<commit_message>
Slide 3: thêm tính năng mới của AI Agent và ô giới hạn
Co-Authored-By: Claude Opus 5.5 <noreply@anthropic.com>
Claude-Session: https://claude.ai/code/session_01JoSsghLRHTtvcNzYXbKpzE
</commit_message>
<xml_diff>
--- a/thuyet-trinh/DANH-SACH-SLIDE-v2.5.docx
+++ b/thuyet-trinh/DANH-SACH-SLIDE-v2.5.docx
@@ -121,7 +121,7 @@
         <w:t xml:space="preserve">”</w:t>
       </w:r>
       <w:r>
-        <w:t xml:space="preserve">.</w:t>
+        <w:t xml:space="preserve">; Slide 3 thêm tính năng mới của AI Agent và ô giới hạn (6′, thảo luận còn 12′).</w:t>
       </w:r>
       <w:r>
         <w:t xml:space="preserve"> </w:t>
@@ -598,6 +598,130 @@
               <w:jc w:val="left"/>
             </w:pPr>
             <w:r>
+              <w:t xml:space="preserve">6′</w:t>
+            </w:r>
+          </w:p>
+        </w:tc>
+        <w:tc>
+          <w:tcPr/>
+          <w:p>
+            <w:pPr>
+              <w:pStyle w:val="Compact"/>
+              <w:jc w:val="left"/>
+            </w:pPr>
+            <w:r>
+              <w:t xml:space="preserve">[ ]</w:t>
+            </w:r>
+          </w:p>
+        </w:tc>
+      </w:tr>
+      <w:tr>
+        <w:tc>
+          <w:tcPr/>
+          <w:p>
+            <w:pPr>
+              <w:pStyle w:val="Compact"/>
+              <w:jc w:val="left"/>
+            </w:pPr>
+            <w:r>
+              <w:t xml:space="preserve">4</w:t>
+            </w:r>
+          </w:p>
+        </w:tc>
+        <w:tc>
+          <w:tcPr/>
+          <w:p>
+            <w:pPr>
+              <w:pStyle w:val="Compact"/>
+              <w:jc w:val="left"/>
+            </w:pPr>
+            <w:r>
+              <w:t xml:space="preserve">Phương thức nghiên cứu đang thay đổi</w:t>
+            </w:r>
+          </w:p>
+        </w:tc>
+        <w:tc>
+          <w:tcPr/>
+          <w:p>
+            <w:pPr>
+              <w:pStyle w:val="Compact"/>
+              <w:jc w:val="left"/>
+            </w:pPr>
+            <w:r>
+              <w:t xml:space="preserve">I</w:t>
+            </w:r>
+          </w:p>
+        </w:tc>
+        <w:tc>
+          <w:tcPr/>
+          <w:p>
+            <w:pPr>
+              <w:pStyle w:val="Compact"/>
+              <w:jc w:val="left"/>
+            </w:pPr>
+            <w:r>
+              <w:t xml:space="preserve">4′</w:t>
+            </w:r>
+          </w:p>
+        </w:tc>
+        <w:tc>
+          <w:tcPr/>
+          <w:p>
+            <w:pPr>
+              <w:pStyle w:val="Compact"/>
+              <w:jc w:val="left"/>
+            </w:pPr>
+            <w:r>
+              <w:t xml:space="preserve">[ ]</w:t>
+            </w:r>
+          </w:p>
+        </w:tc>
+      </w:tr>
+      <w:tr>
+        <w:tc>
+          <w:tcPr/>
+          <w:p>
+            <w:pPr>
+              <w:pStyle w:val="Compact"/>
+              <w:jc w:val="left"/>
+            </w:pPr>
+            <w:r>
+              <w:t xml:space="preserve">5</w:t>
+            </w:r>
+          </w:p>
+        </w:tc>
+        <w:tc>
+          <w:tcPr/>
+          <w:p>
+            <w:pPr>
+              <w:pStyle w:val="Compact"/>
+              <w:jc w:val="left"/>
+            </w:pPr>
+            <w:r>
+              <w:t xml:space="preserve">Công việc nào cần chatbot, công việc nào cần AI Agent?</w:t>
+            </w:r>
+          </w:p>
+        </w:tc>
+        <w:tc>
+          <w:tcPr/>
+          <w:p>
+            <w:pPr>
+              <w:pStyle w:val="Compact"/>
+              <w:jc w:val="left"/>
+            </w:pPr>
+            <w:r>
+              <w:t xml:space="preserve">II</w:t>
+            </w:r>
+          </w:p>
+        </w:tc>
+        <w:tc>
+          <w:tcPr/>
+          <w:p>
+            <w:pPr>
+              <w:pStyle w:val="Compact"/>
+              <w:jc w:val="left"/>
+            </w:pPr>
+            <w:r>
               <w:t xml:space="preserve">5′</w:t>
             </w:r>
           </w:p>
@@ -624,31 +748,31 @@
               <w:jc w:val="left"/>
             </w:pPr>
             <w:r>
-              <w:t xml:space="preserve">4</w:t>
-            </w:r>
-          </w:p>
-        </w:tc>
-        <w:tc>
-          <w:tcPr/>
-          <w:p>
-            <w:pPr>
-              <w:pStyle w:val="Compact"/>
-              <w:jc w:val="left"/>
-            </w:pPr>
-            <w:r>
-              <w:t xml:space="preserve">Phương thức nghiên cứu đang thay đổi</w:t>
-            </w:r>
-          </w:p>
-        </w:tc>
-        <w:tc>
-          <w:tcPr/>
-          <w:p>
-            <w:pPr>
-              <w:pStyle w:val="Compact"/>
-              <w:jc w:val="left"/>
-            </w:pPr>
-            <w:r>
-              <w:t xml:space="preserve">I</w:t>
+              <w:t xml:space="preserve">6</w:t>
+            </w:r>
+          </w:p>
+        </w:tc>
+        <w:tc>
+          <w:tcPr/>
+          <w:p>
+            <w:pPr>
+              <w:pStyle w:val="Compact"/>
+              <w:jc w:val="left"/>
+            </w:pPr>
+            <w:r>
+              <w:t xml:space="preserve">Các công cụ AI và vai trò khác nhau</w:t>
+            </w:r>
+          </w:p>
+        </w:tc>
+        <w:tc>
+          <w:tcPr/>
+          <w:p>
+            <w:pPr>
+              <w:pStyle w:val="Compact"/>
+              <w:jc w:val="left"/>
+            </w:pPr>
+            <w:r>
+              <w:t xml:space="preserve">II</w:t>
             </w:r>
           </w:p>
         </w:tc>
@@ -686,19 +810,19 @@
               <w:jc w:val="left"/>
             </w:pPr>
             <w:r>
-              <w:t xml:space="preserve">5</w:t>
-            </w:r>
-          </w:p>
-        </w:tc>
-        <w:tc>
-          <w:tcPr/>
-          <w:p>
-            <w:pPr>
-              <w:pStyle w:val="Compact"/>
-              <w:jc w:val="left"/>
-            </w:pPr>
-            <w:r>
-              <w:t xml:space="preserve">Công việc nào cần chatbot, công việc nào cần AI Agent?</w:t>
+              <w:t xml:space="preserve">7</w:t>
+            </w:r>
+          </w:p>
+        </w:tc>
+        <w:tc>
+          <w:tcPr/>
+          <w:p>
+            <w:pPr>
+              <w:pStyle w:val="Compact"/>
+              <w:jc w:val="left"/>
+            </w:pPr>
+            <w:r>
+              <w:t xml:space="preserve">Claude là gì? Các tính năng nổi bật</w:t>
             </w:r>
           </w:p>
         </w:tc>
@@ -722,6 +846,750 @@
               <w:jc w:val="left"/>
             </w:pPr>
             <w:r>
+              <w:t xml:space="preserve">7′</w:t>
+            </w:r>
+          </w:p>
+        </w:tc>
+        <w:tc>
+          <w:tcPr/>
+          <w:p>
+            <w:pPr>
+              <w:pStyle w:val="Compact"/>
+              <w:jc w:val="left"/>
+            </w:pPr>
+            <w:r>
+              <w:t xml:space="preserve">[ ]</w:t>
+            </w:r>
+          </w:p>
+        </w:tc>
+      </w:tr>
+      <w:tr>
+        <w:tc>
+          <w:tcPr/>
+          <w:p>
+            <w:pPr>
+              <w:pStyle w:val="Compact"/>
+              <w:jc w:val="left"/>
+            </w:pPr>
+            <w:r>
+              <w:t xml:space="preserve">8</w:t>
+            </w:r>
+          </w:p>
+        </w:tc>
+        <w:tc>
+          <w:tcPr/>
+          <w:p>
+            <w:pPr>
+              <w:pStyle w:val="Compact"/>
+              <w:jc w:val="left"/>
+            </w:pPr>
+            <w:r>
+              <w:t xml:space="preserve">Dùng Claude cơ bản: 6 bước đầu tiên</w:t>
+            </w:r>
+          </w:p>
+        </w:tc>
+        <w:tc>
+          <w:tcPr/>
+          <w:p>
+            <w:pPr>
+              <w:pStyle w:val="Compact"/>
+              <w:jc w:val="left"/>
+            </w:pPr>
+            <w:r>
+              <w:t xml:space="preserve">II</w:t>
+            </w:r>
+          </w:p>
+        </w:tc>
+        <w:tc>
+          <w:tcPr/>
+          <w:p>
+            <w:pPr>
+              <w:pStyle w:val="Compact"/>
+              <w:jc w:val="left"/>
+            </w:pPr>
+            <w:r>
+              <w:t xml:space="preserve">7′</w:t>
+            </w:r>
+          </w:p>
+        </w:tc>
+        <w:tc>
+          <w:tcPr/>
+          <w:p>
+            <w:pPr>
+              <w:pStyle w:val="Compact"/>
+              <w:jc w:val="left"/>
+            </w:pPr>
+            <w:r>
+              <w:t xml:space="preserve">[ ]</w:t>
+            </w:r>
+          </w:p>
+        </w:tc>
+      </w:tr>
+      <w:tr>
+        <w:tc>
+          <w:tcPr/>
+          <w:p>
+            <w:pPr>
+              <w:pStyle w:val="Compact"/>
+              <w:jc w:val="left"/>
+            </w:pPr>
+            <w:r>
+              <w:t xml:space="preserve">9</w:t>
+            </w:r>
+          </w:p>
+        </w:tc>
+        <w:tc>
+          <w:tcPr/>
+          <w:p>
+            <w:pPr>
+              <w:pStyle w:val="Compact"/>
+              <w:jc w:val="left"/>
+            </w:pPr>
+            <w:r>
+              <w:t xml:space="preserve">Một cách giao việc chung cho các công cụ AI Agent</w:t>
+            </w:r>
+          </w:p>
+        </w:tc>
+        <w:tc>
+          <w:tcPr/>
+          <w:p>
+            <w:pPr>
+              <w:pStyle w:val="Compact"/>
+              <w:jc w:val="left"/>
+            </w:pPr>
+            <w:r>
+              <w:t xml:space="preserve">II</w:t>
+            </w:r>
+          </w:p>
+        </w:tc>
+        <w:tc>
+          <w:tcPr/>
+          <w:p>
+            <w:pPr>
+              <w:pStyle w:val="Compact"/>
+              <w:jc w:val="left"/>
+            </w:pPr>
+            <w:r>
+              <w:t xml:space="preserve">6′</w:t>
+            </w:r>
+          </w:p>
+        </w:tc>
+        <w:tc>
+          <w:tcPr/>
+          <w:p>
+            <w:pPr>
+              <w:pStyle w:val="Compact"/>
+              <w:jc w:val="left"/>
+            </w:pPr>
+            <w:r>
+              <w:t xml:space="preserve">[ ]</w:t>
+            </w:r>
+          </w:p>
+        </w:tc>
+      </w:tr>
+      <w:tr>
+        <w:tc>
+          <w:tcPr/>
+          <w:p>
+            <w:pPr>
+              <w:pStyle w:val="Compact"/>
+              <w:jc w:val="left"/>
+            </w:pPr>
+            <w:r>
+              <w:t xml:space="preserve">10</w:t>
+            </w:r>
+          </w:p>
+        </w:tc>
+        <w:tc>
+          <w:tcPr/>
+          <w:p>
+            <w:pPr>
+              <w:pStyle w:val="Compact"/>
+              <w:jc w:val="left"/>
+            </w:pPr>
+            <w:r>
+              <w:t xml:space="preserve">Tổ chức một không gian làm việc nghiên cứu</w:t>
+            </w:r>
+          </w:p>
+        </w:tc>
+        <w:tc>
+          <w:tcPr/>
+          <w:p>
+            <w:pPr>
+              <w:pStyle w:val="Compact"/>
+              <w:jc w:val="left"/>
+            </w:pPr>
+            <w:r>
+              <w:t xml:space="preserve">II</w:t>
+            </w:r>
+          </w:p>
+        </w:tc>
+        <w:tc>
+          <w:tcPr/>
+          <w:p>
+            <w:pPr>
+              <w:pStyle w:val="Compact"/>
+              <w:jc w:val="left"/>
+            </w:pPr>
+            <w:r>
+              <w:t xml:space="preserve">4′</w:t>
+            </w:r>
+          </w:p>
+        </w:tc>
+        <w:tc>
+          <w:tcPr/>
+          <w:p>
+            <w:pPr>
+              <w:pStyle w:val="Compact"/>
+              <w:jc w:val="left"/>
+            </w:pPr>
+            <w:r>
+              <w:t xml:space="preserve">[ ]</w:t>
+            </w:r>
+          </w:p>
+        </w:tc>
+      </w:tr>
+      <w:tr>
+        <w:tc>
+          <w:tcPr/>
+          <w:p>
+            <w:pPr>
+              <w:pStyle w:val="Compact"/>
+              <w:jc w:val="left"/>
+            </w:pPr>
+            <w:r>
+              <w:t xml:space="preserve">11</w:t>
+            </w:r>
+          </w:p>
+        </w:tc>
+        <w:tc>
+          <w:tcPr/>
+          <w:p>
+            <w:pPr>
+              <w:pStyle w:val="Compact"/>
+              <w:jc w:val="left"/>
+            </w:pPr>
+            <w:r>
+              <w:t xml:space="preserve">Skill, Subagent và hệ thống nhiều Agent</w:t>
+            </w:r>
+          </w:p>
+        </w:tc>
+        <w:tc>
+          <w:tcPr/>
+          <w:p>
+            <w:pPr>
+              <w:pStyle w:val="Compact"/>
+              <w:jc w:val="left"/>
+            </w:pPr>
+            <w:r>
+              <w:t xml:space="preserve">II</w:t>
+            </w:r>
+          </w:p>
+        </w:tc>
+        <w:tc>
+          <w:tcPr/>
+          <w:p>
+            <w:pPr>
+              <w:pStyle w:val="Compact"/>
+              <w:jc w:val="left"/>
+            </w:pPr>
+            <w:r>
+              <w:t xml:space="preserve">3′</w:t>
+            </w:r>
+          </w:p>
+        </w:tc>
+        <w:tc>
+          <w:tcPr/>
+          <w:p>
+            <w:pPr>
+              <w:pStyle w:val="Compact"/>
+              <w:jc w:val="left"/>
+            </w:pPr>
+            <w:r>
+              <w:t xml:space="preserve">[ ]</w:t>
+            </w:r>
+          </w:p>
+        </w:tc>
+      </w:tr>
+      <w:tr>
+        <w:tc>
+          <w:tcPr/>
+          <w:p>
+            <w:pPr>
+              <w:pStyle w:val="Compact"/>
+              <w:jc w:val="left"/>
+            </w:pPr>
+            <w:r>
+              <w:t xml:space="preserve">12</w:t>
+            </w:r>
+          </w:p>
+        </w:tc>
+        <w:tc>
+          <w:tcPr/>
+          <w:p>
+            <w:pPr>
+              <w:pStyle w:val="Compact"/>
+              <w:jc w:val="left"/>
+            </w:pPr>
+            <w:r>
+              <w:t xml:space="preserve">Từ tài liệu đến khoảng trống nghiên cứu</w:t>
+            </w:r>
+          </w:p>
+        </w:tc>
+        <w:tc>
+          <w:tcPr/>
+          <w:p>
+            <w:pPr>
+              <w:pStyle w:val="Compact"/>
+              <w:jc w:val="left"/>
+            </w:pPr>
+            <w:r>
+              <w:t xml:space="preserve">III</w:t>
+            </w:r>
+          </w:p>
+        </w:tc>
+        <w:tc>
+          <w:tcPr/>
+          <w:p>
+            <w:pPr>
+              <w:pStyle w:val="Compact"/>
+              <w:jc w:val="left"/>
+            </w:pPr>
+            <w:r>
+              <w:t xml:space="preserve">8′</w:t>
+            </w:r>
+          </w:p>
+        </w:tc>
+        <w:tc>
+          <w:tcPr/>
+          <w:p>
+            <w:pPr>
+              <w:pStyle w:val="Compact"/>
+              <w:jc w:val="left"/>
+            </w:pPr>
+            <w:r>
+              <w:t xml:space="preserve">[ ]</w:t>
+            </w:r>
+          </w:p>
+        </w:tc>
+      </w:tr>
+      <w:tr>
+        <w:tc>
+          <w:tcPr/>
+          <w:p>
+            <w:pPr>
+              <w:pStyle w:val="Compact"/>
+              <w:jc w:val="left"/>
+            </w:pPr>
+            <w:r>
+              <w:t xml:space="preserve">13</w:t>
+            </w:r>
+          </w:p>
+        </w:tc>
+        <w:tc>
+          <w:tcPr/>
+          <w:p>
+            <w:pPr>
+              <w:pStyle w:val="Compact"/>
+              <w:jc w:val="left"/>
+            </w:pPr>
+            <w:r>
+              <w:t xml:space="preserve">Từ khoảng trống đến phiếu đề xuất và thuyết minh – DEMO 1 với biểu mẫu thật của Trung tâm</w:t>
+            </w:r>
+          </w:p>
+        </w:tc>
+        <w:tc>
+          <w:tcPr/>
+          <w:p>
+            <w:pPr>
+              <w:pStyle w:val="Compact"/>
+              <w:jc w:val="left"/>
+            </w:pPr>
+            <w:r>
+              <w:t xml:space="preserve">III</w:t>
+            </w:r>
+          </w:p>
+        </w:tc>
+        <w:tc>
+          <w:tcPr/>
+          <w:p>
+            <w:pPr>
+              <w:pStyle w:val="Compact"/>
+              <w:jc w:val="left"/>
+            </w:pPr>
+            <w:r>
+              <w:t xml:space="preserve">8′</w:t>
+            </w:r>
+          </w:p>
+        </w:tc>
+        <w:tc>
+          <w:tcPr/>
+          <w:p>
+            <w:pPr>
+              <w:pStyle w:val="Compact"/>
+              <w:jc w:val="left"/>
+            </w:pPr>
+            <w:r>
+              <w:t xml:space="preserve">[ ]</w:t>
+            </w:r>
+          </w:p>
+        </w:tc>
+      </w:tr>
+      <w:tr>
+        <w:tc>
+          <w:tcPr/>
+          <w:p>
+            <w:pPr>
+              <w:pStyle w:val="Compact"/>
+              <w:jc w:val="left"/>
+            </w:pPr>
+            <w:r>
+              <w:t xml:space="preserve">14</w:t>
+            </w:r>
+          </w:p>
+        </w:tc>
+        <w:tc>
+          <w:tcPr/>
+          <w:p>
+            <w:pPr>
+              <w:pStyle w:val="Compact"/>
+              <w:jc w:val="left"/>
+            </w:pPr>
+            <w:r>
+              <w:t xml:space="preserve">Thuyết minh, tiến độ và kinh phí theo biểu mẫu Trung tâm</w:t>
+            </w:r>
+          </w:p>
+        </w:tc>
+        <w:tc>
+          <w:tcPr/>
+          <w:p>
+            <w:pPr>
+              <w:pStyle w:val="Compact"/>
+              <w:jc w:val="left"/>
+            </w:pPr>
+            <w:r>
+              <w:t xml:space="preserve">III</w:t>
+            </w:r>
+          </w:p>
+        </w:tc>
+        <w:tc>
+          <w:tcPr/>
+          <w:p>
+            <w:pPr>
+              <w:pStyle w:val="Compact"/>
+              <w:jc w:val="left"/>
+            </w:pPr>
+            <w:r>
+              <w:t xml:space="preserve">6′</w:t>
+            </w:r>
+          </w:p>
+        </w:tc>
+        <w:tc>
+          <w:tcPr/>
+          <w:p>
+            <w:pPr>
+              <w:pStyle w:val="Compact"/>
+              <w:jc w:val="left"/>
+            </w:pPr>
+            <w:r>
+              <w:t xml:space="preserve">[ ]</w:t>
+            </w:r>
+          </w:p>
+        </w:tc>
+      </w:tr>
+      <w:tr>
+        <w:tc>
+          <w:tcPr/>
+          <w:p>
+            <w:pPr>
+              <w:pStyle w:val="Compact"/>
+              <w:jc w:val="left"/>
+            </w:pPr>
+            <w:r>
+              <w:t xml:space="preserve">15</w:t>
+            </w:r>
+          </w:p>
+        </w:tc>
+        <w:tc>
+          <w:tcPr/>
+          <w:p>
+            <w:pPr>
+              <w:pStyle w:val="Compact"/>
+              <w:jc w:val="left"/>
+            </w:pPr>
+            <w:r>
+              <w:t xml:space="preserve">Xử lý dữ liệu bằng mã Python – DEMO 2</w:t>
+            </w:r>
+          </w:p>
+        </w:tc>
+        <w:tc>
+          <w:tcPr/>
+          <w:p>
+            <w:pPr>
+              <w:pStyle w:val="Compact"/>
+              <w:jc w:val="left"/>
+            </w:pPr>
+            <w:r>
+              <w:t xml:space="preserve">III</w:t>
+            </w:r>
+          </w:p>
+        </w:tc>
+        <w:tc>
+          <w:tcPr/>
+          <w:p>
+            <w:pPr>
+              <w:pStyle w:val="Compact"/>
+              <w:jc w:val="left"/>
+            </w:pPr>
+            <w:r>
+              <w:t xml:space="preserve">8′</w:t>
+            </w:r>
+          </w:p>
+        </w:tc>
+        <w:tc>
+          <w:tcPr/>
+          <w:p>
+            <w:pPr>
+              <w:pStyle w:val="Compact"/>
+              <w:jc w:val="left"/>
+            </w:pPr>
+            <w:r>
+              <w:t xml:space="preserve">[ ]</w:t>
+            </w:r>
+          </w:p>
+        </w:tc>
+      </w:tr>
+      <w:tr>
+        <w:tc>
+          <w:tcPr/>
+          <w:p>
+            <w:pPr>
+              <w:pStyle w:val="Compact"/>
+              <w:jc w:val="left"/>
+            </w:pPr>
+            <w:r>
+              <w:t xml:space="preserve">16</w:t>
+            </w:r>
+          </w:p>
+        </w:tc>
+        <w:tc>
+          <w:tcPr/>
+          <w:p>
+            <w:pPr>
+              <w:pStyle w:val="Compact"/>
+              <w:jc w:val="left"/>
+            </w:pPr>
+            <w:r>
+              <w:t xml:space="preserve">Xây dựng bài báo và báo cáo tổng hợp kết quả</w:t>
+            </w:r>
+          </w:p>
+        </w:tc>
+        <w:tc>
+          <w:tcPr/>
+          <w:p>
+            <w:pPr>
+              <w:pStyle w:val="Compact"/>
+              <w:jc w:val="left"/>
+            </w:pPr>
+            <w:r>
+              <w:t xml:space="preserve">III</w:t>
+            </w:r>
+          </w:p>
+        </w:tc>
+        <w:tc>
+          <w:tcPr/>
+          <w:p>
+            <w:pPr>
+              <w:pStyle w:val="Compact"/>
+              <w:jc w:val="left"/>
+            </w:pPr>
+            <w:r>
+              <w:t xml:space="preserve">6′</w:t>
+            </w:r>
+          </w:p>
+        </w:tc>
+        <w:tc>
+          <w:tcPr/>
+          <w:p>
+            <w:pPr>
+              <w:pStyle w:val="Compact"/>
+              <w:jc w:val="left"/>
+            </w:pPr>
+            <w:r>
+              <w:t xml:space="preserve">[ ]</w:t>
+            </w:r>
+          </w:p>
+        </w:tc>
+      </w:tr>
+      <w:tr>
+        <w:tc>
+          <w:tcPr/>
+          <w:p>
+            <w:pPr>
+              <w:pStyle w:val="Compact"/>
+              <w:jc w:val="left"/>
+            </w:pPr>
+            <w:r>
+              <w:t xml:space="preserve">17</w:t>
+            </w:r>
+          </w:p>
+        </w:tc>
+        <w:tc>
+          <w:tcPr/>
+          <w:p>
+            <w:pPr>
+              <w:pStyle w:val="Compact"/>
+              <w:jc w:val="left"/>
+            </w:pPr>
+            <w:r>
+              <w:t xml:space="preserve">Toàn cảnh: một nhiệm vụ khoa học đi qua AI Agent</w:t>
+            </w:r>
+          </w:p>
+        </w:tc>
+        <w:tc>
+          <w:tcPr/>
+          <w:p>
+            <w:pPr>
+              <w:pStyle w:val="Compact"/>
+              <w:jc w:val="left"/>
+            </w:pPr>
+            <w:r>
+              <w:t xml:space="preserve">III</w:t>
+            </w:r>
+          </w:p>
+        </w:tc>
+        <w:tc>
+          <w:tcPr/>
+          <w:p>
+            <w:pPr>
+              <w:pStyle w:val="Compact"/>
+              <w:jc w:val="left"/>
+            </w:pPr>
+            <w:r>
+              <w:t xml:space="preserve">2′</w:t>
+            </w:r>
+          </w:p>
+        </w:tc>
+        <w:tc>
+          <w:tcPr/>
+          <w:p>
+            <w:pPr>
+              <w:pStyle w:val="Compact"/>
+              <w:jc w:val="left"/>
+            </w:pPr>
+            <w:r>
+              <w:t xml:space="preserve">[ ]</w:t>
+            </w:r>
+          </w:p>
+        </w:tc>
+      </w:tr>
+      <w:tr>
+        <w:tc>
+          <w:tcPr/>
+          <w:p>
+            <w:pPr>
+              <w:pStyle w:val="Compact"/>
+              <w:jc w:val="left"/>
+            </w:pPr>
+            <w:r>
+              <w:t xml:space="preserve">18</w:t>
+            </w:r>
+          </w:p>
+        </w:tc>
+        <w:tc>
+          <w:tcPr/>
+          <w:p>
+            <w:pPr>
+              <w:pStyle w:val="Compact"/>
+              <w:jc w:val="left"/>
+            </w:pPr>
+            <w:r>
+              <w:t xml:space="preserve">Skill và khoa học mở: nền móng của tự động hóa</w:t>
+            </w:r>
+          </w:p>
+        </w:tc>
+        <w:tc>
+          <w:tcPr/>
+          <w:p>
+            <w:pPr>
+              <w:pStyle w:val="Compact"/>
+              <w:jc w:val="left"/>
+            </w:pPr>
+            <w:r>
+              <w:t xml:space="preserve">IV</w:t>
+            </w:r>
+          </w:p>
+        </w:tc>
+        <w:tc>
+          <w:tcPr/>
+          <w:p>
+            <w:pPr>
+              <w:pStyle w:val="Compact"/>
+              <w:jc w:val="left"/>
+            </w:pPr>
+            <w:r>
+              <w:t xml:space="preserve">6′</w:t>
+            </w:r>
+          </w:p>
+        </w:tc>
+        <w:tc>
+          <w:tcPr/>
+          <w:p>
+            <w:pPr>
+              <w:pStyle w:val="Compact"/>
+              <w:jc w:val="left"/>
+            </w:pPr>
+            <w:r>
+              <w:t xml:space="preserve">[ ]</w:t>
+            </w:r>
+          </w:p>
+        </w:tc>
+      </w:tr>
+      <w:tr>
+        <w:tc>
+          <w:tcPr/>
+          <w:p>
+            <w:pPr>
+              <w:pStyle w:val="Compact"/>
+              <w:jc w:val="left"/>
+            </w:pPr>
+            <w:r>
+              <w:t xml:space="preserve">19</w:t>
+            </w:r>
+          </w:p>
+        </w:tc>
+        <w:tc>
+          <w:tcPr/>
+          <w:p>
+            <w:pPr>
+              <w:pStyle w:val="Compact"/>
+              <w:jc w:val="left"/>
+            </w:pPr>
+            <w:r>
+              <w:t xml:space="preserve">Ứng dụng khoa học mở và tự động hóa từng bước đến toàn trình</w:t>
+            </w:r>
+          </w:p>
+        </w:tc>
+        <w:tc>
+          <w:tcPr/>
+          <w:p>
+            <w:pPr>
+              <w:pStyle w:val="Compact"/>
+              <w:jc w:val="left"/>
+            </w:pPr>
+            <w:r>
+              <w:t xml:space="preserve">IV</w:t>
+            </w:r>
+          </w:p>
+        </w:tc>
+        <w:tc>
+          <w:tcPr/>
+          <w:p>
+            <w:pPr>
+              <w:pStyle w:val="Compact"/>
+              <w:jc w:val="left"/>
+            </w:pPr>
+            <w:r>
               <w:t xml:space="preserve">5′</w:t>
             </w:r>
           </w:p>
@@ -748,31 +1616,31 @@
               <w:jc w:val="left"/>
             </w:pPr>
             <w:r>
-              <w:t xml:space="preserve">6</w:t>
-            </w:r>
-          </w:p>
-        </w:tc>
-        <w:tc>
-          <w:tcPr/>
-          <w:p>
-            <w:pPr>
-              <w:pStyle w:val="Compact"/>
-              <w:jc w:val="left"/>
-            </w:pPr>
-            <w:r>
-              <w:t xml:space="preserve">Các công cụ AI và vai trò khác nhau</w:t>
-            </w:r>
-          </w:p>
-        </w:tc>
-        <w:tc>
-          <w:tcPr/>
-          <w:p>
-            <w:pPr>
-              <w:pStyle w:val="Compact"/>
-              <w:jc w:val="left"/>
-            </w:pPr>
-            <w:r>
-              <w:t xml:space="preserve">II</w:t>
+              <w:t xml:space="preserve">20</w:t>
+            </w:r>
+          </w:p>
+        </w:tc>
+        <w:tc>
+          <w:tcPr/>
+          <w:p>
+            <w:pPr>
+              <w:pStyle w:val="Compact"/>
+              <w:jc w:val="left"/>
+            </w:pPr>
+            <w:r>
+              <w:t xml:space="preserve">Bản đồ quy trình tự động của Trung tâm và năm quyết định của nhà khoa học</w:t>
+            </w:r>
+          </w:p>
+        </w:tc>
+        <w:tc>
+          <w:tcPr/>
+          <w:p>
+            <w:pPr>
+              <w:pStyle w:val="Compact"/>
+              <w:jc w:val="left"/>
+            </w:pPr>
+            <w:r>
+              <w:t xml:space="preserve">IV</w:t>
             </w:r>
           </w:p>
         </w:tc>
@@ -810,701 +1678,19 @@
               <w:jc w:val="left"/>
             </w:pPr>
             <w:r>
-              <w:t xml:space="preserve">7</w:t>
-            </w:r>
-          </w:p>
-        </w:tc>
-        <w:tc>
-          <w:tcPr/>
-          <w:p>
-            <w:pPr>
-              <w:pStyle w:val="Compact"/>
-              <w:jc w:val="left"/>
-            </w:pPr>
-            <w:r>
-              <w:t xml:space="preserve">Claude là gì? Các tính năng nổi bật</w:t>
-            </w:r>
-          </w:p>
-        </w:tc>
-        <w:tc>
-          <w:tcPr/>
-          <w:p>
-            <w:pPr>
-              <w:pStyle w:val="Compact"/>
-              <w:jc w:val="left"/>
-            </w:pPr>
-            <w:r>
-              <w:t xml:space="preserve">II</w:t>
-            </w:r>
-          </w:p>
-        </w:tc>
-        <w:tc>
-          <w:tcPr/>
-          <w:p>
-            <w:pPr>
-              <w:pStyle w:val="Compact"/>
-              <w:jc w:val="left"/>
-            </w:pPr>
-            <w:r>
-              <w:t xml:space="preserve">7′</w:t>
-            </w:r>
-          </w:p>
-        </w:tc>
-        <w:tc>
-          <w:tcPr/>
-          <w:p>
-            <w:pPr>
-              <w:pStyle w:val="Compact"/>
-              <w:jc w:val="left"/>
-            </w:pPr>
-            <w:r>
-              <w:t xml:space="preserve">[ ]</w:t>
-            </w:r>
-          </w:p>
-        </w:tc>
-      </w:tr>
-      <w:tr>
-        <w:tc>
-          <w:tcPr/>
-          <w:p>
-            <w:pPr>
-              <w:pStyle w:val="Compact"/>
-              <w:jc w:val="left"/>
-            </w:pPr>
-            <w:r>
-              <w:t xml:space="preserve">8</w:t>
-            </w:r>
-          </w:p>
-        </w:tc>
-        <w:tc>
-          <w:tcPr/>
-          <w:p>
-            <w:pPr>
-              <w:pStyle w:val="Compact"/>
-              <w:jc w:val="left"/>
-            </w:pPr>
-            <w:r>
-              <w:t xml:space="preserve">Dùng Claude cơ bản: 6 bước đầu tiên</w:t>
-            </w:r>
-          </w:p>
-        </w:tc>
-        <w:tc>
-          <w:tcPr/>
-          <w:p>
-            <w:pPr>
-              <w:pStyle w:val="Compact"/>
-              <w:jc w:val="left"/>
-            </w:pPr>
-            <w:r>
-              <w:t xml:space="preserve">II</w:t>
-            </w:r>
-          </w:p>
-        </w:tc>
-        <w:tc>
-          <w:tcPr/>
-          <w:p>
-            <w:pPr>
-              <w:pStyle w:val="Compact"/>
-              <w:jc w:val="left"/>
-            </w:pPr>
-            <w:r>
-              <w:t xml:space="preserve">7′</w:t>
-            </w:r>
-          </w:p>
-        </w:tc>
-        <w:tc>
-          <w:tcPr/>
-          <w:p>
-            <w:pPr>
-              <w:pStyle w:val="Compact"/>
-              <w:jc w:val="left"/>
-            </w:pPr>
-            <w:r>
-              <w:t xml:space="preserve">[ ]</w:t>
-            </w:r>
-          </w:p>
-        </w:tc>
-      </w:tr>
-      <w:tr>
-        <w:tc>
-          <w:tcPr/>
-          <w:p>
-            <w:pPr>
-              <w:pStyle w:val="Compact"/>
-              <w:jc w:val="left"/>
-            </w:pPr>
-            <w:r>
-              <w:t xml:space="preserve">9</w:t>
-            </w:r>
-          </w:p>
-        </w:tc>
-        <w:tc>
-          <w:tcPr/>
-          <w:p>
-            <w:pPr>
-              <w:pStyle w:val="Compact"/>
-              <w:jc w:val="left"/>
-            </w:pPr>
-            <w:r>
-              <w:t xml:space="preserve">Một cách giao việc chung cho các công cụ AI Agent</w:t>
-            </w:r>
-          </w:p>
-        </w:tc>
-        <w:tc>
-          <w:tcPr/>
-          <w:p>
-            <w:pPr>
-              <w:pStyle w:val="Compact"/>
-              <w:jc w:val="left"/>
-            </w:pPr>
-            <w:r>
-              <w:t xml:space="preserve">II</w:t>
-            </w:r>
-          </w:p>
-        </w:tc>
-        <w:tc>
-          <w:tcPr/>
-          <w:p>
-            <w:pPr>
-              <w:pStyle w:val="Compact"/>
-              <w:jc w:val="left"/>
-            </w:pPr>
-            <w:r>
-              <w:t xml:space="preserve">6′</w:t>
-            </w:r>
-          </w:p>
-        </w:tc>
-        <w:tc>
-          <w:tcPr/>
-          <w:p>
-            <w:pPr>
-              <w:pStyle w:val="Compact"/>
-              <w:jc w:val="left"/>
-            </w:pPr>
-            <w:r>
-              <w:t xml:space="preserve">[ ]</w:t>
-            </w:r>
-          </w:p>
-        </w:tc>
-      </w:tr>
-      <w:tr>
-        <w:tc>
-          <w:tcPr/>
-          <w:p>
-            <w:pPr>
-              <w:pStyle w:val="Compact"/>
-              <w:jc w:val="left"/>
-            </w:pPr>
-            <w:r>
-              <w:t xml:space="preserve">10</w:t>
-            </w:r>
-          </w:p>
-        </w:tc>
-        <w:tc>
-          <w:tcPr/>
-          <w:p>
-            <w:pPr>
-              <w:pStyle w:val="Compact"/>
-              <w:jc w:val="left"/>
-            </w:pPr>
-            <w:r>
-              <w:t xml:space="preserve">Tổ chức một không gian làm việc nghiên cứu</w:t>
-            </w:r>
-          </w:p>
-        </w:tc>
-        <w:tc>
-          <w:tcPr/>
-          <w:p>
-            <w:pPr>
-              <w:pStyle w:val="Compact"/>
-              <w:jc w:val="left"/>
-            </w:pPr>
-            <w:r>
-              <w:t xml:space="preserve">II</w:t>
-            </w:r>
-          </w:p>
-        </w:tc>
-        <w:tc>
-          <w:tcPr/>
-          <w:p>
-            <w:pPr>
-              <w:pStyle w:val="Compact"/>
-              <w:jc w:val="left"/>
-            </w:pPr>
-            <w:r>
-              <w:t xml:space="preserve">4′</w:t>
-            </w:r>
-          </w:p>
-        </w:tc>
-        <w:tc>
-          <w:tcPr/>
-          <w:p>
-            <w:pPr>
-              <w:pStyle w:val="Compact"/>
-              <w:jc w:val="left"/>
-            </w:pPr>
-            <w:r>
-              <w:t xml:space="preserve">[ ]</w:t>
-            </w:r>
-          </w:p>
-        </w:tc>
-      </w:tr>
-      <w:tr>
-        <w:tc>
-          <w:tcPr/>
-          <w:p>
-            <w:pPr>
-              <w:pStyle w:val="Compact"/>
-              <w:jc w:val="left"/>
-            </w:pPr>
-            <w:r>
-              <w:t xml:space="preserve">11</w:t>
-            </w:r>
-          </w:p>
-        </w:tc>
-        <w:tc>
-          <w:tcPr/>
-          <w:p>
-            <w:pPr>
-              <w:pStyle w:val="Compact"/>
-              <w:jc w:val="left"/>
-            </w:pPr>
-            <w:r>
-              <w:t xml:space="preserve">Skill, Subagent và hệ thống nhiều Agent</w:t>
-            </w:r>
-          </w:p>
-        </w:tc>
-        <w:tc>
-          <w:tcPr/>
-          <w:p>
-            <w:pPr>
-              <w:pStyle w:val="Compact"/>
-              <w:jc w:val="left"/>
-            </w:pPr>
-            <w:r>
-              <w:t xml:space="preserve">II</w:t>
-            </w:r>
-          </w:p>
-        </w:tc>
-        <w:tc>
-          <w:tcPr/>
-          <w:p>
-            <w:pPr>
-              <w:pStyle w:val="Compact"/>
-              <w:jc w:val="left"/>
-            </w:pPr>
-            <w:r>
-              <w:t xml:space="preserve">3′</w:t>
-            </w:r>
-          </w:p>
-        </w:tc>
-        <w:tc>
-          <w:tcPr/>
-          <w:p>
-            <w:pPr>
-              <w:pStyle w:val="Compact"/>
-              <w:jc w:val="left"/>
-            </w:pPr>
-            <w:r>
-              <w:t xml:space="preserve">[ ]</w:t>
-            </w:r>
-          </w:p>
-        </w:tc>
-      </w:tr>
-      <w:tr>
-        <w:tc>
-          <w:tcPr/>
-          <w:p>
-            <w:pPr>
-              <w:pStyle w:val="Compact"/>
-              <w:jc w:val="left"/>
-            </w:pPr>
-            <w:r>
-              <w:t xml:space="preserve">12</w:t>
-            </w:r>
-          </w:p>
-        </w:tc>
-        <w:tc>
-          <w:tcPr/>
-          <w:p>
-            <w:pPr>
-              <w:pStyle w:val="Compact"/>
-              <w:jc w:val="left"/>
-            </w:pPr>
-            <w:r>
-              <w:t xml:space="preserve">Từ tài liệu đến khoảng trống nghiên cứu</w:t>
-            </w:r>
-          </w:p>
-        </w:tc>
-        <w:tc>
-          <w:tcPr/>
-          <w:p>
-            <w:pPr>
-              <w:pStyle w:val="Compact"/>
-              <w:jc w:val="left"/>
-            </w:pPr>
-            <w:r>
-              <w:t xml:space="preserve">III</w:t>
-            </w:r>
-          </w:p>
-        </w:tc>
-        <w:tc>
-          <w:tcPr/>
-          <w:p>
-            <w:pPr>
-              <w:pStyle w:val="Compact"/>
-              <w:jc w:val="left"/>
-            </w:pPr>
-            <w:r>
-              <w:t xml:space="preserve">8′</w:t>
-            </w:r>
-          </w:p>
-        </w:tc>
-        <w:tc>
-          <w:tcPr/>
-          <w:p>
-            <w:pPr>
-              <w:pStyle w:val="Compact"/>
-              <w:jc w:val="left"/>
-            </w:pPr>
-            <w:r>
-              <w:t xml:space="preserve">[ ]</w:t>
-            </w:r>
-          </w:p>
-        </w:tc>
-      </w:tr>
-      <w:tr>
-        <w:tc>
-          <w:tcPr/>
-          <w:p>
-            <w:pPr>
-              <w:pStyle w:val="Compact"/>
-              <w:jc w:val="left"/>
-            </w:pPr>
-            <w:r>
-              <w:t xml:space="preserve">13</w:t>
-            </w:r>
-          </w:p>
-        </w:tc>
-        <w:tc>
-          <w:tcPr/>
-          <w:p>
-            <w:pPr>
-              <w:pStyle w:val="Compact"/>
-              <w:jc w:val="left"/>
-            </w:pPr>
-            <w:r>
-              <w:t xml:space="preserve">Từ khoảng trống đến phiếu đề xuất và thuyết minh – DEMO 1 với biểu mẫu thật của Trung tâm</w:t>
-            </w:r>
-          </w:p>
-        </w:tc>
-        <w:tc>
-          <w:tcPr/>
-          <w:p>
-            <w:pPr>
-              <w:pStyle w:val="Compact"/>
-              <w:jc w:val="left"/>
-            </w:pPr>
-            <w:r>
-              <w:t xml:space="preserve">III</w:t>
-            </w:r>
-          </w:p>
-        </w:tc>
-        <w:tc>
-          <w:tcPr/>
-          <w:p>
-            <w:pPr>
-              <w:pStyle w:val="Compact"/>
-              <w:jc w:val="left"/>
-            </w:pPr>
-            <w:r>
-              <w:t xml:space="preserve">8′</w:t>
-            </w:r>
-          </w:p>
-        </w:tc>
-        <w:tc>
-          <w:tcPr/>
-          <w:p>
-            <w:pPr>
-              <w:pStyle w:val="Compact"/>
-              <w:jc w:val="left"/>
-            </w:pPr>
-            <w:r>
-              <w:t xml:space="preserve">[ ]</w:t>
-            </w:r>
-          </w:p>
-        </w:tc>
-      </w:tr>
-      <w:tr>
-        <w:tc>
-          <w:tcPr/>
-          <w:p>
-            <w:pPr>
-              <w:pStyle w:val="Compact"/>
-              <w:jc w:val="left"/>
-            </w:pPr>
-            <w:r>
-              <w:t xml:space="preserve">14</w:t>
-            </w:r>
-          </w:p>
-        </w:tc>
-        <w:tc>
-          <w:tcPr/>
-          <w:p>
-            <w:pPr>
-              <w:pStyle w:val="Compact"/>
-              <w:jc w:val="left"/>
-            </w:pPr>
-            <w:r>
-              <w:t xml:space="preserve">Thuyết minh, tiến độ và kinh phí theo biểu mẫu Trung tâm</w:t>
-            </w:r>
-          </w:p>
-        </w:tc>
-        <w:tc>
-          <w:tcPr/>
-          <w:p>
-            <w:pPr>
-              <w:pStyle w:val="Compact"/>
-              <w:jc w:val="left"/>
-            </w:pPr>
-            <w:r>
-              <w:t xml:space="preserve">III</w:t>
-            </w:r>
-          </w:p>
-        </w:tc>
-        <w:tc>
-          <w:tcPr/>
-          <w:p>
-            <w:pPr>
-              <w:pStyle w:val="Compact"/>
-              <w:jc w:val="left"/>
-            </w:pPr>
-            <w:r>
-              <w:t xml:space="preserve">6′</w:t>
-            </w:r>
-          </w:p>
-        </w:tc>
-        <w:tc>
-          <w:tcPr/>
-          <w:p>
-            <w:pPr>
-              <w:pStyle w:val="Compact"/>
-              <w:jc w:val="left"/>
-            </w:pPr>
-            <w:r>
-              <w:t xml:space="preserve">[ ]</w:t>
-            </w:r>
-          </w:p>
-        </w:tc>
-      </w:tr>
-      <w:tr>
-        <w:tc>
-          <w:tcPr/>
-          <w:p>
-            <w:pPr>
-              <w:pStyle w:val="Compact"/>
-              <w:jc w:val="left"/>
-            </w:pPr>
-            <w:r>
-              <w:t xml:space="preserve">15</w:t>
-            </w:r>
-          </w:p>
-        </w:tc>
-        <w:tc>
-          <w:tcPr/>
-          <w:p>
-            <w:pPr>
-              <w:pStyle w:val="Compact"/>
-              <w:jc w:val="left"/>
-            </w:pPr>
-            <w:r>
-              <w:t xml:space="preserve">Xử lý dữ liệu bằng mã Python – DEMO 2</w:t>
-            </w:r>
-          </w:p>
-        </w:tc>
-        <w:tc>
-          <w:tcPr/>
-          <w:p>
-            <w:pPr>
-              <w:pStyle w:val="Compact"/>
-              <w:jc w:val="left"/>
-            </w:pPr>
-            <w:r>
-              <w:t xml:space="preserve">III</w:t>
-            </w:r>
-          </w:p>
-        </w:tc>
-        <w:tc>
-          <w:tcPr/>
-          <w:p>
-            <w:pPr>
-              <w:pStyle w:val="Compact"/>
-              <w:jc w:val="left"/>
-            </w:pPr>
-            <w:r>
-              <w:t xml:space="preserve">8′</w:t>
-            </w:r>
-          </w:p>
-        </w:tc>
-        <w:tc>
-          <w:tcPr/>
-          <w:p>
-            <w:pPr>
-              <w:pStyle w:val="Compact"/>
-              <w:jc w:val="left"/>
-            </w:pPr>
-            <w:r>
-              <w:t xml:space="preserve">[ ]</w:t>
-            </w:r>
-          </w:p>
-        </w:tc>
-      </w:tr>
-      <w:tr>
-        <w:tc>
-          <w:tcPr/>
-          <w:p>
-            <w:pPr>
-              <w:pStyle w:val="Compact"/>
-              <w:jc w:val="left"/>
-            </w:pPr>
-            <w:r>
-              <w:t xml:space="preserve">16</w:t>
-            </w:r>
-          </w:p>
-        </w:tc>
-        <w:tc>
-          <w:tcPr/>
-          <w:p>
-            <w:pPr>
-              <w:pStyle w:val="Compact"/>
-              <w:jc w:val="left"/>
-            </w:pPr>
-            <w:r>
-              <w:t xml:space="preserve">Xây dựng bài báo và báo cáo tổng hợp kết quả</w:t>
-            </w:r>
-          </w:p>
-        </w:tc>
-        <w:tc>
-          <w:tcPr/>
-          <w:p>
-            <w:pPr>
-              <w:pStyle w:val="Compact"/>
-              <w:jc w:val="left"/>
-            </w:pPr>
-            <w:r>
-              <w:t xml:space="preserve">III</w:t>
-            </w:r>
-          </w:p>
-        </w:tc>
-        <w:tc>
-          <w:tcPr/>
-          <w:p>
-            <w:pPr>
-              <w:pStyle w:val="Compact"/>
-              <w:jc w:val="left"/>
-            </w:pPr>
-            <w:r>
-              <w:t xml:space="preserve">6′</w:t>
-            </w:r>
-          </w:p>
-        </w:tc>
-        <w:tc>
-          <w:tcPr/>
-          <w:p>
-            <w:pPr>
-              <w:pStyle w:val="Compact"/>
-              <w:jc w:val="left"/>
-            </w:pPr>
-            <w:r>
-              <w:t xml:space="preserve">[ ]</w:t>
-            </w:r>
-          </w:p>
-        </w:tc>
-      </w:tr>
-      <w:tr>
-        <w:tc>
-          <w:tcPr/>
-          <w:p>
-            <w:pPr>
-              <w:pStyle w:val="Compact"/>
-              <w:jc w:val="left"/>
-            </w:pPr>
-            <w:r>
-              <w:t xml:space="preserve">17</w:t>
-            </w:r>
-          </w:p>
-        </w:tc>
-        <w:tc>
-          <w:tcPr/>
-          <w:p>
-            <w:pPr>
-              <w:pStyle w:val="Compact"/>
-              <w:jc w:val="left"/>
-            </w:pPr>
-            <w:r>
-              <w:t xml:space="preserve">Toàn cảnh: một nhiệm vụ khoa học đi qua AI Agent</w:t>
-            </w:r>
-          </w:p>
-        </w:tc>
-        <w:tc>
-          <w:tcPr/>
-          <w:p>
-            <w:pPr>
-              <w:pStyle w:val="Compact"/>
-              <w:jc w:val="left"/>
-            </w:pPr>
-            <w:r>
-              <w:t xml:space="preserve">III</w:t>
-            </w:r>
-          </w:p>
-        </w:tc>
-        <w:tc>
-          <w:tcPr/>
-          <w:p>
-            <w:pPr>
-              <w:pStyle w:val="Compact"/>
-              <w:jc w:val="left"/>
-            </w:pPr>
-            <w:r>
-              <w:t xml:space="preserve">2′</w:t>
-            </w:r>
-          </w:p>
-        </w:tc>
-        <w:tc>
-          <w:tcPr/>
-          <w:p>
-            <w:pPr>
-              <w:pStyle w:val="Compact"/>
-              <w:jc w:val="left"/>
-            </w:pPr>
-            <w:r>
-              <w:t xml:space="preserve">[ ]</w:t>
-            </w:r>
-          </w:p>
-        </w:tc>
-      </w:tr>
-      <w:tr>
-        <w:tc>
-          <w:tcPr/>
-          <w:p>
-            <w:pPr>
-              <w:pStyle w:val="Compact"/>
-              <w:jc w:val="left"/>
-            </w:pPr>
-            <w:r>
-              <w:t xml:space="preserve">18</w:t>
-            </w:r>
-          </w:p>
-        </w:tc>
-        <w:tc>
-          <w:tcPr/>
-          <w:p>
-            <w:pPr>
-              <w:pStyle w:val="Compact"/>
-              <w:jc w:val="left"/>
-            </w:pPr>
-            <w:r>
-              <w:t xml:space="preserve">Skill và khoa học mở: nền móng của tự động hóa</w:t>
+              <w:t xml:space="preserve">21</w:t>
+            </w:r>
+          </w:p>
+        </w:tc>
+        <w:tc>
+          <w:tcPr/>
+          <w:p>
+            <w:pPr>
+              <w:pStyle w:val="Compact"/>
+              <w:jc w:val="left"/>
+            </w:pPr>
+            <w:r>
+              <w:t xml:space="preserve">Trao đổi và thảo luận</w:t>
             </w:r>
           </w:p>
         </w:tc>
@@ -1528,193 +1714,7 @@
               <w:jc w:val="left"/>
             </w:pPr>
             <w:r>
-              <w:t xml:space="preserve">6′</w:t>
-            </w:r>
-          </w:p>
-        </w:tc>
-        <w:tc>
-          <w:tcPr/>
-          <w:p>
-            <w:pPr>
-              <w:pStyle w:val="Compact"/>
-              <w:jc w:val="left"/>
-            </w:pPr>
-            <w:r>
-              <w:t xml:space="preserve">[ ]</w:t>
-            </w:r>
-          </w:p>
-        </w:tc>
-      </w:tr>
-      <w:tr>
-        <w:tc>
-          <w:tcPr/>
-          <w:p>
-            <w:pPr>
-              <w:pStyle w:val="Compact"/>
-              <w:jc w:val="left"/>
-            </w:pPr>
-            <w:r>
-              <w:t xml:space="preserve">19</w:t>
-            </w:r>
-          </w:p>
-        </w:tc>
-        <w:tc>
-          <w:tcPr/>
-          <w:p>
-            <w:pPr>
-              <w:pStyle w:val="Compact"/>
-              <w:jc w:val="left"/>
-            </w:pPr>
-            <w:r>
-              <w:t xml:space="preserve">Ứng dụng khoa học mở và tự động hóa từng bước đến toàn trình</w:t>
-            </w:r>
-          </w:p>
-        </w:tc>
-        <w:tc>
-          <w:tcPr/>
-          <w:p>
-            <w:pPr>
-              <w:pStyle w:val="Compact"/>
-              <w:jc w:val="left"/>
-            </w:pPr>
-            <w:r>
-              <w:t xml:space="preserve">IV</w:t>
-            </w:r>
-          </w:p>
-        </w:tc>
-        <w:tc>
-          <w:tcPr/>
-          <w:p>
-            <w:pPr>
-              <w:pStyle w:val="Compact"/>
-              <w:jc w:val="left"/>
-            </w:pPr>
-            <w:r>
-              <w:t xml:space="preserve">5′</w:t>
-            </w:r>
-          </w:p>
-        </w:tc>
-        <w:tc>
-          <w:tcPr/>
-          <w:p>
-            <w:pPr>
-              <w:pStyle w:val="Compact"/>
-              <w:jc w:val="left"/>
-            </w:pPr>
-            <w:r>
-              <w:t xml:space="preserve">[ ]</w:t>
-            </w:r>
-          </w:p>
-        </w:tc>
-      </w:tr>
-      <w:tr>
-        <w:tc>
-          <w:tcPr/>
-          <w:p>
-            <w:pPr>
-              <w:pStyle w:val="Compact"/>
-              <w:jc w:val="left"/>
-            </w:pPr>
-            <w:r>
-              <w:t xml:space="preserve">20</w:t>
-            </w:r>
-          </w:p>
-        </w:tc>
-        <w:tc>
-          <w:tcPr/>
-          <w:p>
-            <w:pPr>
-              <w:pStyle w:val="Compact"/>
-              <w:jc w:val="left"/>
-            </w:pPr>
-            <w:r>
-              <w:t xml:space="preserve">Bản đồ quy trình tự động của Trung tâm và năm quyết định của nhà khoa học</w:t>
-            </w:r>
-          </w:p>
-        </w:tc>
-        <w:tc>
-          <w:tcPr/>
-          <w:p>
-            <w:pPr>
-              <w:pStyle w:val="Compact"/>
-              <w:jc w:val="left"/>
-            </w:pPr>
-            <w:r>
-              <w:t xml:space="preserve">IV</w:t>
-            </w:r>
-          </w:p>
-        </w:tc>
-        <w:tc>
-          <w:tcPr/>
-          <w:p>
-            <w:pPr>
-              <w:pStyle w:val="Compact"/>
-              <w:jc w:val="left"/>
-            </w:pPr>
-            <w:r>
-              <w:t xml:space="preserve">4′</w:t>
-            </w:r>
-          </w:p>
-        </w:tc>
-        <w:tc>
-          <w:tcPr/>
-          <w:p>
-            <w:pPr>
-              <w:pStyle w:val="Compact"/>
-              <w:jc w:val="left"/>
-            </w:pPr>
-            <w:r>
-              <w:t xml:space="preserve">[ ]</w:t>
-            </w:r>
-          </w:p>
-        </w:tc>
-      </w:tr>
-      <w:tr>
-        <w:tc>
-          <w:tcPr/>
-          <w:p>
-            <w:pPr>
-              <w:pStyle w:val="Compact"/>
-              <w:jc w:val="left"/>
-            </w:pPr>
-            <w:r>
-              <w:t xml:space="preserve">21</w:t>
-            </w:r>
-          </w:p>
-        </w:tc>
-        <w:tc>
-          <w:tcPr/>
-          <w:p>
-            <w:pPr>
-              <w:pStyle w:val="Compact"/>
-              <w:jc w:val="left"/>
-            </w:pPr>
-            <w:r>
-              <w:t xml:space="preserve">Trao đổi và thảo luận</w:t>
-            </w:r>
-          </w:p>
-        </w:tc>
-        <w:tc>
-          <w:tcPr/>
-          <w:p>
-            <w:pPr>
-              <w:pStyle w:val="Compact"/>
-              <w:jc w:val="left"/>
-            </w:pPr>
-            <w:r>
-              <w:t xml:space="preserve">IV</w:t>
-            </w:r>
-          </w:p>
-        </w:tc>
-        <w:tc>
-          <w:tcPr/>
-          <w:p>
-            <w:pPr>
-              <w:pStyle w:val="Compact"/>
-              <w:jc w:val="left"/>
-            </w:pPr>
-            <w:r>
-              <w:t xml:space="preserve">13′</w:t>
+              <w:t xml:space="preserve">12′</w:t>
             </w:r>
           </w:p>
         </w:tc>
@@ -2030,7 +2030,7 @@
               <w:t xml:space="preserve"> </w:t>
             </w:r>
             <w:r>
-              <w:t xml:space="preserve">= 107′ trình bày + 13′ thảo luận</w:t>
+              <w:t xml:space="preserve">= 108′ trình bày + 12′ thảo luận</w:t>
             </w:r>
           </w:p>
         </w:tc>
@@ -2138,13 +2138,13 @@
     </w:p>
     <w:bookmarkEnd w:id="22"/>
     <w:bookmarkEnd w:id="23"/>
-    <w:bookmarkStart w:id="28" w:name="phần-i.-tổng-quan-18-phút"/>
+    <w:bookmarkStart w:id="28" w:name="phần-i.-tổng-quan-19-phút"/>
     <w:p>
       <w:pPr>
         <w:pStyle w:val="Heading1"/>
       </w:pPr>
       <w:r>
-        <w:t xml:space="preserve">PHẦN I. TỔNG QUAN (18 phút)</w:t>
+        <w:t xml:space="preserve">PHẦN I. TỔNG QUAN (19 phút)</w:t>
       </w:r>
     </w:p>
     <w:p>
@@ -2891,13 +2891,13 @@
       </w:r>
     </w:p>
     <w:bookmarkEnd w:id="25"/>
-    <w:bookmarkStart w:id="26" w:name="X8a8832f61c52e375d7db2ec19d6f17954b116a6"/>
+    <w:bookmarkStart w:id="26" w:name="Xb7ef6a3daef1835cc00e0207c2edcf862d67d5d"/>
     <w:p>
       <w:pPr>
         <w:pStyle w:val="Heading2"/>
       </w:pPr>
       <w:r>
-        <w:t xml:space="preserve">Slide 3 – Năng lực cốt lõi của AI: từ trả lời đến thực hiện (5′)</w:t>
+        <w:t xml:space="preserve">Slide 3 – Năng lực cốt lõi của AI: từ trả lời đến thực hiện (6′)</w:t>
       </w:r>
     </w:p>
     <w:p>
@@ -2969,7 +2969,7 @@
     <w:tbl>
       <w:tblPr>
         <w:tblStyle w:val="Table"/>
-        <w:tblW w:type="auto" w:w="0"/>
+        <w:tblW w:type="pct" w:w="5000"/>
         <w:tblLook w:firstRow="1" w:lastRow="0" w:firstColumn="0" w:lastColumn="0" w:noHBand="0" w:noVBand="0" w:val="0020"/>
         <w:jc w:val="start"/>
       </w:tblPr>
@@ -3162,7 +3162,7 @@
               <w:jc w:val="left"/>
             </w:pPr>
             <w:r>
-              <w:t xml:space="preserve">Tự kiểm tra từng bước</w:t>
+              <w:t xml:space="preserve">Tự kiểm tra từng bước – vẫn cần người xác nhận</w:t>
             </w:r>
           </w:p>
         </w:tc>
@@ -3201,6 +3201,348 @@
             </w:pPr>
             <w:r>
               <w:t xml:space="preserve">Cao hơn</w:t>
+            </w:r>
+          </w:p>
+        </w:tc>
+      </w:tr>
+    </w:tbl>
+    <w:p>
+      <w:pPr>
+        <w:pStyle w:val="BodyText"/>
+      </w:pPr>
+      <w:r>
+        <w:t xml:space="preserve">🆕</w:t>
+      </w:r>
+      <w:r>
+        <w:t xml:space="preserve"> </w:t>
+      </w:r>
+      <w:r>
+        <w:rPr>
+          <w:bCs/>
+          <w:b/>
+        </w:rPr>
+        <w:t xml:space="preserve">Tính năng mới của AI Agent (2024–2026):</w:t>
+      </w:r>
+    </w:p>
+    <w:tbl>
+      <w:tblPr>
+        <w:tblStyle w:val="Table"/>
+        <w:tblW w:type="pct" w:w="5000"/>
+        <w:tblLook w:firstRow="1" w:lastRow="0" w:firstColumn="0" w:lastColumn="0" w:noHBand="0" w:noVBand="0" w:val="0020"/>
+        <w:jc w:val="start"/>
+      </w:tblPr>
+      <w:tblGrid>
+        <w:gridCol w:w="2640"/>
+        <w:gridCol w:w="2640"/>
+        <w:gridCol w:w="2640"/>
+      </w:tblGrid>
+      <w:tr>
+        <w:trPr>
+          <w:tblHeader w:val="true"/>
+        </w:trPr>
+        <w:tc>
+          <w:tcPr/>
+          <w:p>
+            <w:pPr>
+              <w:pStyle w:val="Compact"/>
+              <w:jc w:val="left"/>
+            </w:pPr>
+            <w:r>
+              <w:t xml:space="preserve">Tính năng</w:t>
+            </w:r>
+          </w:p>
+        </w:tc>
+        <w:tc>
+          <w:tcPr/>
+          <w:p>
+            <w:pPr>
+              <w:pStyle w:val="Compact"/>
+              <w:jc w:val="left"/>
+            </w:pPr>
+            <w:r>
+              <w:t xml:space="preserve">Làm được gì cho nhà khoa học</w:t>
+            </w:r>
+          </w:p>
+        </w:tc>
+        <w:tc>
+          <w:tcPr/>
+          <w:p>
+            <w:pPr>
+              <w:pStyle w:val="Compact"/>
+              <w:jc w:val="left"/>
+            </w:pPr>
+            <w:r>
+              <w:t xml:space="preserve">Mốc</w:t>
+            </w:r>
+          </w:p>
+        </w:tc>
+      </w:tr>
+      <w:tr>
+        <w:tc>
+          <w:tcPr/>
+          <w:p>
+            <w:pPr>
+              <w:pStyle w:val="Compact"/>
+              <w:jc w:val="left"/>
+            </w:pPr>
+            <w:r>
+              <w:rPr>
+                <w:bCs/>
+                <w:b/>
+              </w:rPr>
+              <w:t xml:space="preserve">Làm việc tự chủ nhiều giờ</w:t>
+            </w:r>
+          </w:p>
+        </w:tc>
+        <w:tc>
+          <w:tcPr/>
+          <w:p>
+            <w:pPr>
+              <w:pStyle w:val="Compact"/>
+              <w:jc w:val="left"/>
+            </w:pPr>
+            <w:r>
+              <w:t xml:space="preserve">Giao cả chuỗi việc (đọc dữ liệu → phân tích → vẽ biểu đồ → viết báo cáo); AI tự làm, tự sửa lỗi</w:t>
+            </w:r>
+          </w:p>
+        </w:tc>
+        <w:tc>
+          <w:tcPr/>
+          <w:p>
+            <w:pPr>
+              <w:pStyle w:val="Compact"/>
+              <w:jc w:val="left"/>
+            </w:pPr>
+            <w:r>
+              <w:t xml:space="preserve">Độ dài việc AI làm được: ~1 giờ (02/2025) → ≥ 16 giờ (05/2026)</w:t>
+            </w:r>
+          </w:p>
+        </w:tc>
+      </w:tr>
+      <w:tr>
+        <w:tc>
+          <w:tcPr/>
+          <w:p>
+            <w:pPr>
+              <w:pStyle w:val="Compact"/>
+              <w:jc w:val="left"/>
+            </w:pPr>
+            <w:r>
+              <w:rPr>
+                <w:bCs/>
+                <w:b/>
+              </w:rPr>
+              <w:t xml:space="preserve">Nghiên cứu chuyên sâu (Deep Research)</w:t>
+            </w:r>
+          </w:p>
+        </w:tc>
+        <w:tc>
+          <w:tcPr/>
+          <w:p>
+            <w:pPr>
+              <w:pStyle w:val="Compact"/>
+              <w:jc w:val="left"/>
+            </w:pPr>
+            <w:r>
+              <w:t xml:space="preserve">Tự tìm, đọc hàng chục – hàng trăm nguồn, viết báo cáo có trích dẫn</w:t>
+            </w:r>
+          </w:p>
+        </w:tc>
+        <w:tc>
+          <w:tcPr/>
+          <w:p>
+            <w:pPr>
+              <w:pStyle w:val="Compact"/>
+              <w:jc w:val="left"/>
+            </w:pPr>
+            <w:r>
+              <w:t xml:space="preserve">Google 12/2024 · OpenAI 02/2025 · Claude 04/2025</w:t>
+            </w:r>
+          </w:p>
+        </w:tc>
+      </w:tr>
+      <w:tr>
+        <w:tc>
+          <w:tcPr/>
+          <w:p>
+            <w:pPr>
+              <w:pStyle w:val="Compact"/>
+              <w:jc w:val="left"/>
+            </w:pPr>
+            <w:r>
+              <w:rPr>
+                <w:bCs/>
+                <w:b/>
+              </w:rPr>
+              <w:t xml:space="preserve">Sử dụng máy tính</w:t>
+            </w:r>
+          </w:p>
+        </w:tc>
+        <w:tc>
+          <w:tcPr/>
+          <w:p>
+            <w:pPr>
+              <w:pStyle w:val="Compact"/>
+              <w:jc w:val="left"/>
+            </w:pPr>
+            <w:r>
+              <w:t xml:space="preserve">Tự nhìn màn hình, bấm chuột, gõ phím – thao tác trên trang web, phần mềm như người dùng</w:t>
+            </w:r>
+          </w:p>
+        </w:tc>
+        <w:tc>
+          <w:tcPr/>
+          <w:p>
+            <w:pPr>
+              <w:pStyle w:val="Compact"/>
+              <w:jc w:val="left"/>
+            </w:pPr>
+            <w:r>
+              <w:t xml:space="preserve">Anthropic thử nghiệm công khai 10/2024</w:t>
+            </w:r>
+          </w:p>
+        </w:tc>
+      </w:tr>
+      <w:tr>
+        <w:tc>
+          <w:tcPr/>
+          <w:p>
+            <w:pPr>
+              <w:pStyle w:val="Compact"/>
+              <w:jc w:val="left"/>
+            </w:pPr>
+            <w:r>
+              <w:rPr>
+                <w:bCs/>
+                <w:b/>
+              </w:rPr>
+              <w:t xml:space="preserve">Kết nối chuẩn mở MCP</w:t>
+            </w:r>
+          </w:p>
+        </w:tc>
+        <w:tc>
+          <w:tcPr/>
+          <w:p>
+            <w:pPr>
+              <w:pStyle w:val="Compact"/>
+              <w:jc w:val="left"/>
+            </w:pPr>
+            <w:r>
+              <w:t xml:space="preserve">Một</w:t>
+            </w:r>
+            <w:r>
+              <w:t xml:space="preserve"> </w:t>
+            </w:r>
+            <w:r>
+              <w:t xml:space="preserve">“</w:t>
+            </w:r>
+            <w:r>
+              <w:t xml:space="preserve">ổ cắm chung</w:t>
+            </w:r>
+            <w:r>
+              <w:t xml:space="preserve">”</w:t>
+            </w:r>
+            <w:r>
+              <w:t xml:space="preserve"> </w:t>
+            </w:r>
+            <w:r>
+              <w:t xml:space="preserve">để AI kết nối cơ sở dữ liệu, kho tài liệu, phần mềm</w:t>
+            </w:r>
+          </w:p>
+        </w:tc>
+        <w:tc>
+          <w:tcPr/>
+          <w:p>
+            <w:pPr>
+              <w:pStyle w:val="Compact"/>
+              <w:jc w:val="left"/>
+            </w:pPr>
+            <w:r>
+              <w:t xml:space="preserve">Ra mắt 11/2024; &gt; 10.000 máy chủ kết nối công khai; chuyển cho Linux Foundation 12/2025</w:t>
+            </w:r>
+          </w:p>
+        </w:tc>
+      </w:tr>
+      <w:tr>
+        <w:tc>
+          <w:tcPr/>
+          <w:p>
+            <w:pPr>
+              <w:pStyle w:val="Compact"/>
+              <w:jc w:val="left"/>
+            </w:pPr>
+            <w:r>
+              <w:rPr>
+                <w:bCs/>
+                <w:b/>
+              </w:rPr>
+              <w:t xml:space="preserve">Skill – chuẩn mở</w:t>
+            </w:r>
+          </w:p>
+        </w:tc>
+        <w:tc>
+          <w:tcPr/>
+          <w:p>
+            <w:pPr>
+              <w:pStyle w:val="Compact"/>
+              <w:jc w:val="left"/>
+            </w:pPr>
+            <w:r>
+              <w:t xml:space="preserve">Quy trình mẫu đóng gói một lần, dùng được trên nhiều công cụ AI khác nhau</w:t>
+            </w:r>
+          </w:p>
+        </w:tc>
+        <w:tc>
+          <w:tcPr/>
+          <w:p>
+            <w:pPr>
+              <w:pStyle w:val="Compact"/>
+              <w:jc w:val="left"/>
+            </w:pPr>
+            <w:r>
+              <w:t xml:space="preserve">Chuẩn mở 12/2025 (agentskills.io)</w:t>
+            </w:r>
+          </w:p>
+        </w:tc>
+      </w:tr>
+      <w:tr>
+        <w:tc>
+          <w:tcPr/>
+          <w:p>
+            <w:pPr>
+              <w:pStyle w:val="Compact"/>
+              <w:jc w:val="left"/>
+            </w:pPr>
+            <w:r>
+              <w:rPr>
+                <w:bCs/>
+                <w:b/>
+              </w:rPr>
+              <w:t xml:space="preserve">Chạy nền, theo lịch</w:t>
+            </w:r>
+          </w:p>
+        </w:tc>
+        <w:tc>
+          <w:tcPr/>
+          <w:p>
+            <w:pPr>
+              <w:pStyle w:val="Compact"/>
+              <w:jc w:val="left"/>
+            </w:pPr>
+            <w:r>
+              <w:t xml:space="preserve">Tự chạy định kỳ (ví dụ: bản tin công bố mới mỗi sáng thứ Hai) – không cần ngồi canh</w:t>
+            </w:r>
+          </w:p>
+        </w:tc>
+        <w:tc>
+          <w:tcPr/>
+          <w:p>
+            <w:pPr>
+              <w:pStyle w:val="Compact"/>
+              <w:jc w:val="left"/>
+            </w:pPr>
+            <w:r>
+              <w:t xml:space="preserve">Tác vụ theo lịch trong Cowork (Claude cho Windows, 04/2026)</w:t>
             </w:r>
           </w:p>
         </w:tc>
@@ -3221,7 +3563,79 @@
         <w:t xml:space="preserve"> </w:t>
       </w:r>
       <w:r>
-        <w:t xml:space="preserve">Lập trình là lĩnh vực AI Agent phát triển sớm nhất – 84% lập trình viên đang dùng hoặc dự định dùng AI. Nhà khoa học không cần giỏi lập trình vẫn có thể yêu cầu AI viết và chạy mã xử lý dữ liệu → Slide 16.</w:t>
+        <w:t xml:space="preserve">Lập trình là lĩnh vực AI Agent phát triển sớm nhất – 84% lập trình viên đang dùng hoặc dự định dùng AI. Nhà khoa học không cần giỏi lập trình vẫn có thể yêu cầu AI viết và chạy mã xử lý dữ liệu → Slide 15.</w:t>
+      </w:r>
+    </w:p>
+    <w:p>
+      <w:pPr>
+        <w:pStyle w:val="BlockText"/>
+      </w:pPr>
+      <w:r>
+        <w:t xml:space="preserve">⚠</w:t>
+      </w:r>
+      <w:r>
+        <w:t xml:space="preserve"> </w:t>
+      </w:r>
+      <w:r>
+        <w:rPr>
+          <w:bCs/>
+          <w:b/>
+        </w:rPr>
+        <w:t xml:space="preserve">AI vẫn có thể sai:</w:t>
+      </w:r>
+      <w:r>
+        <w:t xml:space="preserve"> </w:t>
+      </w:r>
+      <w:r>
+        <w:t xml:space="preserve">bịa tài liệu tham khảo, tính nhầm, chọn sai phương pháp mà vẫn trả lời rất tự tin → nhà khoa học kiểm tra lại mọi kết quả.</w:t>
+      </w:r>
+      <w:r>
+        <w:t xml:space="preserve"> </w:t>
+      </w:r>
+      <w:r>
+        <w:rPr>
+          <w:iCs/>
+          <w:i/>
+        </w:rPr>
+        <w:t xml:space="preserve">Ví dụ từ dự án ăn mòn của bài này:</w:t>
+      </w:r>
+      <w:r>
+        <w:t xml:space="preserve"> </w:t>
+      </w:r>
+      <w:r>
+        <w:t xml:space="preserve">AI</w:t>
+      </w:r>
+      <w:r>
+        <w:t xml:space="preserve"> </w:t>
+      </w:r>
+      <w:r>
+        <w:rPr>
+          <w:bCs/>
+          <w:b/>
+        </w:rPr>
+        <w:t xml:space="preserve">phát hiện</w:t>
+      </w:r>
+      <w:r>
+        <w:t xml:space="preserve"> </w:t>
+      </w:r>
+      <w:r>
+        <w:t xml:space="preserve">lỗi đơn vị trong bộ dữ liệu đã công bố (ghi g/m², thực tế µm/năm) – nhưng cách tìm số đo bất thường AI chọn lần đầu lại</w:t>
+      </w:r>
+      <w:r>
+        <w:t xml:space="preserve"> </w:t>
+      </w:r>
+      <w:r>
+        <w:rPr>
+          <w:bCs/>
+          <w:b/>
+        </w:rPr>
+        <w:t xml:space="preserve">đánh dấu nhầm</w:t>
+      </w:r>
+      <w:r>
+        <w:t xml:space="preserve"> </w:t>
+      </w:r>
+      <w:r>
+        <w:t xml:space="preserve">20 giá trị bình thường và bỏ sót lỗi gõ nhầm.</w:t>
       </w:r>
     </w:p>
     <w:p>
@@ -11404,13 +11818,13 @@
       </w:r>
     </w:p>
     <w:bookmarkEnd w:id="46"/>
-    <w:bookmarkStart w:id="47" w:name="slide-21-trao-đổi-và-thảo-luận-13"/>
+    <w:bookmarkStart w:id="47" w:name="slide-21-trao-đổi-và-thảo-luận-12"/>
     <w:p>
       <w:pPr>
         <w:pStyle w:val="Heading2"/>
       </w:pPr>
       <w:r>
-        <w:t xml:space="preserve">Slide 21 – Trao đổi và thảo luận (13′)</w:t>
+        <w:t xml:space="preserve">Slide 21 – Trao đổi và thảo luận (12′)</w:t>
       </w:r>
     </w:p>
     <w:p>

</xml_diff>

<commit_message>
Slide 3: thêm tính năng mới của AI Agent và ô giới hạn (#3)
Claude-Session: https://claude.ai/code/session_01JoSsghLRHTtvcNzYXbKpzE

Co-authored-by: Claude <noreply@anthropic.com>
</commit_message>
<xml_diff>
--- a/thuyet-trinh/DANH-SACH-SLIDE-v2.5.docx
+++ b/thuyet-trinh/DANH-SACH-SLIDE-v2.5.docx
@@ -121,7 +121,7 @@
         <w:t xml:space="preserve">”</w:t>
       </w:r>
       <w:r>
-        <w:t xml:space="preserve">.</w:t>
+        <w:t xml:space="preserve">; Slide 3 thêm tính năng mới của AI Agent và ô giới hạn (6′, thảo luận còn 12′).</w:t>
       </w:r>
       <w:r>
         <w:t xml:space="preserve"> </w:t>
@@ -598,6 +598,130 @@
               <w:jc w:val="left"/>
             </w:pPr>
             <w:r>
+              <w:t xml:space="preserve">6′</w:t>
+            </w:r>
+          </w:p>
+        </w:tc>
+        <w:tc>
+          <w:tcPr/>
+          <w:p>
+            <w:pPr>
+              <w:pStyle w:val="Compact"/>
+              <w:jc w:val="left"/>
+            </w:pPr>
+            <w:r>
+              <w:t xml:space="preserve">[ ]</w:t>
+            </w:r>
+          </w:p>
+        </w:tc>
+      </w:tr>
+      <w:tr>
+        <w:tc>
+          <w:tcPr/>
+          <w:p>
+            <w:pPr>
+              <w:pStyle w:val="Compact"/>
+              <w:jc w:val="left"/>
+            </w:pPr>
+            <w:r>
+              <w:t xml:space="preserve">4</w:t>
+            </w:r>
+          </w:p>
+        </w:tc>
+        <w:tc>
+          <w:tcPr/>
+          <w:p>
+            <w:pPr>
+              <w:pStyle w:val="Compact"/>
+              <w:jc w:val="left"/>
+            </w:pPr>
+            <w:r>
+              <w:t xml:space="preserve">Phương thức nghiên cứu đang thay đổi</w:t>
+            </w:r>
+          </w:p>
+        </w:tc>
+        <w:tc>
+          <w:tcPr/>
+          <w:p>
+            <w:pPr>
+              <w:pStyle w:val="Compact"/>
+              <w:jc w:val="left"/>
+            </w:pPr>
+            <w:r>
+              <w:t xml:space="preserve">I</w:t>
+            </w:r>
+          </w:p>
+        </w:tc>
+        <w:tc>
+          <w:tcPr/>
+          <w:p>
+            <w:pPr>
+              <w:pStyle w:val="Compact"/>
+              <w:jc w:val="left"/>
+            </w:pPr>
+            <w:r>
+              <w:t xml:space="preserve">4′</w:t>
+            </w:r>
+          </w:p>
+        </w:tc>
+        <w:tc>
+          <w:tcPr/>
+          <w:p>
+            <w:pPr>
+              <w:pStyle w:val="Compact"/>
+              <w:jc w:val="left"/>
+            </w:pPr>
+            <w:r>
+              <w:t xml:space="preserve">[ ]</w:t>
+            </w:r>
+          </w:p>
+        </w:tc>
+      </w:tr>
+      <w:tr>
+        <w:tc>
+          <w:tcPr/>
+          <w:p>
+            <w:pPr>
+              <w:pStyle w:val="Compact"/>
+              <w:jc w:val="left"/>
+            </w:pPr>
+            <w:r>
+              <w:t xml:space="preserve">5</w:t>
+            </w:r>
+          </w:p>
+        </w:tc>
+        <w:tc>
+          <w:tcPr/>
+          <w:p>
+            <w:pPr>
+              <w:pStyle w:val="Compact"/>
+              <w:jc w:val="left"/>
+            </w:pPr>
+            <w:r>
+              <w:t xml:space="preserve">Công việc nào cần chatbot, công việc nào cần AI Agent?</w:t>
+            </w:r>
+          </w:p>
+        </w:tc>
+        <w:tc>
+          <w:tcPr/>
+          <w:p>
+            <w:pPr>
+              <w:pStyle w:val="Compact"/>
+              <w:jc w:val="left"/>
+            </w:pPr>
+            <w:r>
+              <w:t xml:space="preserve">II</w:t>
+            </w:r>
+          </w:p>
+        </w:tc>
+        <w:tc>
+          <w:tcPr/>
+          <w:p>
+            <w:pPr>
+              <w:pStyle w:val="Compact"/>
+              <w:jc w:val="left"/>
+            </w:pPr>
+            <w:r>
               <w:t xml:space="preserve">5′</w:t>
             </w:r>
           </w:p>
@@ -624,31 +748,31 @@
               <w:jc w:val="left"/>
             </w:pPr>
             <w:r>
-              <w:t xml:space="preserve">4</w:t>
-            </w:r>
-          </w:p>
-        </w:tc>
-        <w:tc>
-          <w:tcPr/>
-          <w:p>
-            <w:pPr>
-              <w:pStyle w:val="Compact"/>
-              <w:jc w:val="left"/>
-            </w:pPr>
-            <w:r>
-              <w:t xml:space="preserve">Phương thức nghiên cứu đang thay đổi</w:t>
-            </w:r>
-          </w:p>
-        </w:tc>
-        <w:tc>
-          <w:tcPr/>
-          <w:p>
-            <w:pPr>
-              <w:pStyle w:val="Compact"/>
-              <w:jc w:val="left"/>
-            </w:pPr>
-            <w:r>
-              <w:t xml:space="preserve">I</w:t>
+              <w:t xml:space="preserve">6</w:t>
+            </w:r>
+          </w:p>
+        </w:tc>
+        <w:tc>
+          <w:tcPr/>
+          <w:p>
+            <w:pPr>
+              <w:pStyle w:val="Compact"/>
+              <w:jc w:val="left"/>
+            </w:pPr>
+            <w:r>
+              <w:t xml:space="preserve">Các công cụ AI và vai trò khác nhau</w:t>
+            </w:r>
+          </w:p>
+        </w:tc>
+        <w:tc>
+          <w:tcPr/>
+          <w:p>
+            <w:pPr>
+              <w:pStyle w:val="Compact"/>
+              <w:jc w:val="left"/>
+            </w:pPr>
+            <w:r>
+              <w:t xml:space="preserve">II</w:t>
             </w:r>
           </w:p>
         </w:tc>
@@ -686,19 +810,19 @@
               <w:jc w:val="left"/>
             </w:pPr>
             <w:r>
-              <w:t xml:space="preserve">5</w:t>
-            </w:r>
-          </w:p>
-        </w:tc>
-        <w:tc>
-          <w:tcPr/>
-          <w:p>
-            <w:pPr>
-              <w:pStyle w:val="Compact"/>
-              <w:jc w:val="left"/>
-            </w:pPr>
-            <w:r>
-              <w:t xml:space="preserve">Công việc nào cần chatbot, công việc nào cần AI Agent?</w:t>
+              <w:t xml:space="preserve">7</w:t>
+            </w:r>
+          </w:p>
+        </w:tc>
+        <w:tc>
+          <w:tcPr/>
+          <w:p>
+            <w:pPr>
+              <w:pStyle w:val="Compact"/>
+              <w:jc w:val="left"/>
+            </w:pPr>
+            <w:r>
+              <w:t xml:space="preserve">Claude là gì? Các tính năng nổi bật</w:t>
             </w:r>
           </w:p>
         </w:tc>
@@ -722,6 +846,750 @@
               <w:jc w:val="left"/>
             </w:pPr>
             <w:r>
+              <w:t xml:space="preserve">7′</w:t>
+            </w:r>
+          </w:p>
+        </w:tc>
+        <w:tc>
+          <w:tcPr/>
+          <w:p>
+            <w:pPr>
+              <w:pStyle w:val="Compact"/>
+              <w:jc w:val="left"/>
+            </w:pPr>
+            <w:r>
+              <w:t xml:space="preserve">[ ]</w:t>
+            </w:r>
+          </w:p>
+        </w:tc>
+      </w:tr>
+      <w:tr>
+        <w:tc>
+          <w:tcPr/>
+          <w:p>
+            <w:pPr>
+              <w:pStyle w:val="Compact"/>
+              <w:jc w:val="left"/>
+            </w:pPr>
+            <w:r>
+              <w:t xml:space="preserve">8</w:t>
+            </w:r>
+          </w:p>
+        </w:tc>
+        <w:tc>
+          <w:tcPr/>
+          <w:p>
+            <w:pPr>
+              <w:pStyle w:val="Compact"/>
+              <w:jc w:val="left"/>
+            </w:pPr>
+            <w:r>
+              <w:t xml:space="preserve">Dùng Claude cơ bản: 6 bước đầu tiên</w:t>
+            </w:r>
+          </w:p>
+        </w:tc>
+        <w:tc>
+          <w:tcPr/>
+          <w:p>
+            <w:pPr>
+              <w:pStyle w:val="Compact"/>
+              <w:jc w:val="left"/>
+            </w:pPr>
+            <w:r>
+              <w:t xml:space="preserve">II</w:t>
+            </w:r>
+          </w:p>
+        </w:tc>
+        <w:tc>
+          <w:tcPr/>
+          <w:p>
+            <w:pPr>
+              <w:pStyle w:val="Compact"/>
+              <w:jc w:val="left"/>
+            </w:pPr>
+            <w:r>
+              <w:t xml:space="preserve">7′</w:t>
+            </w:r>
+          </w:p>
+        </w:tc>
+        <w:tc>
+          <w:tcPr/>
+          <w:p>
+            <w:pPr>
+              <w:pStyle w:val="Compact"/>
+              <w:jc w:val="left"/>
+            </w:pPr>
+            <w:r>
+              <w:t xml:space="preserve">[ ]</w:t>
+            </w:r>
+          </w:p>
+        </w:tc>
+      </w:tr>
+      <w:tr>
+        <w:tc>
+          <w:tcPr/>
+          <w:p>
+            <w:pPr>
+              <w:pStyle w:val="Compact"/>
+              <w:jc w:val="left"/>
+            </w:pPr>
+            <w:r>
+              <w:t xml:space="preserve">9</w:t>
+            </w:r>
+          </w:p>
+        </w:tc>
+        <w:tc>
+          <w:tcPr/>
+          <w:p>
+            <w:pPr>
+              <w:pStyle w:val="Compact"/>
+              <w:jc w:val="left"/>
+            </w:pPr>
+            <w:r>
+              <w:t xml:space="preserve">Một cách giao việc chung cho các công cụ AI Agent</w:t>
+            </w:r>
+          </w:p>
+        </w:tc>
+        <w:tc>
+          <w:tcPr/>
+          <w:p>
+            <w:pPr>
+              <w:pStyle w:val="Compact"/>
+              <w:jc w:val="left"/>
+            </w:pPr>
+            <w:r>
+              <w:t xml:space="preserve">II</w:t>
+            </w:r>
+          </w:p>
+        </w:tc>
+        <w:tc>
+          <w:tcPr/>
+          <w:p>
+            <w:pPr>
+              <w:pStyle w:val="Compact"/>
+              <w:jc w:val="left"/>
+            </w:pPr>
+            <w:r>
+              <w:t xml:space="preserve">6′</w:t>
+            </w:r>
+          </w:p>
+        </w:tc>
+        <w:tc>
+          <w:tcPr/>
+          <w:p>
+            <w:pPr>
+              <w:pStyle w:val="Compact"/>
+              <w:jc w:val="left"/>
+            </w:pPr>
+            <w:r>
+              <w:t xml:space="preserve">[ ]</w:t>
+            </w:r>
+          </w:p>
+        </w:tc>
+      </w:tr>
+      <w:tr>
+        <w:tc>
+          <w:tcPr/>
+          <w:p>
+            <w:pPr>
+              <w:pStyle w:val="Compact"/>
+              <w:jc w:val="left"/>
+            </w:pPr>
+            <w:r>
+              <w:t xml:space="preserve">10</w:t>
+            </w:r>
+          </w:p>
+        </w:tc>
+        <w:tc>
+          <w:tcPr/>
+          <w:p>
+            <w:pPr>
+              <w:pStyle w:val="Compact"/>
+              <w:jc w:val="left"/>
+            </w:pPr>
+            <w:r>
+              <w:t xml:space="preserve">Tổ chức một không gian làm việc nghiên cứu</w:t>
+            </w:r>
+          </w:p>
+        </w:tc>
+        <w:tc>
+          <w:tcPr/>
+          <w:p>
+            <w:pPr>
+              <w:pStyle w:val="Compact"/>
+              <w:jc w:val="left"/>
+            </w:pPr>
+            <w:r>
+              <w:t xml:space="preserve">II</w:t>
+            </w:r>
+          </w:p>
+        </w:tc>
+        <w:tc>
+          <w:tcPr/>
+          <w:p>
+            <w:pPr>
+              <w:pStyle w:val="Compact"/>
+              <w:jc w:val="left"/>
+            </w:pPr>
+            <w:r>
+              <w:t xml:space="preserve">4′</w:t>
+            </w:r>
+          </w:p>
+        </w:tc>
+        <w:tc>
+          <w:tcPr/>
+          <w:p>
+            <w:pPr>
+              <w:pStyle w:val="Compact"/>
+              <w:jc w:val="left"/>
+            </w:pPr>
+            <w:r>
+              <w:t xml:space="preserve">[ ]</w:t>
+            </w:r>
+          </w:p>
+        </w:tc>
+      </w:tr>
+      <w:tr>
+        <w:tc>
+          <w:tcPr/>
+          <w:p>
+            <w:pPr>
+              <w:pStyle w:val="Compact"/>
+              <w:jc w:val="left"/>
+            </w:pPr>
+            <w:r>
+              <w:t xml:space="preserve">11</w:t>
+            </w:r>
+          </w:p>
+        </w:tc>
+        <w:tc>
+          <w:tcPr/>
+          <w:p>
+            <w:pPr>
+              <w:pStyle w:val="Compact"/>
+              <w:jc w:val="left"/>
+            </w:pPr>
+            <w:r>
+              <w:t xml:space="preserve">Skill, Subagent và hệ thống nhiều Agent</w:t>
+            </w:r>
+          </w:p>
+        </w:tc>
+        <w:tc>
+          <w:tcPr/>
+          <w:p>
+            <w:pPr>
+              <w:pStyle w:val="Compact"/>
+              <w:jc w:val="left"/>
+            </w:pPr>
+            <w:r>
+              <w:t xml:space="preserve">II</w:t>
+            </w:r>
+          </w:p>
+        </w:tc>
+        <w:tc>
+          <w:tcPr/>
+          <w:p>
+            <w:pPr>
+              <w:pStyle w:val="Compact"/>
+              <w:jc w:val="left"/>
+            </w:pPr>
+            <w:r>
+              <w:t xml:space="preserve">3′</w:t>
+            </w:r>
+          </w:p>
+        </w:tc>
+        <w:tc>
+          <w:tcPr/>
+          <w:p>
+            <w:pPr>
+              <w:pStyle w:val="Compact"/>
+              <w:jc w:val="left"/>
+            </w:pPr>
+            <w:r>
+              <w:t xml:space="preserve">[ ]</w:t>
+            </w:r>
+          </w:p>
+        </w:tc>
+      </w:tr>
+      <w:tr>
+        <w:tc>
+          <w:tcPr/>
+          <w:p>
+            <w:pPr>
+              <w:pStyle w:val="Compact"/>
+              <w:jc w:val="left"/>
+            </w:pPr>
+            <w:r>
+              <w:t xml:space="preserve">12</w:t>
+            </w:r>
+          </w:p>
+        </w:tc>
+        <w:tc>
+          <w:tcPr/>
+          <w:p>
+            <w:pPr>
+              <w:pStyle w:val="Compact"/>
+              <w:jc w:val="left"/>
+            </w:pPr>
+            <w:r>
+              <w:t xml:space="preserve">Từ tài liệu đến khoảng trống nghiên cứu</w:t>
+            </w:r>
+          </w:p>
+        </w:tc>
+        <w:tc>
+          <w:tcPr/>
+          <w:p>
+            <w:pPr>
+              <w:pStyle w:val="Compact"/>
+              <w:jc w:val="left"/>
+            </w:pPr>
+            <w:r>
+              <w:t xml:space="preserve">III</w:t>
+            </w:r>
+          </w:p>
+        </w:tc>
+        <w:tc>
+          <w:tcPr/>
+          <w:p>
+            <w:pPr>
+              <w:pStyle w:val="Compact"/>
+              <w:jc w:val="left"/>
+            </w:pPr>
+            <w:r>
+              <w:t xml:space="preserve">8′</w:t>
+            </w:r>
+          </w:p>
+        </w:tc>
+        <w:tc>
+          <w:tcPr/>
+          <w:p>
+            <w:pPr>
+              <w:pStyle w:val="Compact"/>
+              <w:jc w:val="left"/>
+            </w:pPr>
+            <w:r>
+              <w:t xml:space="preserve">[ ]</w:t>
+            </w:r>
+          </w:p>
+        </w:tc>
+      </w:tr>
+      <w:tr>
+        <w:tc>
+          <w:tcPr/>
+          <w:p>
+            <w:pPr>
+              <w:pStyle w:val="Compact"/>
+              <w:jc w:val="left"/>
+            </w:pPr>
+            <w:r>
+              <w:t xml:space="preserve">13</w:t>
+            </w:r>
+          </w:p>
+        </w:tc>
+        <w:tc>
+          <w:tcPr/>
+          <w:p>
+            <w:pPr>
+              <w:pStyle w:val="Compact"/>
+              <w:jc w:val="left"/>
+            </w:pPr>
+            <w:r>
+              <w:t xml:space="preserve">Từ khoảng trống đến phiếu đề xuất và thuyết minh – DEMO 1 với biểu mẫu thật của Trung tâm</w:t>
+            </w:r>
+          </w:p>
+        </w:tc>
+        <w:tc>
+          <w:tcPr/>
+          <w:p>
+            <w:pPr>
+              <w:pStyle w:val="Compact"/>
+              <w:jc w:val="left"/>
+            </w:pPr>
+            <w:r>
+              <w:t xml:space="preserve">III</w:t>
+            </w:r>
+          </w:p>
+        </w:tc>
+        <w:tc>
+          <w:tcPr/>
+          <w:p>
+            <w:pPr>
+              <w:pStyle w:val="Compact"/>
+              <w:jc w:val="left"/>
+            </w:pPr>
+            <w:r>
+              <w:t xml:space="preserve">8′</w:t>
+            </w:r>
+          </w:p>
+        </w:tc>
+        <w:tc>
+          <w:tcPr/>
+          <w:p>
+            <w:pPr>
+              <w:pStyle w:val="Compact"/>
+              <w:jc w:val="left"/>
+            </w:pPr>
+            <w:r>
+              <w:t xml:space="preserve">[ ]</w:t>
+            </w:r>
+          </w:p>
+        </w:tc>
+      </w:tr>
+      <w:tr>
+        <w:tc>
+          <w:tcPr/>
+          <w:p>
+            <w:pPr>
+              <w:pStyle w:val="Compact"/>
+              <w:jc w:val="left"/>
+            </w:pPr>
+            <w:r>
+              <w:t xml:space="preserve">14</w:t>
+            </w:r>
+          </w:p>
+        </w:tc>
+        <w:tc>
+          <w:tcPr/>
+          <w:p>
+            <w:pPr>
+              <w:pStyle w:val="Compact"/>
+              <w:jc w:val="left"/>
+            </w:pPr>
+            <w:r>
+              <w:t xml:space="preserve">Thuyết minh, tiến độ và kinh phí theo biểu mẫu Trung tâm</w:t>
+            </w:r>
+          </w:p>
+        </w:tc>
+        <w:tc>
+          <w:tcPr/>
+          <w:p>
+            <w:pPr>
+              <w:pStyle w:val="Compact"/>
+              <w:jc w:val="left"/>
+            </w:pPr>
+            <w:r>
+              <w:t xml:space="preserve">III</w:t>
+            </w:r>
+          </w:p>
+        </w:tc>
+        <w:tc>
+          <w:tcPr/>
+          <w:p>
+            <w:pPr>
+              <w:pStyle w:val="Compact"/>
+              <w:jc w:val="left"/>
+            </w:pPr>
+            <w:r>
+              <w:t xml:space="preserve">6′</w:t>
+            </w:r>
+          </w:p>
+        </w:tc>
+        <w:tc>
+          <w:tcPr/>
+          <w:p>
+            <w:pPr>
+              <w:pStyle w:val="Compact"/>
+              <w:jc w:val="left"/>
+            </w:pPr>
+            <w:r>
+              <w:t xml:space="preserve">[ ]</w:t>
+            </w:r>
+          </w:p>
+        </w:tc>
+      </w:tr>
+      <w:tr>
+        <w:tc>
+          <w:tcPr/>
+          <w:p>
+            <w:pPr>
+              <w:pStyle w:val="Compact"/>
+              <w:jc w:val="left"/>
+            </w:pPr>
+            <w:r>
+              <w:t xml:space="preserve">15</w:t>
+            </w:r>
+          </w:p>
+        </w:tc>
+        <w:tc>
+          <w:tcPr/>
+          <w:p>
+            <w:pPr>
+              <w:pStyle w:val="Compact"/>
+              <w:jc w:val="left"/>
+            </w:pPr>
+            <w:r>
+              <w:t xml:space="preserve">Xử lý dữ liệu bằng mã Python – DEMO 2</w:t>
+            </w:r>
+          </w:p>
+        </w:tc>
+        <w:tc>
+          <w:tcPr/>
+          <w:p>
+            <w:pPr>
+              <w:pStyle w:val="Compact"/>
+              <w:jc w:val="left"/>
+            </w:pPr>
+            <w:r>
+              <w:t xml:space="preserve">III</w:t>
+            </w:r>
+          </w:p>
+        </w:tc>
+        <w:tc>
+          <w:tcPr/>
+          <w:p>
+            <w:pPr>
+              <w:pStyle w:val="Compact"/>
+              <w:jc w:val="left"/>
+            </w:pPr>
+            <w:r>
+              <w:t xml:space="preserve">8′</w:t>
+            </w:r>
+          </w:p>
+        </w:tc>
+        <w:tc>
+          <w:tcPr/>
+          <w:p>
+            <w:pPr>
+              <w:pStyle w:val="Compact"/>
+              <w:jc w:val="left"/>
+            </w:pPr>
+            <w:r>
+              <w:t xml:space="preserve">[ ]</w:t>
+            </w:r>
+          </w:p>
+        </w:tc>
+      </w:tr>
+      <w:tr>
+        <w:tc>
+          <w:tcPr/>
+          <w:p>
+            <w:pPr>
+              <w:pStyle w:val="Compact"/>
+              <w:jc w:val="left"/>
+            </w:pPr>
+            <w:r>
+              <w:t xml:space="preserve">16</w:t>
+            </w:r>
+          </w:p>
+        </w:tc>
+        <w:tc>
+          <w:tcPr/>
+          <w:p>
+            <w:pPr>
+              <w:pStyle w:val="Compact"/>
+              <w:jc w:val="left"/>
+            </w:pPr>
+            <w:r>
+              <w:t xml:space="preserve">Xây dựng bài báo và báo cáo tổng hợp kết quả</w:t>
+            </w:r>
+          </w:p>
+        </w:tc>
+        <w:tc>
+          <w:tcPr/>
+          <w:p>
+            <w:pPr>
+              <w:pStyle w:val="Compact"/>
+              <w:jc w:val="left"/>
+            </w:pPr>
+            <w:r>
+              <w:t xml:space="preserve">III</w:t>
+            </w:r>
+          </w:p>
+        </w:tc>
+        <w:tc>
+          <w:tcPr/>
+          <w:p>
+            <w:pPr>
+              <w:pStyle w:val="Compact"/>
+              <w:jc w:val="left"/>
+            </w:pPr>
+            <w:r>
+              <w:t xml:space="preserve">6′</w:t>
+            </w:r>
+          </w:p>
+        </w:tc>
+        <w:tc>
+          <w:tcPr/>
+          <w:p>
+            <w:pPr>
+              <w:pStyle w:val="Compact"/>
+              <w:jc w:val="left"/>
+            </w:pPr>
+            <w:r>
+              <w:t xml:space="preserve">[ ]</w:t>
+            </w:r>
+          </w:p>
+        </w:tc>
+      </w:tr>
+      <w:tr>
+        <w:tc>
+          <w:tcPr/>
+          <w:p>
+            <w:pPr>
+              <w:pStyle w:val="Compact"/>
+              <w:jc w:val="left"/>
+            </w:pPr>
+            <w:r>
+              <w:t xml:space="preserve">17</w:t>
+            </w:r>
+          </w:p>
+        </w:tc>
+        <w:tc>
+          <w:tcPr/>
+          <w:p>
+            <w:pPr>
+              <w:pStyle w:val="Compact"/>
+              <w:jc w:val="left"/>
+            </w:pPr>
+            <w:r>
+              <w:t xml:space="preserve">Toàn cảnh: một nhiệm vụ khoa học đi qua AI Agent</w:t>
+            </w:r>
+          </w:p>
+        </w:tc>
+        <w:tc>
+          <w:tcPr/>
+          <w:p>
+            <w:pPr>
+              <w:pStyle w:val="Compact"/>
+              <w:jc w:val="left"/>
+            </w:pPr>
+            <w:r>
+              <w:t xml:space="preserve">III</w:t>
+            </w:r>
+          </w:p>
+        </w:tc>
+        <w:tc>
+          <w:tcPr/>
+          <w:p>
+            <w:pPr>
+              <w:pStyle w:val="Compact"/>
+              <w:jc w:val="left"/>
+            </w:pPr>
+            <w:r>
+              <w:t xml:space="preserve">2′</w:t>
+            </w:r>
+          </w:p>
+        </w:tc>
+        <w:tc>
+          <w:tcPr/>
+          <w:p>
+            <w:pPr>
+              <w:pStyle w:val="Compact"/>
+              <w:jc w:val="left"/>
+            </w:pPr>
+            <w:r>
+              <w:t xml:space="preserve">[ ]</w:t>
+            </w:r>
+          </w:p>
+        </w:tc>
+      </w:tr>
+      <w:tr>
+        <w:tc>
+          <w:tcPr/>
+          <w:p>
+            <w:pPr>
+              <w:pStyle w:val="Compact"/>
+              <w:jc w:val="left"/>
+            </w:pPr>
+            <w:r>
+              <w:t xml:space="preserve">18</w:t>
+            </w:r>
+          </w:p>
+        </w:tc>
+        <w:tc>
+          <w:tcPr/>
+          <w:p>
+            <w:pPr>
+              <w:pStyle w:val="Compact"/>
+              <w:jc w:val="left"/>
+            </w:pPr>
+            <w:r>
+              <w:t xml:space="preserve">Skill và khoa học mở: nền móng của tự động hóa</w:t>
+            </w:r>
+          </w:p>
+        </w:tc>
+        <w:tc>
+          <w:tcPr/>
+          <w:p>
+            <w:pPr>
+              <w:pStyle w:val="Compact"/>
+              <w:jc w:val="left"/>
+            </w:pPr>
+            <w:r>
+              <w:t xml:space="preserve">IV</w:t>
+            </w:r>
+          </w:p>
+        </w:tc>
+        <w:tc>
+          <w:tcPr/>
+          <w:p>
+            <w:pPr>
+              <w:pStyle w:val="Compact"/>
+              <w:jc w:val="left"/>
+            </w:pPr>
+            <w:r>
+              <w:t xml:space="preserve">6′</w:t>
+            </w:r>
+          </w:p>
+        </w:tc>
+        <w:tc>
+          <w:tcPr/>
+          <w:p>
+            <w:pPr>
+              <w:pStyle w:val="Compact"/>
+              <w:jc w:val="left"/>
+            </w:pPr>
+            <w:r>
+              <w:t xml:space="preserve">[ ]</w:t>
+            </w:r>
+          </w:p>
+        </w:tc>
+      </w:tr>
+      <w:tr>
+        <w:tc>
+          <w:tcPr/>
+          <w:p>
+            <w:pPr>
+              <w:pStyle w:val="Compact"/>
+              <w:jc w:val="left"/>
+            </w:pPr>
+            <w:r>
+              <w:t xml:space="preserve">19</w:t>
+            </w:r>
+          </w:p>
+        </w:tc>
+        <w:tc>
+          <w:tcPr/>
+          <w:p>
+            <w:pPr>
+              <w:pStyle w:val="Compact"/>
+              <w:jc w:val="left"/>
+            </w:pPr>
+            <w:r>
+              <w:t xml:space="preserve">Ứng dụng khoa học mở và tự động hóa từng bước đến toàn trình</w:t>
+            </w:r>
+          </w:p>
+        </w:tc>
+        <w:tc>
+          <w:tcPr/>
+          <w:p>
+            <w:pPr>
+              <w:pStyle w:val="Compact"/>
+              <w:jc w:val="left"/>
+            </w:pPr>
+            <w:r>
+              <w:t xml:space="preserve">IV</w:t>
+            </w:r>
+          </w:p>
+        </w:tc>
+        <w:tc>
+          <w:tcPr/>
+          <w:p>
+            <w:pPr>
+              <w:pStyle w:val="Compact"/>
+              <w:jc w:val="left"/>
+            </w:pPr>
+            <w:r>
               <w:t xml:space="preserve">5′</w:t>
             </w:r>
           </w:p>
@@ -748,31 +1616,31 @@
               <w:jc w:val="left"/>
             </w:pPr>
             <w:r>
-              <w:t xml:space="preserve">6</w:t>
-            </w:r>
-          </w:p>
-        </w:tc>
-        <w:tc>
-          <w:tcPr/>
-          <w:p>
-            <w:pPr>
-              <w:pStyle w:val="Compact"/>
-              <w:jc w:val="left"/>
-            </w:pPr>
-            <w:r>
-              <w:t xml:space="preserve">Các công cụ AI và vai trò khác nhau</w:t>
-            </w:r>
-          </w:p>
-        </w:tc>
-        <w:tc>
-          <w:tcPr/>
-          <w:p>
-            <w:pPr>
-              <w:pStyle w:val="Compact"/>
-              <w:jc w:val="left"/>
-            </w:pPr>
-            <w:r>
-              <w:t xml:space="preserve">II</w:t>
+              <w:t xml:space="preserve">20</w:t>
+            </w:r>
+          </w:p>
+        </w:tc>
+        <w:tc>
+          <w:tcPr/>
+          <w:p>
+            <w:pPr>
+              <w:pStyle w:val="Compact"/>
+              <w:jc w:val="left"/>
+            </w:pPr>
+            <w:r>
+              <w:t xml:space="preserve">Bản đồ quy trình tự động của Trung tâm và năm quyết định của nhà khoa học</w:t>
+            </w:r>
+          </w:p>
+        </w:tc>
+        <w:tc>
+          <w:tcPr/>
+          <w:p>
+            <w:pPr>
+              <w:pStyle w:val="Compact"/>
+              <w:jc w:val="left"/>
+            </w:pPr>
+            <w:r>
+              <w:t xml:space="preserve">IV</w:t>
             </w:r>
           </w:p>
         </w:tc>
@@ -810,701 +1678,19 @@
               <w:jc w:val="left"/>
             </w:pPr>
             <w:r>
-              <w:t xml:space="preserve">7</w:t>
-            </w:r>
-          </w:p>
-        </w:tc>
-        <w:tc>
-          <w:tcPr/>
-          <w:p>
-            <w:pPr>
-              <w:pStyle w:val="Compact"/>
-              <w:jc w:val="left"/>
-            </w:pPr>
-            <w:r>
-              <w:t xml:space="preserve">Claude là gì? Các tính năng nổi bật</w:t>
-            </w:r>
-          </w:p>
-        </w:tc>
-        <w:tc>
-          <w:tcPr/>
-          <w:p>
-            <w:pPr>
-              <w:pStyle w:val="Compact"/>
-              <w:jc w:val="left"/>
-            </w:pPr>
-            <w:r>
-              <w:t xml:space="preserve">II</w:t>
-            </w:r>
-          </w:p>
-        </w:tc>
-        <w:tc>
-          <w:tcPr/>
-          <w:p>
-            <w:pPr>
-              <w:pStyle w:val="Compact"/>
-              <w:jc w:val="left"/>
-            </w:pPr>
-            <w:r>
-              <w:t xml:space="preserve">7′</w:t>
-            </w:r>
-          </w:p>
-        </w:tc>
-        <w:tc>
-          <w:tcPr/>
-          <w:p>
-            <w:pPr>
-              <w:pStyle w:val="Compact"/>
-              <w:jc w:val="left"/>
-            </w:pPr>
-            <w:r>
-              <w:t xml:space="preserve">[ ]</w:t>
-            </w:r>
-          </w:p>
-        </w:tc>
-      </w:tr>
-      <w:tr>
-        <w:tc>
-          <w:tcPr/>
-          <w:p>
-            <w:pPr>
-              <w:pStyle w:val="Compact"/>
-              <w:jc w:val="left"/>
-            </w:pPr>
-            <w:r>
-              <w:t xml:space="preserve">8</w:t>
-            </w:r>
-          </w:p>
-        </w:tc>
-        <w:tc>
-          <w:tcPr/>
-          <w:p>
-            <w:pPr>
-              <w:pStyle w:val="Compact"/>
-              <w:jc w:val="left"/>
-            </w:pPr>
-            <w:r>
-              <w:t xml:space="preserve">Dùng Claude cơ bản: 6 bước đầu tiên</w:t>
-            </w:r>
-          </w:p>
-        </w:tc>
-        <w:tc>
-          <w:tcPr/>
-          <w:p>
-            <w:pPr>
-              <w:pStyle w:val="Compact"/>
-              <w:jc w:val="left"/>
-            </w:pPr>
-            <w:r>
-              <w:t xml:space="preserve">II</w:t>
-            </w:r>
-          </w:p>
-        </w:tc>
-        <w:tc>
-          <w:tcPr/>
-          <w:p>
-            <w:pPr>
-              <w:pStyle w:val="Compact"/>
-              <w:jc w:val="left"/>
-            </w:pPr>
-            <w:r>
-              <w:t xml:space="preserve">7′</w:t>
-            </w:r>
-          </w:p>
-        </w:tc>
-        <w:tc>
-          <w:tcPr/>
-          <w:p>
-            <w:pPr>
-              <w:pStyle w:val="Compact"/>
-              <w:jc w:val="left"/>
-            </w:pPr>
-            <w:r>
-              <w:t xml:space="preserve">[ ]</w:t>
-            </w:r>
-          </w:p>
-        </w:tc>
-      </w:tr>
-      <w:tr>
-        <w:tc>
-          <w:tcPr/>
-          <w:p>
-            <w:pPr>
-              <w:pStyle w:val="Compact"/>
-              <w:jc w:val="left"/>
-            </w:pPr>
-            <w:r>
-              <w:t xml:space="preserve">9</w:t>
-            </w:r>
-          </w:p>
-        </w:tc>
-        <w:tc>
-          <w:tcPr/>
-          <w:p>
-            <w:pPr>
-              <w:pStyle w:val="Compact"/>
-              <w:jc w:val="left"/>
-            </w:pPr>
-            <w:r>
-              <w:t xml:space="preserve">Một cách giao việc chung cho các công cụ AI Agent</w:t>
-            </w:r>
-          </w:p>
-        </w:tc>
-        <w:tc>
-          <w:tcPr/>
-          <w:p>
-            <w:pPr>
-              <w:pStyle w:val="Compact"/>
-              <w:jc w:val="left"/>
-            </w:pPr>
-            <w:r>
-              <w:t xml:space="preserve">II</w:t>
-            </w:r>
-          </w:p>
-        </w:tc>
-        <w:tc>
-          <w:tcPr/>
-          <w:p>
-            <w:pPr>
-              <w:pStyle w:val="Compact"/>
-              <w:jc w:val="left"/>
-            </w:pPr>
-            <w:r>
-              <w:t xml:space="preserve">6′</w:t>
-            </w:r>
-          </w:p>
-        </w:tc>
-        <w:tc>
-          <w:tcPr/>
-          <w:p>
-            <w:pPr>
-              <w:pStyle w:val="Compact"/>
-              <w:jc w:val="left"/>
-            </w:pPr>
-            <w:r>
-              <w:t xml:space="preserve">[ ]</w:t>
-            </w:r>
-          </w:p>
-        </w:tc>
-      </w:tr>
-      <w:tr>
-        <w:tc>
-          <w:tcPr/>
-          <w:p>
-            <w:pPr>
-              <w:pStyle w:val="Compact"/>
-              <w:jc w:val="left"/>
-            </w:pPr>
-            <w:r>
-              <w:t xml:space="preserve">10</w:t>
-            </w:r>
-          </w:p>
-        </w:tc>
-        <w:tc>
-          <w:tcPr/>
-          <w:p>
-            <w:pPr>
-              <w:pStyle w:val="Compact"/>
-              <w:jc w:val="left"/>
-            </w:pPr>
-            <w:r>
-              <w:t xml:space="preserve">Tổ chức một không gian làm việc nghiên cứu</w:t>
-            </w:r>
-          </w:p>
-        </w:tc>
-        <w:tc>
-          <w:tcPr/>
-          <w:p>
-            <w:pPr>
-              <w:pStyle w:val="Compact"/>
-              <w:jc w:val="left"/>
-            </w:pPr>
-            <w:r>
-              <w:t xml:space="preserve">II</w:t>
-            </w:r>
-          </w:p>
-        </w:tc>
-        <w:tc>
-          <w:tcPr/>
-          <w:p>
-            <w:pPr>
-              <w:pStyle w:val="Compact"/>
-              <w:jc w:val="left"/>
-            </w:pPr>
-            <w:r>
-              <w:t xml:space="preserve">4′</w:t>
-            </w:r>
-          </w:p>
-        </w:tc>
-        <w:tc>
-          <w:tcPr/>
-          <w:p>
-            <w:pPr>
-              <w:pStyle w:val="Compact"/>
-              <w:jc w:val="left"/>
-            </w:pPr>
-            <w:r>
-              <w:t xml:space="preserve">[ ]</w:t>
-            </w:r>
-          </w:p>
-        </w:tc>
-      </w:tr>
-      <w:tr>
-        <w:tc>
-          <w:tcPr/>
-          <w:p>
-            <w:pPr>
-              <w:pStyle w:val="Compact"/>
-              <w:jc w:val="left"/>
-            </w:pPr>
-            <w:r>
-              <w:t xml:space="preserve">11</w:t>
-            </w:r>
-          </w:p>
-        </w:tc>
-        <w:tc>
-          <w:tcPr/>
-          <w:p>
-            <w:pPr>
-              <w:pStyle w:val="Compact"/>
-              <w:jc w:val="left"/>
-            </w:pPr>
-            <w:r>
-              <w:t xml:space="preserve">Skill, Subagent và hệ thống nhiều Agent</w:t>
-            </w:r>
-          </w:p>
-        </w:tc>
-        <w:tc>
-          <w:tcPr/>
-          <w:p>
-            <w:pPr>
-              <w:pStyle w:val="Compact"/>
-              <w:jc w:val="left"/>
-            </w:pPr>
-            <w:r>
-              <w:t xml:space="preserve">II</w:t>
-            </w:r>
-          </w:p>
-        </w:tc>
-        <w:tc>
-          <w:tcPr/>
-          <w:p>
-            <w:pPr>
-              <w:pStyle w:val="Compact"/>
-              <w:jc w:val="left"/>
-            </w:pPr>
-            <w:r>
-              <w:t xml:space="preserve">3′</w:t>
-            </w:r>
-          </w:p>
-        </w:tc>
-        <w:tc>
-          <w:tcPr/>
-          <w:p>
-            <w:pPr>
-              <w:pStyle w:val="Compact"/>
-              <w:jc w:val="left"/>
-            </w:pPr>
-            <w:r>
-              <w:t xml:space="preserve">[ ]</w:t>
-            </w:r>
-          </w:p>
-        </w:tc>
-      </w:tr>
-      <w:tr>
-        <w:tc>
-          <w:tcPr/>
-          <w:p>
-            <w:pPr>
-              <w:pStyle w:val="Compact"/>
-              <w:jc w:val="left"/>
-            </w:pPr>
-            <w:r>
-              <w:t xml:space="preserve">12</w:t>
-            </w:r>
-          </w:p>
-        </w:tc>
-        <w:tc>
-          <w:tcPr/>
-          <w:p>
-            <w:pPr>
-              <w:pStyle w:val="Compact"/>
-              <w:jc w:val="left"/>
-            </w:pPr>
-            <w:r>
-              <w:t xml:space="preserve">Từ tài liệu đến khoảng trống nghiên cứu</w:t>
-            </w:r>
-          </w:p>
-        </w:tc>
-        <w:tc>
-          <w:tcPr/>
-          <w:p>
-            <w:pPr>
-              <w:pStyle w:val="Compact"/>
-              <w:jc w:val="left"/>
-            </w:pPr>
-            <w:r>
-              <w:t xml:space="preserve">III</w:t>
-            </w:r>
-          </w:p>
-        </w:tc>
-        <w:tc>
-          <w:tcPr/>
-          <w:p>
-            <w:pPr>
-              <w:pStyle w:val="Compact"/>
-              <w:jc w:val="left"/>
-            </w:pPr>
-            <w:r>
-              <w:t xml:space="preserve">8′</w:t>
-            </w:r>
-          </w:p>
-        </w:tc>
-        <w:tc>
-          <w:tcPr/>
-          <w:p>
-            <w:pPr>
-              <w:pStyle w:val="Compact"/>
-              <w:jc w:val="left"/>
-            </w:pPr>
-            <w:r>
-              <w:t xml:space="preserve">[ ]</w:t>
-            </w:r>
-          </w:p>
-        </w:tc>
-      </w:tr>
-      <w:tr>
-        <w:tc>
-          <w:tcPr/>
-          <w:p>
-            <w:pPr>
-              <w:pStyle w:val="Compact"/>
-              <w:jc w:val="left"/>
-            </w:pPr>
-            <w:r>
-              <w:t xml:space="preserve">13</w:t>
-            </w:r>
-          </w:p>
-        </w:tc>
-        <w:tc>
-          <w:tcPr/>
-          <w:p>
-            <w:pPr>
-              <w:pStyle w:val="Compact"/>
-              <w:jc w:val="left"/>
-            </w:pPr>
-            <w:r>
-              <w:t xml:space="preserve">Từ khoảng trống đến phiếu đề xuất và thuyết minh – DEMO 1 với biểu mẫu thật của Trung tâm</w:t>
-            </w:r>
-          </w:p>
-        </w:tc>
-        <w:tc>
-          <w:tcPr/>
-          <w:p>
-            <w:pPr>
-              <w:pStyle w:val="Compact"/>
-              <w:jc w:val="left"/>
-            </w:pPr>
-            <w:r>
-              <w:t xml:space="preserve">III</w:t>
-            </w:r>
-          </w:p>
-        </w:tc>
-        <w:tc>
-          <w:tcPr/>
-          <w:p>
-            <w:pPr>
-              <w:pStyle w:val="Compact"/>
-              <w:jc w:val="left"/>
-            </w:pPr>
-            <w:r>
-              <w:t xml:space="preserve">8′</w:t>
-            </w:r>
-          </w:p>
-        </w:tc>
-        <w:tc>
-          <w:tcPr/>
-          <w:p>
-            <w:pPr>
-              <w:pStyle w:val="Compact"/>
-              <w:jc w:val="left"/>
-            </w:pPr>
-            <w:r>
-              <w:t xml:space="preserve">[ ]</w:t>
-            </w:r>
-          </w:p>
-        </w:tc>
-      </w:tr>
-      <w:tr>
-        <w:tc>
-          <w:tcPr/>
-          <w:p>
-            <w:pPr>
-              <w:pStyle w:val="Compact"/>
-              <w:jc w:val="left"/>
-            </w:pPr>
-            <w:r>
-              <w:t xml:space="preserve">14</w:t>
-            </w:r>
-          </w:p>
-        </w:tc>
-        <w:tc>
-          <w:tcPr/>
-          <w:p>
-            <w:pPr>
-              <w:pStyle w:val="Compact"/>
-              <w:jc w:val="left"/>
-            </w:pPr>
-            <w:r>
-              <w:t xml:space="preserve">Thuyết minh, tiến độ và kinh phí theo biểu mẫu Trung tâm</w:t>
-            </w:r>
-          </w:p>
-        </w:tc>
-        <w:tc>
-          <w:tcPr/>
-          <w:p>
-            <w:pPr>
-              <w:pStyle w:val="Compact"/>
-              <w:jc w:val="left"/>
-            </w:pPr>
-            <w:r>
-              <w:t xml:space="preserve">III</w:t>
-            </w:r>
-          </w:p>
-        </w:tc>
-        <w:tc>
-          <w:tcPr/>
-          <w:p>
-            <w:pPr>
-              <w:pStyle w:val="Compact"/>
-              <w:jc w:val="left"/>
-            </w:pPr>
-            <w:r>
-              <w:t xml:space="preserve">6′</w:t>
-            </w:r>
-          </w:p>
-        </w:tc>
-        <w:tc>
-          <w:tcPr/>
-          <w:p>
-            <w:pPr>
-              <w:pStyle w:val="Compact"/>
-              <w:jc w:val="left"/>
-            </w:pPr>
-            <w:r>
-              <w:t xml:space="preserve">[ ]</w:t>
-            </w:r>
-          </w:p>
-        </w:tc>
-      </w:tr>
-      <w:tr>
-        <w:tc>
-          <w:tcPr/>
-          <w:p>
-            <w:pPr>
-              <w:pStyle w:val="Compact"/>
-              <w:jc w:val="left"/>
-            </w:pPr>
-            <w:r>
-              <w:t xml:space="preserve">15</w:t>
-            </w:r>
-          </w:p>
-        </w:tc>
-        <w:tc>
-          <w:tcPr/>
-          <w:p>
-            <w:pPr>
-              <w:pStyle w:val="Compact"/>
-              <w:jc w:val="left"/>
-            </w:pPr>
-            <w:r>
-              <w:t xml:space="preserve">Xử lý dữ liệu bằng mã Python – DEMO 2</w:t>
-            </w:r>
-          </w:p>
-        </w:tc>
-        <w:tc>
-          <w:tcPr/>
-          <w:p>
-            <w:pPr>
-              <w:pStyle w:val="Compact"/>
-              <w:jc w:val="left"/>
-            </w:pPr>
-            <w:r>
-              <w:t xml:space="preserve">III</w:t>
-            </w:r>
-          </w:p>
-        </w:tc>
-        <w:tc>
-          <w:tcPr/>
-          <w:p>
-            <w:pPr>
-              <w:pStyle w:val="Compact"/>
-              <w:jc w:val="left"/>
-            </w:pPr>
-            <w:r>
-              <w:t xml:space="preserve">8′</w:t>
-            </w:r>
-          </w:p>
-        </w:tc>
-        <w:tc>
-          <w:tcPr/>
-          <w:p>
-            <w:pPr>
-              <w:pStyle w:val="Compact"/>
-              <w:jc w:val="left"/>
-            </w:pPr>
-            <w:r>
-              <w:t xml:space="preserve">[ ]</w:t>
-            </w:r>
-          </w:p>
-        </w:tc>
-      </w:tr>
-      <w:tr>
-        <w:tc>
-          <w:tcPr/>
-          <w:p>
-            <w:pPr>
-              <w:pStyle w:val="Compact"/>
-              <w:jc w:val="left"/>
-            </w:pPr>
-            <w:r>
-              <w:t xml:space="preserve">16</w:t>
-            </w:r>
-          </w:p>
-        </w:tc>
-        <w:tc>
-          <w:tcPr/>
-          <w:p>
-            <w:pPr>
-              <w:pStyle w:val="Compact"/>
-              <w:jc w:val="left"/>
-            </w:pPr>
-            <w:r>
-              <w:t xml:space="preserve">Xây dựng bài báo và báo cáo tổng hợp kết quả</w:t>
-            </w:r>
-          </w:p>
-        </w:tc>
-        <w:tc>
-          <w:tcPr/>
-          <w:p>
-            <w:pPr>
-              <w:pStyle w:val="Compact"/>
-              <w:jc w:val="left"/>
-            </w:pPr>
-            <w:r>
-              <w:t xml:space="preserve">III</w:t>
-            </w:r>
-          </w:p>
-        </w:tc>
-        <w:tc>
-          <w:tcPr/>
-          <w:p>
-            <w:pPr>
-              <w:pStyle w:val="Compact"/>
-              <w:jc w:val="left"/>
-            </w:pPr>
-            <w:r>
-              <w:t xml:space="preserve">6′</w:t>
-            </w:r>
-          </w:p>
-        </w:tc>
-        <w:tc>
-          <w:tcPr/>
-          <w:p>
-            <w:pPr>
-              <w:pStyle w:val="Compact"/>
-              <w:jc w:val="left"/>
-            </w:pPr>
-            <w:r>
-              <w:t xml:space="preserve">[ ]</w:t>
-            </w:r>
-          </w:p>
-        </w:tc>
-      </w:tr>
-      <w:tr>
-        <w:tc>
-          <w:tcPr/>
-          <w:p>
-            <w:pPr>
-              <w:pStyle w:val="Compact"/>
-              <w:jc w:val="left"/>
-            </w:pPr>
-            <w:r>
-              <w:t xml:space="preserve">17</w:t>
-            </w:r>
-          </w:p>
-        </w:tc>
-        <w:tc>
-          <w:tcPr/>
-          <w:p>
-            <w:pPr>
-              <w:pStyle w:val="Compact"/>
-              <w:jc w:val="left"/>
-            </w:pPr>
-            <w:r>
-              <w:t xml:space="preserve">Toàn cảnh: một nhiệm vụ khoa học đi qua AI Agent</w:t>
-            </w:r>
-          </w:p>
-        </w:tc>
-        <w:tc>
-          <w:tcPr/>
-          <w:p>
-            <w:pPr>
-              <w:pStyle w:val="Compact"/>
-              <w:jc w:val="left"/>
-            </w:pPr>
-            <w:r>
-              <w:t xml:space="preserve">III</w:t>
-            </w:r>
-          </w:p>
-        </w:tc>
-        <w:tc>
-          <w:tcPr/>
-          <w:p>
-            <w:pPr>
-              <w:pStyle w:val="Compact"/>
-              <w:jc w:val="left"/>
-            </w:pPr>
-            <w:r>
-              <w:t xml:space="preserve">2′</w:t>
-            </w:r>
-          </w:p>
-        </w:tc>
-        <w:tc>
-          <w:tcPr/>
-          <w:p>
-            <w:pPr>
-              <w:pStyle w:val="Compact"/>
-              <w:jc w:val="left"/>
-            </w:pPr>
-            <w:r>
-              <w:t xml:space="preserve">[ ]</w:t>
-            </w:r>
-          </w:p>
-        </w:tc>
-      </w:tr>
-      <w:tr>
-        <w:tc>
-          <w:tcPr/>
-          <w:p>
-            <w:pPr>
-              <w:pStyle w:val="Compact"/>
-              <w:jc w:val="left"/>
-            </w:pPr>
-            <w:r>
-              <w:t xml:space="preserve">18</w:t>
-            </w:r>
-          </w:p>
-        </w:tc>
-        <w:tc>
-          <w:tcPr/>
-          <w:p>
-            <w:pPr>
-              <w:pStyle w:val="Compact"/>
-              <w:jc w:val="left"/>
-            </w:pPr>
-            <w:r>
-              <w:t xml:space="preserve">Skill và khoa học mở: nền móng của tự động hóa</w:t>
+              <w:t xml:space="preserve">21</w:t>
+            </w:r>
+          </w:p>
+        </w:tc>
+        <w:tc>
+          <w:tcPr/>
+          <w:p>
+            <w:pPr>
+              <w:pStyle w:val="Compact"/>
+              <w:jc w:val="left"/>
+            </w:pPr>
+            <w:r>
+              <w:t xml:space="preserve">Trao đổi và thảo luận</w:t>
             </w:r>
           </w:p>
         </w:tc>
@@ -1528,193 +1714,7 @@
               <w:jc w:val="left"/>
             </w:pPr>
             <w:r>
-              <w:t xml:space="preserve">6′</w:t>
-            </w:r>
-          </w:p>
-        </w:tc>
-        <w:tc>
-          <w:tcPr/>
-          <w:p>
-            <w:pPr>
-              <w:pStyle w:val="Compact"/>
-              <w:jc w:val="left"/>
-            </w:pPr>
-            <w:r>
-              <w:t xml:space="preserve">[ ]</w:t>
-            </w:r>
-          </w:p>
-        </w:tc>
-      </w:tr>
-      <w:tr>
-        <w:tc>
-          <w:tcPr/>
-          <w:p>
-            <w:pPr>
-              <w:pStyle w:val="Compact"/>
-              <w:jc w:val="left"/>
-            </w:pPr>
-            <w:r>
-              <w:t xml:space="preserve">19</w:t>
-            </w:r>
-          </w:p>
-        </w:tc>
-        <w:tc>
-          <w:tcPr/>
-          <w:p>
-            <w:pPr>
-              <w:pStyle w:val="Compact"/>
-              <w:jc w:val="left"/>
-            </w:pPr>
-            <w:r>
-              <w:t xml:space="preserve">Ứng dụng khoa học mở và tự động hóa từng bước đến toàn trình</w:t>
-            </w:r>
-          </w:p>
-        </w:tc>
-        <w:tc>
-          <w:tcPr/>
-          <w:p>
-            <w:pPr>
-              <w:pStyle w:val="Compact"/>
-              <w:jc w:val="left"/>
-            </w:pPr>
-            <w:r>
-              <w:t xml:space="preserve">IV</w:t>
-            </w:r>
-          </w:p>
-        </w:tc>
-        <w:tc>
-          <w:tcPr/>
-          <w:p>
-            <w:pPr>
-              <w:pStyle w:val="Compact"/>
-              <w:jc w:val="left"/>
-            </w:pPr>
-            <w:r>
-              <w:t xml:space="preserve">5′</w:t>
-            </w:r>
-          </w:p>
-        </w:tc>
-        <w:tc>
-          <w:tcPr/>
-          <w:p>
-            <w:pPr>
-              <w:pStyle w:val="Compact"/>
-              <w:jc w:val="left"/>
-            </w:pPr>
-            <w:r>
-              <w:t xml:space="preserve">[ ]</w:t>
-            </w:r>
-          </w:p>
-        </w:tc>
-      </w:tr>
-      <w:tr>
-        <w:tc>
-          <w:tcPr/>
-          <w:p>
-            <w:pPr>
-              <w:pStyle w:val="Compact"/>
-              <w:jc w:val="left"/>
-            </w:pPr>
-            <w:r>
-              <w:t xml:space="preserve">20</w:t>
-            </w:r>
-          </w:p>
-        </w:tc>
-        <w:tc>
-          <w:tcPr/>
-          <w:p>
-            <w:pPr>
-              <w:pStyle w:val="Compact"/>
-              <w:jc w:val="left"/>
-            </w:pPr>
-            <w:r>
-              <w:t xml:space="preserve">Bản đồ quy trình tự động của Trung tâm và năm quyết định của nhà khoa học</w:t>
-            </w:r>
-          </w:p>
-        </w:tc>
-        <w:tc>
-          <w:tcPr/>
-          <w:p>
-            <w:pPr>
-              <w:pStyle w:val="Compact"/>
-              <w:jc w:val="left"/>
-            </w:pPr>
-            <w:r>
-              <w:t xml:space="preserve">IV</w:t>
-            </w:r>
-          </w:p>
-        </w:tc>
-        <w:tc>
-          <w:tcPr/>
-          <w:p>
-            <w:pPr>
-              <w:pStyle w:val="Compact"/>
-              <w:jc w:val="left"/>
-            </w:pPr>
-            <w:r>
-              <w:t xml:space="preserve">4′</w:t>
-            </w:r>
-          </w:p>
-        </w:tc>
-        <w:tc>
-          <w:tcPr/>
-          <w:p>
-            <w:pPr>
-              <w:pStyle w:val="Compact"/>
-              <w:jc w:val="left"/>
-            </w:pPr>
-            <w:r>
-              <w:t xml:space="preserve">[ ]</w:t>
-            </w:r>
-          </w:p>
-        </w:tc>
-      </w:tr>
-      <w:tr>
-        <w:tc>
-          <w:tcPr/>
-          <w:p>
-            <w:pPr>
-              <w:pStyle w:val="Compact"/>
-              <w:jc w:val="left"/>
-            </w:pPr>
-            <w:r>
-              <w:t xml:space="preserve">21</w:t>
-            </w:r>
-          </w:p>
-        </w:tc>
-        <w:tc>
-          <w:tcPr/>
-          <w:p>
-            <w:pPr>
-              <w:pStyle w:val="Compact"/>
-              <w:jc w:val="left"/>
-            </w:pPr>
-            <w:r>
-              <w:t xml:space="preserve">Trao đổi và thảo luận</w:t>
-            </w:r>
-          </w:p>
-        </w:tc>
-        <w:tc>
-          <w:tcPr/>
-          <w:p>
-            <w:pPr>
-              <w:pStyle w:val="Compact"/>
-              <w:jc w:val="left"/>
-            </w:pPr>
-            <w:r>
-              <w:t xml:space="preserve">IV</w:t>
-            </w:r>
-          </w:p>
-        </w:tc>
-        <w:tc>
-          <w:tcPr/>
-          <w:p>
-            <w:pPr>
-              <w:pStyle w:val="Compact"/>
-              <w:jc w:val="left"/>
-            </w:pPr>
-            <w:r>
-              <w:t xml:space="preserve">13′</w:t>
+              <w:t xml:space="preserve">12′</w:t>
             </w:r>
           </w:p>
         </w:tc>
@@ -2030,7 +2030,7 @@
               <w:t xml:space="preserve"> </w:t>
             </w:r>
             <w:r>
-              <w:t xml:space="preserve">= 107′ trình bày + 13′ thảo luận</w:t>
+              <w:t xml:space="preserve">= 108′ trình bày + 12′ thảo luận</w:t>
             </w:r>
           </w:p>
         </w:tc>
@@ -2138,13 +2138,13 @@
     </w:p>
     <w:bookmarkEnd w:id="22"/>
     <w:bookmarkEnd w:id="23"/>
-    <w:bookmarkStart w:id="28" w:name="phần-i.-tổng-quan-18-phút"/>
+    <w:bookmarkStart w:id="28" w:name="phần-i.-tổng-quan-19-phút"/>
     <w:p>
       <w:pPr>
         <w:pStyle w:val="Heading1"/>
       </w:pPr>
       <w:r>
-        <w:t xml:space="preserve">PHẦN I. TỔNG QUAN (18 phút)</w:t>
+        <w:t xml:space="preserve">PHẦN I. TỔNG QUAN (19 phút)</w:t>
       </w:r>
     </w:p>
     <w:p>
@@ -2891,13 +2891,13 @@
       </w:r>
     </w:p>
     <w:bookmarkEnd w:id="25"/>
-    <w:bookmarkStart w:id="26" w:name="X8a8832f61c52e375d7db2ec19d6f17954b116a6"/>
+    <w:bookmarkStart w:id="26" w:name="Xb7ef6a3daef1835cc00e0207c2edcf862d67d5d"/>
     <w:p>
       <w:pPr>
         <w:pStyle w:val="Heading2"/>
       </w:pPr>
       <w:r>
-        <w:t xml:space="preserve">Slide 3 – Năng lực cốt lõi của AI: từ trả lời đến thực hiện (5′)</w:t>
+        <w:t xml:space="preserve">Slide 3 – Năng lực cốt lõi của AI: từ trả lời đến thực hiện (6′)</w:t>
       </w:r>
     </w:p>
     <w:p>
@@ -2969,7 +2969,7 @@
     <w:tbl>
       <w:tblPr>
         <w:tblStyle w:val="Table"/>
-        <w:tblW w:type="auto" w:w="0"/>
+        <w:tblW w:type="pct" w:w="5000"/>
         <w:tblLook w:firstRow="1" w:lastRow="0" w:firstColumn="0" w:lastColumn="0" w:noHBand="0" w:noVBand="0" w:val="0020"/>
         <w:jc w:val="start"/>
       </w:tblPr>
@@ -3162,7 +3162,7 @@
               <w:jc w:val="left"/>
             </w:pPr>
             <w:r>
-              <w:t xml:space="preserve">Tự kiểm tra từng bước</w:t>
+              <w:t xml:space="preserve">Tự kiểm tra từng bước – vẫn cần người xác nhận</w:t>
             </w:r>
           </w:p>
         </w:tc>
@@ -3201,6 +3201,348 @@
             </w:pPr>
             <w:r>
               <w:t xml:space="preserve">Cao hơn</w:t>
+            </w:r>
+          </w:p>
+        </w:tc>
+      </w:tr>
+    </w:tbl>
+    <w:p>
+      <w:pPr>
+        <w:pStyle w:val="BodyText"/>
+      </w:pPr>
+      <w:r>
+        <w:t xml:space="preserve">🆕</w:t>
+      </w:r>
+      <w:r>
+        <w:t xml:space="preserve"> </w:t>
+      </w:r>
+      <w:r>
+        <w:rPr>
+          <w:bCs/>
+          <w:b/>
+        </w:rPr>
+        <w:t xml:space="preserve">Tính năng mới của AI Agent (2024–2026):</w:t>
+      </w:r>
+    </w:p>
+    <w:tbl>
+      <w:tblPr>
+        <w:tblStyle w:val="Table"/>
+        <w:tblW w:type="pct" w:w="5000"/>
+        <w:tblLook w:firstRow="1" w:lastRow="0" w:firstColumn="0" w:lastColumn="0" w:noHBand="0" w:noVBand="0" w:val="0020"/>
+        <w:jc w:val="start"/>
+      </w:tblPr>
+      <w:tblGrid>
+        <w:gridCol w:w="2640"/>
+        <w:gridCol w:w="2640"/>
+        <w:gridCol w:w="2640"/>
+      </w:tblGrid>
+      <w:tr>
+        <w:trPr>
+          <w:tblHeader w:val="true"/>
+        </w:trPr>
+        <w:tc>
+          <w:tcPr/>
+          <w:p>
+            <w:pPr>
+              <w:pStyle w:val="Compact"/>
+              <w:jc w:val="left"/>
+            </w:pPr>
+            <w:r>
+              <w:t xml:space="preserve">Tính năng</w:t>
+            </w:r>
+          </w:p>
+        </w:tc>
+        <w:tc>
+          <w:tcPr/>
+          <w:p>
+            <w:pPr>
+              <w:pStyle w:val="Compact"/>
+              <w:jc w:val="left"/>
+            </w:pPr>
+            <w:r>
+              <w:t xml:space="preserve">Làm được gì cho nhà khoa học</w:t>
+            </w:r>
+          </w:p>
+        </w:tc>
+        <w:tc>
+          <w:tcPr/>
+          <w:p>
+            <w:pPr>
+              <w:pStyle w:val="Compact"/>
+              <w:jc w:val="left"/>
+            </w:pPr>
+            <w:r>
+              <w:t xml:space="preserve">Mốc</w:t>
+            </w:r>
+          </w:p>
+        </w:tc>
+      </w:tr>
+      <w:tr>
+        <w:tc>
+          <w:tcPr/>
+          <w:p>
+            <w:pPr>
+              <w:pStyle w:val="Compact"/>
+              <w:jc w:val="left"/>
+            </w:pPr>
+            <w:r>
+              <w:rPr>
+                <w:bCs/>
+                <w:b/>
+              </w:rPr>
+              <w:t xml:space="preserve">Làm việc tự chủ nhiều giờ</w:t>
+            </w:r>
+          </w:p>
+        </w:tc>
+        <w:tc>
+          <w:tcPr/>
+          <w:p>
+            <w:pPr>
+              <w:pStyle w:val="Compact"/>
+              <w:jc w:val="left"/>
+            </w:pPr>
+            <w:r>
+              <w:t xml:space="preserve">Giao cả chuỗi việc (đọc dữ liệu → phân tích → vẽ biểu đồ → viết báo cáo); AI tự làm, tự sửa lỗi</w:t>
+            </w:r>
+          </w:p>
+        </w:tc>
+        <w:tc>
+          <w:tcPr/>
+          <w:p>
+            <w:pPr>
+              <w:pStyle w:val="Compact"/>
+              <w:jc w:val="left"/>
+            </w:pPr>
+            <w:r>
+              <w:t xml:space="preserve">Độ dài việc AI làm được: ~1 giờ (02/2025) → ≥ 16 giờ (05/2026)</w:t>
+            </w:r>
+          </w:p>
+        </w:tc>
+      </w:tr>
+      <w:tr>
+        <w:tc>
+          <w:tcPr/>
+          <w:p>
+            <w:pPr>
+              <w:pStyle w:val="Compact"/>
+              <w:jc w:val="left"/>
+            </w:pPr>
+            <w:r>
+              <w:rPr>
+                <w:bCs/>
+                <w:b/>
+              </w:rPr>
+              <w:t xml:space="preserve">Nghiên cứu chuyên sâu (Deep Research)</w:t>
+            </w:r>
+          </w:p>
+        </w:tc>
+        <w:tc>
+          <w:tcPr/>
+          <w:p>
+            <w:pPr>
+              <w:pStyle w:val="Compact"/>
+              <w:jc w:val="left"/>
+            </w:pPr>
+            <w:r>
+              <w:t xml:space="preserve">Tự tìm, đọc hàng chục – hàng trăm nguồn, viết báo cáo có trích dẫn</w:t>
+            </w:r>
+          </w:p>
+        </w:tc>
+        <w:tc>
+          <w:tcPr/>
+          <w:p>
+            <w:pPr>
+              <w:pStyle w:val="Compact"/>
+              <w:jc w:val="left"/>
+            </w:pPr>
+            <w:r>
+              <w:t xml:space="preserve">Google 12/2024 · OpenAI 02/2025 · Claude 04/2025</w:t>
+            </w:r>
+          </w:p>
+        </w:tc>
+      </w:tr>
+      <w:tr>
+        <w:tc>
+          <w:tcPr/>
+          <w:p>
+            <w:pPr>
+              <w:pStyle w:val="Compact"/>
+              <w:jc w:val="left"/>
+            </w:pPr>
+            <w:r>
+              <w:rPr>
+                <w:bCs/>
+                <w:b/>
+              </w:rPr>
+              <w:t xml:space="preserve">Sử dụng máy tính</w:t>
+            </w:r>
+          </w:p>
+        </w:tc>
+        <w:tc>
+          <w:tcPr/>
+          <w:p>
+            <w:pPr>
+              <w:pStyle w:val="Compact"/>
+              <w:jc w:val="left"/>
+            </w:pPr>
+            <w:r>
+              <w:t xml:space="preserve">Tự nhìn màn hình, bấm chuột, gõ phím – thao tác trên trang web, phần mềm như người dùng</w:t>
+            </w:r>
+          </w:p>
+        </w:tc>
+        <w:tc>
+          <w:tcPr/>
+          <w:p>
+            <w:pPr>
+              <w:pStyle w:val="Compact"/>
+              <w:jc w:val="left"/>
+            </w:pPr>
+            <w:r>
+              <w:t xml:space="preserve">Anthropic thử nghiệm công khai 10/2024</w:t>
+            </w:r>
+          </w:p>
+        </w:tc>
+      </w:tr>
+      <w:tr>
+        <w:tc>
+          <w:tcPr/>
+          <w:p>
+            <w:pPr>
+              <w:pStyle w:val="Compact"/>
+              <w:jc w:val="left"/>
+            </w:pPr>
+            <w:r>
+              <w:rPr>
+                <w:bCs/>
+                <w:b/>
+              </w:rPr>
+              <w:t xml:space="preserve">Kết nối chuẩn mở MCP</w:t>
+            </w:r>
+          </w:p>
+        </w:tc>
+        <w:tc>
+          <w:tcPr/>
+          <w:p>
+            <w:pPr>
+              <w:pStyle w:val="Compact"/>
+              <w:jc w:val="left"/>
+            </w:pPr>
+            <w:r>
+              <w:t xml:space="preserve">Một</w:t>
+            </w:r>
+            <w:r>
+              <w:t xml:space="preserve"> </w:t>
+            </w:r>
+            <w:r>
+              <w:t xml:space="preserve">“</w:t>
+            </w:r>
+            <w:r>
+              <w:t xml:space="preserve">ổ cắm chung</w:t>
+            </w:r>
+            <w:r>
+              <w:t xml:space="preserve">”</w:t>
+            </w:r>
+            <w:r>
+              <w:t xml:space="preserve"> </w:t>
+            </w:r>
+            <w:r>
+              <w:t xml:space="preserve">để AI kết nối cơ sở dữ liệu, kho tài liệu, phần mềm</w:t>
+            </w:r>
+          </w:p>
+        </w:tc>
+        <w:tc>
+          <w:tcPr/>
+          <w:p>
+            <w:pPr>
+              <w:pStyle w:val="Compact"/>
+              <w:jc w:val="left"/>
+            </w:pPr>
+            <w:r>
+              <w:t xml:space="preserve">Ra mắt 11/2024; &gt; 10.000 máy chủ kết nối công khai; chuyển cho Linux Foundation 12/2025</w:t>
+            </w:r>
+          </w:p>
+        </w:tc>
+      </w:tr>
+      <w:tr>
+        <w:tc>
+          <w:tcPr/>
+          <w:p>
+            <w:pPr>
+              <w:pStyle w:val="Compact"/>
+              <w:jc w:val="left"/>
+            </w:pPr>
+            <w:r>
+              <w:rPr>
+                <w:bCs/>
+                <w:b/>
+              </w:rPr>
+              <w:t xml:space="preserve">Skill – chuẩn mở</w:t>
+            </w:r>
+          </w:p>
+        </w:tc>
+        <w:tc>
+          <w:tcPr/>
+          <w:p>
+            <w:pPr>
+              <w:pStyle w:val="Compact"/>
+              <w:jc w:val="left"/>
+            </w:pPr>
+            <w:r>
+              <w:t xml:space="preserve">Quy trình mẫu đóng gói một lần, dùng được trên nhiều công cụ AI khác nhau</w:t>
+            </w:r>
+          </w:p>
+        </w:tc>
+        <w:tc>
+          <w:tcPr/>
+          <w:p>
+            <w:pPr>
+              <w:pStyle w:val="Compact"/>
+              <w:jc w:val="left"/>
+            </w:pPr>
+            <w:r>
+              <w:t xml:space="preserve">Chuẩn mở 12/2025 (agentskills.io)</w:t>
+            </w:r>
+          </w:p>
+        </w:tc>
+      </w:tr>
+      <w:tr>
+        <w:tc>
+          <w:tcPr/>
+          <w:p>
+            <w:pPr>
+              <w:pStyle w:val="Compact"/>
+              <w:jc w:val="left"/>
+            </w:pPr>
+            <w:r>
+              <w:rPr>
+                <w:bCs/>
+                <w:b/>
+              </w:rPr>
+              <w:t xml:space="preserve">Chạy nền, theo lịch</w:t>
+            </w:r>
+          </w:p>
+        </w:tc>
+        <w:tc>
+          <w:tcPr/>
+          <w:p>
+            <w:pPr>
+              <w:pStyle w:val="Compact"/>
+              <w:jc w:val="left"/>
+            </w:pPr>
+            <w:r>
+              <w:t xml:space="preserve">Tự chạy định kỳ (ví dụ: bản tin công bố mới mỗi sáng thứ Hai) – không cần ngồi canh</w:t>
+            </w:r>
+          </w:p>
+        </w:tc>
+        <w:tc>
+          <w:tcPr/>
+          <w:p>
+            <w:pPr>
+              <w:pStyle w:val="Compact"/>
+              <w:jc w:val="left"/>
+            </w:pPr>
+            <w:r>
+              <w:t xml:space="preserve">Tác vụ theo lịch trong Cowork (Claude cho Windows, 04/2026)</w:t>
             </w:r>
           </w:p>
         </w:tc>
@@ -3221,7 +3563,79 @@
         <w:t xml:space="preserve"> </w:t>
       </w:r>
       <w:r>
-        <w:t xml:space="preserve">Lập trình là lĩnh vực AI Agent phát triển sớm nhất – 84% lập trình viên đang dùng hoặc dự định dùng AI. Nhà khoa học không cần giỏi lập trình vẫn có thể yêu cầu AI viết và chạy mã xử lý dữ liệu → Slide 16.</w:t>
+        <w:t xml:space="preserve">Lập trình là lĩnh vực AI Agent phát triển sớm nhất – 84% lập trình viên đang dùng hoặc dự định dùng AI. Nhà khoa học không cần giỏi lập trình vẫn có thể yêu cầu AI viết và chạy mã xử lý dữ liệu → Slide 15.</w:t>
+      </w:r>
+    </w:p>
+    <w:p>
+      <w:pPr>
+        <w:pStyle w:val="BlockText"/>
+      </w:pPr>
+      <w:r>
+        <w:t xml:space="preserve">⚠</w:t>
+      </w:r>
+      <w:r>
+        <w:t xml:space="preserve"> </w:t>
+      </w:r>
+      <w:r>
+        <w:rPr>
+          <w:bCs/>
+          <w:b/>
+        </w:rPr>
+        <w:t xml:space="preserve">AI vẫn có thể sai:</w:t>
+      </w:r>
+      <w:r>
+        <w:t xml:space="preserve"> </w:t>
+      </w:r>
+      <w:r>
+        <w:t xml:space="preserve">bịa tài liệu tham khảo, tính nhầm, chọn sai phương pháp mà vẫn trả lời rất tự tin → nhà khoa học kiểm tra lại mọi kết quả.</w:t>
+      </w:r>
+      <w:r>
+        <w:t xml:space="preserve"> </w:t>
+      </w:r>
+      <w:r>
+        <w:rPr>
+          <w:iCs/>
+          <w:i/>
+        </w:rPr>
+        <w:t xml:space="preserve">Ví dụ từ dự án ăn mòn của bài này:</w:t>
+      </w:r>
+      <w:r>
+        <w:t xml:space="preserve"> </w:t>
+      </w:r>
+      <w:r>
+        <w:t xml:space="preserve">AI</w:t>
+      </w:r>
+      <w:r>
+        <w:t xml:space="preserve"> </w:t>
+      </w:r>
+      <w:r>
+        <w:rPr>
+          <w:bCs/>
+          <w:b/>
+        </w:rPr>
+        <w:t xml:space="preserve">phát hiện</w:t>
+      </w:r>
+      <w:r>
+        <w:t xml:space="preserve"> </w:t>
+      </w:r>
+      <w:r>
+        <w:t xml:space="preserve">lỗi đơn vị trong bộ dữ liệu đã công bố (ghi g/m², thực tế µm/năm) – nhưng cách tìm số đo bất thường AI chọn lần đầu lại</w:t>
+      </w:r>
+      <w:r>
+        <w:t xml:space="preserve"> </w:t>
+      </w:r>
+      <w:r>
+        <w:rPr>
+          <w:bCs/>
+          <w:b/>
+        </w:rPr>
+        <w:t xml:space="preserve">đánh dấu nhầm</w:t>
+      </w:r>
+      <w:r>
+        <w:t xml:space="preserve"> </w:t>
+      </w:r>
+      <w:r>
+        <w:t xml:space="preserve">20 giá trị bình thường và bỏ sót lỗi gõ nhầm.</w:t>
       </w:r>
     </w:p>
     <w:p>
@@ -11404,13 +11818,13 @@
       </w:r>
     </w:p>
     <w:bookmarkEnd w:id="46"/>
-    <w:bookmarkStart w:id="47" w:name="slide-21-trao-đổi-và-thảo-luận-13"/>
+    <w:bookmarkStart w:id="47" w:name="slide-21-trao-đổi-và-thảo-luận-12"/>
     <w:p>
       <w:pPr>
         <w:pStyle w:val="Heading2"/>
       </w:pPr>
       <w:r>
-        <w:t xml:space="preserve">Slide 21 – Trao đổi và thảo luận (13′)</w:t>
+        <w:t xml:space="preserve">Slide 21 – Trao đổi và thảo luận (12′)</w:t>
       </w:r>
     </w:p>
     <w:p>

</xml_diff>

<commit_message>
Đổi tên các slide cho rõ nội dung
Co-Authored-By: Claude Opus 5.5 <noreply@anthropic.com>
Claude-Session: https://claude.ai/code/session_01JoSsghLRHTtvcNzYXbKpzE
</commit_message>
<xml_diff>
--- a/thuyet-trinh/DANH-SACH-SLIDE-v2.5.docx
+++ b/thuyet-trinh/DANH-SACH-SLIDE-v2.5.docx
@@ -466,7 +466,7 @@
               <w:jc w:val="left"/>
             </w:pPr>
             <w:r>
-              <w:t xml:space="preserve">AI đang phát triển nhanh đến mức nào?</w:t>
+              <w:t xml:space="preserve">AI phát triển nhanh đến mức nào: những con số mới nhất</w:t>
             </w:r>
           </w:p>
         </w:tc>
@@ -528,7 +528,7 @@
               <w:jc w:val="left"/>
             </w:pPr>
             <w:r>
-              <w:t xml:space="preserve">AI trong các lĩnh vực khoa học: quốc tế và Việt Nam</w:t>
+              <w:t xml:space="preserve">AI trong khoa học: ví dụ quốc tế và Việt Nam</w:t>
             </w:r>
           </w:p>
         </w:tc>
@@ -590,7 +590,7 @@
               <w:jc w:val="left"/>
             </w:pPr>
             <w:r>
-              <w:t xml:space="preserve">Năng lực cốt lõi của AI: từ trả lời đến thực hiện</w:t>
+              <w:t xml:space="preserve">Năng lực cốt lõi và tính năng mới của AI Agent</w:t>
             </w:r>
           </w:p>
         </w:tc>
@@ -652,7 +652,7 @@
               <w:jc w:val="left"/>
             </w:pPr>
             <w:r>
-              <w:t xml:space="preserve">Phương thức nghiên cứu đang thay đổi</w:t>
+              <w:t xml:space="preserve">Phương thức nghiên cứu đang thay đổi: từ thao tác thủ công đến quy trình liên tục</w:t>
             </w:r>
           </w:p>
         </w:tc>
@@ -714,7 +714,7 @@
               <w:jc w:val="left"/>
             </w:pPr>
             <w:r>
-              <w:t xml:space="preserve">Công việc nào cần chatbot, công việc nào cần AI Agent?</w:t>
+              <w:t xml:space="preserve">Chọn đúng công cụ: việc nào dùng chatbot, việc nào cần AI Agent</w:t>
             </w:r>
           </w:p>
         </w:tc>
@@ -776,7 +776,7 @@
               <w:jc w:val="left"/>
             </w:pPr>
             <w:r>
-              <w:t xml:space="preserve">Các công cụ AI và vai trò khác nhau</w:t>
+              <w:t xml:space="preserve">Các công cụ AI phổ biến và vai trò của từng loại</w:t>
             </w:r>
           </w:p>
         </w:tc>
@@ -838,7 +838,7 @@
               <w:jc w:val="left"/>
             </w:pPr>
             <w:r>
-              <w:t xml:space="preserve">Claude là gì? Các tính năng nổi bật</w:t>
+              <w:t xml:space="preserve">Giới thiệu Claude: mô hình, gói dịch vụ và tính năng nổi bật trên Windows</w:t>
             </w:r>
           </w:p>
         </w:tc>
@@ -900,7 +900,7 @@
               <w:jc w:val="left"/>
             </w:pPr>
             <w:r>
-              <w:t xml:space="preserve">Dùng Claude cơ bản: 6 bước đầu tiên</w:t>
+              <w:t xml:space="preserve">Bắt đầu với Claude: 6 bước đầu tiên và tổng hợp dữ liệu nhiều nguồn</w:t>
             </w:r>
           </w:p>
         </w:tc>
@@ -962,7 +962,7 @@
               <w:jc w:val="left"/>
             </w:pPr>
             <w:r>
-              <w:t xml:space="preserve">Một cách giao việc chung cho các công cụ AI Agent</w:t>
+              <w:t xml:space="preserve">Giao việc cho AI Agent: cách viết yêu cầu 5 bước</w:t>
             </w:r>
           </w:p>
         </w:tc>
@@ -1024,7 +1024,7 @@
               <w:jc w:val="left"/>
             </w:pPr>
             <w:r>
-              <w:t xml:space="preserve">Tổ chức một không gian làm việc nghiên cứu</w:t>
+              <w:t xml:space="preserve">Không gian làm việc nghiên cứu: mỗi nhiệm vụ một dự án</w:t>
             </w:r>
           </w:p>
         </w:tc>
@@ -1148,7 +1148,7 @@
               <w:jc w:val="left"/>
             </w:pPr>
             <w:r>
-              <w:t xml:space="preserve">Từ tài liệu đến khoảng trống nghiên cứu</w:t>
+              <w:t xml:space="preserve">Tổng quan tài liệu: từ bài báo đến khoảng trống nghiên cứu</w:t>
             </w:r>
           </w:p>
         </w:tc>
@@ -1210,7 +1210,7 @@
               <w:jc w:val="left"/>
             </w:pPr>
             <w:r>
-              <w:t xml:space="preserve">Từ khoảng trống đến phiếu đề xuất và thuyết minh – DEMO 1 với biểu mẫu thật của Trung tâm</w:t>
+              <w:t xml:space="preserve">Đề xuất nhiệm vụ: từ khoảng trống đến phiếu đề xuất và thuyết minh – DEMO 1</w:t>
             </w:r>
           </w:p>
         </w:tc>
@@ -1272,7 +1272,7 @@
               <w:jc w:val="left"/>
             </w:pPr>
             <w:r>
-              <w:t xml:space="preserve">Thuyết minh, tiến độ và kinh phí theo biểu mẫu Trung tâm</w:t>
+              <w:t xml:space="preserve">Hồ sơ nhiệm vụ: thuyết minh, tiến độ và kinh phí theo biểu mẫu Trung tâm</w:t>
             </w:r>
           </w:p>
         </w:tc>
@@ -1334,7 +1334,7 @@
               <w:jc w:val="left"/>
             </w:pPr>
             <w:r>
-              <w:t xml:space="preserve">Xử lý dữ liệu bằng mã Python – DEMO 2</w:t>
+              <w:t xml:space="preserve">Xử lý dữ liệu: AI viết và chạy mã Python – DEMO 2</w:t>
             </w:r>
           </w:p>
         </w:tc>
@@ -1396,7 +1396,7 @@
               <w:jc w:val="left"/>
             </w:pPr>
             <w:r>
-              <w:t xml:space="preserve">🆕 Dựng mô hình 3D mô tả quá trình ăn mòn</w:t>
+              <w:t xml:space="preserve">Mô hình 3D: mô phỏng quá trình ăn mòn vật liệu theo thời gian</w:t>
             </w:r>
           </w:p>
         </w:tc>
@@ -1458,7 +1458,7 @@
               <w:jc w:val="left"/>
             </w:pPr>
             <w:r>
-              <w:t xml:space="preserve">🆕 Đề tài có dữ liệu mật: AI viết công cụ, máy không Internet xử lý dữ liệu – DEMO 3</w:t>
+              <w:t xml:space="preserve">Đề tài mật: xây dựng công cụ và xử lý ngay trên máy không kết nối Internet – DEMO 3</w:t>
             </w:r>
           </w:p>
         </w:tc>
@@ -1520,7 +1520,7 @@
               <w:jc w:val="left"/>
             </w:pPr>
             <w:r>
-              <w:t xml:space="preserve">Xây dựng bài báo và báo cáo tổng hợp kết quả</w:t>
+              <w:t xml:space="preserve">Công bố kết quả: bài báo và báo cáo tổng hợp theo nhiều định dạng</w:t>
             </w:r>
           </w:p>
         </w:tc>
@@ -1706,7 +1706,7 @@
               <w:jc w:val="left"/>
             </w:pPr>
             <w:r>
-              <w:t xml:space="preserve">Ứng dụng khoa học mở và tự động hóa từng bước đến toàn trình</w:t>
+              <w:t xml:space="preserve">Tự động hóa từng bước: từ một công việc đến toàn quy trình</w:t>
             </w:r>
           </w:p>
         </w:tc>
@@ -1768,7 +1768,7 @@
               <w:jc w:val="left"/>
             </w:pPr>
             <w:r>
-              <w:t xml:space="preserve">Bản đồ quy trình tự động của Trung tâm và năm quyết định của nhà khoa học</w:t>
+              <w:t xml:space="preserve">Quy trình tự động của Trung tâm và năm quyết định của nhà khoa học</w:t>
             </w:r>
           </w:p>
         </w:tc>
@@ -2294,13 +2294,13 @@
         </w:pict>
       </w:r>
     </w:p>
-    <w:bookmarkStart w:id="24" w:name="Xe712ab02e32995f70e6de1f3e1573e9b7eae964"/>
+    <w:bookmarkStart w:id="24" w:name="X5e2791cf2fb76533d937191050fe8e8749ccf3d"/>
     <w:p>
       <w:pPr>
         <w:pStyle w:val="Heading2"/>
       </w:pPr>
       <w:r>
-        <w:t xml:space="preserve">Slide 1 – AI đang phát triển nhanh đến mức nào? (4′)</w:t>
+        <w:t xml:space="preserve">Slide 1 – AI phát triển nhanh đến mức nào: những con số mới nhất (4′)</w:t>
       </w:r>
     </w:p>
     <w:p>
@@ -2624,13 +2624,13 @@
       </w:r>
     </w:p>
     <w:bookmarkEnd w:id="24"/>
-    <w:bookmarkStart w:id="25" w:name="X9975534e857217555b710cf06517ef0a4677615"/>
+    <w:bookmarkStart w:id="25" w:name="X994b28678e20557dbcc0e00066897a30c6e7b31"/>
     <w:p>
       <w:pPr>
         <w:pStyle w:val="Heading2"/>
       </w:pPr>
       <w:r>
-        <w:t xml:space="preserve">Slide 2 – AI trong các lĩnh vực khoa học: quốc tế và Việt Nam (5′)</w:t>
+        <w:t xml:space="preserve">Slide 2 – AI trong khoa học: ví dụ quốc tế và Việt Nam (5′)</w:t>
       </w:r>
     </w:p>
     <w:p>
@@ -3031,13 +3031,13 @@
       </w:r>
     </w:p>
     <w:bookmarkEnd w:id="25"/>
-    <w:bookmarkStart w:id="26" w:name="Xb7ef6a3daef1835cc00e0207c2edcf862d67d5d"/>
+    <w:bookmarkStart w:id="26" w:name="Xadbfb030a8db414f49527c469921dc167a20dca"/>
     <w:p>
       <w:pPr>
         <w:pStyle w:val="Heading2"/>
       </w:pPr>
       <w:r>
-        <w:t xml:space="preserve">Slide 3 – Năng lực cốt lõi của AI: từ trả lời đến thực hiện (6′)</w:t>
+        <w:t xml:space="preserve">Slide 3 – Năng lực cốt lõi và tính năng mới của AI Agent (6′)</w:t>
       </w:r>
     </w:p>
     <w:p>
@@ -3814,13 +3814,13 @@
       </w:r>
     </w:p>
     <w:bookmarkEnd w:id="26"/>
-    <w:bookmarkStart w:id="27" w:name="Xfe7ba92c981cdfca2b3d8a7e31e0db20a0dedcd"/>
+    <w:bookmarkStart w:id="27" w:name="Xca35d572d693031c60afab96fdfbb1edf71dff5"/>
     <w:p>
       <w:pPr>
         <w:pStyle w:val="Heading2"/>
       </w:pPr>
       <w:r>
-        <w:t xml:space="preserve">Slide 4 – Phương thức nghiên cứu đang thay đổi (4′)</w:t>
+        <w:t xml:space="preserve">Slide 4 – Phương thức nghiên cứu đang thay đổi: từ thao tác thủ công đến quy trình liên tục (4′)</w:t>
       </w:r>
     </w:p>
     <w:p>
@@ -4118,13 +4118,13 @@
         </w:pict>
       </w:r>
     </w:p>
-    <w:bookmarkStart w:id="29" w:name="X65cae3077fa706bc053338588cd42d0a2c2bfdb"/>
+    <w:bookmarkStart w:id="29" w:name="Xf478361b239b1c542bc0de4be4e80db6f7cbc3f"/>
     <w:p>
       <w:pPr>
         <w:pStyle w:val="Heading2"/>
       </w:pPr>
       <w:r>
-        <w:t xml:space="preserve">Slide 5 – Công việc nào cần chatbot, công việc nào cần AI Agent? (5′)</w:t>
+        <w:t xml:space="preserve">Slide 5 – Chọn đúng công cụ: việc nào dùng chatbot, việc nào cần AI Agent (5′)</w:t>
       </w:r>
     </w:p>
     <w:p>
@@ -4541,13 +4541,13 @@
       </w:r>
     </w:p>
     <w:bookmarkEnd w:id="29"/>
-    <w:bookmarkStart w:id="30" w:name="X88cf97816c8622a0aed36f0bd3437cd9c282287"/>
+    <w:bookmarkStart w:id="30" w:name="X5733276d07a97894b7ef5c30fb8f70c96b52f27"/>
     <w:p>
       <w:pPr>
         <w:pStyle w:val="Heading2"/>
       </w:pPr>
       <w:r>
-        <w:t xml:space="preserve">Slide 6 – Các công cụ AI và vai trò khác nhau (4′)</w:t>
+        <w:t xml:space="preserve">Slide 6 – Các công cụ AI phổ biến và vai trò của từng loại (4′)</w:t>
       </w:r>
     </w:p>
     <w:p>
@@ -5017,13 +5017,13 @@
       </w:r>
     </w:p>
     <w:bookmarkEnd w:id="30"/>
-    <w:bookmarkStart w:id="31" w:name="Xef33792c0800ea0192ddac44f30177a87e7b142"/>
+    <w:bookmarkStart w:id="31" w:name="X3cdee8486a783c12ce5155f39202b5659e1017c"/>
     <w:p>
       <w:pPr>
         <w:pStyle w:val="Heading2"/>
       </w:pPr>
       <w:r>
-        <w:t xml:space="preserve">Slide 7 – Claude là gì? Các tính năng nổi bật (7′)</w:t>
+        <w:t xml:space="preserve">Slide 7 – Giới thiệu Claude: mô hình, gói dịch vụ và tính năng nổi bật trên Windows (7′)</w:t>
       </w:r>
     </w:p>
     <w:p>
@@ -5905,13 +5905,13 @@
       </w:r>
     </w:p>
     <w:bookmarkEnd w:id="31"/>
-    <w:bookmarkStart w:id="32" w:name="X1adceb894a6a73f6c8df98b52600f3b25e8f55c"/>
+    <w:bookmarkStart w:id="32" w:name="Xcfe02677acd48312f1a8c3116105c2513a1aa6a"/>
     <w:p>
       <w:pPr>
         <w:pStyle w:val="Heading2"/>
       </w:pPr>
       <w:r>
-        <w:t xml:space="preserve">Slide 8 – Dùng Claude cơ bản: 6 bước đầu tiên (7′)</w:t>
+        <w:t xml:space="preserve">Slide 8 – Bắt đầu với Claude: 6 bước đầu tiên và tổng hợp dữ liệu nhiều nguồn (7′)</w:t>
       </w:r>
     </w:p>
     <w:p>
@@ -6978,13 +6978,13 @@
       </w:r>
     </w:p>
     <w:bookmarkEnd w:id="32"/>
-    <w:bookmarkStart w:id="33" w:name="Xf280f64a57cd5993b5b9bf0818a9fa15d9a92a3"/>
+    <w:bookmarkStart w:id="33" w:name="Xd9d0d6b663c0b8154825a4c4a283f7a088a8679"/>
     <w:p>
       <w:pPr>
         <w:pStyle w:val="Heading2"/>
       </w:pPr>
       <w:r>
-        <w:t xml:space="preserve">Slide 9 – Một cách giao việc chung cho các công cụ AI Agent (6′)</w:t>
+        <w:t xml:space="preserve">Slide 9 – Giao việc cho AI Agent: cách viết yêu cầu 5 bước (6′)</w:t>
       </w:r>
     </w:p>
     <w:p>
@@ -7346,13 +7346,13 @@
       </w:r>
     </w:p>
     <w:bookmarkEnd w:id="33"/>
-    <w:bookmarkStart w:id="34" w:name="X885c49f5fc6578d53bb04d0bf910c4786630114"/>
+    <w:bookmarkStart w:id="34" w:name="X0b923a1a013338280d796ef2440c703039fcd56"/>
     <w:p>
       <w:pPr>
         <w:pStyle w:val="Heading2"/>
       </w:pPr>
       <w:r>
-        <w:t xml:space="preserve">Slide 10 – Tổ chức một không gian làm việc nghiên cứu (3′)</w:t>
+        <w:t xml:space="preserve">Slide 10 – Không gian làm việc nghiên cứu: mỗi nhiệm vụ một dự án (3′)</w:t>
       </w:r>
     </w:p>
     <w:p>
@@ -8101,13 +8101,13 @@
         </w:pict>
       </w:r>
     </w:p>
-    <w:bookmarkStart w:id="37" w:name="X462c62148b59faca7cbeefb81127d7d8c9bf997"/>
+    <w:bookmarkStart w:id="37" w:name="Xd43c46c008d9e4d8849a930e96bda6326ea0cf0"/>
     <w:p>
       <w:pPr>
         <w:pStyle w:val="Heading2"/>
       </w:pPr>
       <w:r>
-        <w:t xml:space="preserve">Slide 12 – Từ tài liệu đến khoảng trống nghiên cứu (7′)</w:t>
+        <w:t xml:space="preserve">Slide 12 – Tổng quan tài liệu: từ bài báo đến khoảng trống nghiên cứu (7′)</w:t>
       </w:r>
     </w:p>
     <w:p>
@@ -8839,13 +8839,13 @@
       </w:r>
     </w:p>
     <w:bookmarkEnd w:id="37"/>
-    <w:bookmarkStart w:id="38" w:name="Xb10b5ed466c8c1cfc6e100dfe700942c6401964"/>
+    <w:bookmarkStart w:id="38" w:name="Xc8ba032270c9c569ced786dfca8e096c44633e5"/>
     <w:p>
       <w:pPr>
         <w:pStyle w:val="Heading2"/>
       </w:pPr>
       <w:r>
-        <w:t xml:space="preserve">Slide 13 – Từ khoảng trống đến phiếu đề xuất và thuyết minh – DEMO 1 với biểu mẫu thật của Trung tâm (7′)</w:t>
+        <w:t xml:space="preserve">Slide 13 – Đề xuất nhiệm vụ: từ khoảng trống đến phiếu đề xuất và thuyết minh – DEMO 1 (7′)</w:t>
       </w:r>
     </w:p>
     <w:p>
@@ -9079,13 +9079,13 @@
       </w:r>
     </w:p>
     <w:bookmarkEnd w:id="38"/>
-    <w:bookmarkStart w:id="39" w:name="X865757dac194ab556d7749bf128da62fce0214c"/>
+    <w:bookmarkStart w:id="39" w:name="Xa112d2126c8edb8d7894d1b2ddf73023b5298a3"/>
     <w:p>
       <w:pPr>
         <w:pStyle w:val="Heading2"/>
       </w:pPr>
       <w:r>
-        <w:t xml:space="preserve">Slide 14 – Thuyết minh, tiến độ và kinh phí theo biểu mẫu Trung tâm (5′)</w:t>
+        <w:t xml:space="preserve">Slide 14 – Hồ sơ nhiệm vụ: thuyết minh, tiến độ và kinh phí theo biểu mẫu Trung tâm (5′)</w:t>
       </w:r>
     </w:p>
     <w:p>
@@ -9315,13 +9315,13 @@
       </w:r>
     </w:p>
     <w:bookmarkEnd w:id="39"/>
-    <w:bookmarkStart w:id="40" w:name="Xd6004ed4779231e798cecedcb47b98abe241b8f"/>
+    <w:bookmarkStart w:id="40" w:name="Xe2df8c0ff55655febd02bc94b617eccf50b4b2e"/>
     <w:p>
       <w:pPr>
         <w:pStyle w:val="Heading2"/>
       </w:pPr>
       <w:r>
-        <w:t xml:space="preserve">Slide 15 – Xử lý dữ liệu bằng mã Python – DEMO 2 (8′)</w:t>
+        <w:t xml:space="preserve">Slide 15 – Xử lý dữ liệu: AI viết và chạy mã Python – DEMO 2 (8′)</w:t>
       </w:r>
     </w:p>
     <w:p>
@@ -9623,13 +9623,13 @@
       </w:r>
     </w:p>
     <w:bookmarkEnd w:id="40"/>
-    <w:bookmarkStart w:id="41" w:name="X5a80a90b9293fcc0871e0cb36e542de94b178e1"/>
+    <w:bookmarkStart w:id="41" w:name="X6b28836b621772ec8296339c72bace8e2eb8206"/>
     <w:p>
       <w:pPr>
         <w:pStyle w:val="Heading2"/>
       </w:pPr>
       <w:r>
-        <w:t xml:space="preserve">Slide 16 – Dựng mô hình 3D mô tả quá trình ăn mòn (3′) 🆕</w:t>
+        <w:t xml:space="preserve">Slide 16 – Mô hình 3D: mô phỏng quá trình ăn mòn vật liệu theo thời gian (3′)</w:t>
       </w:r>
     </w:p>
     <w:p>
@@ -10206,13 +10206,13 @@
       </w:r>
     </w:p>
     <w:bookmarkEnd w:id="41"/>
-    <w:bookmarkStart w:id="42" w:name="X638c9d3b032d0b8d64a03b274815be323179184"/>
+    <w:bookmarkStart w:id="42" w:name="X18c4632885f14876c166db8c4340704c141fe3f"/>
     <w:p>
       <w:pPr>
         <w:pStyle w:val="Heading2"/>
       </w:pPr>
       <w:r>
-        <w:t xml:space="preserve">Slide 17 – Đề tài có dữ liệu mật: AI viết công cụ, máy không Internet xử lý dữ liệu – DEMO 3 (5′) 🆕</w:t>
+        <w:t xml:space="preserve">Slide 17 – Đề tài mật: xây dựng công cụ và xử lý ngay trên máy không kết nối Internet – DEMO 3 (5′)</w:t>
       </w:r>
     </w:p>
     <w:p>
@@ -10796,13 +10796,13 @@
       </w:r>
     </w:p>
     <w:bookmarkEnd w:id="42"/>
-    <w:bookmarkStart w:id="43" w:name="Xa5714a4de64357a8bda9caa7338ba0dbd100e84"/>
+    <w:bookmarkStart w:id="43" w:name="X3d0cb8888c77e00478e39b2807659fc7b9f359f"/>
     <w:p>
       <w:pPr>
         <w:pStyle w:val="Heading2"/>
       </w:pPr>
       <w:r>
-        <w:t xml:space="preserve">Slide 18 – Xây dựng bài báo và báo cáo tổng hợp kết quả (5′)</w:t>
+        <w:t xml:space="preserve">Slide 18 – Công bố kết quả: bài báo và báo cáo tổng hợp theo nhiều định dạng (5′)</w:t>
       </w:r>
     </w:p>
     <w:p>
@@ -11977,13 +11977,13 @@
       </w:r>
     </w:p>
     <w:bookmarkEnd w:id="46"/>
-    <w:bookmarkStart w:id="47" w:name="X2c6bc3a938864947cd8e370a4127836ed7609c8"/>
+    <w:bookmarkStart w:id="47" w:name="Xed3464729fbb4912ed2c4f95a8612249b6e2b90"/>
     <w:p>
       <w:pPr>
         <w:pStyle w:val="Heading2"/>
       </w:pPr>
       <w:r>
-        <w:t xml:space="preserve">Slide 21 – Ứng dụng khoa học mở và tự động hóa từng bước đến toàn trình (5′)</w:t>
+        <w:t xml:space="preserve">Slide 21 – Tự động hóa từng bước: từ một công việc đến toàn quy trình (5′)</w:t>
       </w:r>
     </w:p>
     <w:p>
@@ -12504,13 +12504,13 @@
       </w:r>
     </w:p>
     <w:bookmarkEnd w:id="47"/>
-    <w:bookmarkStart w:id="48" w:name="X3098f8f08e061c03a8d98bf048142b2307de7b1"/>
+    <w:bookmarkStart w:id="48" w:name="X1cb900760096274a3dd5c9fe1f213f586658b4a"/>
     <w:p>
       <w:pPr>
         <w:pStyle w:val="Heading2"/>
       </w:pPr>
       <w:r>
-        <w:t xml:space="preserve">Slide 22 – Bản đồ quy trình tự động của Trung tâm và năm quyết định của nhà khoa học (4′)</w:t>
+        <w:t xml:space="preserve">Slide 22 – Quy trình tự động của Trung tâm và năm quyết định của nhà khoa học (4′)</w:t>
       </w:r>
     </w:p>
     <w:p>

</xml_diff>

<commit_message>
Đổi tên các slide cho rõ nội dung (#5)
Claude-Session: https://claude.ai/code/session_01JoSsghLRHTtvcNzYXbKpzE

Co-authored-by: Claude <noreply@anthropic.com>
</commit_message>
<xml_diff>
--- a/thuyet-trinh/DANH-SACH-SLIDE-v2.5.docx
+++ b/thuyet-trinh/DANH-SACH-SLIDE-v2.5.docx
@@ -466,7 +466,7 @@
               <w:jc w:val="left"/>
             </w:pPr>
             <w:r>
-              <w:t xml:space="preserve">AI đang phát triển nhanh đến mức nào?</w:t>
+              <w:t xml:space="preserve">AI phát triển nhanh đến mức nào: những con số mới nhất</w:t>
             </w:r>
           </w:p>
         </w:tc>
@@ -528,7 +528,7 @@
               <w:jc w:val="left"/>
             </w:pPr>
             <w:r>
-              <w:t xml:space="preserve">AI trong các lĩnh vực khoa học: quốc tế và Việt Nam</w:t>
+              <w:t xml:space="preserve">AI trong khoa học: ví dụ quốc tế và Việt Nam</w:t>
             </w:r>
           </w:p>
         </w:tc>
@@ -590,7 +590,7 @@
               <w:jc w:val="left"/>
             </w:pPr>
             <w:r>
-              <w:t xml:space="preserve">Năng lực cốt lõi của AI: từ trả lời đến thực hiện</w:t>
+              <w:t xml:space="preserve">Năng lực cốt lõi và tính năng mới của AI Agent</w:t>
             </w:r>
           </w:p>
         </w:tc>
@@ -652,7 +652,7 @@
               <w:jc w:val="left"/>
             </w:pPr>
             <w:r>
-              <w:t xml:space="preserve">Phương thức nghiên cứu đang thay đổi</w:t>
+              <w:t xml:space="preserve">Phương thức nghiên cứu đang thay đổi: từ thao tác thủ công đến quy trình liên tục</w:t>
             </w:r>
           </w:p>
         </w:tc>
@@ -714,7 +714,7 @@
               <w:jc w:val="left"/>
             </w:pPr>
             <w:r>
-              <w:t xml:space="preserve">Công việc nào cần chatbot, công việc nào cần AI Agent?</w:t>
+              <w:t xml:space="preserve">Chọn đúng công cụ: việc nào dùng chatbot, việc nào cần AI Agent</w:t>
             </w:r>
           </w:p>
         </w:tc>
@@ -776,7 +776,7 @@
               <w:jc w:val="left"/>
             </w:pPr>
             <w:r>
-              <w:t xml:space="preserve">Các công cụ AI và vai trò khác nhau</w:t>
+              <w:t xml:space="preserve">Các công cụ AI phổ biến và vai trò của từng loại</w:t>
             </w:r>
           </w:p>
         </w:tc>
@@ -838,7 +838,7 @@
               <w:jc w:val="left"/>
             </w:pPr>
             <w:r>
-              <w:t xml:space="preserve">Claude là gì? Các tính năng nổi bật</w:t>
+              <w:t xml:space="preserve">Giới thiệu Claude: mô hình, gói dịch vụ và tính năng nổi bật trên Windows</w:t>
             </w:r>
           </w:p>
         </w:tc>
@@ -900,7 +900,7 @@
               <w:jc w:val="left"/>
             </w:pPr>
             <w:r>
-              <w:t xml:space="preserve">Dùng Claude cơ bản: 6 bước đầu tiên</w:t>
+              <w:t xml:space="preserve">Bắt đầu với Claude: 6 bước đầu tiên và tổng hợp dữ liệu nhiều nguồn</w:t>
             </w:r>
           </w:p>
         </w:tc>
@@ -962,7 +962,7 @@
               <w:jc w:val="left"/>
             </w:pPr>
             <w:r>
-              <w:t xml:space="preserve">Một cách giao việc chung cho các công cụ AI Agent</w:t>
+              <w:t xml:space="preserve">Giao việc cho AI Agent: cách viết yêu cầu 5 bước</w:t>
             </w:r>
           </w:p>
         </w:tc>
@@ -1024,7 +1024,7 @@
               <w:jc w:val="left"/>
             </w:pPr>
             <w:r>
-              <w:t xml:space="preserve">Tổ chức một không gian làm việc nghiên cứu</w:t>
+              <w:t xml:space="preserve">Không gian làm việc nghiên cứu: mỗi nhiệm vụ một dự án</w:t>
             </w:r>
           </w:p>
         </w:tc>
@@ -1148,7 +1148,7 @@
               <w:jc w:val="left"/>
             </w:pPr>
             <w:r>
-              <w:t xml:space="preserve">Từ tài liệu đến khoảng trống nghiên cứu</w:t>
+              <w:t xml:space="preserve">Tổng quan tài liệu: từ bài báo đến khoảng trống nghiên cứu</w:t>
             </w:r>
           </w:p>
         </w:tc>
@@ -1210,7 +1210,7 @@
               <w:jc w:val="left"/>
             </w:pPr>
             <w:r>
-              <w:t xml:space="preserve">Từ khoảng trống đến phiếu đề xuất và thuyết minh – DEMO 1 với biểu mẫu thật của Trung tâm</w:t>
+              <w:t xml:space="preserve">Đề xuất nhiệm vụ: từ khoảng trống đến phiếu đề xuất và thuyết minh – DEMO 1</w:t>
             </w:r>
           </w:p>
         </w:tc>
@@ -1272,7 +1272,7 @@
               <w:jc w:val="left"/>
             </w:pPr>
             <w:r>
-              <w:t xml:space="preserve">Thuyết minh, tiến độ và kinh phí theo biểu mẫu Trung tâm</w:t>
+              <w:t xml:space="preserve">Hồ sơ nhiệm vụ: thuyết minh, tiến độ và kinh phí theo biểu mẫu Trung tâm</w:t>
             </w:r>
           </w:p>
         </w:tc>
@@ -1334,7 +1334,7 @@
               <w:jc w:val="left"/>
             </w:pPr>
             <w:r>
-              <w:t xml:space="preserve">Xử lý dữ liệu bằng mã Python – DEMO 2</w:t>
+              <w:t xml:space="preserve">Xử lý dữ liệu: AI viết và chạy mã Python – DEMO 2</w:t>
             </w:r>
           </w:p>
         </w:tc>
@@ -1396,7 +1396,7 @@
               <w:jc w:val="left"/>
             </w:pPr>
             <w:r>
-              <w:t xml:space="preserve">🆕 Dựng mô hình 3D mô tả quá trình ăn mòn</w:t>
+              <w:t xml:space="preserve">Mô hình 3D: mô phỏng quá trình ăn mòn vật liệu theo thời gian</w:t>
             </w:r>
           </w:p>
         </w:tc>
@@ -1458,7 +1458,7 @@
               <w:jc w:val="left"/>
             </w:pPr>
             <w:r>
-              <w:t xml:space="preserve">🆕 Đề tài có dữ liệu mật: AI viết công cụ, máy không Internet xử lý dữ liệu – DEMO 3</w:t>
+              <w:t xml:space="preserve">Đề tài mật: xây dựng công cụ và xử lý ngay trên máy không kết nối Internet – DEMO 3</w:t>
             </w:r>
           </w:p>
         </w:tc>
@@ -1520,7 +1520,7 @@
               <w:jc w:val="left"/>
             </w:pPr>
             <w:r>
-              <w:t xml:space="preserve">Xây dựng bài báo và báo cáo tổng hợp kết quả</w:t>
+              <w:t xml:space="preserve">Công bố kết quả: bài báo và báo cáo tổng hợp theo nhiều định dạng</w:t>
             </w:r>
           </w:p>
         </w:tc>
@@ -1706,7 +1706,7 @@
               <w:jc w:val="left"/>
             </w:pPr>
             <w:r>
-              <w:t xml:space="preserve">Ứng dụng khoa học mở và tự động hóa từng bước đến toàn trình</w:t>
+              <w:t xml:space="preserve">Tự động hóa từng bước: từ một công việc đến toàn quy trình</w:t>
             </w:r>
           </w:p>
         </w:tc>
@@ -1768,7 +1768,7 @@
               <w:jc w:val="left"/>
             </w:pPr>
             <w:r>
-              <w:t xml:space="preserve">Bản đồ quy trình tự động của Trung tâm và năm quyết định của nhà khoa học</w:t>
+              <w:t xml:space="preserve">Quy trình tự động của Trung tâm và năm quyết định của nhà khoa học</w:t>
             </w:r>
           </w:p>
         </w:tc>
@@ -2294,13 +2294,13 @@
         </w:pict>
       </w:r>
     </w:p>
-    <w:bookmarkStart w:id="24" w:name="Xe712ab02e32995f70e6de1f3e1573e9b7eae964"/>
+    <w:bookmarkStart w:id="24" w:name="X5e2791cf2fb76533d937191050fe8e8749ccf3d"/>
     <w:p>
       <w:pPr>
         <w:pStyle w:val="Heading2"/>
       </w:pPr>
       <w:r>
-        <w:t xml:space="preserve">Slide 1 – AI đang phát triển nhanh đến mức nào? (4′)</w:t>
+        <w:t xml:space="preserve">Slide 1 – AI phát triển nhanh đến mức nào: những con số mới nhất (4′)</w:t>
       </w:r>
     </w:p>
     <w:p>
@@ -2624,13 +2624,13 @@
       </w:r>
     </w:p>
     <w:bookmarkEnd w:id="24"/>
-    <w:bookmarkStart w:id="25" w:name="X9975534e857217555b710cf06517ef0a4677615"/>
+    <w:bookmarkStart w:id="25" w:name="X994b28678e20557dbcc0e00066897a30c6e7b31"/>
     <w:p>
       <w:pPr>
         <w:pStyle w:val="Heading2"/>
       </w:pPr>
       <w:r>
-        <w:t xml:space="preserve">Slide 2 – AI trong các lĩnh vực khoa học: quốc tế và Việt Nam (5′)</w:t>
+        <w:t xml:space="preserve">Slide 2 – AI trong khoa học: ví dụ quốc tế và Việt Nam (5′)</w:t>
       </w:r>
     </w:p>
     <w:p>
@@ -3031,13 +3031,13 @@
       </w:r>
     </w:p>
     <w:bookmarkEnd w:id="25"/>
-    <w:bookmarkStart w:id="26" w:name="Xb7ef6a3daef1835cc00e0207c2edcf862d67d5d"/>
+    <w:bookmarkStart w:id="26" w:name="Xadbfb030a8db414f49527c469921dc167a20dca"/>
     <w:p>
       <w:pPr>
         <w:pStyle w:val="Heading2"/>
       </w:pPr>
       <w:r>
-        <w:t xml:space="preserve">Slide 3 – Năng lực cốt lõi của AI: từ trả lời đến thực hiện (6′)</w:t>
+        <w:t xml:space="preserve">Slide 3 – Năng lực cốt lõi và tính năng mới của AI Agent (6′)</w:t>
       </w:r>
     </w:p>
     <w:p>
@@ -3814,13 +3814,13 @@
       </w:r>
     </w:p>
     <w:bookmarkEnd w:id="26"/>
-    <w:bookmarkStart w:id="27" w:name="Xfe7ba92c981cdfca2b3d8a7e31e0db20a0dedcd"/>
+    <w:bookmarkStart w:id="27" w:name="Xca35d572d693031c60afab96fdfbb1edf71dff5"/>
     <w:p>
       <w:pPr>
         <w:pStyle w:val="Heading2"/>
       </w:pPr>
       <w:r>
-        <w:t xml:space="preserve">Slide 4 – Phương thức nghiên cứu đang thay đổi (4′)</w:t>
+        <w:t xml:space="preserve">Slide 4 – Phương thức nghiên cứu đang thay đổi: từ thao tác thủ công đến quy trình liên tục (4′)</w:t>
       </w:r>
     </w:p>
     <w:p>
@@ -4118,13 +4118,13 @@
         </w:pict>
       </w:r>
     </w:p>
-    <w:bookmarkStart w:id="29" w:name="X65cae3077fa706bc053338588cd42d0a2c2bfdb"/>
+    <w:bookmarkStart w:id="29" w:name="Xf478361b239b1c542bc0de4be4e80db6f7cbc3f"/>
     <w:p>
       <w:pPr>
         <w:pStyle w:val="Heading2"/>
       </w:pPr>
       <w:r>
-        <w:t xml:space="preserve">Slide 5 – Công việc nào cần chatbot, công việc nào cần AI Agent? (5′)</w:t>
+        <w:t xml:space="preserve">Slide 5 – Chọn đúng công cụ: việc nào dùng chatbot, việc nào cần AI Agent (5′)</w:t>
       </w:r>
     </w:p>
     <w:p>
@@ -4541,13 +4541,13 @@
       </w:r>
     </w:p>
     <w:bookmarkEnd w:id="29"/>
-    <w:bookmarkStart w:id="30" w:name="X88cf97816c8622a0aed36f0bd3437cd9c282287"/>
+    <w:bookmarkStart w:id="30" w:name="X5733276d07a97894b7ef5c30fb8f70c96b52f27"/>
     <w:p>
       <w:pPr>
         <w:pStyle w:val="Heading2"/>
       </w:pPr>
       <w:r>
-        <w:t xml:space="preserve">Slide 6 – Các công cụ AI và vai trò khác nhau (4′)</w:t>
+        <w:t xml:space="preserve">Slide 6 – Các công cụ AI phổ biến và vai trò của từng loại (4′)</w:t>
       </w:r>
     </w:p>
     <w:p>
@@ -5017,13 +5017,13 @@
       </w:r>
     </w:p>
     <w:bookmarkEnd w:id="30"/>
-    <w:bookmarkStart w:id="31" w:name="Xef33792c0800ea0192ddac44f30177a87e7b142"/>
+    <w:bookmarkStart w:id="31" w:name="X3cdee8486a783c12ce5155f39202b5659e1017c"/>
     <w:p>
       <w:pPr>
         <w:pStyle w:val="Heading2"/>
       </w:pPr>
       <w:r>
-        <w:t xml:space="preserve">Slide 7 – Claude là gì? Các tính năng nổi bật (7′)</w:t>
+        <w:t xml:space="preserve">Slide 7 – Giới thiệu Claude: mô hình, gói dịch vụ và tính năng nổi bật trên Windows (7′)</w:t>
       </w:r>
     </w:p>
     <w:p>
@@ -5905,13 +5905,13 @@
       </w:r>
     </w:p>
     <w:bookmarkEnd w:id="31"/>
-    <w:bookmarkStart w:id="32" w:name="X1adceb894a6a73f6c8df98b52600f3b25e8f55c"/>
+    <w:bookmarkStart w:id="32" w:name="Xcfe02677acd48312f1a8c3116105c2513a1aa6a"/>
     <w:p>
       <w:pPr>
         <w:pStyle w:val="Heading2"/>
       </w:pPr>
       <w:r>
-        <w:t xml:space="preserve">Slide 8 – Dùng Claude cơ bản: 6 bước đầu tiên (7′)</w:t>
+        <w:t xml:space="preserve">Slide 8 – Bắt đầu với Claude: 6 bước đầu tiên và tổng hợp dữ liệu nhiều nguồn (7′)</w:t>
       </w:r>
     </w:p>
     <w:p>
@@ -6978,13 +6978,13 @@
       </w:r>
     </w:p>
     <w:bookmarkEnd w:id="32"/>
-    <w:bookmarkStart w:id="33" w:name="Xf280f64a57cd5993b5b9bf0818a9fa15d9a92a3"/>
+    <w:bookmarkStart w:id="33" w:name="Xd9d0d6b663c0b8154825a4c4a283f7a088a8679"/>
     <w:p>
       <w:pPr>
         <w:pStyle w:val="Heading2"/>
       </w:pPr>
       <w:r>
-        <w:t xml:space="preserve">Slide 9 – Một cách giao việc chung cho các công cụ AI Agent (6′)</w:t>
+        <w:t xml:space="preserve">Slide 9 – Giao việc cho AI Agent: cách viết yêu cầu 5 bước (6′)</w:t>
       </w:r>
     </w:p>
     <w:p>
@@ -7346,13 +7346,13 @@
       </w:r>
     </w:p>
     <w:bookmarkEnd w:id="33"/>
-    <w:bookmarkStart w:id="34" w:name="X885c49f5fc6578d53bb04d0bf910c4786630114"/>
+    <w:bookmarkStart w:id="34" w:name="X0b923a1a013338280d796ef2440c703039fcd56"/>
     <w:p>
       <w:pPr>
         <w:pStyle w:val="Heading2"/>
       </w:pPr>
       <w:r>
-        <w:t xml:space="preserve">Slide 10 – Tổ chức một không gian làm việc nghiên cứu (3′)</w:t>
+        <w:t xml:space="preserve">Slide 10 – Không gian làm việc nghiên cứu: mỗi nhiệm vụ một dự án (3′)</w:t>
       </w:r>
     </w:p>
     <w:p>
@@ -8101,13 +8101,13 @@
         </w:pict>
       </w:r>
     </w:p>
-    <w:bookmarkStart w:id="37" w:name="X462c62148b59faca7cbeefb81127d7d8c9bf997"/>
+    <w:bookmarkStart w:id="37" w:name="Xd43c46c008d9e4d8849a930e96bda6326ea0cf0"/>
     <w:p>
       <w:pPr>
         <w:pStyle w:val="Heading2"/>
       </w:pPr>
       <w:r>
-        <w:t xml:space="preserve">Slide 12 – Từ tài liệu đến khoảng trống nghiên cứu (7′)</w:t>
+        <w:t xml:space="preserve">Slide 12 – Tổng quan tài liệu: từ bài báo đến khoảng trống nghiên cứu (7′)</w:t>
       </w:r>
     </w:p>
     <w:p>
@@ -8839,13 +8839,13 @@
       </w:r>
     </w:p>
     <w:bookmarkEnd w:id="37"/>
-    <w:bookmarkStart w:id="38" w:name="Xb10b5ed466c8c1cfc6e100dfe700942c6401964"/>
+    <w:bookmarkStart w:id="38" w:name="Xc8ba032270c9c569ced786dfca8e096c44633e5"/>
     <w:p>
       <w:pPr>
         <w:pStyle w:val="Heading2"/>
       </w:pPr>
       <w:r>
-        <w:t xml:space="preserve">Slide 13 – Từ khoảng trống đến phiếu đề xuất và thuyết minh – DEMO 1 với biểu mẫu thật của Trung tâm (7′)</w:t>
+        <w:t xml:space="preserve">Slide 13 – Đề xuất nhiệm vụ: từ khoảng trống đến phiếu đề xuất và thuyết minh – DEMO 1 (7′)</w:t>
       </w:r>
     </w:p>
     <w:p>
@@ -9079,13 +9079,13 @@
       </w:r>
     </w:p>
     <w:bookmarkEnd w:id="38"/>
-    <w:bookmarkStart w:id="39" w:name="X865757dac194ab556d7749bf128da62fce0214c"/>
+    <w:bookmarkStart w:id="39" w:name="Xa112d2126c8edb8d7894d1b2ddf73023b5298a3"/>
     <w:p>
       <w:pPr>
         <w:pStyle w:val="Heading2"/>
       </w:pPr>
       <w:r>
-        <w:t xml:space="preserve">Slide 14 – Thuyết minh, tiến độ và kinh phí theo biểu mẫu Trung tâm (5′)</w:t>
+        <w:t xml:space="preserve">Slide 14 – Hồ sơ nhiệm vụ: thuyết minh, tiến độ và kinh phí theo biểu mẫu Trung tâm (5′)</w:t>
       </w:r>
     </w:p>
     <w:p>
@@ -9315,13 +9315,13 @@
       </w:r>
     </w:p>
     <w:bookmarkEnd w:id="39"/>
-    <w:bookmarkStart w:id="40" w:name="Xd6004ed4779231e798cecedcb47b98abe241b8f"/>
+    <w:bookmarkStart w:id="40" w:name="Xe2df8c0ff55655febd02bc94b617eccf50b4b2e"/>
     <w:p>
       <w:pPr>
         <w:pStyle w:val="Heading2"/>
       </w:pPr>
       <w:r>
-        <w:t xml:space="preserve">Slide 15 – Xử lý dữ liệu bằng mã Python – DEMO 2 (8′)</w:t>
+        <w:t xml:space="preserve">Slide 15 – Xử lý dữ liệu: AI viết và chạy mã Python – DEMO 2 (8′)</w:t>
       </w:r>
     </w:p>
     <w:p>
@@ -9623,13 +9623,13 @@
       </w:r>
     </w:p>
     <w:bookmarkEnd w:id="40"/>
-    <w:bookmarkStart w:id="41" w:name="X5a80a90b9293fcc0871e0cb36e542de94b178e1"/>
+    <w:bookmarkStart w:id="41" w:name="X6b28836b621772ec8296339c72bace8e2eb8206"/>
     <w:p>
       <w:pPr>
         <w:pStyle w:val="Heading2"/>
       </w:pPr>
       <w:r>
-        <w:t xml:space="preserve">Slide 16 – Dựng mô hình 3D mô tả quá trình ăn mòn (3′) 🆕</w:t>
+        <w:t xml:space="preserve">Slide 16 – Mô hình 3D: mô phỏng quá trình ăn mòn vật liệu theo thời gian (3′)</w:t>
       </w:r>
     </w:p>
     <w:p>
@@ -10206,13 +10206,13 @@
       </w:r>
     </w:p>
     <w:bookmarkEnd w:id="41"/>
-    <w:bookmarkStart w:id="42" w:name="X638c9d3b032d0b8d64a03b274815be323179184"/>
+    <w:bookmarkStart w:id="42" w:name="X18c4632885f14876c166db8c4340704c141fe3f"/>
     <w:p>
       <w:pPr>
         <w:pStyle w:val="Heading2"/>
       </w:pPr>
       <w:r>
-        <w:t xml:space="preserve">Slide 17 – Đề tài có dữ liệu mật: AI viết công cụ, máy không Internet xử lý dữ liệu – DEMO 3 (5′) 🆕</w:t>
+        <w:t xml:space="preserve">Slide 17 – Đề tài mật: xây dựng công cụ và xử lý ngay trên máy không kết nối Internet – DEMO 3 (5′)</w:t>
       </w:r>
     </w:p>
     <w:p>
@@ -10796,13 +10796,13 @@
       </w:r>
     </w:p>
     <w:bookmarkEnd w:id="42"/>
-    <w:bookmarkStart w:id="43" w:name="Xa5714a4de64357a8bda9caa7338ba0dbd100e84"/>
+    <w:bookmarkStart w:id="43" w:name="X3d0cb8888c77e00478e39b2807659fc7b9f359f"/>
     <w:p>
       <w:pPr>
         <w:pStyle w:val="Heading2"/>
       </w:pPr>
       <w:r>
-        <w:t xml:space="preserve">Slide 18 – Xây dựng bài báo và báo cáo tổng hợp kết quả (5′)</w:t>
+        <w:t xml:space="preserve">Slide 18 – Công bố kết quả: bài báo và báo cáo tổng hợp theo nhiều định dạng (5′)</w:t>
       </w:r>
     </w:p>
     <w:p>
@@ -11977,13 +11977,13 @@
       </w:r>
     </w:p>
     <w:bookmarkEnd w:id="46"/>
-    <w:bookmarkStart w:id="47" w:name="X2c6bc3a938864947cd8e370a4127836ed7609c8"/>
+    <w:bookmarkStart w:id="47" w:name="Xed3464729fbb4912ed2c4f95a8612249b6e2b90"/>
     <w:p>
       <w:pPr>
         <w:pStyle w:val="Heading2"/>
       </w:pPr>
       <w:r>
-        <w:t xml:space="preserve">Slide 21 – Ứng dụng khoa học mở và tự động hóa từng bước đến toàn trình (5′)</w:t>
+        <w:t xml:space="preserve">Slide 21 – Tự động hóa từng bước: từ một công việc đến toàn quy trình (5′)</w:t>
       </w:r>
     </w:p>
     <w:p>
@@ -12504,13 +12504,13 @@
       </w:r>
     </w:p>
     <w:bookmarkEnd w:id="47"/>
-    <w:bookmarkStart w:id="48" w:name="X3098f8f08e061c03a8d98bf048142b2307de7b1"/>
+    <w:bookmarkStart w:id="48" w:name="X1cb900760096274a3dd5c9fe1f213f586658b4a"/>
     <w:p>
       <w:pPr>
         <w:pStyle w:val="Heading2"/>
       </w:pPr>
       <w:r>
-        <w:t xml:space="preserve">Slide 22 – Bản đồ quy trình tự động của Trung tâm và năm quyết định của nhà khoa học (4′)</w:t>
+        <w:t xml:space="preserve">Slide 22 – Quy trình tự động của Trung tâm và năm quyết định của nhà khoa học (4′)</w:t>
       </w:r>
     </w:p>
     <w:p>

</xml_diff>

<commit_message>
Chuẩn hóa tên slide và tên phần theo văn phong khoa học quân sự
Co-Authored-By: Claude Opus 5.5 <noreply@anthropic.com>
Claude-Session: https://claude.ai/code/session_01JoSsghLRHTtvcNzYXbKpzE
</commit_message>
<xml_diff>
--- a/thuyet-trinh/DANH-SACH-SLIDE-v2.5.docx
+++ b/thuyet-trinh/DANH-SACH-SLIDE-v2.5.docx
@@ -466,7 +466,7 @@
               <w:jc w:val="left"/>
             </w:pPr>
             <w:r>
-              <w:t xml:space="preserve">AI phát triển nhanh đến mức nào: những con số mới nhất</w:t>
+              <w:t xml:space="preserve">Tốc độ phát triển của trí tuệ nhân tạo giai đoạn 2019–2026</w:t>
             </w:r>
           </w:p>
         </w:tc>
@@ -528,7 +528,7 @@
               <w:jc w:val="left"/>
             </w:pPr>
             <w:r>
-              <w:t xml:space="preserve">AI trong khoa học: ví dụ quốc tế và Việt Nam</w:t>
+              <w:t xml:space="preserve">Ứng dụng trí tuệ nhân tạo trong nghiên cứu khoa học trên thế giới và ở Việt Nam</w:t>
             </w:r>
           </w:p>
         </w:tc>
@@ -590,7 +590,7 @@
               <w:jc w:val="left"/>
             </w:pPr>
             <w:r>
-              <w:t xml:space="preserve">Năng lực cốt lõi và tính năng mới của AI Agent</w:t>
+              <w:t xml:space="preserve">Năng lực cốt lõi và các tính năng mới của tác tử trí tuệ nhân tạo (AI Agent)</w:t>
             </w:r>
           </w:p>
         </w:tc>
@@ -652,7 +652,7 @@
               <w:jc w:val="left"/>
             </w:pPr>
             <w:r>
-              <w:t xml:space="preserve">Phương thức nghiên cứu đang thay đổi: từ thao tác thủ công đến quy trình liên tục</w:t>
+              <w:t xml:space="preserve">Xu thế chuyển đổi phương thức nghiên cứu khoa học dưới tác động của trí tuệ nhân tạo</w:t>
             </w:r>
           </w:p>
         </w:tc>
@@ -714,7 +714,7 @@
               <w:jc w:val="left"/>
             </w:pPr>
             <w:r>
-              <w:t xml:space="preserve">Chọn đúng công cụ: việc nào dùng chatbot, việc nào cần AI Agent</w:t>
+              <w:t xml:space="preserve">Phân loại công việc nghiên cứu và lựa chọn công cụ trí tuệ nhân tạo phù hợp</w:t>
             </w:r>
           </w:p>
         </w:tc>
@@ -776,7 +776,7 @@
               <w:jc w:val="left"/>
             </w:pPr>
             <w:r>
-              <w:t xml:space="preserve">Các công cụ AI phổ biến và vai trò của từng loại</w:t>
+              <w:t xml:space="preserve">Các công cụ trí tuệ nhân tạo thông dụng: chức năng và phạm vi sử dụng</w:t>
             </w:r>
           </w:p>
         </w:tc>
@@ -838,7 +838,7 @@
               <w:jc w:val="left"/>
             </w:pPr>
             <w:r>
-              <w:t xml:space="preserve">Giới thiệu Claude: mô hình, gói dịch vụ và tính năng nổi bật trên Windows</w:t>
+              <w:t xml:space="preserve">Giới thiệu hệ thống Claude: mô hình, gói dịch vụ và tính năng trên nền tảng Windows</w:t>
             </w:r>
           </w:p>
         </w:tc>
@@ -900,7 +900,7 @@
               <w:jc w:val="left"/>
             </w:pPr>
             <w:r>
-              <w:t xml:space="preserve">Bắt đầu với Claude: 6 bước đầu tiên và tổng hợp dữ liệu nhiều nguồn</w:t>
+              <w:t xml:space="preserve">Quy trình khai thác, sử dụng cơ bản hệ thống Claude</w:t>
             </w:r>
           </w:p>
         </w:tc>
@@ -962,7 +962,7 @@
               <w:jc w:val="left"/>
             </w:pPr>
             <w:r>
-              <w:t xml:space="preserve">Giao việc cho AI Agent: cách viết yêu cầu 5 bước</w:t>
+              <w:t xml:space="preserve">Phương pháp giao nhiệm vụ cho tác tử trí tuệ nhân tạo</w:t>
             </w:r>
           </w:p>
         </w:tc>
@@ -1024,7 +1024,7 @@
               <w:jc w:val="left"/>
             </w:pPr>
             <w:r>
-              <w:t xml:space="preserve">Không gian làm việc nghiên cứu: mỗi nhiệm vụ một dự án</w:t>
+              <w:t xml:space="preserve">Tổ chức không gian làm việc theo từng nhiệm vụ khoa học và công nghệ</w:t>
             </w:r>
           </w:p>
         </w:tc>
@@ -1086,7 +1086,7 @@
               <w:jc w:val="left"/>
             </w:pPr>
             <w:r>
-              <w:t xml:space="preserve">Skill, Subagent và hệ thống nhiều Agent</w:t>
+              <w:t xml:space="preserve">Kỹ năng (Skill), tác tử con (Subagent) và hệ đa tác tử</w:t>
             </w:r>
           </w:p>
         </w:tc>
@@ -1148,7 +1148,7 @@
               <w:jc w:val="left"/>
             </w:pPr>
             <w:r>
-              <w:t xml:space="preserve">Tổng quan tài liệu: từ bài báo đến khoảng trống nghiên cứu</w:t>
+              <w:t xml:space="preserve">Tổng quan tài liệu và xác định khoảng trống nghiên cứu</w:t>
             </w:r>
           </w:p>
         </w:tc>
@@ -1210,7 +1210,7 @@
               <w:jc w:val="left"/>
             </w:pPr>
             <w:r>
-              <w:t xml:space="preserve">Đề xuất nhiệm vụ: từ khoảng trống đến phiếu đề xuất và thuyết minh – DEMO 1</w:t>
+              <w:t xml:space="preserve">Xây dựng phiếu đề xuất và thuyết minh nhiệm vụ – Minh họa thực nghiệm 1</w:t>
             </w:r>
           </w:p>
         </w:tc>
@@ -1272,7 +1272,7 @@
               <w:jc w:val="left"/>
             </w:pPr>
             <w:r>
-              <w:t xml:space="preserve">Hồ sơ nhiệm vụ: thuyết minh, tiến độ và kinh phí theo biểu mẫu Trung tâm</w:t>
+              <w:t xml:space="preserve">Lập kế hoạch tiến độ và dự toán kinh phí theo biểu mẫu của Trung tâm</w:t>
             </w:r>
           </w:p>
         </w:tc>
@@ -1334,7 +1334,7 @@
               <w:jc w:val="left"/>
             </w:pPr>
             <w:r>
-              <w:t xml:space="preserve">Xử lý dữ liệu: AI viết và chạy mã Python – DEMO 2</w:t>
+              <w:t xml:space="preserve">Xử lý, phân tích số liệu thực nghiệm bằng mã nguồn Python – Minh họa thực nghiệm 2</w:t>
             </w:r>
           </w:p>
         </w:tc>
@@ -1396,7 +1396,7 @@
               <w:jc w:val="left"/>
             </w:pPr>
             <w:r>
-              <w:t xml:space="preserve">Mô hình 3D: mô phỏng quá trình ăn mòn vật liệu theo thời gian</w:t>
+              <w:t xml:space="preserve">Mô hình hóa 3D quá trình ăn mòn khí quyển của vật liệu kim loại</w:t>
             </w:r>
           </w:p>
         </w:tc>
@@ -1458,7 +1458,7 @@
               <w:jc w:val="left"/>
             </w:pPr>
             <w:r>
-              <w:t xml:space="preserve">Đề tài mật: xây dựng công cụ và xử lý ngay trên máy không kết nối Internet – DEMO 3</w:t>
+              <w:t xml:space="preserve">Xây dựng công cụ xử lý dữ liệu trên máy tính không kết nối Internet đối với nhiệm vụ có nội dung bí mật – Minh họa thực nghiệm 3</w:t>
             </w:r>
           </w:p>
         </w:tc>
@@ -1520,7 +1520,7 @@
               <w:jc w:val="left"/>
             </w:pPr>
             <w:r>
-              <w:t xml:space="preserve">Công bố kết quả: bài báo và báo cáo tổng hợp theo nhiều định dạng</w:t>
+              <w:t xml:space="preserve">Công bố kết quả nghiên cứu và lập báo cáo tổng hợp</w:t>
             </w:r>
           </w:p>
         </w:tc>
@@ -1582,7 +1582,7 @@
               <w:jc w:val="left"/>
             </w:pPr>
             <w:r>
-              <w:t xml:space="preserve">Toàn cảnh: một nhiệm vụ khoa học đi qua AI Agent</w:t>
+              <w:t xml:space="preserve">Tổng hợp chu trình thực hiện nhiệm vụ khoa học và công nghệ có ứng dụng tác tử trí tuệ nhân tạo</w:t>
             </w:r>
           </w:p>
         </w:tc>
@@ -1644,7 +1644,7 @@
               <w:jc w:val="left"/>
             </w:pPr>
             <w:r>
-              <w:t xml:space="preserve">Skill và khoa học mở: nền móng của tự động hóa</w:t>
+              <w:t xml:space="preserve">Kỹ năng (Skill) và khoa học mở – nền tảng tự động hóa hoạt động nghiên cứu</w:t>
             </w:r>
           </w:p>
         </w:tc>
@@ -1706,7 +1706,7 @@
               <w:jc w:val="left"/>
             </w:pPr>
             <w:r>
-              <w:t xml:space="preserve">Tự động hóa từng bước: từ một công việc đến toàn quy trình</w:t>
+              <w:t xml:space="preserve">Lộ trình tự động hóa từ từng công đoạn đến toàn bộ quy trình nghiên cứu</w:t>
             </w:r>
           </w:p>
         </w:tc>
@@ -1768,7 +1768,7 @@
               <w:jc w:val="left"/>
             </w:pPr>
             <w:r>
-              <w:t xml:space="preserve">Quy trình tự động của Trung tâm và năm quyết định của nhà khoa học</w:t>
+              <w:t xml:space="preserve">Sơ đồ quy trình tự động hóa của Trung tâm và các nội dung thuộc thẩm quyền quyết định của nhà khoa học</w:t>
             </w:r>
           </w:p>
         </w:tc>
@@ -1830,7 +1830,7 @@
               <w:jc w:val="left"/>
             </w:pPr>
             <w:r>
-              <w:t xml:space="preserve">Trao đổi và thảo luận</w:t>
+              <w:t xml:space="preserve">Trao đổi, thảo luận</w:t>
             </w:r>
           </w:p>
         </w:tc>
@@ -1892,7 +1892,7 @@
               <w:jc w:val="left"/>
             </w:pPr>
             <w:r>
-              <w:t xml:space="preserve">Phụ lục A: AI lập trình (không trình bày)</w:t>
+              <w:t xml:space="preserve">Phụ lục A: Trí tuệ nhân tạo trong lĩnh vực lập trình</w:t>
             </w:r>
           </w:p>
         </w:tc>
@@ -1954,7 +1954,7 @@
               <w:jc w:val="left"/>
             </w:pPr>
             <w:r>
-              <w:t xml:space="preserve">Phụ lục B: Ví dụ Google và các nhà khoa học dùng AI (không trình bày – dự phòng khi được hỏi)</w:t>
+              <w:t xml:space="preserve">Phụ lục B: Một số công trình nghiên cứu ứng dụng trí tuệ nhân tạo của Google</w:t>
             </w:r>
           </w:p>
         </w:tc>
@@ -2016,7 +2016,7 @@
               <w:jc w:val="left"/>
             </w:pPr>
             <w:r>
-              <w:t xml:space="preserve">Phụ lục C: Nguồn tham khảo (không trình bày)</w:t>
+              <w:t xml:space="preserve">Phụ lục C: Tài liệu tham khảo</w:t>
             </w:r>
           </w:p>
         </w:tc>
@@ -2078,7 +2078,7 @@
               <w:jc w:val="left"/>
             </w:pPr>
             <w:r>
-              <w:t xml:space="preserve">Phụ lục D: Dự án và bộ Skill khoa học mở (không trình bày)</w:t>
+              <w:t xml:space="preserve">Phụ lục D: Dự án minh họa và thư viện kỹ năng khoa học mở</w:t>
             </w:r>
           </w:p>
         </w:tc>
@@ -2278,13 +2278,13 @@
     </w:p>
     <w:bookmarkEnd w:id="22"/>
     <w:bookmarkEnd w:id="23"/>
-    <w:bookmarkStart w:id="28" w:name="phần-i.-tổng-quan-19-phút"/>
+    <w:bookmarkStart w:id="28" w:name="X1ed5c8284985b3291bd3009e87834ab21691187"/>
     <w:p>
       <w:pPr>
         <w:pStyle w:val="Heading1"/>
       </w:pPr>
       <w:r>
-        <w:t xml:space="preserve">PHẦN I. TỔNG QUAN (19 phút)</w:t>
+        <w:t xml:space="preserve">PHẦN I. TỔNG QUAN VỀ TRÍ TUỆ NHÂN TẠO VÀ XU THẾ CHUYỂN ĐỔI PHƯƠNG THỨC NGHIÊN CỨU KHOA HỌC (19 phút)</w:t>
       </w:r>
     </w:p>
     <w:p>
@@ -2294,13 +2294,13 @@
         </w:pict>
       </w:r>
     </w:p>
-    <w:bookmarkStart w:id="24" w:name="X5e2791cf2fb76533d937191050fe8e8749ccf3d"/>
+    <w:bookmarkStart w:id="24" w:name="X7013140f8b02d6d1eeb11339317c50a357329ac"/>
     <w:p>
       <w:pPr>
         <w:pStyle w:val="Heading2"/>
       </w:pPr>
       <w:r>
-        <w:t xml:space="preserve">Slide 1 – AI phát triển nhanh đến mức nào: những con số mới nhất (4′)</w:t>
+        <w:t xml:space="preserve">Slide 1 – Tốc độ phát triển của trí tuệ nhân tạo giai đoạn 2019–2026 (4′)</w:t>
       </w:r>
     </w:p>
     <w:p>
@@ -2624,13 +2624,13 @@
       </w:r>
     </w:p>
     <w:bookmarkEnd w:id="24"/>
-    <w:bookmarkStart w:id="25" w:name="X994b28678e20557dbcc0e00066897a30c6e7b31"/>
+    <w:bookmarkStart w:id="25" w:name="X902da8d4261dd07b849e284e5a068515d1a02fb"/>
     <w:p>
       <w:pPr>
         <w:pStyle w:val="Heading2"/>
       </w:pPr>
       <w:r>
-        <w:t xml:space="preserve">Slide 2 – AI trong khoa học: ví dụ quốc tế và Việt Nam (5′)</w:t>
+        <w:t xml:space="preserve">Slide 2 – Ứng dụng trí tuệ nhân tạo trong nghiên cứu khoa học trên thế giới và ở Việt Nam (5′)</w:t>
       </w:r>
     </w:p>
     <w:p>
@@ -3031,13 +3031,13 @@
       </w:r>
     </w:p>
     <w:bookmarkEnd w:id="25"/>
-    <w:bookmarkStart w:id="26" w:name="Xadbfb030a8db414f49527c469921dc167a20dca"/>
+    <w:bookmarkStart w:id="26" w:name="Xa6c8c956c17fdf3bc75de32f02b3b6ea3c90b09"/>
     <w:p>
       <w:pPr>
         <w:pStyle w:val="Heading2"/>
       </w:pPr>
       <w:r>
-        <w:t xml:space="preserve">Slide 3 – Năng lực cốt lõi và tính năng mới của AI Agent (6′)</w:t>
+        <w:t xml:space="preserve">Slide 3 – Năng lực cốt lõi và các tính năng mới của tác tử trí tuệ nhân tạo (AI Agent) (6′)</w:t>
       </w:r>
     </w:p>
     <w:p>
@@ -3814,13 +3814,13 @@
       </w:r>
     </w:p>
     <w:bookmarkEnd w:id="26"/>
-    <w:bookmarkStart w:id="27" w:name="Xca35d572d693031c60afab96fdfbb1edf71dff5"/>
+    <w:bookmarkStart w:id="27" w:name="Xec41b5f8f99d4871d87991256bbff0a89ccea3c"/>
     <w:p>
       <w:pPr>
         <w:pStyle w:val="Heading2"/>
       </w:pPr>
       <w:r>
-        <w:t xml:space="preserve">Slide 4 – Phương thức nghiên cứu đang thay đổi: từ thao tác thủ công đến quy trình liên tục (4′)</w:t>
+        <w:t xml:space="preserve">Slide 4 – Xu thế chuyển đổi phương thức nghiên cứu khoa học dưới tác động của trí tuệ nhân tạo (4′)</w:t>
       </w:r>
     </w:p>
     <w:p>
@@ -4102,13 +4102,13 @@
     </w:p>
     <w:bookmarkEnd w:id="27"/>
     <w:bookmarkEnd w:id="28"/>
-    <w:bookmarkStart w:id="36" w:name="Xe6e19048329e4f9c57419e683206ceaf5f98434"/>
+    <w:bookmarkStart w:id="36" w:name="X78f523f0ac5ed6cdc75b0f5213867ebcbd00bb3"/>
     <w:p>
       <w:pPr>
         <w:pStyle w:val="Heading1"/>
       </w:pPr>
       <w:r>
-        <w:t xml:space="preserve">PHẦN II. LỰA CHỌN VÀ SỬ DỤNG CÔNG CỤ AI PHÙ HỢP (35 phút)</w:t>
+        <w:t xml:space="preserve">PHẦN II. LỰA CHỌN, KHAI THÁC VÀ SỬ DỤNG CÔNG CỤ TRÍ TUỆ NHÂN TẠO (35 phút)</w:t>
       </w:r>
     </w:p>
     <w:p>
@@ -4118,13 +4118,13 @@
         </w:pict>
       </w:r>
     </w:p>
-    <w:bookmarkStart w:id="29" w:name="Xf478361b239b1c542bc0de4be4e80db6f7cbc3f"/>
+    <w:bookmarkStart w:id="29" w:name="X0a67c866dd10f35ef9b59a4e05d59d716eccca2"/>
     <w:p>
       <w:pPr>
         <w:pStyle w:val="Heading2"/>
       </w:pPr>
       <w:r>
-        <w:t xml:space="preserve">Slide 5 – Chọn đúng công cụ: việc nào dùng chatbot, việc nào cần AI Agent (5′)</w:t>
+        <w:t xml:space="preserve">Slide 5 – Phân loại công việc nghiên cứu và lựa chọn công cụ trí tuệ nhân tạo phù hợp (5′)</w:t>
       </w:r>
     </w:p>
     <w:p>
@@ -4541,13 +4541,13 @@
       </w:r>
     </w:p>
     <w:bookmarkEnd w:id="29"/>
-    <w:bookmarkStart w:id="30" w:name="X5733276d07a97894b7ef5c30fb8f70c96b52f27"/>
+    <w:bookmarkStart w:id="30" w:name="X4556bdbf68bfa1bd5383d46576ac2c2ae7e5c55"/>
     <w:p>
       <w:pPr>
         <w:pStyle w:val="Heading2"/>
       </w:pPr>
       <w:r>
-        <w:t xml:space="preserve">Slide 6 – Các công cụ AI phổ biến và vai trò của từng loại (4′)</w:t>
+        <w:t xml:space="preserve">Slide 6 – Các công cụ trí tuệ nhân tạo thông dụng: chức năng và phạm vi sử dụng (4′)</w:t>
       </w:r>
     </w:p>
     <w:p>
@@ -5017,13 +5017,13 @@
       </w:r>
     </w:p>
     <w:bookmarkEnd w:id="30"/>
-    <w:bookmarkStart w:id="31" w:name="X3cdee8486a783c12ce5155f39202b5659e1017c"/>
+    <w:bookmarkStart w:id="31" w:name="X15a711178b1d79d27ffa43c90cd11b37dfa5ae5"/>
     <w:p>
       <w:pPr>
         <w:pStyle w:val="Heading2"/>
       </w:pPr>
       <w:r>
-        <w:t xml:space="preserve">Slide 7 – Giới thiệu Claude: mô hình, gói dịch vụ và tính năng nổi bật trên Windows (7′)</w:t>
+        <w:t xml:space="preserve">Slide 7 – Giới thiệu hệ thống Claude: mô hình, gói dịch vụ và tính năng trên nền tảng Windows (7′)</w:t>
       </w:r>
     </w:p>
     <w:p>
@@ -5905,13 +5905,13 @@
       </w:r>
     </w:p>
     <w:bookmarkEnd w:id="31"/>
-    <w:bookmarkStart w:id="32" w:name="Xcfe02677acd48312f1a8c3116105c2513a1aa6a"/>
+    <w:bookmarkStart w:id="32" w:name="X26959583b21ad955b55d465affd0632a05b2a70"/>
     <w:p>
       <w:pPr>
         <w:pStyle w:val="Heading2"/>
       </w:pPr>
       <w:r>
-        <w:t xml:space="preserve">Slide 8 – Bắt đầu với Claude: 6 bước đầu tiên và tổng hợp dữ liệu nhiều nguồn (7′)</w:t>
+        <w:t xml:space="preserve">Slide 8 – Quy trình khai thác, sử dụng cơ bản hệ thống Claude (7′)</w:t>
       </w:r>
     </w:p>
     <w:p>
@@ -6978,13 +6978,13 @@
       </w:r>
     </w:p>
     <w:bookmarkEnd w:id="32"/>
-    <w:bookmarkStart w:id="33" w:name="Xd9d0d6b663c0b8154825a4c4a283f7a088a8679"/>
+    <w:bookmarkStart w:id="33" w:name="Xc455ddbf0e201b31851ae10fcdbf3478b01bf57"/>
     <w:p>
       <w:pPr>
         <w:pStyle w:val="Heading2"/>
       </w:pPr>
       <w:r>
-        <w:t xml:space="preserve">Slide 9 – Giao việc cho AI Agent: cách viết yêu cầu 5 bước (6′)</w:t>
+        <w:t xml:space="preserve">Slide 9 – Phương pháp giao nhiệm vụ cho tác tử trí tuệ nhân tạo (6′)</w:t>
       </w:r>
     </w:p>
     <w:p>
@@ -7346,13 +7346,13 @@
       </w:r>
     </w:p>
     <w:bookmarkEnd w:id="33"/>
-    <w:bookmarkStart w:id="34" w:name="X0b923a1a013338280d796ef2440c703039fcd56"/>
+    <w:bookmarkStart w:id="34" w:name="Xdadf4c3cd5093f090a2477e16d0023b11fe0dae"/>
     <w:p>
       <w:pPr>
         <w:pStyle w:val="Heading2"/>
       </w:pPr>
       <w:r>
-        <w:t xml:space="preserve">Slide 10 – Không gian làm việc nghiên cứu: mỗi nhiệm vụ một dự án (3′)</w:t>
+        <w:t xml:space="preserve">Slide 10 – Tổ chức không gian làm việc theo từng nhiệm vụ khoa học và công nghệ (3′)</w:t>
       </w:r>
     </w:p>
     <w:p>
@@ -7810,13 +7810,13 @@
       </w:r>
     </w:p>
     <w:bookmarkEnd w:id="34"/>
-    <w:bookmarkStart w:id="35" w:name="X72d5b3d824d06bc2d977fb724c6ea11fcd5ac43"/>
+    <w:bookmarkStart w:id="35" w:name="Xfe3677891e3e35009708b748a26f096f4e00abd"/>
     <w:p>
       <w:pPr>
         <w:pStyle w:val="Heading2"/>
       </w:pPr>
       <w:r>
-        <w:t xml:space="preserve">Slide 11 – Skill, Subagent và hệ thống nhiều Agent (3′) –</w:t>
+        <w:t xml:space="preserve">Slide 11 – Kỹ năng (Skill), tác tử con (Subagent) và hệ đa tác tử (3′) –</w:t>
       </w:r>
       <w:r>
         <w:t xml:space="preserve"> </w:t>
@@ -8029,13 +8029,13 @@
     </w:p>
     <w:bookmarkEnd w:id="35"/>
     <w:bookmarkEnd w:id="36"/>
-    <w:bookmarkStart w:id="45" w:name="X4f170a3005fddfc18f950ed0eb5e931d67b450d"/>
+    <w:bookmarkStart w:id="45" w:name="Xebbffa673623344b085dcb7a665cec729593ad9"/>
     <w:p>
       <w:pPr>
         <w:pStyle w:val="Heading1"/>
       </w:pPr>
       <w:r>
-        <w:t xml:space="preserve">PHẦN III. AI AGENT TRONG VÒNG ĐỜI NHIỆM VỤ KHOA HỌC (42 phút)</w:t>
+        <w:t xml:space="preserve">PHẦN III. ỨNG DỤNG TÁC TỬ TRÍ TUỆ NHÂN TẠO TRONG CHU TRÌNH THỰC HIỆN NHIỆM VỤ KHOA HỌC VÀ CÔNG NGHỆ (42 phút)</w:t>
       </w:r>
     </w:p>
     <w:p>
@@ -8101,13 +8101,13 @@
         </w:pict>
       </w:r>
     </w:p>
-    <w:bookmarkStart w:id="37" w:name="Xd43c46c008d9e4d8849a930e96bda6326ea0cf0"/>
+    <w:bookmarkStart w:id="37" w:name="X3a80e774d37a3c7a38b4880083f454ebfb3b8a0"/>
     <w:p>
       <w:pPr>
         <w:pStyle w:val="Heading2"/>
       </w:pPr>
       <w:r>
-        <w:t xml:space="preserve">Slide 12 – Tổng quan tài liệu: từ bài báo đến khoảng trống nghiên cứu (7′)</w:t>
+        <w:t xml:space="preserve">Slide 12 – Tổng quan tài liệu và xác định khoảng trống nghiên cứu (7′)</w:t>
       </w:r>
     </w:p>
     <w:p>
@@ -8839,13 +8839,13 @@
       </w:r>
     </w:p>
     <w:bookmarkEnd w:id="37"/>
-    <w:bookmarkStart w:id="38" w:name="Xc8ba032270c9c569ced786dfca8e096c44633e5"/>
+    <w:bookmarkStart w:id="38" w:name="X432cfee3380cd7d01956eed8431b30ccb3bc4f2"/>
     <w:p>
       <w:pPr>
         <w:pStyle w:val="Heading2"/>
       </w:pPr>
       <w:r>
-        <w:t xml:space="preserve">Slide 13 – Đề xuất nhiệm vụ: từ khoảng trống đến phiếu đề xuất và thuyết minh – DEMO 1 (7′)</w:t>
+        <w:t xml:space="preserve">Slide 13 – Xây dựng phiếu đề xuất và thuyết minh nhiệm vụ – Minh họa thực nghiệm 1 (7′)</w:t>
       </w:r>
     </w:p>
     <w:p>
@@ -9079,13 +9079,13 @@
       </w:r>
     </w:p>
     <w:bookmarkEnd w:id="38"/>
-    <w:bookmarkStart w:id="39" w:name="Xa112d2126c8edb8d7894d1b2ddf73023b5298a3"/>
+    <w:bookmarkStart w:id="39" w:name="X95dcb3ab3b718a7b0ac24417c75b4156c3eac0f"/>
     <w:p>
       <w:pPr>
         <w:pStyle w:val="Heading2"/>
       </w:pPr>
       <w:r>
-        <w:t xml:space="preserve">Slide 14 – Hồ sơ nhiệm vụ: thuyết minh, tiến độ và kinh phí theo biểu mẫu Trung tâm (5′)</w:t>
+        <w:t xml:space="preserve">Slide 14 – Lập kế hoạch tiến độ và dự toán kinh phí theo biểu mẫu của Trung tâm (5′)</w:t>
       </w:r>
     </w:p>
     <w:p>
@@ -9315,13 +9315,13 @@
       </w:r>
     </w:p>
     <w:bookmarkEnd w:id="39"/>
-    <w:bookmarkStart w:id="40" w:name="Xe2df8c0ff55655febd02bc94b617eccf50b4b2e"/>
+    <w:bookmarkStart w:id="40" w:name="X4faca6bc140feef6ad7b67488b404483a9e374c"/>
     <w:p>
       <w:pPr>
         <w:pStyle w:val="Heading2"/>
       </w:pPr>
       <w:r>
-        <w:t xml:space="preserve">Slide 15 – Xử lý dữ liệu: AI viết và chạy mã Python – DEMO 2 (8′)</w:t>
+        <w:t xml:space="preserve">Slide 15 – Xử lý, phân tích số liệu thực nghiệm bằng mã nguồn Python – Minh họa thực nghiệm 2 (8′)</w:t>
       </w:r>
     </w:p>
     <w:p>
@@ -9623,13 +9623,13 @@
       </w:r>
     </w:p>
     <w:bookmarkEnd w:id="40"/>
-    <w:bookmarkStart w:id="41" w:name="X6b28836b621772ec8296339c72bace8e2eb8206"/>
+    <w:bookmarkStart w:id="41" w:name="Xf9c051b601e36b6350d2ea88b27b43c13b7c1c4"/>
     <w:p>
       <w:pPr>
         <w:pStyle w:val="Heading2"/>
       </w:pPr>
       <w:r>
-        <w:t xml:space="preserve">Slide 16 – Mô hình 3D: mô phỏng quá trình ăn mòn vật liệu theo thời gian (3′)</w:t>
+        <w:t xml:space="preserve">Slide 16 – Mô hình hóa 3D quá trình ăn mòn khí quyển của vật liệu kim loại (3′)</w:t>
       </w:r>
     </w:p>
     <w:p>
@@ -10206,13 +10206,13 @@
       </w:r>
     </w:p>
     <w:bookmarkEnd w:id="41"/>
-    <w:bookmarkStart w:id="42" w:name="X18c4632885f14876c166db8c4340704c141fe3f"/>
+    <w:bookmarkStart w:id="42" w:name="Xeb9c0b2b50c44e43205db45f461d6cdcf353e85"/>
     <w:p>
       <w:pPr>
         <w:pStyle w:val="Heading2"/>
       </w:pPr>
       <w:r>
-        <w:t xml:space="preserve">Slide 17 – Đề tài mật: xây dựng công cụ và xử lý ngay trên máy không kết nối Internet – DEMO 3 (5′)</w:t>
+        <w:t xml:space="preserve">Slide 17 – Xây dựng công cụ xử lý dữ liệu trên máy tính không kết nối Internet đối với nhiệm vụ có nội dung bí mật – Minh họa thực nghiệm 3 (5′)</w:t>
       </w:r>
     </w:p>
     <w:p>
@@ -10796,13 +10796,13 @@
       </w:r>
     </w:p>
     <w:bookmarkEnd w:id="42"/>
-    <w:bookmarkStart w:id="43" w:name="X3d0cb8888c77e00478e39b2807659fc7b9f359f"/>
+    <w:bookmarkStart w:id="43" w:name="X2cd43d54e17a105f7cd682c764868fcbb685c71"/>
     <w:p>
       <w:pPr>
         <w:pStyle w:val="Heading2"/>
       </w:pPr>
       <w:r>
-        <w:t xml:space="preserve">Slide 18 – Công bố kết quả: bài báo và báo cáo tổng hợp theo nhiều định dạng (5′)</w:t>
+        <w:t xml:space="preserve">Slide 18 – Công bố kết quả nghiên cứu và lập báo cáo tổng hợp (5′)</w:t>
       </w:r>
     </w:p>
     <w:p>
@@ -11256,13 +11256,13 @@
       </w:r>
     </w:p>
     <w:bookmarkEnd w:id="43"/>
-    <w:bookmarkStart w:id="44" w:name="Xff024ff663616b9af386751f7c26e6682f4e9d0"/>
+    <w:bookmarkStart w:id="44" w:name="Xc168ec6a35dd25182e83a95b5e7a9d46ecee8cd"/>
     <w:p>
       <w:pPr>
         <w:pStyle w:val="Heading2"/>
       </w:pPr>
       <w:r>
-        <w:t xml:space="preserve">Slide 19 – Toàn cảnh: một nhiệm vụ khoa học đi qua AI Agent (2′) –</w:t>
+        <w:t xml:space="preserve">Slide 19 – Tổng hợp chu trình thực hiện nhiệm vụ khoa học và công nghệ có ứng dụng tác tử trí tuệ nhân tạo (2′) –</w:t>
       </w:r>
       <w:r>
         <w:t xml:space="preserve"> </w:t>
@@ -11365,13 +11365,13 @@
     </w:p>
     <w:bookmarkEnd w:id="44"/>
     <w:bookmarkEnd w:id="45"/>
-    <w:bookmarkStart w:id="55" w:name="Xc880f06cc75ba60a2af63c23eb8d988dbd63543"/>
+    <w:bookmarkStart w:id="55" w:name="X3a72b5620823bd057fa601f63db5843cab00f4b"/>
     <w:p>
       <w:pPr>
         <w:pStyle w:val="Heading1"/>
       </w:pPr>
       <w:r>
-        <w:t xml:space="preserve">PHẦN IV. SKILL, KHOA HỌC MỞ VÀ TỰ ĐỘNG HÓA (15 phút)</w:t>
+        <w:t xml:space="preserve">PHẦN IV. KỸ NĂNG, KHOA HỌC MỞ VÀ TỰ ĐỘNG HÓA QUY TRÌNH NGHIÊN CỨU (15 phút)</w:t>
       </w:r>
     </w:p>
     <w:p>
@@ -11381,13 +11381,13 @@
         </w:pict>
       </w:r>
     </w:p>
-    <w:bookmarkStart w:id="46" w:name="Xede09fe8d87eea4758afea24298a0a93a490a9c"/>
+    <w:bookmarkStart w:id="46" w:name="X818242104804ce0c977341420493fb5a14aef84"/>
     <w:p>
       <w:pPr>
         <w:pStyle w:val="Heading2"/>
       </w:pPr>
       <w:r>
-        <w:t xml:space="preserve">Slide 20 – Skill và khoa học mở: nền móng của tự động hóa (6′)</w:t>
+        <w:t xml:space="preserve">Slide 20 – Kỹ năng (Skill) và khoa học mở – nền tảng tự động hóa hoạt động nghiên cứu (6′)</w:t>
       </w:r>
     </w:p>
     <w:p>
@@ -11977,13 +11977,13 @@
       </w:r>
     </w:p>
     <w:bookmarkEnd w:id="46"/>
-    <w:bookmarkStart w:id="47" w:name="Xed3464729fbb4912ed2c4f95a8612249b6e2b90"/>
+    <w:bookmarkStart w:id="47" w:name="X726540dc6836b0b411b8e79de7361a22afe3ad5"/>
     <w:p>
       <w:pPr>
         <w:pStyle w:val="Heading2"/>
       </w:pPr>
       <w:r>
-        <w:t xml:space="preserve">Slide 21 – Tự động hóa từng bước: từ một công việc đến toàn quy trình (5′)</w:t>
+        <w:t xml:space="preserve">Slide 21 – Lộ trình tự động hóa từ từng công đoạn đến toàn bộ quy trình nghiên cứu (5′)</w:t>
       </w:r>
     </w:p>
     <w:p>
@@ -12504,13 +12504,13 @@
       </w:r>
     </w:p>
     <w:bookmarkEnd w:id="47"/>
-    <w:bookmarkStart w:id="48" w:name="X1cb900760096274a3dd5c9fe1f213f586658b4a"/>
+    <w:bookmarkStart w:id="48" w:name="X735cc2cc89b2c622c4c48db7dc4521398c84c95"/>
     <w:p>
       <w:pPr>
         <w:pStyle w:val="Heading2"/>
       </w:pPr>
       <w:r>
-        <w:t xml:space="preserve">Slide 22 – Quy trình tự động của Trung tâm và năm quyết định của nhà khoa học (4′)</w:t>
+        <w:t xml:space="preserve">Slide 22 – Sơ đồ quy trình tự động hóa của Trung tâm và các nội dung thuộc thẩm quyền quyết định của nhà khoa học (4′)</w:t>
       </w:r>
     </w:p>
     <w:p>
@@ -13131,13 +13131,13 @@
       </w:r>
     </w:p>
     <w:bookmarkEnd w:id="48"/>
-    <w:bookmarkStart w:id="49" w:name="slide-23-trao-đổi-và-thảo-luận-9"/>
+    <w:bookmarkStart w:id="49" w:name="slide-23-trao-đổi-thảo-luận-9"/>
     <w:p>
       <w:pPr>
         <w:pStyle w:val="Heading2"/>
       </w:pPr>
       <w:r>
-        <w:t xml:space="preserve">Slide 23 – Trao đổi và thảo luận (9′)</w:t>
+        <w:t xml:space="preserve">Slide 23 – Trao đổi, thảo luận (9′)</w:t>
       </w:r>
     </w:p>
     <w:p>
@@ -13212,13 +13212,13 @@
       </w:r>
     </w:p>
     <w:bookmarkEnd w:id="49"/>
-    <w:bookmarkStart w:id="50" w:name="Xc5e529fd4c010d30b1942a8d2129db4c84ec610"/>
+    <w:bookmarkStart w:id="50" w:name="Xc1d1bfc469bd29a27f454cc5a1d0d3e81a83768"/>
     <w:p>
       <w:pPr>
         <w:pStyle w:val="Heading2"/>
       </w:pPr>
       <w:r>
-        <w:t xml:space="preserve">Slide 24 – Phụ lục A: AI lập trình (không trình bày)</w:t>
+        <w:t xml:space="preserve">Slide 24 – Phụ lục A: Trí tuệ nhân tạo trong lĩnh vực lập trình (không trình bày)</w:t>
       </w:r>
     </w:p>
     <w:p>
@@ -13321,13 +13321,13 @@
       </w:r>
     </w:p>
     <w:bookmarkEnd w:id="50"/>
-    <w:bookmarkStart w:id="51" w:name="X6d02dea6a9e8ff5038e1983d7c74272693c420f"/>
+    <w:bookmarkStart w:id="51" w:name="X83b1fb41b981806eaafcf513d71488b865b192c"/>
     <w:p>
       <w:pPr>
         <w:pStyle w:val="Heading2"/>
       </w:pPr>
       <w:r>
-        <w:t xml:space="preserve">Slide 25 – Phụ lục B: Ví dụ Google và các nhà khoa học dùng AI (không trình bày – dự phòng khi được hỏi)</w:t>
+        <w:t xml:space="preserve">Slide 25 – Phụ lục B: Một số công trình nghiên cứu ứng dụng trí tuệ nhân tạo của Google (không trình bày)</w:t>
       </w:r>
     </w:p>
     <w:p>
@@ -14005,13 +14005,13 @@
       </w:r>
     </w:p>
     <w:bookmarkEnd w:id="51"/>
-    <w:bookmarkStart w:id="52" w:name="X93d551cb36b78b56d1c5628e3247657e12675ac"/>
+    <w:bookmarkStart w:id="52" w:name="X7613461a50d489aabc0c4f50dba778b09145968"/>
     <w:p>
       <w:pPr>
         <w:pStyle w:val="Heading2"/>
       </w:pPr>
       <w:r>
-        <w:t xml:space="preserve">Slide 26 – Phụ lục C: Nguồn tham khảo (không trình bày)</w:t>
+        <w:t xml:space="preserve">Slide 26 – Phụ lục C: Tài liệu tham khảo (không trình bày)</w:t>
       </w:r>
     </w:p>
     <w:p>
@@ -14102,13 +14102,13 @@
       </w:r>
     </w:p>
     <w:bookmarkEnd w:id="52"/>
-    <w:bookmarkStart w:id="53" w:name="X2627c6a16089affe10a68860cf545edfc1afbe1"/>
+    <w:bookmarkStart w:id="53" w:name="Xad4b20d875ea3727bfbcf3964f28216f1423a66"/>
     <w:p>
       <w:pPr>
         <w:pStyle w:val="Heading2"/>
       </w:pPr>
       <w:r>
-        <w:t xml:space="preserve">Slide 27 – Phụ lục D: Dự án và bộ Skill khoa học mở (không trình bày)</w:t>
+        <w:t xml:space="preserve">Slide 27 – Phụ lục D: Dự án minh họa và thư viện kỹ năng khoa học mở (không trình bày)</w:t>
       </w:r>
     </w:p>
     <w:p>

</xml_diff>

<commit_message>
Chuẩn hóa tên slide và tên phần theo văn phong khoa học quân sự (#6)
Claude-Session: https://claude.ai/code/session_01JoSsghLRHTtvcNzYXbKpzE

Co-authored-by: Claude <noreply@anthropic.com>
</commit_message>
<xml_diff>
--- a/thuyet-trinh/DANH-SACH-SLIDE-v2.5.docx
+++ b/thuyet-trinh/DANH-SACH-SLIDE-v2.5.docx
@@ -466,7 +466,7 @@
               <w:jc w:val="left"/>
             </w:pPr>
             <w:r>
-              <w:t xml:space="preserve">AI phát triển nhanh đến mức nào: những con số mới nhất</w:t>
+              <w:t xml:space="preserve">Tốc độ phát triển của trí tuệ nhân tạo giai đoạn 2019–2026</w:t>
             </w:r>
           </w:p>
         </w:tc>
@@ -528,7 +528,7 @@
               <w:jc w:val="left"/>
             </w:pPr>
             <w:r>
-              <w:t xml:space="preserve">AI trong khoa học: ví dụ quốc tế và Việt Nam</w:t>
+              <w:t xml:space="preserve">Ứng dụng trí tuệ nhân tạo trong nghiên cứu khoa học trên thế giới và ở Việt Nam</w:t>
             </w:r>
           </w:p>
         </w:tc>
@@ -590,7 +590,7 @@
               <w:jc w:val="left"/>
             </w:pPr>
             <w:r>
-              <w:t xml:space="preserve">Năng lực cốt lõi và tính năng mới của AI Agent</w:t>
+              <w:t xml:space="preserve">Năng lực cốt lõi và các tính năng mới của tác tử trí tuệ nhân tạo (AI Agent)</w:t>
             </w:r>
           </w:p>
         </w:tc>
@@ -652,7 +652,7 @@
               <w:jc w:val="left"/>
             </w:pPr>
             <w:r>
-              <w:t xml:space="preserve">Phương thức nghiên cứu đang thay đổi: từ thao tác thủ công đến quy trình liên tục</w:t>
+              <w:t xml:space="preserve">Xu thế chuyển đổi phương thức nghiên cứu khoa học dưới tác động của trí tuệ nhân tạo</w:t>
             </w:r>
           </w:p>
         </w:tc>
@@ -714,7 +714,7 @@
               <w:jc w:val="left"/>
             </w:pPr>
             <w:r>
-              <w:t xml:space="preserve">Chọn đúng công cụ: việc nào dùng chatbot, việc nào cần AI Agent</w:t>
+              <w:t xml:space="preserve">Phân loại công việc nghiên cứu và lựa chọn công cụ trí tuệ nhân tạo phù hợp</w:t>
             </w:r>
           </w:p>
         </w:tc>
@@ -776,7 +776,7 @@
               <w:jc w:val="left"/>
             </w:pPr>
             <w:r>
-              <w:t xml:space="preserve">Các công cụ AI phổ biến và vai trò của từng loại</w:t>
+              <w:t xml:space="preserve">Các công cụ trí tuệ nhân tạo thông dụng: chức năng và phạm vi sử dụng</w:t>
             </w:r>
           </w:p>
         </w:tc>
@@ -838,7 +838,7 @@
               <w:jc w:val="left"/>
             </w:pPr>
             <w:r>
-              <w:t xml:space="preserve">Giới thiệu Claude: mô hình, gói dịch vụ và tính năng nổi bật trên Windows</w:t>
+              <w:t xml:space="preserve">Giới thiệu hệ thống Claude: mô hình, gói dịch vụ và tính năng trên nền tảng Windows</w:t>
             </w:r>
           </w:p>
         </w:tc>
@@ -900,7 +900,7 @@
               <w:jc w:val="left"/>
             </w:pPr>
             <w:r>
-              <w:t xml:space="preserve">Bắt đầu với Claude: 6 bước đầu tiên và tổng hợp dữ liệu nhiều nguồn</w:t>
+              <w:t xml:space="preserve">Quy trình khai thác, sử dụng cơ bản hệ thống Claude</w:t>
             </w:r>
           </w:p>
         </w:tc>
@@ -962,7 +962,7 @@
               <w:jc w:val="left"/>
             </w:pPr>
             <w:r>
-              <w:t xml:space="preserve">Giao việc cho AI Agent: cách viết yêu cầu 5 bước</w:t>
+              <w:t xml:space="preserve">Phương pháp giao nhiệm vụ cho tác tử trí tuệ nhân tạo</w:t>
             </w:r>
           </w:p>
         </w:tc>
@@ -1024,7 +1024,7 @@
               <w:jc w:val="left"/>
             </w:pPr>
             <w:r>
-              <w:t xml:space="preserve">Không gian làm việc nghiên cứu: mỗi nhiệm vụ một dự án</w:t>
+              <w:t xml:space="preserve">Tổ chức không gian làm việc theo từng nhiệm vụ khoa học và công nghệ</w:t>
             </w:r>
           </w:p>
         </w:tc>
@@ -1086,7 +1086,7 @@
               <w:jc w:val="left"/>
             </w:pPr>
             <w:r>
-              <w:t xml:space="preserve">Skill, Subagent và hệ thống nhiều Agent</w:t>
+              <w:t xml:space="preserve">Kỹ năng (Skill), tác tử con (Subagent) và hệ đa tác tử</w:t>
             </w:r>
           </w:p>
         </w:tc>
@@ -1148,7 +1148,7 @@
               <w:jc w:val="left"/>
             </w:pPr>
             <w:r>
-              <w:t xml:space="preserve">Tổng quan tài liệu: từ bài báo đến khoảng trống nghiên cứu</w:t>
+              <w:t xml:space="preserve">Tổng quan tài liệu và xác định khoảng trống nghiên cứu</w:t>
             </w:r>
           </w:p>
         </w:tc>
@@ -1210,7 +1210,7 @@
               <w:jc w:val="left"/>
             </w:pPr>
             <w:r>
-              <w:t xml:space="preserve">Đề xuất nhiệm vụ: từ khoảng trống đến phiếu đề xuất và thuyết minh – DEMO 1</w:t>
+              <w:t xml:space="preserve">Xây dựng phiếu đề xuất và thuyết minh nhiệm vụ – Minh họa thực nghiệm 1</w:t>
             </w:r>
           </w:p>
         </w:tc>
@@ -1272,7 +1272,7 @@
               <w:jc w:val="left"/>
             </w:pPr>
             <w:r>
-              <w:t xml:space="preserve">Hồ sơ nhiệm vụ: thuyết minh, tiến độ và kinh phí theo biểu mẫu Trung tâm</w:t>
+              <w:t xml:space="preserve">Lập kế hoạch tiến độ và dự toán kinh phí theo biểu mẫu của Trung tâm</w:t>
             </w:r>
           </w:p>
         </w:tc>
@@ -1334,7 +1334,7 @@
               <w:jc w:val="left"/>
             </w:pPr>
             <w:r>
-              <w:t xml:space="preserve">Xử lý dữ liệu: AI viết và chạy mã Python – DEMO 2</w:t>
+              <w:t xml:space="preserve">Xử lý, phân tích số liệu thực nghiệm bằng mã nguồn Python – Minh họa thực nghiệm 2</w:t>
             </w:r>
           </w:p>
         </w:tc>
@@ -1396,7 +1396,7 @@
               <w:jc w:val="left"/>
             </w:pPr>
             <w:r>
-              <w:t xml:space="preserve">Mô hình 3D: mô phỏng quá trình ăn mòn vật liệu theo thời gian</w:t>
+              <w:t xml:space="preserve">Mô hình hóa 3D quá trình ăn mòn khí quyển của vật liệu kim loại</w:t>
             </w:r>
           </w:p>
         </w:tc>
@@ -1458,7 +1458,7 @@
               <w:jc w:val="left"/>
             </w:pPr>
             <w:r>
-              <w:t xml:space="preserve">Đề tài mật: xây dựng công cụ và xử lý ngay trên máy không kết nối Internet – DEMO 3</w:t>
+              <w:t xml:space="preserve">Xây dựng công cụ xử lý dữ liệu trên máy tính không kết nối Internet đối với nhiệm vụ có nội dung bí mật – Minh họa thực nghiệm 3</w:t>
             </w:r>
           </w:p>
         </w:tc>
@@ -1520,7 +1520,7 @@
               <w:jc w:val="left"/>
             </w:pPr>
             <w:r>
-              <w:t xml:space="preserve">Công bố kết quả: bài báo và báo cáo tổng hợp theo nhiều định dạng</w:t>
+              <w:t xml:space="preserve">Công bố kết quả nghiên cứu và lập báo cáo tổng hợp</w:t>
             </w:r>
           </w:p>
         </w:tc>
@@ -1582,7 +1582,7 @@
               <w:jc w:val="left"/>
             </w:pPr>
             <w:r>
-              <w:t xml:space="preserve">Toàn cảnh: một nhiệm vụ khoa học đi qua AI Agent</w:t>
+              <w:t xml:space="preserve">Tổng hợp chu trình thực hiện nhiệm vụ khoa học và công nghệ có ứng dụng tác tử trí tuệ nhân tạo</w:t>
             </w:r>
           </w:p>
         </w:tc>
@@ -1644,7 +1644,7 @@
               <w:jc w:val="left"/>
             </w:pPr>
             <w:r>
-              <w:t xml:space="preserve">Skill và khoa học mở: nền móng của tự động hóa</w:t>
+              <w:t xml:space="preserve">Kỹ năng (Skill) và khoa học mở – nền tảng tự động hóa hoạt động nghiên cứu</w:t>
             </w:r>
           </w:p>
         </w:tc>
@@ -1706,7 +1706,7 @@
               <w:jc w:val="left"/>
             </w:pPr>
             <w:r>
-              <w:t xml:space="preserve">Tự động hóa từng bước: từ một công việc đến toàn quy trình</w:t>
+              <w:t xml:space="preserve">Lộ trình tự động hóa từ từng công đoạn đến toàn bộ quy trình nghiên cứu</w:t>
             </w:r>
           </w:p>
         </w:tc>
@@ -1768,7 +1768,7 @@
               <w:jc w:val="left"/>
             </w:pPr>
             <w:r>
-              <w:t xml:space="preserve">Quy trình tự động của Trung tâm và năm quyết định của nhà khoa học</w:t>
+              <w:t xml:space="preserve">Sơ đồ quy trình tự động hóa của Trung tâm và các nội dung thuộc thẩm quyền quyết định của nhà khoa học</w:t>
             </w:r>
           </w:p>
         </w:tc>
@@ -1830,7 +1830,7 @@
               <w:jc w:val="left"/>
             </w:pPr>
             <w:r>
-              <w:t xml:space="preserve">Trao đổi và thảo luận</w:t>
+              <w:t xml:space="preserve">Trao đổi, thảo luận</w:t>
             </w:r>
           </w:p>
         </w:tc>
@@ -1892,7 +1892,7 @@
               <w:jc w:val="left"/>
             </w:pPr>
             <w:r>
-              <w:t xml:space="preserve">Phụ lục A: AI lập trình (không trình bày)</w:t>
+              <w:t xml:space="preserve">Phụ lục A: Trí tuệ nhân tạo trong lĩnh vực lập trình</w:t>
             </w:r>
           </w:p>
         </w:tc>
@@ -1954,7 +1954,7 @@
               <w:jc w:val="left"/>
             </w:pPr>
             <w:r>
-              <w:t xml:space="preserve">Phụ lục B: Ví dụ Google và các nhà khoa học dùng AI (không trình bày – dự phòng khi được hỏi)</w:t>
+              <w:t xml:space="preserve">Phụ lục B: Một số công trình nghiên cứu ứng dụng trí tuệ nhân tạo của Google</w:t>
             </w:r>
           </w:p>
         </w:tc>
@@ -2016,7 +2016,7 @@
               <w:jc w:val="left"/>
             </w:pPr>
             <w:r>
-              <w:t xml:space="preserve">Phụ lục C: Nguồn tham khảo (không trình bày)</w:t>
+              <w:t xml:space="preserve">Phụ lục C: Tài liệu tham khảo</w:t>
             </w:r>
           </w:p>
         </w:tc>
@@ -2078,7 +2078,7 @@
               <w:jc w:val="left"/>
             </w:pPr>
             <w:r>
-              <w:t xml:space="preserve">Phụ lục D: Dự án và bộ Skill khoa học mở (không trình bày)</w:t>
+              <w:t xml:space="preserve">Phụ lục D: Dự án minh họa và thư viện kỹ năng khoa học mở</w:t>
             </w:r>
           </w:p>
         </w:tc>
@@ -2278,13 +2278,13 @@
     </w:p>
     <w:bookmarkEnd w:id="22"/>
     <w:bookmarkEnd w:id="23"/>
-    <w:bookmarkStart w:id="28" w:name="phần-i.-tổng-quan-19-phút"/>
+    <w:bookmarkStart w:id="28" w:name="X1ed5c8284985b3291bd3009e87834ab21691187"/>
     <w:p>
       <w:pPr>
         <w:pStyle w:val="Heading1"/>
       </w:pPr>
       <w:r>
-        <w:t xml:space="preserve">PHẦN I. TỔNG QUAN (19 phút)</w:t>
+        <w:t xml:space="preserve">PHẦN I. TỔNG QUAN VỀ TRÍ TUỆ NHÂN TẠO VÀ XU THẾ CHUYỂN ĐỔI PHƯƠNG THỨC NGHIÊN CỨU KHOA HỌC (19 phút)</w:t>
       </w:r>
     </w:p>
     <w:p>
@@ -2294,13 +2294,13 @@
         </w:pict>
       </w:r>
     </w:p>
-    <w:bookmarkStart w:id="24" w:name="X5e2791cf2fb76533d937191050fe8e8749ccf3d"/>
+    <w:bookmarkStart w:id="24" w:name="X7013140f8b02d6d1eeb11339317c50a357329ac"/>
     <w:p>
       <w:pPr>
         <w:pStyle w:val="Heading2"/>
       </w:pPr>
       <w:r>
-        <w:t xml:space="preserve">Slide 1 – AI phát triển nhanh đến mức nào: những con số mới nhất (4′)</w:t>
+        <w:t xml:space="preserve">Slide 1 – Tốc độ phát triển của trí tuệ nhân tạo giai đoạn 2019–2026 (4′)</w:t>
       </w:r>
     </w:p>
     <w:p>
@@ -2624,13 +2624,13 @@
       </w:r>
     </w:p>
     <w:bookmarkEnd w:id="24"/>
-    <w:bookmarkStart w:id="25" w:name="X994b28678e20557dbcc0e00066897a30c6e7b31"/>
+    <w:bookmarkStart w:id="25" w:name="X902da8d4261dd07b849e284e5a068515d1a02fb"/>
     <w:p>
       <w:pPr>
         <w:pStyle w:val="Heading2"/>
       </w:pPr>
       <w:r>
-        <w:t xml:space="preserve">Slide 2 – AI trong khoa học: ví dụ quốc tế và Việt Nam (5′)</w:t>
+        <w:t xml:space="preserve">Slide 2 – Ứng dụng trí tuệ nhân tạo trong nghiên cứu khoa học trên thế giới và ở Việt Nam (5′)</w:t>
       </w:r>
     </w:p>
     <w:p>
@@ -3031,13 +3031,13 @@
       </w:r>
     </w:p>
     <w:bookmarkEnd w:id="25"/>
-    <w:bookmarkStart w:id="26" w:name="Xadbfb030a8db414f49527c469921dc167a20dca"/>
+    <w:bookmarkStart w:id="26" w:name="Xa6c8c956c17fdf3bc75de32f02b3b6ea3c90b09"/>
     <w:p>
       <w:pPr>
         <w:pStyle w:val="Heading2"/>
       </w:pPr>
       <w:r>
-        <w:t xml:space="preserve">Slide 3 – Năng lực cốt lõi và tính năng mới của AI Agent (6′)</w:t>
+        <w:t xml:space="preserve">Slide 3 – Năng lực cốt lõi và các tính năng mới của tác tử trí tuệ nhân tạo (AI Agent) (6′)</w:t>
       </w:r>
     </w:p>
     <w:p>
@@ -3814,13 +3814,13 @@
       </w:r>
     </w:p>
     <w:bookmarkEnd w:id="26"/>
-    <w:bookmarkStart w:id="27" w:name="Xca35d572d693031c60afab96fdfbb1edf71dff5"/>
+    <w:bookmarkStart w:id="27" w:name="Xec41b5f8f99d4871d87991256bbff0a89ccea3c"/>
     <w:p>
       <w:pPr>
         <w:pStyle w:val="Heading2"/>
       </w:pPr>
       <w:r>
-        <w:t xml:space="preserve">Slide 4 – Phương thức nghiên cứu đang thay đổi: từ thao tác thủ công đến quy trình liên tục (4′)</w:t>
+        <w:t xml:space="preserve">Slide 4 – Xu thế chuyển đổi phương thức nghiên cứu khoa học dưới tác động của trí tuệ nhân tạo (4′)</w:t>
       </w:r>
     </w:p>
     <w:p>
@@ -4102,13 +4102,13 @@
     </w:p>
     <w:bookmarkEnd w:id="27"/>
     <w:bookmarkEnd w:id="28"/>
-    <w:bookmarkStart w:id="36" w:name="Xe6e19048329e4f9c57419e683206ceaf5f98434"/>
+    <w:bookmarkStart w:id="36" w:name="X78f523f0ac5ed6cdc75b0f5213867ebcbd00bb3"/>
     <w:p>
       <w:pPr>
         <w:pStyle w:val="Heading1"/>
       </w:pPr>
       <w:r>
-        <w:t xml:space="preserve">PHẦN II. LỰA CHỌN VÀ SỬ DỤNG CÔNG CỤ AI PHÙ HỢP (35 phút)</w:t>
+        <w:t xml:space="preserve">PHẦN II. LỰA CHỌN, KHAI THÁC VÀ SỬ DỤNG CÔNG CỤ TRÍ TUỆ NHÂN TẠO (35 phút)</w:t>
       </w:r>
     </w:p>
     <w:p>
@@ -4118,13 +4118,13 @@
         </w:pict>
       </w:r>
     </w:p>
-    <w:bookmarkStart w:id="29" w:name="Xf478361b239b1c542bc0de4be4e80db6f7cbc3f"/>
+    <w:bookmarkStart w:id="29" w:name="X0a67c866dd10f35ef9b59a4e05d59d716eccca2"/>
     <w:p>
       <w:pPr>
         <w:pStyle w:val="Heading2"/>
       </w:pPr>
       <w:r>
-        <w:t xml:space="preserve">Slide 5 – Chọn đúng công cụ: việc nào dùng chatbot, việc nào cần AI Agent (5′)</w:t>
+        <w:t xml:space="preserve">Slide 5 – Phân loại công việc nghiên cứu và lựa chọn công cụ trí tuệ nhân tạo phù hợp (5′)</w:t>
       </w:r>
     </w:p>
     <w:p>
@@ -4541,13 +4541,13 @@
       </w:r>
     </w:p>
     <w:bookmarkEnd w:id="29"/>
-    <w:bookmarkStart w:id="30" w:name="X5733276d07a97894b7ef5c30fb8f70c96b52f27"/>
+    <w:bookmarkStart w:id="30" w:name="X4556bdbf68bfa1bd5383d46576ac2c2ae7e5c55"/>
     <w:p>
       <w:pPr>
         <w:pStyle w:val="Heading2"/>
       </w:pPr>
       <w:r>
-        <w:t xml:space="preserve">Slide 6 – Các công cụ AI phổ biến và vai trò của từng loại (4′)</w:t>
+        <w:t xml:space="preserve">Slide 6 – Các công cụ trí tuệ nhân tạo thông dụng: chức năng và phạm vi sử dụng (4′)</w:t>
       </w:r>
     </w:p>
     <w:p>
@@ -5017,13 +5017,13 @@
       </w:r>
     </w:p>
     <w:bookmarkEnd w:id="30"/>
-    <w:bookmarkStart w:id="31" w:name="X3cdee8486a783c12ce5155f39202b5659e1017c"/>
+    <w:bookmarkStart w:id="31" w:name="X15a711178b1d79d27ffa43c90cd11b37dfa5ae5"/>
     <w:p>
       <w:pPr>
         <w:pStyle w:val="Heading2"/>
       </w:pPr>
       <w:r>
-        <w:t xml:space="preserve">Slide 7 – Giới thiệu Claude: mô hình, gói dịch vụ và tính năng nổi bật trên Windows (7′)</w:t>
+        <w:t xml:space="preserve">Slide 7 – Giới thiệu hệ thống Claude: mô hình, gói dịch vụ và tính năng trên nền tảng Windows (7′)</w:t>
       </w:r>
     </w:p>
     <w:p>
@@ -5905,13 +5905,13 @@
       </w:r>
     </w:p>
     <w:bookmarkEnd w:id="31"/>
-    <w:bookmarkStart w:id="32" w:name="Xcfe02677acd48312f1a8c3116105c2513a1aa6a"/>
+    <w:bookmarkStart w:id="32" w:name="X26959583b21ad955b55d465affd0632a05b2a70"/>
     <w:p>
       <w:pPr>
         <w:pStyle w:val="Heading2"/>
       </w:pPr>
       <w:r>
-        <w:t xml:space="preserve">Slide 8 – Bắt đầu với Claude: 6 bước đầu tiên và tổng hợp dữ liệu nhiều nguồn (7′)</w:t>
+        <w:t xml:space="preserve">Slide 8 – Quy trình khai thác, sử dụng cơ bản hệ thống Claude (7′)</w:t>
       </w:r>
     </w:p>
     <w:p>
@@ -6978,13 +6978,13 @@
       </w:r>
     </w:p>
     <w:bookmarkEnd w:id="32"/>
-    <w:bookmarkStart w:id="33" w:name="Xd9d0d6b663c0b8154825a4c4a283f7a088a8679"/>
+    <w:bookmarkStart w:id="33" w:name="Xc455ddbf0e201b31851ae10fcdbf3478b01bf57"/>
     <w:p>
       <w:pPr>
         <w:pStyle w:val="Heading2"/>
       </w:pPr>
       <w:r>
-        <w:t xml:space="preserve">Slide 9 – Giao việc cho AI Agent: cách viết yêu cầu 5 bước (6′)</w:t>
+        <w:t xml:space="preserve">Slide 9 – Phương pháp giao nhiệm vụ cho tác tử trí tuệ nhân tạo (6′)</w:t>
       </w:r>
     </w:p>
     <w:p>
@@ -7346,13 +7346,13 @@
       </w:r>
     </w:p>
     <w:bookmarkEnd w:id="33"/>
-    <w:bookmarkStart w:id="34" w:name="X0b923a1a013338280d796ef2440c703039fcd56"/>
+    <w:bookmarkStart w:id="34" w:name="Xdadf4c3cd5093f090a2477e16d0023b11fe0dae"/>
     <w:p>
       <w:pPr>
         <w:pStyle w:val="Heading2"/>
       </w:pPr>
       <w:r>
-        <w:t xml:space="preserve">Slide 10 – Không gian làm việc nghiên cứu: mỗi nhiệm vụ một dự án (3′)</w:t>
+        <w:t xml:space="preserve">Slide 10 – Tổ chức không gian làm việc theo từng nhiệm vụ khoa học và công nghệ (3′)</w:t>
       </w:r>
     </w:p>
     <w:p>
@@ -7810,13 +7810,13 @@
       </w:r>
     </w:p>
     <w:bookmarkEnd w:id="34"/>
-    <w:bookmarkStart w:id="35" w:name="X72d5b3d824d06bc2d977fb724c6ea11fcd5ac43"/>
+    <w:bookmarkStart w:id="35" w:name="Xfe3677891e3e35009708b748a26f096f4e00abd"/>
     <w:p>
       <w:pPr>
         <w:pStyle w:val="Heading2"/>
       </w:pPr>
       <w:r>
-        <w:t xml:space="preserve">Slide 11 – Skill, Subagent và hệ thống nhiều Agent (3′) –</w:t>
+        <w:t xml:space="preserve">Slide 11 – Kỹ năng (Skill), tác tử con (Subagent) và hệ đa tác tử (3′) –</w:t>
       </w:r>
       <w:r>
         <w:t xml:space="preserve"> </w:t>
@@ -8029,13 +8029,13 @@
     </w:p>
     <w:bookmarkEnd w:id="35"/>
     <w:bookmarkEnd w:id="36"/>
-    <w:bookmarkStart w:id="45" w:name="X4f170a3005fddfc18f950ed0eb5e931d67b450d"/>
+    <w:bookmarkStart w:id="45" w:name="Xebbffa673623344b085dcb7a665cec729593ad9"/>
     <w:p>
       <w:pPr>
         <w:pStyle w:val="Heading1"/>
       </w:pPr>
       <w:r>
-        <w:t xml:space="preserve">PHẦN III. AI AGENT TRONG VÒNG ĐỜI NHIỆM VỤ KHOA HỌC (42 phút)</w:t>
+        <w:t xml:space="preserve">PHẦN III. ỨNG DỤNG TÁC TỬ TRÍ TUỆ NHÂN TẠO TRONG CHU TRÌNH THỰC HIỆN NHIỆM VỤ KHOA HỌC VÀ CÔNG NGHỆ (42 phút)</w:t>
       </w:r>
     </w:p>
     <w:p>
@@ -8101,13 +8101,13 @@
         </w:pict>
       </w:r>
     </w:p>
-    <w:bookmarkStart w:id="37" w:name="Xd43c46c008d9e4d8849a930e96bda6326ea0cf0"/>
+    <w:bookmarkStart w:id="37" w:name="X3a80e774d37a3c7a38b4880083f454ebfb3b8a0"/>
     <w:p>
       <w:pPr>
         <w:pStyle w:val="Heading2"/>
       </w:pPr>
       <w:r>
-        <w:t xml:space="preserve">Slide 12 – Tổng quan tài liệu: từ bài báo đến khoảng trống nghiên cứu (7′)</w:t>
+        <w:t xml:space="preserve">Slide 12 – Tổng quan tài liệu và xác định khoảng trống nghiên cứu (7′)</w:t>
       </w:r>
     </w:p>
     <w:p>
@@ -8839,13 +8839,13 @@
       </w:r>
     </w:p>
     <w:bookmarkEnd w:id="37"/>
-    <w:bookmarkStart w:id="38" w:name="Xc8ba032270c9c569ced786dfca8e096c44633e5"/>
+    <w:bookmarkStart w:id="38" w:name="X432cfee3380cd7d01956eed8431b30ccb3bc4f2"/>
     <w:p>
       <w:pPr>
         <w:pStyle w:val="Heading2"/>
       </w:pPr>
       <w:r>
-        <w:t xml:space="preserve">Slide 13 – Đề xuất nhiệm vụ: từ khoảng trống đến phiếu đề xuất và thuyết minh – DEMO 1 (7′)</w:t>
+        <w:t xml:space="preserve">Slide 13 – Xây dựng phiếu đề xuất và thuyết minh nhiệm vụ – Minh họa thực nghiệm 1 (7′)</w:t>
       </w:r>
     </w:p>
     <w:p>
@@ -9079,13 +9079,13 @@
       </w:r>
     </w:p>
     <w:bookmarkEnd w:id="38"/>
-    <w:bookmarkStart w:id="39" w:name="Xa112d2126c8edb8d7894d1b2ddf73023b5298a3"/>
+    <w:bookmarkStart w:id="39" w:name="X95dcb3ab3b718a7b0ac24417c75b4156c3eac0f"/>
     <w:p>
       <w:pPr>
         <w:pStyle w:val="Heading2"/>
       </w:pPr>
       <w:r>
-        <w:t xml:space="preserve">Slide 14 – Hồ sơ nhiệm vụ: thuyết minh, tiến độ và kinh phí theo biểu mẫu Trung tâm (5′)</w:t>
+        <w:t xml:space="preserve">Slide 14 – Lập kế hoạch tiến độ và dự toán kinh phí theo biểu mẫu của Trung tâm (5′)</w:t>
       </w:r>
     </w:p>
     <w:p>
@@ -9315,13 +9315,13 @@
       </w:r>
     </w:p>
     <w:bookmarkEnd w:id="39"/>
-    <w:bookmarkStart w:id="40" w:name="Xe2df8c0ff55655febd02bc94b617eccf50b4b2e"/>
+    <w:bookmarkStart w:id="40" w:name="X4faca6bc140feef6ad7b67488b404483a9e374c"/>
     <w:p>
       <w:pPr>
         <w:pStyle w:val="Heading2"/>
       </w:pPr>
       <w:r>
-        <w:t xml:space="preserve">Slide 15 – Xử lý dữ liệu: AI viết và chạy mã Python – DEMO 2 (8′)</w:t>
+        <w:t xml:space="preserve">Slide 15 – Xử lý, phân tích số liệu thực nghiệm bằng mã nguồn Python – Minh họa thực nghiệm 2 (8′)</w:t>
       </w:r>
     </w:p>
     <w:p>
@@ -9623,13 +9623,13 @@
       </w:r>
     </w:p>
     <w:bookmarkEnd w:id="40"/>
-    <w:bookmarkStart w:id="41" w:name="X6b28836b621772ec8296339c72bace8e2eb8206"/>
+    <w:bookmarkStart w:id="41" w:name="Xf9c051b601e36b6350d2ea88b27b43c13b7c1c4"/>
     <w:p>
       <w:pPr>
         <w:pStyle w:val="Heading2"/>
       </w:pPr>
       <w:r>
-        <w:t xml:space="preserve">Slide 16 – Mô hình 3D: mô phỏng quá trình ăn mòn vật liệu theo thời gian (3′)</w:t>
+        <w:t xml:space="preserve">Slide 16 – Mô hình hóa 3D quá trình ăn mòn khí quyển của vật liệu kim loại (3′)</w:t>
       </w:r>
     </w:p>
     <w:p>
@@ -10206,13 +10206,13 @@
       </w:r>
     </w:p>
     <w:bookmarkEnd w:id="41"/>
-    <w:bookmarkStart w:id="42" w:name="X18c4632885f14876c166db8c4340704c141fe3f"/>
+    <w:bookmarkStart w:id="42" w:name="Xeb9c0b2b50c44e43205db45f461d6cdcf353e85"/>
     <w:p>
       <w:pPr>
         <w:pStyle w:val="Heading2"/>
       </w:pPr>
       <w:r>
-        <w:t xml:space="preserve">Slide 17 – Đề tài mật: xây dựng công cụ và xử lý ngay trên máy không kết nối Internet – DEMO 3 (5′)</w:t>
+        <w:t xml:space="preserve">Slide 17 – Xây dựng công cụ xử lý dữ liệu trên máy tính không kết nối Internet đối với nhiệm vụ có nội dung bí mật – Minh họa thực nghiệm 3 (5′)</w:t>
       </w:r>
     </w:p>
     <w:p>
@@ -10796,13 +10796,13 @@
       </w:r>
     </w:p>
     <w:bookmarkEnd w:id="42"/>
-    <w:bookmarkStart w:id="43" w:name="X3d0cb8888c77e00478e39b2807659fc7b9f359f"/>
+    <w:bookmarkStart w:id="43" w:name="X2cd43d54e17a105f7cd682c764868fcbb685c71"/>
     <w:p>
       <w:pPr>
         <w:pStyle w:val="Heading2"/>
       </w:pPr>
       <w:r>
-        <w:t xml:space="preserve">Slide 18 – Công bố kết quả: bài báo và báo cáo tổng hợp theo nhiều định dạng (5′)</w:t>
+        <w:t xml:space="preserve">Slide 18 – Công bố kết quả nghiên cứu và lập báo cáo tổng hợp (5′)</w:t>
       </w:r>
     </w:p>
     <w:p>
@@ -11256,13 +11256,13 @@
       </w:r>
     </w:p>
     <w:bookmarkEnd w:id="43"/>
-    <w:bookmarkStart w:id="44" w:name="Xff024ff663616b9af386751f7c26e6682f4e9d0"/>
+    <w:bookmarkStart w:id="44" w:name="Xc168ec6a35dd25182e83a95b5e7a9d46ecee8cd"/>
     <w:p>
       <w:pPr>
         <w:pStyle w:val="Heading2"/>
       </w:pPr>
       <w:r>
-        <w:t xml:space="preserve">Slide 19 – Toàn cảnh: một nhiệm vụ khoa học đi qua AI Agent (2′) –</w:t>
+        <w:t xml:space="preserve">Slide 19 – Tổng hợp chu trình thực hiện nhiệm vụ khoa học và công nghệ có ứng dụng tác tử trí tuệ nhân tạo (2′) –</w:t>
       </w:r>
       <w:r>
         <w:t xml:space="preserve"> </w:t>
@@ -11365,13 +11365,13 @@
     </w:p>
     <w:bookmarkEnd w:id="44"/>
     <w:bookmarkEnd w:id="45"/>
-    <w:bookmarkStart w:id="55" w:name="Xc880f06cc75ba60a2af63c23eb8d988dbd63543"/>
+    <w:bookmarkStart w:id="55" w:name="X3a72b5620823bd057fa601f63db5843cab00f4b"/>
     <w:p>
       <w:pPr>
         <w:pStyle w:val="Heading1"/>
       </w:pPr>
       <w:r>
-        <w:t xml:space="preserve">PHẦN IV. SKILL, KHOA HỌC MỞ VÀ TỰ ĐỘNG HÓA (15 phút)</w:t>
+        <w:t xml:space="preserve">PHẦN IV. KỸ NĂNG, KHOA HỌC MỞ VÀ TỰ ĐỘNG HÓA QUY TRÌNH NGHIÊN CỨU (15 phút)</w:t>
       </w:r>
     </w:p>
     <w:p>
@@ -11381,13 +11381,13 @@
         </w:pict>
       </w:r>
     </w:p>
-    <w:bookmarkStart w:id="46" w:name="Xede09fe8d87eea4758afea24298a0a93a490a9c"/>
+    <w:bookmarkStart w:id="46" w:name="X818242104804ce0c977341420493fb5a14aef84"/>
     <w:p>
       <w:pPr>
         <w:pStyle w:val="Heading2"/>
       </w:pPr>
       <w:r>
-        <w:t xml:space="preserve">Slide 20 – Skill và khoa học mở: nền móng của tự động hóa (6′)</w:t>
+        <w:t xml:space="preserve">Slide 20 – Kỹ năng (Skill) và khoa học mở – nền tảng tự động hóa hoạt động nghiên cứu (6′)</w:t>
       </w:r>
     </w:p>
     <w:p>
@@ -11977,13 +11977,13 @@
       </w:r>
     </w:p>
     <w:bookmarkEnd w:id="46"/>
-    <w:bookmarkStart w:id="47" w:name="Xed3464729fbb4912ed2c4f95a8612249b6e2b90"/>
+    <w:bookmarkStart w:id="47" w:name="X726540dc6836b0b411b8e79de7361a22afe3ad5"/>
     <w:p>
       <w:pPr>
         <w:pStyle w:val="Heading2"/>
       </w:pPr>
       <w:r>
-        <w:t xml:space="preserve">Slide 21 – Tự động hóa từng bước: từ một công việc đến toàn quy trình (5′)</w:t>
+        <w:t xml:space="preserve">Slide 21 – Lộ trình tự động hóa từ từng công đoạn đến toàn bộ quy trình nghiên cứu (5′)</w:t>
       </w:r>
     </w:p>
     <w:p>
@@ -12504,13 +12504,13 @@
       </w:r>
     </w:p>
     <w:bookmarkEnd w:id="47"/>
-    <w:bookmarkStart w:id="48" w:name="X1cb900760096274a3dd5c9fe1f213f586658b4a"/>
+    <w:bookmarkStart w:id="48" w:name="X735cc2cc89b2c622c4c48db7dc4521398c84c95"/>
     <w:p>
       <w:pPr>
         <w:pStyle w:val="Heading2"/>
       </w:pPr>
       <w:r>
-        <w:t xml:space="preserve">Slide 22 – Quy trình tự động của Trung tâm và năm quyết định của nhà khoa học (4′)</w:t>
+        <w:t xml:space="preserve">Slide 22 – Sơ đồ quy trình tự động hóa của Trung tâm và các nội dung thuộc thẩm quyền quyết định của nhà khoa học (4′)</w:t>
       </w:r>
     </w:p>
     <w:p>
@@ -13131,13 +13131,13 @@
       </w:r>
     </w:p>
     <w:bookmarkEnd w:id="48"/>
-    <w:bookmarkStart w:id="49" w:name="slide-23-trao-đổi-và-thảo-luận-9"/>
+    <w:bookmarkStart w:id="49" w:name="slide-23-trao-đổi-thảo-luận-9"/>
     <w:p>
       <w:pPr>
         <w:pStyle w:val="Heading2"/>
       </w:pPr>
       <w:r>
-        <w:t xml:space="preserve">Slide 23 – Trao đổi và thảo luận (9′)</w:t>
+        <w:t xml:space="preserve">Slide 23 – Trao đổi, thảo luận (9′)</w:t>
       </w:r>
     </w:p>
     <w:p>
@@ -13212,13 +13212,13 @@
       </w:r>
     </w:p>
     <w:bookmarkEnd w:id="49"/>
-    <w:bookmarkStart w:id="50" w:name="Xc5e529fd4c010d30b1942a8d2129db4c84ec610"/>
+    <w:bookmarkStart w:id="50" w:name="Xc1d1bfc469bd29a27f454cc5a1d0d3e81a83768"/>
     <w:p>
       <w:pPr>
         <w:pStyle w:val="Heading2"/>
       </w:pPr>
       <w:r>
-        <w:t xml:space="preserve">Slide 24 – Phụ lục A: AI lập trình (không trình bày)</w:t>
+        <w:t xml:space="preserve">Slide 24 – Phụ lục A: Trí tuệ nhân tạo trong lĩnh vực lập trình (không trình bày)</w:t>
       </w:r>
     </w:p>
     <w:p>
@@ -13321,13 +13321,13 @@
       </w:r>
     </w:p>
     <w:bookmarkEnd w:id="50"/>
-    <w:bookmarkStart w:id="51" w:name="X6d02dea6a9e8ff5038e1983d7c74272693c420f"/>
+    <w:bookmarkStart w:id="51" w:name="X83b1fb41b981806eaafcf513d71488b865b192c"/>
     <w:p>
       <w:pPr>
         <w:pStyle w:val="Heading2"/>
       </w:pPr>
       <w:r>
-        <w:t xml:space="preserve">Slide 25 – Phụ lục B: Ví dụ Google và các nhà khoa học dùng AI (không trình bày – dự phòng khi được hỏi)</w:t>
+        <w:t xml:space="preserve">Slide 25 – Phụ lục B: Một số công trình nghiên cứu ứng dụng trí tuệ nhân tạo của Google (không trình bày)</w:t>
       </w:r>
     </w:p>
     <w:p>
@@ -14005,13 +14005,13 @@
       </w:r>
     </w:p>
     <w:bookmarkEnd w:id="51"/>
-    <w:bookmarkStart w:id="52" w:name="X93d551cb36b78b56d1c5628e3247657e12675ac"/>
+    <w:bookmarkStart w:id="52" w:name="X7613461a50d489aabc0c4f50dba778b09145968"/>
     <w:p>
       <w:pPr>
         <w:pStyle w:val="Heading2"/>
       </w:pPr>
       <w:r>
-        <w:t xml:space="preserve">Slide 26 – Phụ lục C: Nguồn tham khảo (không trình bày)</w:t>
+        <w:t xml:space="preserve">Slide 26 – Phụ lục C: Tài liệu tham khảo (không trình bày)</w:t>
       </w:r>
     </w:p>
     <w:p>
@@ -14102,13 +14102,13 @@
       </w:r>
     </w:p>
     <w:bookmarkEnd w:id="52"/>
-    <w:bookmarkStart w:id="53" w:name="X2627c6a16089affe10a68860cf545edfc1afbe1"/>
+    <w:bookmarkStart w:id="53" w:name="Xad4b20d875ea3727bfbcf3964f28216f1423a66"/>
     <w:p>
       <w:pPr>
         <w:pStyle w:val="Heading2"/>
       </w:pPr>
       <w:r>
-        <w:t xml:space="preserve">Slide 27 – Phụ lục D: Dự án và bộ Skill khoa học mở (không trình bày)</w:t>
+        <w:t xml:space="preserve">Slide 27 – Phụ lục D: Dự án minh họa và thư viện kỹ năng khoa học mở (không trình bày)</w:t>
       </w:r>
     </w:p>
     <w:p>

</xml_diff>

<commit_message>
Trả lại tên slide bản trước, chia 6 phần rõ rệt, thêm đánh giá phản biện
- Khôi phục tên slide theo bản 'Chủ đề: nội dung'
- Demo 3 (đề tài mật) thành Phần IV riêng, đặt sau slide toàn cảnh; thảo luận thành Phần VI; thêm trang chuyển phần
- DANH-GIA-REVIEWER.md: mức khả quan, mức tiếp thu theo phần, rủi ro, đề xuất

Co-Authored-By: Claude Opus 5.5 <noreply@anthropic.com>
Claude-Session: https://claude.ai/code/session_01JoSsghLRHTtvcNzYXbKpzE
</commit_message>
<xml_diff>
--- a/thuyet-trinh/DANH-SACH-SLIDE-v2.5.docx
+++ b/thuyet-trinh/DANH-SACH-SLIDE-v2.5.docx
@@ -137,7 +137,7 @@
         <w:t xml:space="preserve"> </w:t>
       </w:r>
       <w:r>
-        <w:t xml:space="preserve">thêm Slide 16 (mô hình 3D quá trình ăn mòn) và Slide 17 (Demo 3 – công cụ cho máy không Internet); từ slide cũ 16 trở đi số slide cộng 2; thảo luận còn 9′.</w:t>
+        <w:t xml:space="preserve">thêm Slide 16 (mô hình 3D quá trình ăn mòn) và Slide 19 (Demo 3 – công cụ cho máy không Internet); từ slide cũ 16 trở đi số slide cộng 2; thảo luận còn 9′.</w:t>
       </w:r>
       <w:r>
         <w:t xml:space="preserve"> </w:t>
@@ -451,6 +451,56 @@
           <w:p>
             <w:pPr>
               <w:pStyle w:val="Compact"/>
+            </w:pPr>
+          </w:p>
+        </w:tc>
+        <w:tc>
+          <w:tcPr/>
+          <w:p>
+            <w:pPr>
+              <w:pStyle w:val="Compact"/>
+              <w:jc w:val="left"/>
+            </w:pPr>
+            <w:r>
+              <w:rPr>
+                <w:bCs/>
+                <w:b/>
+              </w:rPr>
+              <w:t xml:space="preserve">PHẦN I. TỔNG QUAN – 19′</w:t>
+            </w:r>
+          </w:p>
+        </w:tc>
+        <w:tc>
+          <w:tcPr/>
+          <w:p>
+            <w:pPr>
+              <w:pStyle w:val="Compact"/>
+            </w:pPr>
+          </w:p>
+        </w:tc>
+        <w:tc>
+          <w:tcPr/>
+          <w:p>
+            <w:pPr>
+              <w:pStyle w:val="Compact"/>
+            </w:pPr>
+          </w:p>
+        </w:tc>
+        <w:tc>
+          <w:tcPr/>
+          <w:p>
+            <w:pPr>
+              <w:pStyle w:val="Compact"/>
+            </w:pPr>
+          </w:p>
+        </w:tc>
+      </w:tr>
+      <w:tr>
+        <w:tc>
+          <w:tcPr/>
+          <w:p>
+            <w:pPr>
+              <w:pStyle w:val="Compact"/>
               <w:jc w:val="left"/>
             </w:pPr>
             <w:r>
@@ -466,7 +516,7 @@
               <w:jc w:val="left"/>
             </w:pPr>
             <w:r>
-              <w:t xml:space="preserve">Tốc độ phát triển của trí tuệ nhân tạo giai đoạn 2019–2026</w:t>
+              <w:t xml:space="preserve">AI phát triển nhanh đến mức nào: những con số mới nhất</w:t>
             </w:r>
           </w:p>
         </w:tc>
@@ -528,7 +578,7 @@
               <w:jc w:val="left"/>
             </w:pPr>
             <w:r>
-              <w:t xml:space="preserve">Ứng dụng trí tuệ nhân tạo trong nghiên cứu khoa học trên thế giới và ở Việt Nam</w:t>
+              <w:t xml:space="preserve">AI trong khoa học: ví dụ quốc tế và Việt Nam</w:t>
             </w:r>
           </w:p>
         </w:tc>
@@ -590,7 +640,7 @@
               <w:jc w:val="left"/>
             </w:pPr>
             <w:r>
-              <w:t xml:space="preserve">Năng lực cốt lõi và các tính năng mới của tác tử trí tuệ nhân tạo (AI Agent)</w:t>
+              <w:t xml:space="preserve">Năng lực cốt lõi và tính năng mới của AI Agent</w:t>
             </w:r>
           </w:p>
         </w:tc>
@@ -652,7 +702,7 @@
               <w:jc w:val="left"/>
             </w:pPr>
             <w:r>
-              <w:t xml:space="preserve">Xu thế chuyển đổi phương thức nghiên cứu khoa học dưới tác động của trí tuệ nhân tạo</w:t>
+              <w:t xml:space="preserve">Phương thức nghiên cứu đang thay đổi: từ thao tác thủ công đến quy trình liên tục</w:t>
             </w:r>
           </w:p>
         </w:tc>
@@ -699,6 +749,56 @@
           <w:p>
             <w:pPr>
               <w:pStyle w:val="Compact"/>
+            </w:pPr>
+          </w:p>
+        </w:tc>
+        <w:tc>
+          <w:tcPr/>
+          <w:p>
+            <w:pPr>
+              <w:pStyle w:val="Compact"/>
+              <w:jc w:val="left"/>
+            </w:pPr>
+            <w:r>
+              <w:rPr>
+                <w:bCs/>
+                <w:b/>
+              </w:rPr>
+              <w:t xml:space="preserve">PHẦN II. LỰA CHỌN VÀ SỬ DỤNG CÔNG CỤ AI PHÙ HỢP – 35′</w:t>
+            </w:r>
+          </w:p>
+        </w:tc>
+        <w:tc>
+          <w:tcPr/>
+          <w:p>
+            <w:pPr>
+              <w:pStyle w:val="Compact"/>
+            </w:pPr>
+          </w:p>
+        </w:tc>
+        <w:tc>
+          <w:tcPr/>
+          <w:p>
+            <w:pPr>
+              <w:pStyle w:val="Compact"/>
+            </w:pPr>
+          </w:p>
+        </w:tc>
+        <w:tc>
+          <w:tcPr/>
+          <w:p>
+            <w:pPr>
+              <w:pStyle w:val="Compact"/>
+            </w:pPr>
+          </w:p>
+        </w:tc>
+      </w:tr>
+      <w:tr>
+        <w:tc>
+          <w:tcPr/>
+          <w:p>
+            <w:pPr>
+              <w:pStyle w:val="Compact"/>
               <w:jc w:val="left"/>
             </w:pPr>
             <w:r>
@@ -714,7 +814,7 @@
               <w:jc w:val="left"/>
             </w:pPr>
             <w:r>
-              <w:t xml:space="preserve">Phân loại công việc nghiên cứu và lựa chọn công cụ trí tuệ nhân tạo phù hợp</w:t>
+              <w:t xml:space="preserve">Chọn đúng công cụ: việc nào dùng chatbot, việc nào cần AI Agent</w:t>
             </w:r>
           </w:p>
         </w:tc>
@@ -776,7 +876,7 @@
               <w:jc w:val="left"/>
             </w:pPr>
             <w:r>
-              <w:t xml:space="preserve">Các công cụ trí tuệ nhân tạo thông dụng: chức năng và phạm vi sử dụng</w:t>
+              <w:t xml:space="preserve">Các công cụ AI phổ biến và vai trò của từng loại</w:t>
             </w:r>
           </w:p>
         </w:tc>
@@ -838,7 +938,7 @@
               <w:jc w:val="left"/>
             </w:pPr>
             <w:r>
-              <w:t xml:space="preserve">Giới thiệu hệ thống Claude: mô hình, gói dịch vụ và tính năng trên nền tảng Windows</w:t>
+              <w:t xml:space="preserve">Giới thiệu Claude: mô hình, gói dịch vụ và tính năng nổi bật trên Windows</w:t>
             </w:r>
           </w:p>
         </w:tc>
@@ -900,7 +1000,7 @@
               <w:jc w:val="left"/>
             </w:pPr>
             <w:r>
-              <w:t xml:space="preserve">Quy trình khai thác, sử dụng cơ bản hệ thống Claude</w:t>
+              <w:t xml:space="preserve">Bắt đầu với Claude: 6 bước đầu tiên và tổng hợp dữ liệu nhiều nguồn</w:t>
             </w:r>
           </w:p>
         </w:tc>
@@ -962,7 +1062,7 @@
               <w:jc w:val="left"/>
             </w:pPr>
             <w:r>
-              <w:t xml:space="preserve">Phương pháp giao nhiệm vụ cho tác tử trí tuệ nhân tạo</w:t>
+              <w:t xml:space="preserve">Giao việc cho AI Agent: cách viết yêu cầu 5 bước</w:t>
             </w:r>
           </w:p>
         </w:tc>
@@ -1024,7 +1124,7 @@
               <w:jc w:val="left"/>
             </w:pPr>
             <w:r>
-              <w:t xml:space="preserve">Tổ chức không gian làm việc theo từng nhiệm vụ khoa học và công nghệ</w:t>
+              <w:t xml:space="preserve">Không gian làm việc nghiên cứu: mỗi nhiệm vụ một dự án</w:t>
             </w:r>
           </w:p>
         </w:tc>
@@ -1086,7 +1186,7 @@
               <w:jc w:val="left"/>
             </w:pPr>
             <w:r>
-              <w:t xml:space="preserve">Kỹ năng (Skill), tác tử con (Subagent) và hệ đa tác tử</w:t>
+              <w:t xml:space="preserve">Skill, Subagent và hệ thống nhiều Agent</w:t>
             </w:r>
           </w:p>
         </w:tc>
@@ -1133,6 +1233,56 @@
           <w:p>
             <w:pPr>
               <w:pStyle w:val="Compact"/>
+            </w:pPr>
+          </w:p>
+        </w:tc>
+        <w:tc>
+          <w:tcPr/>
+          <w:p>
+            <w:pPr>
+              <w:pStyle w:val="Compact"/>
+              <w:jc w:val="left"/>
+            </w:pPr>
+            <w:r>
+              <w:rPr>
+                <w:bCs/>
+                <w:b/>
+              </w:rPr>
+              <w:t xml:space="preserve">PHẦN III. AI AGENT TRONG VÒNG ĐỜI NHIỆM VỤ KHOA HỌC – 37′</w:t>
+            </w:r>
+          </w:p>
+        </w:tc>
+        <w:tc>
+          <w:tcPr/>
+          <w:p>
+            <w:pPr>
+              <w:pStyle w:val="Compact"/>
+            </w:pPr>
+          </w:p>
+        </w:tc>
+        <w:tc>
+          <w:tcPr/>
+          <w:p>
+            <w:pPr>
+              <w:pStyle w:val="Compact"/>
+            </w:pPr>
+          </w:p>
+        </w:tc>
+        <w:tc>
+          <w:tcPr/>
+          <w:p>
+            <w:pPr>
+              <w:pStyle w:val="Compact"/>
+            </w:pPr>
+          </w:p>
+        </w:tc>
+      </w:tr>
+      <w:tr>
+        <w:tc>
+          <w:tcPr/>
+          <w:p>
+            <w:pPr>
+              <w:pStyle w:val="Compact"/>
               <w:jc w:val="left"/>
             </w:pPr>
             <w:r>
@@ -1148,7 +1298,7 @@
               <w:jc w:val="left"/>
             </w:pPr>
             <w:r>
-              <w:t xml:space="preserve">Tổng quan tài liệu và xác định khoảng trống nghiên cứu</w:t>
+              <w:t xml:space="preserve">Tổng quan tài liệu: từ bài báo đến khoảng trống nghiên cứu</w:t>
             </w:r>
           </w:p>
         </w:tc>
@@ -1210,7 +1360,7 @@
               <w:jc w:val="left"/>
             </w:pPr>
             <w:r>
-              <w:t xml:space="preserve">Xây dựng phiếu đề xuất và thuyết minh nhiệm vụ – Minh họa thực nghiệm 1</w:t>
+              <w:t xml:space="preserve">Đề xuất nhiệm vụ: từ khoảng trống đến phiếu đề xuất và thuyết minh – DEMO 1</w:t>
             </w:r>
           </w:p>
         </w:tc>
@@ -1272,7 +1422,7 @@
               <w:jc w:val="left"/>
             </w:pPr>
             <w:r>
-              <w:t xml:space="preserve">Lập kế hoạch tiến độ và dự toán kinh phí theo biểu mẫu của Trung tâm</w:t>
+              <w:t xml:space="preserve">Hồ sơ nhiệm vụ: thuyết minh, tiến độ và kinh phí theo biểu mẫu Trung tâm</w:t>
             </w:r>
           </w:p>
         </w:tc>
@@ -1334,7 +1484,7 @@
               <w:jc w:val="left"/>
             </w:pPr>
             <w:r>
-              <w:t xml:space="preserve">Xử lý, phân tích số liệu thực nghiệm bằng mã nguồn Python – Minh họa thực nghiệm 2</w:t>
+              <w:t xml:space="preserve">Xử lý dữ liệu: AI viết và chạy mã Python – DEMO 2</w:t>
             </w:r>
           </w:p>
         </w:tc>
@@ -1396,7 +1546,7 @@
               <w:jc w:val="left"/>
             </w:pPr>
             <w:r>
-              <w:t xml:space="preserve">Mô hình hóa 3D quá trình ăn mòn khí quyển của vật liệu kim loại</w:t>
+              <w:t xml:space="preserve">Mô hình 3D: mô phỏng quá trình ăn mòn vật liệu theo thời gian</w:t>
             </w:r>
           </w:p>
         </w:tc>
@@ -1458,7 +1608,7 @@
               <w:jc w:val="left"/>
             </w:pPr>
             <w:r>
-              <w:t xml:space="preserve">Xây dựng công cụ xử lý dữ liệu trên máy tính không kết nối Internet đối với nhiệm vụ có nội dung bí mật – Minh họa thực nghiệm 3</w:t>
+              <w:t xml:space="preserve">Công bố kết quả: bài báo và báo cáo tổng hợp theo nhiều định dạng</w:t>
             </w:r>
           </w:p>
         </w:tc>
@@ -1520,7 +1670,7 @@
               <w:jc w:val="left"/>
             </w:pPr>
             <w:r>
-              <w:t xml:space="preserve">Công bố kết quả nghiên cứu và lập báo cáo tổng hợp</w:t>
+              <w:t xml:space="preserve">Toàn cảnh: một nhiệm vụ khoa học đi qua AI Agent</w:t>
             </w:r>
           </w:p>
         </w:tc>
@@ -1544,6 +1694,118 @@
               <w:jc w:val="left"/>
             </w:pPr>
             <w:r>
+              <w:t xml:space="preserve">2′</w:t>
+            </w:r>
+          </w:p>
+        </w:tc>
+        <w:tc>
+          <w:tcPr/>
+          <w:p>
+            <w:pPr>
+              <w:pStyle w:val="Compact"/>
+              <w:jc w:val="left"/>
+            </w:pPr>
+            <w:r>
+              <w:t xml:space="preserve">[ ]</w:t>
+            </w:r>
+          </w:p>
+        </w:tc>
+      </w:tr>
+      <w:tr>
+        <w:tc>
+          <w:tcPr/>
+          <w:p>
+            <w:pPr>
+              <w:pStyle w:val="Compact"/>
+            </w:pPr>
+          </w:p>
+        </w:tc>
+        <w:tc>
+          <w:tcPr/>
+          <w:p>
+            <w:pPr>
+              <w:pStyle w:val="Compact"/>
+              <w:jc w:val="left"/>
+            </w:pPr>
+            <w:r>
+              <w:rPr>
+                <w:bCs/>
+                <w:b/>
+              </w:rPr>
+              <w:t xml:space="preserve">PHẦN IV. ĐỀ TÀI MẬT: ỨNG DỤNG AI KHI DỮ LIỆU KHÔNG ĐƯỢC ĐƯA LÊN INTERNET – 5′</w:t>
+            </w:r>
+          </w:p>
+        </w:tc>
+        <w:tc>
+          <w:tcPr/>
+          <w:p>
+            <w:pPr>
+              <w:pStyle w:val="Compact"/>
+            </w:pPr>
+          </w:p>
+        </w:tc>
+        <w:tc>
+          <w:tcPr/>
+          <w:p>
+            <w:pPr>
+              <w:pStyle w:val="Compact"/>
+            </w:pPr>
+          </w:p>
+        </w:tc>
+        <w:tc>
+          <w:tcPr/>
+          <w:p>
+            <w:pPr>
+              <w:pStyle w:val="Compact"/>
+            </w:pPr>
+          </w:p>
+        </w:tc>
+      </w:tr>
+      <w:tr>
+        <w:tc>
+          <w:tcPr/>
+          <w:p>
+            <w:pPr>
+              <w:pStyle w:val="Compact"/>
+              <w:jc w:val="left"/>
+            </w:pPr>
+            <w:r>
+              <w:t xml:space="preserve">19</w:t>
+            </w:r>
+          </w:p>
+        </w:tc>
+        <w:tc>
+          <w:tcPr/>
+          <w:p>
+            <w:pPr>
+              <w:pStyle w:val="Compact"/>
+              <w:jc w:val="left"/>
+            </w:pPr>
+            <w:r>
+              <w:t xml:space="preserve">Đề tài mật: xây dựng công cụ và xử lý ngay trên máy không kết nối Internet – DEMO 3</w:t>
+            </w:r>
+          </w:p>
+        </w:tc>
+        <w:tc>
+          <w:tcPr/>
+          <w:p>
+            <w:pPr>
+              <w:pStyle w:val="Compact"/>
+              <w:jc w:val="left"/>
+            </w:pPr>
+            <w:r>
+              <w:t xml:space="preserve">IV</w:t>
+            </w:r>
+          </w:p>
+        </w:tc>
+        <w:tc>
+          <w:tcPr/>
+          <w:p>
+            <w:pPr>
+              <w:pStyle w:val="Compact"/>
+              <w:jc w:val="left"/>
+            </w:pPr>
+            <w:r>
               <w:t xml:space="preserve">5′</w:t>
             </w:r>
           </w:p>
@@ -1567,46 +1829,96 @@
           <w:p>
             <w:pPr>
               <w:pStyle w:val="Compact"/>
-              <w:jc w:val="left"/>
-            </w:pPr>
-            <w:r>
-              <w:t xml:space="preserve">19</w:t>
-            </w:r>
-          </w:p>
-        </w:tc>
-        <w:tc>
-          <w:tcPr/>
-          <w:p>
-            <w:pPr>
-              <w:pStyle w:val="Compact"/>
-              <w:jc w:val="left"/>
-            </w:pPr>
-            <w:r>
-              <w:t xml:space="preserve">Tổng hợp chu trình thực hiện nhiệm vụ khoa học và công nghệ có ứng dụng tác tử trí tuệ nhân tạo</w:t>
-            </w:r>
-          </w:p>
-        </w:tc>
-        <w:tc>
-          <w:tcPr/>
-          <w:p>
-            <w:pPr>
-              <w:pStyle w:val="Compact"/>
-              <w:jc w:val="left"/>
-            </w:pPr>
-            <w:r>
-              <w:t xml:space="preserve">III</w:t>
-            </w:r>
-          </w:p>
-        </w:tc>
-        <w:tc>
-          <w:tcPr/>
-          <w:p>
-            <w:pPr>
-              <w:pStyle w:val="Compact"/>
-              <w:jc w:val="left"/>
-            </w:pPr>
-            <w:r>
-              <w:t xml:space="preserve">2′</w:t>
+            </w:pPr>
+          </w:p>
+        </w:tc>
+        <w:tc>
+          <w:tcPr/>
+          <w:p>
+            <w:pPr>
+              <w:pStyle w:val="Compact"/>
+              <w:jc w:val="left"/>
+            </w:pPr>
+            <w:r>
+              <w:rPr>
+                <w:bCs/>
+                <w:b/>
+              </w:rPr>
+              <w:t xml:space="preserve">PHẦN V. SKILL, KHOA HỌC MỞ VÀ TỰ ĐỘNG HÓA – 15′</w:t>
+            </w:r>
+          </w:p>
+        </w:tc>
+        <w:tc>
+          <w:tcPr/>
+          <w:p>
+            <w:pPr>
+              <w:pStyle w:val="Compact"/>
+            </w:pPr>
+          </w:p>
+        </w:tc>
+        <w:tc>
+          <w:tcPr/>
+          <w:p>
+            <w:pPr>
+              <w:pStyle w:val="Compact"/>
+            </w:pPr>
+          </w:p>
+        </w:tc>
+        <w:tc>
+          <w:tcPr/>
+          <w:p>
+            <w:pPr>
+              <w:pStyle w:val="Compact"/>
+            </w:pPr>
+          </w:p>
+        </w:tc>
+      </w:tr>
+      <w:tr>
+        <w:tc>
+          <w:tcPr/>
+          <w:p>
+            <w:pPr>
+              <w:pStyle w:val="Compact"/>
+              <w:jc w:val="left"/>
+            </w:pPr>
+            <w:r>
+              <w:t xml:space="preserve">20</w:t>
+            </w:r>
+          </w:p>
+        </w:tc>
+        <w:tc>
+          <w:tcPr/>
+          <w:p>
+            <w:pPr>
+              <w:pStyle w:val="Compact"/>
+              <w:jc w:val="left"/>
+            </w:pPr>
+            <w:r>
+              <w:t xml:space="preserve">Skill và khoa học mở: nền móng của tự động hóa</w:t>
+            </w:r>
+          </w:p>
+        </w:tc>
+        <w:tc>
+          <w:tcPr/>
+          <w:p>
+            <w:pPr>
+              <w:pStyle w:val="Compact"/>
+              <w:jc w:val="left"/>
+            </w:pPr>
+            <w:r>
+              <w:t xml:space="preserve">V</w:t>
+            </w:r>
+          </w:p>
+        </w:tc>
+        <w:tc>
+          <w:tcPr/>
+          <w:p>
+            <w:pPr>
+              <w:pStyle w:val="Compact"/>
+              <w:jc w:val="left"/>
+            </w:pPr>
+            <w:r>
+              <w:t xml:space="preserve">6′</w:t>
             </w:r>
           </w:p>
         </w:tc>
@@ -1632,43 +1944,43 @@
               <w:jc w:val="left"/>
             </w:pPr>
             <w:r>
-              <w:t xml:space="preserve">20</w:t>
-            </w:r>
-          </w:p>
-        </w:tc>
-        <w:tc>
-          <w:tcPr/>
-          <w:p>
-            <w:pPr>
-              <w:pStyle w:val="Compact"/>
-              <w:jc w:val="left"/>
-            </w:pPr>
-            <w:r>
-              <w:t xml:space="preserve">Kỹ năng (Skill) và khoa học mở – nền tảng tự động hóa hoạt động nghiên cứu</w:t>
-            </w:r>
-          </w:p>
-        </w:tc>
-        <w:tc>
-          <w:tcPr/>
-          <w:p>
-            <w:pPr>
-              <w:pStyle w:val="Compact"/>
-              <w:jc w:val="left"/>
-            </w:pPr>
-            <w:r>
-              <w:t xml:space="preserve">IV</w:t>
-            </w:r>
-          </w:p>
-        </w:tc>
-        <w:tc>
-          <w:tcPr/>
-          <w:p>
-            <w:pPr>
-              <w:pStyle w:val="Compact"/>
-              <w:jc w:val="left"/>
-            </w:pPr>
-            <w:r>
-              <w:t xml:space="preserve">6′</w:t>
+              <w:t xml:space="preserve">21</w:t>
+            </w:r>
+          </w:p>
+        </w:tc>
+        <w:tc>
+          <w:tcPr/>
+          <w:p>
+            <w:pPr>
+              <w:pStyle w:val="Compact"/>
+              <w:jc w:val="left"/>
+            </w:pPr>
+            <w:r>
+              <w:t xml:space="preserve">Tự động hóa từng bước: từ một công việc đến toàn quy trình</w:t>
+            </w:r>
+          </w:p>
+        </w:tc>
+        <w:tc>
+          <w:tcPr/>
+          <w:p>
+            <w:pPr>
+              <w:pStyle w:val="Compact"/>
+              <w:jc w:val="left"/>
+            </w:pPr>
+            <w:r>
+              <w:t xml:space="preserve">V</w:t>
+            </w:r>
+          </w:p>
+        </w:tc>
+        <w:tc>
+          <w:tcPr/>
+          <w:p>
+            <w:pPr>
+              <w:pStyle w:val="Compact"/>
+              <w:jc w:val="left"/>
+            </w:pPr>
+            <w:r>
+              <w:t xml:space="preserve">5′</w:t>
             </w:r>
           </w:p>
         </w:tc>
@@ -1694,43 +2006,43 @@
               <w:jc w:val="left"/>
             </w:pPr>
             <w:r>
-              <w:t xml:space="preserve">21</w:t>
-            </w:r>
-          </w:p>
-        </w:tc>
-        <w:tc>
-          <w:tcPr/>
-          <w:p>
-            <w:pPr>
-              <w:pStyle w:val="Compact"/>
-              <w:jc w:val="left"/>
-            </w:pPr>
-            <w:r>
-              <w:t xml:space="preserve">Lộ trình tự động hóa từ từng công đoạn đến toàn bộ quy trình nghiên cứu</w:t>
-            </w:r>
-          </w:p>
-        </w:tc>
-        <w:tc>
-          <w:tcPr/>
-          <w:p>
-            <w:pPr>
-              <w:pStyle w:val="Compact"/>
-              <w:jc w:val="left"/>
-            </w:pPr>
-            <w:r>
-              <w:t xml:space="preserve">IV</w:t>
-            </w:r>
-          </w:p>
-        </w:tc>
-        <w:tc>
-          <w:tcPr/>
-          <w:p>
-            <w:pPr>
-              <w:pStyle w:val="Compact"/>
-              <w:jc w:val="left"/>
-            </w:pPr>
-            <w:r>
-              <w:t xml:space="preserve">5′</w:t>
+              <w:t xml:space="preserve">22</w:t>
+            </w:r>
+          </w:p>
+        </w:tc>
+        <w:tc>
+          <w:tcPr/>
+          <w:p>
+            <w:pPr>
+              <w:pStyle w:val="Compact"/>
+              <w:jc w:val="left"/>
+            </w:pPr>
+            <w:r>
+              <w:t xml:space="preserve">Quy trình tự động của Trung tâm và năm quyết định của nhà khoa học</w:t>
+            </w:r>
+          </w:p>
+        </w:tc>
+        <w:tc>
+          <w:tcPr/>
+          <w:p>
+            <w:pPr>
+              <w:pStyle w:val="Compact"/>
+              <w:jc w:val="left"/>
+            </w:pPr>
+            <w:r>
+              <w:t xml:space="preserve">V</w:t>
+            </w:r>
+          </w:p>
+        </w:tc>
+        <w:tc>
+          <w:tcPr/>
+          <w:p>
+            <w:pPr>
+              <w:pStyle w:val="Compact"/>
+              <w:jc w:val="left"/>
+            </w:pPr>
+            <w:r>
+              <w:t xml:space="preserve">4′</w:t>
             </w:r>
           </w:p>
         </w:tc>
@@ -1753,46 +2065,96 @@
           <w:p>
             <w:pPr>
               <w:pStyle w:val="Compact"/>
-              <w:jc w:val="left"/>
-            </w:pPr>
-            <w:r>
-              <w:t xml:space="preserve">22</w:t>
-            </w:r>
-          </w:p>
-        </w:tc>
-        <w:tc>
-          <w:tcPr/>
-          <w:p>
-            <w:pPr>
-              <w:pStyle w:val="Compact"/>
-              <w:jc w:val="left"/>
-            </w:pPr>
-            <w:r>
-              <w:t xml:space="preserve">Sơ đồ quy trình tự động hóa của Trung tâm và các nội dung thuộc thẩm quyền quyết định của nhà khoa học</w:t>
-            </w:r>
-          </w:p>
-        </w:tc>
-        <w:tc>
-          <w:tcPr/>
-          <w:p>
-            <w:pPr>
-              <w:pStyle w:val="Compact"/>
-              <w:jc w:val="left"/>
-            </w:pPr>
-            <w:r>
-              <w:t xml:space="preserve">IV</w:t>
-            </w:r>
-          </w:p>
-        </w:tc>
-        <w:tc>
-          <w:tcPr/>
-          <w:p>
-            <w:pPr>
-              <w:pStyle w:val="Compact"/>
-              <w:jc w:val="left"/>
-            </w:pPr>
-            <w:r>
-              <w:t xml:space="preserve">4′</w:t>
+            </w:pPr>
+          </w:p>
+        </w:tc>
+        <w:tc>
+          <w:tcPr/>
+          <w:p>
+            <w:pPr>
+              <w:pStyle w:val="Compact"/>
+              <w:jc w:val="left"/>
+            </w:pPr>
+            <w:r>
+              <w:rPr>
+                <w:bCs/>
+                <w:b/>
+              </w:rPr>
+              <w:t xml:space="preserve">PHẦN VI. TRAO ĐỔI VÀ THẢO LUẬN – 9′</w:t>
+            </w:r>
+          </w:p>
+        </w:tc>
+        <w:tc>
+          <w:tcPr/>
+          <w:p>
+            <w:pPr>
+              <w:pStyle w:val="Compact"/>
+            </w:pPr>
+          </w:p>
+        </w:tc>
+        <w:tc>
+          <w:tcPr/>
+          <w:p>
+            <w:pPr>
+              <w:pStyle w:val="Compact"/>
+            </w:pPr>
+          </w:p>
+        </w:tc>
+        <w:tc>
+          <w:tcPr/>
+          <w:p>
+            <w:pPr>
+              <w:pStyle w:val="Compact"/>
+            </w:pPr>
+          </w:p>
+        </w:tc>
+      </w:tr>
+      <w:tr>
+        <w:tc>
+          <w:tcPr/>
+          <w:p>
+            <w:pPr>
+              <w:pStyle w:val="Compact"/>
+              <w:jc w:val="left"/>
+            </w:pPr>
+            <w:r>
+              <w:t xml:space="preserve">23</w:t>
+            </w:r>
+          </w:p>
+        </w:tc>
+        <w:tc>
+          <w:tcPr/>
+          <w:p>
+            <w:pPr>
+              <w:pStyle w:val="Compact"/>
+              <w:jc w:val="left"/>
+            </w:pPr>
+            <w:r>
+              <w:t xml:space="preserve">Trao đổi và thảo luận</w:t>
+            </w:r>
+          </w:p>
+        </w:tc>
+        <w:tc>
+          <w:tcPr/>
+          <w:p>
+            <w:pPr>
+              <w:pStyle w:val="Compact"/>
+              <w:jc w:val="left"/>
+            </w:pPr>
+            <w:r>
+              <w:t xml:space="preserve">VI</w:t>
+            </w:r>
+          </w:p>
+        </w:tc>
+        <w:tc>
+          <w:tcPr/>
+          <w:p>
+            <w:pPr>
+              <w:pStyle w:val="Compact"/>
+              <w:jc w:val="left"/>
+            </w:pPr>
+            <w:r>
+              <w:t xml:space="preserve">9′</w:t>
             </w:r>
           </w:p>
         </w:tc>
@@ -1815,46 +2177,96 @@
           <w:p>
             <w:pPr>
               <w:pStyle w:val="Compact"/>
-              <w:jc w:val="left"/>
-            </w:pPr>
-            <w:r>
-              <w:t xml:space="preserve">23</w:t>
-            </w:r>
-          </w:p>
-        </w:tc>
-        <w:tc>
-          <w:tcPr/>
-          <w:p>
-            <w:pPr>
-              <w:pStyle w:val="Compact"/>
-              <w:jc w:val="left"/>
-            </w:pPr>
-            <w:r>
-              <w:t xml:space="preserve">Trao đổi, thảo luận</w:t>
-            </w:r>
-          </w:p>
-        </w:tc>
-        <w:tc>
-          <w:tcPr/>
-          <w:p>
-            <w:pPr>
-              <w:pStyle w:val="Compact"/>
-              <w:jc w:val="left"/>
-            </w:pPr>
-            <w:r>
-              <w:t xml:space="preserve">IV</w:t>
-            </w:r>
-          </w:p>
-        </w:tc>
-        <w:tc>
-          <w:tcPr/>
-          <w:p>
-            <w:pPr>
-              <w:pStyle w:val="Compact"/>
-              <w:jc w:val="left"/>
-            </w:pPr>
-            <w:r>
-              <w:t xml:space="preserve">9′</w:t>
+            </w:pPr>
+          </w:p>
+        </w:tc>
+        <w:tc>
+          <w:tcPr/>
+          <w:p>
+            <w:pPr>
+              <w:pStyle w:val="Compact"/>
+              <w:jc w:val="left"/>
+            </w:pPr>
+            <w:r>
+              <w:rPr>
+                <w:bCs/>
+                <w:b/>
+              </w:rPr>
+              <w:t xml:space="preserve">PHỤ LỤC (không trình bày)</w:t>
+            </w:r>
+          </w:p>
+        </w:tc>
+        <w:tc>
+          <w:tcPr/>
+          <w:p>
+            <w:pPr>
+              <w:pStyle w:val="Compact"/>
+            </w:pPr>
+          </w:p>
+        </w:tc>
+        <w:tc>
+          <w:tcPr/>
+          <w:p>
+            <w:pPr>
+              <w:pStyle w:val="Compact"/>
+            </w:pPr>
+          </w:p>
+        </w:tc>
+        <w:tc>
+          <w:tcPr/>
+          <w:p>
+            <w:pPr>
+              <w:pStyle w:val="Compact"/>
+            </w:pPr>
+          </w:p>
+        </w:tc>
+      </w:tr>
+      <w:tr>
+        <w:tc>
+          <w:tcPr/>
+          <w:p>
+            <w:pPr>
+              <w:pStyle w:val="Compact"/>
+              <w:jc w:val="left"/>
+            </w:pPr>
+            <w:r>
+              <w:t xml:space="preserve">24</w:t>
+            </w:r>
+          </w:p>
+        </w:tc>
+        <w:tc>
+          <w:tcPr/>
+          <w:p>
+            <w:pPr>
+              <w:pStyle w:val="Compact"/>
+              <w:jc w:val="left"/>
+            </w:pPr>
+            <w:r>
+              <w:t xml:space="preserve">Phụ lục A: AI lập trình (không trình bày)</w:t>
+            </w:r>
+          </w:p>
+        </w:tc>
+        <w:tc>
+          <w:tcPr/>
+          <w:p>
+            <w:pPr>
+              <w:pStyle w:val="Compact"/>
+              <w:jc w:val="left"/>
+            </w:pPr>
+            <w:r>
+              <w:t xml:space="preserve">PL</w:t>
+            </w:r>
+          </w:p>
+        </w:tc>
+        <w:tc>
+          <w:tcPr/>
+          <w:p>
+            <w:pPr>
+              <w:pStyle w:val="Compact"/>
+              <w:jc w:val="left"/>
+            </w:pPr>
+            <w:r>
+              <w:t xml:space="preserve">–</w:t>
             </w:r>
           </w:p>
         </w:tc>
@@ -1880,31 +2292,31 @@
               <w:jc w:val="left"/>
             </w:pPr>
             <w:r>
-              <w:t xml:space="preserve">24</w:t>
-            </w:r>
-          </w:p>
-        </w:tc>
-        <w:tc>
-          <w:tcPr/>
-          <w:p>
-            <w:pPr>
-              <w:pStyle w:val="Compact"/>
-              <w:jc w:val="left"/>
-            </w:pPr>
-            <w:r>
-              <w:t xml:space="preserve">Phụ lục A: Trí tuệ nhân tạo trong lĩnh vực lập trình</w:t>
-            </w:r>
-          </w:p>
-        </w:tc>
-        <w:tc>
-          <w:tcPr/>
-          <w:p>
-            <w:pPr>
-              <w:pStyle w:val="Compact"/>
-              <w:jc w:val="left"/>
-            </w:pPr>
-            <w:r>
-              <w:t xml:space="preserve">IV</w:t>
+              <w:t xml:space="preserve">25</w:t>
+            </w:r>
+          </w:p>
+        </w:tc>
+        <w:tc>
+          <w:tcPr/>
+          <w:p>
+            <w:pPr>
+              <w:pStyle w:val="Compact"/>
+              <w:jc w:val="left"/>
+            </w:pPr>
+            <w:r>
+              <w:t xml:space="preserve">Phụ lục B: Ví dụ Google và các nhà khoa học dùng AI (không trình bày – dự phòng khi được hỏi)</w:t>
+            </w:r>
+          </w:p>
+        </w:tc>
+        <w:tc>
+          <w:tcPr/>
+          <w:p>
+            <w:pPr>
+              <w:pStyle w:val="Compact"/>
+              <w:jc w:val="left"/>
+            </w:pPr>
+            <w:r>
+              <w:t xml:space="preserve">PL</w:t>
             </w:r>
           </w:p>
         </w:tc>
@@ -1942,31 +2354,31 @@
               <w:jc w:val="left"/>
             </w:pPr>
             <w:r>
-              <w:t xml:space="preserve">25</w:t>
-            </w:r>
-          </w:p>
-        </w:tc>
-        <w:tc>
-          <w:tcPr/>
-          <w:p>
-            <w:pPr>
-              <w:pStyle w:val="Compact"/>
-              <w:jc w:val="left"/>
-            </w:pPr>
-            <w:r>
-              <w:t xml:space="preserve">Phụ lục B: Một số công trình nghiên cứu ứng dụng trí tuệ nhân tạo của Google</w:t>
-            </w:r>
-          </w:p>
-        </w:tc>
-        <w:tc>
-          <w:tcPr/>
-          <w:p>
-            <w:pPr>
-              <w:pStyle w:val="Compact"/>
-              <w:jc w:val="left"/>
-            </w:pPr>
-            <w:r>
-              <w:t xml:space="preserve">IV</w:t>
+              <w:t xml:space="preserve">26</w:t>
+            </w:r>
+          </w:p>
+        </w:tc>
+        <w:tc>
+          <w:tcPr/>
+          <w:p>
+            <w:pPr>
+              <w:pStyle w:val="Compact"/>
+              <w:jc w:val="left"/>
+            </w:pPr>
+            <w:r>
+              <w:t xml:space="preserve">Phụ lục C: Nguồn tham khảo (không trình bày)</w:t>
+            </w:r>
+          </w:p>
+        </w:tc>
+        <w:tc>
+          <w:tcPr/>
+          <w:p>
+            <w:pPr>
+              <w:pStyle w:val="Compact"/>
+              <w:jc w:val="left"/>
+            </w:pPr>
+            <w:r>
+              <w:t xml:space="preserve">PL</w:t>
             </w:r>
           </w:p>
         </w:tc>
@@ -2004,68 +2416,6 @@
               <w:jc w:val="left"/>
             </w:pPr>
             <w:r>
-              <w:t xml:space="preserve">26</w:t>
-            </w:r>
-          </w:p>
-        </w:tc>
-        <w:tc>
-          <w:tcPr/>
-          <w:p>
-            <w:pPr>
-              <w:pStyle w:val="Compact"/>
-              <w:jc w:val="left"/>
-            </w:pPr>
-            <w:r>
-              <w:t xml:space="preserve">Phụ lục C: Tài liệu tham khảo</w:t>
-            </w:r>
-          </w:p>
-        </w:tc>
-        <w:tc>
-          <w:tcPr/>
-          <w:p>
-            <w:pPr>
-              <w:pStyle w:val="Compact"/>
-              <w:jc w:val="left"/>
-            </w:pPr>
-            <w:r>
-              <w:t xml:space="preserve">IV</w:t>
-            </w:r>
-          </w:p>
-        </w:tc>
-        <w:tc>
-          <w:tcPr/>
-          <w:p>
-            <w:pPr>
-              <w:pStyle w:val="Compact"/>
-              <w:jc w:val="left"/>
-            </w:pPr>
-            <w:r>
-              <w:t xml:space="preserve">–</w:t>
-            </w:r>
-          </w:p>
-        </w:tc>
-        <w:tc>
-          <w:tcPr/>
-          <w:p>
-            <w:pPr>
-              <w:pStyle w:val="Compact"/>
-              <w:jc w:val="left"/>
-            </w:pPr>
-            <w:r>
-              <w:t xml:space="preserve">[ ]</w:t>
-            </w:r>
-          </w:p>
-        </w:tc>
-      </w:tr>
-      <w:tr>
-        <w:tc>
-          <w:tcPr/>
-          <w:p>
-            <w:pPr>
-              <w:pStyle w:val="Compact"/>
-              <w:jc w:val="left"/>
-            </w:pPr>
-            <w:r>
               <w:t xml:space="preserve">27</w:t>
             </w:r>
           </w:p>
@@ -2078,19 +2428,19 @@
               <w:jc w:val="left"/>
             </w:pPr>
             <w:r>
-              <w:t xml:space="preserve">Phụ lục D: Dự án minh họa và thư viện kỹ năng khoa học mở</w:t>
-            </w:r>
-          </w:p>
-        </w:tc>
-        <w:tc>
-          <w:tcPr/>
-          <w:p>
-            <w:pPr>
-              <w:pStyle w:val="Compact"/>
-              <w:jc w:val="left"/>
-            </w:pPr>
-            <w:r>
-              <w:t xml:space="preserve">IV</w:t>
+              <w:t xml:space="preserve">Phụ lục D: Dự án và bộ Skill khoa học mở (không trình bày)</w:t>
+            </w:r>
+          </w:p>
+        </w:tc>
+        <w:tc>
+          <w:tcPr/>
+          <w:p>
+            <w:pPr>
+              <w:pStyle w:val="Compact"/>
+              <w:jc w:val="left"/>
+            </w:pPr>
+            <w:r>
+              <w:t xml:space="preserve">PL</w:t>
             </w:r>
           </w:p>
         </w:tc>
@@ -2278,13 +2628,31 @@
     </w:p>
     <w:bookmarkEnd w:id="22"/>
     <w:bookmarkEnd w:id="23"/>
-    <w:bookmarkStart w:id="28" w:name="X1ed5c8284985b3291bd3009e87834ab21691187"/>
+    <w:bookmarkStart w:id="28" w:name="phần-i.-tổng-quan-19-phút"/>
     <w:p>
       <w:pPr>
         <w:pStyle w:val="Heading1"/>
       </w:pPr>
       <w:r>
-        <w:t xml:space="preserve">PHẦN I. TỔNG QUAN VỀ TRÍ TUỆ NHÂN TẠO VÀ XU THẾ CHUYỂN ĐỔI PHƯƠNG THỨC NGHIÊN CỨU KHOA HỌC (19 phút)</w:t>
+        <w:t xml:space="preserve">PHẦN I. TỔNG QUAN (19 phút)</w:t>
+      </w:r>
+    </w:p>
+    <w:p>
+      <w:pPr>
+        <w:pStyle w:val="FirstParagraph"/>
+      </w:pPr>
+      <w:r>
+        <w:rPr>
+          <w:bCs/>
+          <w:b/>
+        </w:rPr>
+        <w:t xml:space="preserve">Trang chuyển phần:</w:t>
+      </w:r>
+      <w:r>
+        <w:t xml:space="preserve"> </w:t>
+      </w:r>
+      <w:r>
+        <w:t xml:space="preserve">tên Phần I · Slide 1–4</w:t>
       </w:r>
     </w:p>
     <w:p>
@@ -2294,13 +2662,13 @@
         </w:pict>
       </w:r>
     </w:p>
-    <w:bookmarkStart w:id="24" w:name="X7013140f8b02d6d1eeb11339317c50a357329ac"/>
+    <w:bookmarkStart w:id="24" w:name="X5e2791cf2fb76533d937191050fe8e8749ccf3d"/>
     <w:p>
       <w:pPr>
         <w:pStyle w:val="Heading2"/>
       </w:pPr>
       <w:r>
-        <w:t xml:space="preserve">Slide 1 – Tốc độ phát triển của trí tuệ nhân tạo giai đoạn 2019–2026 (4′)</w:t>
+        <w:t xml:space="preserve">Slide 1 – AI phát triển nhanh đến mức nào: những con số mới nhất (4′)</w:t>
       </w:r>
     </w:p>
     <w:p>
@@ -2624,13 +2992,13 @@
       </w:r>
     </w:p>
     <w:bookmarkEnd w:id="24"/>
-    <w:bookmarkStart w:id="25" w:name="X902da8d4261dd07b849e284e5a068515d1a02fb"/>
+    <w:bookmarkStart w:id="25" w:name="X994b28678e20557dbcc0e00066897a30c6e7b31"/>
     <w:p>
       <w:pPr>
         <w:pStyle w:val="Heading2"/>
       </w:pPr>
       <w:r>
-        <w:t xml:space="preserve">Slide 2 – Ứng dụng trí tuệ nhân tạo trong nghiên cứu khoa học trên thế giới và ở Việt Nam (5′)</w:t>
+        <w:t xml:space="preserve">Slide 2 – AI trong khoa học: ví dụ quốc tế và Việt Nam (5′)</w:t>
       </w:r>
     </w:p>
     <w:p>
@@ -3031,13 +3399,13 @@
       </w:r>
     </w:p>
     <w:bookmarkEnd w:id="25"/>
-    <w:bookmarkStart w:id="26" w:name="Xa6c8c956c17fdf3bc75de32f02b3b6ea3c90b09"/>
+    <w:bookmarkStart w:id="26" w:name="Xadbfb030a8db414f49527c469921dc167a20dca"/>
     <w:p>
       <w:pPr>
         <w:pStyle w:val="Heading2"/>
       </w:pPr>
       <w:r>
-        <w:t xml:space="preserve">Slide 3 – Năng lực cốt lõi và các tính năng mới của tác tử trí tuệ nhân tạo (AI Agent) (6′)</w:t>
+        <w:t xml:space="preserve">Slide 3 – Năng lực cốt lõi và tính năng mới của AI Agent (6′)</w:t>
       </w:r>
     </w:p>
     <w:p>
@@ -3814,13 +4182,13 @@
       </w:r>
     </w:p>
     <w:bookmarkEnd w:id="26"/>
-    <w:bookmarkStart w:id="27" w:name="Xec41b5f8f99d4871d87991256bbff0a89ccea3c"/>
+    <w:bookmarkStart w:id="27" w:name="Xca35d572d693031c60afab96fdfbb1edf71dff5"/>
     <w:p>
       <w:pPr>
         <w:pStyle w:val="Heading2"/>
       </w:pPr>
       <w:r>
-        <w:t xml:space="preserve">Slide 4 – Xu thế chuyển đổi phương thức nghiên cứu khoa học dưới tác động của trí tuệ nhân tạo (4′)</w:t>
+        <w:t xml:space="preserve">Slide 4 – Phương thức nghiên cứu đang thay đổi: từ thao tác thủ công đến quy trình liên tục (4′)</w:t>
       </w:r>
     </w:p>
     <w:p>
@@ -4102,13 +4470,31 @@
     </w:p>
     <w:bookmarkEnd w:id="27"/>
     <w:bookmarkEnd w:id="28"/>
-    <w:bookmarkStart w:id="36" w:name="X78f523f0ac5ed6cdc75b0f5213867ebcbd00bb3"/>
+    <w:bookmarkStart w:id="36" w:name="Xe6e19048329e4f9c57419e683206ceaf5f98434"/>
     <w:p>
       <w:pPr>
         <w:pStyle w:val="Heading1"/>
       </w:pPr>
       <w:r>
-        <w:t xml:space="preserve">PHẦN II. LỰA CHỌN, KHAI THÁC VÀ SỬ DỤNG CÔNG CỤ TRÍ TUỆ NHÂN TẠO (35 phút)</w:t>
+        <w:t xml:space="preserve">PHẦN II. LỰA CHỌN VÀ SỬ DỤNG CÔNG CỤ AI PHÙ HỢP (35 phút)</w:t>
+      </w:r>
+    </w:p>
+    <w:p>
+      <w:pPr>
+        <w:pStyle w:val="FirstParagraph"/>
+      </w:pPr>
+      <w:r>
+        <w:rPr>
+          <w:bCs/>
+          <w:b/>
+        </w:rPr>
+        <w:t xml:space="preserve">Trang chuyển phần:</w:t>
+      </w:r>
+      <w:r>
+        <w:t xml:space="preserve"> </w:t>
+      </w:r>
+      <w:r>
+        <w:t xml:space="preserve">tên Phần II · Slide 5–11</w:t>
       </w:r>
     </w:p>
     <w:p>
@@ -4118,13 +4504,13 @@
         </w:pict>
       </w:r>
     </w:p>
-    <w:bookmarkStart w:id="29" w:name="X0a67c866dd10f35ef9b59a4e05d59d716eccca2"/>
+    <w:bookmarkStart w:id="29" w:name="Xf478361b239b1c542bc0de4be4e80db6f7cbc3f"/>
     <w:p>
       <w:pPr>
         <w:pStyle w:val="Heading2"/>
       </w:pPr>
       <w:r>
-        <w:t xml:space="preserve">Slide 5 – Phân loại công việc nghiên cứu và lựa chọn công cụ trí tuệ nhân tạo phù hợp (5′)</w:t>
+        <w:t xml:space="preserve">Slide 5 – Chọn đúng công cụ: việc nào dùng chatbot, việc nào cần AI Agent (5′)</w:t>
       </w:r>
     </w:p>
     <w:p>
@@ -4541,13 +4927,13 @@
       </w:r>
     </w:p>
     <w:bookmarkEnd w:id="29"/>
-    <w:bookmarkStart w:id="30" w:name="X4556bdbf68bfa1bd5383d46576ac2c2ae7e5c55"/>
+    <w:bookmarkStart w:id="30" w:name="X5733276d07a97894b7ef5c30fb8f70c96b52f27"/>
     <w:p>
       <w:pPr>
         <w:pStyle w:val="Heading2"/>
       </w:pPr>
       <w:r>
-        <w:t xml:space="preserve">Slide 6 – Các công cụ trí tuệ nhân tạo thông dụng: chức năng và phạm vi sử dụng (4′)</w:t>
+        <w:t xml:space="preserve">Slide 6 – Các công cụ AI phổ biến và vai trò của từng loại (4′)</w:t>
       </w:r>
     </w:p>
     <w:p>
@@ -5017,13 +5403,13 @@
       </w:r>
     </w:p>
     <w:bookmarkEnd w:id="30"/>
-    <w:bookmarkStart w:id="31" w:name="X15a711178b1d79d27ffa43c90cd11b37dfa5ae5"/>
+    <w:bookmarkStart w:id="31" w:name="X3cdee8486a783c12ce5155f39202b5659e1017c"/>
     <w:p>
       <w:pPr>
         <w:pStyle w:val="Heading2"/>
       </w:pPr>
       <w:r>
-        <w:t xml:space="preserve">Slide 7 – Giới thiệu hệ thống Claude: mô hình, gói dịch vụ và tính năng trên nền tảng Windows (7′)</w:t>
+        <w:t xml:space="preserve">Slide 7 – Giới thiệu Claude: mô hình, gói dịch vụ và tính năng nổi bật trên Windows (7′)</w:t>
       </w:r>
     </w:p>
     <w:p>
@@ -5905,13 +6291,13 @@
       </w:r>
     </w:p>
     <w:bookmarkEnd w:id="31"/>
-    <w:bookmarkStart w:id="32" w:name="X26959583b21ad955b55d465affd0632a05b2a70"/>
+    <w:bookmarkStart w:id="32" w:name="Xcfe02677acd48312f1a8c3116105c2513a1aa6a"/>
     <w:p>
       <w:pPr>
         <w:pStyle w:val="Heading2"/>
       </w:pPr>
       <w:r>
-        <w:t xml:space="preserve">Slide 8 – Quy trình khai thác, sử dụng cơ bản hệ thống Claude (7′)</w:t>
+        <w:t xml:space="preserve">Slide 8 – Bắt đầu với Claude: 6 bước đầu tiên và tổng hợp dữ liệu nhiều nguồn (7′)</w:t>
       </w:r>
     </w:p>
     <w:p>
@@ -6978,13 +7364,13 @@
       </w:r>
     </w:p>
     <w:bookmarkEnd w:id="32"/>
-    <w:bookmarkStart w:id="33" w:name="Xc455ddbf0e201b31851ae10fcdbf3478b01bf57"/>
+    <w:bookmarkStart w:id="33" w:name="Xd9d0d6b663c0b8154825a4c4a283f7a088a8679"/>
     <w:p>
       <w:pPr>
         <w:pStyle w:val="Heading2"/>
       </w:pPr>
       <w:r>
-        <w:t xml:space="preserve">Slide 9 – Phương pháp giao nhiệm vụ cho tác tử trí tuệ nhân tạo (6′)</w:t>
+        <w:t xml:space="preserve">Slide 9 – Giao việc cho AI Agent: cách viết yêu cầu 5 bước (6′)</w:t>
       </w:r>
     </w:p>
     <w:p>
@@ -7346,13 +7732,13 @@
       </w:r>
     </w:p>
     <w:bookmarkEnd w:id="33"/>
-    <w:bookmarkStart w:id="34" w:name="Xdadf4c3cd5093f090a2477e16d0023b11fe0dae"/>
+    <w:bookmarkStart w:id="34" w:name="X0b923a1a013338280d796ef2440c703039fcd56"/>
     <w:p>
       <w:pPr>
         <w:pStyle w:val="Heading2"/>
       </w:pPr>
       <w:r>
-        <w:t xml:space="preserve">Slide 10 – Tổ chức không gian làm việc theo từng nhiệm vụ khoa học và công nghệ (3′)</w:t>
+        <w:t xml:space="preserve">Slide 10 – Không gian làm việc nghiên cứu: mỗi nhiệm vụ một dự án (3′)</w:t>
       </w:r>
     </w:p>
     <w:p>
@@ -7717,7 +8103,7 @@
         <w:rPr>
           <w:rStyle w:val="VerbatimChar"/>
         </w:rPr>
-        <w:t xml:space="preserve">├── 06-bai-bao/              ← bản thảo bài báo                                             (Slide 18)</w:t>
+        <w:t xml:space="preserve">├── 06-bai-bao/              ← bản thảo bài báo                                             (Slide 17)</w:t>
       </w:r>
       <w:r>
         <w:br/>
@@ -7810,13 +8196,13 @@
       </w:r>
     </w:p>
     <w:bookmarkEnd w:id="34"/>
-    <w:bookmarkStart w:id="35" w:name="Xfe3677891e3e35009708b748a26f096f4e00abd"/>
+    <w:bookmarkStart w:id="35" w:name="X72d5b3d824d06bc2d977fb724c6ea11fcd5ac43"/>
     <w:p>
       <w:pPr>
         <w:pStyle w:val="Heading2"/>
       </w:pPr>
       <w:r>
-        <w:t xml:space="preserve">Slide 11 – Kỹ năng (Skill), tác tử con (Subagent) và hệ đa tác tử (3′) –</w:t>
+        <w:t xml:space="preserve">Slide 11 – Skill, Subagent và hệ thống nhiều Agent (3′) –</w:t>
       </w:r>
       <w:r>
         <w:t xml:space="preserve"> </w:t>
@@ -8029,13 +8415,31 @@
     </w:p>
     <w:bookmarkEnd w:id="35"/>
     <w:bookmarkEnd w:id="36"/>
-    <w:bookmarkStart w:id="45" w:name="Xebbffa673623344b085dcb7a665cec729593ad9"/>
+    <w:bookmarkStart w:id="44" w:name="X69b1f55d32cec84c0ec78960410c4370761b2a6"/>
     <w:p>
       <w:pPr>
         <w:pStyle w:val="Heading1"/>
       </w:pPr>
       <w:r>
-        <w:t xml:space="preserve">PHẦN III. ỨNG DỤNG TÁC TỬ TRÍ TUỆ NHÂN TẠO TRONG CHU TRÌNH THỰC HIỆN NHIỆM VỤ KHOA HỌC VÀ CÔNG NGHỆ (42 phút)</w:t>
+        <w:t xml:space="preserve">PHẦN III. AI AGENT TRONG VÒNG ĐỜI NHIỆM VỤ KHOA HỌC (37 phút)</w:t>
+      </w:r>
+    </w:p>
+    <w:p>
+      <w:pPr>
+        <w:pStyle w:val="FirstParagraph"/>
+      </w:pPr>
+      <w:r>
+        <w:rPr>
+          <w:bCs/>
+          <w:b/>
+        </w:rPr>
+        <w:t xml:space="preserve">Trang chuyển phần:</w:t>
+      </w:r>
+      <w:r>
+        <w:t xml:space="preserve"> </w:t>
+      </w:r>
+      <w:r>
+        <w:t xml:space="preserve">tên Phần III · Slide 12–18</w:t>
       </w:r>
     </w:p>
     <w:p>
@@ -8056,7 +8460,7 @@
         <w:t xml:space="preserve">bắt đầu ngay bằng tìm khoảng trống nghiên cứu</w:t>
       </w:r>
       <w:r>
-        <w:t xml:space="preserve">; slide tổng quan vòng đời chuyển xuống cuối phần (Slide 19) để tổng kết.</w:t>
+        <w:t xml:space="preserve">; slide tổng quan vòng đời chuyển xuống cuối phần (Slide 18) để tổng kết.</w:t>
       </w:r>
       <w:r>
         <w:t xml:space="preserve"> </w:t>
@@ -8101,13 +8505,13 @@
         </w:pict>
       </w:r>
     </w:p>
-    <w:bookmarkStart w:id="37" w:name="X3a80e774d37a3c7a38b4880083f454ebfb3b8a0"/>
+    <w:bookmarkStart w:id="37" w:name="Xd43c46c008d9e4d8849a930e96bda6326ea0cf0"/>
     <w:p>
       <w:pPr>
         <w:pStyle w:val="Heading2"/>
       </w:pPr>
       <w:r>
-        <w:t xml:space="preserve">Slide 12 – Tổng quan tài liệu và xác định khoảng trống nghiên cứu (7′)</w:t>
+        <w:t xml:space="preserve">Slide 12 – Tổng quan tài liệu: từ bài báo đến khoảng trống nghiên cứu (7′)</w:t>
       </w:r>
     </w:p>
     <w:p>
@@ -8839,13 +9243,13 @@
       </w:r>
     </w:p>
     <w:bookmarkEnd w:id="37"/>
-    <w:bookmarkStart w:id="38" w:name="X432cfee3380cd7d01956eed8431b30ccb3bc4f2"/>
+    <w:bookmarkStart w:id="38" w:name="Xc8ba032270c9c569ced786dfca8e096c44633e5"/>
     <w:p>
       <w:pPr>
         <w:pStyle w:val="Heading2"/>
       </w:pPr>
       <w:r>
-        <w:t xml:space="preserve">Slide 13 – Xây dựng phiếu đề xuất và thuyết minh nhiệm vụ – Minh họa thực nghiệm 1 (7′)</w:t>
+        <w:t xml:space="preserve">Slide 13 – Đề xuất nhiệm vụ: từ khoảng trống đến phiếu đề xuất và thuyết minh – DEMO 1 (7′)</w:t>
       </w:r>
     </w:p>
     <w:p>
@@ -9079,13 +9483,13 @@
       </w:r>
     </w:p>
     <w:bookmarkEnd w:id="38"/>
-    <w:bookmarkStart w:id="39" w:name="X95dcb3ab3b718a7b0ac24417c75b4156c3eac0f"/>
+    <w:bookmarkStart w:id="39" w:name="Xa112d2126c8edb8d7894d1b2ddf73023b5298a3"/>
     <w:p>
       <w:pPr>
         <w:pStyle w:val="Heading2"/>
       </w:pPr>
       <w:r>
-        <w:t xml:space="preserve">Slide 14 – Lập kế hoạch tiến độ và dự toán kinh phí theo biểu mẫu của Trung tâm (5′)</w:t>
+        <w:t xml:space="preserve">Slide 14 – Hồ sơ nhiệm vụ: thuyết minh, tiến độ và kinh phí theo biểu mẫu Trung tâm (5′)</w:t>
       </w:r>
     </w:p>
     <w:p>
@@ -9315,13 +9719,13 @@
       </w:r>
     </w:p>
     <w:bookmarkEnd w:id="39"/>
-    <w:bookmarkStart w:id="40" w:name="X4faca6bc140feef6ad7b67488b404483a9e374c"/>
+    <w:bookmarkStart w:id="40" w:name="Xe2df8c0ff55655febd02bc94b617eccf50b4b2e"/>
     <w:p>
       <w:pPr>
         <w:pStyle w:val="Heading2"/>
       </w:pPr>
       <w:r>
-        <w:t xml:space="preserve">Slide 15 – Xử lý, phân tích số liệu thực nghiệm bằng mã nguồn Python – Minh họa thực nghiệm 2 (8′)</w:t>
+        <w:t xml:space="preserve">Slide 15 – Xử lý dữ liệu: AI viết và chạy mã Python – DEMO 2 (8′)</w:t>
       </w:r>
     </w:p>
     <w:p>
@@ -9623,13 +10027,13 @@
       </w:r>
     </w:p>
     <w:bookmarkEnd w:id="40"/>
-    <w:bookmarkStart w:id="41" w:name="Xf9c051b601e36b6350d2ea88b27b43c13b7c1c4"/>
+    <w:bookmarkStart w:id="41" w:name="X6b28836b621772ec8296339c72bace8e2eb8206"/>
     <w:p>
       <w:pPr>
         <w:pStyle w:val="Heading2"/>
       </w:pPr>
       <w:r>
-        <w:t xml:space="preserve">Slide 16 – Mô hình hóa 3D quá trình ăn mòn khí quyển của vật liệu kim loại (3′)</w:t>
+        <w:t xml:space="preserve">Slide 16 – Mô hình 3D: mô phỏng quá trình ăn mòn vật liệu theo thời gian (3′)</w:t>
       </w:r>
     </w:p>
     <w:p>
@@ -10206,13 +10610,13 @@
       </w:r>
     </w:p>
     <w:bookmarkEnd w:id="41"/>
-    <w:bookmarkStart w:id="42" w:name="Xeb9c0b2b50c44e43205db45f461d6cdcf353e85"/>
+    <w:bookmarkStart w:id="42" w:name="X9dd84735f9bde2aa6768557122fd994d207bc80"/>
     <w:p>
       <w:pPr>
         <w:pStyle w:val="Heading2"/>
       </w:pPr>
       <w:r>
-        <w:t xml:space="preserve">Slide 17 – Xây dựng công cụ xử lý dữ liệu trên máy tính không kết nối Internet đối với nhiệm vụ có nội dung bí mật – Minh họa thực nghiệm 3 (5′)</w:t>
+        <w:t xml:space="preserve">Slide 17 – Công bố kết quả: bài báo và báo cáo tổng hợp theo nhiều định dạng (5′)</w:t>
       </w:r>
     </w:p>
     <w:p>
@@ -10230,17 +10634,17 @@
         <w:t xml:space="preserve"> </w:t>
       </w:r>
       <w:r>
-        <w:t xml:space="preserve">-</w:t>
-      </w:r>
-      <w:r>
-        <w:t xml:space="preserve"> </w:t>
-      </w:r>
-      <w:r>
-        <w:rPr>
-          <w:bCs/>
-          <w:b/>
-        </w:rPr>
-        <w:t xml:space="preserve">Nguyên tắc: AI viết công cụ – AI không bao giờ thấy dữ liệu thật</w:t>
+        <w:t xml:space="preserve">- 🆕</w:t>
+      </w:r>
+      <w:r>
+        <w:t xml:space="preserve"> </w:t>
+      </w:r>
+      <w:r>
+        <w:rPr>
+          <w:bCs/>
+          <w:b/>
+        </w:rPr>
+        <w:t xml:space="preserve">Một kết quả – nhiều định dạng công bố:</w:t>
       </w:r>
     </w:p>
     <w:tbl>
@@ -10267,266 +10671,265 @@
               <w:jc w:val="left"/>
             </w:pPr>
             <w:r>
-              <w:t xml:space="preserve">Máy có Internet (dùng AI)</w:t>
-            </w:r>
-          </w:p>
-        </w:tc>
-        <w:tc>
-          <w:tcPr/>
-          <w:p>
-            <w:pPr>
-              <w:pStyle w:val="Compact"/>
-            </w:pPr>
-          </w:p>
-        </w:tc>
-        <w:tc>
-          <w:tcPr/>
-          <w:p>
-            <w:pPr>
-              <w:pStyle w:val="Compact"/>
-              <w:jc w:val="left"/>
-            </w:pPr>
-            <w:r>
-              <w:t xml:space="preserve">Máy không Internet (dữ liệu mật)</w:t>
-            </w:r>
-          </w:p>
-        </w:tc>
-      </w:tr>
-      <w:tr>
-        <w:tc>
-          <w:tcPr/>
-          <w:p>
-            <w:pPr>
-              <w:pStyle w:val="Compact"/>
-              <w:jc w:val="left"/>
-            </w:pPr>
-            <w:r>
-              <w:t xml:space="preserve">1. Chỉ mô tả</w:t>
-            </w:r>
-            <w:r>
-              <w:t xml:space="preserve"> </w:t>
-            </w:r>
+              <w:t xml:space="preserve">Đích công bố</w:t>
+            </w:r>
+          </w:p>
+        </w:tc>
+        <w:tc>
+          <w:tcPr/>
+          <w:p>
+            <w:pPr>
+              <w:pStyle w:val="Compact"/>
+              <w:jc w:val="left"/>
+            </w:pPr>
+            <w:r>
+              <w:t xml:space="preserve">Yêu cầu đặc thù AI cần làm theo</w:t>
+            </w:r>
+          </w:p>
+        </w:tc>
+        <w:tc>
+          <w:tcPr/>
+          <w:p>
+            <w:pPr>
+              <w:pStyle w:val="Compact"/>
+              <w:jc w:val="left"/>
+            </w:pPr>
+            <w:r>
+              <w:t xml:space="preserve">Ví dụ tạp chí (kiểm tra danh mục hiện hành)</w:t>
+            </w:r>
+          </w:p>
+        </w:tc>
+      </w:tr>
+      <w:tr>
+        <w:tc>
+          <w:tcPr/>
+          <w:p>
+            <w:pPr>
+              <w:pStyle w:val="Compact"/>
+              <w:jc w:val="left"/>
+            </w:pPr>
             <w:r>
               <w:rPr>
                 <w:bCs/>
                 <w:b/>
               </w:rPr>
-              <w:t xml:space="preserve">cấu trúc</w:t>
+              <w:t xml:space="preserve">Scopus / Web of Science</w:t>
+            </w:r>
+          </w:p>
+        </w:tc>
+        <w:tc>
+          <w:tcPr/>
+          <w:p>
+            <w:pPr>
+              <w:pStyle w:val="Compact"/>
+              <w:jc w:val="left"/>
+            </w:pPr>
+            <w:r>
+              <w:t xml:space="preserve">Theo</w:t>
             </w:r>
             <w:r>
               <w:t xml:space="preserve"> </w:t>
             </w:r>
             <w:r>
-              <w:t xml:space="preserve">dữ liệu (tên cột, đơn vị)</w:t>
-            </w:r>
-          </w:p>
-        </w:tc>
-        <w:tc>
-          <w:tcPr/>
-          <w:p>
-            <w:pPr>
-              <w:pStyle w:val="Compact"/>
-            </w:pPr>
-          </w:p>
-        </w:tc>
-        <w:tc>
-          <w:tcPr/>
-          <w:p>
-            <w:pPr>
-              <w:pStyle w:val="Compact"/>
-            </w:pPr>
-          </w:p>
-        </w:tc>
-      </w:tr>
-      <w:tr>
-        <w:tc>
-          <w:tcPr/>
-          <w:p>
-            <w:pPr>
-              <w:pStyle w:val="Compact"/>
-              <w:jc w:val="left"/>
-            </w:pPr>
-            <w:r>
-              <w:t xml:space="preserve">2. AI viết công cụ, sinh</w:t>
+              <w:t xml:space="preserve">“</w:t>
+            </w:r>
+            <w:r>
+              <w:t xml:space="preserve">Hướng dẫn tác giả</w:t>
+            </w:r>
+            <w:r>
+              <w:t xml:space="preserve">”</w:t>
             </w:r>
             <w:r>
               <w:t xml:space="preserve"> </w:t>
             </w:r>
+            <w:r>
+              <w:t xml:space="preserve">của từng tạp chí: cấu trúc IMRaD, tóm tắt có cấu trúc, highlights, khai báo dữ liệu, khai báo dùng AI, đóng góp tác giả</w:t>
+            </w:r>
+          </w:p>
+        </w:tc>
+        <w:tc>
+          <w:tcPr/>
+          <w:p>
+            <w:pPr>
+              <w:pStyle w:val="Compact"/>
+              <w:jc w:val="left"/>
+            </w:pPr>
+            <w:r>
+              <w:t xml:space="preserve">Corrosion Science; Materials and Corrosion; npj Materials Degradation; Protection of Metals and Physical Chemistry of Surfaces</w:t>
+            </w:r>
+          </w:p>
+        </w:tc>
+      </w:tr>
+      <w:tr>
+        <w:tc>
+          <w:tcPr/>
+          <w:p>
+            <w:pPr>
+              <w:pStyle w:val="Compact"/>
+              <w:jc w:val="left"/>
+            </w:pPr>
             <w:r>
               <w:rPr>
                 <w:bCs/>
                 <w:b/>
               </w:rPr>
-              <w:t xml:space="preserve">dữ liệu giả</w:t>
-            </w:r>
-            <w:r>
-              <w:t xml:space="preserve">, chạy thử</w:t>
-            </w:r>
-          </w:p>
-        </w:tc>
-        <w:tc>
-          <w:tcPr/>
-          <w:p>
-            <w:pPr>
-              <w:pStyle w:val="Compact"/>
-            </w:pPr>
-          </w:p>
-        </w:tc>
-        <w:tc>
-          <w:tcPr/>
-          <w:p>
-            <w:pPr>
-              <w:pStyle w:val="Compact"/>
-            </w:pPr>
-          </w:p>
-        </w:tc>
-      </w:tr>
-      <w:tr>
-        <w:tc>
-          <w:tcPr/>
-          <w:p>
-            <w:pPr>
-              <w:pStyle w:val="Compact"/>
-              <w:jc w:val="left"/>
-            </w:pPr>
-            <w:r>
-              <w:t xml:space="preserve">3. Nhà khoa học đọc mã;</w:t>
-            </w:r>
-            <w:r>
-              <w:t xml:space="preserve"> </w:t>
-            </w:r>
+              <w:t xml:space="preserve">Danh mục ВАК (Nga)</w:t>
+            </w:r>
+          </w:p>
+        </w:tc>
+        <w:tc>
+          <w:tcPr/>
+          <w:p>
+            <w:pPr>
+              <w:pStyle w:val="Compact"/>
+              <w:jc w:val="left"/>
+            </w:pPr>
+            <w:r>
+              <w:t xml:space="preserve">Mã УДК; tóm tắt và từ khóa tiếng Nga + tiếng Anh; tài liệu tham khảo theo ГОСТ Р 7.0.5-2008 (theo quy định từng tạp chí); danh mục chia nhóm К1–К3</w:t>
+            </w:r>
+          </w:p>
+        </w:tc>
+        <w:tc>
+          <w:tcPr/>
+          <w:p>
+            <w:pPr>
+              <w:pStyle w:val="Compact"/>
+              <w:jc w:val="left"/>
+            </w:pPr>
+            <w:r>
+              <w:t xml:space="preserve">Физикохимия поверхности и защита материалов; Коррозия: материалы, защита</w:t>
+            </w:r>
+          </w:p>
+        </w:tc>
+      </w:tr>
+      <w:tr>
+        <w:tc>
+          <w:tcPr/>
+          <w:p>
+            <w:pPr>
+              <w:pStyle w:val="Compact"/>
+              <w:jc w:val="left"/>
+            </w:pPr>
             <w:r>
               <w:rPr>
                 <w:bCs/>
                 <w:b/>
               </w:rPr>
-              <w:t xml:space="preserve">quét mã</w:t>
+              <w:t xml:space="preserve">Ei Compendex</w:t>
             </w:r>
             <w:r>
               <w:t xml:space="preserve"> </w:t>
             </w:r>
             <w:r>
-              <w:t xml:space="preserve">– không có kết nối mạng</w:t>
-            </w:r>
-          </w:p>
-        </w:tc>
-        <w:tc>
-          <w:tcPr/>
-          <w:p>
-            <w:pPr>
-              <w:pStyle w:val="Compact"/>
-            </w:pPr>
-          </w:p>
-        </w:tc>
-        <w:tc>
-          <w:tcPr/>
-          <w:p>
-            <w:pPr>
-              <w:pStyle w:val="Compact"/>
-            </w:pPr>
-          </w:p>
-        </w:tc>
-      </w:tr>
-      <w:tr>
-        <w:tc>
-          <w:tcPr/>
-          <w:p>
-            <w:pPr>
-              <w:pStyle w:val="Compact"/>
-              <w:jc w:val="left"/>
-            </w:pPr>
-            <w:r>
-              <w:t xml:space="preserve">4. Đóng gói +</w:t>
-            </w:r>
-            <w:r>
-              <w:t xml:space="preserve"> </w:t>
-            </w:r>
+              <w:t xml:space="preserve">(kỹ thuật)</w:t>
+            </w:r>
+          </w:p>
+        </w:tc>
+        <w:tc>
+          <w:tcPr/>
+          <w:p>
+            <w:pPr>
+              <w:pStyle w:val="Compact"/>
+              <w:jc w:val="left"/>
+            </w:pPr>
+            <w:r>
+              <w:t xml:space="preserve">Như Scopus; nhấn mạnh ứng dụng kỹ thuật</w:t>
+            </w:r>
+          </w:p>
+        </w:tc>
+        <w:tc>
+          <w:tcPr/>
+          <w:p>
+            <w:pPr>
+              <w:pStyle w:val="Compact"/>
+              <w:jc w:val="left"/>
+            </w:pPr>
+            <w:r>
+              <w:t xml:space="preserve">Kiểm tra tạp chí trong danh mục Ei</w:t>
+            </w:r>
+          </w:p>
+        </w:tc>
+      </w:tr>
+      <w:tr>
+        <w:tc>
+          <w:tcPr/>
+          <w:p>
+            <w:pPr>
+              <w:pStyle w:val="Compact"/>
+              <w:jc w:val="left"/>
+            </w:pPr>
             <w:r>
               <w:rPr>
                 <w:bCs/>
                 <w:b/>
               </w:rPr>
-              <w:t xml:space="preserve">mã băm SHA-256</w:t>
-            </w:r>
-          </w:p>
-        </w:tc>
-        <w:tc>
-          <w:tcPr/>
-          <w:p>
-            <w:pPr>
-              <w:pStyle w:val="Compact"/>
-              <w:jc w:val="left"/>
-            </w:pPr>
-            <w:r>
-              <w:t xml:space="preserve">➜ chuyển theo quy định ➜</w:t>
-            </w:r>
-          </w:p>
-        </w:tc>
-        <w:tc>
-          <w:tcPr/>
-          <w:p>
-            <w:pPr>
-              <w:pStyle w:val="Compact"/>
-              <w:jc w:val="left"/>
-            </w:pPr>
-            <w:r>
-              <w:t xml:space="preserve">5. Đối chiếu mã băm → chạy với</w:t>
-            </w:r>
-            <w:r>
-              <w:t xml:space="preserve"> </w:t>
-            </w:r>
+              <w:t xml:space="preserve">Tạp chí trong nước</w:t>
+            </w:r>
+          </w:p>
+        </w:tc>
+        <w:tc>
+          <w:tcPr/>
+          <w:p>
+            <w:pPr>
+              <w:pStyle w:val="Compact"/>
+              <w:jc w:val="left"/>
+            </w:pPr>
+            <w:r>
+              <w:t xml:space="preserve">Theo thể lệ tạp chí; danh mục Hội đồng Giáo sư Nhà nước</w:t>
+            </w:r>
+          </w:p>
+        </w:tc>
+        <w:tc>
+          <w:tcPr/>
+          <w:p>
+            <w:pPr>
+              <w:pStyle w:val="Compact"/>
+              <w:jc w:val="left"/>
+            </w:pPr>
+            <w:r>
+              <w:t xml:space="preserve">Tạp chí Khoa học và Công nghệ nhiệt đới (ISSN 0866-7535)</w:t>
+            </w:r>
+          </w:p>
+        </w:tc>
+      </w:tr>
+      <w:tr>
+        <w:tc>
+          <w:tcPr/>
+          <w:p>
+            <w:pPr>
+              <w:pStyle w:val="Compact"/>
+              <w:jc w:val="left"/>
+            </w:pPr>
             <w:r>
               <w:rPr>
                 <w:bCs/>
                 <w:b/>
               </w:rPr>
-              <w:t xml:space="preserve">dữ liệu thật</w:t>
-            </w:r>
-          </w:p>
-        </w:tc>
-      </w:tr>
-      <w:tr>
-        <w:tc>
-          <w:tcPr/>
-          <w:p>
-            <w:pPr>
-              <w:pStyle w:val="Compact"/>
-            </w:pPr>
-          </w:p>
-        </w:tc>
-        <w:tc>
-          <w:tcPr/>
-          <w:p>
-            <w:pPr>
-              <w:pStyle w:val="Compact"/>
-            </w:pPr>
-          </w:p>
-        </w:tc>
-        <w:tc>
-          <w:tcPr/>
-          <w:p>
-            <w:pPr>
-              <w:pStyle w:val="Compact"/>
-              <w:jc w:val="left"/>
-            </w:pPr>
-            <w:r>
-              <w:t xml:space="preserve">6. Kết quả</w:t>
-            </w:r>
-            <w:r>
-              <w:t xml:space="preserve"> </w:t>
-            </w:r>
-            <w:r>
-              <w:rPr>
-                <w:bCs/>
-                <w:b/>
-              </w:rPr>
-              <w:t xml:space="preserve">ở lại</w:t>
-            </w:r>
-            <w:r>
-              <w:t xml:space="preserve"> </w:t>
-            </w:r>
-            <w:r>
-              <w:t xml:space="preserve">máy này</w:t>
+              <w:t xml:space="preserve">Báo cáo của Trung tâm</w:t>
+            </w:r>
+          </w:p>
+        </w:tc>
+        <w:tc>
+          <w:tcPr/>
+          <w:p>
+            <w:pPr>
+              <w:pStyle w:val="Compact"/>
+              <w:jc w:val="left"/>
+            </w:pPr>
+            <w:r>
+              <w:t xml:space="preserve">Biểu mẫu báo cáo tổng hợp kết quả, Mẫu 21, 22</w:t>
+            </w:r>
+          </w:p>
+        </w:tc>
+        <w:tc>
+          <w:tcPr/>
+          <w:p>
+            <w:pPr>
+              <w:pStyle w:val="Compact"/>
+              <w:jc w:val="left"/>
+            </w:pPr>
+            <w:r>
+              <w:t xml:space="preserve">Biểu mẫu Trung tâm</w:t>
             </w:r>
           </w:p>
         </w:tc>
@@ -10538,151 +10941,61 @@
           <w:ilvl w:val="0"/>
           <w:numId w:val="1005"/>
         </w:numPr>
-        <w:pStyle w:val="Compact"/>
-      </w:pPr>
-      <w:r>
-        <w:t xml:space="preserve">🧪</w:t>
-      </w:r>
-      <w:r>
-        <w:t xml:space="preserve"> </w:t>
-      </w:r>
-      <w:r>
-        <w:rPr>
-          <w:bCs/>
-          <w:b/>
-        </w:rPr>
-        <w:t xml:space="preserve">Ví dụ:</w:t>
-      </w:r>
-      <w:r>
-        <w:t xml:space="preserve"> </w:t>
-      </w:r>
-      <w:r>
-        <w:rPr>
-          <w:iCs/>
-          <w:i/>
-        </w:rPr>
-        <w:t xml:space="preserve">Ảnh hưởng của địa hình và khí hậu nhiệt đới đến lộ trình của thiết bị bay không người lái</w:t>
-      </w:r>
-      <w:r>
-        <w:t xml:space="preserve"> </w:t>
-      </w:r>
-      <w:r>
-        <w:t xml:space="preserve">– công cụ tìm lộ trình tốn ít năng lượng nhất, tránh núi cao, ổ mưa dông, gió mạnh; tính ảnh hưởng của gió, mưa, nhiệt độ – độ ẩm, leo cao</w:t>
+      </w:pPr>
+      <w:r>
+        <w:t xml:space="preserve">⌨</w:t>
+      </w:r>
+      <w:r>
+        <w:t xml:space="preserve"> </w:t>
+      </w:r>
+      <w:r>
+        <w:rPr>
+          <w:bCs/>
+          <w:b/>
+        </w:rPr>
+        <w:t xml:space="preserve">Câu lệnh:</w:t>
       </w:r>
     </w:p>
     <w:p>
       <w:pPr>
         <w:numPr>
           <w:ilvl w:val="0"/>
-          <w:numId w:val="1005"/>
+          <w:numId w:val="1000"/>
         </w:numPr>
-        <w:pStyle w:val="Compact"/>
-      </w:pPr>
-      <w:r>
-        <w:t xml:space="preserve">📊</w:t>
-      </w:r>
-      <w:r>
-        <w:t xml:space="preserve"> </w:t>
-      </w:r>
-      <w:r>
-        <w:rPr>
-          <w:bCs/>
-          <w:b/>
-        </w:rPr>
-        <w:t xml:space="preserve">Kết quả với dữ liệu giả lập:</w:t>
-      </w:r>
-    </w:p>
-    <w:p>
-      <w:pPr>
-        <w:numPr>
-          <w:ilvl w:val="1"/>
-          <w:numId w:val="1006"/>
-        </w:numPr>
-        <w:pStyle w:val="Compact"/>
-      </w:pPr>
-      <w:r>
-        <w:t xml:space="preserve">Đường thẳng cắt qua</w:t>
-      </w:r>
-      <w:r>
-        <w:t xml:space="preserve"> </w:t>
-      </w:r>
-      <w:r>
-        <w:rPr>
-          <w:bCs/>
-          <w:b/>
-        </w:rPr>
-        <w:t xml:space="preserve">8 ô cấm bay</w:t>
-      </w:r>
-      <w:r>
-        <w:t xml:space="preserve"> </w:t>
-      </w:r>
-      <w:r>
-        <w:t xml:space="preserve">→ lộ trình vòng qua đèo: 14,5 km, 240 Wh</w:t>
-      </w:r>
-    </w:p>
-    <w:p>
-      <w:pPr>
-        <w:numPr>
-          <w:ilvl w:val="1"/>
-          <w:numId w:val="1006"/>
-        </w:numPr>
-        <w:pStyle w:val="Compact"/>
-      </w:pPr>
-      <w:r>
-        <w:t xml:space="preserve">Chiều về ngược gió mùa:</w:t>
-      </w:r>
-      <w:r>
-        <w:t xml:space="preserve"> </w:t>
-      </w:r>
-      <w:r>
-        <w:rPr>
-          <w:bCs/>
-          <w:b/>
-        </w:rPr>
-        <w:t xml:space="preserve">422 Wh – gấp 1,8 lần chiều đi</w:t>
-      </w:r>
-      <w:r>
-        <w:t xml:space="preserve"> </w:t>
-      </w:r>
-      <w:r>
-        <w:t xml:space="preserve">→ không đủ pin, phải đổi phương án</w:t>
-      </w:r>
-    </w:p>
-    <w:p>
-      <w:pPr>
-        <w:numPr>
-          <w:ilvl w:val="1"/>
-          <w:numId w:val="1006"/>
-        </w:numPr>
-        <w:pStyle w:val="Compact"/>
-      </w:pPr>
-      <w:r>
-        <w:t xml:space="preserve">Công cụ chạy trong ~3 giây trên máy tính thường, không cần mạng</w:t>
-      </w:r>
-    </w:p>
-    <w:p>
-      <w:pPr>
-        <w:numPr>
-          <w:ilvl w:val="0"/>
-          <w:numId w:val="1005"/>
-        </w:numPr>
-        <w:pStyle w:val="Compact"/>
-      </w:pPr>
-      <w:r>
-        <w:t xml:space="preserve">⚠ Chuyển tệp giữa hai máy theo</w:t>
-      </w:r>
-      <w:r>
-        <w:t xml:space="preserve"> </w:t>
-      </w:r>
-      <w:r>
-        <w:rPr>
-          <w:bCs/>
-          <w:b/>
-        </w:rPr>
-        <w:t xml:space="preserve">quy định bảo vệ bí mật nhà nước và quy chế của đơn vị</w:t>
-      </w:r>
-      <w:r>
-        <w:t xml:space="preserve">. Khi công cụ lỗi: tái tạo lỗi bằng dữ liệu giả để hỏi AI – không mang dữ liệu thật ra ngoài.</w:t>
+        <w:pStyle w:val="SourceCode"/>
+      </w:pPr>
+      <w:r>
+        <w:rPr>
+          <w:rStyle w:val="VerbatimChar"/>
+        </w:rPr>
+        <w:t xml:space="preserve">Từ kết quả trong dự án, soạn bản thảo cho tạp chí [tên]. Đọc "Hướng dẫn tác giả" tôi tải</w:t>
+      </w:r>
+      <w:r>
+        <w:br/>
+      </w:r>
+      <w:r>
+        <w:rPr>
+          <w:rStyle w:val="VerbatimChar"/>
+        </w:rPr>
+        <w:t xml:space="preserve">lên; lập bảng kiểm tra từng yêu cầu (đạt / chưa đạt). Với tạp chí ВАК: thêm УДК, tóm tắt</w:t>
+      </w:r>
+      <w:r>
+        <w:br/>
+      </w:r>
+      <w:r>
+        <w:rPr>
+          <w:rStyle w:val="VerbatimChar"/>
+        </w:rPr>
+        <w:t xml:space="preserve">và từ khóa tiếng Nga – Anh, tài liệu tham khảo theo ГОСТ Р 7.0.5-2008.</w:t>
+      </w:r>
+      <w:r>
+        <w:br/>
+      </w:r>
+      <w:r>
+        <w:rPr>
+          <w:rStyle w:val="VerbatimChar"/>
+        </w:rPr>
+        <w:t xml:space="preserve">Sau đó đóng vai phản biện khó tính: 5 nhược điểm lớn nhất và cách trả lời.</w:t>
       </w:r>
     </w:p>
     <w:p>
@@ -10694,70 +11007,31 @@
           <w:bCs/>
           <w:b/>
         </w:rPr>
-        <w:t xml:space="preserve">Hình ảnh:</w:t>
-      </w:r>
-      <w:r>
-        <w:t xml:space="preserve"> </w:t>
-      </w:r>
-      <w:r>
-        <w:t xml:space="preserve">sơ đồ hai máy;</w:t>
-      </w:r>
-      <w:r>
-        <w:t xml:space="preserve"> </w:t>
-      </w:r>
-      <w:r>
-        <w:rPr>
-          <w:rStyle w:val="VerbatimChar"/>
-        </w:rPr>
-        <w:t xml:space="preserve">thuyet-trinh/ket-qua-demo/may-cach-ly/ban_do_lo_trinh.png</w:t>
-      </w:r>
-      <w:r>
-        <w:t xml:space="preserve">.</w:t>
-      </w:r>
-    </w:p>
-    <w:p>
-      <w:pPr>
-        <w:pStyle w:val="BodyText"/>
-      </w:pPr>
-      <w:r>
-        <w:rPr>
-          <w:bCs/>
-          <w:b/>
-        </w:rPr>
-        <w:t xml:space="preserve">Demo:</w:t>
-      </w:r>
-      <w:r>
-        <w:t xml:space="preserve"> </w:t>
-      </w:r>
-      <w:r>
-        <w:t xml:space="preserve">~2 phút – chạy công cụ trên dữ liệu giả, mở báo cáo (câu lệnh:</w:t>
-      </w:r>
-      <w:r>
-        <w:t xml:space="preserve"> </w:t>
-      </w:r>
-      <w:r>
-        <w:rPr>
-          <w:rStyle w:val="VerbatimChar"/>
-        </w:rPr>
-        <w:t xml:space="preserve">cau-lenh-demo.md</w:t>
-      </w:r>
-      <w:r>
-        <w:t xml:space="preserve"> </w:t>
-      </w:r>
-      <w:r>
-        <w:t xml:space="preserve">mục 13; mã:</w:t>
-      </w:r>
-      <w:r>
-        <w:t xml:space="preserve"> </w:t>
-      </w:r>
-      <w:r>
-        <w:rPr>
-          <w:rStyle w:val="VerbatimChar"/>
-        </w:rPr>
-        <w:t xml:space="preserve">thuyet-trinh/ma-nguon-demo/may-cach-ly/</w:t>
-      </w:r>
-      <w:r>
-        <w:t xml:space="preserve">).</w:t>
+        <w:t xml:space="preserve">Việc phải làm:</w:t>
+      </w:r>
+      <w:r>
+        <w:t xml:space="preserve"> </w:t>
+      </w:r>
+      <w:r>
+        <w:t xml:space="preserve">kiểm tra danh mục ВАК hiện hành và nhóm К1–К3 của từng tạp chí; xác nhận</w:t>
+      </w:r>
+      <w:r>
+        <w:t xml:space="preserve"> </w:t>
+      </w:r>
+      <w:r>
+        <w:t xml:space="preserve">“</w:t>
+      </w:r>
+      <w:r>
+        <w:t xml:space="preserve">EeiE</w:t>
+      </w:r>
+      <w:r>
+        <w:t xml:space="preserve">”</w:t>
+      </w:r>
+      <w:r>
+        <w:t xml:space="preserve"> </w:t>
+      </w:r>
+      <w:r>
+        <w:t xml:space="preserve">trong bản góp ý là Ei Compendex hay danh mục khác.</w:t>
       </w:r>
     </w:p>
     <w:p>
@@ -10796,13 +11070,23 @@
       </w:r>
     </w:p>
     <w:bookmarkEnd w:id="42"/>
-    <w:bookmarkStart w:id="43" w:name="X2cd43d54e17a105f7cd682c764868fcbb685c71"/>
+    <w:bookmarkStart w:id="43" w:name="Xec5161d74064f414ef1ad004e0a8ce2cd9a98c3"/>
     <w:p>
       <w:pPr>
         <w:pStyle w:val="Heading2"/>
       </w:pPr>
       <w:r>
-        <w:t xml:space="preserve">Slide 18 – Công bố kết quả nghiên cứu và lập báo cáo tổng hợp (5′)</w:t>
+        <w:t xml:space="preserve">Slide 18 – Toàn cảnh: một nhiệm vụ khoa học đi qua AI Agent (2′) –</w:t>
+      </w:r>
+      <w:r>
+        <w:t xml:space="preserve"> </w:t>
+      </w:r>
+      <w:r>
+        <w:rPr>
+          <w:iCs/>
+          <w:i/>
+        </w:rPr>
+        <w:t xml:space="preserve">tổng kết Phần III</w:t>
       </w:r>
     </w:p>
     <w:p>
@@ -10816,21 +11100,154 @@
         </w:rPr>
         <w:t xml:space="preserve">Chữ trên slide:</w:t>
       </w:r>
-      <w:r>
-        <w:t xml:space="preserve"> </w:t>
-      </w:r>
-      <w:r>
-        <w:t xml:space="preserve">- 🆕</w:t>
-      </w:r>
-      <w:r>
-        <w:t xml:space="preserve"> </w:t>
-      </w:r>
-      <w:r>
-        <w:rPr>
-          <w:bCs/>
-          <w:b/>
-        </w:rPr>
-        <w:t xml:space="preserve">Một kết quả – nhiều định dạng công bố:</w:t>
+    </w:p>
+    <w:p>
+      <w:pPr>
+        <w:pStyle w:val="BodyText"/>
+      </w:pPr>
+      <w:r>
+        <w:rPr>
+          <w:bCs/>
+          <w:b/>
+        </w:rPr>
+        <w:t xml:space="preserve">Hình ảnh (chính):</w:t>
+      </w:r>
+      <w:r>
+        <w:t xml:space="preserve"> </w:t>
+      </w:r>
+      <w:r>
+        <w:t xml:space="preserve">sơ đồ vòng đời: Tài liệu → Khoảng trống (S12) → Phiếu đề xuất, thuyết minh (S13) → Tiến độ – kinh phí (S14) → Dữ liệu – kết quả, mô hình 3D (S15–S16) → Bài báo – báo cáo (S17); mỗi bước có dấu ✅</w:t>
+      </w:r>
+      <w:r>
+        <w:t xml:space="preserve"> </w:t>
+      </w:r>
+      <w:r>
+        <w:t xml:space="preserve">“</w:t>
+      </w:r>
+      <w:r>
+        <w:t xml:space="preserve">nhà khoa học xác nhận</w:t>
+      </w:r>
+      <w:r>
+        <w:t xml:space="preserve">”</w:t>
+      </w:r>
+      <w:r>
+        <w:t xml:space="preserve">.</w:t>
+      </w:r>
+    </w:p>
+    <w:p>
+      <w:pPr>
+        <w:pStyle w:val="BlockText"/>
+      </w:pPr>
+      <w:r>
+        <w:t xml:space="preserve">Cùng một dự án, cùng một bộ tài liệu – AI nối các công đoạn; nhà khoa học duyệt ở mỗi bước.</w:t>
+      </w:r>
+    </w:p>
+    <w:p>
+      <w:pPr>
+        <w:pStyle w:val="FirstParagraph"/>
+      </w:pPr>
+      <w:r>
+        <w:rPr>
+          <w:bCs/>
+          <w:b/>
+        </w:rPr>
+        <w:t xml:space="preserve">Duyệt:</w:t>
+      </w:r>
+      <w:r>
+        <w:t xml:space="preserve"> </w:t>
+      </w:r>
+      <w:r>
+        <w:t xml:space="preserve">[ ] Duyệt · [ ] Sửa · [ ] Bỏ</w:t>
+      </w:r>
+      <w:r>
+        <w:t xml:space="preserve"> </w:t>
+      </w:r>
+      <w:r>
+        <w:rPr>
+          <w:bCs/>
+          <w:b/>
+        </w:rPr>
+        <w:t xml:space="preserve">Ghi chú:</w:t>
+      </w:r>
+    </w:p>
+    <w:p>
+      <w:r>
+        <w:pict>
+          <v:rect style="width:0;height:1.5pt" o:hralign="center" o:hrstd="t" o:hr="t"/>
+        </w:pict>
+      </w:r>
+    </w:p>
+    <w:bookmarkEnd w:id="43"/>
+    <w:bookmarkEnd w:id="44"/>
+    <w:bookmarkStart w:id="46" w:name="X71301bc43ae8a2583ec30af40a0adfa491f7f5a"/>
+    <w:p>
+      <w:pPr>
+        <w:pStyle w:val="Heading1"/>
+      </w:pPr>
+      <w:r>
+        <w:t xml:space="preserve">PHẦN IV. ĐỀ TÀI MẬT: ỨNG DỤNG AI KHI DỮ LIỆU KHÔNG ĐƯỢC ĐƯA LÊN INTERNET (5 phút)</w:t>
+      </w:r>
+    </w:p>
+    <w:p>
+      <w:pPr>
+        <w:pStyle w:val="FirstParagraph"/>
+      </w:pPr>
+      <w:r>
+        <w:rPr>
+          <w:bCs/>
+          <w:b/>
+        </w:rPr>
+        <w:t xml:space="preserve">Trang chuyển phần:</w:t>
+      </w:r>
+      <w:r>
+        <w:t xml:space="preserve"> </w:t>
+      </w:r>
+      <w:r>
+        <w:t xml:space="preserve">tên Phần IV · Slide 19</w:t>
+      </w:r>
+    </w:p>
+    <w:p>
+      <w:r>
+        <w:pict>
+          <v:rect style="width:0;height:1.5pt" o:hralign="center" o:hrstd="t" o:hr="t"/>
+        </w:pict>
+      </w:r>
+    </w:p>
+    <w:bookmarkStart w:id="45" w:name="X16b01e03006115780af7081c342f2c01c0e39ae"/>
+    <w:p>
+      <w:pPr>
+        <w:pStyle w:val="Heading2"/>
+      </w:pPr>
+      <w:r>
+        <w:t xml:space="preserve">Slide 19 – Đề tài mật: xây dựng công cụ và xử lý ngay trên máy không kết nối Internet – DEMO 3 (5′)</w:t>
+      </w:r>
+    </w:p>
+    <w:p>
+      <w:pPr>
+        <w:pStyle w:val="FirstParagraph"/>
+      </w:pPr>
+      <w:r>
+        <w:rPr>
+          <w:bCs/>
+          <w:b/>
+        </w:rPr>
+        <w:t xml:space="preserve">Chữ trên slide:</w:t>
+      </w:r>
+      <w:r>
+        <w:t xml:space="preserve"> </w:t>
+      </w:r>
+      <w:r>
+        <w:t xml:space="preserve">-</w:t>
+      </w:r>
+      <w:r>
+        <w:t xml:space="preserve"> </w:t>
+      </w:r>
+      <w:r>
+        <w:rPr>
+          <w:bCs/>
+          <w:b/>
+        </w:rPr>
+        <w:t xml:space="preserve">Nguyên tắc: AI viết công cụ – AI không bao giờ thấy dữ liệu thật</w:t>
       </w:r>
     </w:p>
     <w:tbl>
@@ -10857,265 +11274,266 @@
               <w:jc w:val="left"/>
             </w:pPr>
             <w:r>
-              <w:t xml:space="preserve">Đích công bố</w:t>
-            </w:r>
-          </w:p>
-        </w:tc>
-        <w:tc>
-          <w:tcPr/>
-          <w:p>
-            <w:pPr>
-              <w:pStyle w:val="Compact"/>
-              <w:jc w:val="left"/>
-            </w:pPr>
-            <w:r>
-              <w:t xml:space="preserve">Yêu cầu đặc thù AI cần làm theo</w:t>
-            </w:r>
-          </w:p>
-        </w:tc>
-        <w:tc>
-          <w:tcPr/>
-          <w:p>
-            <w:pPr>
-              <w:pStyle w:val="Compact"/>
-              <w:jc w:val="left"/>
-            </w:pPr>
-            <w:r>
-              <w:t xml:space="preserve">Ví dụ tạp chí (kiểm tra danh mục hiện hành)</w:t>
-            </w:r>
-          </w:p>
-        </w:tc>
-      </w:tr>
-      <w:tr>
-        <w:tc>
-          <w:tcPr/>
-          <w:p>
-            <w:pPr>
-              <w:pStyle w:val="Compact"/>
-              <w:jc w:val="left"/>
-            </w:pPr>
+              <w:t xml:space="preserve">Máy có Internet (dùng AI)</w:t>
+            </w:r>
+          </w:p>
+        </w:tc>
+        <w:tc>
+          <w:tcPr/>
+          <w:p>
+            <w:pPr>
+              <w:pStyle w:val="Compact"/>
+            </w:pPr>
+          </w:p>
+        </w:tc>
+        <w:tc>
+          <w:tcPr/>
+          <w:p>
+            <w:pPr>
+              <w:pStyle w:val="Compact"/>
+              <w:jc w:val="left"/>
+            </w:pPr>
+            <w:r>
+              <w:t xml:space="preserve">Máy không Internet (dữ liệu mật)</w:t>
+            </w:r>
+          </w:p>
+        </w:tc>
+      </w:tr>
+      <w:tr>
+        <w:tc>
+          <w:tcPr/>
+          <w:p>
+            <w:pPr>
+              <w:pStyle w:val="Compact"/>
+              <w:jc w:val="left"/>
+            </w:pPr>
+            <w:r>
+              <w:t xml:space="preserve">1. Chỉ mô tả</w:t>
+            </w:r>
+            <w:r>
+              <w:t xml:space="preserve"> </w:t>
+            </w:r>
             <w:r>
               <w:rPr>
                 <w:bCs/>
                 <w:b/>
               </w:rPr>
-              <w:t xml:space="preserve">Scopus / Web of Science</w:t>
-            </w:r>
-          </w:p>
-        </w:tc>
-        <w:tc>
-          <w:tcPr/>
-          <w:p>
-            <w:pPr>
-              <w:pStyle w:val="Compact"/>
-              <w:jc w:val="left"/>
-            </w:pPr>
-            <w:r>
-              <w:t xml:space="preserve">Theo</w:t>
+              <w:t xml:space="preserve">cấu trúc</w:t>
             </w:r>
             <w:r>
               <w:t xml:space="preserve"> </w:t>
             </w:r>
             <w:r>
-              <w:t xml:space="preserve">“</w:t>
-            </w:r>
-            <w:r>
-              <w:t xml:space="preserve">Hướng dẫn tác giả</w:t>
-            </w:r>
-            <w:r>
-              <w:t xml:space="preserve">”</w:t>
+              <w:t xml:space="preserve">dữ liệu (tên cột, đơn vị)</w:t>
+            </w:r>
+          </w:p>
+        </w:tc>
+        <w:tc>
+          <w:tcPr/>
+          <w:p>
+            <w:pPr>
+              <w:pStyle w:val="Compact"/>
+            </w:pPr>
+          </w:p>
+        </w:tc>
+        <w:tc>
+          <w:tcPr/>
+          <w:p>
+            <w:pPr>
+              <w:pStyle w:val="Compact"/>
+            </w:pPr>
+          </w:p>
+        </w:tc>
+      </w:tr>
+      <w:tr>
+        <w:tc>
+          <w:tcPr/>
+          <w:p>
+            <w:pPr>
+              <w:pStyle w:val="Compact"/>
+              <w:jc w:val="left"/>
+            </w:pPr>
+            <w:r>
+              <w:t xml:space="preserve">2. AI viết công cụ, sinh</w:t>
             </w:r>
             <w:r>
               <w:t xml:space="preserve"> </w:t>
             </w:r>
-            <w:r>
-              <w:t xml:space="preserve">của từng tạp chí: cấu trúc IMRaD, tóm tắt có cấu trúc, highlights, khai báo dữ liệu, khai báo dùng AI, đóng góp tác giả</w:t>
-            </w:r>
-          </w:p>
-        </w:tc>
-        <w:tc>
-          <w:tcPr/>
-          <w:p>
-            <w:pPr>
-              <w:pStyle w:val="Compact"/>
-              <w:jc w:val="left"/>
-            </w:pPr>
-            <w:r>
-              <w:t xml:space="preserve">Corrosion Science; Materials and Corrosion; npj Materials Degradation; Protection of Metals and Physical Chemistry of Surfaces</w:t>
-            </w:r>
-          </w:p>
-        </w:tc>
-      </w:tr>
-      <w:tr>
-        <w:tc>
-          <w:tcPr/>
-          <w:p>
-            <w:pPr>
-              <w:pStyle w:val="Compact"/>
-              <w:jc w:val="left"/>
-            </w:pPr>
             <w:r>
               <w:rPr>
                 <w:bCs/>
                 <w:b/>
               </w:rPr>
-              <w:t xml:space="preserve">Danh mục ВАК (Nga)</w:t>
-            </w:r>
-          </w:p>
-        </w:tc>
-        <w:tc>
-          <w:tcPr/>
-          <w:p>
-            <w:pPr>
-              <w:pStyle w:val="Compact"/>
-              <w:jc w:val="left"/>
-            </w:pPr>
-            <w:r>
-              <w:t xml:space="preserve">Mã УДК; tóm tắt và từ khóa tiếng Nga + tiếng Anh; tài liệu tham khảo theo ГОСТ Р 7.0.5-2008 (theo quy định từng tạp chí); danh mục chia nhóm К1–К3</w:t>
-            </w:r>
-          </w:p>
-        </w:tc>
-        <w:tc>
-          <w:tcPr/>
-          <w:p>
-            <w:pPr>
-              <w:pStyle w:val="Compact"/>
-              <w:jc w:val="left"/>
-            </w:pPr>
-            <w:r>
-              <w:t xml:space="preserve">Физикохимия поверхности и защита материалов; Коррозия: материалы, защита</w:t>
-            </w:r>
-          </w:p>
-        </w:tc>
-      </w:tr>
-      <w:tr>
-        <w:tc>
-          <w:tcPr/>
-          <w:p>
-            <w:pPr>
-              <w:pStyle w:val="Compact"/>
-              <w:jc w:val="left"/>
-            </w:pPr>
+              <w:t xml:space="preserve">dữ liệu giả</w:t>
+            </w:r>
+            <w:r>
+              <w:t xml:space="preserve">, chạy thử</w:t>
+            </w:r>
+          </w:p>
+        </w:tc>
+        <w:tc>
+          <w:tcPr/>
+          <w:p>
+            <w:pPr>
+              <w:pStyle w:val="Compact"/>
+            </w:pPr>
+          </w:p>
+        </w:tc>
+        <w:tc>
+          <w:tcPr/>
+          <w:p>
+            <w:pPr>
+              <w:pStyle w:val="Compact"/>
+            </w:pPr>
+          </w:p>
+        </w:tc>
+      </w:tr>
+      <w:tr>
+        <w:tc>
+          <w:tcPr/>
+          <w:p>
+            <w:pPr>
+              <w:pStyle w:val="Compact"/>
+              <w:jc w:val="left"/>
+            </w:pPr>
+            <w:r>
+              <w:t xml:space="preserve">3. Nhà khoa học đọc mã;</w:t>
+            </w:r>
+            <w:r>
+              <w:t xml:space="preserve"> </w:t>
+            </w:r>
             <w:r>
               <w:rPr>
                 <w:bCs/>
                 <w:b/>
               </w:rPr>
-              <w:t xml:space="preserve">Ei Compendex</w:t>
+              <w:t xml:space="preserve">quét mã</w:t>
             </w:r>
             <w:r>
               <w:t xml:space="preserve"> </w:t>
             </w:r>
             <w:r>
-              <w:t xml:space="preserve">(kỹ thuật)</w:t>
-            </w:r>
-          </w:p>
-        </w:tc>
-        <w:tc>
-          <w:tcPr/>
-          <w:p>
-            <w:pPr>
-              <w:pStyle w:val="Compact"/>
-              <w:jc w:val="left"/>
-            </w:pPr>
-            <w:r>
-              <w:t xml:space="preserve">Như Scopus; nhấn mạnh ứng dụng kỹ thuật</w:t>
-            </w:r>
-          </w:p>
-        </w:tc>
-        <w:tc>
-          <w:tcPr/>
-          <w:p>
-            <w:pPr>
-              <w:pStyle w:val="Compact"/>
-              <w:jc w:val="left"/>
-            </w:pPr>
-            <w:r>
-              <w:t xml:space="preserve">Kiểm tra tạp chí trong danh mục Ei</w:t>
-            </w:r>
-          </w:p>
-        </w:tc>
-      </w:tr>
-      <w:tr>
-        <w:tc>
-          <w:tcPr/>
-          <w:p>
-            <w:pPr>
-              <w:pStyle w:val="Compact"/>
-              <w:jc w:val="left"/>
-            </w:pPr>
+              <w:t xml:space="preserve">– không có kết nối mạng</w:t>
+            </w:r>
+          </w:p>
+        </w:tc>
+        <w:tc>
+          <w:tcPr/>
+          <w:p>
+            <w:pPr>
+              <w:pStyle w:val="Compact"/>
+            </w:pPr>
+          </w:p>
+        </w:tc>
+        <w:tc>
+          <w:tcPr/>
+          <w:p>
+            <w:pPr>
+              <w:pStyle w:val="Compact"/>
+            </w:pPr>
+          </w:p>
+        </w:tc>
+      </w:tr>
+      <w:tr>
+        <w:tc>
+          <w:tcPr/>
+          <w:p>
+            <w:pPr>
+              <w:pStyle w:val="Compact"/>
+              <w:jc w:val="left"/>
+            </w:pPr>
+            <w:r>
+              <w:t xml:space="preserve">4. Đóng gói +</w:t>
+            </w:r>
+            <w:r>
+              <w:t xml:space="preserve"> </w:t>
+            </w:r>
             <w:r>
               <w:rPr>
                 <w:bCs/>
                 <w:b/>
               </w:rPr>
-              <w:t xml:space="preserve">Tạp chí trong nước</w:t>
-            </w:r>
-          </w:p>
-        </w:tc>
-        <w:tc>
-          <w:tcPr/>
-          <w:p>
-            <w:pPr>
-              <w:pStyle w:val="Compact"/>
-              <w:jc w:val="left"/>
-            </w:pPr>
-            <w:r>
-              <w:t xml:space="preserve">Theo thể lệ tạp chí; danh mục Hội đồng Giáo sư Nhà nước</w:t>
-            </w:r>
-          </w:p>
-        </w:tc>
-        <w:tc>
-          <w:tcPr/>
-          <w:p>
-            <w:pPr>
-              <w:pStyle w:val="Compact"/>
-              <w:jc w:val="left"/>
-            </w:pPr>
-            <w:r>
-              <w:t xml:space="preserve">Tạp chí Khoa học và Công nghệ nhiệt đới (ISSN 0866-7535)</w:t>
-            </w:r>
-          </w:p>
-        </w:tc>
-      </w:tr>
-      <w:tr>
-        <w:tc>
-          <w:tcPr/>
-          <w:p>
-            <w:pPr>
-              <w:pStyle w:val="Compact"/>
-              <w:jc w:val="left"/>
-            </w:pPr>
+              <w:t xml:space="preserve">mã băm SHA-256</w:t>
+            </w:r>
+          </w:p>
+        </w:tc>
+        <w:tc>
+          <w:tcPr/>
+          <w:p>
+            <w:pPr>
+              <w:pStyle w:val="Compact"/>
+              <w:jc w:val="left"/>
+            </w:pPr>
+            <w:r>
+              <w:t xml:space="preserve">➜ chuyển theo quy định ➜</w:t>
+            </w:r>
+          </w:p>
+        </w:tc>
+        <w:tc>
+          <w:tcPr/>
+          <w:p>
+            <w:pPr>
+              <w:pStyle w:val="Compact"/>
+              <w:jc w:val="left"/>
+            </w:pPr>
+            <w:r>
+              <w:t xml:space="preserve">5. Đối chiếu mã băm → chạy với</w:t>
+            </w:r>
+            <w:r>
+              <w:t xml:space="preserve"> </w:t>
+            </w:r>
             <w:r>
               <w:rPr>
                 <w:bCs/>
                 <w:b/>
               </w:rPr>
-              <w:t xml:space="preserve">Báo cáo của Trung tâm</w:t>
-            </w:r>
-          </w:p>
-        </w:tc>
-        <w:tc>
-          <w:tcPr/>
-          <w:p>
-            <w:pPr>
-              <w:pStyle w:val="Compact"/>
-              <w:jc w:val="left"/>
-            </w:pPr>
-            <w:r>
-              <w:t xml:space="preserve">Biểu mẫu báo cáo tổng hợp kết quả, Mẫu 21, 22</w:t>
-            </w:r>
-          </w:p>
-        </w:tc>
-        <w:tc>
-          <w:tcPr/>
-          <w:p>
-            <w:pPr>
-              <w:pStyle w:val="Compact"/>
-              <w:jc w:val="left"/>
-            </w:pPr>
-            <w:r>
-              <w:t xml:space="preserve">Biểu mẫu Trung tâm</w:t>
+              <w:t xml:space="preserve">dữ liệu thật</w:t>
+            </w:r>
+          </w:p>
+        </w:tc>
+      </w:tr>
+      <w:tr>
+        <w:tc>
+          <w:tcPr/>
+          <w:p>
+            <w:pPr>
+              <w:pStyle w:val="Compact"/>
+            </w:pPr>
+          </w:p>
+        </w:tc>
+        <w:tc>
+          <w:tcPr/>
+          <w:p>
+            <w:pPr>
+              <w:pStyle w:val="Compact"/>
+            </w:pPr>
+          </w:p>
+        </w:tc>
+        <w:tc>
+          <w:tcPr/>
+          <w:p>
+            <w:pPr>
+              <w:pStyle w:val="Compact"/>
+              <w:jc w:val="left"/>
+            </w:pPr>
+            <w:r>
+              <w:t xml:space="preserve">6. Kết quả</w:t>
+            </w:r>
+            <w:r>
+              <w:t xml:space="preserve"> </w:t>
+            </w:r>
+            <w:r>
+              <w:rPr>
+                <w:bCs/>
+                <w:b/>
+              </w:rPr>
+              <w:t xml:space="preserve">ở lại</w:t>
+            </w:r>
+            <w:r>
+              <w:t xml:space="preserve"> </w:t>
+            </w:r>
+            <w:r>
+              <w:t xml:space="preserve">máy này</w:t>
             </w:r>
           </w:p>
         </w:tc>
@@ -11125,99 +11543,228 @@
       <w:pPr>
         <w:numPr>
           <w:ilvl w:val="0"/>
+          <w:numId w:val="1006"/>
+        </w:numPr>
+        <w:pStyle w:val="Compact"/>
+      </w:pPr>
+      <w:r>
+        <w:t xml:space="preserve">🧪</w:t>
+      </w:r>
+      <w:r>
+        <w:t xml:space="preserve"> </w:t>
+      </w:r>
+      <w:r>
+        <w:rPr>
+          <w:bCs/>
+          <w:b/>
+        </w:rPr>
+        <w:t xml:space="preserve">Ví dụ:</w:t>
+      </w:r>
+      <w:r>
+        <w:t xml:space="preserve"> </w:t>
+      </w:r>
+      <w:r>
+        <w:rPr>
+          <w:iCs/>
+          <w:i/>
+        </w:rPr>
+        <w:t xml:space="preserve">Ảnh hưởng của địa hình và khí hậu nhiệt đới đến lộ trình của thiết bị bay không người lái</w:t>
+      </w:r>
+      <w:r>
+        <w:t xml:space="preserve"> </w:t>
+      </w:r>
+      <w:r>
+        <w:t xml:space="preserve">– công cụ tìm lộ trình tốn ít năng lượng nhất, tránh núi cao, ổ mưa dông, gió mạnh; tính ảnh hưởng của gió, mưa, nhiệt độ – độ ẩm, leo cao</w:t>
+      </w:r>
+    </w:p>
+    <w:p>
+      <w:pPr>
+        <w:numPr>
+          <w:ilvl w:val="0"/>
+          <w:numId w:val="1006"/>
+        </w:numPr>
+        <w:pStyle w:val="Compact"/>
+      </w:pPr>
+      <w:r>
+        <w:t xml:space="preserve">📊</w:t>
+      </w:r>
+      <w:r>
+        <w:t xml:space="preserve"> </w:t>
+      </w:r>
+      <w:r>
+        <w:rPr>
+          <w:bCs/>
+          <w:b/>
+        </w:rPr>
+        <w:t xml:space="preserve">Kết quả với dữ liệu giả lập:</w:t>
+      </w:r>
+    </w:p>
+    <w:p>
+      <w:pPr>
+        <w:numPr>
+          <w:ilvl w:val="1"/>
           <w:numId w:val="1007"/>
         </w:numPr>
-      </w:pPr>
-      <w:r>
-        <w:t xml:space="preserve">⌨</w:t>
-      </w:r>
-      <w:r>
-        <w:t xml:space="preserve"> </w:t>
-      </w:r>
-      <w:r>
-        <w:rPr>
-          <w:bCs/>
-          <w:b/>
-        </w:rPr>
-        <w:t xml:space="preserve">Câu lệnh:</w:t>
+        <w:pStyle w:val="Compact"/>
+      </w:pPr>
+      <w:r>
+        <w:t xml:space="preserve">Đường thẳng cắt qua</w:t>
+      </w:r>
+      <w:r>
+        <w:t xml:space="preserve"> </w:t>
+      </w:r>
+      <w:r>
+        <w:rPr>
+          <w:bCs/>
+          <w:b/>
+        </w:rPr>
+        <w:t xml:space="preserve">8 ô cấm bay</w:t>
+      </w:r>
+      <w:r>
+        <w:t xml:space="preserve"> </w:t>
+      </w:r>
+      <w:r>
+        <w:t xml:space="preserve">→ lộ trình vòng qua đèo: 14,5 km, 240 Wh</w:t>
+      </w:r>
+    </w:p>
+    <w:p>
+      <w:pPr>
+        <w:numPr>
+          <w:ilvl w:val="1"/>
+          <w:numId w:val="1007"/>
+        </w:numPr>
+        <w:pStyle w:val="Compact"/>
+      </w:pPr>
+      <w:r>
+        <w:t xml:space="preserve">Chiều về ngược gió mùa:</w:t>
+      </w:r>
+      <w:r>
+        <w:t xml:space="preserve"> </w:t>
+      </w:r>
+      <w:r>
+        <w:rPr>
+          <w:bCs/>
+          <w:b/>
+        </w:rPr>
+        <w:t xml:space="preserve">422 Wh – gấp 1,8 lần chiều đi</w:t>
+      </w:r>
+      <w:r>
+        <w:t xml:space="preserve"> </w:t>
+      </w:r>
+      <w:r>
+        <w:t xml:space="preserve">→ không đủ pin, phải đổi phương án</w:t>
+      </w:r>
+    </w:p>
+    <w:p>
+      <w:pPr>
+        <w:numPr>
+          <w:ilvl w:val="1"/>
+          <w:numId w:val="1007"/>
+        </w:numPr>
+        <w:pStyle w:val="Compact"/>
+      </w:pPr>
+      <w:r>
+        <w:t xml:space="preserve">Công cụ chạy trong ~3 giây trên máy tính thường, không cần mạng</w:t>
       </w:r>
     </w:p>
     <w:p>
       <w:pPr>
         <w:numPr>
           <w:ilvl w:val="0"/>
-          <w:numId w:val="1000"/>
+          <w:numId w:val="1006"/>
         </w:numPr>
-        <w:pStyle w:val="SourceCode"/>
-      </w:pPr>
+        <w:pStyle w:val="Compact"/>
+      </w:pPr>
+      <w:r>
+        <w:t xml:space="preserve">⚠ Chuyển tệp giữa hai máy theo</w:t>
+      </w:r>
+      <w:r>
+        <w:t xml:space="preserve"> </w:t>
+      </w:r>
+      <w:r>
+        <w:rPr>
+          <w:bCs/>
+          <w:b/>
+        </w:rPr>
+        <w:t xml:space="preserve">quy định bảo vệ bí mật nhà nước và quy chế của đơn vị</w:t>
+      </w:r>
+      <w:r>
+        <w:t xml:space="preserve">. Khi công cụ lỗi: tái tạo lỗi bằng dữ liệu giả để hỏi AI – không mang dữ liệu thật ra ngoài.</w:t>
+      </w:r>
+    </w:p>
+    <w:p>
+      <w:pPr>
+        <w:pStyle w:val="FirstParagraph"/>
+      </w:pPr>
+      <w:r>
+        <w:rPr>
+          <w:bCs/>
+          <w:b/>
+        </w:rPr>
+        <w:t xml:space="preserve">Hình ảnh:</w:t>
+      </w:r>
+      <w:r>
+        <w:t xml:space="preserve"> </w:t>
+      </w:r>
+      <w:r>
+        <w:t xml:space="preserve">sơ đồ hai máy;</w:t>
+      </w:r>
+      <w:r>
+        <w:t xml:space="preserve"> </w:t>
+      </w:r>
       <w:r>
         <w:rPr>
           <w:rStyle w:val="VerbatimChar"/>
         </w:rPr>
-        <w:t xml:space="preserve">Từ kết quả trong dự án, soạn bản thảo cho tạp chí [tên]. Đọc "Hướng dẫn tác giả" tôi tải</w:t>
-      </w:r>
-      <w:r>
-        <w:br/>
+        <w:t xml:space="preserve">thuyet-trinh/ket-qua-demo/may-cach-ly/ban_do_lo_trinh.png</w:t>
+      </w:r>
+      <w:r>
+        <w:t xml:space="preserve">.</w:t>
+      </w:r>
+    </w:p>
+    <w:p>
+      <w:pPr>
+        <w:pStyle w:val="BodyText"/>
+      </w:pPr>
+      <w:r>
+        <w:rPr>
+          <w:bCs/>
+          <w:b/>
+        </w:rPr>
+        <w:t xml:space="preserve">Demo:</w:t>
+      </w:r>
+      <w:r>
+        <w:t xml:space="preserve"> </w:t>
+      </w:r>
+      <w:r>
+        <w:t xml:space="preserve">~2 phút – chạy công cụ trên dữ liệu giả, mở báo cáo (câu lệnh:</w:t>
+      </w:r>
+      <w:r>
+        <w:t xml:space="preserve"> </w:t>
       </w:r>
       <w:r>
         <w:rPr>
           <w:rStyle w:val="VerbatimChar"/>
         </w:rPr>
-        <w:t xml:space="preserve">lên; lập bảng kiểm tra từng yêu cầu (đạt / chưa đạt). Với tạp chí ВАК: thêm УДК, tóm tắt</w:t>
-      </w:r>
-      <w:r>
-        <w:br/>
+        <w:t xml:space="preserve">cau-lenh-demo.md</w:t>
+      </w:r>
+      <w:r>
+        <w:t xml:space="preserve"> </w:t>
+      </w:r>
+      <w:r>
+        <w:t xml:space="preserve">mục 13; mã:</w:t>
+      </w:r>
+      <w:r>
+        <w:t xml:space="preserve"> </w:t>
       </w:r>
       <w:r>
         <w:rPr>
           <w:rStyle w:val="VerbatimChar"/>
         </w:rPr>
-        <w:t xml:space="preserve">và từ khóa tiếng Nga – Anh, tài liệu tham khảo theo ГОСТ Р 7.0.5-2008.</w:t>
-      </w:r>
-      <w:r>
-        <w:br/>
-      </w:r>
-      <w:r>
-        <w:rPr>
-          <w:rStyle w:val="VerbatimChar"/>
-        </w:rPr>
-        <w:t xml:space="preserve">Sau đó đóng vai phản biện khó tính: 5 nhược điểm lớn nhất và cách trả lời.</w:t>
-      </w:r>
-    </w:p>
-    <w:p>
-      <w:pPr>
-        <w:pStyle w:val="FirstParagraph"/>
-      </w:pPr>
-      <w:r>
-        <w:rPr>
-          <w:bCs/>
-          <w:b/>
-        </w:rPr>
-        <w:t xml:space="preserve">Việc phải làm:</w:t>
-      </w:r>
-      <w:r>
-        <w:t xml:space="preserve"> </w:t>
-      </w:r>
-      <w:r>
-        <w:t xml:space="preserve">kiểm tra danh mục ВАК hiện hành và nhóm К1–К3 của từng tạp chí; xác nhận</w:t>
-      </w:r>
-      <w:r>
-        <w:t xml:space="preserve"> </w:t>
-      </w:r>
-      <w:r>
-        <w:t xml:space="preserve">“</w:t>
-      </w:r>
-      <w:r>
-        <w:t xml:space="preserve">EeiE</w:t>
-      </w:r>
-      <w:r>
-        <w:t xml:space="preserve">”</w:t>
-      </w:r>
-      <w:r>
-        <w:t xml:space="preserve"> </w:t>
-      </w:r>
-      <w:r>
-        <w:t xml:space="preserve">trong bản góp ý là Ei Compendex hay danh mục khác.</w:t>
+        <w:t xml:space="preserve">thuyet-trinh/ma-nguon-demo/may-cach-ly/</w:t>
+      </w:r>
+      <w:r>
+        <w:t xml:space="preserve">).</w:t>
       </w:r>
     </w:p>
     <w:p>
@@ -11255,24 +11802,15 @@
         </w:pict>
       </w:r>
     </w:p>
-    <w:bookmarkEnd w:id="43"/>
-    <w:bookmarkStart w:id="44" w:name="Xc168ec6a35dd25182e83a95b5e7a9d46ecee8cd"/>
-    <w:p>
-      <w:pPr>
-        <w:pStyle w:val="Heading2"/>
-      </w:pPr>
-      <w:r>
-        <w:t xml:space="preserve">Slide 19 – Tổng hợp chu trình thực hiện nhiệm vụ khoa học và công nghệ có ứng dụng tác tử trí tuệ nhân tạo (2′) –</w:t>
-      </w:r>
-      <w:r>
-        <w:t xml:space="preserve"> </w:t>
-      </w:r>
-      <w:r>
-        <w:rPr>
-          <w:iCs/>
-          <w:i/>
-        </w:rPr>
-        <w:t xml:space="preserve">tổng kết Phần III</w:t>
+    <w:bookmarkEnd w:id="45"/>
+    <w:bookmarkEnd w:id="46"/>
+    <w:bookmarkStart w:id="50" w:name="X49c9e2e2629d4b3041c6feec67246a57957c4b4"/>
+    <w:p>
+      <w:pPr>
+        <w:pStyle w:val="Heading1"/>
+      </w:pPr>
+      <w:r>
+        <w:t xml:space="preserve">PHẦN V. SKILL, KHOA HỌC MỞ VÀ TỰ ĐỘNG HÓA (15 phút)</w:t>
       </w:r>
     </w:p>
     <w:p>
@@ -11284,76 +11822,13 @@
           <w:bCs/>
           <w:b/>
         </w:rPr>
-        <w:t xml:space="preserve">Chữ trên slide:</w:t>
-      </w:r>
-    </w:p>
-    <w:p>
-      <w:pPr>
-        <w:pStyle w:val="BodyText"/>
-      </w:pPr>
-      <w:r>
-        <w:rPr>
-          <w:bCs/>
-          <w:b/>
-        </w:rPr>
-        <w:t xml:space="preserve">Hình ảnh (chính):</w:t>
-      </w:r>
-      <w:r>
-        <w:t xml:space="preserve"> </w:t>
-      </w:r>
-      <w:r>
-        <w:t xml:space="preserve">sơ đồ vòng đời: Tài liệu → Khoảng trống (S12) → Phiếu đề xuất, thuyết minh (S13) → Tiến độ – kinh phí (S14) → Dữ liệu – kết quả, mô hình 3D (S15–S16) → Bài báo – báo cáo (S18); nhánh đề tài mật: công cụ chạy trên máy không Internet (S17); mỗi bước có dấu ✅</w:t>
-      </w:r>
-      <w:r>
-        <w:t xml:space="preserve"> </w:t>
-      </w:r>
-      <w:r>
-        <w:t xml:space="preserve">“</w:t>
-      </w:r>
-      <w:r>
-        <w:t xml:space="preserve">nhà khoa học xác nhận</w:t>
-      </w:r>
-      <w:r>
-        <w:t xml:space="preserve">”</w:t>
-      </w:r>
-      <w:r>
-        <w:t xml:space="preserve">.</w:t>
-      </w:r>
-    </w:p>
-    <w:p>
-      <w:pPr>
-        <w:pStyle w:val="BlockText"/>
-      </w:pPr>
-      <w:r>
-        <w:t xml:space="preserve">Cùng một dự án, cùng một bộ tài liệu – AI nối các công đoạn; nhà khoa học duyệt ở mỗi bước.</w:t>
-      </w:r>
-    </w:p>
-    <w:p>
-      <w:pPr>
-        <w:pStyle w:val="FirstParagraph"/>
-      </w:pPr>
-      <w:r>
-        <w:rPr>
-          <w:bCs/>
-          <w:b/>
-        </w:rPr>
-        <w:t xml:space="preserve">Duyệt:</w:t>
-      </w:r>
-      <w:r>
-        <w:t xml:space="preserve"> </w:t>
-      </w:r>
-      <w:r>
-        <w:t xml:space="preserve">[ ] Duyệt · [ ] Sửa · [ ] Bỏ</w:t>
-      </w:r>
-      <w:r>
-        <w:t xml:space="preserve"> </w:t>
-      </w:r>
-      <w:r>
-        <w:rPr>
-          <w:bCs/>
-          <w:b/>
-        </w:rPr>
-        <w:t xml:space="preserve">Ghi chú:</w:t>
+        <w:t xml:space="preserve">Trang chuyển phần:</w:t>
+      </w:r>
+      <w:r>
+        <w:t xml:space="preserve"> </w:t>
+      </w:r>
+      <w:r>
+        <w:t xml:space="preserve">tên Phần V · Slide 20–22</w:t>
       </w:r>
     </w:p>
     <w:p>
@@ -11363,31 +11838,13 @@
         </w:pict>
       </w:r>
     </w:p>
-    <w:bookmarkEnd w:id="44"/>
-    <w:bookmarkEnd w:id="45"/>
-    <w:bookmarkStart w:id="55" w:name="X3a72b5620823bd057fa601f63db5843cab00f4b"/>
-    <w:p>
-      <w:pPr>
-        <w:pStyle w:val="Heading1"/>
-      </w:pPr>
-      <w:r>
-        <w:t xml:space="preserve">PHẦN IV. KỸ NĂNG, KHOA HỌC MỞ VÀ TỰ ĐỘNG HÓA QUY TRÌNH NGHIÊN CỨU (15 phút)</w:t>
-      </w:r>
-    </w:p>
-    <w:p>
-      <w:r>
-        <w:pict>
-          <v:rect style="width:0;height:1.5pt" o:hralign="center" o:hrstd="t" o:hr="t"/>
-        </w:pict>
-      </w:r>
-    </w:p>
-    <w:bookmarkStart w:id="46" w:name="X818242104804ce0c977341420493fb5a14aef84"/>
+    <w:bookmarkStart w:id="47" w:name="Xede09fe8d87eea4758afea24298a0a93a490a9c"/>
     <w:p>
       <w:pPr>
         <w:pStyle w:val="Heading2"/>
       </w:pPr>
       <w:r>
-        <w:t xml:space="preserve">Slide 20 – Kỹ năng (Skill) và khoa học mở – nền tảng tự động hóa hoạt động nghiên cứu (6′)</w:t>
+        <w:t xml:space="preserve">Slide 20 – Skill và khoa học mở: nền móng của tự động hóa (6′)</w:t>
       </w:r>
     </w:p>
     <w:p>
@@ -11976,14 +12433,14 @@
         </w:pict>
       </w:r>
     </w:p>
-    <w:bookmarkEnd w:id="46"/>
-    <w:bookmarkStart w:id="47" w:name="X726540dc6836b0b411b8e79de7361a22afe3ad5"/>
+    <w:bookmarkEnd w:id="47"/>
+    <w:bookmarkStart w:id="48" w:name="Xed3464729fbb4912ed2c4f95a8612249b6e2b90"/>
     <w:p>
       <w:pPr>
         <w:pStyle w:val="Heading2"/>
       </w:pPr>
       <w:r>
-        <w:t xml:space="preserve">Slide 21 – Lộ trình tự động hóa từ từng công đoạn đến toàn bộ quy trình nghiên cứu (5′)</w:t>
+        <w:t xml:space="preserve">Slide 21 – Tự động hóa từng bước: từ một công việc đến toàn quy trình (5′)</w:t>
       </w:r>
     </w:p>
     <w:p>
@@ -12503,14 +12960,14 @@
         </w:pict>
       </w:r>
     </w:p>
-    <w:bookmarkEnd w:id="47"/>
-    <w:bookmarkStart w:id="48" w:name="X735cc2cc89b2c622c4c48db7dc4521398c84c95"/>
+    <w:bookmarkEnd w:id="48"/>
+    <w:bookmarkStart w:id="49" w:name="X1cb900760096274a3dd5c9fe1f213f586658b4a"/>
     <w:p>
       <w:pPr>
         <w:pStyle w:val="Heading2"/>
       </w:pPr>
       <w:r>
-        <w:t xml:space="preserve">Slide 22 – Sơ đồ quy trình tự động hóa của Trung tâm và các nội dung thuộc thẩm quyền quyết định của nhà khoa học (4′)</w:t>
+        <w:t xml:space="preserve">Slide 22 – Quy trình tự động của Trung tâm và năm quyết định của nhà khoa học (4′)</w:t>
       </w:r>
     </w:p>
     <w:p>
@@ -13130,78 +13587,15 @@
         </w:pict>
       </w:r>
     </w:p>
-    <w:bookmarkEnd w:id="48"/>
-    <w:bookmarkStart w:id="49" w:name="slide-23-trao-đổi-thảo-luận-9"/>
-    <w:p>
-      <w:pPr>
-        <w:pStyle w:val="Heading2"/>
-      </w:pPr>
-      <w:r>
-        <w:t xml:space="preserve">Slide 23 – Trao đổi, thảo luận (9′)</w:t>
-      </w:r>
-    </w:p>
-    <w:p>
-      <w:pPr>
-        <w:pStyle w:val="FirstParagraph"/>
-      </w:pPr>
-      <w:r>
-        <w:rPr>
-          <w:bCs/>
-          <w:b/>
-        </w:rPr>
-        <w:t xml:space="preserve">Chữ trên slide:</w:t>
-      </w:r>
-      <w:r>
-        <w:t xml:space="preserve"> </w:t>
-      </w:r>
-      <w:r>
-        <w:t xml:space="preserve">- Kết quả phiếu khảo sát trước buổi học (biểu đồ)</w:t>
-      </w:r>
-      <w:r>
-        <w:t xml:space="preserve"> </w:t>
-      </w:r>
-      <w:r>
-        <w:t xml:space="preserve">- Các quy trình các phòng muốn tự động hóa</w:t>
-      </w:r>
-      <w:r>
-        <w:t xml:space="preserve"> </w:t>
-      </w:r>
-      <w:r>
-        <w:t xml:space="preserve">- Câu hỏi – góp ý – đề xuất thí điểm</w:t>
-      </w:r>
-      <w:r>
-        <w:t xml:space="preserve"> </w:t>
-      </w:r>
-      <w:r>
-        <w:t xml:space="preserve">- Đầu mối liên hệ: ______________________</w:t>
-      </w:r>
-    </w:p>
-    <w:p>
-      <w:pPr>
-        <w:pStyle w:val="BodyText"/>
-      </w:pPr>
-      <w:r>
-        <w:rPr>
-          <w:bCs/>
-          <w:b/>
-        </w:rPr>
-        <w:t xml:space="preserve">Duyệt:</w:t>
-      </w:r>
-      <w:r>
-        <w:t xml:space="preserve"> </w:t>
-      </w:r>
-      <w:r>
-        <w:t xml:space="preserve">[ ] Duyệt · [ ] Sửa · [ ] Bỏ</w:t>
-      </w:r>
-      <w:r>
-        <w:t xml:space="preserve"> </w:t>
-      </w:r>
-      <w:r>
-        <w:rPr>
-          <w:bCs/>
-          <w:b/>
-        </w:rPr>
-        <w:t xml:space="preserve">Ghi chú:</w:t>
+    <w:bookmarkEnd w:id="49"/>
+    <w:bookmarkEnd w:id="50"/>
+    <w:bookmarkStart w:id="52" w:name="phần-vi.-trao-đổi-và-thảo-luận-9-phút"/>
+    <w:p>
+      <w:pPr>
+        <w:pStyle w:val="Heading1"/>
+      </w:pPr>
+      <w:r>
+        <w:t xml:space="preserve">PHẦN VI. TRAO ĐỔI VÀ THẢO LUẬN (9 phút)</w:t>
       </w:r>
     </w:p>
     <w:p>
@@ -13211,14 +13605,13 @@
         </w:pict>
       </w:r>
     </w:p>
-    <w:bookmarkEnd w:id="49"/>
-    <w:bookmarkStart w:id="50" w:name="Xc1d1bfc469bd29a27f454cc5a1d0d3e81a83768"/>
+    <w:bookmarkStart w:id="51" w:name="slide-23-trao-đổi-và-thảo-luận-9"/>
     <w:p>
       <w:pPr>
         <w:pStyle w:val="Heading2"/>
       </w:pPr>
       <w:r>
-        <w:t xml:space="preserve">Slide 24 – Phụ lục A: Trí tuệ nhân tạo trong lĩnh vực lập trình (không trình bày)</w:t>
+        <w:t xml:space="preserve">Slide 23 – Trao đổi và thảo luận (9′)</w:t>
       </w:r>
     </w:p>
     <w:p>
@@ -13236,53 +13629,25 @@
         <w:t xml:space="preserve"> </w:t>
       </w:r>
       <w:r>
-        <w:t xml:space="preserve">- GitHub Octoverse 2025: hơn 180 triệu lập trình viên; hơn 36 triệu người mới trong một năm; 630 triệu kho mã; gần 1 tỷ lần đẩy mã; 4,3 triệu dự án AI</w:t>
-      </w:r>
-      <w:r>
-        <w:t xml:space="preserve"> </w:t>
-      </w:r>
-      <w:r>
-        <w:t xml:space="preserve">- Stack Overflow 2025: 84% lập trình viên dùng hoặc dự định dùng AI; 51% lập trình viên chuyên nghiệp dùng hằng ngày</w:t>
-      </w:r>
-      <w:r>
-        <w:t xml:space="preserve"> </w:t>
-      </w:r>
-      <w:r>
-        <w:t xml:space="preserve">- SWE-bench Verified (năng lực sửa lỗi phần mềm thật) tăng mạnh trong một năm –</w:t>
-      </w:r>
-      <w:r>
-        <w:t xml:space="preserve"> </w:t>
-      </w:r>
-      <w:r>
-        <w:rPr>
-          <w:iCs/>
-          <w:i/>
-        </w:rPr>
-        <w:t xml:space="preserve">kiểm tra số liệu trong bản gốc AI Index 2026 trước khi dùng</w:t>
-      </w:r>
-      <w:r>
-        <w:t xml:space="preserve"> </w:t>
-      </w:r>
-      <w:r>
-        <w:t xml:space="preserve">- Các AI Agent lập trình: Claude Code, OpenAI Codex, GitHub Copilot, Cursor</w:t>
-      </w:r>
-    </w:p>
-    <w:p>
-      <w:pPr>
-        <w:pStyle w:val="BodyText"/>
-      </w:pPr>
-      <w:r>
-        <w:rPr>
-          <w:bCs/>
-          <w:b/>
-        </w:rPr>
-        <w:t xml:space="preserve">Nguồn:</w:t>
-      </w:r>
-      <w:r>
-        <w:t xml:space="preserve"> </w:t>
-      </w:r>
-      <w:r>
-        <w:t xml:space="preserve">N1, N11, N13</w:t>
+        <w:t xml:space="preserve">- Kết quả phiếu khảo sát trước buổi học (biểu đồ)</w:t>
+      </w:r>
+      <w:r>
+        <w:t xml:space="preserve"> </w:t>
+      </w:r>
+      <w:r>
+        <w:t xml:space="preserve">- Các quy trình các phòng muốn tự động hóa</w:t>
+      </w:r>
+      <w:r>
+        <w:t xml:space="preserve"> </w:t>
+      </w:r>
+      <w:r>
+        <w:t xml:space="preserve">- Câu hỏi – góp ý – đề xuất thí điểm</w:t>
+      </w:r>
+      <w:r>
+        <w:t xml:space="preserve"> </w:t>
+      </w:r>
+      <w:r>
+        <w:t xml:space="preserve">- Đầu mối liên hệ: ______________________</w:t>
       </w:r>
     </w:p>
     <w:p>
@@ -13320,14 +13685,140 @@
         </w:pict>
       </w:r>
     </w:p>
-    <w:bookmarkEnd w:id="50"/>
-    <w:bookmarkStart w:id="51" w:name="X83b1fb41b981806eaafcf513d71488b865b192c"/>
+    <w:bookmarkEnd w:id="51"/>
+    <w:bookmarkEnd w:id="52"/>
+    <w:bookmarkStart w:id="58" w:name="phụ-lục-không-trình-bày"/>
+    <w:p>
+      <w:pPr>
+        <w:pStyle w:val="Heading1"/>
+      </w:pPr>
+      <w:r>
+        <w:t xml:space="preserve">PHỤ LỤC (không trình bày)</w:t>
+      </w:r>
+    </w:p>
+    <w:p>
+      <w:r>
+        <w:pict>
+          <v:rect style="width:0;height:1.5pt" o:hralign="center" o:hrstd="t" o:hr="t"/>
+        </w:pict>
+      </w:r>
+    </w:p>
+    <w:bookmarkStart w:id="53" w:name="Xc5e529fd4c010d30b1942a8d2129db4c84ec610"/>
     <w:p>
       <w:pPr>
         <w:pStyle w:val="Heading2"/>
       </w:pPr>
       <w:r>
-        <w:t xml:space="preserve">Slide 25 – Phụ lục B: Một số công trình nghiên cứu ứng dụng trí tuệ nhân tạo của Google (không trình bày)</w:t>
+        <w:t xml:space="preserve">Slide 24 – Phụ lục A: AI lập trình (không trình bày)</w:t>
+      </w:r>
+    </w:p>
+    <w:p>
+      <w:pPr>
+        <w:pStyle w:val="FirstParagraph"/>
+      </w:pPr>
+      <w:r>
+        <w:rPr>
+          <w:bCs/>
+          <w:b/>
+        </w:rPr>
+        <w:t xml:space="preserve">Chữ trên slide:</w:t>
+      </w:r>
+      <w:r>
+        <w:t xml:space="preserve"> </w:t>
+      </w:r>
+      <w:r>
+        <w:t xml:space="preserve">- GitHub Octoverse 2025: hơn 180 triệu lập trình viên; hơn 36 triệu người mới trong một năm; 630 triệu kho mã; gần 1 tỷ lần đẩy mã; 4,3 triệu dự án AI</w:t>
+      </w:r>
+      <w:r>
+        <w:t xml:space="preserve"> </w:t>
+      </w:r>
+      <w:r>
+        <w:t xml:space="preserve">- Stack Overflow 2025: 84% lập trình viên dùng hoặc dự định dùng AI; 51% lập trình viên chuyên nghiệp dùng hằng ngày</w:t>
+      </w:r>
+      <w:r>
+        <w:t xml:space="preserve"> </w:t>
+      </w:r>
+      <w:r>
+        <w:t xml:space="preserve">- SWE-bench Verified (năng lực sửa lỗi phần mềm thật) tăng mạnh trong một năm –</w:t>
+      </w:r>
+      <w:r>
+        <w:t xml:space="preserve"> </w:t>
+      </w:r>
+      <w:r>
+        <w:rPr>
+          <w:iCs/>
+          <w:i/>
+        </w:rPr>
+        <w:t xml:space="preserve">kiểm tra số liệu trong bản gốc AI Index 2026 trước khi dùng</w:t>
+      </w:r>
+      <w:r>
+        <w:t xml:space="preserve"> </w:t>
+      </w:r>
+      <w:r>
+        <w:t xml:space="preserve">- Các AI Agent lập trình: Claude Code, OpenAI Codex, GitHub Copilot, Cursor</w:t>
+      </w:r>
+    </w:p>
+    <w:p>
+      <w:pPr>
+        <w:pStyle w:val="BodyText"/>
+      </w:pPr>
+      <w:r>
+        <w:rPr>
+          <w:bCs/>
+          <w:b/>
+        </w:rPr>
+        <w:t xml:space="preserve">Nguồn:</w:t>
+      </w:r>
+      <w:r>
+        <w:t xml:space="preserve"> </w:t>
+      </w:r>
+      <w:r>
+        <w:t xml:space="preserve">N1, N11, N13</w:t>
+      </w:r>
+    </w:p>
+    <w:p>
+      <w:pPr>
+        <w:pStyle w:val="BodyText"/>
+      </w:pPr>
+      <w:r>
+        <w:rPr>
+          <w:bCs/>
+          <w:b/>
+        </w:rPr>
+        <w:t xml:space="preserve">Duyệt:</w:t>
+      </w:r>
+      <w:r>
+        <w:t xml:space="preserve"> </w:t>
+      </w:r>
+      <w:r>
+        <w:t xml:space="preserve">[ ] Duyệt · [ ] Sửa · [ ] Bỏ</w:t>
+      </w:r>
+      <w:r>
+        <w:t xml:space="preserve"> </w:t>
+      </w:r>
+      <w:r>
+        <w:rPr>
+          <w:bCs/>
+          <w:b/>
+        </w:rPr>
+        <w:t xml:space="preserve">Ghi chú:</w:t>
+      </w:r>
+    </w:p>
+    <w:p>
+      <w:r>
+        <w:pict>
+          <v:rect style="width:0;height:1.5pt" o:hralign="center" o:hrstd="t" o:hr="t"/>
+        </w:pict>
+      </w:r>
+    </w:p>
+    <w:bookmarkEnd w:id="53"/>
+    <w:bookmarkStart w:id="54" w:name="X6d02dea6a9e8ff5038e1983d7c74272693c420f"/>
+    <w:p>
+      <w:pPr>
+        <w:pStyle w:val="Heading2"/>
+      </w:pPr>
+      <w:r>
+        <w:t xml:space="preserve">Slide 25 – Phụ lục B: Ví dụ Google và các nhà khoa học dùng AI (không trình bày – dự phòng khi được hỏi)</w:t>
       </w:r>
     </w:p>
     <w:p>
@@ -14004,14 +14495,14 @@
         </w:pict>
       </w:r>
     </w:p>
-    <w:bookmarkEnd w:id="51"/>
-    <w:bookmarkStart w:id="52" w:name="X7613461a50d489aabc0c4f50dba778b09145968"/>
+    <w:bookmarkEnd w:id="54"/>
+    <w:bookmarkStart w:id="55" w:name="X93d551cb36b78b56d1c5628e3247657e12675ac"/>
     <w:p>
       <w:pPr>
         <w:pStyle w:val="Heading2"/>
       </w:pPr>
       <w:r>
-        <w:t xml:space="preserve">Slide 26 – Phụ lục C: Tài liệu tham khảo (không trình bày)</w:t>
+        <w:t xml:space="preserve">Slide 26 – Phụ lục C: Nguồn tham khảo (không trình bày)</w:t>
       </w:r>
     </w:p>
     <w:p>
@@ -14101,14 +14592,14 @@
         </w:pict>
       </w:r>
     </w:p>
-    <w:bookmarkEnd w:id="52"/>
-    <w:bookmarkStart w:id="53" w:name="Xad4b20d875ea3727bfbcf3964f28216f1423a66"/>
+    <w:bookmarkEnd w:id="55"/>
+    <w:bookmarkStart w:id="56" w:name="X2627c6a16089affe10a68860cf545edfc1afbe1"/>
     <w:p>
       <w:pPr>
         <w:pStyle w:val="Heading2"/>
       </w:pPr>
       <w:r>
-        <w:t xml:space="preserve">Slide 27 – Phụ lục D: Dự án minh họa và thư viện kỹ năng khoa học mở (không trình bày)</w:t>
+        <w:t xml:space="preserve">Slide 27 – Phụ lục D: Dự án và bộ Skill khoa học mở (không trình bày)</w:t>
       </w:r>
     </w:p>
     <w:p>
@@ -14182,8 +14673,8 @@
         </w:pict>
       </w:r>
     </w:p>
-    <w:bookmarkEnd w:id="53"/>
-    <w:bookmarkStart w:id="54" w:name="ý-kiến-chung-của-người-duyệt"/>
+    <w:bookmarkEnd w:id="56"/>
+    <w:bookmarkStart w:id="57" w:name="ý-kiến-chung-của-người-duyệt"/>
     <w:p>
       <w:pPr>
         <w:pStyle w:val="Heading2"/>
@@ -14240,8 +14731,8 @@
         <w:t xml:space="preserve">Người duyệt: ______________________ · Ngày: ____ / ____ / 2026</w:t>
       </w:r>
     </w:p>
-    <w:bookmarkEnd w:id="54"/>
-    <w:bookmarkEnd w:id="55"/>
+    <w:bookmarkEnd w:id="57"/>
+    <w:bookmarkEnd w:id="58"/>
     <w:sectPr/>
   </w:body>
 </w:document>

</xml_diff>

<commit_message>
Trả lại tên slide bản trước, chia 6 phần rõ rệt, thêm đánh giá phản biện (#7)
- Khôi phục tên slide theo bản 'Chủ đề: nội dung'
- Demo 3 (đề tài mật) thành Phần IV riêng, đặt sau slide toàn cảnh; thảo luận thành Phần VI; thêm trang chuyển phần
- DANH-GIA-REVIEWER.md: mức khả quan, mức tiếp thu theo phần, rủi ro, đề xuất


Claude-Session: https://claude.ai/code/session_01JoSsghLRHTtvcNzYXbKpzE

Co-authored-by: Claude <noreply@anthropic.com>
</commit_message>
<xml_diff>
--- a/thuyet-trinh/DANH-SACH-SLIDE-v2.5.docx
+++ b/thuyet-trinh/DANH-SACH-SLIDE-v2.5.docx
@@ -137,7 +137,7 @@
         <w:t xml:space="preserve"> </w:t>
       </w:r>
       <w:r>
-        <w:t xml:space="preserve">thêm Slide 16 (mô hình 3D quá trình ăn mòn) và Slide 17 (Demo 3 – công cụ cho máy không Internet); từ slide cũ 16 trở đi số slide cộng 2; thảo luận còn 9′.</w:t>
+        <w:t xml:space="preserve">thêm Slide 16 (mô hình 3D quá trình ăn mòn) và Slide 19 (Demo 3 – công cụ cho máy không Internet); từ slide cũ 16 trở đi số slide cộng 2; thảo luận còn 9′.</w:t>
       </w:r>
       <w:r>
         <w:t xml:space="preserve"> </w:t>
@@ -451,6 +451,56 @@
           <w:p>
             <w:pPr>
               <w:pStyle w:val="Compact"/>
+            </w:pPr>
+          </w:p>
+        </w:tc>
+        <w:tc>
+          <w:tcPr/>
+          <w:p>
+            <w:pPr>
+              <w:pStyle w:val="Compact"/>
+              <w:jc w:val="left"/>
+            </w:pPr>
+            <w:r>
+              <w:rPr>
+                <w:bCs/>
+                <w:b/>
+              </w:rPr>
+              <w:t xml:space="preserve">PHẦN I. TỔNG QUAN – 19′</w:t>
+            </w:r>
+          </w:p>
+        </w:tc>
+        <w:tc>
+          <w:tcPr/>
+          <w:p>
+            <w:pPr>
+              <w:pStyle w:val="Compact"/>
+            </w:pPr>
+          </w:p>
+        </w:tc>
+        <w:tc>
+          <w:tcPr/>
+          <w:p>
+            <w:pPr>
+              <w:pStyle w:val="Compact"/>
+            </w:pPr>
+          </w:p>
+        </w:tc>
+        <w:tc>
+          <w:tcPr/>
+          <w:p>
+            <w:pPr>
+              <w:pStyle w:val="Compact"/>
+            </w:pPr>
+          </w:p>
+        </w:tc>
+      </w:tr>
+      <w:tr>
+        <w:tc>
+          <w:tcPr/>
+          <w:p>
+            <w:pPr>
+              <w:pStyle w:val="Compact"/>
               <w:jc w:val="left"/>
             </w:pPr>
             <w:r>
@@ -466,7 +516,7 @@
               <w:jc w:val="left"/>
             </w:pPr>
             <w:r>
-              <w:t xml:space="preserve">Tốc độ phát triển của trí tuệ nhân tạo giai đoạn 2019–2026</w:t>
+              <w:t xml:space="preserve">AI phát triển nhanh đến mức nào: những con số mới nhất</w:t>
             </w:r>
           </w:p>
         </w:tc>
@@ -528,7 +578,7 @@
               <w:jc w:val="left"/>
             </w:pPr>
             <w:r>
-              <w:t xml:space="preserve">Ứng dụng trí tuệ nhân tạo trong nghiên cứu khoa học trên thế giới và ở Việt Nam</w:t>
+              <w:t xml:space="preserve">AI trong khoa học: ví dụ quốc tế và Việt Nam</w:t>
             </w:r>
           </w:p>
         </w:tc>
@@ -590,7 +640,7 @@
               <w:jc w:val="left"/>
             </w:pPr>
             <w:r>
-              <w:t xml:space="preserve">Năng lực cốt lõi và các tính năng mới của tác tử trí tuệ nhân tạo (AI Agent)</w:t>
+              <w:t xml:space="preserve">Năng lực cốt lõi và tính năng mới của AI Agent</w:t>
             </w:r>
           </w:p>
         </w:tc>
@@ -652,7 +702,7 @@
               <w:jc w:val="left"/>
             </w:pPr>
             <w:r>
-              <w:t xml:space="preserve">Xu thế chuyển đổi phương thức nghiên cứu khoa học dưới tác động của trí tuệ nhân tạo</w:t>
+              <w:t xml:space="preserve">Phương thức nghiên cứu đang thay đổi: từ thao tác thủ công đến quy trình liên tục</w:t>
             </w:r>
           </w:p>
         </w:tc>
@@ -699,6 +749,56 @@
           <w:p>
             <w:pPr>
               <w:pStyle w:val="Compact"/>
+            </w:pPr>
+          </w:p>
+        </w:tc>
+        <w:tc>
+          <w:tcPr/>
+          <w:p>
+            <w:pPr>
+              <w:pStyle w:val="Compact"/>
+              <w:jc w:val="left"/>
+            </w:pPr>
+            <w:r>
+              <w:rPr>
+                <w:bCs/>
+                <w:b/>
+              </w:rPr>
+              <w:t xml:space="preserve">PHẦN II. LỰA CHỌN VÀ SỬ DỤNG CÔNG CỤ AI PHÙ HỢP – 35′</w:t>
+            </w:r>
+          </w:p>
+        </w:tc>
+        <w:tc>
+          <w:tcPr/>
+          <w:p>
+            <w:pPr>
+              <w:pStyle w:val="Compact"/>
+            </w:pPr>
+          </w:p>
+        </w:tc>
+        <w:tc>
+          <w:tcPr/>
+          <w:p>
+            <w:pPr>
+              <w:pStyle w:val="Compact"/>
+            </w:pPr>
+          </w:p>
+        </w:tc>
+        <w:tc>
+          <w:tcPr/>
+          <w:p>
+            <w:pPr>
+              <w:pStyle w:val="Compact"/>
+            </w:pPr>
+          </w:p>
+        </w:tc>
+      </w:tr>
+      <w:tr>
+        <w:tc>
+          <w:tcPr/>
+          <w:p>
+            <w:pPr>
+              <w:pStyle w:val="Compact"/>
               <w:jc w:val="left"/>
             </w:pPr>
             <w:r>
@@ -714,7 +814,7 @@
               <w:jc w:val="left"/>
             </w:pPr>
             <w:r>
-              <w:t xml:space="preserve">Phân loại công việc nghiên cứu và lựa chọn công cụ trí tuệ nhân tạo phù hợp</w:t>
+              <w:t xml:space="preserve">Chọn đúng công cụ: việc nào dùng chatbot, việc nào cần AI Agent</w:t>
             </w:r>
           </w:p>
         </w:tc>
@@ -776,7 +876,7 @@
               <w:jc w:val="left"/>
             </w:pPr>
             <w:r>
-              <w:t xml:space="preserve">Các công cụ trí tuệ nhân tạo thông dụng: chức năng và phạm vi sử dụng</w:t>
+              <w:t xml:space="preserve">Các công cụ AI phổ biến và vai trò của từng loại</w:t>
             </w:r>
           </w:p>
         </w:tc>
@@ -838,7 +938,7 @@
               <w:jc w:val="left"/>
             </w:pPr>
             <w:r>
-              <w:t xml:space="preserve">Giới thiệu hệ thống Claude: mô hình, gói dịch vụ và tính năng trên nền tảng Windows</w:t>
+              <w:t xml:space="preserve">Giới thiệu Claude: mô hình, gói dịch vụ và tính năng nổi bật trên Windows</w:t>
             </w:r>
           </w:p>
         </w:tc>
@@ -900,7 +1000,7 @@
               <w:jc w:val="left"/>
             </w:pPr>
             <w:r>
-              <w:t xml:space="preserve">Quy trình khai thác, sử dụng cơ bản hệ thống Claude</w:t>
+              <w:t xml:space="preserve">Bắt đầu với Claude: 6 bước đầu tiên và tổng hợp dữ liệu nhiều nguồn</w:t>
             </w:r>
           </w:p>
         </w:tc>
@@ -962,7 +1062,7 @@
               <w:jc w:val="left"/>
             </w:pPr>
             <w:r>
-              <w:t xml:space="preserve">Phương pháp giao nhiệm vụ cho tác tử trí tuệ nhân tạo</w:t>
+              <w:t xml:space="preserve">Giao việc cho AI Agent: cách viết yêu cầu 5 bước</w:t>
             </w:r>
           </w:p>
         </w:tc>
@@ -1024,7 +1124,7 @@
               <w:jc w:val="left"/>
             </w:pPr>
             <w:r>
-              <w:t xml:space="preserve">Tổ chức không gian làm việc theo từng nhiệm vụ khoa học và công nghệ</w:t>
+              <w:t xml:space="preserve">Không gian làm việc nghiên cứu: mỗi nhiệm vụ một dự án</w:t>
             </w:r>
           </w:p>
         </w:tc>
@@ -1086,7 +1186,7 @@
               <w:jc w:val="left"/>
             </w:pPr>
             <w:r>
-              <w:t xml:space="preserve">Kỹ năng (Skill), tác tử con (Subagent) và hệ đa tác tử</w:t>
+              <w:t xml:space="preserve">Skill, Subagent và hệ thống nhiều Agent</w:t>
             </w:r>
           </w:p>
         </w:tc>
@@ -1133,6 +1233,56 @@
           <w:p>
             <w:pPr>
               <w:pStyle w:val="Compact"/>
+            </w:pPr>
+          </w:p>
+        </w:tc>
+        <w:tc>
+          <w:tcPr/>
+          <w:p>
+            <w:pPr>
+              <w:pStyle w:val="Compact"/>
+              <w:jc w:val="left"/>
+            </w:pPr>
+            <w:r>
+              <w:rPr>
+                <w:bCs/>
+                <w:b/>
+              </w:rPr>
+              <w:t xml:space="preserve">PHẦN III. AI AGENT TRONG VÒNG ĐỜI NHIỆM VỤ KHOA HỌC – 37′</w:t>
+            </w:r>
+          </w:p>
+        </w:tc>
+        <w:tc>
+          <w:tcPr/>
+          <w:p>
+            <w:pPr>
+              <w:pStyle w:val="Compact"/>
+            </w:pPr>
+          </w:p>
+        </w:tc>
+        <w:tc>
+          <w:tcPr/>
+          <w:p>
+            <w:pPr>
+              <w:pStyle w:val="Compact"/>
+            </w:pPr>
+          </w:p>
+        </w:tc>
+        <w:tc>
+          <w:tcPr/>
+          <w:p>
+            <w:pPr>
+              <w:pStyle w:val="Compact"/>
+            </w:pPr>
+          </w:p>
+        </w:tc>
+      </w:tr>
+      <w:tr>
+        <w:tc>
+          <w:tcPr/>
+          <w:p>
+            <w:pPr>
+              <w:pStyle w:val="Compact"/>
               <w:jc w:val="left"/>
             </w:pPr>
             <w:r>
@@ -1148,7 +1298,7 @@
               <w:jc w:val="left"/>
             </w:pPr>
             <w:r>
-              <w:t xml:space="preserve">Tổng quan tài liệu và xác định khoảng trống nghiên cứu</w:t>
+              <w:t xml:space="preserve">Tổng quan tài liệu: từ bài báo đến khoảng trống nghiên cứu</w:t>
             </w:r>
           </w:p>
         </w:tc>
@@ -1210,7 +1360,7 @@
               <w:jc w:val="left"/>
             </w:pPr>
             <w:r>
-              <w:t xml:space="preserve">Xây dựng phiếu đề xuất và thuyết minh nhiệm vụ – Minh họa thực nghiệm 1</w:t>
+              <w:t xml:space="preserve">Đề xuất nhiệm vụ: từ khoảng trống đến phiếu đề xuất và thuyết minh – DEMO 1</w:t>
             </w:r>
           </w:p>
         </w:tc>
@@ -1272,7 +1422,7 @@
               <w:jc w:val="left"/>
             </w:pPr>
             <w:r>
-              <w:t xml:space="preserve">Lập kế hoạch tiến độ và dự toán kinh phí theo biểu mẫu của Trung tâm</w:t>
+              <w:t xml:space="preserve">Hồ sơ nhiệm vụ: thuyết minh, tiến độ và kinh phí theo biểu mẫu Trung tâm</w:t>
             </w:r>
           </w:p>
         </w:tc>
@@ -1334,7 +1484,7 @@
               <w:jc w:val="left"/>
             </w:pPr>
             <w:r>
-              <w:t xml:space="preserve">Xử lý, phân tích số liệu thực nghiệm bằng mã nguồn Python – Minh họa thực nghiệm 2</w:t>
+              <w:t xml:space="preserve">Xử lý dữ liệu: AI viết và chạy mã Python – DEMO 2</w:t>
             </w:r>
           </w:p>
         </w:tc>
@@ -1396,7 +1546,7 @@
               <w:jc w:val="left"/>
             </w:pPr>
             <w:r>
-              <w:t xml:space="preserve">Mô hình hóa 3D quá trình ăn mòn khí quyển của vật liệu kim loại</w:t>
+              <w:t xml:space="preserve">Mô hình 3D: mô phỏng quá trình ăn mòn vật liệu theo thời gian</w:t>
             </w:r>
           </w:p>
         </w:tc>
@@ -1458,7 +1608,7 @@
               <w:jc w:val="left"/>
             </w:pPr>
             <w:r>
-              <w:t xml:space="preserve">Xây dựng công cụ xử lý dữ liệu trên máy tính không kết nối Internet đối với nhiệm vụ có nội dung bí mật – Minh họa thực nghiệm 3</w:t>
+              <w:t xml:space="preserve">Công bố kết quả: bài báo và báo cáo tổng hợp theo nhiều định dạng</w:t>
             </w:r>
           </w:p>
         </w:tc>
@@ -1520,7 +1670,7 @@
               <w:jc w:val="left"/>
             </w:pPr>
             <w:r>
-              <w:t xml:space="preserve">Công bố kết quả nghiên cứu và lập báo cáo tổng hợp</w:t>
+              <w:t xml:space="preserve">Toàn cảnh: một nhiệm vụ khoa học đi qua AI Agent</w:t>
             </w:r>
           </w:p>
         </w:tc>
@@ -1544,6 +1694,118 @@
               <w:jc w:val="left"/>
             </w:pPr>
             <w:r>
+              <w:t xml:space="preserve">2′</w:t>
+            </w:r>
+          </w:p>
+        </w:tc>
+        <w:tc>
+          <w:tcPr/>
+          <w:p>
+            <w:pPr>
+              <w:pStyle w:val="Compact"/>
+              <w:jc w:val="left"/>
+            </w:pPr>
+            <w:r>
+              <w:t xml:space="preserve">[ ]</w:t>
+            </w:r>
+          </w:p>
+        </w:tc>
+      </w:tr>
+      <w:tr>
+        <w:tc>
+          <w:tcPr/>
+          <w:p>
+            <w:pPr>
+              <w:pStyle w:val="Compact"/>
+            </w:pPr>
+          </w:p>
+        </w:tc>
+        <w:tc>
+          <w:tcPr/>
+          <w:p>
+            <w:pPr>
+              <w:pStyle w:val="Compact"/>
+              <w:jc w:val="left"/>
+            </w:pPr>
+            <w:r>
+              <w:rPr>
+                <w:bCs/>
+                <w:b/>
+              </w:rPr>
+              <w:t xml:space="preserve">PHẦN IV. ĐỀ TÀI MẬT: ỨNG DỤNG AI KHI DỮ LIỆU KHÔNG ĐƯỢC ĐƯA LÊN INTERNET – 5′</w:t>
+            </w:r>
+          </w:p>
+        </w:tc>
+        <w:tc>
+          <w:tcPr/>
+          <w:p>
+            <w:pPr>
+              <w:pStyle w:val="Compact"/>
+            </w:pPr>
+          </w:p>
+        </w:tc>
+        <w:tc>
+          <w:tcPr/>
+          <w:p>
+            <w:pPr>
+              <w:pStyle w:val="Compact"/>
+            </w:pPr>
+          </w:p>
+        </w:tc>
+        <w:tc>
+          <w:tcPr/>
+          <w:p>
+            <w:pPr>
+              <w:pStyle w:val="Compact"/>
+            </w:pPr>
+          </w:p>
+        </w:tc>
+      </w:tr>
+      <w:tr>
+        <w:tc>
+          <w:tcPr/>
+          <w:p>
+            <w:pPr>
+              <w:pStyle w:val="Compact"/>
+              <w:jc w:val="left"/>
+            </w:pPr>
+            <w:r>
+              <w:t xml:space="preserve">19</w:t>
+            </w:r>
+          </w:p>
+        </w:tc>
+        <w:tc>
+          <w:tcPr/>
+          <w:p>
+            <w:pPr>
+              <w:pStyle w:val="Compact"/>
+              <w:jc w:val="left"/>
+            </w:pPr>
+            <w:r>
+              <w:t xml:space="preserve">Đề tài mật: xây dựng công cụ và xử lý ngay trên máy không kết nối Internet – DEMO 3</w:t>
+            </w:r>
+          </w:p>
+        </w:tc>
+        <w:tc>
+          <w:tcPr/>
+          <w:p>
+            <w:pPr>
+              <w:pStyle w:val="Compact"/>
+              <w:jc w:val="left"/>
+            </w:pPr>
+            <w:r>
+              <w:t xml:space="preserve">IV</w:t>
+            </w:r>
+          </w:p>
+        </w:tc>
+        <w:tc>
+          <w:tcPr/>
+          <w:p>
+            <w:pPr>
+              <w:pStyle w:val="Compact"/>
+              <w:jc w:val="left"/>
+            </w:pPr>
+            <w:r>
               <w:t xml:space="preserve">5′</w:t>
             </w:r>
           </w:p>
@@ -1567,46 +1829,96 @@
           <w:p>
             <w:pPr>
               <w:pStyle w:val="Compact"/>
-              <w:jc w:val="left"/>
-            </w:pPr>
-            <w:r>
-              <w:t xml:space="preserve">19</w:t>
-            </w:r>
-          </w:p>
-        </w:tc>
-        <w:tc>
-          <w:tcPr/>
-          <w:p>
-            <w:pPr>
-              <w:pStyle w:val="Compact"/>
-              <w:jc w:val="left"/>
-            </w:pPr>
-            <w:r>
-              <w:t xml:space="preserve">Tổng hợp chu trình thực hiện nhiệm vụ khoa học và công nghệ có ứng dụng tác tử trí tuệ nhân tạo</w:t>
-            </w:r>
-          </w:p>
-        </w:tc>
-        <w:tc>
-          <w:tcPr/>
-          <w:p>
-            <w:pPr>
-              <w:pStyle w:val="Compact"/>
-              <w:jc w:val="left"/>
-            </w:pPr>
-            <w:r>
-              <w:t xml:space="preserve">III</w:t>
-            </w:r>
-          </w:p>
-        </w:tc>
-        <w:tc>
-          <w:tcPr/>
-          <w:p>
-            <w:pPr>
-              <w:pStyle w:val="Compact"/>
-              <w:jc w:val="left"/>
-            </w:pPr>
-            <w:r>
-              <w:t xml:space="preserve">2′</w:t>
+            </w:pPr>
+          </w:p>
+        </w:tc>
+        <w:tc>
+          <w:tcPr/>
+          <w:p>
+            <w:pPr>
+              <w:pStyle w:val="Compact"/>
+              <w:jc w:val="left"/>
+            </w:pPr>
+            <w:r>
+              <w:rPr>
+                <w:bCs/>
+                <w:b/>
+              </w:rPr>
+              <w:t xml:space="preserve">PHẦN V. SKILL, KHOA HỌC MỞ VÀ TỰ ĐỘNG HÓA – 15′</w:t>
+            </w:r>
+          </w:p>
+        </w:tc>
+        <w:tc>
+          <w:tcPr/>
+          <w:p>
+            <w:pPr>
+              <w:pStyle w:val="Compact"/>
+            </w:pPr>
+          </w:p>
+        </w:tc>
+        <w:tc>
+          <w:tcPr/>
+          <w:p>
+            <w:pPr>
+              <w:pStyle w:val="Compact"/>
+            </w:pPr>
+          </w:p>
+        </w:tc>
+        <w:tc>
+          <w:tcPr/>
+          <w:p>
+            <w:pPr>
+              <w:pStyle w:val="Compact"/>
+            </w:pPr>
+          </w:p>
+        </w:tc>
+      </w:tr>
+      <w:tr>
+        <w:tc>
+          <w:tcPr/>
+          <w:p>
+            <w:pPr>
+              <w:pStyle w:val="Compact"/>
+              <w:jc w:val="left"/>
+            </w:pPr>
+            <w:r>
+              <w:t xml:space="preserve">20</w:t>
+            </w:r>
+          </w:p>
+        </w:tc>
+        <w:tc>
+          <w:tcPr/>
+          <w:p>
+            <w:pPr>
+              <w:pStyle w:val="Compact"/>
+              <w:jc w:val="left"/>
+            </w:pPr>
+            <w:r>
+              <w:t xml:space="preserve">Skill và khoa học mở: nền móng của tự động hóa</w:t>
+            </w:r>
+          </w:p>
+        </w:tc>
+        <w:tc>
+          <w:tcPr/>
+          <w:p>
+            <w:pPr>
+              <w:pStyle w:val="Compact"/>
+              <w:jc w:val="left"/>
+            </w:pPr>
+            <w:r>
+              <w:t xml:space="preserve">V</w:t>
+            </w:r>
+          </w:p>
+        </w:tc>
+        <w:tc>
+          <w:tcPr/>
+          <w:p>
+            <w:pPr>
+              <w:pStyle w:val="Compact"/>
+              <w:jc w:val="left"/>
+            </w:pPr>
+            <w:r>
+              <w:t xml:space="preserve">6′</w:t>
             </w:r>
           </w:p>
         </w:tc>
@@ -1632,43 +1944,43 @@
               <w:jc w:val="left"/>
             </w:pPr>
             <w:r>
-              <w:t xml:space="preserve">20</w:t>
-            </w:r>
-          </w:p>
-        </w:tc>
-        <w:tc>
-          <w:tcPr/>
-          <w:p>
-            <w:pPr>
-              <w:pStyle w:val="Compact"/>
-              <w:jc w:val="left"/>
-            </w:pPr>
-            <w:r>
-              <w:t xml:space="preserve">Kỹ năng (Skill) và khoa học mở – nền tảng tự động hóa hoạt động nghiên cứu</w:t>
-            </w:r>
-          </w:p>
-        </w:tc>
-        <w:tc>
-          <w:tcPr/>
-          <w:p>
-            <w:pPr>
-              <w:pStyle w:val="Compact"/>
-              <w:jc w:val="left"/>
-            </w:pPr>
-            <w:r>
-              <w:t xml:space="preserve">IV</w:t>
-            </w:r>
-          </w:p>
-        </w:tc>
-        <w:tc>
-          <w:tcPr/>
-          <w:p>
-            <w:pPr>
-              <w:pStyle w:val="Compact"/>
-              <w:jc w:val="left"/>
-            </w:pPr>
-            <w:r>
-              <w:t xml:space="preserve">6′</w:t>
+              <w:t xml:space="preserve">21</w:t>
+            </w:r>
+          </w:p>
+        </w:tc>
+        <w:tc>
+          <w:tcPr/>
+          <w:p>
+            <w:pPr>
+              <w:pStyle w:val="Compact"/>
+              <w:jc w:val="left"/>
+            </w:pPr>
+            <w:r>
+              <w:t xml:space="preserve">Tự động hóa từng bước: từ một công việc đến toàn quy trình</w:t>
+            </w:r>
+          </w:p>
+        </w:tc>
+        <w:tc>
+          <w:tcPr/>
+          <w:p>
+            <w:pPr>
+              <w:pStyle w:val="Compact"/>
+              <w:jc w:val="left"/>
+            </w:pPr>
+            <w:r>
+              <w:t xml:space="preserve">V</w:t>
+            </w:r>
+          </w:p>
+        </w:tc>
+        <w:tc>
+          <w:tcPr/>
+          <w:p>
+            <w:pPr>
+              <w:pStyle w:val="Compact"/>
+              <w:jc w:val="left"/>
+            </w:pPr>
+            <w:r>
+              <w:t xml:space="preserve">5′</w:t>
             </w:r>
           </w:p>
         </w:tc>
@@ -1694,43 +2006,43 @@
               <w:jc w:val="left"/>
             </w:pPr>
             <w:r>
-              <w:t xml:space="preserve">21</w:t>
-            </w:r>
-          </w:p>
-        </w:tc>
-        <w:tc>
-          <w:tcPr/>
-          <w:p>
-            <w:pPr>
-              <w:pStyle w:val="Compact"/>
-              <w:jc w:val="left"/>
-            </w:pPr>
-            <w:r>
-              <w:t xml:space="preserve">Lộ trình tự động hóa từ từng công đoạn đến toàn bộ quy trình nghiên cứu</w:t>
-            </w:r>
-          </w:p>
-        </w:tc>
-        <w:tc>
-          <w:tcPr/>
-          <w:p>
-            <w:pPr>
-              <w:pStyle w:val="Compact"/>
-              <w:jc w:val="left"/>
-            </w:pPr>
-            <w:r>
-              <w:t xml:space="preserve">IV</w:t>
-            </w:r>
-          </w:p>
-        </w:tc>
-        <w:tc>
-          <w:tcPr/>
-          <w:p>
-            <w:pPr>
-              <w:pStyle w:val="Compact"/>
-              <w:jc w:val="left"/>
-            </w:pPr>
-            <w:r>
-              <w:t xml:space="preserve">5′</w:t>
+              <w:t xml:space="preserve">22</w:t>
+            </w:r>
+          </w:p>
+        </w:tc>
+        <w:tc>
+          <w:tcPr/>
+          <w:p>
+            <w:pPr>
+              <w:pStyle w:val="Compact"/>
+              <w:jc w:val="left"/>
+            </w:pPr>
+            <w:r>
+              <w:t xml:space="preserve">Quy trình tự động của Trung tâm và năm quyết định của nhà khoa học</w:t>
+            </w:r>
+          </w:p>
+        </w:tc>
+        <w:tc>
+          <w:tcPr/>
+          <w:p>
+            <w:pPr>
+              <w:pStyle w:val="Compact"/>
+              <w:jc w:val="left"/>
+            </w:pPr>
+            <w:r>
+              <w:t xml:space="preserve">V</w:t>
+            </w:r>
+          </w:p>
+        </w:tc>
+        <w:tc>
+          <w:tcPr/>
+          <w:p>
+            <w:pPr>
+              <w:pStyle w:val="Compact"/>
+              <w:jc w:val="left"/>
+            </w:pPr>
+            <w:r>
+              <w:t xml:space="preserve">4′</w:t>
             </w:r>
           </w:p>
         </w:tc>
@@ -1753,46 +2065,96 @@
           <w:p>
             <w:pPr>
               <w:pStyle w:val="Compact"/>
-              <w:jc w:val="left"/>
-            </w:pPr>
-            <w:r>
-              <w:t xml:space="preserve">22</w:t>
-            </w:r>
-          </w:p>
-        </w:tc>
-        <w:tc>
-          <w:tcPr/>
-          <w:p>
-            <w:pPr>
-              <w:pStyle w:val="Compact"/>
-              <w:jc w:val="left"/>
-            </w:pPr>
-            <w:r>
-              <w:t xml:space="preserve">Sơ đồ quy trình tự động hóa của Trung tâm và các nội dung thuộc thẩm quyền quyết định của nhà khoa học</w:t>
-            </w:r>
-          </w:p>
-        </w:tc>
-        <w:tc>
-          <w:tcPr/>
-          <w:p>
-            <w:pPr>
-              <w:pStyle w:val="Compact"/>
-              <w:jc w:val="left"/>
-            </w:pPr>
-            <w:r>
-              <w:t xml:space="preserve">IV</w:t>
-            </w:r>
-          </w:p>
-        </w:tc>
-        <w:tc>
-          <w:tcPr/>
-          <w:p>
-            <w:pPr>
-              <w:pStyle w:val="Compact"/>
-              <w:jc w:val="left"/>
-            </w:pPr>
-            <w:r>
-              <w:t xml:space="preserve">4′</w:t>
+            </w:pPr>
+          </w:p>
+        </w:tc>
+        <w:tc>
+          <w:tcPr/>
+          <w:p>
+            <w:pPr>
+              <w:pStyle w:val="Compact"/>
+              <w:jc w:val="left"/>
+            </w:pPr>
+            <w:r>
+              <w:rPr>
+                <w:bCs/>
+                <w:b/>
+              </w:rPr>
+              <w:t xml:space="preserve">PHẦN VI. TRAO ĐỔI VÀ THẢO LUẬN – 9′</w:t>
+            </w:r>
+          </w:p>
+        </w:tc>
+        <w:tc>
+          <w:tcPr/>
+          <w:p>
+            <w:pPr>
+              <w:pStyle w:val="Compact"/>
+            </w:pPr>
+          </w:p>
+        </w:tc>
+        <w:tc>
+          <w:tcPr/>
+          <w:p>
+            <w:pPr>
+              <w:pStyle w:val="Compact"/>
+            </w:pPr>
+          </w:p>
+        </w:tc>
+        <w:tc>
+          <w:tcPr/>
+          <w:p>
+            <w:pPr>
+              <w:pStyle w:val="Compact"/>
+            </w:pPr>
+          </w:p>
+        </w:tc>
+      </w:tr>
+      <w:tr>
+        <w:tc>
+          <w:tcPr/>
+          <w:p>
+            <w:pPr>
+              <w:pStyle w:val="Compact"/>
+              <w:jc w:val="left"/>
+            </w:pPr>
+            <w:r>
+              <w:t xml:space="preserve">23</w:t>
+            </w:r>
+          </w:p>
+        </w:tc>
+        <w:tc>
+          <w:tcPr/>
+          <w:p>
+            <w:pPr>
+              <w:pStyle w:val="Compact"/>
+              <w:jc w:val="left"/>
+            </w:pPr>
+            <w:r>
+              <w:t xml:space="preserve">Trao đổi và thảo luận</w:t>
+            </w:r>
+          </w:p>
+        </w:tc>
+        <w:tc>
+          <w:tcPr/>
+          <w:p>
+            <w:pPr>
+              <w:pStyle w:val="Compact"/>
+              <w:jc w:val="left"/>
+            </w:pPr>
+            <w:r>
+              <w:t xml:space="preserve">VI</w:t>
+            </w:r>
+          </w:p>
+        </w:tc>
+        <w:tc>
+          <w:tcPr/>
+          <w:p>
+            <w:pPr>
+              <w:pStyle w:val="Compact"/>
+              <w:jc w:val="left"/>
+            </w:pPr>
+            <w:r>
+              <w:t xml:space="preserve">9′</w:t>
             </w:r>
           </w:p>
         </w:tc>
@@ -1815,46 +2177,96 @@
           <w:p>
             <w:pPr>
               <w:pStyle w:val="Compact"/>
-              <w:jc w:val="left"/>
-            </w:pPr>
-            <w:r>
-              <w:t xml:space="preserve">23</w:t>
-            </w:r>
-          </w:p>
-        </w:tc>
-        <w:tc>
-          <w:tcPr/>
-          <w:p>
-            <w:pPr>
-              <w:pStyle w:val="Compact"/>
-              <w:jc w:val="left"/>
-            </w:pPr>
-            <w:r>
-              <w:t xml:space="preserve">Trao đổi, thảo luận</w:t>
-            </w:r>
-          </w:p>
-        </w:tc>
-        <w:tc>
-          <w:tcPr/>
-          <w:p>
-            <w:pPr>
-              <w:pStyle w:val="Compact"/>
-              <w:jc w:val="left"/>
-            </w:pPr>
-            <w:r>
-              <w:t xml:space="preserve">IV</w:t>
-            </w:r>
-          </w:p>
-        </w:tc>
-        <w:tc>
-          <w:tcPr/>
-          <w:p>
-            <w:pPr>
-              <w:pStyle w:val="Compact"/>
-              <w:jc w:val="left"/>
-            </w:pPr>
-            <w:r>
-              <w:t xml:space="preserve">9′</w:t>
+            </w:pPr>
+          </w:p>
+        </w:tc>
+        <w:tc>
+          <w:tcPr/>
+          <w:p>
+            <w:pPr>
+              <w:pStyle w:val="Compact"/>
+              <w:jc w:val="left"/>
+            </w:pPr>
+            <w:r>
+              <w:rPr>
+                <w:bCs/>
+                <w:b/>
+              </w:rPr>
+              <w:t xml:space="preserve">PHỤ LỤC (không trình bày)</w:t>
+            </w:r>
+          </w:p>
+        </w:tc>
+        <w:tc>
+          <w:tcPr/>
+          <w:p>
+            <w:pPr>
+              <w:pStyle w:val="Compact"/>
+            </w:pPr>
+          </w:p>
+        </w:tc>
+        <w:tc>
+          <w:tcPr/>
+          <w:p>
+            <w:pPr>
+              <w:pStyle w:val="Compact"/>
+            </w:pPr>
+          </w:p>
+        </w:tc>
+        <w:tc>
+          <w:tcPr/>
+          <w:p>
+            <w:pPr>
+              <w:pStyle w:val="Compact"/>
+            </w:pPr>
+          </w:p>
+        </w:tc>
+      </w:tr>
+      <w:tr>
+        <w:tc>
+          <w:tcPr/>
+          <w:p>
+            <w:pPr>
+              <w:pStyle w:val="Compact"/>
+              <w:jc w:val="left"/>
+            </w:pPr>
+            <w:r>
+              <w:t xml:space="preserve">24</w:t>
+            </w:r>
+          </w:p>
+        </w:tc>
+        <w:tc>
+          <w:tcPr/>
+          <w:p>
+            <w:pPr>
+              <w:pStyle w:val="Compact"/>
+              <w:jc w:val="left"/>
+            </w:pPr>
+            <w:r>
+              <w:t xml:space="preserve">Phụ lục A: AI lập trình (không trình bày)</w:t>
+            </w:r>
+          </w:p>
+        </w:tc>
+        <w:tc>
+          <w:tcPr/>
+          <w:p>
+            <w:pPr>
+              <w:pStyle w:val="Compact"/>
+              <w:jc w:val="left"/>
+            </w:pPr>
+            <w:r>
+              <w:t xml:space="preserve">PL</w:t>
+            </w:r>
+          </w:p>
+        </w:tc>
+        <w:tc>
+          <w:tcPr/>
+          <w:p>
+            <w:pPr>
+              <w:pStyle w:val="Compact"/>
+              <w:jc w:val="left"/>
+            </w:pPr>
+            <w:r>
+              <w:t xml:space="preserve">–</w:t>
             </w:r>
           </w:p>
         </w:tc>
@@ -1880,31 +2292,31 @@
               <w:jc w:val="left"/>
             </w:pPr>
             <w:r>
-              <w:t xml:space="preserve">24</w:t>
-            </w:r>
-          </w:p>
-        </w:tc>
-        <w:tc>
-          <w:tcPr/>
-          <w:p>
-            <w:pPr>
-              <w:pStyle w:val="Compact"/>
-              <w:jc w:val="left"/>
-            </w:pPr>
-            <w:r>
-              <w:t xml:space="preserve">Phụ lục A: Trí tuệ nhân tạo trong lĩnh vực lập trình</w:t>
-            </w:r>
-          </w:p>
-        </w:tc>
-        <w:tc>
-          <w:tcPr/>
-          <w:p>
-            <w:pPr>
-              <w:pStyle w:val="Compact"/>
-              <w:jc w:val="left"/>
-            </w:pPr>
-            <w:r>
-              <w:t xml:space="preserve">IV</w:t>
+              <w:t xml:space="preserve">25</w:t>
+            </w:r>
+          </w:p>
+        </w:tc>
+        <w:tc>
+          <w:tcPr/>
+          <w:p>
+            <w:pPr>
+              <w:pStyle w:val="Compact"/>
+              <w:jc w:val="left"/>
+            </w:pPr>
+            <w:r>
+              <w:t xml:space="preserve">Phụ lục B: Ví dụ Google và các nhà khoa học dùng AI (không trình bày – dự phòng khi được hỏi)</w:t>
+            </w:r>
+          </w:p>
+        </w:tc>
+        <w:tc>
+          <w:tcPr/>
+          <w:p>
+            <w:pPr>
+              <w:pStyle w:val="Compact"/>
+              <w:jc w:val="left"/>
+            </w:pPr>
+            <w:r>
+              <w:t xml:space="preserve">PL</w:t>
             </w:r>
           </w:p>
         </w:tc>
@@ -1942,31 +2354,31 @@
               <w:jc w:val="left"/>
             </w:pPr>
             <w:r>
-              <w:t xml:space="preserve">25</w:t>
-            </w:r>
-          </w:p>
-        </w:tc>
-        <w:tc>
-          <w:tcPr/>
-          <w:p>
-            <w:pPr>
-              <w:pStyle w:val="Compact"/>
-              <w:jc w:val="left"/>
-            </w:pPr>
-            <w:r>
-              <w:t xml:space="preserve">Phụ lục B: Một số công trình nghiên cứu ứng dụng trí tuệ nhân tạo của Google</w:t>
-            </w:r>
-          </w:p>
-        </w:tc>
-        <w:tc>
-          <w:tcPr/>
-          <w:p>
-            <w:pPr>
-              <w:pStyle w:val="Compact"/>
-              <w:jc w:val="left"/>
-            </w:pPr>
-            <w:r>
-              <w:t xml:space="preserve">IV</w:t>
+              <w:t xml:space="preserve">26</w:t>
+            </w:r>
+          </w:p>
+        </w:tc>
+        <w:tc>
+          <w:tcPr/>
+          <w:p>
+            <w:pPr>
+              <w:pStyle w:val="Compact"/>
+              <w:jc w:val="left"/>
+            </w:pPr>
+            <w:r>
+              <w:t xml:space="preserve">Phụ lục C: Nguồn tham khảo (không trình bày)</w:t>
+            </w:r>
+          </w:p>
+        </w:tc>
+        <w:tc>
+          <w:tcPr/>
+          <w:p>
+            <w:pPr>
+              <w:pStyle w:val="Compact"/>
+              <w:jc w:val="left"/>
+            </w:pPr>
+            <w:r>
+              <w:t xml:space="preserve">PL</w:t>
             </w:r>
           </w:p>
         </w:tc>
@@ -2004,68 +2416,6 @@
               <w:jc w:val="left"/>
             </w:pPr>
             <w:r>
-              <w:t xml:space="preserve">26</w:t>
-            </w:r>
-          </w:p>
-        </w:tc>
-        <w:tc>
-          <w:tcPr/>
-          <w:p>
-            <w:pPr>
-              <w:pStyle w:val="Compact"/>
-              <w:jc w:val="left"/>
-            </w:pPr>
-            <w:r>
-              <w:t xml:space="preserve">Phụ lục C: Tài liệu tham khảo</w:t>
-            </w:r>
-          </w:p>
-        </w:tc>
-        <w:tc>
-          <w:tcPr/>
-          <w:p>
-            <w:pPr>
-              <w:pStyle w:val="Compact"/>
-              <w:jc w:val="left"/>
-            </w:pPr>
-            <w:r>
-              <w:t xml:space="preserve">IV</w:t>
-            </w:r>
-          </w:p>
-        </w:tc>
-        <w:tc>
-          <w:tcPr/>
-          <w:p>
-            <w:pPr>
-              <w:pStyle w:val="Compact"/>
-              <w:jc w:val="left"/>
-            </w:pPr>
-            <w:r>
-              <w:t xml:space="preserve">–</w:t>
-            </w:r>
-          </w:p>
-        </w:tc>
-        <w:tc>
-          <w:tcPr/>
-          <w:p>
-            <w:pPr>
-              <w:pStyle w:val="Compact"/>
-              <w:jc w:val="left"/>
-            </w:pPr>
-            <w:r>
-              <w:t xml:space="preserve">[ ]</w:t>
-            </w:r>
-          </w:p>
-        </w:tc>
-      </w:tr>
-      <w:tr>
-        <w:tc>
-          <w:tcPr/>
-          <w:p>
-            <w:pPr>
-              <w:pStyle w:val="Compact"/>
-              <w:jc w:val="left"/>
-            </w:pPr>
-            <w:r>
               <w:t xml:space="preserve">27</w:t>
             </w:r>
           </w:p>
@@ -2078,19 +2428,19 @@
               <w:jc w:val="left"/>
             </w:pPr>
             <w:r>
-              <w:t xml:space="preserve">Phụ lục D: Dự án minh họa và thư viện kỹ năng khoa học mở</w:t>
-            </w:r>
-          </w:p>
-        </w:tc>
-        <w:tc>
-          <w:tcPr/>
-          <w:p>
-            <w:pPr>
-              <w:pStyle w:val="Compact"/>
-              <w:jc w:val="left"/>
-            </w:pPr>
-            <w:r>
-              <w:t xml:space="preserve">IV</w:t>
+              <w:t xml:space="preserve">Phụ lục D: Dự án và bộ Skill khoa học mở (không trình bày)</w:t>
+            </w:r>
+          </w:p>
+        </w:tc>
+        <w:tc>
+          <w:tcPr/>
+          <w:p>
+            <w:pPr>
+              <w:pStyle w:val="Compact"/>
+              <w:jc w:val="left"/>
+            </w:pPr>
+            <w:r>
+              <w:t xml:space="preserve">PL</w:t>
             </w:r>
           </w:p>
         </w:tc>
@@ -2278,13 +2628,31 @@
     </w:p>
     <w:bookmarkEnd w:id="22"/>
     <w:bookmarkEnd w:id="23"/>
-    <w:bookmarkStart w:id="28" w:name="X1ed5c8284985b3291bd3009e87834ab21691187"/>
+    <w:bookmarkStart w:id="28" w:name="phần-i.-tổng-quan-19-phút"/>
     <w:p>
       <w:pPr>
         <w:pStyle w:val="Heading1"/>
       </w:pPr>
       <w:r>
-        <w:t xml:space="preserve">PHẦN I. TỔNG QUAN VỀ TRÍ TUỆ NHÂN TẠO VÀ XU THẾ CHUYỂN ĐỔI PHƯƠNG THỨC NGHIÊN CỨU KHOA HỌC (19 phút)</w:t>
+        <w:t xml:space="preserve">PHẦN I. TỔNG QUAN (19 phút)</w:t>
+      </w:r>
+    </w:p>
+    <w:p>
+      <w:pPr>
+        <w:pStyle w:val="FirstParagraph"/>
+      </w:pPr>
+      <w:r>
+        <w:rPr>
+          <w:bCs/>
+          <w:b/>
+        </w:rPr>
+        <w:t xml:space="preserve">Trang chuyển phần:</w:t>
+      </w:r>
+      <w:r>
+        <w:t xml:space="preserve"> </w:t>
+      </w:r>
+      <w:r>
+        <w:t xml:space="preserve">tên Phần I · Slide 1–4</w:t>
       </w:r>
     </w:p>
     <w:p>
@@ -2294,13 +2662,13 @@
         </w:pict>
       </w:r>
     </w:p>
-    <w:bookmarkStart w:id="24" w:name="X7013140f8b02d6d1eeb11339317c50a357329ac"/>
+    <w:bookmarkStart w:id="24" w:name="X5e2791cf2fb76533d937191050fe8e8749ccf3d"/>
     <w:p>
       <w:pPr>
         <w:pStyle w:val="Heading2"/>
       </w:pPr>
       <w:r>
-        <w:t xml:space="preserve">Slide 1 – Tốc độ phát triển của trí tuệ nhân tạo giai đoạn 2019–2026 (4′)</w:t>
+        <w:t xml:space="preserve">Slide 1 – AI phát triển nhanh đến mức nào: những con số mới nhất (4′)</w:t>
       </w:r>
     </w:p>
     <w:p>
@@ -2624,13 +2992,13 @@
       </w:r>
     </w:p>
     <w:bookmarkEnd w:id="24"/>
-    <w:bookmarkStart w:id="25" w:name="X902da8d4261dd07b849e284e5a068515d1a02fb"/>
+    <w:bookmarkStart w:id="25" w:name="X994b28678e20557dbcc0e00066897a30c6e7b31"/>
     <w:p>
       <w:pPr>
         <w:pStyle w:val="Heading2"/>
       </w:pPr>
       <w:r>
-        <w:t xml:space="preserve">Slide 2 – Ứng dụng trí tuệ nhân tạo trong nghiên cứu khoa học trên thế giới và ở Việt Nam (5′)</w:t>
+        <w:t xml:space="preserve">Slide 2 – AI trong khoa học: ví dụ quốc tế và Việt Nam (5′)</w:t>
       </w:r>
     </w:p>
     <w:p>
@@ -3031,13 +3399,13 @@
       </w:r>
     </w:p>
     <w:bookmarkEnd w:id="25"/>
-    <w:bookmarkStart w:id="26" w:name="Xa6c8c956c17fdf3bc75de32f02b3b6ea3c90b09"/>
+    <w:bookmarkStart w:id="26" w:name="Xadbfb030a8db414f49527c469921dc167a20dca"/>
     <w:p>
       <w:pPr>
         <w:pStyle w:val="Heading2"/>
       </w:pPr>
       <w:r>
-        <w:t xml:space="preserve">Slide 3 – Năng lực cốt lõi và các tính năng mới của tác tử trí tuệ nhân tạo (AI Agent) (6′)</w:t>
+        <w:t xml:space="preserve">Slide 3 – Năng lực cốt lõi và tính năng mới của AI Agent (6′)</w:t>
       </w:r>
     </w:p>
     <w:p>
@@ -3814,13 +4182,13 @@
       </w:r>
     </w:p>
     <w:bookmarkEnd w:id="26"/>
-    <w:bookmarkStart w:id="27" w:name="Xec41b5f8f99d4871d87991256bbff0a89ccea3c"/>
+    <w:bookmarkStart w:id="27" w:name="Xca35d572d693031c60afab96fdfbb1edf71dff5"/>
     <w:p>
       <w:pPr>
         <w:pStyle w:val="Heading2"/>
       </w:pPr>
       <w:r>
-        <w:t xml:space="preserve">Slide 4 – Xu thế chuyển đổi phương thức nghiên cứu khoa học dưới tác động của trí tuệ nhân tạo (4′)</w:t>
+        <w:t xml:space="preserve">Slide 4 – Phương thức nghiên cứu đang thay đổi: từ thao tác thủ công đến quy trình liên tục (4′)</w:t>
       </w:r>
     </w:p>
     <w:p>
@@ -4102,13 +4470,31 @@
     </w:p>
     <w:bookmarkEnd w:id="27"/>
     <w:bookmarkEnd w:id="28"/>
-    <w:bookmarkStart w:id="36" w:name="X78f523f0ac5ed6cdc75b0f5213867ebcbd00bb3"/>
+    <w:bookmarkStart w:id="36" w:name="Xe6e19048329e4f9c57419e683206ceaf5f98434"/>
     <w:p>
       <w:pPr>
         <w:pStyle w:val="Heading1"/>
       </w:pPr>
       <w:r>
-        <w:t xml:space="preserve">PHẦN II. LỰA CHỌN, KHAI THÁC VÀ SỬ DỤNG CÔNG CỤ TRÍ TUỆ NHÂN TẠO (35 phút)</w:t>
+        <w:t xml:space="preserve">PHẦN II. LỰA CHỌN VÀ SỬ DỤNG CÔNG CỤ AI PHÙ HỢP (35 phút)</w:t>
+      </w:r>
+    </w:p>
+    <w:p>
+      <w:pPr>
+        <w:pStyle w:val="FirstParagraph"/>
+      </w:pPr>
+      <w:r>
+        <w:rPr>
+          <w:bCs/>
+          <w:b/>
+        </w:rPr>
+        <w:t xml:space="preserve">Trang chuyển phần:</w:t>
+      </w:r>
+      <w:r>
+        <w:t xml:space="preserve"> </w:t>
+      </w:r>
+      <w:r>
+        <w:t xml:space="preserve">tên Phần II · Slide 5–11</w:t>
       </w:r>
     </w:p>
     <w:p>
@@ -4118,13 +4504,13 @@
         </w:pict>
       </w:r>
     </w:p>
-    <w:bookmarkStart w:id="29" w:name="X0a67c866dd10f35ef9b59a4e05d59d716eccca2"/>
+    <w:bookmarkStart w:id="29" w:name="Xf478361b239b1c542bc0de4be4e80db6f7cbc3f"/>
     <w:p>
       <w:pPr>
         <w:pStyle w:val="Heading2"/>
       </w:pPr>
       <w:r>
-        <w:t xml:space="preserve">Slide 5 – Phân loại công việc nghiên cứu và lựa chọn công cụ trí tuệ nhân tạo phù hợp (5′)</w:t>
+        <w:t xml:space="preserve">Slide 5 – Chọn đúng công cụ: việc nào dùng chatbot, việc nào cần AI Agent (5′)</w:t>
       </w:r>
     </w:p>
     <w:p>
@@ -4541,13 +4927,13 @@
       </w:r>
     </w:p>
     <w:bookmarkEnd w:id="29"/>
-    <w:bookmarkStart w:id="30" w:name="X4556bdbf68bfa1bd5383d46576ac2c2ae7e5c55"/>
+    <w:bookmarkStart w:id="30" w:name="X5733276d07a97894b7ef5c30fb8f70c96b52f27"/>
     <w:p>
       <w:pPr>
         <w:pStyle w:val="Heading2"/>
       </w:pPr>
       <w:r>
-        <w:t xml:space="preserve">Slide 6 – Các công cụ trí tuệ nhân tạo thông dụng: chức năng và phạm vi sử dụng (4′)</w:t>
+        <w:t xml:space="preserve">Slide 6 – Các công cụ AI phổ biến và vai trò của từng loại (4′)</w:t>
       </w:r>
     </w:p>
     <w:p>
@@ -5017,13 +5403,13 @@
       </w:r>
     </w:p>
     <w:bookmarkEnd w:id="30"/>
-    <w:bookmarkStart w:id="31" w:name="X15a711178b1d79d27ffa43c90cd11b37dfa5ae5"/>
+    <w:bookmarkStart w:id="31" w:name="X3cdee8486a783c12ce5155f39202b5659e1017c"/>
     <w:p>
       <w:pPr>
         <w:pStyle w:val="Heading2"/>
       </w:pPr>
       <w:r>
-        <w:t xml:space="preserve">Slide 7 – Giới thiệu hệ thống Claude: mô hình, gói dịch vụ và tính năng trên nền tảng Windows (7′)</w:t>
+        <w:t xml:space="preserve">Slide 7 – Giới thiệu Claude: mô hình, gói dịch vụ và tính năng nổi bật trên Windows (7′)</w:t>
       </w:r>
     </w:p>
     <w:p>
@@ -5905,13 +6291,13 @@
       </w:r>
     </w:p>
     <w:bookmarkEnd w:id="31"/>
-    <w:bookmarkStart w:id="32" w:name="X26959583b21ad955b55d465affd0632a05b2a70"/>
+    <w:bookmarkStart w:id="32" w:name="Xcfe02677acd48312f1a8c3116105c2513a1aa6a"/>
     <w:p>
       <w:pPr>
         <w:pStyle w:val="Heading2"/>
       </w:pPr>
       <w:r>
-        <w:t xml:space="preserve">Slide 8 – Quy trình khai thác, sử dụng cơ bản hệ thống Claude (7′)</w:t>
+        <w:t xml:space="preserve">Slide 8 – Bắt đầu với Claude: 6 bước đầu tiên và tổng hợp dữ liệu nhiều nguồn (7′)</w:t>
       </w:r>
     </w:p>
     <w:p>
@@ -6978,13 +7364,13 @@
       </w:r>
     </w:p>
     <w:bookmarkEnd w:id="32"/>
-    <w:bookmarkStart w:id="33" w:name="Xc455ddbf0e201b31851ae10fcdbf3478b01bf57"/>
+    <w:bookmarkStart w:id="33" w:name="Xd9d0d6b663c0b8154825a4c4a283f7a088a8679"/>
     <w:p>
       <w:pPr>
         <w:pStyle w:val="Heading2"/>
       </w:pPr>
       <w:r>
-        <w:t xml:space="preserve">Slide 9 – Phương pháp giao nhiệm vụ cho tác tử trí tuệ nhân tạo (6′)</w:t>
+        <w:t xml:space="preserve">Slide 9 – Giao việc cho AI Agent: cách viết yêu cầu 5 bước (6′)</w:t>
       </w:r>
     </w:p>
     <w:p>
@@ -7346,13 +7732,13 @@
       </w:r>
     </w:p>
     <w:bookmarkEnd w:id="33"/>
-    <w:bookmarkStart w:id="34" w:name="Xdadf4c3cd5093f090a2477e16d0023b11fe0dae"/>
+    <w:bookmarkStart w:id="34" w:name="X0b923a1a013338280d796ef2440c703039fcd56"/>
     <w:p>
       <w:pPr>
         <w:pStyle w:val="Heading2"/>
       </w:pPr>
       <w:r>
-        <w:t xml:space="preserve">Slide 10 – Tổ chức không gian làm việc theo từng nhiệm vụ khoa học và công nghệ (3′)</w:t>
+        <w:t xml:space="preserve">Slide 10 – Không gian làm việc nghiên cứu: mỗi nhiệm vụ một dự án (3′)</w:t>
       </w:r>
     </w:p>
     <w:p>
@@ -7717,7 +8103,7 @@
         <w:rPr>
           <w:rStyle w:val="VerbatimChar"/>
         </w:rPr>
-        <w:t xml:space="preserve">├── 06-bai-bao/              ← bản thảo bài báo                                             (Slide 18)</w:t>
+        <w:t xml:space="preserve">├── 06-bai-bao/              ← bản thảo bài báo                                             (Slide 17)</w:t>
       </w:r>
       <w:r>
         <w:br/>
@@ -7810,13 +8196,13 @@
       </w:r>
     </w:p>
     <w:bookmarkEnd w:id="34"/>
-    <w:bookmarkStart w:id="35" w:name="Xfe3677891e3e35009708b748a26f096f4e00abd"/>
+    <w:bookmarkStart w:id="35" w:name="X72d5b3d824d06bc2d977fb724c6ea11fcd5ac43"/>
     <w:p>
       <w:pPr>
         <w:pStyle w:val="Heading2"/>
       </w:pPr>
       <w:r>
-        <w:t xml:space="preserve">Slide 11 – Kỹ năng (Skill), tác tử con (Subagent) và hệ đa tác tử (3′) –</w:t>
+        <w:t xml:space="preserve">Slide 11 – Skill, Subagent và hệ thống nhiều Agent (3′) –</w:t>
       </w:r>
       <w:r>
         <w:t xml:space="preserve"> </w:t>
@@ -8029,13 +8415,31 @@
     </w:p>
     <w:bookmarkEnd w:id="35"/>
     <w:bookmarkEnd w:id="36"/>
-    <w:bookmarkStart w:id="45" w:name="Xebbffa673623344b085dcb7a665cec729593ad9"/>
+    <w:bookmarkStart w:id="44" w:name="X69b1f55d32cec84c0ec78960410c4370761b2a6"/>
     <w:p>
       <w:pPr>
         <w:pStyle w:val="Heading1"/>
       </w:pPr>
       <w:r>
-        <w:t xml:space="preserve">PHẦN III. ỨNG DỤNG TÁC TỬ TRÍ TUỆ NHÂN TẠO TRONG CHU TRÌNH THỰC HIỆN NHIỆM VỤ KHOA HỌC VÀ CÔNG NGHỆ (42 phút)</w:t>
+        <w:t xml:space="preserve">PHẦN III. AI AGENT TRONG VÒNG ĐỜI NHIỆM VỤ KHOA HỌC (37 phút)</w:t>
+      </w:r>
+    </w:p>
+    <w:p>
+      <w:pPr>
+        <w:pStyle w:val="FirstParagraph"/>
+      </w:pPr>
+      <w:r>
+        <w:rPr>
+          <w:bCs/>
+          <w:b/>
+        </w:rPr>
+        <w:t xml:space="preserve">Trang chuyển phần:</w:t>
+      </w:r>
+      <w:r>
+        <w:t xml:space="preserve"> </w:t>
+      </w:r>
+      <w:r>
+        <w:t xml:space="preserve">tên Phần III · Slide 12–18</w:t>
       </w:r>
     </w:p>
     <w:p>
@@ -8056,7 +8460,7 @@
         <w:t xml:space="preserve">bắt đầu ngay bằng tìm khoảng trống nghiên cứu</w:t>
       </w:r>
       <w:r>
-        <w:t xml:space="preserve">; slide tổng quan vòng đời chuyển xuống cuối phần (Slide 19) để tổng kết.</w:t>
+        <w:t xml:space="preserve">; slide tổng quan vòng đời chuyển xuống cuối phần (Slide 18) để tổng kết.</w:t>
       </w:r>
       <w:r>
         <w:t xml:space="preserve"> </w:t>
@@ -8101,13 +8505,13 @@
         </w:pict>
       </w:r>
     </w:p>
-    <w:bookmarkStart w:id="37" w:name="X3a80e774d37a3c7a38b4880083f454ebfb3b8a0"/>
+    <w:bookmarkStart w:id="37" w:name="Xd43c46c008d9e4d8849a930e96bda6326ea0cf0"/>
     <w:p>
       <w:pPr>
         <w:pStyle w:val="Heading2"/>
       </w:pPr>
       <w:r>
-        <w:t xml:space="preserve">Slide 12 – Tổng quan tài liệu và xác định khoảng trống nghiên cứu (7′)</w:t>
+        <w:t xml:space="preserve">Slide 12 – Tổng quan tài liệu: từ bài báo đến khoảng trống nghiên cứu (7′)</w:t>
       </w:r>
     </w:p>
     <w:p>
@@ -8839,13 +9243,13 @@
       </w:r>
     </w:p>
     <w:bookmarkEnd w:id="37"/>
-    <w:bookmarkStart w:id="38" w:name="X432cfee3380cd7d01956eed8431b30ccb3bc4f2"/>
+    <w:bookmarkStart w:id="38" w:name="Xc8ba032270c9c569ced786dfca8e096c44633e5"/>
     <w:p>
       <w:pPr>
         <w:pStyle w:val="Heading2"/>
       </w:pPr>
       <w:r>
-        <w:t xml:space="preserve">Slide 13 – Xây dựng phiếu đề xuất và thuyết minh nhiệm vụ – Minh họa thực nghiệm 1 (7′)</w:t>
+        <w:t xml:space="preserve">Slide 13 – Đề xuất nhiệm vụ: từ khoảng trống đến phiếu đề xuất và thuyết minh – DEMO 1 (7′)</w:t>
       </w:r>
     </w:p>
     <w:p>
@@ -9079,13 +9483,13 @@
       </w:r>
     </w:p>
     <w:bookmarkEnd w:id="38"/>
-    <w:bookmarkStart w:id="39" w:name="X95dcb3ab3b718a7b0ac24417c75b4156c3eac0f"/>
+    <w:bookmarkStart w:id="39" w:name="Xa112d2126c8edb8d7894d1b2ddf73023b5298a3"/>
     <w:p>
       <w:pPr>
         <w:pStyle w:val="Heading2"/>
       </w:pPr>
       <w:r>
-        <w:t xml:space="preserve">Slide 14 – Lập kế hoạch tiến độ và dự toán kinh phí theo biểu mẫu của Trung tâm (5′)</w:t>
+        <w:t xml:space="preserve">Slide 14 – Hồ sơ nhiệm vụ: thuyết minh, tiến độ và kinh phí theo biểu mẫu Trung tâm (5′)</w:t>
       </w:r>
     </w:p>
     <w:p>
@@ -9315,13 +9719,13 @@
       </w:r>
     </w:p>
     <w:bookmarkEnd w:id="39"/>
-    <w:bookmarkStart w:id="40" w:name="X4faca6bc140feef6ad7b67488b404483a9e374c"/>
+    <w:bookmarkStart w:id="40" w:name="Xe2df8c0ff55655febd02bc94b617eccf50b4b2e"/>
     <w:p>
       <w:pPr>
         <w:pStyle w:val="Heading2"/>
       </w:pPr>
       <w:r>
-        <w:t xml:space="preserve">Slide 15 – Xử lý, phân tích số liệu thực nghiệm bằng mã nguồn Python – Minh họa thực nghiệm 2 (8′)</w:t>
+        <w:t xml:space="preserve">Slide 15 – Xử lý dữ liệu: AI viết và chạy mã Python – DEMO 2 (8′)</w:t>
       </w:r>
     </w:p>
     <w:p>
@@ -9623,13 +10027,13 @@
       </w:r>
     </w:p>
     <w:bookmarkEnd w:id="40"/>
-    <w:bookmarkStart w:id="41" w:name="Xf9c051b601e36b6350d2ea88b27b43c13b7c1c4"/>
+    <w:bookmarkStart w:id="41" w:name="X6b28836b621772ec8296339c72bace8e2eb8206"/>
     <w:p>
       <w:pPr>
         <w:pStyle w:val="Heading2"/>
       </w:pPr>
       <w:r>
-        <w:t xml:space="preserve">Slide 16 – Mô hình hóa 3D quá trình ăn mòn khí quyển của vật liệu kim loại (3′)</w:t>
+        <w:t xml:space="preserve">Slide 16 – Mô hình 3D: mô phỏng quá trình ăn mòn vật liệu theo thời gian (3′)</w:t>
       </w:r>
     </w:p>
     <w:p>
@@ -10206,13 +10610,13 @@
       </w:r>
     </w:p>
     <w:bookmarkEnd w:id="41"/>
-    <w:bookmarkStart w:id="42" w:name="Xeb9c0b2b50c44e43205db45f461d6cdcf353e85"/>
+    <w:bookmarkStart w:id="42" w:name="X9dd84735f9bde2aa6768557122fd994d207bc80"/>
     <w:p>
       <w:pPr>
         <w:pStyle w:val="Heading2"/>
       </w:pPr>
       <w:r>
-        <w:t xml:space="preserve">Slide 17 – Xây dựng công cụ xử lý dữ liệu trên máy tính không kết nối Internet đối với nhiệm vụ có nội dung bí mật – Minh họa thực nghiệm 3 (5′)</w:t>
+        <w:t xml:space="preserve">Slide 17 – Công bố kết quả: bài báo và báo cáo tổng hợp theo nhiều định dạng (5′)</w:t>
       </w:r>
     </w:p>
     <w:p>
@@ -10230,17 +10634,17 @@
         <w:t xml:space="preserve"> </w:t>
       </w:r>
       <w:r>
-        <w:t xml:space="preserve">-</w:t>
-      </w:r>
-      <w:r>
-        <w:t xml:space="preserve"> </w:t>
-      </w:r>
-      <w:r>
-        <w:rPr>
-          <w:bCs/>
-          <w:b/>
-        </w:rPr>
-        <w:t xml:space="preserve">Nguyên tắc: AI viết công cụ – AI không bao giờ thấy dữ liệu thật</w:t>
+        <w:t xml:space="preserve">- 🆕</w:t>
+      </w:r>
+      <w:r>
+        <w:t xml:space="preserve"> </w:t>
+      </w:r>
+      <w:r>
+        <w:rPr>
+          <w:bCs/>
+          <w:b/>
+        </w:rPr>
+        <w:t xml:space="preserve">Một kết quả – nhiều định dạng công bố:</w:t>
       </w:r>
     </w:p>
     <w:tbl>
@@ -10267,266 +10671,265 @@
               <w:jc w:val="left"/>
             </w:pPr>
             <w:r>
-              <w:t xml:space="preserve">Máy có Internet (dùng AI)</w:t>
-            </w:r>
-          </w:p>
-        </w:tc>
-        <w:tc>
-          <w:tcPr/>
-          <w:p>
-            <w:pPr>
-              <w:pStyle w:val="Compact"/>
-            </w:pPr>
-          </w:p>
-        </w:tc>
-        <w:tc>
-          <w:tcPr/>
-          <w:p>
-            <w:pPr>
-              <w:pStyle w:val="Compact"/>
-              <w:jc w:val="left"/>
-            </w:pPr>
-            <w:r>
-              <w:t xml:space="preserve">Máy không Internet (dữ liệu mật)</w:t>
-            </w:r>
-          </w:p>
-        </w:tc>
-      </w:tr>
-      <w:tr>
-        <w:tc>
-          <w:tcPr/>
-          <w:p>
-            <w:pPr>
-              <w:pStyle w:val="Compact"/>
-              <w:jc w:val="left"/>
-            </w:pPr>
-            <w:r>
-              <w:t xml:space="preserve">1. Chỉ mô tả</w:t>
-            </w:r>
-            <w:r>
-              <w:t xml:space="preserve"> </w:t>
-            </w:r>
+              <w:t xml:space="preserve">Đích công bố</w:t>
+            </w:r>
+          </w:p>
+        </w:tc>
+        <w:tc>
+          <w:tcPr/>
+          <w:p>
+            <w:pPr>
+              <w:pStyle w:val="Compact"/>
+              <w:jc w:val="left"/>
+            </w:pPr>
+            <w:r>
+              <w:t xml:space="preserve">Yêu cầu đặc thù AI cần làm theo</w:t>
+            </w:r>
+          </w:p>
+        </w:tc>
+        <w:tc>
+          <w:tcPr/>
+          <w:p>
+            <w:pPr>
+              <w:pStyle w:val="Compact"/>
+              <w:jc w:val="left"/>
+            </w:pPr>
+            <w:r>
+              <w:t xml:space="preserve">Ví dụ tạp chí (kiểm tra danh mục hiện hành)</w:t>
+            </w:r>
+          </w:p>
+        </w:tc>
+      </w:tr>
+      <w:tr>
+        <w:tc>
+          <w:tcPr/>
+          <w:p>
+            <w:pPr>
+              <w:pStyle w:val="Compact"/>
+              <w:jc w:val="left"/>
+            </w:pPr>
             <w:r>
               <w:rPr>
                 <w:bCs/>
                 <w:b/>
               </w:rPr>
-              <w:t xml:space="preserve">cấu trúc</w:t>
+              <w:t xml:space="preserve">Scopus / Web of Science</w:t>
+            </w:r>
+          </w:p>
+        </w:tc>
+        <w:tc>
+          <w:tcPr/>
+          <w:p>
+            <w:pPr>
+              <w:pStyle w:val="Compact"/>
+              <w:jc w:val="left"/>
+            </w:pPr>
+            <w:r>
+              <w:t xml:space="preserve">Theo</w:t>
             </w:r>
             <w:r>
               <w:t xml:space="preserve"> </w:t>
             </w:r>
             <w:r>
-              <w:t xml:space="preserve">dữ liệu (tên cột, đơn vị)</w:t>
-            </w:r>
-          </w:p>
-        </w:tc>
-        <w:tc>
-          <w:tcPr/>
-          <w:p>
-            <w:pPr>
-              <w:pStyle w:val="Compact"/>
-            </w:pPr>
-          </w:p>
-        </w:tc>
-        <w:tc>
-          <w:tcPr/>
-          <w:p>
-            <w:pPr>
-              <w:pStyle w:val="Compact"/>
-            </w:pPr>
-          </w:p>
-        </w:tc>
-      </w:tr>
-      <w:tr>
-        <w:tc>
-          <w:tcPr/>
-          <w:p>
-            <w:pPr>
-              <w:pStyle w:val="Compact"/>
-              <w:jc w:val="left"/>
-            </w:pPr>
-            <w:r>
-              <w:t xml:space="preserve">2. AI viết công cụ, sinh</w:t>
+              <w:t xml:space="preserve">“</w:t>
+            </w:r>
+            <w:r>
+              <w:t xml:space="preserve">Hướng dẫn tác giả</w:t>
+            </w:r>
+            <w:r>
+              <w:t xml:space="preserve">”</w:t>
             </w:r>
             <w:r>
               <w:t xml:space="preserve"> </w:t>
             </w:r>
+            <w:r>
+              <w:t xml:space="preserve">của từng tạp chí: cấu trúc IMRaD, tóm tắt có cấu trúc, highlights, khai báo dữ liệu, khai báo dùng AI, đóng góp tác giả</w:t>
+            </w:r>
+          </w:p>
+        </w:tc>
+        <w:tc>
+          <w:tcPr/>
+          <w:p>
+            <w:pPr>
+              <w:pStyle w:val="Compact"/>
+              <w:jc w:val="left"/>
+            </w:pPr>
+            <w:r>
+              <w:t xml:space="preserve">Corrosion Science; Materials and Corrosion; npj Materials Degradation; Protection of Metals and Physical Chemistry of Surfaces</w:t>
+            </w:r>
+          </w:p>
+        </w:tc>
+      </w:tr>
+      <w:tr>
+        <w:tc>
+          <w:tcPr/>
+          <w:p>
+            <w:pPr>
+              <w:pStyle w:val="Compact"/>
+              <w:jc w:val="left"/>
+            </w:pPr>
             <w:r>
               <w:rPr>
                 <w:bCs/>
                 <w:b/>
               </w:rPr>
-              <w:t xml:space="preserve">dữ liệu giả</w:t>
-            </w:r>
-            <w:r>
-              <w:t xml:space="preserve">, chạy thử</w:t>
-            </w:r>
-          </w:p>
-        </w:tc>
-        <w:tc>
-          <w:tcPr/>
-          <w:p>
-            <w:pPr>
-              <w:pStyle w:val="Compact"/>
-            </w:pPr>
-          </w:p>
-        </w:tc>
-        <w:tc>
-          <w:tcPr/>
-          <w:p>
-            <w:pPr>
-              <w:pStyle w:val="Compact"/>
-            </w:pPr>
-          </w:p>
-        </w:tc>
-      </w:tr>
-      <w:tr>
-        <w:tc>
-          <w:tcPr/>
-          <w:p>
-            <w:pPr>
-              <w:pStyle w:val="Compact"/>
-              <w:jc w:val="left"/>
-            </w:pPr>
-            <w:r>
-              <w:t xml:space="preserve">3. Nhà khoa học đọc mã;</w:t>
-            </w:r>
-            <w:r>
-              <w:t xml:space="preserve"> </w:t>
-            </w:r>
+              <w:t xml:space="preserve">Danh mục ВАК (Nga)</w:t>
+            </w:r>
+          </w:p>
+        </w:tc>
+        <w:tc>
+          <w:tcPr/>
+          <w:p>
+            <w:pPr>
+              <w:pStyle w:val="Compact"/>
+              <w:jc w:val="left"/>
+            </w:pPr>
+            <w:r>
+              <w:t xml:space="preserve">Mã УДК; tóm tắt và từ khóa tiếng Nga + tiếng Anh; tài liệu tham khảo theo ГОСТ Р 7.0.5-2008 (theo quy định từng tạp chí); danh mục chia nhóm К1–К3</w:t>
+            </w:r>
+          </w:p>
+        </w:tc>
+        <w:tc>
+          <w:tcPr/>
+          <w:p>
+            <w:pPr>
+              <w:pStyle w:val="Compact"/>
+              <w:jc w:val="left"/>
+            </w:pPr>
+            <w:r>
+              <w:t xml:space="preserve">Физикохимия поверхности и защита материалов; Коррозия: материалы, защита</w:t>
+            </w:r>
+          </w:p>
+        </w:tc>
+      </w:tr>
+      <w:tr>
+        <w:tc>
+          <w:tcPr/>
+          <w:p>
+            <w:pPr>
+              <w:pStyle w:val="Compact"/>
+              <w:jc w:val="left"/>
+            </w:pPr>
             <w:r>
               <w:rPr>
                 <w:bCs/>
                 <w:b/>
               </w:rPr>
-              <w:t xml:space="preserve">quét mã</w:t>
+              <w:t xml:space="preserve">Ei Compendex</w:t>
             </w:r>
             <w:r>
               <w:t xml:space="preserve"> </w:t>
             </w:r>
             <w:r>
-              <w:t xml:space="preserve">– không có kết nối mạng</w:t>
-            </w:r>
-          </w:p>
-        </w:tc>
-        <w:tc>
-          <w:tcPr/>
-          <w:p>
-            <w:pPr>
-              <w:pStyle w:val="Compact"/>
-            </w:pPr>
-          </w:p>
-        </w:tc>
-        <w:tc>
-          <w:tcPr/>
-          <w:p>
-            <w:pPr>
-              <w:pStyle w:val="Compact"/>
-            </w:pPr>
-          </w:p>
-        </w:tc>
-      </w:tr>
-      <w:tr>
-        <w:tc>
-          <w:tcPr/>
-          <w:p>
-            <w:pPr>
-              <w:pStyle w:val="Compact"/>
-              <w:jc w:val="left"/>
-            </w:pPr>
-            <w:r>
-              <w:t xml:space="preserve">4. Đóng gói +</w:t>
-            </w:r>
-            <w:r>
-              <w:t xml:space="preserve"> </w:t>
-            </w:r>
+              <w:t xml:space="preserve">(kỹ thuật)</w:t>
+            </w:r>
+          </w:p>
+        </w:tc>
+        <w:tc>
+          <w:tcPr/>
+          <w:p>
+            <w:pPr>
+              <w:pStyle w:val="Compact"/>
+              <w:jc w:val="left"/>
+            </w:pPr>
+            <w:r>
+              <w:t xml:space="preserve">Như Scopus; nhấn mạnh ứng dụng kỹ thuật</w:t>
+            </w:r>
+          </w:p>
+        </w:tc>
+        <w:tc>
+          <w:tcPr/>
+          <w:p>
+            <w:pPr>
+              <w:pStyle w:val="Compact"/>
+              <w:jc w:val="left"/>
+            </w:pPr>
+            <w:r>
+              <w:t xml:space="preserve">Kiểm tra tạp chí trong danh mục Ei</w:t>
+            </w:r>
+          </w:p>
+        </w:tc>
+      </w:tr>
+      <w:tr>
+        <w:tc>
+          <w:tcPr/>
+          <w:p>
+            <w:pPr>
+              <w:pStyle w:val="Compact"/>
+              <w:jc w:val="left"/>
+            </w:pPr>
             <w:r>
               <w:rPr>
                 <w:bCs/>
                 <w:b/>
               </w:rPr>
-              <w:t xml:space="preserve">mã băm SHA-256</w:t>
-            </w:r>
-          </w:p>
-        </w:tc>
-        <w:tc>
-          <w:tcPr/>
-          <w:p>
-            <w:pPr>
-              <w:pStyle w:val="Compact"/>
-              <w:jc w:val="left"/>
-            </w:pPr>
-            <w:r>
-              <w:t xml:space="preserve">➜ chuyển theo quy định ➜</w:t>
-            </w:r>
-          </w:p>
-        </w:tc>
-        <w:tc>
-          <w:tcPr/>
-          <w:p>
-            <w:pPr>
-              <w:pStyle w:val="Compact"/>
-              <w:jc w:val="left"/>
-            </w:pPr>
-            <w:r>
-              <w:t xml:space="preserve">5. Đối chiếu mã băm → chạy với</w:t>
-            </w:r>
-            <w:r>
-              <w:t xml:space="preserve"> </w:t>
-            </w:r>
+              <w:t xml:space="preserve">Tạp chí trong nước</w:t>
+            </w:r>
+          </w:p>
+        </w:tc>
+        <w:tc>
+          <w:tcPr/>
+          <w:p>
+            <w:pPr>
+              <w:pStyle w:val="Compact"/>
+              <w:jc w:val="left"/>
+            </w:pPr>
+            <w:r>
+              <w:t xml:space="preserve">Theo thể lệ tạp chí; danh mục Hội đồng Giáo sư Nhà nước</w:t>
+            </w:r>
+          </w:p>
+        </w:tc>
+        <w:tc>
+          <w:tcPr/>
+          <w:p>
+            <w:pPr>
+              <w:pStyle w:val="Compact"/>
+              <w:jc w:val="left"/>
+            </w:pPr>
+            <w:r>
+              <w:t xml:space="preserve">Tạp chí Khoa học và Công nghệ nhiệt đới (ISSN 0866-7535)</w:t>
+            </w:r>
+          </w:p>
+        </w:tc>
+      </w:tr>
+      <w:tr>
+        <w:tc>
+          <w:tcPr/>
+          <w:p>
+            <w:pPr>
+              <w:pStyle w:val="Compact"/>
+              <w:jc w:val="left"/>
+            </w:pPr>
             <w:r>
               <w:rPr>
                 <w:bCs/>
                 <w:b/>
               </w:rPr>
-              <w:t xml:space="preserve">dữ liệu thật</w:t>
-            </w:r>
-          </w:p>
-        </w:tc>
-      </w:tr>
-      <w:tr>
-        <w:tc>
-          <w:tcPr/>
-          <w:p>
-            <w:pPr>
-              <w:pStyle w:val="Compact"/>
-            </w:pPr>
-          </w:p>
-        </w:tc>
-        <w:tc>
-          <w:tcPr/>
-          <w:p>
-            <w:pPr>
-              <w:pStyle w:val="Compact"/>
-            </w:pPr>
-          </w:p>
-        </w:tc>
-        <w:tc>
-          <w:tcPr/>
-          <w:p>
-            <w:pPr>
-              <w:pStyle w:val="Compact"/>
-              <w:jc w:val="left"/>
-            </w:pPr>
-            <w:r>
-              <w:t xml:space="preserve">6. Kết quả</w:t>
-            </w:r>
-            <w:r>
-              <w:t xml:space="preserve"> </w:t>
-            </w:r>
-            <w:r>
-              <w:rPr>
-                <w:bCs/>
-                <w:b/>
-              </w:rPr>
-              <w:t xml:space="preserve">ở lại</w:t>
-            </w:r>
-            <w:r>
-              <w:t xml:space="preserve"> </w:t>
-            </w:r>
-            <w:r>
-              <w:t xml:space="preserve">máy này</w:t>
+              <w:t xml:space="preserve">Báo cáo của Trung tâm</w:t>
+            </w:r>
+          </w:p>
+        </w:tc>
+        <w:tc>
+          <w:tcPr/>
+          <w:p>
+            <w:pPr>
+              <w:pStyle w:val="Compact"/>
+              <w:jc w:val="left"/>
+            </w:pPr>
+            <w:r>
+              <w:t xml:space="preserve">Biểu mẫu báo cáo tổng hợp kết quả, Mẫu 21, 22</w:t>
+            </w:r>
+          </w:p>
+        </w:tc>
+        <w:tc>
+          <w:tcPr/>
+          <w:p>
+            <w:pPr>
+              <w:pStyle w:val="Compact"/>
+              <w:jc w:val="left"/>
+            </w:pPr>
+            <w:r>
+              <w:t xml:space="preserve">Biểu mẫu Trung tâm</w:t>
             </w:r>
           </w:p>
         </w:tc>
@@ -10538,151 +10941,61 @@
           <w:ilvl w:val="0"/>
           <w:numId w:val="1005"/>
         </w:numPr>
-        <w:pStyle w:val="Compact"/>
-      </w:pPr>
-      <w:r>
-        <w:t xml:space="preserve">🧪</w:t>
-      </w:r>
-      <w:r>
-        <w:t xml:space="preserve"> </w:t>
-      </w:r>
-      <w:r>
-        <w:rPr>
-          <w:bCs/>
-          <w:b/>
-        </w:rPr>
-        <w:t xml:space="preserve">Ví dụ:</w:t>
-      </w:r>
-      <w:r>
-        <w:t xml:space="preserve"> </w:t>
-      </w:r>
-      <w:r>
-        <w:rPr>
-          <w:iCs/>
-          <w:i/>
-        </w:rPr>
-        <w:t xml:space="preserve">Ảnh hưởng của địa hình và khí hậu nhiệt đới đến lộ trình của thiết bị bay không người lái</w:t>
-      </w:r>
-      <w:r>
-        <w:t xml:space="preserve"> </w:t>
-      </w:r>
-      <w:r>
-        <w:t xml:space="preserve">– công cụ tìm lộ trình tốn ít năng lượng nhất, tránh núi cao, ổ mưa dông, gió mạnh; tính ảnh hưởng của gió, mưa, nhiệt độ – độ ẩm, leo cao</w:t>
+      </w:pPr>
+      <w:r>
+        <w:t xml:space="preserve">⌨</w:t>
+      </w:r>
+      <w:r>
+        <w:t xml:space="preserve"> </w:t>
+      </w:r>
+      <w:r>
+        <w:rPr>
+          <w:bCs/>
+          <w:b/>
+        </w:rPr>
+        <w:t xml:space="preserve">Câu lệnh:</w:t>
       </w:r>
     </w:p>
     <w:p>
       <w:pPr>
         <w:numPr>
           <w:ilvl w:val="0"/>
-          <w:numId w:val="1005"/>
+          <w:numId w:val="1000"/>
         </w:numPr>
-        <w:pStyle w:val="Compact"/>
-      </w:pPr>
-      <w:r>
-        <w:t xml:space="preserve">📊</w:t>
-      </w:r>
-      <w:r>
-        <w:t xml:space="preserve"> </w:t>
-      </w:r>
-      <w:r>
-        <w:rPr>
-          <w:bCs/>
-          <w:b/>
-        </w:rPr>
-        <w:t xml:space="preserve">Kết quả với dữ liệu giả lập:</w:t>
-      </w:r>
-    </w:p>
-    <w:p>
-      <w:pPr>
-        <w:numPr>
-          <w:ilvl w:val="1"/>
-          <w:numId w:val="1006"/>
-        </w:numPr>
-        <w:pStyle w:val="Compact"/>
-      </w:pPr>
-      <w:r>
-        <w:t xml:space="preserve">Đường thẳng cắt qua</w:t>
-      </w:r>
-      <w:r>
-        <w:t xml:space="preserve"> </w:t>
-      </w:r>
-      <w:r>
-        <w:rPr>
-          <w:bCs/>
-          <w:b/>
-        </w:rPr>
-        <w:t xml:space="preserve">8 ô cấm bay</w:t>
-      </w:r>
-      <w:r>
-        <w:t xml:space="preserve"> </w:t>
-      </w:r>
-      <w:r>
-        <w:t xml:space="preserve">→ lộ trình vòng qua đèo: 14,5 km, 240 Wh</w:t>
-      </w:r>
-    </w:p>
-    <w:p>
-      <w:pPr>
-        <w:numPr>
-          <w:ilvl w:val="1"/>
-          <w:numId w:val="1006"/>
-        </w:numPr>
-        <w:pStyle w:val="Compact"/>
-      </w:pPr>
-      <w:r>
-        <w:t xml:space="preserve">Chiều về ngược gió mùa:</w:t>
-      </w:r>
-      <w:r>
-        <w:t xml:space="preserve"> </w:t>
-      </w:r>
-      <w:r>
-        <w:rPr>
-          <w:bCs/>
-          <w:b/>
-        </w:rPr>
-        <w:t xml:space="preserve">422 Wh – gấp 1,8 lần chiều đi</w:t>
-      </w:r>
-      <w:r>
-        <w:t xml:space="preserve"> </w:t>
-      </w:r>
-      <w:r>
-        <w:t xml:space="preserve">→ không đủ pin, phải đổi phương án</w:t>
-      </w:r>
-    </w:p>
-    <w:p>
-      <w:pPr>
-        <w:numPr>
-          <w:ilvl w:val="1"/>
-          <w:numId w:val="1006"/>
-        </w:numPr>
-        <w:pStyle w:val="Compact"/>
-      </w:pPr>
-      <w:r>
-        <w:t xml:space="preserve">Công cụ chạy trong ~3 giây trên máy tính thường, không cần mạng</w:t>
-      </w:r>
-    </w:p>
-    <w:p>
-      <w:pPr>
-        <w:numPr>
-          <w:ilvl w:val="0"/>
-          <w:numId w:val="1005"/>
-        </w:numPr>
-        <w:pStyle w:val="Compact"/>
-      </w:pPr>
-      <w:r>
-        <w:t xml:space="preserve">⚠ Chuyển tệp giữa hai máy theo</w:t>
-      </w:r>
-      <w:r>
-        <w:t xml:space="preserve"> </w:t>
-      </w:r>
-      <w:r>
-        <w:rPr>
-          <w:bCs/>
-          <w:b/>
-        </w:rPr>
-        <w:t xml:space="preserve">quy định bảo vệ bí mật nhà nước và quy chế của đơn vị</w:t>
-      </w:r>
-      <w:r>
-        <w:t xml:space="preserve">. Khi công cụ lỗi: tái tạo lỗi bằng dữ liệu giả để hỏi AI – không mang dữ liệu thật ra ngoài.</w:t>
+        <w:pStyle w:val="SourceCode"/>
+      </w:pPr>
+      <w:r>
+        <w:rPr>
+          <w:rStyle w:val="VerbatimChar"/>
+        </w:rPr>
+        <w:t xml:space="preserve">Từ kết quả trong dự án, soạn bản thảo cho tạp chí [tên]. Đọc "Hướng dẫn tác giả" tôi tải</w:t>
+      </w:r>
+      <w:r>
+        <w:br/>
+      </w:r>
+      <w:r>
+        <w:rPr>
+          <w:rStyle w:val="VerbatimChar"/>
+        </w:rPr>
+        <w:t xml:space="preserve">lên; lập bảng kiểm tra từng yêu cầu (đạt / chưa đạt). Với tạp chí ВАК: thêm УДК, tóm tắt</w:t>
+      </w:r>
+      <w:r>
+        <w:br/>
+      </w:r>
+      <w:r>
+        <w:rPr>
+          <w:rStyle w:val="VerbatimChar"/>
+        </w:rPr>
+        <w:t xml:space="preserve">và từ khóa tiếng Nga – Anh, tài liệu tham khảo theo ГОСТ Р 7.0.5-2008.</w:t>
+      </w:r>
+      <w:r>
+        <w:br/>
+      </w:r>
+      <w:r>
+        <w:rPr>
+          <w:rStyle w:val="VerbatimChar"/>
+        </w:rPr>
+        <w:t xml:space="preserve">Sau đó đóng vai phản biện khó tính: 5 nhược điểm lớn nhất và cách trả lời.</w:t>
       </w:r>
     </w:p>
     <w:p>
@@ -10694,70 +11007,31 @@
           <w:bCs/>
           <w:b/>
         </w:rPr>
-        <w:t xml:space="preserve">Hình ảnh:</w:t>
-      </w:r>
-      <w:r>
-        <w:t xml:space="preserve"> </w:t>
-      </w:r>
-      <w:r>
-        <w:t xml:space="preserve">sơ đồ hai máy;</w:t>
-      </w:r>
-      <w:r>
-        <w:t xml:space="preserve"> </w:t>
-      </w:r>
-      <w:r>
-        <w:rPr>
-          <w:rStyle w:val="VerbatimChar"/>
-        </w:rPr>
-        <w:t xml:space="preserve">thuyet-trinh/ket-qua-demo/may-cach-ly/ban_do_lo_trinh.png</w:t>
-      </w:r>
-      <w:r>
-        <w:t xml:space="preserve">.</w:t>
-      </w:r>
-    </w:p>
-    <w:p>
-      <w:pPr>
-        <w:pStyle w:val="BodyText"/>
-      </w:pPr>
-      <w:r>
-        <w:rPr>
-          <w:bCs/>
-          <w:b/>
-        </w:rPr>
-        <w:t xml:space="preserve">Demo:</w:t>
-      </w:r>
-      <w:r>
-        <w:t xml:space="preserve"> </w:t>
-      </w:r>
-      <w:r>
-        <w:t xml:space="preserve">~2 phút – chạy công cụ trên dữ liệu giả, mở báo cáo (câu lệnh:</w:t>
-      </w:r>
-      <w:r>
-        <w:t xml:space="preserve"> </w:t>
-      </w:r>
-      <w:r>
-        <w:rPr>
-          <w:rStyle w:val="VerbatimChar"/>
-        </w:rPr>
-        <w:t xml:space="preserve">cau-lenh-demo.md</w:t>
-      </w:r>
-      <w:r>
-        <w:t xml:space="preserve"> </w:t>
-      </w:r>
-      <w:r>
-        <w:t xml:space="preserve">mục 13; mã:</w:t>
-      </w:r>
-      <w:r>
-        <w:t xml:space="preserve"> </w:t>
-      </w:r>
-      <w:r>
-        <w:rPr>
-          <w:rStyle w:val="VerbatimChar"/>
-        </w:rPr>
-        <w:t xml:space="preserve">thuyet-trinh/ma-nguon-demo/may-cach-ly/</w:t>
-      </w:r>
-      <w:r>
-        <w:t xml:space="preserve">).</w:t>
+        <w:t xml:space="preserve">Việc phải làm:</w:t>
+      </w:r>
+      <w:r>
+        <w:t xml:space="preserve"> </w:t>
+      </w:r>
+      <w:r>
+        <w:t xml:space="preserve">kiểm tra danh mục ВАК hiện hành và nhóm К1–К3 của từng tạp chí; xác nhận</w:t>
+      </w:r>
+      <w:r>
+        <w:t xml:space="preserve"> </w:t>
+      </w:r>
+      <w:r>
+        <w:t xml:space="preserve">“</w:t>
+      </w:r>
+      <w:r>
+        <w:t xml:space="preserve">EeiE</w:t>
+      </w:r>
+      <w:r>
+        <w:t xml:space="preserve">”</w:t>
+      </w:r>
+      <w:r>
+        <w:t xml:space="preserve"> </w:t>
+      </w:r>
+      <w:r>
+        <w:t xml:space="preserve">trong bản góp ý là Ei Compendex hay danh mục khác.</w:t>
       </w:r>
     </w:p>
     <w:p>
@@ -10796,13 +11070,23 @@
       </w:r>
     </w:p>
     <w:bookmarkEnd w:id="42"/>
-    <w:bookmarkStart w:id="43" w:name="X2cd43d54e17a105f7cd682c764868fcbb685c71"/>
+    <w:bookmarkStart w:id="43" w:name="Xec5161d74064f414ef1ad004e0a8ce2cd9a98c3"/>
     <w:p>
       <w:pPr>
         <w:pStyle w:val="Heading2"/>
       </w:pPr>
       <w:r>
-        <w:t xml:space="preserve">Slide 18 – Công bố kết quả nghiên cứu và lập báo cáo tổng hợp (5′)</w:t>
+        <w:t xml:space="preserve">Slide 18 – Toàn cảnh: một nhiệm vụ khoa học đi qua AI Agent (2′) –</w:t>
+      </w:r>
+      <w:r>
+        <w:t xml:space="preserve"> </w:t>
+      </w:r>
+      <w:r>
+        <w:rPr>
+          <w:iCs/>
+          <w:i/>
+        </w:rPr>
+        <w:t xml:space="preserve">tổng kết Phần III</w:t>
       </w:r>
     </w:p>
     <w:p>
@@ -10816,21 +11100,154 @@
         </w:rPr>
         <w:t xml:space="preserve">Chữ trên slide:</w:t>
       </w:r>
-      <w:r>
-        <w:t xml:space="preserve"> </w:t>
-      </w:r>
-      <w:r>
-        <w:t xml:space="preserve">- 🆕</w:t>
-      </w:r>
-      <w:r>
-        <w:t xml:space="preserve"> </w:t>
-      </w:r>
-      <w:r>
-        <w:rPr>
-          <w:bCs/>
-          <w:b/>
-        </w:rPr>
-        <w:t xml:space="preserve">Một kết quả – nhiều định dạng công bố:</w:t>
+    </w:p>
+    <w:p>
+      <w:pPr>
+        <w:pStyle w:val="BodyText"/>
+      </w:pPr>
+      <w:r>
+        <w:rPr>
+          <w:bCs/>
+          <w:b/>
+        </w:rPr>
+        <w:t xml:space="preserve">Hình ảnh (chính):</w:t>
+      </w:r>
+      <w:r>
+        <w:t xml:space="preserve"> </w:t>
+      </w:r>
+      <w:r>
+        <w:t xml:space="preserve">sơ đồ vòng đời: Tài liệu → Khoảng trống (S12) → Phiếu đề xuất, thuyết minh (S13) → Tiến độ – kinh phí (S14) → Dữ liệu – kết quả, mô hình 3D (S15–S16) → Bài báo – báo cáo (S17); mỗi bước có dấu ✅</w:t>
+      </w:r>
+      <w:r>
+        <w:t xml:space="preserve"> </w:t>
+      </w:r>
+      <w:r>
+        <w:t xml:space="preserve">“</w:t>
+      </w:r>
+      <w:r>
+        <w:t xml:space="preserve">nhà khoa học xác nhận</w:t>
+      </w:r>
+      <w:r>
+        <w:t xml:space="preserve">”</w:t>
+      </w:r>
+      <w:r>
+        <w:t xml:space="preserve">.</w:t>
+      </w:r>
+    </w:p>
+    <w:p>
+      <w:pPr>
+        <w:pStyle w:val="BlockText"/>
+      </w:pPr>
+      <w:r>
+        <w:t xml:space="preserve">Cùng một dự án, cùng một bộ tài liệu – AI nối các công đoạn; nhà khoa học duyệt ở mỗi bước.</w:t>
+      </w:r>
+    </w:p>
+    <w:p>
+      <w:pPr>
+        <w:pStyle w:val="FirstParagraph"/>
+      </w:pPr>
+      <w:r>
+        <w:rPr>
+          <w:bCs/>
+          <w:b/>
+        </w:rPr>
+        <w:t xml:space="preserve">Duyệt:</w:t>
+      </w:r>
+      <w:r>
+        <w:t xml:space="preserve"> </w:t>
+      </w:r>
+      <w:r>
+        <w:t xml:space="preserve">[ ] Duyệt · [ ] Sửa · [ ] Bỏ</w:t>
+      </w:r>
+      <w:r>
+        <w:t xml:space="preserve"> </w:t>
+      </w:r>
+      <w:r>
+        <w:rPr>
+          <w:bCs/>
+          <w:b/>
+        </w:rPr>
+        <w:t xml:space="preserve">Ghi chú:</w:t>
+      </w:r>
+    </w:p>
+    <w:p>
+      <w:r>
+        <w:pict>
+          <v:rect style="width:0;height:1.5pt" o:hralign="center" o:hrstd="t" o:hr="t"/>
+        </w:pict>
+      </w:r>
+    </w:p>
+    <w:bookmarkEnd w:id="43"/>
+    <w:bookmarkEnd w:id="44"/>
+    <w:bookmarkStart w:id="46" w:name="X71301bc43ae8a2583ec30af40a0adfa491f7f5a"/>
+    <w:p>
+      <w:pPr>
+        <w:pStyle w:val="Heading1"/>
+      </w:pPr>
+      <w:r>
+        <w:t xml:space="preserve">PHẦN IV. ĐỀ TÀI MẬT: ỨNG DỤNG AI KHI DỮ LIỆU KHÔNG ĐƯỢC ĐƯA LÊN INTERNET (5 phút)</w:t>
+      </w:r>
+    </w:p>
+    <w:p>
+      <w:pPr>
+        <w:pStyle w:val="FirstParagraph"/>
+      </w:pPr>
+      <w:r>
+        <w:rPr>
+          <w:bCs/>
+          <w:b/>
+        </w:rPr>
+        <w:t xml:space="preserve">Trang chuyển phần:</w:t>
+      </w:r>
+      <w:r>
+        <w:t xml:space="preserve"> </w:t>
+      </w:r>
+      <w:r>
+        <w:t xml:space="preserve">tên Phần IV · Slide 19</w:t>
+      </w:r>
+    </w:p>
+    <w:p>
+      <w:r>
+        <w:pict>
+          <v:rect style="width:0;height:1.5pt" o:hralign="center" o:hrstd="t" o:hr="t"/>
+        </w:pict>
+      </w:r>
+    </w:p>
+    <w:bookmarkStart w:id="45" w:name="X16b01e03006115780af7081c342f2c01c0e39ae"/>
+    <w:p>
+      <w:pPr>
+        <w:pStyle w:val="Heading2"/>
+      </w:pPr>
+      <w:r>
+        <w:t xml:space="preserve">Slide 19 – Đề tài mật: xây dựng công cụ và xử lý ngay trên máy không kết nối Internet – DEMO 3 (5′)</w:t>
+      </w:r>
+    </w:p>
+    <w:p>
+      <w:pPr>
+        <w:pStyle w:val="FirstParagraph"/>
+      </w:pPr>
+      <w:r>
+        <w:rPr>
+          <w:bCs/>
+          <w:b/>
+        </w:rPr>
+        <w:t xml:space="preserve">Chữ trên slide:</w:t>
+      </w:r>
+      <w:r>
+        <w:t xml:space="preserve"> </w:t>
+      </w:r>
+      <w:r>
+        <w:t xml:space="preserve">-</w:t>
+      </w:r>
+      <w:r>
+        <w:t xml:space="preserve"> </w:t>
+      </w:r>
+      <w:r>
+        <w:rPr>
+          <w:bCs/>
+          <w:b/>
+        </w:rPr>
+        <w:t xml:space="preserve">Nguyên tắc: AI viết công cụ – AI không bao giờ thấy dữ liệu thật</w:t>
       </w:r>
     </w:p>
     <w:tbl>
@@ -10857,265 +11274,266 @@
               <w:jc w:val="left"/>
             </w:pPr>
             <w:r>
-              <w:t xml:space="preserve">Đích công bố</w:t>
-            </w:r>
-          </w:p>
-        </w:tc>
-        <w:tc>
-          <w:tcPr/>
-          <w:p>
-            <w:pPr>
-              <w:pStyle w:val="Compact"/>
-              <w:jc w:val="left"/>
-            </w:pPr>
-            <w:r>
-              <w:t xml:space="preserve">Yêu cầu đặc thù AI cần làm theo</w:t>
-            </w:r>
-          </w:p>
-        </w:tc>
-        <w:tc>
-          <w:tcPr/>
-          <w:p>
-            <w:pPr>
-              <w:pStyle w:val="Compact"/>
-              <w:jc w:val="left"/>
-            </w:pPr>
-            <w:r>
-              <w:t xml:space="preserve">Ví dụ tạp chí (kiểm tra danh mục hiện hành)</w:t>
-            </w:r>
-          </w:p>
-        </w:tc>
-      </w:tr>
-      <w:tr>
-        <w:tc>
-          <w:tcPr/>
-          <w:p>
-            <w:pPr>
-              <w:pStyle w:val="Compact"/>
-              <w:jc w:val="left"/>
-            </w:pPr>
+              <w:t xml:space="preserve">Máy có Internet (dùng AI)</w:t>
+            </w:r>
+          </w:p>
+        </w:tc>
+        <w:tc>
+          <w:tcPr/>
+          <w:p>
+            <w:pPr>
+              <w:pStyle w:val="Compact"/>
+            </w:pPr>
+          </w:p>
+        </w:tc>
+        <w:tc>
+          <w:tcPr/>
+          <w:p>
+            <w:pPr>
+              <w:pStyle w:val="Compact"/>
+              <w:jc w:val="left"/>
+            </w:pPr>
+            <w:r>
+              <w:t xml:space="preserve">Máy không Internet (dữ liệu mật)</w:t>
+            </w:r>
+          </w:p>
+        </w:tc>
+      </w:tr>
+      <w:tr>
+        <w:tc>
+          <w:tcPr/>
+          <w:p>
+            <w:pPr>
+              <w:pStyle w:val="Compact"/>
+              <w:jc w:val="left"/>
+            </w:pPr>
+            <w:r>
+              <w:t xml:space="preserve">1. Chỉ mô tả</w:t>
+            </w:r>
+            <w:r>
+              <w:t xml:space="preserve"> </w:t>
+            </w:r>
             <w:r>
               <w:rPr>
                 <w:bCs/>
                 <w:b/>
               </w:rPr>
-              <w:t xml:space="preserve">Scopus / Web of Science</w:t>
-            </w:r>
-          </w:p>
-        </w:tc>
-        <w:tc>
-          <w:tcPr/>
-          <w:p>
-            <w:pPr>
-              <w:pStyle w:val="Compact"/>
-              <w:jc w:val="left"/>
-            </w:pPr>
-            <w:r>
-              <w:t xml:space="preserve">Theo</w:t>
+              <w:t xml:space="preserve">cấu trúc</w:t>
             </w:r>
             <w:r>
               <w:t xml:space="preserve"> </w:t>
             </w:r>
             <w:r>
-              <w:t xml:space="preserve">“</w:t>
-            </w:r>
-            <w:r>
-              <w:t xml:space="preserve">Hướng dẫn tác giả</w:t>
-            </w:r>
-            <w:r>
-              <w:t xml:space="preserve">”</w:t>
+              <w:t xml:space="preserve">dữ liệu (tên cột, đơn vị)</w:t>
+            </w:r>
+          </w:p>
+        </w:tc>
+        <w:tc>
+          <w:tcPr/>
+          <w:p>
+            <w:pPr>
+              <w:pStyle w:val="Compact"/>
+            </w:pPr>
+          </w:p>
+        </w:tc>
+        <w:tc>
+          <w:tcPr/>
+          <w:p>
+            <w:pPr>
+              <w:pStyle w:val="Compact"/>
+            </w:pPr>
+          </w:p>
+        </w:tc>
+      </w:tr>
+      <w:tr>
+        <w:tc>
+          <w:tcPr/>
+          <w:p>
+            <w:pPr>
+              <w:pStyle w:val="Compact"/>
+              <w:jc w:val="left"/>
+            </w:pPr>
+            <w:r>
+              <w:t xml:space="preserve">2. AI viết công cụ, sinh</w:t>
             </w:r>
             <w:r>
               <w:t xml:space="preserve"> </w:t>
             </w:r>
-            <w:r>
-              <w:t xml:space="preserve">của từng tạp chí: cấu trúc IMRaD, tóm tắt có cấu trúc, highlights, khai báo dữ liệu, khai báo dùng AI, đóng góp tác giả</w:t>
-            </w:r>
-          </w:p>
-        </w:tc>
-        <w:tc>
-          <w:tcPr/>
-          <w:p>
-            <w:pPr>
-              <w:pStyle w:val="Compact"/>
-              <w:jc w:val="left"/>
-            </w:pPr>
-            <w:r>
-              <w:t xml:space="preserve">Corrosion Science; Materials and Corrosion; npj Materials Degradation; Protection of Metals and Physical Chemistry of Surfaces</w:t>
-            </w:r>
-          </w:p>
-        </w:tc>
-      </w:tr>
-      <w:tr>
-        <w:tc>
-          <w:tcPr/>
-          <w:p>
-            <w:pPr>
-              <w:pStyle w:val="Compact"/>
-              <w:jc w:val="left"/>
-            </w:pPr>
             <w:r>
               <w:rPr>
                 <w:bCs/>
                 <w:b/>
               </w:rPr>
-              <w:t xml:space="preserve">Danh mục ВАК (Nga)</w:t>
-            </w:r>
-          </w:p>
-        </w:tc>
-        <w:tc>
-          <w:tcPr/>
-          <w:p>
-            <w:pPr>
-              <w:pStyle w:val="Compact"/>
-              <w:jc w:val="left"/>
-            </w:pPr>
-            <w:r>
-              <w:t xml:space="preserve">Mã УДК; tóm tắt và từ khóa tiếng Nga + tiếng Anh; tài liệu tham khảo theo ГОСТ Р 7.0.5-2008 (theo quy định từng tạp chí); danh mục chia nhóm К1–К3</w:t>
-            </w:r>
-          </w:p>
-        </w:tc>
-        <w:tc>
-          <w:tcPr/>
-          <w:p>
-            <w:pPr>
-              <w:pStyle w:val="Compact"/>
-              <w:jc w:val="left"/>
-            </w:pPr>
-            <w:r>
-              <w:t xml:space="preserve">Физикохимия поверхности и защита материалов; Коррозия: материалы, защита</w:t>
-            </w:r>
-          </w:p>
-        </w:tc>
-      </w:tr>
-      <w:tr>
-        <w:tc>
-          <w:tcPr/>
-          <w:p>
-            <w:pPr>
-              <w:pStyle w:val="Compact"/>
-              <w:jc w:val="left"/>
-            </w:pPr>
+              <w:t xml:space="preserve">dữ liệu giả</w:t>
+            </w:r>
+            <w:r>
+              <w:t xml:space="preserve">, chạy thử</w:t>
+            </w:r>
+          </w:p>
+        </w:tc>
+        <w:tc>
+          <w:tcPr/>
+          <w:p>
+            <w:pPr>
+              <w:pStyle w:val="Compact"/>
+            </w:pPr>
+          </w:p>
+        </w:tc>
+        <w:tc>
+          <w:tcPr/>
+          <w:p>
+            <w:pPr>
+              <w:pStyle w:val="Compact"/>
+            </w:pPr>
+          </w:p>
+        </w:tc>
+      </w:tr>
+      <w:tr>
+        <w:tc>
+          <w:tcPr/>
+          <w:p>
+            <w:pPr>
+              <w:pStyle w:val="Compact"/>
+              <w:jc w:val="left"/>
+            </w:pPr>
+            <w:r>
+              <w:t xml:space="preserve">3. Nhà khoa học đọc mã;</w:t>
+            </w:r>
+            <w:r>
+              <w:t xml:space="preserve"> </w:t>
+            </w:r>
             <w:r>
               <w:rPr>
                 <w:bCs/>
                 <w:b/>
               </w:rPr>
-              <w:t xml:space="preserve">Ei Compendex</w:t>
+              <w:t xml:space="preserve">quét mã</w:t>
             </w:r>
             <w:r>
               <w:t xml:space="preserve"> </w:t>
             </w:r>
             <w:r>
-              <w:t xml:space="preserve">(kỹ thuật)</w:t>
-            </w:r>
-          </w:p>
-        </w:tc>
-        <w:tc>
-          <w:tcPr/>
-          <w:p>
-            <w:pPr>
-              <w:pStyle w:val="Compact"/>
-              <w:jc w:val="left"/>
-            </w:pPr>
-            <w:r>
-              <w:t xml:space="preserve">Như Scopus; nhấn mạnh ứng dụng kỹ thuật</w:t>
-            </w:r>
-          </w:p>
-        </w:tc>
-        <w:tc>
-          <w:tcPr/>
-          <w:p>
-            <w:pPr>
-              <w:pStyle w:val="Compact"/>
-              <w:jc w:val="left"/>
-            </w:pPr>
-            <w:r>
-              <w:t xml:space="preserve">Kiểm tra tạp chí trong danh mục Ei</w:t>
-            </w:r>
-          </w:p>
-        </w:tc>
-      </w:tr>
-      <w:tr>
-        <w:tc>
-          <w:tcPr/>
-          <w:p>
-            <w:pPr>
-              <w:pStyle w:val="Compact"/>
-              <w:jc w:val="left"/>
-            </w:pPr>
+              <w:t xml:space="preserve">– không có kết nối mạng</w:t>
+            </w:r>
+          </w:p>
+        </w:tc>
+        <w:tc>
+          <w:tcPr/>
+          <w:p>
+            <w:pPr>
+              <w:pStyle w:val="Compact"/>
+            </w:pPr>
+          </w:p>
+        </w:tc>
+        <w:tc>
+          <w:tcPr/>
+          <w:p>
+            <w:pPr>
+              <w:pStyle w:val="Compact"/>
+            </w:pPr>
+          </w:p>
+        </w:tc>
+      </w:tr>
+      <w:tr>
+        <w:tc>
+          <w:tcPr/>
+          <w:p>
+            <w:pPr>
+              <w:pStyle w:val="Compact"/>
+              <w:jc w:val="left"/>
+            </w:pPr>
+            <w:r>
+              <w:t xml:space="preserve">4. Đóng gói +</w:t>
+            </w:r>
+            <w:r>
+              <w:t xml:space="preserve"> </w:t>
+            </w:r>
             <w:r>
               <w:rPr>
                 <w:bCs/>
                 <w:b/>
               </w:rPr>
-              <w:t xml:space="preserve">Tạp chí trong nước</w:t>
-            </w:r>
-          </w:p>
-        </w:tc>
-        <w:tc>
-          <w:tcPr/>
-          <w:p>
-            <w:pPr>
-              <w:pStyle w:val="Compact"/>
-              <w:jc w:val="left"/>
-            </w:pPr>
-            <w:r>
-              <w:t xml:space="preserve">Theo thể lệ tạp chí; danh mục Hội đồng Giáo sư Nhà nước</w:t>
-            </w:r>
-          </w:p>
-        </w:tc>
-        <w:tc>
-          <w:tcPr/>
-          <w:p>
-            <w:pPr>
-              <w:pStyle w:val="Compact"/>
-              <w:jc w:val="left"/>
-            </w:pPr>
-            <w:r>
-              <w:t xml:space="preserve">Tạp chí Khoa học và Công nghệ nhiệt đới (ISSN 0866-7535)</w:t>
-            </w:r>
-          </w:p>
-        </w:tc>
-      </w:tr>
-      <w:tr>
-        <w:tc>
-          <w:tcPr/>
-          <w:p>
-            <w:pPr>
-              <w:pStyle w:val="Compact"/>
-              <w:jc w:val="left"/>
-            </w:pPr>
+              <w:t xml:space="preserve">mã băm SHA-256</w:t>
+            </w:r>
+          </w:p>
+        </w:tc>
+        <w:tc>
+          <w:tcPr/>
+          <w:p>
+            <w:pPr>
+              <w:pStyle w:val="Compact"/>
+              <w:jc w:val="left"/>
+            </w:pPr>
+            <w:r>
+              <w:t xml:space="preserve">➜ chuyển theo quy định ➜</w:t>
+            </w:r>
+          </w:p>
+        </w:tc>
+        <w:tc>
+          <w:tcPr/>
+          <w:p>
+            <w:pPr>
+              <w:pStyle w:val="Compact"/>
+              <w:jc w:val="left"/>
+            </w:pPr>
+            <w:r>
+              <w:t xml:space="preserve">5. Đối chiếu mã băm → chạy với</w:t>
+            </w:r>
+            <w:r>
+              <w:t xml:space="preserve"> </w:t>
+            </w:r>
             <w:r>
               <w:rPr>
                 <w:bCs/>
                 <w:b/>
               </w:rPr>
-              <w:t xml:space="preserve">Báo cáo của Trung tâm</w:t>
-            </w:r>
-          </w:p>
-        </w:tc>
-        <w:tc>
-          <w:tcPr/>
-          <w:p>
-            <w:pPr>
-              <w:pStyle w:val="Compact"/>
-              <w:jc w:val="left"/>
-            </w:pPr>
-            <w:r>
-              <w:t xml:space="preserve">Biểu mẫu báo cáo tổng hợp kết quả, Mẫu 21, 22</w:t>
-            </w:r>
-          </w:p>
-        </w:tc>
-        <w:tc>
-          <w:tcPr/>
-          <w:p>
-            <w:pPr>
-              <w:pStyle w:val="Compact"/>
-              <w:jc w:val="left"/>
-            </w:pPr>
-            <w:r>
-              <w:t xml:space="preserve">Biểu mẫu Trung tâm</w:t>
+              <w:t xml:space="preserve">dữ liệu thật</w:t>
+            </w:r>
+          </w:p>
+        </w:tc>
+      </w:tr>
+      <w:tr>
+        <w:tc>
+          <w:tcPr/>
+          <w:p>
+            <w:pPr>
+              <w:pStyle w:val="Compact"/>
+            </w:pPr>
+          </w:p>
+        </w:tc>
+        <w:tc>
+          <w:tcPr/>
+          <w:p>
+            <w:pPr>
+              <w:pStyle w:val="Compact"/>
+            </w:pPr>
+          </w:p>
+        </w:tc>
+        <w:tc>
+          <w:tcPr/>
+          <w:p>
+            <w:pPr>
+              <w:pStyle w:val="Compact"/>
+              <w:jc w:val="left"/>
+            </w:pPr>
+            <w:r>
+              <w:t xml:space="preserve">6. Kết quả</w:t>
+            </w:r>
+            <w:r>
+              <w:t xml:space="preserve"> </w:t>
+            </w:r>
+            <w:r>
+              <w:rPr>
+                <w:bCs/>
+                <w:b/>
+              </w:rPr>
+              <w:t xml:space="preserve">ở lại</w:t>
+            </w:r>
+            <w:r>
+              <w:t xml:space="preserve"> </w:t>
+            </w:r>
+            <w:r>
+              <w:t xml:space="preserve">máy này</w:t>
             </w:r>
           </w:p>
         </w:tc>
@@ -11125,99 +11543,228 @@
       <w:pPr>
         <w:numPr>
           <w:ilvl w:val="0"/>
+          <w:numId w:val="1006"/>
+        </w:numPr>
+        <w:pStyle w:val="Compact"/>
+      </w:pPr>
+      <w:r>
+        <w:t xml:space="preserve">🧪</w:t>
+      </w:r>
+      <w:r>
+        <w:t xml:space="preserve"> </w:t>
+      </w:r>
+      <w:r>
+        <w:rPr>
+          <w:bCs/>
+          <w:b/>
+        </w:rPr>
+        <w:t xml:space="preserve">Ví dụ:</w:t>
+      </w:r>
+      <w:r>
+        <w:t xml:space="preserve"> </w:t>
+      </w:r>
+      <w:r>
+        <w:rPr>
+          <w:iCs/>
+          <w:i/>
+        </w:rPr>
+        <w:t xml:space="preserve">Ảnh hưởng của địa hình và khí hậu nhiệt đới đến lộ trình của thiết bị bay không người lái</w:t>
+      </w:r>
+      <w:r>
+        <w:t xml:space="preserve"> </w:t>
+      </w:r>
+      <w:r>
+        <w:t xml:space="preserve">– công cụ tìm lộ trình tốn ít năng lượng nhất, tránh núi cao, ổ mưa dông, gió mạnh; tính ảnh hưởng của gió, mưa, nhiệt độ – độ ẩm, leo cao</w:t>
+      </w:r>
+    </w:p>
+    <w:p>
+      <w:pPr>
+        <w:numPr>
+          <w:ilvl w:val="0"/>
+          <w:numId w:val="1006"/>
+        </w:numPr>
+        <w:pStyle w:val="Compact"/>
+      </w:pPr>
+      <w:r>
+        <w:t xml:space="preserve">📊</w:t>
+      </w:r>
+      <w:r>
+        <w:t xml:space="preserve"> </w:t>
+      </w:r>
+      <w:r>
+        <w:rPr>
+          <w:bCs/>
+          <w:b/>
+        </w:rPr>
+        <w:t xml:space="preserve">Kết quả với dữ liệu giả lập:</w:t>
+      </w:r>
+    </w:p>
+    <w:p>
+      <w:pPr>
+        <w:numPr>
+          <w:ilvl w:val="1"/>
           <w:numId w:val="1007"/>
         </w:numPr>
-      </w:pPr>
-      <w:r>
-        <w:t xml:space="preserve">⌨</w:t>
-      </w:r>
-      <w:r>
-        <w:t xml:space="preserve"> </w:t>
-      </w:r>
-      <w:r>
-        <w:rPr>
-          <w:bCs/>
-          <w:b/>
-        </w:rPr>
-        <w:t xml:space="preserve">Câu lệnh:</w:t>
+        <w:pStyle w:val="Compact"/>
+      </w:pPr>
+      <w:r>
+        <w:t xml:space="preserve">Đường thẳng cắt qua</w:t>
+      </w:r>
+      <w:r>
+        <w:t xml:space="preserve"> </w:t>
+      </w:r>
+      <w:r>
+        <w:rPr>
+          <w:bCs/>
+          <w:b/>
+        </w:rPr>
+        <w:t xml:space="preserve">8 ô cấm bay</w:t>
+      </w:r>
+      <w:r>
+        <w:t xml:space="preserve"> </w:t>
+      </w:r>
+      <w:r>
+        <w:t xml:space="preserve">→ lộ trình vòng qua đèo: 14,5 km, 240 Wh</w:t>
+      </w:r>
+    </w:p>
+    <w:p>
+      <w:pPr>
+        <w:numPr>
+          <w:ilvl w:val="1"/>
+          <w:numId w:val="1007"/>
+        </w:numPr>
+        <w:pStyle w:val="Compact"/>
+      </w:pPr>
+      <w:r>
+        <w:t xml:space="preserve">Chiều về ngược gió mùa:</w:t>
+      </w:r>
+      <w:r>
+        <w:t xml:space="preserve"> </w:t>
+      </w:r>
+      <w:r>
+        <w:rPr>
+          <w:bCs/>
+          <w:b/>
+        </w:rPr>
+        <w:t xml:space="preserve">422 Wh – gấp 1,8 lần chiều đi</w:t>
+      </w:r>
+      <w:r>
+        <w:t xml:space="preserve"> </w:t>
+      </w:r>
+      <w:r>
+        <w:t xml:space="preserve">→ không đủ pin, phải đổi phương án</w:t>
+      </w:r>
+    </w:p>
+    <w:p>
+      <w:pPr>
+        <w:numPr>
+          <w:ilvl w:val="1"/>
+          <w:numId w:val="1007"/>
+        </w:numPr>
+        <w:pStyle w:val="Compact"/>
+      </w:pPr>
+      <w:r>
+        <w:t xml:space="preserve">Công cụ chạy trong ~3 giây trên máy tính thường, không cần mạng</w:t>
       </w:r>
     </w:p>
     <w:p>
       <w:pPr>
         <w:numPr>
           <w:ilvl w:val="0"/>
-          <w:numId w:val="1000"/>
+          <w:numId w:val="1006"/>
         </w:numPr>
-        <w:pStyle w:val="SourceCode"/>
-      </w:pPr>
+        <w:pStyle w:val="Compact"/>
+      </w:pPr>
+      <w:r>
+        <w:t xml:space="preserve">⚠ Chuyển tệp giữa hai máy theo</w:t>
+      </w:r>
+      <w:r>
+        <w:t xml:space="preserve"> </w:t>
+      </w:r>
+      <w:r>
+        <w:rPr>
+          <w:bCs/>
+          <w:b/>
+        </w:rPr>
+        <w:t xml:space="preserve">quy định bảo vệ bí mật nhà nước và quy chế của đơn vị</w:t>
+      </w:r>
+      <w:r>
+        <w:t xml:space="preserve">. Khi công cụ lỗi: tái tạo lỗi bằng dữ liệu giả để hỏi AI – không mang dữ liệu thật ra ngoài.</w:t>
+      </w:r>
+    </w:p>
+    <w:p>
+      <w:pPr>
+        <w:pStyle w:val="FirstParagraph"/>
+      </w:pPr>
+      <w:r>
+        <w:rPr>
+          <w:bCs/>
+          <w:b/>
+        </w:rPr>
+        <w:t xml:space="preserve">Hình ảnh:</w:t>
+      </w:r>
+      <w:r>
+        <w:t xml:space="preserve"> </w:t>
+      </w:r>
+      <w:r>
+        <w:t xml:space="preserve">sơ đồ hai máy;</w:t>
+      </w:r>
+      <w:r>
+        <w:t xml:space="preserve"> </w:t>
+      </w:r>
       <w:r>
         <w:rPr>
           <w:rStyle w:val="VerbatimChar"/>
         </w:rPr>
-        <w:t xml:space="preserve">Từ kết quả trong dự án, soạn bản thảo cho tạp chí [tên]. Đọc "Hướng dẫn tác giả" tôi tải</w:t>
-      </w:r>
-      <w:r>
-        <w:br/>
+        <w:t xml:space="preserve">thuyet-trinh/ket-qua-demo/may-cach-ly/ban_do_lo_trinh.png</w:t>
+      </w:r>
+      <w:r>
+        <w:t xml:space="preserve">.</w:t>
+      </w:r>
+    </w:p>
+    <w:p>
+      <w:pPr>
+        <w:pStyle w:val="BodyText"/>
+      </w:pPr>
+      <w:r>
+        <w:rPr>
+          <w:bCs/>
+          <w:b/>
+        </w:rPr>
+        <w:t xml:space="preserve">Demo:</w:t>
+      </w:r>
+      <w:r>
+        <w:t xml:space="preserve"> </w:t>
+      </w:r>
+      <w:r>
+        <w:t xml:space="preserve">~2 phút – chạy công cụ trên dữ liệu giả, mở báo cáo (câu lệnh:</w:t>
+      </w:r>
+      <w:r>
+        <w:t xml:space="preserve"> </w:t>
       </w:r>
       <w:r>
         <w:rPr>
           <w:rStyle w:val="VerbatimChar"/>
         </w:rPr>
-        <w:t xml:space="preserve">lên; lập bảng kiểm tra từng yêu cầu (đạt / chưa đạt). Với tạp chí ВАК: thêm УДК, tóm tắt</w:t>
-      </w:r>
-      <w:r>
-        <w:br/>
+        <w:t xml:space="preserve">cau-lenh-demo.md</w:t>
+      </w:r>
+      <w:r>
+        <w:t xml:space="preserve"> </w:t>
+      </w:r>
+      <w:r>
+        <w:t xml:space="preserve">mục 13; mã:</w:t>
+      </w:r>
+      <w:r>
+        <w:t xml:space="preserve"> </w:t>
       </w:r>
       <w:r>
         <w:rPr>
           <w:rStyle w:val="VerbatimChar"/>
         </w:rPr>
-        <w:t xml:space="preserve">và từ khóa tiếng Nga – Anh, tài liệu tham khảo theo ГОСТ Р 7.0.5-2008.</w:t>
-      </w:r>
-      <w:r>
-        <w:br/>
-      </w:r>
-      <w:r>
-        <w:rPr>
-          <w:rStyle w:val="VerbatimChar"/>
-        </w:rPr>
-        <w:t xml:space="preserve">Sau đó đóng vai phản biện khó tính: 5 nhược điểm lớn nhất và cách trả lời.</w:t>
-      </w:r>
-    </w:p>
-    <w:p>
-      <w:pPr>
-        <w:pStyle w:val="FirstParagraph"/>
-      </w:pPr>
-      <w:r>
-        <w:rPr>
-          <w:bCs/>
-          <w:b/>
-        </w:rPr>
-        <w:t xml:space="preserve">Việc phải làm:</w:t>
-      </w:r>
-      <w:r>
-        <w:t xml:space="preserve"> </w:t>
-      </w:r>
-      <w:r>
-        <w:t xml:space="preserve">kiểm tra danh mục ВАК hiện hành và nhóm К1–К3 của từng tạp chí; xác nhận</w:t>
-      </w:r>
-      <w:r>
-        <w:t xml:space="preserve"> </w:t>
-      </w:r>
-      <w:r>
-        <w:t xml:space="preserve">“</w:t>
-      </w:r>
-      <w:r>
-        <w:t xml:space="preserve">EeiE</w:t>
-      </w:r>
-      <w:r>
-        <w:t xml:space="preserve">”</w:t>
-      </w:r>
-      <w:r>
-        <w:t xml:space="preserve"> </w:t>
-      </w:r>
-      <w:r>
-        <w:t xml:space="preserve">trong bản góp ý là Ei Compendex hay danh mục khác.</w:t>
+        <w:t xml:space="preserve">thuyet-trinh/ma-nguon-demo/may-cach-ly/</w:t>
+      </w:r>
+      <w:r>
+        <w:t xml:space="preserve">).</w:t>
       </w:r>
     </w:p>
     <w:p>
@@ -11255,24 +11802,15 @@
         </w:pict>
       </w:r>
     </w:p>
-    <w:bookmarkEnd w:id="43"/>
-    <w:bookmarkStart w:id="44" w:name="Xc168ec6a35dd25182e83a95b5e7a9d46ecee8cd"/>
-    <w:p>
-      <w:pPr>
-        <w:pStyle w:val="Heading2"/>
-      </w:pPr>
-      <w:r>
-        <w:t xml:space="preserve">Slide 19 – Tổng hợp chu trình thực hiện nhiệm vụ khoa học và công nghệ có ứng dụng tác tử trí tuệ nhân tạo (2′) –</w:t>
-      </w:r>
-      <w:r>
-        <w:t xml:space="preserve"> </w:t>
-      </w:r>
-      <w:r>
-        <w:rPr>
-          <w:iCs/>
-          <w:i/>
-        </w:rPr>
-        <w:t xml:space="preserve">tổng kết Phần III</w:t>
+    <w:bookmarkEnd w:id="45"/>
+    <w:bookmarkEnd w:id="46"/>
+    <w:bookmarkStart w:id="50" w:name="X49c9e2e2629d4b3041c6feec67246a57957c4b4"/>
+    <w:p>
+      <w:pPr>
+        <w:pStyle w:val="Heading1"/>
+      </w:pPr>
+      <w:r>
+        <w:t xml:space="preserve">PHẦN V. SKILL, KHOA HỌC MỞ VÀ TỰ ĐỘNG HÓA (15 phút)</w:t>
       </w:r>
     </w:p>
     <w:p>
@@ -11284,76 +11822,13 @@
           <w:bCs/>
           <w:b/>
         </w:rPr>
-        <w:t xml:space="preserve">Chữ trên slide:</w:t>
-      </w:r>
-    </w:p>
-    <w:p>
-      <w:pPr>
-        <w:pStyle w:val="BodyText"/>
-      </w:pPr>
-      <w:r>
-        <w:rPr>
-          <w:bCs/>
-          <w:b/>
-        </w:rPr>
-        <w:t xml:space="preserve">Hình ảnh (chính):</w:t>
-      </w:r>
-      <w:r>
-        <w:t xml:space="preserve"> </w:t>
-      </w:r>
-      <w:r>
-        <w:t xml:space="preserve">sơ đồ vòng đời: Tài liệu → Khoảng trống (S12) → Phiếu đề xuất, thuyết minh (S13) → Tiến độ – kinh phí (S14) → Dữ liệu – kết quả, mô hình 3D (S15–S16) → Bài báo – báo cáo (S18); nhánh đề tài mật: công cụ chạy trên máy không Internet (S17); mỗi bước có dấu ✅</w:t>
-      </w:r>
-      <w:r>
-        <w:t xml:space="preserve"> </w:t>
-      </w:r>
-      <w:r>
-        <w:t xml:space="preserve">“</w:t>
-      </w:r>
-      <w:r>
-        <w:t xml:space="preserve">nhà khoa học xác nhận</w:t>
-      </w:r>
-      <w:r>
-        <w:t xml:space="preserve">”</w:t>
-      </w:r>
-      <w:r>
-        <w:t xml:space="preserve">.</w:t>
-      </w:r>
-    </w:p>
-    <w:p>
-      <w:pPr>
-        <w:pStyle w:val="BlockText"/>
-      </w:pPr>
-      <w:r>
-        <w:t xml:space="preserve">Cùng một dự án, cùng một bộ tài liệu – AI nối các công đoạn; nhà khoa học duyệt ở mỗi bước.</w:t>
-      </w:r>
-    </w:p>
-    <w:p>
-      <w:pPr>
-        <w:pStyle w:val="FirstParagraph"/>
-      </w:pPr>
-      <w:r>
-        <w:rPr>
-          <w:bCs/>
-          <w:b/>
-        </w:rPr>
-        <w:t xml:space="preserve">Duyệt:</w:t>
-      </w:r>
-      <w:r>
-        <w:t xml:space="preserve"> </w:t>
-      </w:r>
-      <w:r>
-        <w:t xml:space="preserve">[ ] Duyệt · [ ] Sửa · [ ] Bỏ</w:t>
-      </w:r>
-      <w:r>
-        <w:t xml:space="preserve"> </w:t>
-      </w:r>
-      <w:r>
-        <w:rPr>
-          <w:bCs/>
-          <w:b/>
-        </w:rPr>
-        <w:t xml:space="preserve">Ghi chú:</w:t>
+        <w:t xml:space="preserve">Trang chuyển phần:</w:t>
+      </w:r>
+      <w:r>
+        <w:t xml:space="preserve"> </w:t>
+      </w:r>
+      <w:r>
+        <w:t xml:space="preserve">tên Phần V · Slide 20–22</w:t>
       </w:r>
     </w:p>
     <w:p>
@@ -11363,31 +11838,13 @@
         </w:pict>
       </w:r>
     </w:p>
-    <w:bookmarkEnd w:id="44"/>
-    <w:bookmarkEnd w:id="45"/>
-    <w:bookmarkStart w:id="55" w:name="X3a72b5620823bd057fa601f63db5843cab00f4b"/>
-    <w:p>
-      <w:pPr>
-        <w:pStyle w:val="Heading1"/>
-      </w:pPr>
-      <w:r>
-        <w:t xml:space="preserve">PHẦN IV. KỸ NĂNG, KHOA HỌC MỞ VÀ TỰ ĐỘNG HÓA QUY TRÌNH NGHIÊN CỨU (15 phút)</w:t>
-      </w:r>
-    </w:p>
-    <w:p>
-      <w:r>
-        <w:pict>
-          <v:rect style="width:0;height:1.5pt" o:hralign="center" o:hrstd="t" o:hr="t"/>
-        </w:pict>
-      </w:r>
-    </w:p>
-    <w:bookmarkStart w:id="46" w:name="X818242104804ce0c977341420493fb5a14aef84"/>
+    <w:bookmarkStart w:id="47" w:name="Xede09fe8d87eea4758afea24298a0a93a490a9c"/>
     <w:p>
       <w:pPr>
         <w:pStyle w:val="Heading2"/>
       </w:pPr>
       <w:r>
-        <w:t xml:space="preserve">Slide 20 – Kỹ năng (Skill) và khoa học mở – nền tảng tự động hóa hoạt động nghiên cứu (6′)</w:t>
+        <w:t xml:space="preserve">Slide 20 – Skill và khoa học mở: nền móng của tự động hóa (6′)</w:t>
       </w:r>
     </w:p>
     <w:p>
@@ -11976,14 +12433,14 @@
         </w:pict>
       </w:r>
     </w:p>
-    <w:bookmarkEnd w:id="46"/>
-    <w:bookmarkStart w:id="47" w:name="X726540dc6836b0b411b8e79de7361a22afe3ad5"/>
+    <w:bookmarkEnd w:id="47"/>
+    <w:bookmarkStart w:id="48" w:name="Xed3464729fbb4912ed2c4f95a8612249b6e2b90"/>
     <w:p>
       <w:pPr>
         <w:pStyle w:val="Heading2"/>
       </w:pPr>
       <w:r>
-        <w:t xml:space="preserve">Slide 21 – Lộ trình tự động hóa từ từng công đoạn đến toàn bộ quy trình nghiên cứu (5′)</w:t>
+        <w:t xml:space="preserve">Slide 21 – Tự động hóa từng bước: từ một công việc đến toàn quy trình (5′)</w:t>
       </w:r>
     </w:p>
     <w:p>
@@ -12503,14 +12960,14 @@
         </w:pict>
       </w:r>
     </w:p>
-    <w:bookmarkEnd w:id="47"/>
-    <w:bookmarkStart w:id="48" w:name="X735cc2cc89b2c622c4c48db7dc4521398c84c95"/>
+    <w:bookmarkEnd w:id="48"/>
+    <w:bookmarkStart w:id="49" w:name="X1cb900760096274a3dd5c9fe1f213f586658b4a"/>
     <w:p>
       <w:pPr>
         <w:pStyle w:val="Heading2"/>
       </w:pPr>
       <w:r>
-        <w:t xml:space="preserve">Slide 22 – Sơ đồ quy trình tự động hóa của Trung tâm và các nội dung thuộc thẩm quyền quyết định của nhà khoa học (4′)</w:t>
+        <w:t xml:space="preserve">Slide 22 – Quy trình tự động của Trung tâm và năm quyết định của nhà khoa học (4′)</w:t>
       </w:r>
     </w:p>
     <w:p>
@@ -13130,78 +13587,15 @@
         </w:pict>
       </w:r>
     </w:p>
-    <w:bookmarkEnd w:id="48"/>
-    <w:bookmarkStart w:id="49" w:name="slide-23-trao-đổi-thảo-luận-9"/>
-    <w:p>
-      <w:pPr>
-        <w:pStyle w:val="Heading2"/>
-      </w:pPr>
-      <w:r>
-        <w:t xml:space="preserve">Slide 23 – Trao đổi, thảo luận (9′)</w:t>
-      </w:r>
-    </w:p>
-    <w:p>
-      <w:pPr>
-        <w:pStyle w:val="FirstParagraph"/>
-      </w:pPr>
-      <w:r>
-        <w:rPr>
-          <w:bCs/>
-          <w:b/>
-        </w:rPr>
-        <w:t xml:space="preserve">Chữ trên slide:</w:t>
-      </w:r>
-      <w:r>
-        <w:t xml:space="preserve"> </w:t>
-      </w:r>
-      <w:r>
-        <w:t xml:space="preserve">- Kết quả phiếu khảo sát trước buổi học (biểu đồ)</w:t>
-      </w:r>
-      <w:r>
-        <w:t xml:space="preserve"> </w:t>
-      </w:r>
-      <w:r>
-        <w:t xml:space="preserve">- Các quy trình các phòng muốn tự động hóa</w:t>
-      </w:r>
-      <w:r>
-        <w:t xml:space="preserve"> </w:t>
-      </w:r>
-      <w:r>
-        <w:t xml:space="preserve">- Câu hỏi – góp ý – đề xuất thí điểm</w:t>
-      </w:r>
-      <w:r>
-        <w:t xml:space="preserve"> </w:t>
-      </w:r>
-      <w:r>
-        <w:t xml:space="preserve">- Đầu mối liên hệ: ______________________</w:t>
-      </w:r>
-    </w:p>
-    <w:p>
-      <w:pPr>
-        <w:pStyle w:val="BodyText"/>
-      </w:pPr>
-      <w:r>
-        <w:rPr>
-          <w:bCs/>
-          <w:b/>
-        </w:rPr>
-        <w:t xml:space="preserve">Duyệt:</w:t>
-      </w:r>
-      <w:r>
-        <w:t xml:space="preserve"> </w:t>
-      </w:r>
-      <w:r>
-        <w:t xml:space="preserve">[ ] Duyệt · [ ] Sửa · [ ] Bỏ</w:t>
-      </w:r>
-      <w:r>
-        <w:t xml:space="preserve"> </w:t>
-      </w:r>
-      <w:r>
-        <w:rPr>
-          <w:bCs/>
-          <w:b/>
-        </w:rPr>
-        <w:t xml:space="preserve">Ghi chú:</w:t>
+    <w:bookmarkEnd w:id="49"/>
+    <w:bookmarkEnd w:id="50"/>
+    <w:bookmarkStart w:id="52" w:name="phần-vi.-trao-đổi-và-thảo-luận-9-phút"/>
+    <w:p>
+      <w:pPr>
+        <w:pStyle w:val="Heading1"/>
+      </w:pPr>
+      <w:r>
+        <w:t xml:space="preserve">PHẦN VI. TRAO ĐỔI VÀ THẢO LUẬN (9 phút)</w:t>
       </w:r>
     </w:p>
     <w:p>
@@ -13211,14 +13605,13 @@
         </w:pict>
       </w:r>
     </w:p>
-    <w:bookmarkEnd w:id="49"/>
-    <w:bookmarkStart w:id="50" w:name="Xc1d1bfc469bd29a27f454cc5a1d0d3e81a83768"/>
+    <w:bookmarkStart w:id="51" w:name="slide-23-trao-đổi-và-thảo-luận-9"/>
     <w:p>
       <w:pPr>
         <w:pStyle w:val="Heading2"/>
       </w:pPr>
       <w:r>
-        <w:t xml:space="preserve">Slide 24 – Phụ lục A: Trí tuệ nhân tạo trong lĩnh vực lập trình (không trình bày)</w:t>
+        <w:t xml:space="preserve">Slide 23 – Trao đổi và thảo luận (9′)</w:t>
       </w:r>
     </w:p>
     <w:p>
@@ -13236,53 +13629,25 @@
         <w:t xml:space="preserve"> </w:t>
       </w:r>
       <w:r>
-        <w:t xml:space="preserve">- GitHub Octoverse 2025: hơn 180 triệu lập trình viên; hơn 36 triệu người mới trong một năm; 630 triệu kho mã; gần 1 tỷ lần đẩy mã; 4,3 triệu dự án AI</w:t>
-      </w:r>
-      <w:r>
-        <w:t xml:space="preserve"> </w:t>
-      </w:r>
-      <w:r>
-        <w:t xml:space="preserve">- Stack Overflow 2025: 84% lập trình viên dùng hoặc dự định dùng AI; 51% lập trình viên chuyên nghiệp dùng hằng ngày</w:t>
-      </w:r>
-      <w:r>
-        <w:t xml:space="preserve"> </w:t>
-      </w:r>
-      <w:r>
-        <w:t xml:space="preserve">- SWE-bench Verified (năng lực sửa lỗi phần mềm thật) tăng mạnh trong một năm –</w:t>
-      </w:r>
-      <w:r>
-        <w:t xml:space="preserve"> </w:t>
-      </w:r>
-      <w:r>
-        <w:rPr>
-          <w:iCs/>
-          <w:i/>
-        </w:rPr>
-        <w:t xml:space="preserve">kiểm tra số liệu trong bản gốc AI Index 2026 trước khi dùng</w:t>
-      </w:r>
-      <w:r>
-        <w:t xml:space="preserve"> </w:t>
-      </w:r>
-      <w:r>
-        <w:t xml:space="preserve">- Các AI Agent lập trình: Claude Code, OpenAI Codex, GitHub Copilot, Cursor</w:t>
-      </w:r>
-    </w:p>
-    <w:p>
-      <w:pPr>
-        <w:pStyle w:val="BodyText"/>
-      </w:pPr>
-      <w:r>
-        <w:rPr>
-          <w:bCs/>
-          <w:b/>
-        </w:rPr>
-        <w:t xml:space="preserve">Nguồn:</w:t>
-      </w:r>
-      <w:r>
-        <w:t xml:space="preserve"> </w:t>
-      </w:r>
-      <w:r>
-        <w:t xml:space="preserve">N1, N11, N13</w:t>
+        <w:t xml:space="preserve">- Kết quả phiếu khảo sát trước buổi học (biểu đồ)</w:t>
+      </w:r>
+      <w:r>
+        <w:t xml:space="preserve"> </w:t>
+      </w:r>
+      <w:r>
+        <w:t xml:space="preserve">- Các quy trình các phòng muốn tự động hóa</w:t>
+      </w:r>
+      <w:r>
+        <w:t xml:space="preserve"> </w:t>
+      </w:r>
+      <w:r>
+        <w:t xml:space="preserve">- Câu hỏi – góp ý – đề xuất thí điểm</w:t>
+      </w:r>
+      <w:r>
+        <w:t xml:space="preserve"> </w:t>
+      </w:r>
+      <w:r>
+        <w:t xml:space="preserve">- Đầu mối liên hệ: ______________________</w:t>
       </w:r>
     </w:p>
     <w:p>
@@ -13320,14 +13685,140 @@
         </w:pict>
       </w:r>
     </w:p>
-    <w:bookmarkEnd w:id="50"/>
-    <w:bookmarkStart w:id="51" w:name="X83b1fb41b981806eaafcf513d71488b865b192c"/>
+    <w:bookmarkEnd w:id="51"/>
+    <w:bookmarkEnd w:id="52"/>
+    <w:bookmarkStart w:id="58" w:name="phụ-lục-không-trình-bày"/>
+    <w:p>
+      <w:pPr>
+        <w:pStyle w:val="Heading1"/>
+      </w:pPr>
+      <w:r>
+        <w:t xml:space="preserve">PHỤ LỤC (không trình bày)</w:t>
+      </w:r>
+    </w:p>
+    <w:p>
+      <w:r>
+        <w:pict>
+          <v:rect style="width:0;height:1.5pt" o:hralign="center" o:hrstd="t" o:hr="t"/>
+        </w:pict>
+      </w:r>
+    </w:p>
+    <w:bookmarkStart w:id="53" w:name="Xc5e529fd4c010d30b1942a8d2129db4c84ec610"/>
     <w:p>
       <w:pPr>
         <w:pStyle w:val="Heading2"/>
       </w:pPr>
       <w:r>
-        <w:t xml:space="preserve">Slide 25 – Phụ lục B: Một số công trình nghiên cứu ứng dụng trí tuệ nhân tạo của Google (không trình bày)</w:t>
+        <w:t xml:space="preserve">Slide 24 – Phụ lục A: AI lập trình (không trình bày)</w:t>
+      </w:r>
+    </w:p>
+    <w:p>
+      <w:pPr>
+        <w:pStyle w:val="FirstParagraph"/>
+      </w:pPr>
+      <w:r>
+        <w:rPr>
+          <w:bCs/>
+          <w:b/>
+        </w:rPr>
+        <w:t xml:space="preserve">Chữ trên slide:</w:t>
+      </w:r>
+      <w:r>
+        <w:t xml:space="preserve"> </w:t>
+      </w:r>
+      <w:r>
+        <w:t xml:space="preserve">- GitHub Octoverse 2025: hơn 180 triệu lập trình viên; hơn 36 triệu người mới trong một năm; 630 triệu kho mã; gần 1 tỷ lần đẩy mã; 4,3 triệu dự án AI</w:t>
+      </w:r>
+      <w:r>
+        <w:t xml:space="preserve"> </w:t>
+      </w:r>
+      <w:r>
+        <w:t xml:space="preserve">- Stack Overflow 2025: 84% lập trình viên dùng hoặc dự định dùng AI; 51% lập trình viên chuyên nghiệp dùng hằng ngày</w:t>
+      </w:r>
+      <w:r>
+        <w:t xml:space="preserve"> </w:t>
+      </w:r>
+      <w:r>
+        <w:t xml:space="preserve">- SWE-bench Verified (năng lực sửa lỗi phần mềm thật) tăng mạnh trong một năm –</w:t>
+      </w:r>
+      <w:r>
+        <w:t xml:space="preserve"> </w:t>
+      </w:r>
+      <w:r>
+        <w:rPr>
+          <w:iCs/>
+          <w:i/>
+        </w:rPr>
+        <w:t xml:space="preserve">kiểm tra số liệu trong bản gốc AI Index 2026 trước khi dùng</w:t>
+      </w:r>
+      <w:r>
+        <w:t xml:space="preserve"> </w:t>
+      </w:r>
+      <w:r>
+        <w:t xml:space="preserve">- Các AI Agent lập trình: Claude Code, OpenAI Codex, GitHub Copilot, Cursor</w:t>
+      </w:r>
+    </w:p>
+    <w:p>
+      <w:pPr>
+        <w:pStyle w:val="BodyText"/>
+      </w:pPr>
+      <w:r>
+        <w:rPr>
+          <w:bCs/>
+          <w:b/>
+        </w:rPr>
+        <w:t xml:space="preserve">Nguồn:</w:t>
+      </w:r>
+      <w:r>
+        <w:t xml:space="preserve"> </w:t>
+      </w:r>
+      <w:r>
+        <w:t xml:space="preserve">N1, N11, N13</w:t>
+      </w:r>
+    </w:p>
+    <w:p>
+      <w:pPr>
+        <w:pStyle w:val="BodyText"/>
+      </w:pPr>
+      <w:r>
+        <w:rPr>
+          <w:bCs/>
+          <w:b/>
+        </w:rPr>
+        <w:t xml:space="preserve">Duyệt:</w:t>
+      </w:r>
+      <w:r>
+        <w:t xml:space="preserve"> </w:t>
+      </w:r>
+      <w:r>
+        <w:t xml:space="preserve">[ ] Duyệt · [ ] Sửa · [ ] Bỏ</w:t>
+      </w:r>
+      <w:r>
+        <w:t xml:space="preserve"> </w:t>
+      </w:r>
+      <w:r>
+        <w:rPr>
+          <w:bCs/>
+          <w:b/>
+        </w:rPr>
+        <w:t xml:space="preserve">Ghi chú:</w:t>
+      </w:r>
+    </w:p>
+    <w:p>
+      <w:r>
+        <w:pict>
+          <v:rect style="width:0;height:1.5pt" o:hralign="center" o:hrstd="t" o:hr="t"/>
+        </w:pict>
+      </w:r>
+    </w:p>
+    <w:bookmarkEnd w:id="53"/>
+    <w:bookmarkStart w:id="54" w:name="X6d02dea6a9e8ff5038e1983d7c74272693c420f"/>
+    <w:p>
+      <w:pPr>
+        <w:pStyle w:val="Heading2"/>
+      </w:pPr>
+      <w:r>
+        <w:t xml:space="preserve">Slide 25 – Phụ lục B: Ví dụ Google và các nhà khoa học dùng AI (không trình bày – dự phòng khi được hỏi)</w:t>
       </w:r>
     </w:p>
     <w:p>
@@ -14004,14 +14495,14 @@
         </w:pict>
       </w:r>
     </w:p>
-    <w:bookmarkEnd w:id="51"/>
-    <w:bookmarkStart w:id="52" w:name="X7613461a50d489aabc0c4f50dba778b09145968"/>
+    <w:bookmarkEnd w:id="54"/>
+    <w:bookmarkStart w:id="55" w:name="X93d551cb36b78b56d1c5628e3247657e12675ac"/>
     <w:p>
       <w:pPr>
         <w:pStyle w:val="Heading2"/>
       </w:pPr>
       <w:r>
-        <w:t xml:space="preserve">Slide 26 – Phụ lục C: Tài liệu tham khảo (không trình bày)</w:t>
+        <w:t xml:space="preserve">Slide 26 – Phụ lục C: Nguồn tham khảo (không trình bày)</w:t>
       </w:r>
     </w:p>
     <w:p>
@@ -14101,14 +14592,14 @@
         </w:pict>
       </w:r>
     </w:p>
-    <w:bookmarkEnd w:id="52"/>
-    <w:bookmarkStart w:id="53" w:name="Xad4b20d875ea3727bfbcf3964f28216f1423a66"/>
+    <w:bookmarkEnd w:id="55"/>
+    <w:bookmarkStart w:id="56" w:name="X2627c6a16089affe10a68860cf545edfc1afbe1"/>
     <w:p>
       <w:pPr>
         <w:pStyle w:val="Heading2"/>
       </w:pPr>
       <w:r>
-        <w:t xml:space="preserve">Slide 27 – Phụ lục D: Dự án minh họa và thư viện kỹ năng khoa học mở (không trình bày)</w:t>
+        <w:t xml:space="preserve">Slide 27 – Phụ lục D: Dự án và bộ Skill khoa học mở (không trình bày)</w:t>
       </w:r>
     </w:p>
     <w:p>
@@ -14182,8 +14673,8 @@
         </w:pict>
       </w:r>
     </w:p>
-    <w:bookmarkEnd w:id="53"/>
-    <w:bookmarkStart w:id="54" w:name="ý-kiến-chung-của-người-duyệt"/>
+    <w:bookmarkEnd w:id="56"/>
+    <w:bookmarkStart w:id="57" w:name="ý-kiến-chung-của-người-duyệt"/>
     <w:p>
       <w:pPr>
         <w:pStyle w:val="Heading2"/>
@@ -14240,8 +14731,8 @@
         <w:t xml:space="preserve">Người duyệt: ______________________ · Ngày: ____ / ____ / 2026</w:t>
       </w:r>
     </w:p>
-    <w:bookmarkEnd w:id="54"/>
-    <w:bookmarkEnd w:id="55"/>
+    <w:bookmarkEnd w:id="57"/>
+    <w:bookmarkEnd w:id="58"/>
     <w:sectPr/>
   </w:body>
 </w:document>

</xml_diff>

<commit_message>
Mở rộng Phần IV (đề tài mật) lên 15 phút, 4 slide; điều chỉnh toàn bộ
- Slide 20 ranh giới pháp lý (Luật Bảo vệ bí mật nhà nước 117/2025/QH15), Slide 21 mô hình ba vùng – quy trình 6 bước có điểm kiểm soát, Slide 22 minh họa 3, Slide 23 sai lầm thường gặp – phương án khác
- Rút Phần II −4′, Phần III −4′, Phần V −2′; đánh số lại; căn cứ N38
- Cập nhật tài liệu phát tay, kế hoạch, phụ lục định hướng trình bày, README

Co-Authored-By: Claude Opus 5.5 <noreply@anthropic.com>
Claude-Session: https://claude.ai/code/session_01JoSsghLRHTtvcNzYXbKpzE
</commit_message>
<xml_diff>
--- a/thuyet-trinh/DANH-SACH-SLIDE-v2.5.docx
+++ b/thuyet-trinh/DANH-SACH-SLIDE-v2.5.docx
@@ -74,7 +74,7 @@
         <w:t xml:space="preserve"> </w:t>
       </w:r>
       <w:r>
-        <w:t xml:space="preserve">24 slide trình bày + 5 phụ lục + trang bìa</w:t>
+        <w:t xml:space="preserve">27 slide trình bày + 5 phụ lục + trang bìa</w:t>
       </w:r>
       <w:r>
         <w:t xml:space="preserve"> </w:t>
@@ -137,7 +137,7 @@
         <w:t xml:space="preserve"> </w:t>
       </w:r>
       <w:r>
-        <w:t xml:space="preserve">thêm Slide 17 (mô hình 3D quá trình ăn mòn) và Slide 20 (Demo 3 – công cụ cho máy không Internet); từ slide cũ 16 trở đi số slide cộng 2; thảo luận còn 9′.</w:t>
+        <w:t xml:space="preserve">thêm Slide 17 (mô hình 3D quá trình ăn mòn) và Slide 22 (Demo 3 – công cụ cho máy không Internet); từ slide cũ 16 trở đi số slide cộng 2; thảo luận còn 9′.</w:t>
       </w:r>
       <w:r>
         <w:t xml:space="preserve"> </w:t>
@@ -198,6 +198,22 @@
       </w:r>
       <w:r>
         <w:t xml:space="preserve">Slide 7 – công cụ tìm và đọc tài liệu (Sci-Hub, Sci-Bot và lựa chọn hợp pháp); từ Slide 7 cũ trở đi số slide cộng 1; thảo luận 12′.</w:t>
+      </w:r>
+      <w:r>
+        <w:t xml:space="preserve"> </w:t>
+      </w:r>
+      <w:r>
+        <w:rPr>
+          <w:bCs/>
+          <w:b/>
+        </w:rPr>
+        <w:t xml:space="preserve">Mở rộng Phần IV (đề tài mật) lên 15′, 4 slide (20–23):</w:t>
+      </w:r>
+      <w:r>
+        <w:t xml:space="preserve"> </w:t>
+      </w:r>
+      <w:r>
+        <w:t xml:space="preserve">ranh giới pháp lý (Luật 117/2025/QH15), mô hình ba vùng, minh họa 3, sai lầm thường gặp; bù bằng cách rút Phần II −4′, Phần III −4′, Phần V −2′.</w:t>
       </w:r>
       <w:r>
         <w:t xml:space="preserve"> </w:t>
@@ -518,7 +534,7 @@
               <w:jc w:val="left"/>
             </w:pPr>
             <w:r>
-              <w:t xml:space="preserve">9, 14, 15, 16, 17, 20</w:t>
+              <w:t xml:space="preserve">9, 14, 15, 16, 17, 22</w:t>
             </w:r>
           </w:p>
         </w:tc>
@@ -694,7 +710,7 @@
               <w:jc w:val="left"/>
             </w:pPr>
             <w:r>
-              <w:t xml:space="preserve">29</w:t>
+              <w:t xml:space="preserve">32</w:t>
             </w:r>
           </w:p>
         </w:tc>
@@ -823,7 +839,7 @@
               <w:jc w:val="left"/>
             </w:pPr>
             <w:r>
-              <w:t xml:space="preserve">18, 28</w:t>
+              <w:t xml:space="preserve">18, 31</w:t>
             </w:r>
           </w:p>
         </w:tc>
@@ -1368,7 +1384,7 @@
                 <w:bCs/>
                 <w:b/>
               </w:rPr>
-              <w:t xml:space="preserve">PHẦN II. LỰA CHỌN VÀ SỬ DỤNG CÔNG CỤ AI PHÙ HỢP – 36′</w:t>
+              <w:t xml:space="preserve">PHẦN II. LỰA CHỌN VÀ SỬ DỤNG CÔNG CỤ AI PHÙ HỢP – 32′</w:t>
             </w:r>
           </w:p>
         </w:tc>
@@ -1504,6 +1520,316 @@
               <w:jc w:val="left"/>
             </w:pPr>
             <w:r>
+              <w:t xml:space="preserve">2′</w:t>
+            </w:r>
+          </w:p>
+        </w:tc>
+        <w:tc>
+          <w:tcPr/>
+          <w:p>
+            <w:pPr>
+              <w:pStyle w:val="Compact"/>
+              <w:jc w:val="left"/>
+            </w:pPr>
+            <w:r>
+              <w:t xml:space="preserve">[ ]</w:t>
+            </w:r>
+          </w:p>
+        </w:tc>
+      </w:tr>
+      <w:tr>
+        <w:tc>
+          <w:tcPr/>
+          <w:p>
+            <w:pPr>
+              <w:pStyle w:val="Compact"/>
+              <w:jc w:val="left"/>
+            </w:pPr>
+            <w:r>
+              <w:t xml:space="preserve">7</w:t>
+            </w:r>
+          </w:p>
+        </w:tc>
+        <w:tc>
+          <w:tcPr/>
+          <w:p>
+            <w:pPr>
+              <w:pStyle w:val="Compact"/>
+              <w:jc w:val="left"/>
+            </w:pPr>
+            <w:r>
+              <w:t xml:space="preserve">🆕 Tìm và đọc tài liệu khoa học: Sci-Hub, Sci-Bot và các lựa chọn hợp pháp</w:t>
+            </w:r>
+          </w:p>
+        </w:tc>
+        <w:tc>
+          <w:tcPr/>
+          <w:p>
+            <w:pPr>
+              <w:pStyle w:val="Compact"/>
+              <w:jc w:val="left"/>
+            </w:pPr>
+            <w:r>
+              <w:t xml:space="preserve">II</w:t>
+            </w:r>
+          </w:p>
+        </w:tc>
+        <w:tc>
+          <w:tcPr/>
+          <w:p>
+            <w:pPr>
+              <w:pStyle w:val="Compact"/>
+              <w:jc w:val="left"/>
+            </w:pPr>
+            <w:r>
+              <w:t xml:space="preserve">4′</w:t>
+            </w:r>
+          </w:p>
+        </w:tc>
+        <w:tc>
+          <w:tcPr/>
+          <w:p>
+            <w:pPr>
+              <w:pStyle w:val="Compact"/>
+              <w:jc w:val="left"/>
+            </w:pPr>
+            <w:r>
+              <w:t xml:space="preserve">[ ]</w:t>
+            </w:r>
+          </w:p>
+        </w:tc>
+      </w:tr>
+      <w:tr>
+        <w:tc>
+          <w:tcPr/>
+          <w:p>
+            <w:pPr>
+              <w:pStyle w:val="Compact"/>
+              <w:jc w:val="left"/>
+            </w:pPr>
+            <w:r>
+              <w:t xml:space="preserve">8</w:t>
+            </w:r>
+          </w:p>
+        </w:tc>
+        <w:tc>
+          <w:tcPr/>
+          <w:p>
+            <w:pPr>
+              <w:pStyle w:val="Compact"/>
+              <w:jc w:val="left"/>
+            </w:pPr>
+            <w:r>
+              <w:t xml:space="preserve">Giới thiệu Claude: mô hình, gói dịch vụ và tính năng nổi bật trên Windows</w:t>
+            </w:r>
+          </w:p>
+        </w:tc>
+        <w:tc>
+          <w:tcPr/>
+          <w:p>
+            <w:pPr>
+              <w:pStyle w:val="Compact"/>
+              <w:jc w:val="left"/>
+            </w:pPr>
+            <w:r>
+              <w:t xml:space="preserve">II</w:t>
+            </w:r>
+          </w:p>
+        </w:tc>
+        <w:tc>
+          <w:tcPr/>
+          <w:p>
+            <w:pPr>
+              <w:pStyle w:val="Compact"/>
+              <w:jc w:val="left"/>
+            </w:pPr>
+            <w:r>
+              <w:t xml:space="preserve">6′</w:t>
+            </w:r>
+          </w:p>
+        </w:tc>
+        <w:tc>
+          <w:tcPr/>
+          <w:p>
+            <w:pPr>
+              <w:pStyle w:val="Compact"/>
+              <w:jc w:val="left"/>
+            </w:pPr>
+            <w:r>
+              <w:t xml:space="preserve">[ ]</w:t>
+            </w:r>
+          </w:p>
+        </w:tc>
+      </w:tr>
+      <w:tr>
+        <w:tc>
+          <w:tcPr/>
+          <w:p>
+            <w:pPr>
+              <w:pStyle w:val="Compact"/>
+              <w:jc w:val="left"/>
+            </w:pPr>
+            <w:r>
+              <w:t xml:space="preserve">9</w:t>
+            </w:r>
+          </w:p>
+        </w:tc>
+        <w:tc>
+          <w:tcPr/>
+          <w:p>
+            <w:pPr>
+              <w:pStyle w:val="Compact"/>
+              <w:jc w:val="left"/>
+            </w:pPr>
+            <w:r>
+              <w:t xml:space="preserve">Bắt đầu với Claude: 6 bước đầu tiên và tổng hợp dữ liệu nhiều nguồn</w:t>
+            </w:r>
+          </w:p>
+        </w:tc>
+        <w:tc>
+          <w:tcPr/>
+          <w:p>
+            <w:pPr>
+              <w:pStyle w:val="Compact"/>
+              <w:jc w:val="left"/>
+            </w:pPr>
+            <w:r>
+              <w:t xml:space="preserve">II</w:t>
+            </w:r>
+          </w:p>
+        </w:tc>
+        <w:tc>
+          <w:tcPr/>
+          <w:p>
+            <w:pPr>
+              <w:pStyle w:val="Compact"/>
+              <w:jc w:val="left"/>
+            </w:pPr>
+            <w:r>
+              <w:t xml:space="preserve">5′</w:t>
+            </w:r>
+          </w:p>
+        </w:tc>
+        <w:tc>
+          <w:tcPr/>
+          <w:p>
+            <w:pPr>
+              <w:pStyle w:val="Compact"/>
+              <w:jc w:val="left"/>
+            </w:pPr>
+            <w:r>
+              <w:t xml:space="preserve">[ ]</w:t>
+            </w:r>
+          </w:p>
+        </w:tc>
+      </w:tr>
+      <w:tr>
+        <w:tc>
+          <w:tcPr/>
+          <w:p>
+            <w:pPr>
+              <w:pStyle w:val="Compact"/>
+              <w:jc w:val="left"/>
+            </w:pPr>
+            <w:r>
+              <w:t xml:space="preserve">10</w:t>
+            </w:r>
+          </w:p>
+        </w:tc>
+        <w:tc>
+          <w:tcPr/>
+          <w:p>
+            <w:pPr>
+              <w:pStyle w:val="Compact"/>
+              <w:jc w:val="left"/>
+            </w:pPr>
+            <w:r>
+              <w:t xml:space="preserve">Giao việc cho AI Agent: cách viết yêu cầu 5 bước</w:t>
+            </w:r>
+          </w:p>
+        </w:tc>
+        <w:tc>
+          <w:tcPr/>
+          <w:p>
+            <w:pPr>
+              <w:pStyle w:val="Compact"/>
+              <w:jc w:val="left"/>
+            </w:pPr>
+            <w:r>
+              <w:t xml:space="preserve">II</w:t>
+            </w:r>
+          </w:p>
+        </w:tc>
+        <w:tc>
+          <w:tcPr/>
+          <w:p>
+            <w:pPr>
+              <w:pStyle w:val="Compact"/>
+              <w:jc w:val="left"/>
+            </w:pPr>
+            <w:r>
+              <w:t xml:space="preserve">5′</w:t>
+            </w:r>
+          </w:p>
+        </w:tc>
+        <w:tc>
+          <w:tcPr/>
+          <w:p>
+            <w:pPr>
+              <w:pStyle w:val="Compact"/>
+              <w:jc w:val="left"/>
+            </w:pPr>
+            <w:r>
+              <w:t xml:space="preserve">[ ]</w:t>
+            </w:r>
+          </w:p>
+        </w:tc>
+      </w:tr>
+      <w:tr>
+        <w:tc>
+          <w:tcPr/>
+          <w:p>
+            <w:pPr>
+              <w:pStyle w:val="Compact"/>
+              <w:jc w:val="left"/>
+            </w:pPr>
+            <w:r>
+              <w:t xml:space="preserve">11</w:t>
+            </w:r>
+          </w:p>
+        </w:tc>
+        <w:tc>
+          <w:tcPr/>
+          <w:p>
+            <w:pPr>
+              <w:pStyle w:val="Compact"/>
+              <w:jc w:val="left"/>
+            </w:pPr>
+            <w:r>
+              <w:t xml:space="preserve">Không gian làm việc nghiên cứu: mỗi nhiệm vụ một dự án</w:t>
+            </w:r>
+          </w:p>
+        </w:tc>
+        <w:tc>
+          <w:tcPr/>
+          <w:p>
+            <w:pPr>
+              <w:pStyle w:val="Compact"/>
+              <w:jc w:val="left"/>
+            </w:pPr>
+            <w:r>
+              <w:t xml:space="preserve">II</w:t>
+            </w:r>
+          </w:p>
+        </w:tc>
+        <w:tc>
+          <w:tcPr/>
+          <w:p>
+            <w:pPr>
+              <w:pStyle w:val="Compact"/>
+              <w:jc w:val="left"/>
+            </w:pPr>
+            <w:r>
               <w:t xml:space="preserve">3′</w:t>
             </w:r>
           </w:p>
@@ -1530,19 +1856,19 @@
               <w:jc w:val="left"/>
             </w:pPr>
             <w:r>
-              <w:t xml:space="preserve">7</w:t>
-            </w:r>
-          </w:p>
-        </w:tc>
-        <w:tc>
-          <w:tcPr/>
-          <w:p>
-            <w:pPr>
-              <w:pStyle w:val="Compact"/>
-              <w:jc w:val="left"/>
-            </w:pPr>
-            <w:r>
-              <w:t xml:space="preserve">🆕 Tìm và đọc tài liệu khoa học: Sci-Hub, Sci-Bot và các lựa chọn hợp pháp</w:t>
+              <w:t xml:space="preserve">12</w:t>
+            </w:r>
+          </w:p>
+        </w:tc>
+        <w:tc>
+          <w:tcPr/>
+          <w:p>
+            <w:pPr>
+              <w:pStyle w:val="Compact"/>
+              <w:jc w:val="left"/>
+            </w:pPr>
+            <w:r>
+              <w:t xml:space="preserve">Skill, Subagent và hệ thống nhiều Agent</w:t>
             </w:r>
           </w:p>
         </w:tc>
@@ -1566,317 +1892,7 @@
               <w:jc w:val="left"/>
             </w:pPr>
             <w:r>
-              <w:t xml:space="preserve">4′</w:t>
-            </w:r>
-          </w:p>
-        </w:tc>
-        <w:tc>
-          <w:tcPr/>
-          <w:p>
-            <w:pPr>
-              <w:pStyle w:val="Compact"/>
-              <w:jc w:val="left"/>
-            </w:pPr>
-            <w:r>
-              <w:t xml:space="preserve">[ ]</w:t>
-            </w:r>
-          </w:p>
-        </w:tc>
-      </w:tr>
-      <w:tr>
-        <w:tc>
-          <w:tcPr/>
-          <w:p>
-            <w:pPr>
-              <w:pStyle w:val="Compact"/>
-              <w:jc w:val="left"/>
-            </w:pPr>
-            <w:r>
-              <w:t xml:space="preserve">8</w:t>
-            </w:r>
-          </w:p>
-        </w:tc>
-        <w:tc>
-          <w:tcPr/>
-          <w:p>
-            <w:pPr>
-              <w:pStyle w:val="Compact"/>
-              <w:jc w:val="left"/>
-            </w:pPr>
-            <w:r>
-              <w:t xml:space="preserve">Giới thiệu Claude: mô hình, gói dịch vụ và tính năng nổi bật trên Windows</w:t>
-            </w:r>
-          </w:p>
-        </w:tc>
-        <w:tc>
-          <w:tcPr/>
-          <w:p>
-            <w:pPr>
-              <w:pStyle w:val="Compact"/>
-              <w:jc w:val="left"/>
-            </w:pPr>
-            <w:r>
-              <w:t xml:space="preserve">II</w:t>
-            </w:r>
-          </w:p>
-        </w:tc>
-        <w:tc>
-          <w:tcPr/>
-          <w:p>
-            <w:pPr>
-              <w:pStyle w:val="Compact"/>
-              <w:jc w:val="left"/>
-            </w:pPr>
-            <w:r>
-              <w:t xml:space="preserve">6′</w:t>
-            </w:r>
-          </w:p>
-        </w:tc>
-        <w:tc>
-          <w:tcPr/>
-          <w:p>
-            <w:pPr>
-              <w:pStyle w:val="Compact"/>
-              <w:jc w:val="left"/>
-            </w:pPr>
-            <w:r>
-              <w:t xml:space="preserve">[ ]</w:t>
-            </w:r>
-          </w:p>
-        </w:tc>
-      </w:tr>
-      <w:tr>
-        <w:tc>
-          <w:tcPr/>
-          <w:p>
-            <w:pPr>
-              <w:pStyle w:val="Compact"/>
-              <w:jc w:val="left"/>
-            </w:pPr>
-            <w:r>
-              <w:t xml:space="preserve">9</w:t>
-            </w:r>
-          </w:p>
-        </w:tc>
-        <w:tc>
-          <w:tcPr/>
-          <w:p>
-            <w:pPr>
-              <w:pStyle w:val="Compact"/>
-              <w:jc w:val="left"/>
-            </w:pPr>
-            <w:r>
-              <w:t xml:space="preserve">Bắt đầu với Claude: 6 bước đầu tiên và tổng hợp dữ liệu nhiều nguồn</w:t>
-            </w:r>
-          </w:p>
-        </w:tc>
-        <w:tc>
-          <w:tcPr/>
-          <w:p>
-            <w:pPr>
-              <w:pStyle w:val="Compact"/>
-              <w:jc w:val="left"/>
-            </w:pPr>
-            <w:r>
-              <w:t xml:space="preserve">II</w:t>
-            </w:r>
-          </w:p>
-        </w:tc>
-        <w:tc>
-          <w:tcPr/>
-          <w:p>
-            <w:pPr>
-              <w:pStyle w:val="Compact"/>
-              <w:jc w:val="left"/>
-            </w:pPr>
-            <w:r>
-              <w:t xml:space="preserve">6′</w:t>
-            </w:r>
-          </w:p>
-        </w:tc>
-        <w:tc>
-          <w:tcPr/>
-          <w:p>
-            <w:pPr>
-              <w:pStyle w:val="Compact"/>
-              <w:jc w:val="left"/>
-            </w:pPr>
-            <w:r>
-              <w:t xml:space="preserve">[ ]</w:t>
-            </w:r>
-          </w:p>
-        </w:tc>
-      </w:tr>
-      <w:tr>
-        <w:tc>
-          <w:tcPr/>
-          <w:p>
-            <w:pPr>
-              <w:pStyle w:val="Compact"/>
-              <w:jc w:val="left"/>
-            </w:pPr>
-            <w:r>
-              <w:t xml:space="preserve">10</w:t>
-            </w:r>
-          </w:p>
-        </w:tc>
-        <w:tc>
-          <w:tcPr/>
-          <w:p>
-            <w:pPr>
-              <w:pStyle w:val="Compact"/>
-              <w:jc w:val="left"/>
-            </w:pPr>
-            <w:r>
-              <w:t xml:space="preserve">Giao việc cho AI Agent: cách viết yêu cầu 5 bước</w:t>
-            </w:r>
-          </w:p>
-        </w:tc>
-        <w:tc>
-          <w:tcPr/>
-          <w:p>
-            <w:pPr>
-              <w:pStyle w:val="Compact"/>
-              <w:jc w:val="left"/>
-            </w:pPr>
-            <w:r>
-              <w:t xml:space="preserve">II</w:t>
-            </w:r>
-          </w:p>
-        </w:tc>
-        <w:tc>
-          <w:tcPr/>
-          <w:p>
-            <w:pPr>
-              <w:pStyle w:val="Compact"/>
-              <w:jc w:val="left"/>
-            </w:pPr>
-            <w:r>
-              <w:t xml:space="preserve">6′</w:t>
-            </w:r>
-          </w:p>
-        </w:tc>
-        <w:tc>
-          <w:tcPr/>
-          <w:p>
-            <w:pPr>
-              <w:pStyle w:val="Compact"/>
-              <w:jc w:val="left"/>
-            </w:pPr>
-            <w:r>
-              <w:t xml:space="preserve">[ ]</w:t>
-            </w:r>
-          </w:p>
-        </w:tc>
-      </w:tr>
-      <w:tr>
-        <w:tc>
-          <w:tcPr/>
-          <w:p>
-            <w:pPr>
-              <w:pStyle w:val="Compact"/>
-              <w:jc w:val="left"/>
-            </w:pPr>
-            <w:r>
-              <w:t xml:space="preserve">11</w:t>
-            </w:r>
-          </w:p>
-        </w:tc>
-        <w:tc>
-          <w:tcPr/>
-          <w:p>
-            <w:pPr>
-              <w:pStyle w:val="Compact"/>
-              <w:jc w:val="left"/>
-            </w:pPr>
-            <w:r>
-              <w:t xml:space="preserve">Không gian làm việc nghiên cứu: mỗi nhiệm vụ một dự án</w:t>
-            </w:r>
-          </w:p>
-        </w:tc>
-        <w:tc>
-          <w:tcPr/>
-          <w:p>
-            <w:pPr>
-              <w:pStyle w:val="Compact"/>
-              <w:jc w:val="left"/>
-            </w:pPr>
-            <w:r>
-              <w:t xml:space="preserve">II</w:t>
-            </w:r>
-          </w:p>
-        </w:tc>
-        <w:tc>
-          <w:tcPr/>
-          <w:p>
-            <w:pPr>
-              <w:pStyle w:val="Compact"/>
-              <w:jc w:val="left"/>
-            </w:pPr>
-            <w:r>
-              <w:t xml:space="preserve">3′</w:t>
-            </w:r>
-          </w:p>
-        </w:tc>
-        <w:tc>
-          <w:tcPr/>
-          <w:p>
-            <w:pPr>
-              <w:pStyle w:val="Compact"/>
-              <w:jc w:val="left"/>
-            </w:pPr>
-            <w:r>
-              <w:t xml:space="preserve">[ ]</w:t>
-            </w:r>
-          </w:p>
-        </w:tc>
-      </w:tr>
-      <w:tr>
-        <w:tc>
-          <w:tcPr/>
-          <w:p>
-            <w:pPr>
-              <w:pStyle w:val="Compact"/>
-              <w:jc w:val="left"/>
-            </w:pPr>
-            <w:r>
-              <w:t xml:space="preserve">12</w:t>
-            </w:r>
-          </w:p>
-        </w:tc>
-        <w:tc>
-          <w:tcPr/>
-          <w:p>
-            <w:pPr>
-              <w:pStyle w:val="Compact"/>
-              <w:jc w:val="left"/>
-            </w:pPr>
-            <w:r>
-              <w:t xml:space="preserve">Skill, Subagent và hệ thống nhiều Agent</w:t>
-            </w:r>
-          </w:p>
-        </w:tc>
-        <w:tc>
-          <w:tcPr/>
-          <w:p>
-            <w:pPr>
-              <w:pStyle w:val="Compact"/>
-              <w:jc w:val="left"/>
-            </w:pPr>
-            <w:r>
-              <w:t xml:space="preserve">II</w:t>
-            </w:r>
-          </w:p>
-        </w:tc>
-        <w:tc>
-          <w:tcPr/>
-          <w:p>
-            <w:pPr>
-              <w:pStyle w:val="Compact"/>
-              <w:jc w:val="left"/>
-            </w:pPr>
-            <w:r>
-              <w:t xml:space="preserve">3′</w:t>
+              <w:t xml:space="preserve">2′</w:t>
             </w:r>
           </w:p>
         </w:tc>
@@ -1914,7 +1930,7 @@
                 <w:bCs/>
                 <w:b/>
               </w:rPr>
-              <w:t xml:space="preserve">PHẦN III. AI AGENT TRONG VÒNG ĐỜI NHIỆM VỤ KHOA HỌC – 34′</w:t>
+              <w:t xml:space="preserve">PHẦN III. AI AGENT TRONG VÒNG ĐỜI NHIỆM VỤ KHOA HỌC – 30′</w:t>
             </w:r>
           </w:p>
         </w:tc>
@@ -1988,7 +2004,7 @@
               <w:jc w:val="left"/>
             </w:pPr>
             <w:r>
-              <w:t xml:space="preserve">7′</w:t>
+              <w:t xml:space="preserve">6′</w:t>
             </w:r>
           </w:p>
         </w:tc>
@@ -2050,6 +2066,130 @@
               <w:jc w:val="left"/>
             </w:pPr>
             <w:r>
+              <w:t xml:space="preserve">5′</w:t>
+            </w:r>
+          </w:p>
+        </w:tc>
+        <w:tc>
+          <w:tcPr/>
+          <w:p>
+            <w:pPr>
+              <w:pStyle w:val="Compact"/>
+              <w:jc w:val="left"/>
+            </w:pPr>
+            <w:r>
+              <w:t xml:space="preserve">[ ]</w:t>
+            </w:r>
+          </w:p>
+        </w:tc>
+      </w:tr>
+      <w:tr>
+        <w:tc>
+          <w:tcPr/>
+          <w:p>
+            <w:pPr>
+              <w:pStyle w:val="Compact"/>
+              <w:jc w:val="left"/>
+            </w:pPr>
+            <w:r>
+              <w:t xml:space="preserve">15</w:t>
+            </w:r>
+          </w:p>
+        </w:tc>
+        <w:tc>
+          <w:tcPr/>
+          <w:p>
+            <w:pPr>
+              <w:pStyle w:val="Compact"/>
+              <w:jc w:val="left"/>
+            </w:pPr>
+            <w:r>
+              <w:t xml:space="preserve">Hồ sơ nhiệm vụ: thuyết minh, tiến độ và kinh phí theo biểu mẫu Trung tâm</w:t>
+            </w:r>
+          </w:p>
+        </w:tc>
+        <w:tc>
+          <w:tcPr/>
+          <w:p>
+            <w:pPr>
+              <w:pStyle w:val="Compact"/>
+              <w:jc w:val="left"/>
+            </w:pPr>
+            <w:r>
+              <w:t xml:space="preserve">III</w:t>
+            </w:r>
+          </w:p>
+        </w:tc>
+        <w:tc>
+          <w:tcPr/>
+          <w:p>
+            <w:pPr>
+              <w:pStyle w:val="Compact"/>
+              <w:jc w:val="left"/>
+            </w:pPr>
+            <w:r>
+              <w:t xml:space="preserve">4′</w:t>
+            </w:r>
+          </w:p>
+        </w:tc>
+        <w:tc>
+          <w:tcPr/>
+          <w:p>
+            <w:pPr>
+              <w:pStyle w:val="Compact"/>
+              <w:jc w:val="left"/>
+            </w:pPr>
+            <w:r>
+              <w:t xml:space="preserve">[ ]</w:t>
+            </w:r>
+          </w:p>
+        </w:tc>
+      </w:tr>
+      <w:tr>
+        <w:tc>
+          <w:tcPr/>
+          <w:p>
+            <w:pPr>
+              <w:pStyle w:val="Compact"/>
+              <w:jc w:val="left"/>
+            </w:pPr>
+            <w:r>
+              <w:t xml:space="preserve">16</w:t>
+            </w:r>
+          </w:p>
+        </w:tc>
+        <w:tc>
+          <w:tcPr/>
+          <w:p>
+            <w:pPr>
+              <w:pStyle w:val="Compact"/>
+              <w:jc w:val="left"/>
+            </w:pPr>
+            <w:r>
+              <w:t xml:space="preserve">Xử lý dữ liệu: AI viết và chạy mã Python – DEMO 2</w:t>
+            </w:r>
+          </w:p>
+        </w:tc>
+        <w:tc>
+          <w:tcPr/>
+          <w:p>
+            <w:pPr>
+              <w:pStyle w:val="Compact"/>
+              <w:jc w:val="left"/>
+            </w:pPr>
+            <w:r>
+              <w:t xml:space="preserve">III</w:t>
+            </w:r>
+          </w:p>
+        </w:tc>
+        <w:tc>
+          <w:tcPr/>
+          <w:p>
+            <w:pPr>
+              <w:pStyle w:val="Compact"/>
+              <w:jc w:val="left"/>
+            </w:pPr>
+            <w:r>
               <w:t xml:space="preserve">6′</w:t>
             </w:r>
           </w:p>
@@ -2076,19 +2216,19 @@
               <w:jc w:val="left"/>
             </w:pPr>
             <w:r>
-              <w:t xml:space="preserve">15</w:t>
-            </w:r>
-          </w:p>
-        </w:tc>
-        <w:tc>
-          <w:tcPr/>
-          <w:p>
-            <w:pPr>
-              <w:pStyle w:val="Compact"/>
-              <w:jc w:val="left"/>
-            </w:pPr>
-            <w:r>
-              <w:t xml:space="preserve">Hồ sơ nhiệm vụ: thuyết minh, tiến độ và kinh phí theo biểu mẫu Trung tâm</w:t>
+              <w:t xml:space="preserve">17</w:t>
+            </w:r>
+          </w:p>
+        </w:tc>
+        <w:tc>
+          <w:tcPr/>
+          <w:p>
+            <w:pPr>
+              <w:pStyle w:val="Compact"/>
+              <w:jc w:val="left"/>
+            </w:pPr>
+            <w:r>
+              <w:t xml:space="preserve">Mô hình 3D: mô phỏng quá trình ăn mòn vật liệu theo thời gian</w:t>
             </w:r>
           </w:p>
         </w:tc>
@@ -2112,193 +2252,69 @@
               <w:jc w:val="left"/>
             </w:pPr>
             <w:r>
+              <w:t xml:space="preserve">3′</w:t>
+            </w:r>
+          </w:p>
+        </w:tc>
+        <w:tc>
+          <w:tcPr/>
+          <w:p>
+            <w:pPr>
+              <w:pStyle w:val="Compact"/>
+              <w:jc w:val="left"/>
+            </w:pPr>
+            <w:r>
+              <w:t xml:space="preserve">[ ]</w:t>
+            </w:r>
+          </w:p>
+        </w:tc>
+      </w:tr>
+      <w:tr>
+        <w:tc>
+          <w:tcPr/>
+          <w:p>
+            <w:pPr>
+              <w:pStyle w:val="Compact"/>
+              <w:jc w:val="left"/>
+            </w:pPr>
+            <w:r>
+              <w:t xml:space="preserve">18</w:t>
+            </w:r>
+          </w:p>
+        </w:tc>
+        <w:tc>
+          <w:tcPr/>
+          <w:p>
+            <w:pPr>
+              <w:pStyle w:val="Compact"/>
+              <w:jc w:val="left"/>
+            </w:pPr>
+            <w:r>
+              <w:t xml:space="preserve">Công bố kết quả: bài báo và báo cáo tổng hợp theo nhiều định dạng</w:t>
+            </w:r>
+          </w:p>
+        </w:tc>
+        <w:tc>
+          <w:tcPr/>
+          <w:p>
+            <w:pPr>
+              <w:pStyle w:val="Compact"/>
+              <w:jc w:val="left"/>
+            </w:pPr>
+            <w:r>
+              <w:t xml:space="preserve">III</w:t>
+            </w:r>
+          </w:p>
+        </w:tc>
+        <w:tc>
+          <w:tcPr/>
+          <w:p>
+            <w:pPr>
+              <w:pStyle w:val="Compact"/>
+              <w:jc w:val="left"/>
+            </w:pPr>
+            <w:r>
               <w:t xml:space="preserve">4′</w:t>
-            </w:r>
-          </w:p>
-        </w:tc>
-        <w:tc>
-          <w:tcPr/>
-          <w:p>
-            <w:pPr>
-              <w:pStyle w:val="Compact"/>
-              <w:jc w:val="left"/>
-            </w:pPr>
-            <w:r>
-              <w:t xml:space="preserve">[ ]</w:t>
-            </w:r>
-          </w:p>
-        </w:tc>
-      </w:tr>
-      <w:tr>
-        <w:tc>
-          <w:tcPr/>
-          <w:p>
-            <w:pPr>
-              <w:pStyle w:val="Compact"/>
-              <w:jc w:val="left"/>
-            </w:pPr>
-            <w:r>
-              <w:t xml:space="preserve">16</w:t>
-            </w:r>
-          </w:p>
-        </w:tc>
-        <w:tc>
-          <w:tcPr/>
-          <w:p>
-            <w:pPr>
-              <w:pStyle w:val="Compact"/>
-              <w:jc w:val="left"/>
-            </w:pPr>
-            <w:r>
-              <w:t xml:space="preserve">Xử lý dữ liệu: AI viết và chạy mã Python – DEMO 2</w:t>
-            </w:r>
-          </w:p>
-        </w:tc>
-        <w:tc>
-          <w:tcPr/>
-          <w:p>
-            <w:pPr>
-              <w:pStyle w:val="Compact"/>
-              <w:jc w:val="left"/>
-            </w:pPr>
-            <w:r>
-              <w:t xml:space="preserve">III</w:t>
-            </w:r>
-          </w:p>
-        </w:tc>
-        <w:tc>
-          <w:tcPr/>
-          <w:p>
-            <w:pPr>
-              <w:pStyle w:val="Compact"/>
-              <w:jc w:val="left"/>
-            </w:pPr>
-            <w:r>
-              <w:t xml:space="preserve">7′</w:t>
-            </w:r>
-          </w:p>
-        </w:tc>
-        <w:tc>
-          <w:tcPr/>
-          <w:p>
-            <w:pPr>
-              <w:pStyle w:val="Compact"/>
-              <w:jc w:val="left"/>
-            </w:pPr>
-            <w:r>
-              <w:t xml:space="preserve">[ ]</w:t>
-            </w:r>
-          </w:p>
-        </w:tc>
-      </w:tr>
-      <w:tr>
-        <w:tc>
-          <w:tcPr/>
-          <w:p>
-            <w:pPr>
-              <w:pStyle w:val="Compact"/>
-              <w:jc w:val="left"/>
-            </w:pPr>
-            <w:r>
-              <w:t xml:space="preserve">17</w:t>
-            </w:r>
-          </w:p>
-        </w:tc>
-        <w:tc>
-          <w:tcPr/>
-          <w:p>
-            <w:pPr>
-              <w:pStyle w:val="Compact"/>
-              <w:jc w:val="left"/>
-            </w:pPr>
-            <w:r>
-              <w:t xml:space="preserve">Mô hình 3D: mô phỏng quá trình ăn mòn vật liệu theo thời gian</w:t>
-            </w:r>
-          </w:p>
-        </w:tc>
-        <w:tc>
-          <w:tcPr/>
-          <w:p>
-            <w:pPr>
-              <w:pStyle w:val="Compact"/>
-              <w:jc w:val="left"/>
-            </w:pPr>
-            <w:r>
-              <w:t xml:space="preserve">III</w:t>
-            </w:r>
-          </w:p>
-        </w:tc>
-        <w:tc>
-          <w:tcPr/>
-          <w:p>
-            <w:pPr>
-              <w:pStyle w:val="Compact"/>
-              <w:jc w:val="left"/>
-            </w:pPr>
-            <w:r>
-              <w:t xml:space="preserve">3′</w:t>
-            </w:r>
-          </w:p>
-        </w:tc>
-        <w:tc>
-          <w:tcPr/>
-          <w:p>
-            <w:pPr>
-              <w:pStyle w:val="Compact"/>
-              <w:jc w:val="left"/>
-            </w:pPr>
-            <w:r>
-              <w:t xml:space="preserve">[ ]</w:t>
-            </w:r>
-          </w:p>
-        </w:tc>
-      </w:tr>
-      <w:tr>
-        <w:tc>
-          <w:tcPr/>
-          <w:p>
-            <w:pPr>
-              <w:pStyle w:val="Compact"/>
-              <w:jc w:val="left"/>
-            </w:pPr>
-            <w:r>
-              <w:t xml:space="preserve">18</w:t>
-            </w:r>
-          </w:p>
-        </w:tc>
-        <w:tc>
-          <w:tcPr/>
-          <w:p>
-            <w:pPr>
-              <w:pStyle w:val="Compact"/>
-              <w:jc w:val="left"/>
-            </w:pPr>
-            <w:r>
-              <w:t xml:space="preserve">Công bố kết quả: bài báo và báo cáo tổng hợp theo nhiều định dạng</w:t>
-            </w:r>
-          </w:p>
-        </w:tc>
-        <w:tc>
-          <w:tcPr/>
-          <w:p>
-            <w:pPr>
-              <w:pStyle w:val="Compact"/>
-              <w:jc w:val="left"/>
-            </w:pPr>
-            <w:r>
-              <w:t xml:space="preserve">III</w:t>
-            </w:r>
-          </w:p>
-        </w:tc>
-        <w:tc>
-          <w:tcPr/>
-          <w:p>
-            <w:pPr>
-              <w:pStyle w:val="Compact"/>
-              <w:jc w:val="left"/>
-            </w:pPr>
-            <w:r>
-              <w:t xml:space="preserve">5′</w:t>
             </w:r>
           </w:p>
         </w:tc>
@@ -2398,7 +2414,7 @@
                 <w:bCs/>
                 <w:b/>
               </w:rPr>
-              <w:t xml:space="preserve">PHẦN IV. ĐỀ TÀI MẬT: ỨNG DỤNG AI KHI DỮ LIỆU KHÔNG ĐƯỢC ĐƯA LÊN INTERNET – 5′</w:t>
+              <w:t xml:space="preserve">PHẦN IV. ĐỀ TÀI MẬT: ỨNG DỤNG AI KHI DỮ LIỆU KHÔNG ĐƯỢC ĐƯA LÊN INTERNET – 15′</w:t>
             </w:r>
           </w:p>
         </w:tc>
@@ -2448,6 +2464,130 @@
               <w:jc w:val="left"/>
             </w:pPr>
             <w:r>
+              <w:t xml:space="preserve">🆕 Ranh giới pháp lý: dữ liệu mật và AI trực tuyến</w:t>
+            </w:r>
+          </w:p>
+        </w:tc>
+        <w:tc>
+          <w:tcPr/>
+          <w:p>
+            <w:pPr>
+              <w:pStyle w:val="Compact"/>
+              <w:jc w:val="left"/>
+            </w:pPr>
+            <w:r>
+              <w:t xml:space="preserve">IV</w:t>
+            </w:r>
+          </w:p>
+        </w:tc>
+        <w:tc>
+          <w:tcPr/>
+          <w:p>
+            <w:pPr>
+              <w:pStyle w:val="Compact"/>
+              <w:jc w:val="left"/>
+            </w:pPr>
+            <w:r>
+              <w:t xml:space="preserve">3′</w:t>
+            </w:r>
+          </w:p>
+        </w:tc>
+        <w:tc>
+          <w:tcPr/>
+          <w:p>
+            <w:pPr>
+              <w:pStyle w:val="Compact"/>
+              <w:jc w:val="left"/>
+            </w:pPr>
+            <w:r>
+              <w:t xml:space="preserve">[ ]</w:t>
+            </w:r>
+          </w:p>
+        </w:tc>
+      </w:tr>
+      <w:tr>
+        <w:tc>
+          <w:tcPr/>
+          <w:p>
+            <w:pPr>
+              <w:pStyle w:val="Compact"/>
+              <w:jc w:val="left"/>
+            </w:pPr>
+            <w:r>
+              <w:t xml:space="preserve">21</w:t>
+            </w:r>
+          </w:p>
+        </w:tc>
+        <w:tc>
+          <w:tcPr/>
+          <w:p>
+            <w:pPr>
+              <w:pStyle w:val="Compact"/>
+              <w:jc w:val="left"/>
+            </w:pPr>
+            <w:r>
+              <w:t xml:space="preserve">🆕 Mô hình ba vùng và quy trình 6 bước có điểm kiểm soát</w:t>
+            </w:r>
+          </w:p>
+        </w:tc>
+        <w:tc>
+          <w:tcPr/>
+          <w:p>
+            <w:pPr>
+              <w:pStyle w:val="Compact"/>
+              <w:jc w:val="left"/>
+            </w:pPr>
+            <w:r>
+              <w:t xml:space="preserve">IV</w:t>
+            </w:r>
+          </w:p>
+        </w:tc>
+        <w:tc>
+          <w:tcPr/>
+          <w:p>
+            <w:pPr>
+              <w:pStyle w:val="Compact"/>
+              <w:jc w:val="left"/>
+            </w:pPr>
+            <w:r>
+              <w:t xml:space="preserve">4′</w:t>
+            </w:r>
+          </w:p>
+        </w:tc>
+        <w:tc>
+          <w:tcPr/>
+          <w:p>
+            <w:pPr>
+              <w:pStyle w:val="Compact"/>
+              <w:jc w:val="left"/>
+            </w:pPr>
+            <w:r>
+              <w:t xml:space="preserve">[ ]</w:t>
+            </w:r>
+          </w:p>
+        </w:tc>
+      </w:tr>
+      <w:tr>
+        <w:tc>
+          <w:tcPr/>
+          <w:p>
+            <w:pPr>
+              <w:pStyle w:val="Compact"/>
+              <w:jc w:val="left"/>
+            </w:pPr>
+            <w:r>
+              <w:t xml:space="preserve">22</w:t>
+            </w:r>
+          </w:p>
+        </w:tc>
+        <w:tc>
+          <w:tcPr/>
+          <w:p>
+            <w:pPr>
+              <w:pStyle w:val="Compact"/>
+              <w:jc w:val="left"/>
+            </w:pPr>
+            <w:r>
               <w:t xml:space="preserve">Đề tài mật: xây dựng công cụ và xử lý ngay trên máy không kết nối Internet – DEMO 3</w:t>
             </w:r>
           </w:p>
@@ -2473,6 +2613,68 @@
             </w:pPr>
             <w:r>
               <w:t xml:space="preserve">5′</w:t>
+            </w:r>
+          </w:p>
+        </w:tc>
+        <w:tc>
+          <w:tcPr/>
+          <w:p>
+            <w:pPr>
+              <w:pStyle w:val="Compact"/>
+              <w:jc w:val="left"/>
+            </w:pPr>
+            <w:r>
+              <w:t xml:space="preserve">[ ]</w:t>
+            </w:r>
+          </w:p>
+        </w:tc>
+      </w:tr>
+      <w:tr>
+        <w:tc>
+          <w:tcPr/>
+          <w:p>
+            <w:pPr>
+              <w:pStyle w:val="Compact"/>
+              <w:jc w:val="left"/>
+            </w:pPr>
+            <w:r>
+              <w:t xml:space="preserve">23</w:t>
+            </w:r>
+          </w:p>
+        </w:tc>
+        <w:tc>
+          <w:tcPr/>
+          <w:p>
+            <w:pPr>
+              <w:pStyle w:val="Compact"/>
+              <w:jc w:val="left"/>
+            </w:pPr>
+            <w:r>
+              <w:t xml:space="preserve">🆕 Sai lầm thường gặp và các phương án khác</w:t>
+            </w:r>
+          </w:p>
+        </w:tc>
+        <w:tc>
+          <w:tcPr/>
+          <w:p>
+            <w:pPr>
+              <w:pStyle w:val="Compact"/>
+              <w:jc w:val="left"/>
+            </w:pPr>
+            <w:r>
+              <w:t xml:space="preserve">IV</w:t>
+            </w:r>
+          </w:p>
+        </w:tc>
+        <w:tc>
+          <w:tcPr/>
+          <w:p>
+            <w:pPr>
+              <w:pStyle w:val="Compact"/>
+              <w:jc w:val="left"/>
+            </w:pPr>
+            <w:r>
+              <w:t xml:space="preserve">3′</w:t>
             </w:r>
           </w:p>
         </w:tc>
@@ -2510,45 +2712,45 @@
                 <w:bCs/>
                 <w:b/>
               </w:rPr>
-              <w:t xml:space="preserve">PHẦN V. SKILL, KHOA HỌC MỞ VÀ TỰ ĐỘNG HÓA – 15′</w:t>
-            </w:r>
-          </w:p>
-        </w:tc>
-        <w:tc>
-          <w:tcPr/>
-          <w:p>
-            <w:pPr>
-              <w:pStyle w:val="Compact"/>
-            </w:pPr>
-          </w:p>
-        </w:tc>
-        <w:tc>
-          <w:tcPr/>
-          <w:p>
-            <w:pPr>
-              <w:pStyle w:val="Compact"/>
-            </w:pPr>
-          </w:p>
-        </w:tc>
-        <w:tc>
-          <w:tcPr/>
-          <w:p>
-            <w:pPr>
-              <w:pStyle w:val="Compact"/>
-            </w:pPr>
-          </w:p>
-        </w:tc>
-      </w:tr>
-      <w:tr>
-        <w:tc>
-          <w:tcPr/>
-          <w:p>
-            <w:pPr>
-              <w:pStyle w:val="Compact"/>
-              <w:jc w:val="left"/>
-            </w:pPr>
-            <w:r>
-              <w:t xml:space="preserve">21</w:t>
+              <w:t xml:space="preserve">PHẦN V. SKILL, KHOA HỌC MỞ VÀ TỰ ĐỘNG HÓA – 13′</w:t>
+            </w:r>
+          </w:p>
+        </w:tc>
+        <w:tc>
+          <w:tcPr/>
+          <w:p>
+            <w:pPr>
+              <w:pStyle w:val="Compact"/>
+            </w:pPr>
+          </w:p>
+        </w:tc>
+        <w:tc>
+          <w:tcPr/>
+          <w:p>
+            <w:pPr>
+              <w:pStyle w:val="Compact"/>
+            </w:pPr>
+          </w:p>
+        </w:tc>
+        <w:tc>
+          <w:tcPr/>
+          <w:p>
+            <w:pPr>
+              <w:pStyle w:val="Compact"/>
+            </w:pPr>
+          </w:p>
+        </w:tc>
+      </w:tr>
+      <w:tr>
+        <w:tc>
+          <w:tcPr/>
+          <w:p>
+            <w:pPr>
+              <w:pStyle w:val="Compact"/>
+              <w:jc w:val="left"/>
+            </w:pPr>
+            <w:r>
+              <w:t xml:space="preserve">24</w:t>
             </w:r>
           </w:p>
         </w:tc>
@@ -2584,7 +2786,7 @@
               <w:jc w:val="left"/>
             </w:pPr>
             <w:r>
-              <w:t xml:space="preserve">6′</w:t>
+              <w:t xml:space="preserve">5′</w:t>
             </w:r>
           </w:p>
         </w:tc>
@@ -2610,7 +2812,7 @@
               <w:jc w:val="left"/>
             </w:pPr>
             <w:r>
-              <w:t xml:space="preserve">22</w:t>
+              <w:t xml:space="preserve">25</w:t>
             </w:r>
           </w:p>
         </w:tc>
@@ -2646,7 +2848,7 @@
               <w:jc w:val="left"/>
             </w:pPr>
             <w:r>
-              <w:t xml:space="preserve">5′</w:t>
+              <w:t xml:space="preserve">4′</w:t>
             </w:r>
           </w:p>
         </w:tc>
@@ -2672,7 +2874,7 @@
               <w:jc w:val="left"/>
             </w:pPr>
             <w:r>
-              <w:t xml:space="preserve">23</w:t>
+              <w:t xml:space="preserve">26</w:t>
             </w:r>
           </w:p>
         </w:tc>
@@ -2784,7 +2986,7 @@
               <w:jc w:val="left"/>
             </w:pPr>
             <w:r>
-              <w:t xml:space="preserve">24</w:t>
+              <w:t xml:space="preserve">27</w:t>
             </w:r>
           </w:p>
         </w:tc>
@@ -2896,7 +3098,7 @@
               <w:jc w:val="left"/>
             </w:pPr>
             <w:r>
-              <w:t xml:space="preserve">25</w:t>
+              <w:t xml:space="preserve">28</w:t>
             </w:r>
           </w:p>
         </w:tc>
@@ -2958,7 +3160,7 @@
               <w:jc w:val="left"/>
             </w:pPr>
             <w:r>
-              <w:t xml:space="preserve">26</w:t>
+              <w:t xml:space="preserve">29</w:t>
             </w:r>
           </w:p>
         </w:tc>
@@ -3020,7 +3222,7 @@
               <w:jc w:val="left"/>
             </w:pPr>
             <w:r>
-              <w:t xml:space="preserve">27</w:t>
+              <w:t xml:space="preserve">30</w:t>
             </w:r>
           </w:p>
         </w:tc>
@@ -3082,7 +3284,7 @@
               <w:jc w:val="left"/>
             </w:pPr>
             <w:r>
-              <w:t xml:space="preserve">28</w:t>
+              <w:t xml:space="preserve">31</w:t>
             </w:r>
           </w:p>
         </w:tc>
@@ -3144,7 +3346,7 @@
               <w:jc w:val="left"/>
             </w:pPr>
             <w:r>
-              <w:t xml:space="preserve">29</w:t>
+              <w:t xml:space="preserve">32</w:t>
             </w:r>
           </w:p>
         </w:tc>
@@ -4777,13 +4979,13 @@
     </w:p>
     <w:bookmarkEnd w:id="28"/>
     <w:bookmarkEnd w:id="29"/>
-    <w:bookmarkStart w:id="38" w:name="X52d1169fc9a4f3edcc8e3f646ed780d583b262b"/>
+    <w:bookmarkStart w:id="38" w:name="Xa1d8ae570c6b4d8a7632d2cdd3fd6d3433745c3"/>
     <w:p>
       <w:pPr>
         <w:pStyle w:val="Heading1"/>
       </w:pPr>
       <w:r>
-        <w:t xml:space="preserve">PHẦN II. LỰA CHỌN VÀ SỬ DỤNG CÔNG CỤ AI PHÙ HỢP (36 phút)</w:t>
+        <w:t xml:space="preserve">PHẦN II. LỰA CHỌN VÀ SỬ DỤNG CÔNG CỤ AI PHÙ HỢP (32 phút)</w:t>
       </w:r>
     </w:p>
     <w:p>
@@ -5272,13 +5474,13 @@
       </w:r>
     </w:p>
     <w:bookmarkEnd w:id="30"/>
-    <w:bookmarkStart w:id="31" w:name="X1489f1209cb8496d49bc0b0faf962492444811d"/>
+    <w:bookmarkStart w:id="31" w:name="X24d1c09b8e484d4311ae8b168dea217e6d28e26"/>
     <w:p>
       <w:pPr>
         <w:pStyle w:val="Heading2"/>
       </w:pPr>
       <w:r>
-        <w:t xml:space="preserve">Slide 6 – Các công cụ AI phổ biến và vai trò của từng loại (3′)</w:t>
+        <w:t xml:space="preserve">Slide 6 – Các công cụ AI phổ biến và vai trò của từng loại (2′)</w:t>
       </w:r>
     </w:p>
     <w:p>
@@ -6702,13 +6904,13 @@
       </w:r>
     </w:p>
     <w:bookmarkEnd w:id="33"/>
-    <w:bookmarkStart w:id="34" w:name="X1f2fca7a4929371012e05f3d846214e7df9b297"/>
+    <w:bookmarkStart w:id="34" w:name="X804204e3a809e15549529c0e80355c3679ac91d"/>
     <w:p>
       <w:pPr>
         <w:pStyle w:val="Heading2"/>
       </w:pPr>
       <w:r>
-        <w:t xml:space="preserve">Slide 9 – Bắt đầu với Claude: 6 bước đầu tiên và tổng hợp dữ liệu nhiều nguồn (6′)</w:t>
+        <w:t xml:space="preserve">Slide 9 – Bắt đầu với Claude: 6 bước đầu tiên và tổng hợp dữ liệu nhiều nguồn (5′)</w:t>
       </w:r>
     </w:p>
     <w:p>
@@ -7793,13 +7995,13 @@
       </w:r>
     </w:p>
     <w:bookmarkEnd w:id="34"/>
-    <w:bookmarkStart w:id="35" w:name="Xa0af0395506ce5796e276f539278a944ef2c75f"/>
+    <w:bookmarkStart w:id="35" w:name="X1b19ea63da5f2e53c9ddbb9fbe1a91d56194a43"/>
     <w:p>
       <w:pPr>
         <w:pStyle w:val="Heading2"/>
       </w:pPr>
       <w:r>
-        <w:t xml:space="preserve">Slide 10 – Giao việc cho AI Agent: cách viết yêu cầu 5 bước (6′)</w:t>
+        <w:t xml:space="preserve">Slide 10 – Giao việc cho AI Agent: cách viết yêu cầu 5 bước (5′)</w:t>
       </w:r>
     </w:p>
     <w:p>
@@ -8523,7 +8725,7 @@
         <w:rPr>
           <w:rStyle w:val="VerbatimChar"/>
         </w:rPr>
-        <w:t xml:space="preserve">├── 05-ket-qua/              ← bảng, hình, mô hình 3D, kiểm tra bằng Skill                 (Slide 16, 17, 21)</w:t>
+        <w:t xml:space="preserve">├── 05-ket-qua/              ← bảng, hình, mô hình 3D, kiểm tra bằng Skill                 (Slide 16, 17, 24)</w:t>
       </w:r>
       <w:r>
         <w:br/>
@@ -8625,13 +8827,13 @@
       </w:r>
     </w:p>
     <w:bookmarkEnd w:id="36"/>
-    <w:bookmarkStart w:id="37" w:name="X95e28c2cc31a9fbdda85c56c3f8cbf25d1f1191"/>
+    <w:bookmarkStart w:id="37" w:name="Xd43cf258a8a6f26e4e2ebfab4eeebf3b2928ae9"/>
     <w:p>
       <w:pPr>
         <w:pStyle w:val="Heading2"/>
       </w:pPr>
       <w:r>
-        <w:t xml:space="preserve">Slide 12 – Skill, Subagent và hệ thống nhiều Agent (3′) –</w:t>
+        <w:t xml:space="preserve">Slide 12 – Skill, Subagent và hệ thống nhiều Agent (2′) –</w:t>
       </w:r>
       <w:r>
         <w:t xml:space="preserve"> </w:t>
@@ -8844,13 +9046,13 @@
     </w:p>
     <w:bookmarkEnd w:id="37"/>
     <w:bookmarkEnd w:id="38"/>
-    <w:bookmarkStart w:id="46" w:name="Xb76ac458eb2f403086516140cdc9f2a6c74effc"/>
+    <w:bookmarkStart w:id="46" w:name="X8f20a420af1379ad237599e2a76979ed8275dc8"/>
     <w:p>
       <w:pPr>
         <w:pStyle w:val="Heading1"/>
       </w:pPr>
       <w:r>
-        <w:t xml:space="preserve">PHẦN III. AI AGENT TRONG VÒNG ĐỜI NHIỆM VỤ KHOA HỌC (34 phút)</w:t>
+        <w:t xml:space="preserve">PHẦN III. AI AGENT TRONG VÒNG ĐỜI NHIỆM VỤ KHOA HỌC (30 phút)</w:t>
       </w:r>
     </w:p>
     <w:p>
@@ -8934,13 +9136,13 @@
         </w:pict>
       </w:r>
     </w:p>
-    <w:bookmarkStart w:id="39" w:name="Xb2bbdb2ab71873195c7690595cfbe09ab9e92fd"/>
+    <w:bookmarkStart w:id="39" w:name="X86b8179ee4983cce1e74e4be426ed43bc51a863"/>
     <w:p>
       <w:pPr>
         <w:pStyle w:val="Heading2"/>
       </w:pPr>
       <w:r>
-        <w:t xml:space="preserve">Slide 13 – Tổng quan tài liệu: từ bài báo đến khoảng trống nghiên cứu (7′)</w:t>
+        <w:t xml:space="preserve">Slide 13 – Tổng quan tài liệu: từ bài báo đến khoảng trống nghiên cứu (6′)</w:t>
       </w:r>
     </w:p>
     <w:p>
@@ -9241,13 +9443,13 @@
       </w:r>
     </w:p>
     <w:bookmarkEnd w:id="39"/>
-    <w:bookmarkStart w:id="40" w:name="X92aca80117eae73b864446d26d5774419245066"/>
+    <w:bookmarkStart w:id="40" w:name="X8d7e78c22fb4cd32c248eb2d592e06664dd5bd7"/>
     <w:p>
       <w:pPr>
         <w:pStyle w:val="Heading2"/>
       </w:pPr>
       <w:r>
-        <w:t xml:space="preserve">Slide 14 – Đề xuất nhiệm vụ: từ khoảng trống đến phiếu đề xuất và thuyết minh – DEMO 1 (6′)</w:t>
+        <w:t xml:space="preserve">Slide 14 – Đề xuất nhiệm vụ: từ khoảng trống đến phiếu đề xuất và thuyết minh – DEMO 1 (5′)</w:t>
       </w:r>
     </w:p>
     <w:p>
@@ -9717,13 +9919,13 @@
       </w:r>
     </w:p>
     <w:bookmarkEnd w:id="41"/>
-    <w:bookmarkStart w:id="42" w:name="Xacbd027a0466a8126644e875ec189c8247cbd2e"/>
+    <w:bookmarkStart w:id="42" w:name="Xae2fbca96bcb46ff2b706302da1d5a4147a88ee"/>
     <w:p>
       <w:pPr>
         <w:pStyle w:val="Heading2"/>
       </w:pPr>
       <w:r>
-        <w:t xml:space="preserve">Slide 16 – Xử lý dữ liệu: AI viết và chạy mã Python – DEMO 2 (7′)</w:t>
+        <w:t xml:space="preserve">Slide 16 – Xử lý dữ liệu: AI viết và chạy mã Python – DEMO 2 (6′)</w:t>
       </w:r>
     </w:p>
     <w:p>
@@ -10639,13 +10841,13 @@
       </w:r>
     </w:p>
     <w:bookmarkEnd w:id="43"/>
-    <w:bookmarkStart w:id="44" w:name="X3d0cb8888c77e00478e39b2807659fc7b9f359f"/>
+    <w:bookmarkStart w:id="44" w:name="X61752ef5806553cc1d9ee1f478b5f3fc10b911a"/>
     <w:p>
       <w:pPr>
         <w:pStyle w:val="Heading2"/>
       </w:pPr>
       <w:r>
-        <w:t xml:space="preserve">Slide 18 – Công bố kết quả: bài báo và báo cáo tổng hợp theo nhiều định dạng (5′)</w:t>
+        <w:t xml:space="preserve">Slide 18 – Công bố kết quả: bài báo và báo cáo tổng hợp theo nhiều định dạng (4′)</w:t>
       </w:r>
     </w:p>
     <w:p>
@@ -11208,13 +11410,13 @@
     </w:p>
     <w:bookmarkEnd w:id="45"/>
     <w:bookmarkEnd w:id="46"/>
-    <w:bookmarkStart w:id="48" w:name="X71301bc43ae8a2583ec30af40a0adfa491f7f5a"/>
+    <w:bookmarkStart w:id="51" w:name="X0014fa5bec6c78deb2d55d5cdd9b3469e0b9c66"/>
     <w:p>
       <w:pPr>
         <w:pStyle w:val="Heading1"/>
       </w:pPr>
       <w:r>
-        <w:t xml:space="preserve">PHẦN IV. ĐỀ TÀI MẬT: ỨNG DỤNG AI KHI DỮ LIỆU KHÔNG ĐƯỢC ĐƯA LÊN INTERNET (5 phút)</w:t>
+        <w:t xml:space="preserve">PHẦN IV. ĐỀ TÀI MẬT: ỨNG DỤNG AI KHI DỮ LIỆU KHÔNG ĐƯỢC ĐƯA LÊN INTERNET (15 phút)</w:t>
       </w:r>
     </w:p>
     <w:p>
@@ -11232,7 +11434,7 @@
         <w:t xml:space="preserve"> </w:t>
       </w:r>
       <w:r>
-        <w:t xml:space="preserve">tên Phần IV · Slide 20</w:t>
+        <w:t xml:space="preserve">tên Phần IV · Slide 20–23</w:t>
       </w:r>
     </w:p>
     <w:p>
@@ -11242,13 +11444,13 @@
         </w:pict>
       </w:r>
     </w:p>
-    <w:bookmarkStart w:id="47" w:name="Xdce5a0ca7e50bb4b26a7a2c21738c7913073300"/>
+    <w:bookmarkStart w:id="47" w:name="X1f3519f9b30b39f05368139bd8fbc1456ddcfef"/>
     <w:p>
       <w:pPr>
         <w:pStyle w:val="Heading2"/>
       </w:pPr>
       <w:r>
-        <w:t xml:space="preserve">Slide 20 – Đề tài mật: xây dựng công cụ và xử lý ngay trên máy không kết nối Internet – DEMO 3 (5′)</w:t>
+        <w:t xml:space="preserve">Slide 20 – Ranh giới pháp lý: dữ liệu mật và AI trực tuyến (3′)</w:t>
       </w:r>
     </w:p>
     <w:p>
@@ -11276,7 +11478,1323 @@
           <w:bCs/>
           <w:b/>
         </w:rPr>
-        <w:t xml:space="preserve">Nguyên tắc: AI viết công cụ – AI không bao giờ thấy dữ liệu thật</w:t>
+        <w:t xml:space="preserve">Luật Bảo vệ bí mật nhà nước số 117/2025/QH15</w:t>
+      </w:r>
+      <w:r>
+        <w:t xml:space="preserve"> </w:t>
+      </w:r>
+      <w:r>
+        <w:t xml:space="preserve">(hiệu lực 01/3/2026), Điều 5 – nghiêm cấm:</w:t>
+      </w:r>
+      <w:r>
+        <w:t xml:space="preserve"> </w:t>
+      </w:r>
+      <w:r>
+        <w:t xml:space="preserve">- soạn thảo, lưu giữ tài liệu có nội dung bí mật nhà nước trên máy tính, thiết bị đang kết nối Internet, mạng máy tính, mạng viễn thông (trừ mạng LAN độc lập theo quy định);</w:t>
+      </w:r>
+      <w:r>
+        <w:t xml:space="preserve"> </w:t>
+      </w:r>
+      <w:r>
+        <w:t xml:space="preserve">- sử dụng hệ thống trí tuệ nhân tạo, công nghệ mới để xâm phạm bí mật nhà nước.</w:t>
+      </w:r>
+      <w:r>
+        <w:t xml:space="preserve"> </w:t>
+      </w:r>
+      <w:r>
+        <w:t xml:space="preserve">- →</w:t>
+      </w:r>
+      <w:r>
+        <w:t xml:space="preserve"> </w:t>
+      </w:r>
+      <w:r>
+        <w:rPr>
+          <w:bCs/>
+          <w:b/>
+        </w:rPr>
+        <w:t xml:space="preserve">Dữ liệu mật không bao giờ đi vào AI trực tuyến</w:t>
+      </w:r>
+      <w:r>
+        <w:t xml:space="preserve"> </w:t>
+      </w:r>
+      <w:r>
+        <w:t xml:space="preserve">– kể cả</w:t>
+      </w:r>
+      <w:r>
+        <w:t xml:space="preserve"> </w:t>
+      </w:r>
+      <w:r>
+        <w:t xml:space="preserve">“</w:t>
+      </w:r>
+      <w:r>
+        <w:t xml:space="preserve">hỏi thử</w:t>
+      </w:r>
+      <w:r>
+        <w:t xml:space="preserve">”</w:t>
+      </w:r>
+      <w:r>
+        <w:t xml:space="preserve">, một đoạn trích hay một ảnh chụp màn hình.</w:t>
+      </w:r>
+    </w:p>
+    <w:tbl>
+      <w:tblPr>
+        <w:tblStyle w:val="Table"/>
+        <w:tblW w:type="pct" w:w="5000"/>
+        <w:tblLook w:firstRow="1" w:lastRow="0" w:firstColumn="0" w:lastColumn="0" w:noHBand="0" w:noVBand="0" w:val="0020"/>
+        <w:jc w:val="start"/>
+      </w:tblPr>
+      <w:tblGrid>
+        <w:gridCol w:w="3960"/>
+        <w:gridCol w:w="3960"/>
+      </w:tblGrid>
+      <w:tr>
+        <w:trPr>
+          <w:tblHeader w:val="true"/>
+        </w:trPr>
+        <w:tc>
+          <w:tcPr/>
+          <w:p>
+            <w:pPr>
+              <w:pStyle w:val="Compact"/>
+              <w:jc w:val="left"/>
+            </w:pPr>
+            <w:r>
+              <w:t xml:space="preserve">Được đưa cho AI trực tuyến</w:t>
+            </w:r>
+          </w:p>
+        </w:tc>
+        <w:tc>
+          <w:tcPr/>
+          <w:p>
+            <w:pPr>
+              <w:pStyle w:val="Compact"/>
+              <w:jc w:val="left"/>
+            </w:pPr>
+            <w:r>
+              <w:t xml:space="preserve">Không bao giờ đưa</w:t>
+            </w:r>
+          </w:p>
+        </w:tc>
+      </w:tr>
+      <w:tr>
+        <w:tc>
+          <w:tcPr/>
+          <w:p>
+            <w:pPr>
+              <w:pStyle w:val="Compact"/>
+              <w:jc w:val="left"/>
+            </w:pPr>
+            <w:r>
+              <w:t xml:space="preserve">Cấu trúc dữ liệu với tên cột trung tính (</w:t>
+            </w:r>
+            <w:r>
+              <w:rPr>
+                <w:rStyle w:val="VerbatimChar"/>
+              </w:rPr>
+              <w:t xml:space="preserve">do_cao_m</w:t>
+            </w:r>
+            <w:r>
+              <w:t xml:space="preserve">,</w:t>
+            </w:r>
+            <w:r>
+              <w:t xml:space="preserve"> </w:t>
+            </w:r>
+            <w:r>
+              <w:rPr>
+                <w:rStyle w:val="VerbatimChar"/>
+              </w:rPr>
+              <w:t xml:space="preserve">gio_u_ms</w:t>
+            </w:r>
+            <w:r>
+              <w:t xml:space="preserve">)</w:t>
+            </w:r>
+          </w:p>
+        </w:tc>
+        <w:tc>
+          <w:tcPr/>
+          <w:p>
+            <w:pPr>
+              <w:pStyle w:val="Compact"/>
+              <w:jc w:val="left"/>
+            </w:pPr>
+            <w:r>
+              <w:t xml:space="preserve">Giá trị số liệu thật, tọa độ, bản đồ, ảnh</w:t>
+            </w:r>
+          </w:p>
+        </w:tc>
+      </w:tr>
+      <w:tr>
+        <w:tc>
+          <w:tcPr/>
+          <w:p>
+            <w:pPr>
+              <w:pStyle w:val="Compact"/>
+              <w:jc w:val="left"/>
+            </w:pPr>
+            <w:r>
+              <w:t xml:space="preserve">Bài toán mô tả ở dạng tổng quát (</w:t>
+            </w:r>
+            <w:r>
+              <w:t xml:space="preserve">“</w:t>
+            </w:r>
+            <w:r>
+              <w:t xml:space="preserve">tìm đường tốn ít năng lượng nhất trên lưới</w:t>
+            </w:r>
+            <w:r>
+              <w:t xml:space="preserve">”</w:t>
+            </w:r>
+            <w:r>
+              <w:t xml:space="preserve">)</w:t>
+            </w:r>
+          </w:p>
+        </w:tc>
+        <w:tc>
+          <w:tcPr/>
+          <w:p>
+            <w:pPr>
+              <w:pStyle w:val="Compact"/>
+              <w:jc w:val="left"/>
+            </w:pPr>
+            <w:r>
+              <w:t xml:space="preserve">Tên đơn vị, phiên hiệu, khu vực, mục đích nhiệm vụ</w:t>
+            </w:r>
+          </w:p>
+        </w:tc>
+      </w:tr>
+      <w:tr>
+        <w:tc>
+          <w:tcPr/>
+          <w:p>
+            <w:pPr>
+              <w:pStyle w:val="Compact"/>
+              <w:jc w:val="left"/>
+            </w:pPr>
+            <w:r>
+              <w:t xml:space="preserve">Dữ liệu giả do AI sinh ra</w:t>
+            </w:r>
+          </w:p>
+        </w:tc>
+        <w:tc>
+          <w:tcPr/>
+          <w:p>
+            <w:pPr>
+              <w:pStyle w:val="Compact"/>
+              <w:jc w:val="left"/>
+            </w:pPr>
+            <w:r>
+              <w:t xml:space="preserve">Thông số kỹ thuật thật của vũ khí, trang bị</w:t>
+            </w:r>
+          </w:p>
+        </w:tc>
+      </w:tr>
+      <w:tr>
+        <w:tc>
+          <w:tcPr/>
+          <w:p>
+            <w:pPr>
+              <w:pStyle w:val="Compact"/>
+              <w:jc w:val="left"/>
+            </w:pPr>
+            <w:r>
+              <w:t xml:space="preserve">Thông báo lỗi đã tái tạo trên dữ liệu giả</w:t>
+            </w:r>
+          </w:p>
+        </w:tc>
+        <w:tc>
+          <w:tcPr/>
+          <w:p>
+            <w:pPr>
+              <w:pStyle w:val="Compact"/>
+              <w:jc w:val="left"/>
+            </w:pPr>
+            <w:r>
+              <w:t xml:space="preserve">Ảnh chụp màn hình, nhật ký lỗi, tệp kết quả từ máy mật</w:t>
+            </w:r>
+          </w:p>
+        </w:tc>
+      </w:tr>
+    </w:tbl>
+    <w:p>
+      <w:pPr>
+        <w:pStyle w:val="BlockText"/>
+      </w:pPr>
+      <w:r>
+        <w:t xml:space="preserve">⚠ Ghép nhiều thông tin tưởng như vô hại có thể suy ra thông tin mật → mô tả càng chung càng tốt; khi chưa chắc, hỏi cán bộ bảo mật trước.</w:t>
+      </w:r>
+    </w:p>
+    <w:p>
+      <w:pPr>
+        <w:pStyle w:val="FirstParagraph"/>
+      </w:pPr>
+      <w:r>
+        <w:rPr>
+          <w:bCs/>
+          <w:b/>
+        </w:rPr>
+        <w:t xml:space="preserve">Nguồn:</w:t>
+      </w:r>
+      <w:r>
+        <w:t xml:space="preserve"> </w:t>
+      </w:r>
+      <w:r>
+        <w:t xml:space="preserve">N38 (Luật 117/2025/QH15), N10 (Luật Trí tuệ nhân tạo 134/2025/QH15)</w:t>
+      </w:r>
+    </w:p>
+    <w:p>
+      <w:pPr>
+        <w:pStyle w:val="BodyText"/>
+      </w:pPr>
+      <w:r>
+        <w:rPr>
+          <w:bCs/>
+          <w:b/>
+        </w:rPr>
+        <w:t xml:space="preserve">Duyệt:</w:t>
+      </w:r>
+      <w:r>
+        <w:t xml:space="preserve"> </w:t>
+      </w:r>
+      <w:r>
+        <w:t xml:space="preserve">[ ] Duyệt · [ ] Sửa · [ ] Bỏ</w:t>
+      </w:r>
+      <w:r>
+        <w:t xml:space="preserve"> </w:t>
+      </w:r>
+      <w:r>
+        <w:rPr>
+          <w:bCs/>
+          <w:b/>
+        </w:rPr>
+        <w:t xml:space="preserve">Ghi chú:</w:t>
+      </w:r>
+    </w:p>
+    <w:p>
+      <w:r>
+        <w:pict>
+          <v:rect style="width:0;height:1.5pt" o:hralign="center" o:hrstd="t" o:hr="t"/>
+        </w:pict>
+      </w:r>
+    </w:p>
+    <w:bookmarkEnd w:id="47"/>
+    <w:bookmarkStart w:id="48" w:name="X17ef4ae97e6f1961ed6445ba6f8809014ff0c02"/>
+    <w:p>
+      <w:pPr>
+        <w:pStyle w:val="Heading2"/>
+      </w:pPr>
+      <w:r>
+        <w:t xml:space="preserve">Slide 21 – Mô hình ba vùng và quy trình 6 bước có điểm kiểm soát (4′)</w:t>
+      </w:r>
+    </w:p>
+    <w:p>
+      <w:pPr>
+        <w:pStyle w:val="FirstParagraph"/>
+      </w:pPr>
+      <w:r>
+        <w:rPr>
+          <w:bCs/>
+          <w:b/>
+        </w:rPr>
+        <w:t xml:space="preserve">Chữ trên slide:</w:t>
+      </w:r>
+      <w:r>
+        <w:t xml:space="preserve"> </w:t>
+      </w:r>
+      <w:r>
+        <w:t xml:space="preserve">-</w:t>
+      </w:r>
+      <w:r>
+        <w:t xml:space="preserve"> </w:t>
+      </w:r>
+      <w:r>
+        <w:rPr>
+          <w:bCs/>
+          <w:b/>
+        </w:rPr>
+        <w:t xml:space="preserve">Nguyên tắc: AI viết công cụ – AI không bao giờ thấy dữ liệu thật · luồng một chiều: chỉ mã đi vào, không gì đi ra</w:t>
+      </w:r>
+    </w:p>
+    <w:tbl>
+      <w:tblPr>
+        <w:tblStyle w:val="Table"/>
+        <w:tblW w:type="pct" w:w="5000"/>
+        <w:tblLook w:firstRow="1" w:lastRow="0" w:firstColumn="0" w:lastColumn="0" w:noHBand="0" w:noVBand="0" w:val="0020"/>
+        <w:jc w:val="start"/>
+      </w:tblPr>
+      <w:tblGrid>
+        <w:gridCol w:w="1980"/>
+        <w:gridCol w:w="1980"/>
+        <w:gridCol w:w="1980"/>
+        <w:gridCol w:w="1980"/>
+      </w:tblGrid>
+      <w:tr>
+        <w:trPr>
+          <w:tblHeader w:val="true"/>
+        </w:trPr>
+        <w:tc>
+          <w:tcPr/>
+          <w:p>
+            <w:pPr>
+              <w:pStyle w:val="Compact"/>
+              <w:jc w:val="left"/>
+            </w:pPr>
+            <w:r>
+              <w:t xml:space="preserve">Vùng</w:t>
+            </w:r>
+          </w:p>
+        </w:tc>
+        <w:tc>
+          <w:tcPr/>
+          <w:p>
+            <w:pPr>
+              <w:pStyle w:val="Compact"/>
+              <w:jc w:val="left"/>
+            </w:pPr>
+            <w:r>
+              <w:t xml:space="preserve">Bước</w:t>
+            </w:r>
+          </w:p>
+        </w:tc>
+        <w:tc>
+          <w:tcPr/>
+          <w:p>
+            <w:pPr>
+              <w:pStyle w:val="Compact"/>
+              <w:jc w:val="left"/>
+            </w:pPr>
+            <w:r>
+              <w:t xml:space="preserve">Điểm kiểm soát</w:t>
+            </w:r>
+          </w:p>
+        </w:tc>
+        <w:tc>
+          <w:tcPr/>
+          <w:p>
+            <w:pPr>
+              <w:pStyle w:val="Compact"/>
+              <w:jc w:val="left"/>
+            </w:pPr>
+            <w:r>
+              <w:t xml:space="preserve">Người chịu trách nhiệm</w:t>
+            </w:r>
+          </w:p>
+        </w:tc>
+      </w:tr>
+      <w:tr>
+        <w:tc>
+          <w:tcPr/>
+          <w:p>
+            <w:pPr>
+              <w:pStyle w:val="Compact"/>
+              <w:jc w:val="left"/>
+            </w:pPr>
+            <w:r>
+              <w:rPr>
+                <w:bCs/>
+                <w:b/>
+              </w:rPr>
+              <w:t xml:space="preserve">A. Máy có Internet</w:t>
+            </w:r>
+            <w:r>
+              <w:t xml:space="preserve"> </w:t>
+            </w:r>
+            <w:r>
+              <w:t xml:space="preserve">(dùng AI)</w:t>
+            </w:r>
+          </w:p>
+        </w:tc>
+        <w:tc>
+          <w:tcPr/>
+          <w:p>
+            <w:pPr>
+              <w:pStyle w:val="Compact"/>
+              <w:jc w:val="left"/>
+            </w:pPr>
+            <w:r>
+              <w:t xml:space="preserve">1. Mô tả cấu trúc dữ liệu, bài toán tổng quát</w:t>
+            </w:r>
+          </w:p>
+        </w:tc>
+        <w:tc>
+          <w:tcPr/>
+          <w:p>
+            <w:pPr>
+              <w:pStyle w:val="Compact"/>
+              <w:jc w:val="left"/>
+            </w:pPr>
+            <w:r>
+              <w:t xml:space="preserve">Rà soát mô tả trước khi gửi (bảng</w:t>
+            </w:r>
+            <w:r>
+              <w:t xml:space="preserve"> </w:t>
+            </w:r>
+            <w:r>
+              <w:t xml:space="preserve">“</w:t>
+            </w:r>
+            <w:r>
+              <w:t xml:space="preserve">được – không được</w:t>
+            </w:r>
+            <w:r>
+              <w:t xml:space="preserve">”</w:t>
+            </w:r>
+            <w:r>
+              <w:t xml:space="preserve"> </w:t>
+            </w:r>
+            <w:r>
+              <w:t xml:space="preserve">Slide 20)</w:t>
+            </w:r>
+          </w:p>
+        </w:tc>
+        <w:tc>
+          <w:tcPr/>
+          <w:p>
+            <w:pPr>
+              <w:pStyle w:val="Compact"/>
+              <w:jc w:val="left"/>
+            </w:pPr>
+            <w:r>
+              <w:t xml:space="preserve">Chủ nhiệm nhiệm vụ</w:t>
+            </w:r>
+          </w:p>
+        </w:tc>
+      </w:tr>
+      <w:tr>
+        <w:tc>
+          <w:tcPr/>
+          <w:p>
+            <w:pPr>
+              <w:pStyle w:val="Compact"/>
+            </w:pPr>
+          </w:p>
+        </w:tc>
+        <w:tc>
+          <w:tcPr/>
+          <w:p>
+            <w:pPr>
+              <w:pStyle w:val="Compact"/>
+              <w:jc w:val="left"/>
+            </w:pPr>
+            <w:r>
+              <w:t xml:space="preserve">2. AI viết công cụ, sinh dữ liệu giả, chạy thử</w:t>
+            </w:r>
+          </w:p>
+        </w:tc>
+        <w:tc>
+          <w:tcPr/>
+          <w:p>
+            <w:pPr>
+              <w:pStyle w:val="Compact"/>
+              <w:jc w:val="left"/>
+            </w:pPr>
+            <w:r>
+              <w:t xml:space="preserve">Chỉ dùng thư viện được phép; không gọi mạng</w:t>
+            </w:r>
+          </w:p>
+        </w:tc>
+        <w:tc>
+          <w:tcPr/>
+          <w:p>
+            <w:pPr>
+              <w:pStyle w:val="Compact"/>
+              <w:jc w:val="left"/>
+            </w:pPr>
+            <w:r>
+              <w:t xml:space="preserve">Chủ nhiệm nhiệm vụ</w:t>
+            </w:r>
+          </w:p>
+        </w:tc>
+      </w:tr>
+      <w:tr>
+        <w:tc>
+          <w:tcPr/>
+          <w:p>
+            <w:pPr>
+              <w:pStyle w:val="Compact"/>
+            </w:pPr>
+          </w:p>
+        </w:tc>
+        <w:tc>
+          <w:tcPr/>
+          <w:p>
+            <w:pPr>
+              <w:pStyle w:val="Compact"/>
+              <w:jc w:val="left"/>
+            </w:pPr>
+            <w:r>
+              <w:t xml:space="preserve">3. Đọc mã; chạy chương trình</w:t>
+            </w:r>
+            <w:r>
+              <w:t xml:space="preserve"> </w:t>
+            </w:r>
+            <w:r>
+              <w:rPr>
+                <w:bCs/>
+                <w:b/>
+              </w:rPr>
+              <w:t xml:space="preserve">quét mã</w:t>
+            </w:r>
+          </w:p>
+        </w:tc>
+        <w:tc>
+          <w:tcPr/>
+          <w:p>
+            <w:pPr>
+              <w:pStyle w:val="Compact"/>
+              <w:jc w:val="left"/>
+            </w:pPr>
+            <w:r>
+              <w:t xml:space="preserve">Không thư viện mạng, không lệnh hệ thống, không địa chỉ web</w:t>
+            </w:r>
+          </w:p>
+        </w:tc>
+        <w:tc>
+          <w:tcPr/>
+          <w:p>
+            <w:pPr>
+              <w:pStyle w:val="Compact"/>
+              <w:jc w:val="left"/>
+            </w:pPr>
+            <w:r>
+              <w:t xml:space="preserve">Chủ nhiệm + cán bộ CNTT</w:t>
+            </w:r>
+          </w:p>
+        </w:tc>
+      </w:tr>
+      <w:tr>
+        <w:tc>
+          <w:tcPr/>
+          <w:p>
+            <w:pPr>
+              <w:pStyle w:val="Compact"/>
+            </w:pPr>
+          </w:p>
+        </w:tc>
+        <w:tc>
+          <w:tcPr/>
+          <w:p>
+            <w:pPr>
+              <w:pStyle w:val="Compact"/>
+              <w:jc w:val="left"/>
+            </w:pPr>
+            <w:r>
+              <w:t xml:space="preserve">4. Đóng gói +</w:t>
+            </w:r>
+            <w:r>
+              <w:t xml:space="preserve"> </w:t>
+            </w:r>
+            <w:r>
+              <w:rPr>
+                <w:bCs/>
+                <w:b/>
+              </w:rPr>
+              <w:t xml:space="preserve">mã băm SHA-256</w:t>
+            </w:r>
+          </w:p>
+        </w:tc>
+        <w:tc>
+          <w:tcPr/>
+          <w:p>
+            <w:pPr>
+              <w:pStyle w:val="Compact"/>
+              <w:jc w:val="left"/>
+            </w:pPr>
+            <w:r>
+              <w:t xml:space="preserve">Danh sách tệp, mã băm ghi sổ</w:t>
+            </w:r>
+          </w:p>
+        </w:tc>
+        <w:tc>
+          <w:tcPr/>
+          <w:p>
+            <w:pPr>
+              <w:pStyle w:val="Compact"/>
+              <w:jc w:val="left"/>
+            </w:pPr>
+            <w:r>
+              <w:t xml:space="preserve">Cán bộ CNTT</w:t>
+            </w:r>
+          </w:p>
+        </w:tc>
+      </w:tr>
+      <w:tr>
+        <w:tc>
+          <w:tcPr/>
+          <w:p>
+            <w:pPr>
+              <w:pStyle w:val="Compact"/>
+              <w:jc w:val="left"/>
+            </w:pPr>
+            <w:r>
+              <w:rPr>
+                <w:bCs/>
+                <w:b/>
+              </w:rPr>
+              <w:t xml:space="preserve">B. Chuyển giao</w:t>
+            </w:r>
+          </w:p>
+        </w:tc>
+        <w:tc>
+          <w:tcPr/>
+          <w:p>
+            <w:pPr>
+              <w:pStyle w:val="Compact"/>
+              <w:jc w:val="left"/>
+            </w:pPr>
+            <w:r>
+              <w:t xml:space="preserve">5. Chép sang máy mật</w:t>
+            </w:r>
+          </w:p>
+        </w:tc>
+        <w:tc>
+          <w:tcPr/>
+          <w:p>
+            <w:pPr>
+              <w:pStyle w:val="Compact"/>
+              <w:jc w:val="left"/>
+            </w:pPr>
+            <w:r>
+              <w:t xml:space="preserve">Thiết bị lưu trữ được cấp phép, quét mã độc, sổ theo dõi;</w:t>
+            </w:r>
+            <w:r>
+              <w:t xml:space="preserve"> </w:t>
+            </w:r>
+            <w:r>
+              <w:rPr>
+                <w:bCs/>
+                <w:b/>
+              </w:rPr>
+              <w:t xml:space="preserve">đối chiếu mã băm</w:t>
+            </w:r>
+          </w:p>
+        </w:tc>
+        <w:tc>
+          <w:tcPr/>
+          <w:p>
+            <w:pPr>
+              <w:pStyle w:val="Compact"/>
+              <w:jc w:val="left"/>
+            </w:pPr>
+            <w:r>
+              <w:t xml:space="preserve">Cán bộ bảo mật</w:t>
+            </w:r>
+          </w:p>
+        </w:tc>
+      </w:tr>
+      <w:tr>
+        <w:tc>
+          <w:tcPr/>
+          <w:p>
+            <w:pPr>
+              <w:pStyle w:val="Compact"/>
+              <w:jc w:val="left"/>
+            </w:pPr>
+            <w:r>
+              <w:rPr>
+                <w:bCs/>
+                <w:b/>
+              </w:rPr>
+              <w:t xml:space="preserve">C. Máy không kết nối Internet</w:t>
+            </w:r>
+            <w:r>
+              <w:t xml:space="preserve"> </w:t>
+            </w:r>
+            <w:r>
+              <w:t xml:space="preserve">(hoặc mạng LAN độc lập)</w:t>
+            </w:r>
+          </w:p>
+        </w:tc>
+        <w:tc>
+          <w:tcPr/>
+          <w:p>
+            <w:pPr>
+              <w:pStyle w:val="Compact"/>
+              <w:jc w:val="left"/>
+            </w:pPr>
+            <w:r>
+              <w:t xml:space="preserve">6. Chạy với dữ liệu thật</w:t>
+            </w:r>
+          </w:p>
+        </w:tc>
+        <w:tc>
+          <w:tcPr/>
+          <w:p>
+            <w:pPr>
+              <w:pStyle w:val="Compact"/>
+              <w:jc w:val="left"/>
+            </w:pPr>
+            <w:r>
+              <w:t xml:space="preserve">Báo cáo tự ghi mã băm của dữ liệu, cấu hình → truy vết được; kết quả lưu tại chỗ</w:t>
+            </w:r>
+          </w:p>
+        </w:tc>
+        <w:tc>
+          <w:tcPr/>
+          <w:p>
+            <w:pPr>
+              <w:pStyle w:val="Compact"/>
+              <w:jc w:val="left"/>
+            </w:pPr>
+            <w:r>
+              <w:t xml:space="preserve">Chủ nhiệm nhiệm vụ</w:t>
+            </w:r>
+          </w:p>
+        </w:tc>
+      </w:tr>
+    </w:tbl>
+    <w:p>
+      <w:pPr>
+        <w:numPr>
+          <w:ilvl w:val="0"/>
+          <w:numId w:val="1005"/>
+        </w:numPr>
+        <w:pStyle w:val="Compact"/>
+      </w:pPr>
+      <w:r>
+        <w:t xml:space="preserve">Sửa công cụ: quay lại vùng A với dữ liệu giả → đóng gói lại → mã băm mới.</w:t>
+      </w:r>
+    </w:p>
+    <w:p>
+      <w:pPr>
+        <w:pStyle w:val="FirstParagraph"/>
+      </w:pPr>
+      <w:r>
+        <w:rPr>
+          <w:bCs/>
+          <w:b/>
+        </w:rPr>
+        <w:t xml:space="preserve">Hình ảnh:</w:t>
+      </w:r>
+      <w:r>
+        <w:t xml:space="preserve"> </w:t>
+      </w:r>
+      <w:r>
+        <w:t xml:space="preserve">sơ đồ ba vùng A – B – C, mũi tên một chiều A → C.</w:t>
+      </w:r>
+    </w:p>
+    <w:p>
+      <w:pPr>
+        <w:pStyle w:val="BodyText"/>
+      </w:pPr>
+      <w:r>
+        <w:rPr>
+          <w:bCs/>
+          <w:b/>
+        </w:rPr>
+        <w:t xml:space="preserve">Duyệt:</w:t>
+      </w:r>
+      <w:r>
+        <w:t xml:space="preserve"> </w:t>
+      </w:r>
+      <w:r>
+        <w:t xml:space="preserve">[ ] Duyệt · [ ] Sửa · [ ] Bỏ</w:t>
+      </w:r>
+      <w:r>
+        <w:t xml:space="preserve"> </w:t>
+      </w:r>
+      <w:r>
+        <w:rPr>
+          <w:bCs/>
+          <w:b/>
+        </w:rPr>
+        <w:t xml:space="preserve">Ghi chú:</w:t>
+      </w:r>
+    </w:p>
+    <w:p>
+      <w:r>
+        <w:pict>
+          <v:rect style="width:0;height:1.5pt" o:hralign="center" o:hrstd="t" o:hr="t"/>
+        </w:pict>
+      </w:r>
+    </w:p>
+    <w:bookmarkEnd w:id="48"/>
+    <w:bookmarkStart w:id="49" w:name="Xbdb4c9c42cf5b0b68a21832623de9ea47ef158c"/>
+    <w:p>
+      <w:pPr>
+        <w:pStyle w:val="Heading2"/>
+      </w:pPr>
+      <w:r>
+        <w:t xml:space="preserve">Slide 22 – Đề tài mật: xây dựng công cụ và xử lý ngay trên máy không kết nối Internet – DEMO 3 (5′)</w:t>
+      </w:r>
+    </w:p>
+    <w:p>
+      <w:pPr>
+        <w:pStyle w:val="FirstParagraph"/>
+      </w:pPr>
+      <w:r>
+        <w:rPr>
+          <w:bCs/>
+          <w:b/>
+        </w:rPr>
+        <w:t xml:space="preserve">Chữ trên slide:</w:t>
+      </w:r>
+      <w:r>
+        <w:t xml:space="preserve"> </w:t>
+      </w:r>
+      <w:r>
+        <w:t xml:space="preserve">- 🧪</w:t>
+      </w:r>
+      <w:r>
+        <w:t xml:space="preserve"> </w:t>
+      </w:r>
+      <w:r>
+        <w:rPr>
+          <w:bCs/>
+          <w:b/>
+        </w:rPr>
+        <w:t xml:space="preserve">Bài toán (dữ liệu giả lập):</w:t>
+      </w:r>
+      <w:r>
+        <w:t xml:space="preserve"> </w:t>
+      </w:r>
+      <w:r>
+        <w:rPr>
+          <w:iCs/>
+          <w:i/>
+        </w:rPr>
+        <w:t xml:space="preserve">Ảnh hưởng của địa hình và khí hậu nhiệt đới đến lộ trình của thiết bị bay không người lái</w:t>
+      </w:r>
+      <w:r>
+        <w:t xml:space="preserve"> </w:t>
+      </w:r>
+      <w:r>
+        <w:t xml:space="preserve">-</w:t>
+      </w:r>
+      <w:r>
+        <w:t xml:space="preserve"> </w:t>
+      </w:r>
+      <w:r>
+        <w:rPr>
+          <w:bCs/>
+          <w:b/>
+        </w:rPr>
+        <w:t xml:space="preserve">Công cụ AI viết</w:t>
+      </w:r>
+      <w:r>
+        <w:t xml:space="preserve"> </w:t>
+      </w:r>
+      <w:r>
+        <w:t xml:space="preserve">(chỉ dùng numpy, matplotlib): tìm lộ trình tốn ít năng lượng nhất, tránh núi cao, ổ mưa dông, gió mạnh; tính ảnh hưởng của gió, mưa, nhiệt độ – độ ẩm, leo cao; kiểm tra pin chiều đi, chiều về</w:t>
+      </w:r>
+      <w:r>
+        <w:t xml:space="preserve"> </w:t>
+      </w:r>
+      <w:r>
+        <w:t xml:space="preserve">- 📊</w:t>
+      </w:r>
+      <w:r>
+        <w:t xml:space="preserve"> </w:t>
+      </w:r>
+      <w:r>
+        <w:rPr>
+          <w:bCs/>
+          <w:b/>
+        </w:rPr>
+        <w:t xml:space="preserve">Kết quả:</w:t>
+      </w:r>
+      <w:r>
+        <w:t xml:space="preserve"> </w:t>
+      </w:r>
+      <w:r>
+        <w:t xml:space="preserve">- Đường thẳng cắt qua</w:t>
+      </w:r>
+      <w:r>
+        <w:t xml:space="preserve"> </w:t>
+      </w:r>
+      <w:r>
+        <w:rPr>
+          <w:bCs/>
+          <w:b/>
+        </w:rPr>
+        <w:t xml:space="preserve">8 ô cấm bay</w:t>
+      </w:r>
+      <w:r>
+        <w:t xml:space="preserve"> </w:t>
+      </w:r>
+      <w:r>
+        <w:t xml:space="preserve">→ lộ trình vòng qua đèo: 14,5 km, 240 Wh</w:t>
+      </w:r>
+      <w:r>
+        <w:t xml:space="preserve"> </w:t>
+      </w:r>
+      <w:r>
+        <w:t xml:space="preserve">- Chiều về ngược gió mùa:</w:t>
+      </w:r>
+      <w:r>
+        <w:t xml:space="preserve"> </w:t>
+      </w:r>
+      <w:r>
+        <w:rPr>
+          <w:bCs/>
+          <w:b/>
+        </w:rPr>
+        <w:t xml:space="preserve">422 Wh – gấp 1,8 lần chiều đi</w:t>
+      </w:r>
+      <w:r>
+        <w:t xml:space="preserve"> </w:t>
+      </w:r>
+      <w:r>
+        <w:t xml:space="preserve">→ không đủ pin, phải đổi phương án</w:t>
+      </w:r>
+      <w:r>
+        <w:t xml:space="preserve"> </w:t>
+      </w:r>
+      <w:r>
+        <w:t xml:space="preserve">- Chạy ~3 giây trên máy tính thường, không cần mạng</w:t>
+      </w:r>
+      <w:r>
+        <w:t xml:space="preserve"> </w:t>
+      </w:r>
+      <w:r>
+        <w:t xml:space="preserve">- 🔒</w:t>
+      </w:r>
+      <w:r>
+        <w:t xml:space="preserve"> </w:t>
+      </w:r>
+      <w:r>
+        <w:rPr>
+          <w:bCs/>
+          <w:b/>
+        </w:rPr>
+        <w:t xml:space="preserve">Kiểm tra an toàn đã chạy:</w:t>
+      </w:r>
+      <w:r>
+        <w:t xml:space="preserve"> </w:t>
+      </w:r>
+      <w:r>
+        <w:t xml:space="preserve">quét mã →</w:t>
+      </w:r>
+      <w:r>
+        <w:t xml:space="preserve"> </w:t>
+      </w:r>
+      <w:r>
+        <w:t xml:space="preserve">“</w:t>
+      </w:r>
+      <w:r>
+        <w:t xml:space="preserve">không phát hiện kết nối mạng</w:t>
+      </w:r>
+      <w:r>
+        <w:t xml:space="preserve">”</w:t>
+      </w:r>
+      <w:r>
+        <w:t xml:space="preserve">; thử chèn</w:t>
+      </w:r>
+      <w:r>
+        <w:t xml:space="preserve"> </w:t>
+      </w:r>
+      <w:r>
+        <w:rPr>
+          <w:rStyle w:val="VerbatimChar"/>
+        </w:rPr>
+        <w:t xml:space="preserve">import requests</w:t>
+      </w:r>
+      <w:r>
+        <w:t xml:space="preserve"> </w:t>
+      </w:r>
+      <w:r>
+        <w:t xml:space="preserve">→</w:t>
+      </w:r>
+      <w:r>
+        <w:t xml:space="preserve"> </w:t>
+      </w:r>
+      <w:r>
+        <w:rPr>
+          <w:bCs/>
+          <w:b/>
+        </w:rPr>
+        <w:t xml:space="preserve">bị chặn</w:t>
+      </w:r>
+      <w:r>
+        <w:t xml:space="preserve">; đối chiếu mã băm trên máy đích →</w:t>
+      </w:r>
+      <w:r>
+        <w:t xml:space="preserve"> </w:t>
+      </w:r>
+      <w:r>
+        <w:rPr>
+          <w:bCs/>
+          <w:b/>
+        </w:rPr>
+        <w:t xml:space="preserve">KHỚP</w:t>
+      </w:r>
+      <w:r>
+        <w:t xml:space="preserve"> </w:t>
+      </w:r>
+      <w:r>
+        <w:t xml:space="preserve">- 🎯</w:t>
+      </w:r>
+      <w:r>
+        <w:t xml:space="preserve"> </w:t>
+      </w:r>
+      <w:r>
+        <w:rPr>
+          <w:bCs/>
+          <w:b/>
+        </w:rPr>
+        <w:t xml:space="preserve">Trọng tâm là quy trình</w:t>
+      </w:r>
+      <w:r>
+        <w:t xml:space="preserve"> </w:t>
+      </w:r>
+      <w:r>
+        <w:t xml:space="preserve">– mô hình bay đã đơn giản hóa; đơn vị thay bằng mô hình và thông số của mình.</w:t>
+      </w:r>
+    </w:p>
+    <w:p>
+      <w:pPr>
+        <w:pStyle w:val="BodyText"/>
+      </w:pPr>
+      <w:r>
+        <w:rPr>
+          <w:bCs/>
+          <w:b/>
+        </w:rPr>
+        <w:t xml:space="preserve">Hình ảnh:</w:t>
+      </w:r>
+      <w:r>
+        <w:t xml:space="preserve"> </w:t>
+      </w:r>
+      <w:r>
+        <w:rPr>
+          <w:rStyle w:val="VerbatimChar"/>
+        </w:rPr>
+        <w:t xml:space="preserve">thuyet-trinh/ket-qua-demo/may-cach-ly/ban_do_lo_trinh.png</w:t>
+      </w:r>
+      <w:r>
+        <w:t xml:space="preserve">; ảnh báo cáo có dòng mã băm.</w:t>
+      </w:r>
+    </w:p>
+    <w:p>
+      <w:pPr>
+        <w:pStyle w:val="BodyText"/>
+      </w:pPr>
+      <w:r>
+        <w:rPr>
+          <w:bCs/>
+          <w:b/>
+        </w:rPr>
+        <w:t xml:space="preserve">🎬 Trình chiếu:</w:t>
+      </w:r>
+      <w:r>
+        <w:t xml:space="preserve"> </w:t>
+      </w:r>
+      <w:r>
+        <w:t xml:space="preserve">ảnh bản đồ lộ trình + báo cáo; ảnh màn hình chương trình quét mã và đối chiếu mã băm (câu lệnh:</w:t>
+      </w:r>
+      <w:r>
+        <w:t xml:space="preserve"> </w:t>
+      </w:r>
+      <w:r>
+        <w:rPr>
+          <w:rStyle w:val="VerbatimChar"/>
+        </w:rPr>
+        <w:t xml:space="preserve">cau-lenh-demo.md</w:t>
+      </w:r>
+      <w:r>
+        <w:t xml:space="preserve"> </w:t>
+      </w:r>
+      <w:r>
+        <w:t xml:space="preserve">mục 13; mã:</w:t>
+      </w:r>
+      <w:r>
+        <w:t xml:space="preserve"> </w:t>
+      </w:r>
+      <w:r>
+        <w:rPr>
+          <w:rStyle w:val="VerbatimChar"/>
+        </w:rPr>
+        <w:t xml:space="preserve">thuyet-trinh/ma-nguon-demo/may-cach-ly/</w:t>
+      </w:r>
+      <w:r>
+        <w:t xml:space="preserve">).</w:t>
+      </w:r>
+    </w:p>
+    <w:p>
+      <w:pPr>
+        <w:pStyle w:val="BodyText"/>
+      </w:pPr>
+      <w:r>
+        <w:rPr>
+          <w:bCs/>
+          <w:b/>
+        </w:rPr>
+        <w:t xml:space="preserve">Duyệt:</w:t>
+      </w:r>
+      <w:r>
+        <w:t xml:space="preserve"> </w:t>
+      </w:r>
+      <w:r>
+        <w:t xml:space="preserve">[ ] Duyệt · [ ] Sửa · [ ] Bỏ</w:t>
+      </w:r>
+      <w:r>
+        <w:t xml:space="preserve"> </w:t>
+      </w:r>
+      <w:r>
+        <w:rPr>
+          <w:bCs/>
+          <w:b/>
+        </w:rPr>
+        <w:t xml:space="preserve">Ghi chú:</w:t>
+      </w:r>
+    </w:p>
+    <w:p>
+      <w:r>
+        <w:pict>
+          <v:rect style="width:0;height:1.5pt" o:hralign="center" o:hrstd="t" o:hr="t"/>
+        </w:pict>
+      </w:r>
+    </w:p>
+    <w:bookmarkEnd w:id="49"/>
+    <w:bookmarkStart w:id="50" w:name="X854607e9086b793b76053ed81bd2959e7fc81cb"/>
+    <w:p>
+      <w:pPr>
+        <w:pStyle w:val="Heading2"/>
+      </w:pPr>
+      <w:r>
+        <w:t xml:space="preserve">Slide 23 – Sai lầm thường gặp và các phương án khác (3′)</w:t>
+      </w:r>
+    </w:p>
+    <w:p>
+      <w:pPr>
+        <w:pStyle w:val="FirstParagraph"/>
+      </w:pPr>
+      <w:r>
+        <w:rPr>
+          <w:bCs/>
+          <w:b/>
+        </w:rPr>
+        <w:t xml:space="preserve">Chữ trên slide:</w:t>
+      </w:r>
+    </w:p>
+    <w:p>
+      <w:pPr>
+        <w:pStyle w:val="BodyText"/>
+      </w:pPr>
+      <w:r>
+        <w:rPr>
+          <w:bCs/>
+          <w:b/>
+        </w:rPr>
+        <w:t xml:space="preserve">Năm sai lầm dễ làm lộ dữ liệu:</w:t>
+      </w:r>
+      <w:r>
+        <w:t xml:space="preserve"> </w:t>
+      </w:r>
+      <w:r>
+        <w:t xml:space="preserve">1. Chụp màn hình, dán đoạn trích tài liệu mật để</w:t>
+      </w:r>
+      <w:r>
+        <w:t xml:space="preserve"> </w:t>
+      </w:r>
+      <w:r>
+        <w:t xml:space="preserve">“</w:t>
+      </w:r>
+      <w:r>
+        <w:t xml:space="preserve">hỏi nhanh</w:t>
+      </w:r>
+      <w:r>
+        <w:t xml:space="preserve">”</w:t>
+      </w:r>
+      <w:r>
+        <w:t xml:space="preserve"> </w:t>
+      </w:r>
+      <w:r>
+        <w:t xml:space="preserve">AI</w:t>
+      </w:r>
+      <w:r>
+        <w:t xml:space="preserve"> </w:t>
+      </w:r>
+      <w:r>
+        <w:t xml:space="preserve">2. Dùng</w:t>
+      </w:r>
+      <w:r>
+        <w:t xml:space="preserve"> </w:t>
+      </w:r>
+      <w:r>
+        <w:rPr>
+          <w:bCs/>
+          <w:b/>
+        </w:rPr>
+        <w:t xml:space="preserve">Cowork</w:t>
+      </w:r>
+      <w:r>
+        <w:t xml:space="preserve">, tiện ích AI trong trình duyệt, tính năng</w:t>
+      </w:r>
+      <w:r>
+        <w:t xml:space="preserve"> </w:t>
+      </w:r>
+      <w:r>
+        <w:rPr>
+          <w:bCs/>
+          <w:b/>
+        </w:rPr>
+        <w:t xml:space="preserve">sử dụng máy tính</w:t>
+      </w:r>
+      <w:r>
+        <w:t xml:space="preserve"> </w:t>
+      </w:r>
+      <w:r>
+        <w:t xml:space="preserve">trên máy có tài liệu mật – AI đọc được mọi tệp trong thư mục được cấp quyền</w:t>
+      </w:r>
+      <w:r>
+        <w:t xml:space="preserve"> </w:t>
+      </w:r>
+      <w:r>
+        <w:t xml:space="preserve">3. Bật</w:t>
+      </w:r>
+      <w:r>
+        <w:t xml:space="preserve"> </w:t>
+      </w:r>
+      <w:r>
+        <w:rPr>
+          <w:bCs/>
+          <w:b/>
+        </w:rPr>
+        <w:t xml:space="preserve">đồng bộ đám mây</w:t>
+      </w:r>
+      <w:r>
+        <w:t xml:space="preserve"> </w:t>
+      </w:r>
+      <w:r>
+        <w:t xml:space="preserve">(OneDrive, Google Drive) hoặc</w:t>
+      </w:r>
+      <w:r>
+        <w:t xml:space="preserve"> </w:t>
+      </w:r>
+      <w:r>
+        <w:rPr>
+          <w:bCs/>
+          <w:b/>
+        </w:rPr>
+        <w:t xml:space="preserve">Kết nối (Connectors)</w:t>
+      </w:r>
+      <w:r>
+        <w:t xml:space="preserve"> </w:t>
+      </w:r>
+      <w:r>
+        <w:t xml:space="preserve">trên máy xử lý tài liệu mật</w:t>
+      </w:r>
+      <w:r>
+        <w:t xml:space="preserve"> </w:t>
+      </w:r>
+      <w:r>
+        <w:t xml:space="preserve">4. Mang nhật ký lỗi, tệp kết quả từ máy mật sang máy có Internet để nhờ AI sửa</w:t>
+      </w:r>
+      <w:r>
+        <w:t xml:space="preserve"> </w:t>
+      </w:r>
+      <w:r>
+        <w:t xml:space="preserve">5. Dùng tài khoản AI cá nhân cho công việc nội bộ của đơn vị</w:t>
+      </w:r>
+    </w:p>
+    <w:p>
+      <w:pPr>
+        <w:pStyle w:val="BodyText"/>
+      </w:pPr>
+      <w:r>
+        <w:rPr>
+          <w:bCs/>
+          <w:b/>
+        </w:rPr>
+        <w:t xml:space="preserve">Phương án khác (khi được cấp có thẩm quyền cho phép):</w:t>
       </w:r>
     </w:p>
     <w:tbl>
@@ -11303,266 +12821,107 @@
               <w:jc w:val="left"/>
             </w:pPr>
             <w:r>
-              <w:t xml:space="preserve">Máy có Internet (dùng AI)</w:t>
-            </w:r>
-          </w:p>
-        </w:tc>
-        <w:tc>
-          <w:tcPr/>
-          <w:p>
-            <w:pPr>
-              <w:pStyle w:val="Compact"/>
-            </w:pPr>
-          </w:p>
-        </w:tc>
-        <w:tc>
-          <w:tcPr/>
-          <w:p>
-            <w:pPr>
-              <w:pStyle w:val="Compact"/>
-              <w:jc w:val="left"/>
-            </w:pPr>
-            <w:r>
-              <w:t xml:space="preserve">Máy không Internet (dữ liệu mật)</w:t>
-            </w:r>
-          </w:p>
-        </w:tc>
-      </w:tr>
-      <w:tr>
-        <w:tc>
-          <w:tcPr/>
-          <w:p>
-            <w:pPr>
-              <w:pStyle w:val="Compact"/>
-              <w:jc w:val="left"/>
-            </w:pPr>
-            <w:r>
-              <w:t xml:space="preserve">1. Chỉ mô tả</w:t>
-            </w:r>
-            <w:r>
-              <w:t xml:space="preserve"> </w:t>
-            </w:r>
-            <w:r>
-              <w:rPr>
-                <w:bCs/>
-                <w:b/>
-              </w:rPr>
-              <w:t xml:space="preserve">cấu trúc</w:t>
-            </w:r>
-            <w:r>
-              <w:t xml:space="preserve"> </w:t>
-            </w:r>
-            <w:r>
-              <w:t xml:space="preserve">dữ liệu (tên cột, đơn vị)</w:t>
-            </w:r>
-          </w:p>
-        </w:tc>
-        <w:tc>
-          <w:tcPr/>
-          <w:p>
-            <w:pPr>
-              <w:pStyle w:val="Compact"/>
-            </w:pPr>
-          </w:p>
-        </w:tc>
-        <w:tc>
-          <w:tcPr/>
-          <w:p>
-            <w:pPr>
-              <w:pStyle w:val="Compact"/>
-            </w:pPr>
-          </w:p>
-        </w:tc>
-      </w:tr>
-      <w:tr>
-        <w:tc>
-          <w:tcPr/>
-          <w:p>
-            <w:pPr>
-              <w:pStyle w:val="Compact"/>
-              <w:jc w:val="left"/>
-            </w:pPr>
-            <w:r>
-              <w:t xml:space="preserve">2. AI viết công cụ, sinh</w:t>
-            </w:r>
-            <w:r>
-              <w:t xml:space="preserve"> </w:t>
-            </w:r>
-            <w:r>
-              <w:rPr>
-                <w:bCs/>
-                <w:b/>
-              </w:rPr>
-              <w:t xml:space="preserve">dữ liệu giả</w:t>
-            </w:r>
-            <w:r>
-              <w:t xml:space="preserve">, chạy thử</w:t>
-            </w:r>
-          </w:p>
-        </w:tc>
-        <w:tc>
-          <w:tcPr/>
-          <w:p>
-            <w:pPr>
-              <w:pStyle w:val="Compact"/>
-            </w:pPr>
-          </w:p>
-        </w:tc>
-        <w:tc>
-          <w:tcPr/>
-          <w:p>
-            <w:pPr>
-              <w:pStyle w:val="Compact"/>
-            </w:pPr>
-          </w:p>
-        </w:tc>
-      </w:tr>
-      <w:tr>
-        <w:tc>
-          <w:tcPr/>
-          <w:p>
-            <w:pPr>
-              <w:pStyle w:val="Compact"/>
-              <w:jc w:val="left"/>
-            </w:pPr>
-            <w:r>
-              <w:t xml:space="preserve">3. Nhà khoa học đọc mã;</w:t>
-            </w:r>
-            <w:r>
-              <w:t xml:space="preserve"> </w:t>
-            </w:r>
-            <w:r>
-              <w:rPr>
-                <w:bCs/>
-                <w:b/>
-              </w:rPr>
-              <w:t xml:space="preserve">quét mã</w:t>
-            </w:r>
-            <w:r>
-              <w:t xml:space="preserve"> </w:t>
-            </w:r>
-            <w:r>
-              <w:t xml:space="preserve">– không có kết nối mạng</w:t>
-            </w:r>
-          </w:p>
-        </w:tc>
-        <w:tc>
-          <w:tcPr/>
-          <w:p>
-            <w:pPr>
-              <w:pStyle w:val="Compact"/>
-            </w:pPr>
-          </w:p>
-        </w:tc>
-        <w:tc>
-          <w:tcPr/>
-          <w:p>
-            <w:pPr>
-              <w:pStyle w:val="Compact"/>
-            </w:pPr>
-          </w:p>
-        </w:tc>
-      </w:tr>
-      <w:tr>
-        <w:tc>
-          <w:tcPr/>
-          <w:p>
-            <w:pPr>
-              <w:pStyle w:val="Compact"/>
-              <w:jc w:val="left"/>
-            </w:pPr>
-            <w:r>
-              <w:t xml:space="preserve">4. Đóng gói +</w:t>
-            </w:r>
-            <w:r>
-              <w:t xml:space="preserve"> </w:t>
-            </w:r>
-            <w:r>
-              <w:rPr>
-                <w:bCs/>
-                <w:b/>
-              </w:rPr>
-              <w:t xml:space="preserve">mã băm SHA-256</w:t>
-            </w:r>
-          </w:p>
-        </w:tc>
-        <w:tc>
-          <w:tcPr/>
-          <w:p>
-            <w:pPr>
-              <w:pStyle w:val="Compact"/>
-              <w:jc w:val="left"/>
-            </w:pPr>
-            <w:r>
-              <w:t xml:space="preserve">➜ chuyển theo quy định ➜</w:t>
-            </w:r>
-          </w:p>
-        </w:tc>
-        <w:tc>
-          <w:tcPr/>
-          <w:p>
-            <w:pPr>
-              <w:pStyle w:val="Compact"/>
-              <w:jc w:val="left"/>
-            </w:pPr>
-            <w:r>
-              <w:t xml:space="preserve">5. Đối chiếu mã băm → chạy với</w:t>
-            </w:r>
-            <w:r>
-              <w:t xml:space="preserve"> </w:t>
-            </w:r>
-            <w:r>
-              <w:rPr>
-                <w:bCs/>
-                <w:b/>
-              </w:rPr>
-              <w:t xml:space="preserve">dữ liệu thật</w:t>
-            </w:r>
-          </w:p>
-        </w:tc>
-      </w:tr>
-      <w:tr>
-        <w:tc>
-          <w:tcPr/>
-          <w:p>
-            <w:pPr>
-              <w:pStyle w:val="Compact"/>
-            </w:pPr>
-          </w:p>
-        </w:tc>
-        <w:tc>
-          <w:tcPr/>
-          <w:p>
-            <w:pPr>
-              <w:pStyle w:val="Compact"/>
-            </w:pPr>
-          </w:p>
-        </w:tc>
-        <w:tc>
-          <w:tcPr/>
-          <w:p>
-            <w:pPr>
-              <w:pStyle w:val="Compact"/>
-              <w:jc w:val="left"/>
-            </w:pPr>
-            <w:r>
-              <w:t xml:space="preserve">6. Kết quả</w:t>
-            </w:r>
-            <w:r>
-              <w:t xml:space="preserve"> </w:t>
-            </w:r>
-            <w:r>
-              <w:rPr>
-                <w:bCs/>
-                <w:b/>
-              </w:rPr>
-              <w:t xml:space="preserve">ở lại</w:t>
-            </w:r>
-            <w:r>
-              <w:t xml:space="preserve"> </w:t>
-            </w:r>
-            <w:r>
-              <w:t xml:space="preserve">máy này</w:t>
+              <w:t xml:space="preserve">Phương án</w:t>
+            </w:r>
+          </w:p>
+        </w:tc>
+        <w:tc>
+          <w:tcPr/>
+          <w:p>
+            <w:pPr>
+              <w:pStyle w:val="Compact"/>
+              <w:jc w:val="left"/>
+            </w:pPr>
+            <w:r>
+              <w:t xml:space="preserve">Ưu điểm</w:t>
+            </w:r>
+          </w:p>
+        </w:tc>
+        <w:tc>
+          <w:tcPr/>
+          <w:p>
+            <w:pPr>
+              <w:pStyle w:val="Compact"/>
+              <w:jc w:val="left"/>
+            </w:pPr>
+            <w:r>
+              <w:t xml:space="preserve">Hạn chế</w:t>
+            </w:r>
+          </w:p>
+        </w:tc>
+      </w:tr>
+      <w:tr>
+        <w:tc>
+          <w:tcPr/>
+          <w:p>
+            <w:pPr>
+              <w:pStyle w:val="Compact"/>
+              <w:jc w:val="left"/>
+            </w:pPr>
+            <w:r>
+              <w:t xml:space="preserve">Mô hình AI mã nguồn mở chạy cục bộ trên máy không kết nối</w:t>
+            </w:r>
+          </w:p>
+        </w:tc>
+        <w:tc>
+          <w:tcPr/>
+          <w:p>
+            <w:pPr>
+              <w:pStyle w:val="Compact"/>
+              <w:jc w:val="left"/>
+            </w:pPr>
+            <w:r>
+              <w:t xml:space="preserve">Hỏi – đáp, tóm tắt trực tiếp trên dữ liệu mật</w:t>
+            </w:r>
+          </w:p>
+        </w:tc>
+        <w:tc>
+          <w:tcPr/>
+          <w:p>
+            <w:pPr>
+              <w:pStyle w:val="Compact"/>
+              <w:jc w:val="left"/>
+            </w:pPr>
+            <w:r>
+              <w:t xml:space="preserve">Phải kiểm định, phê duyệt; năng lực thấp hơn; cần máy cấu hình cao</w:t>
+            </w:r>
+          </w:p>
+        </w:tc>
+      </w:tr>
+      <w:tr>
+        <w:tc>
+          <w:tcPr/>
+          <w:p>
+            <w:pPr>
+              <w:pStyle w:val="Compact"/>
+              <w:jc w:val="left"/>
+            </w:pPr>
+            <w:r>
+              <w:t xml:space="preserve">Mạng LAN độc lập trong trụ sở</w:t>
+            </w:r>
+          </w:p>
+        </w:tc>
+        <w:tc>
+          <w:tcPr/>
+          <w:p>
+            <w:pPr>
+              <w:pStyle w:val="Compact"/>
+              <w:jc w:val="left"/>
+            </w:pPr>
+            <w:r>
+              <w:t xml:space="preserve">Nhiều cán bộ dùng chung công cụ</w:t>
+            </w:r>
+          </w:p>
+        </w:tc>
+        <w:tc>
+          <w:tcPr/>
+          <w:p>
+            <w:pPr>
+              <w:pStyle w:val="Compact"/>
+              <w:jc w:val="left"/>
+            </w:pPr>
+            <w:r>
+              <w:t xml:space="preserve">Theo quy định về mạng LAN độc lập của Luật 117/2025</w:t>
             </w:r>
           </w:p>
         </w:tc>
@@ -11570,217 +12929,6 @@
     </w:tbl>
     <w:p>
       <w:pPr>
-        <w:numPr>
-          <w:ilvl w:val="0"/>
-          <w:numId w:val="1005"/>
-        </w:numPr>
-        <w:pStyle w:val="Compact"/>
-      </w:pPr>
-      <w:r>
-        <w:t xml:space="preserve">🧪</w:t>
-      </w:r>
-      <w:r>
-        <w:t xml:space="preserve"> </w:t>
-      </w:r>
-      <w:r>
-        <w:rPr>
-          <w:bCs/>
-          <w:b/>
-        </w:rPr>
-        <w:t xml:space="preserve">Ví dụ:</w:t>
-      </w:r>
-      <w:r>
-        <w:t xml:space="preserve"> </w:t>
-      </w:r>
-      <w:r>
-        <w:rPr>
-          <w:iCs/>
-          <w:i/>
-        </w:rPr>
-        <w:t xml:space="preserve">Ảnh hưởng của địa hình và khí hậu nhiệt đới đến lộ trình của thiết bị bay không người lái</w:t>
-      </w:r>
-      <w:r>
-        <w:t xml:space="preserve"> </w:t>
-      </w:r>
-      <w:r>
-        <w:t xml:space="preserve">– công cụ tìm lộ trình tốn ít năng lượng nhất, tránh núi cao, ổ mưa dông, gió mạnh; tính ảnh hưởng của gió, mưa, nhiệt độ – độ ẩm, leo cao</w:t>
-      </w:r>
-    </w:p>
-    <w:p>
-      <w:pPr>
-        <w:numPr>
-          <w:ilvl w:val="0"/>
-          <w:numId w:val="1005"/>
-        </w:numPr>
-        <w:pStyle w:val="Compact"/>
-      </w:pPr>
-      <w:r>
-        <w:t xml:space="preserve">📊</w:t>
-      </w:r>
-      <w:r>
-        <w:t xml:space="preserve"> </w:t>
-      </w:r>
-      <w:r>
-        <w:rPr>
-          <w:bCs/>
-          <w:b/>
-        </w:rPr>
-        <w:t xml:space="preserve">Kết quả với dữ liệu giả lập:</w:t>
-      </w:r>
-    </w:p>
-    <w:p>
-      <w:pPr>
-        <w:numPr>
-          <w:ilvl w:val="1"/>
-          <w:numId w:val="1006"/>
-        </w:numPr>
-        <w:pStyle w:val="Compact"/>
-      </w:pPr>
-      <w:r>
-        <w:t xml:space="preserve">Đường thẳng cắt qua</w:t>
-      </w:r>
-      <w:r>
-        <w:t xml:space="preserve"> </w:t>
-      </w:r>
-      <w:r>
-        <w:rPr>
-          <w:bCs/>
-          <w:b/>
-        </w:rPr>
-        <w:t xml:space="preserve">8 ô cấm bay</w:t>
-      </w:r>
-      <w:r>
-        <w:t xml:space="preserve"> </w:t>
-      </w:r>
-      <w:r>
-        <w:t xml:space="preserve">→ lộ trình vòng qua đèo: 14,5 km, 240 Wh</w:t>
-      </w:r>
-    </w:p>
-    <w:p>
-      <w:pPr>
-        <w:numPr>
-          <w:ilvl w:val="1"/>
-          <w:numId w:val="1006"/>
-        </w:numPr>
-        <w:pStyle w:val="Compact"/>
-      </w:pPr>
-      <w:r>
-        <w:t xml:space="preserve">Chiều về ngược gió mùa:</w:t>
-      </w:r>
-      <w:r>
-        <w:t xml:space="preserve"> </w:t>
-      </w:r>
-      <w:r>
-        <w:rPr>
-          <w:bCs/>
-          <w:b/>
-        </w:rPr>
-        <w:t xml:space="preserve">422 Wh – gấp 1,8 lần chiều đi</w:t>
-      </w:r>
-      <w:r>
-        <w:t xml:space="preserve"> </w:t>
-      </w:r>
-      <w:r>
-        <w:t xml:space="preserve">→ không đủ pin, phải đổi phương án</w:t>
-      </w:r>
-    </w:p>
-    <w:p>
-      <w:pPr>
-        <w:numPr>
-          <w:ilvl w:val="1"/>
-          <w:numId w:val="1006"/>
-        </w:numPr>
-        <w:pStyle w:val="Compact"/>
-      </w:pPr>
-      <w:r>
-        <w:t xml:space="preserve">Công cụ chạy trong ~3 giây trên máy tính thường, không cần mạng</w:t>
-      </w:r>
-    </w:p>
-    <w:p>
-      <w:pPr>
-        <w:numPr>
-          <w:ilvl w:val="0"/>
-          <w:numId w:val="1005"/>
-        </w:numPr>
-        <w:pStyle w:val="Compact"/>
-      </w:pPr>
-      <w:r>
-        <w:t xml:space="preserve">🎯</w:t>
-      </w:r>
-      <w:r>
-        <w:t xml:space="preserve"> </w:t>
-      </w:r>
-      <w:r>
-        <w:rPr>
-          <w:bCs/>
-          <w:b/>
-        </w:rPr>
-        <w:t xml:space="preserve">Trọng tâm là quy trình</w:t>
-      </w:r>
-      <w:r>
-        <w:t xml:space="preserve"> </w:t>
-      </w:r>
-      <w:r>
-        <w:t xml:space="preserve">– mô hình bay trong ví dụ đã đơn giản hóa; đơn vị thay bằng mô hình và thông số của mình.</w:t>
-      </w:r>
-    </w:p>
-    <w:p>
-      <w:pPr>
-        <w:numPr>
-          <w:ilvl w:val="0"/>
-          <w:numId w:val="1005"/>
-        </w:numPr>
-        <w:pStyle w:val="Compact"/>
-      </w:pPr>
-      <w:r>
-        <w:t xml:space="preserve">⚠ Chuyển tệp giữa hai máy theo</w:t>
-      </w:r>
-      <w:r>
-        <w:t xml:space="preserve"> </w:t>
-      </w:r>
-      <w:r>
-        <w:rPr>
-          <w:bCs/>
-          <w:b/>
-        </w:rPr>
-        <w:t xml:space="preserve">quy định bảo vệ bí mật nhà nước và quy chế của đơn vị</w:t>
-      </w:r>
-      <w:r>
-        <w:t xml:space="preserve">. Khi công cụ lỗi: tái tạo lỗi bằng dữ liệu giả để hỏi AI – không mang dữ liệu thật ra ngoài.</w:t>
-      </w:r>
-    </w:p>
-    <w:p>
-      <w:pPr>
-        <w:pStyle w:val="FirstParagraph"/>
-      </w:pPr>
-      <w:r>
-        <w:rPr>
-          <w:bCs/>
-          <w:b/>
-        </w:rPr>
-        <w:t xml:space="preserve">Hình ảnh:</w:t>
-      </w:r>
-      <w:r>
-        <w:t xml:space="preserve"> </w:t>
-      </w:r>
-      <w:r>
-        <w:t xml:space="preserve">sơ đồ hai máy;</w:t>
-      </w:r>
-      <w:r>
-        <w:t xml:space="preserve"> </w:t>
-      </w:r>
-      <w:r>
-        <w:rPr>
-          <w:rStyle w:val="VerbatimChar"/>
-        </w:rPr>
-        <w:t xml:space="preserve">thuyet-trinh/ket-qua-demo/may-cach-ly/ban_do_lo_trinh.png</w:t>
-      </w:r>
-      <w:r>
-        <w:t xml:space="preserve">.</w:t>
-      </w:r>
-    </w:p>
-    <w:p>
-      <w:pPr>
         <w:pStyle w:val="BodyText"/>
       </w:pPr>
       <w:r>
@@ -11788,89 +12936,13 @@
           <w:bCs/>
           <w:b/>
         </w:rPr>
-        <w:t xml:space="preserve">🎬 Trình chiếu:</w:t>
-      </w:r>
-      <w:r>
-        <w:t xml:space="preserve"> </w:t>
-      </w:r>
-      <w:r>
-        <w:t xml:space="preserve">ảnh bản đồ lộ trình + báo cáo đã chạy; ảnh màn hình chương trình quét mã báo</w:t>
-      </w:r>
-      <w:r>
-        <w:t xml:space="preserve"> </w:t>
-      </w:r>
-      <w:r>
-        <w:t xml:space="preserve">“</w:t>
-      </w:r>
-      <w:r>
-        <w:t xml:space="preserve">không phát hiện kết nối mạng</w:t>
-      </w:r>
-      <w:r>
-        <w:t xml:space="preserve">”</w:t>
-      </w:r>
-      <w:r>
-        <w:t xml:space="preserve"> </w:t>
-      </w:r>
-      <w:r>
-        <w:t xml:space="preserve">và báo</w:t>
-      </w:r>
-      <w:r>
-        <w:t xml:space="preserve"> </w:t>
-      </w:r>
-      <w:r>
-        <w:rPr>
-          <w:bCs/>
-          <w:b/>
-        </w:rPr>
-        <w:t xml:space="preserve">chặn</w:t>
-      </w:r>
-      <w:r>
-        <w:t xml:space="preserve"> </w:t>
-      </w:r>
-      <w:r>
-        <w:t xml:space="preserve">khi thử chèn</w:t>
-      </w:r>
-      <w:r>
-        <w:t xml:space="preserve"> </w:t>
-      </w:r>
-      <w:r>
-        <w:rPr>
-          <w:rStyle w:val="VerbatimChar"/>
-        </w:rPr>
-        <w:t xml:space="preserve">import requests</w:t>
-      </w:r>
-      <w:r>
-        <w:t xml:space="preserve"> </w:t>
-      </w:r>
-      <w:r>
-        <w:t xml:space="preserve">(câu lệnh:</w:t>
-      </w:r>
-      <w:r>
-        <w:t xml:space="preserve"> </w:t>
-      </w:r>
-      <w:r>
-        <w:rPr>
-          <w:rStyle w:val="VerbatimChar"/>
-        </w:rPr>
-        <w:t xml:space="preserve">cau-lenh-demo.md</w:t>
-      </w:r>
-      <w:r>
-        <w:t xml:space="preserve"> </w:t>
-      </w:r>
-      <w:r>
-        <w:t xml:space="preserve">mục 13; mã:</w:t>
-      </w:r>
-      <w:r>
-        <w:t xml:space="preserve"> </w:t>
-      </w:r>
-      <w:r>
-        <w:rPr>
-          <w:rStyle w:val="VerbatimChar"/>
-        </w:rPr>
-        <w:t xml:space="preserve">thuyet-trinh/ma-nguon-demo/may-cach-ly/</w:t>
-      </w:r>
-      <w:r>
-        <w:t xml:space="preserve">).</w:t>
+        <w:t xml:space="preserve">Nguồn:</w:t>
+      </w:r>
+      <w:r>
+        <w:t xml:space="preserve"> </w:t>
+      </w:r>
+      <w:r>
+        <w:t xml:space="preserve">N38</w:t>
       </w:r>
     </w:p>
     <w:p>
@@ -11908,15 +12980,15 @@
         </w:pict>
       </w:r>
     </w:p>
-    <w:bookmarkEnd w:id="47"/>
-    <w:bookmarkEnd w:id="48"/>
-    <w:bookmarkStart w:id="52" w:name="X49c9e2e2629d4b3041c6feec67246a57957c4b4"/>
+    <w:bookmarkEnd w:id="50"/>
+    <w:bookmarkEnd w:id="51"/>
+    <w:bookmarkStart w:id="55" w:name="Xa57b4ca23103b29cbf0eb98fe4e860d4d81e36c"/>
     <w:p>
       <w:pPr>
         <w:pStyle w:val="Heading1"/>
       </w:pPr>
       <w:r>
-        <w:t xml:space="preserve">PHẦN V. SKILL, KHOA HỌC MỞ VÀ TỰ ĐỘNG HÓA (15 phút)</w:t>
+        <w:t xml:space="preserve">PHẦN V. SKILL, KHOA HỌC MỞ VÀ TỰ ĐỘNG HÓA (13 phút)</w:t>
       </w:r>
     </w:p>
     <w:p>
@@ -11934,7 +13006,7 @@
         <w:t xml:space="preserve"> </w:t>
       </w:r>
       <w:r>
-        <w:t xml:space="preserve">tên Phần V · Slide 21–23</w:t>
+        <w:t xml:space="preserve">tên Phần V · Slide 24–26</w:t>
       </w:r>
     </w:p>
     <w:p>
@@ -11944,13 +13016,13 @@
         </w:pict>
       </w:r>
     </w:p>
-    <w:bookmarkStart w:id="49" w:name="X5d85201682f74012aaff14be436a56e291dab5b"/>
+    <w:bookmarkStart w:id="52" w:name="X5375f35c5560ee3b02d34f905afaccaf18bbe54"/>
     <w:p>
       <w:pPr>
         <w:pStyle w:val="Heading2"/>
       </w:pPr>
       <w:r>
-        <w:t xml:space="preserve">Slide 21 – Skill và khoa học mở: nền móng của tự động hóa (6′)</w:t>
+        <w:t xml:space="preserve">Slide 24 – Skill và khoa học mở: nền móng của tự động hóa (5′)</w:t>
       </w:r>
     </w:p>
     <w:p>
@@ -12437,14 +13509,14 @@
         </w:pict>
       </w:r>
     </w:p>
-    <w:bookmarkEnd w:id="49"/>
-    <w:bookmarkStart w:id="50" w:name="Xe89b064a741105d19ba019fc0a41ec1b8ee21ee"/>
+    <w:bookmarkEnd w:id="52"/>
+    <w:bookmarkStart w:id="53" w:name="X0cfc18ab76a143714bcb419aa2fc5112160c5db"/>
     <w:p>
       <w:pPr>
         <w:pStyle w:val="Heading2"/>
       </w:pPr>
       <w:r>
-        <w:t xml:space="preserve">Slide 22 – Tự động hóa từng bước: từ một công việc đến toàn quy trình (5′)</w:t>
+        <w:t xml:space="preserve">Slide 25 – Tự động hóa từng bước: từ một công việc đến toàn quy trình (4′)</w:t>
       </w:r>
     </w:p>
     <w:p>
@@ -12964,14 +14036,14 @@
         </w:pict>
       </w:r>
     </w:p>
-    <w:bookmarkEnd w:id="50"/>
-    <w:bookmarkStart w:id="51" w:name="X12f078beff3c8f6e6e0a0aa609bbd91a91781f8"/>
+    <w:bookmarkEnd w:id="53"/>
+    <w:bookmarkStart w:id="54" w:name="X5782e8dd4d466845a4de6bb2295f5da0ac977da"/>
     <w:p>
       <w:pPr>
         <w:pStyle w:val="Heading2"/>
       </w:pPr>
       <w:r>
-        <w:t xml:space="preserve">Slide 23 – Quy trình tự động của Trung tâm và năm quyết định của nhà khoa học (4′)</w:t>
+        <w:t xml:space="preserve">Slide 26 – Quy trình tự động của Trung tâm và năm quyết định của nhà khoa học (4′)</w:t>
       </w:r>
     </w:p>
     <w:p>
@@ -13591,9 +14663,9 @@
         </w:pict>
       </w:r>
     </w:p>
-    <w:bookmarkEnd w:id="51"/>
-    <w:bookmarkEnd w:id="52"/>
-    <w:bookmarkStart w:id="54" w:name="phần-vi.-trao-đổi-và-thảo-luận-12-phút"/>
+    <w:bookmarkEnd w:id="54"/>
+    <w:bookmarkEnd w:id="55"/>
+    <w:bookmarkStart w:id="57" w:name="phần-vi.-trao-đổi-và-thảo-luận-12-phút"/>
     <w:p>
       <w:pPr>
         <w:pStyle w:val="Heading1"/>
@@ -13609,13 +14681,13 @@
         </w:pict>
       </w:r>
     </w:p>
-    <w:bookmarkStart w:id="53" w:name="slide-24-trao-đổi-và-thảo-luận-12"/>
+    <w:bookmarkStart w:id="56" w:name="slide-27-trao-đổi-và-thảo-luận-12"/>
     <w:p>
       <w:pPr>
         <w:pStyle w:val="Heading2"/>
       </w:pPr>
       <w:r>
-        <w:t xml:space="preserve">Slide 24 – Trao đổi và thảo luận (12′)</w:t>
+        <w:t xml:space="preserve">Slide 27 – Trao đổi và thảo luận (12′)</w:t>
       </w:r>
     </w:p>
     <w:p>
@@ -13689,9 +14761,9 @@
         </w:pict>
       </w:r>
     </w:p>
-    <w:bookmarkEnd w:id="53"/>
-    <w:bookmarkEnd w:id="54"/>
-    <w:bookmarkStart w:id="61" w:name="phụ-lục-không-trình-bày"/>
+    <w:bookmarkEnd w:id="56"/>
+    <w:bookmarkEnd w:id="57"/>
+    <w:bookmarkStart w:id="64" w:name="phụ-lục-không-trình-bày"/>
     <w:p>
       <w:pPr>
         <w:pStyle w:val="Heading1"/>
@@ -13707,13 +14779,13 @@
         </w:pict>
       </w:r>
     </w:p>
-    <w:bookmarkStart w:id="55" w:name="X8f9e2ba04e714feee59df4978548bcb43fd9566"/>
+    <w:bookmarkStart w:id="58" w:name="Xe40b59842847e32d9ff00a521f9d01c24863782"/>
     <w:p>
       <w:pPr>
         <w:pStyle w:val="Heading2"/>
       </w:pPr>
       <w:r>
-        <w:t xml:space="preserve">Slide 25 – Phụ lục A: AI lập trình (không trình bày)</w:t>
+        <w:t xml:space="preserve">Slide 28 – Phụ lục A: AI lập trình (không trình bày)</w:t>
       </w:r>
     </w:p>
     <w:p>
@@ -13815,14 +14887,14 @@
         </w:pict>
       </w:r>
     </w:p>
-    <w:bookmarkEnd w:id="55"/>
-    <w:bookmarkStart w:id="56" w:name="Xd74df6b9081f296f5d44d3cb7737b2bbd8fe71c"/>
+    <w:bookmarkEnd w:id="58"/>
+    <w:bookmarkStart w:id="59" w:name="Xb54733a1be9f78a1d097cad3c6c6f1a836eee43"/>
     <w:p>
       <w:pPr>
         <w:pStyle w:val="Heading2"/>
       </w:pPr>
       <w:r>
-        <w:t xml:space="preserve">Slide 26 – Phụ lục B: Ví dụ Google và các nhà khoa học dùng AI (không trình bày – dự phòng khi được hỏi)</w:t>
+        <w:t xml:space="preserve">Slide 29 – Phụ lục B: Ví dụ Google và các nhà khoa học dùng AI (không trình bày – dự phòng khi được hỏi)</w:t>
       </w:r>
     </w:p>
     <w:p>
@@ -14499,14 +15571,14 @@
         </w:pict>
       </w:r>
     </w:p>
-    <w:bookmarkEnd w:id="56"/>
-    <w:bookmarkStart w:id="57" w:name="Xa8e58479d1a1c480496e65013585d6cdadeba01"/>
+    <w:bookmarkEnd w:id="59"/>
+    <w:bookmarkStart w:id="60" w:name="Xc9887d7478f770621d0cae14328f1183d16b37a"/>
     <w:p>
       <w:pPr>
         <w:pStyle w:val="Heading2"/>
       </w:pPr>
       <w:r>
-        <w:t xml:space="preserve">Slide 27 – Phụ lục C: Nguồn tham khảo (không trình bày)</w:t>
+        <w:t xml:space="preserve">Slide 30 – Phụ lục C: Nguồn tham khảo (không trình bày)</w:t>
       </w:r>
     </w:p>
     <w:p>
@@ -14596,14 +15668,14 @@
         </w:pict>
       </w:r>
     </w:p>
-    <w:bookmarkEnd w:id="57"/>
-    <w:bookmarkStart w:id="58" w:name="Xab5725cfa470f07895dde52f84d960bbf3bb8f8"/>
+    <w:bookmarkEnd w:id="60"/>
+    <w:bookmarkStart w:id="61" w:name="Xa7f4f83a003c666aa1034540295379b0c781014"/>
     <w:p>
       <w:pPr>
         <w:pStyle w:val="Heading2"/>
       </w:pPr>
       <w:r>
-        <w:t xml:space="preserve">Slide 28 – Phụ lục D: Dự án và bộ Skill khoa học mở (không trình bày)</w:t>
+        <w:t xml:space="preserve">Slide 31 – Phụ lục D: Dự án và bộ Skill khoa học mở (không trình bày)</w:t>
       </w:r>
     </w:p>
     <w:p>
@@ -14677,14 +15749,14 @@
         </w:pict>
       </w:r>
     </w:p>
-    <w:bookmarkEnd w:id="58"/>
-    <w:bookmarkStart w:id="59" w:name="X33a93005abd6f1d5d0d4884403f4eee5689cd16"/>
+    <w:bookmarkEnd w:id="61"/>
+    <w:bookmarkStart w:id="62" w:name="Xd5f30bdd5007fc667b780428f6ed531daaf0dd0"/>
     <w:p>
       <w:pPr>
         <w:pStyle w:val="Heading2"/>
       </w:pPr>
       <w:r>
-        <w:t xml:space="preserve">Slide 29 – Phụ lục E: Câu hỏi thường gặp (dự phòng khi được hỏi) 🆕</w:t>
+        <w:t xml:space="preserve">Slide 32 – Phụ lục E: Câu hỏi thường gặp (dự phòng khi được hỏi) 🆕</w:t>
       </w:r>
     </w:p>
     <w:p>
@@ -14963,8 +16035,8 @@
         </w:pict>
       </w:r>
     </w:p>
-    <w:bookmarkEnd w:id="59"/>
-    <w:bookmarkStart w:id="60" w:name="ý-kiến-chung-của-người-duyệt"/>
+    <w:bookmarkEnd w:id="62"/>
+    <w:bookmarkStart w:id="63" w:name="ý-kiến-chung-của-người-duyệt"/>
     <w:p>
       <w:pPr>
         <w:pStyle w:val="Heading2"/>
@@ -14977,7 +16049,7 @@
       <w:pPr>
         <w:numPr>
           <w:ilvl w:val="0"/>
-          <w:numId w:val="1007"/>
+          <w:numId w:val="1006"/>
         </w:numPr>
         <w:pStyle w:val="Compact"/>
       </w:pPr>
@@ -14989,7 +16061,7 @@
       <w:pPr>
         <w:numPr>
           <w:ilvl w:val="0"/>
-          <w:numId w:val="1007"/>
+          <w:numId w:val="1006"/>
         </w:numPr>
         <w:pStyle w:val="Compact"/>
       </w:pPr>
@@ -15001,7 +16073,7 @@
       <w:pPr>
         <w:numPr>
           <w:ilvl w:val="0"/>
-          <w:numId w:val="1007"/>
+          <w:numId w:val="1006"/>
         </w:numPr>
         <w:pStyle w:val="Compact"/>
       </w:pPr>
@@ -15013,7 +16085,7 @@
       <w:pPr>
         <w:numPr>
           <w:ilvl w:val="0"/>
-          <w:numId w:val="1007"/>
+          <w:numId w:val="1006"/>
         </w:numPr>
         <w:pStyle w:val="Compact"/>
       </w:pPr>
@@ -15021,8 +16093,8 @@
         <w:t xml:space="preserve">Người duyệt: ______________________ · Ngày: ____ / ____ / 2026</w:t>
       </w:r>
     </w:p>
-    <w:bookmarkEnd w:id="60"/>
-    <w:bookmarkEnd w:id="61"/>
+    <w:bookmarkEnd w:id="63"/>
+    <w:bookmarkEnd w:id="64"/>
     <w:sectPr/>
   </w:body>
 </w:document>
@@ -15336,9 +16408,6 @@
     <w:abstractNumId w:val="991"/>
   </w:num>
   <w:num w:numId="1006">
-    <w:abstractNumId w:val="991"/>
-  </w:num>
-  <w:num w:numId="1007">
     <w:abstractNumId w:val="991"/>
   </w:num>
 </w:numbering>

</xml_diff>

<commit_message>
Mở rộng Phần IV (đề tài mật) lên 15 phút, 4 slide; điều chỉnh toàn bộ (#11)
- Slide 20 ranh giới pháp lý (Luật Bảo vệ bí mật nhà nước 117/2025/QH15), Slide 21 mô hình ba vùng – quy trình 6 bước có điểm kiểm soát, Slide 22 minh họa 3, Slide 23 sai lầm thường gặp – phương án khác
- Rút Phần II −4′, Phần III −4′, Phần V −2′; đánh số lại; căn cứ N38
- Cập nhật tài liệu phát tay, kế hoạch, phụ lục định hướng trình bày, README


Claude-Session: https://claude.ai/code/session_01JoSsghLRHTtvcNzYXbKpzE

Co-authored-by: Claude <noreply@anthropic.com>
</commit_message>
<xml_diff>
--- a/thuyet-trinh/DANH-SACH-SLIDE-v2.5.docx
+++ b/thuyet-trinh/DANH-SACH-SLIDE-v2.5.docx
@@ -74,7 +74,7 @@
         <w:t xml:space="preserve"> </w:t>
       </w:r>
       <w:r>
-        <w:t xml:space="preserve">24 slide trình bày + 5 phụ lục + trang bìa</w:t>
+        <w:t xml:space="preserve">27 slide trình bày + 5 phụ lục + trang bìa</w:t>
       </w:r>
       <w:r>
         <w:t xml:space="preserve"> </w:t>
@@ -137,7 +137,7 @@
         <w:t xml:space="preserve"> </w:t>
       </w:r>
       <w:r>
-        <w:t xml:space="preserve">thêm Slide 17 (mô hình 3D quá trình ăn mòn) và Slide 20 (Demo 3 – công cụ cho máy không Internet); từ slide cũ 16 trở đi số slide cộng 2; thảo luận còn 9′.</w:t>
+        <w:t xml:space="preserve">thêm Slide 17 (mô hình 3D quá trình ăn mòn) và Slide 22 (Demo 3 – công cụ cho máy không Internet); từ slide cũ 16 trở đi số slide cộng 2; thảo luận còn 9′.</w:t>
       </w:r>
       <w:r>
         <w:t xml:space="preserve"> </w:t>
@@ -198,6 +198,22 @@
       </w:r>
       <w:r>
         <w:t xml:space="preserve">Slide 7 – công cụ tìm và đọc tài liệu (Sci-Hub, Sci-Bot và lựa chọn hợp pháp); từ Slide 7 cũ trở đi số slide cộng 1; thảo luận 12′.</w:t>
+      </w:r>
+      <w:r>
+        <w:t xml:space="preserve"> </w:t>
+      </w:r>
+      <w:r>
+        <w:rPr>
+          <w:bCs/>
+          <w:b/>
+        </w:rPr>
+        <w:t xml:space="preserve">Mở rộng Phần IV (đề tài mật) lên 15′, 4 slide (20–23):</w:t>
+      </w:r>
+      <w:r>
+        <w:t xml:space="preserve"> </w:t>
+      </w:r>
+      <w:r>
+        <w:t xml:space="preserve">ranh giới pháp lý (Luật 117/2025/QH15), mô hình ba vùng, minh họa 3, sai lầm thường gặp; bù bằng cách rút Phần II −4′, Phần III −4′, Phần V −2′.</w:t>
       </w:r>
       <w:r>
         <w:t xml:space="preserve"> </w:t>
@@ -518,7 +534,7 @@
               <w:jc w:val="left"/>
             </w:pPr>
             <w:r>
-              <w:t xml:space="preserve">9, 14, 15, 16, 17, 20</w:t>
+              <w:t xml:space="preserve">9, 14, 15, 16, 17, 22</w:t>
             </w:r>
           </w:p>
         </w:tc>
@@ -694,7 +710,7 @@
               <w:jc w:val="left"/>
             </w:pPr>
             <w:r>
-              <w:t xml:space="preserve">29</w:t>
+              <w:t xml:space="preserve">32</w:t>
             </w:r>
           </w:p>
         </w:tc>
@@ -823,7 +839,7 @@
               <w:jc w:val="left"/>
             </w:pPr>
             <w:r>
-              <w:t xml:space="preserve">18, 28</w:t>
+              <w:t xml:space="preserve">18, 31</w:t>
             </w:r>
           </w:p>
         </w:tc>
@@ -1368,7 +1384,7 @@
                 <w:bCs/>
                 <w:b/>
               </w:rPr>
-              <w:t xml:space="preserve">PHẦN II. LỰA CHỌN VÀ SỬ DỤNG CÔNG CỤ AI PHÙ HỢP – 36′</w:t>
+              <w:t xml:space="preserve">PHẦN II. LỰA CHỌN VÀ SỬ DỤNG CÔNG CỤ AI PHÙ HỢP – 32′</w:t>
             </w:r>
           </w:p>
         </w:tc>
@@ -1504,6 +1520,316 @@
               <w:jc w:val="left"/>
             </w:pPr>
             <w:r>
+              <w:t xml:space="preserve">2′</w:t>
+            </w:r>
+          </w:p>
+        </w:tc>
+        <w:tc>
+          <w:tcPr/>
+          <w:p>
+            <w:pPr>
+              <w:pStyle w:val="Compact"/>
+              <w:jc w:val="left"/>
+            </w:pPr>
+            <w:r>
+              <w:t xml:space="preserve">[ ]</w:t>
+            </w:r>
+          </w:p>
+        </w:tc>
+      </w:tr>
+      <w:tr>
+        <w:tc>
+          <w:tcPr/>
+          <w:p>
+            <w:pPr>
+              <w:pStyle w:val="Compact"/>
+              <w:jc w:val="left"/>
+            </w:pPr>
+            <w:r>
+              <w:t xml:space="preserve">7</w:t>
+            </w:r>
+          </w:p>
+        </w:tc>
+        <w:tc>
+          <w:tcPr/>
+          <w:p>
+            <w:pPr>
+              <w:pStyle w:val="Compact"/>
+              <w:jc w:val="left"/>
+            </w:pPr>
+            <w:r>
+              <w:t xml:space="preserve">🆕 Tìm và đọc tài liệu khoa học: Sci-Hub, Sci-Bot và các lựa chọn hợp pháp</w:t>
+            </w:r>
+          </w:p>
+        </w:tc>
+        <w:tc>
+          <w:tcPr/>
+          <w:p>
+            <w:pPr>
+              <w:pStyle w:val="Compact"/>
+              <w:jc w:val="left"/>
+            </w:pPr>
+            <w:r>
+              <w:t xml:space="preserve">II</w:t>
+            </w:r>
+          </w:p>
+        </w:tc>
+        <w:tc>
+          <w:tcPr/>
+          <w:p>
+            <w:pPr>
+              <w:pStyle w:val="Compact"/>
+              <w:jc w:val="left"/>
+            </w:pPr>
+            <w:r>
+              <w:t xml:space="preserve">4′</w:t>
+            </w:r>
+          </w:p>
+        </w:tc>
+        <w:tc>
+          <w:tcPr/>
+          <w:p>
+            <w:pPr>
+              <w:pStyle w:val="Compact"/>
+              <w:jc w:val="left"/>
+            </w:pPr>
+            <w:r>
+              <w:t xml:space="preserve">[ ]</w:t>
+            </w:r>
+          </w:p>
+        </w:tc>
+      </w:tr>
+      <w:tr>
+        <w:tc>
+          <w:tcPr/>
+          <w:p>
+            <w:pPr>
+              <w:pStyle w:val="Compact"/>
+              <w:jc w:val="left"/>
+            </w:pPr>
+            <w:r>
+              <w:t xml:space="preserve">8</w:t>
+            </w:r>
+          </w:p>
+        </w:tc>
+        <w:tc>
+          <w:tcPr/>
+          <w:p>
+            <w:pPr>
+              <w:pStyle w:val="Compact"/>
+              <w:jc w:val="left"/>
+            </w:pPr>
+            <w:r>
+              <w:t xml:space="preserve">Giới thiệu Claude: mô hình, gói dịch vụ và tính năng nổi bật trên Windows</w:t>
+            </w:r>
+          </w:p>
+        </w:tc>
+        <w:tc>
+          <w:tcPr/>
+          <w:p>
+            <w:pPr>
+              <w:pStyle w:val="Compact"/>
+              <w:jc w:val="left"/>
+            </w:pPr>
+            <w:r>
+              <w:t xml:space="preserve">II</w:t>
+            </w:r>
+          </w:p>
+        </w:tc>
+        <w:tc>
+          <w:tcPr/>
+          <w:p>
+            <w:pPr>
+              <w:pStyle w:val="Compact"/>
+              <w:jc w:val="left"/>
+            </w:pPr>
+            <w:r>
+              <w:t xml:space="preserve">6′</w:t>
+            </w:r>
+          </w:p>
+        </w:tc>
+        <w:tc>
+          <w:tcPr/>
+          <w:p>
+            <w:pPr>
+              <w:pStyle w:val="Compact"/>
+              <w:jc w:val="left"/>
+            </w:pPr>
+            <w:r>
+              <w:t xml:space="preserve">[ ]</w:t>
+            </w:r>
+          </w:p>
+        </w:tc>
+      </w:tr>
+      <w:tr>
+        <w:tc>
+          <w:tcPr/>
+          <w:p>
+            <w:pPr>
+              <w:pStyle w:val="Compact"/>
+              <w:jc w:val="left"/>
+            </w:pPr>
+            <w:r>
+              <w:t xml:space="preserve">9</w:t>
+            </w:r>
+          </w:p>
+        </w:tc>
+        <w:tc>
+          <w:tcPr/>
+          <w:p>
+            <w:pPr>
+              <w:pStyle w:val="Compact"/>
+              <w:jc w:val="left"/>
+            </w:pPr>
+            <w:r>
+              <w:t xml:space="preserve">Bắt đầu với Claude: 6 bước đầu tiên và tổng hợp dữ liệu nhiều nguồn</w:t>
+            </w:r>
+          </w:p>
+        </w:tc>
+        <w:tc>
+          <w:tcPr/>
+          <w:p>
+            <w:pPr>
+              <w:pStyle w:val="Compact"/>
+              <w:jc w:val="left"/>
+            </w:pPr>
+            <w:r>
+              <w:t xml:space="preserve">II</w:t>
+            </w:r>
+          </w:p>
+        </w:tc>
+        <w:tc>
+          <w:tcPr/>
+          <w:p>
+            <w:pPr>
+              <w:pStyle w:val="Compact"/>
+              <w:jc w:val="left"/>
+            </w:pPr>
+            <w:r>
+              <w:t xml:space="preserve">5′</w:t>
+            </w:r>
+          </w:p>
+        </w:tc>
+        <w:tc>
+          <w:tcPr/>
+          <w:p>
+            <w:pPr>
+              <w:pStyle w:val="Compact"/>
+              <w:jc w:val="left"/>
+            </w:pPr>
+            <w:r>
+              <w:t xml:space="preserve">[ ]</w:t>
+            </w:r>
+          </w:p>
+        </w:tc>
+      </w:tr>
+      <w:tr>
+        <w:tc>
+          <w:tcPr/>
+          <w:p>
+            <w:pPr>
+              <w:pStyle w:val="Compact"/>
+              <w:jc w:val="left"/>
+            </w:pPr>
+            <w:r>
+              <w:t xml:space="preserve">10</w:t>
+            </w:r>
+          </w:p>
+        </w:tc>
+        <w:tc>
+          <w:tcPr/>
+          <w:p>
+            <w:pPr>
+              <w:pStyle w:val="Compact"/>
+              <w:jc w:val="left"/>
+            </w:pPr>
+            <w:r>
+              <w:t xml:space="preserve">Giao việc cho AI Agent: cách viết yêu cầu 5 bước</w:t>
+            </w:r>
+          </w:p>
+        </w:tc>
+        <w:tc>
+          <w:tcPr/>
+          <w:p>
+            <w:pPr>
+              <w:pStyle w:val="Compact"/>
+              <w:jc w:val="left"/>
+            </w:pPr>
+            <w:r>
+              <w:t xml:space="preserve">II</w:t>
+            </w:r>
+          </w:p>
+        </w:tc>
+        <w:tc>
+          <w:tcPr/>
+          <w:p>
+            <w:pPr>
+              <w:pStyle w:val="Compact"/>
+              <w:jc w:val="left"/>
+            </w:pPr>
+            <w:r>
+              <w:t xml:space="preserve">5′</w:t>
+            </w:r>
+          </w:p>
+        </w:tc>
+        <w:tc>
+          <w:tcPr/>
+          <w:p>
+            <w:pPr>
+              <w:pStyle w:val="Compact"/>
+              <w:jc w:val="left"/>
+            </w:pPr>
+            <w:r>
+              <w:t xml:space="preserve">[ ]</w:t>
+            </w:r>
+          </w:p>
+        </w:tc>
+      </w:tr>
+      <w:tr>
+        <w:tc>
+          <w:tcPr/>
+          <w:p>
+            <w:pPr>
+              <w:pStyle w:val="Compact"/>
+              <w:jc w:val="left"/>
+            </w:pPr>
+            <w:r>
+              <w:t xml:space="preserve">11</w:t>
+            </w:r>
+          </w:p>
+        </w:tc>
+        <w:tc>
+          <w:tcPr/>
+          <w:p>
+            <w:pPr>
+              <w:pStyle w:val="Compact"/>
+              <w:jc w:val="left"/>
+            </w:pPr>
+            <w:r>
+              <w:t xml:space="preserve">Không gian làm việc nghiên cứu: mỗi nhiệm vụ một dự án</w:t>
+            </w:r>
+          </w:p>
+        </w:tc>
+        <w:tc>
+          <w:tcPr/>
+          <w:p>
+            <w:pPr>
+              <w:pStyle w:val="Compact"/>
+              <w:jc w:val="left"/>
+            </w:pPr>
+            <w:r>
+              <w:t xml:space="preserve">II</w:t>
+            </w:r>
+          </w:p>
+        </w:tc>
+        <w:tc>
+          <w:tcPr/>
+          <w:p>
+            <w:pPr>
+              <w:pStyle w:val="Compact"/>
+              <w:jc w:val="left"/>
+            </w:pPr>
+            <w:r>
               <w:t xml:space="preserve">3′</w:t>
             </w:r>
           </w:p>
@@ -1530,19 +1856,19 @@
               <w:jc w:val="left"/>
             </w:pPr>
             <w:r>
-              <w:t xml:space="preserve">7</w:t>
-            </w:r>
-          </w:p>
-        </w:tc>
-        <w:tc>
-          <w:tcPr/>
-          <w:p>
-            <w:pPr>
-              <w:pStyle w:val="Compact"/>
-              <w:jc w:val="left"/>
-            </w:pPr>
-            <w:r>
-              <w:t xml:space="preserve">🆕 Tìm và đọc tài liệu khoa học: Sci-Hub, Sci-Bot và các lựa chọn hợp pháp</w:t>
+              <w:t xml:space="preserve">12</w:t>
+            </w:r>
+          </w:p>
+        </w:tc>
+        <w:tc>
+          <w:tcPr/>
+          <w:p>
+            <w:pPr>
+              <w:pStyle w:val="Compact"/>
+              <w:jc w:val="left"/>
+            </w:pPr>
+            <w:r>
+              <w:t xml:space="preserve">Skill, Subagent và hệ thống nhiều Agent</w:t>
             </w:r>
           </w:p>
         </w:tc>
@@ -1566,317 +1892,7 @@
               <w:jc w:val="left"/>
             </w:pPr>
             <w:r>
-              <w:t xml:space="preserve">4′</w:t>
-            </w:r>
-          </w:p>
-        </w:tc>
-        <w:tc>
-          <w:tcPr/>
-          <w:p>
-            <w:pPr>
-              <w:pStyle w:val="Compact"/>
-              <w:jc w:val="left"/>
-            </w:pPr>
-            <w:r>
-              <w:t xml:space="preserve">[ ]</w:t>
-            </w:r>
-          </w:p>
-        </w:tc>
-      </w:tr>
-      <w:tr>
-        <w:tc>
-          <w:tcPr/>
-          <w:p>
-            <w:pPr>
-              <w:pStyle w:val="Compact"/>
-              <w:jc w:val="left"/>
-            </w:pPr>
-            <w:r>
-              <w:t xml:space="preserve">8</w:t>
-            </w:r>
-          </w:p>
-        </w:tc>
-        <w:tc>
-          <w:tcPr/>
-          <w:p>
-            <w:pPr>
-              <w:pStyle w:val="Compact"/>
-              <w:jc w:val="left"/>
-            </w:pPr>
-            <w:r>
-              <w:t xml:space="preserve">Giới thiệu Claude: mô hình, gói dịch vụ và tính năng nổi bật trên Windows</w:t>
-            </w:r>
-          </w:p>
-        </w:tc>
-        <w:tc>
-          <w:tcPr/>
-          <w:p>
-            <w:pPr>
-              <w:pStyle w:val="Compact"/>
-              <w:jc w:val="left"/>
-            </w:pPr>
-            <w:r>
-              <w:t xml:space="preserve">II</w:t>
-            </w:r>
-          </w:p>
-        </w:tc>
-        <w:tc>
-          <w:tcPr/>
-          <w:p>
-            <w:pPr>
-              <w:pStyle w:val="Compact"/>
-              <w:jc w:val="left"/>
-            </w:pPr>
-            <w:r>
-              <w:t xml:space="preserve">6′</w:t>
-            </w:r>
-          </w:p>
-        </w:tc>
-        <w:tc>
-          <w:tcPr/>
-          <w:p>
-            <w:pPr>
-              <w:pStyle w:val="Compact"/>
-              <w:jc w:val="left"/>
-            </w:pPr>
-            <w:r>
-              <w:t xml:space="preserve">[ ]</w:t>
-            </w:r>
-          </w:p>
-        </w:tc>
-      </w:tr>
-      <w:tr>
-        <w:tc>
-          <w:tcPr/>
-          <w:p>
-            <w:pPr>
-              <w:pStyle w:val="Compact"/>
-              <w:jc w:val="left"/>
-            </w:pPr>
-            <w:r>
-              <w:t xml:space="preserve">9</w:t>
-            </w:r>
-          </w:p>
-        </w:tc>
-        <w:tc>
-          <w:tcPr/>
-          <w:p>
-            <w:pPr>
-              <w:pStyle w:val="Compact"/>
-              <w:jc w:val="left"/>
-            </w:pPr>
-            <w:r>
-              <w:t xml:space="preserve">Bắt đầu với Claude: 6 bước đầu tiên và tổng hợp dữ liệu nhiều nguồn</w:t>
-            </w:r>
-          </w:p>
-        </w:tc>
-        <w:tc>
-          <w:tcPr/>
-          <w:p>
-            <w:pPr>
-              <w:pStyle w:val="Compact"/>
-              <w:jc w:val="left"/>
-            </w:pPr>
-            <w:r>
-              <w:t xml:space="preserve">II</w:t>
-            </w:r>
-          </w:p>
-        </w:tc>
-        <w:tc>
-          <w:tcPr/>
-          <w:p>
-            <w:pPr>
-              <w:pStyle w:val="Compact"/>
-              <w:jc w:val="left"/>
-            </w:pPr>
-            <w:r>
-              <w:t xml:space="preserve">6′</w:t>
-            </w:r>
-          </w:p>
-        </w:tc>
-        <w:tc>
-          <w:tcPr/>
-          <w:p>
-            <w:pPr>
-              <w:pStyle w:val="Compact"/>
-              <w:jc w:val="left"/>
-            </w:pPr>
-            <w:r>
-              <w:t xml:space="preserve">[ ]</w:t>
-            </w:r>
-          </w:p>
-        </w:tc>
-      </w:tr>
-      <w:tr>
-        <w:tc>
-          <w:tcPr/>
-          <w:p>
-            <w:pPr>
-              <w:pStyle w:val="Compact"/>
-              <w:jc w:val="left"/>
-            </w:pPr>
-            <w:r>
-              <w:t xml:space="preserve">10</w:t>
-            </w:r>
-          </w:p>
-        </w:tc>
-        <w:tc>
-          <w:tcPr/>
-          <w:p>
-            <w:pPr>
-              <w:pStyle w:val="Compact"/>
-              <w:jc w:val="left"/>
-            </w:pPr>
-            <w:r>
-              <w:t xml:space="preserve">Giao việc cho AI Agent: cách viết yêu cầu 5 bước</w:t>
-            </w:r>
-          </w:p>
-        </w:tc>
-        <w:tc>
-          <w:tcPr/>
-          <w:p>
-            <w:pPr>
-              <w:pStyle w:val="Compact"/>
-              <w:jc w:val="left"/>
-            </w:pPr>
-            <w:r>
-              <w:t xml:space="preserve">II</w:t>
-            </w:r>
-          </w:p>
-        </w:tc>
-        <w:tc>
-          <w:tcPr/>
-          <w:p>
-            <w:pPr>
-              <w:pStyle w:val="Compact"/>
-              <w:jc w:val="left"/>
-            </w:pPr>
-            <w:r>
-              <w:t xml:space="preserve">6′</w:t>
-            </w:r>
-          </w:p>
-        </w:tc>
-        <w:tc>
-          <w:tcPr/>
-          <w:p>
-            <w:pPr>
-              <w:pStyle w:val="Compact"/>
-              <w:jc w:val="left"/>
-            </w:pPr>
-            <w:r>
-              <w:t xml:space="preserve">[ ]</w:t>
-            </w:r>
-          </w:p>
-        </w:tc>
-      </w:tr>
-      <w:tr>
-        <w:tc>
-          <w:tcPr/>
-          <w:p>
-            <w:pPr>
-              <w:pStyle w:val="Compact"/>
-              <w:jc w:val="left"/>
-            </w:pPr>
-            <w:r>
-              <w:t xml:space="preserve">11</w:t>
-            </w:r>
-          </w:p>
-        </w:tc>
-        <w:tc>
-          <w:tcPr/>
-          <w:p>
-            <w:pPr>
-              <w:pStyle w:val="Compact"/>
-              <w:jc w:val="left"/>
-            </w:pPr>
-            <w:r>
-              <w:t xml:space="preserve">Không gian làm việc nghiên cứu: mỗi nhiệm vụ một dự án</w:t>
-            </w:r>
-          </w:p>
-        </w:tc>
-        <w:tc>
-          <w:tcPr/>
-          <w:p>
-            <w:pPr>
-              <w:pStyle w:val="Compact"/>
-              <w:jc w:val="left"/>
-            </w:pPr>
-            <w:r>
-              <w:t xml:space="preserve">II</w:t>
-            </w:r>
-          </w:p>
-        </w:tc>
-        <w:tc>
-          <w:tcPr/>
-          <w:p>
-            <w:pPr>
-              <w:pStyle w:val="Compact"/>
-              <w:jc w:val="left"/>
-            </w:pPr>
-            <w:r>
-              <w:t xml:space="preserve">3′</w:t>
-            </w:r>
-          </w:p>
-        </w:tc>
-        <w:tc>
-          <w:tcPr/>
-          <w:p>
-            <w:pPr>
-              <w:pStyle w:val="Compact"/>
-              <w:jc w:val="left"/>
-            </w:pPr>
-            <w:r>
-              <w:t xml:space="preserve">[ ]</w:t>
-            </w:r>
-          </w:p>
-        </w:tc>
-      </w:tr>
-      <w:tr>
-        <w:tc>
-          <w:tcPr/>
-          <w:p>
-            <w:pPr>
-              <w:pStyle w:val="Compact"/>
-              <w:jc w:val="left"/>
-            </w:pPr>
-            <w:r>
-              <w:t xml:space="preserve">12</w:t>
-            </w:r>
-          </w:p>
-        </w:tc>
-        <w:tc>
-          <w:tcPr/>
-          <w:p>
-            <w:pPr>
-              <w:pStyle w:val="Compact"/>
-              <w:jc w:val="left"/>
-            </w:pPr>
-            <w:r>
-              <w:t xml:space="preserve">Skill, Subagent và hệ thống nhiều Agent</w:t>
-            </w:r>
-          </w:p>
-        </w:tc>
-        <w:tc>
-          <w:tcPr/>
-          <w:p>
-            <w:pPr>
-              <w:pStyle w:val="Compact"/>
-              <w:jc w:val="left"/>
-            </w:pPr>
-            <w:r>
-              <w:t xml:space="preserve">II</w:t>
-            </w:r>
-          </w:p>
-        </w:tc>
-        <w:tc>
-          <w:tcPr/>
-          <w:p>
-            <w:pPr>
-              <w:pStyle w:val="Compact"/>
-              <w:jc w:val="left"/>
-            </w:pPr>
-            <w:r>
-              <w:t xml:space="preserve">3′</w:t>
+              <w:t xml:space="preserve">2′</w:t>
             </w:r>
           </w:p>
         </w:tc>
@@ -1914,7 +1930,7 @@
                 <w:bCs/>
                 <w:b/>
               </w:rPr>
-              <w:t xml:space="preserve">PHẦN III. AI AGENT TRONG VÒNG ĐỜI NHIỆM VỤ KHOA HỌC – 34′</w:t>
+              <w:t xml:space="preserve">PHẦN III. AI AGENT TRONG VÒNG ĐỜI NHIỆM VỤ KHOA HỌC – 30′</w:t>
             </w:r>
           </w:p>
         </w:tc>
@@ -1988,7 +2004,7 @@
               <w:jc w:val="left"/>
             </w:pPr>
             <w:r>
-              <w:t xml:space="preserve">7′</w:t>
+              <w:t xml:space="preserve">6′</w:t>
             </w:r>
           </w:p>
         </w:tc>
@@ -2050,6 +2066,130 @@
               <w:jc w:val="left"/>
             </w:pPr>
             <w:r>
+              <w:t xml:space="preserve">5′</w:t>
+            </w:r>
+          </w:p>
+        </w:tc>
+        <w:tc>
+          <w:tcPr/>
+          <w:p>
+            <w:pPr>
+              <w:pStyle w:val="Compact"/>
+              <w:jc w:val="left"/>
+            </w:pPr>
+            <w:r>
+              <w:t xml:space="preserve">[ ]</w:t>
+            </w:r>
+          </w:p>
+        </w:tc>
+      </w:tr>
+      <w:tr>
+        <w:tc>
+          <w:tcPr/>
+          <w:p>
+            <w:pPr>
+              <w:pStyle w:val="Compact"/>
+              <w:jc w:val="left"/>
+            </w:pPr>
+            <w:r>
+              <w:t xml:space="preserve">15</w:t>
+            </w:r>
+          </w:p>
+        </w:tc>
+        <w:tc>
+          <w:tcPr/>
+          <w:p>
+            <w:pPr>
+              <w:pStyle w:val="Compact"/>
+              <w:jc w:val="left"/>
+            </w:pPr>
+            <w:r>
+              <w:t xml:space="preserve">Hồ sơ nhiệm vụ: thuyết minh, tiến độ và kinh phí theo biểu mẫu Trung tâm</w:t>
+            </w:r>
+          </w:p>
+        </w:tc>
+        <w:tc>
+          <w:tcPr/>
+          <w:p>
+            <w:pPr>
+              <w:pStyle w:val="Compact"/>
+              <w:jc w:val="left"/>
+            </w:pPr>
+            <w:r>
+              <w:t xml:space="preserve">III</w:t>
+            </w:r>
+          </w:p>
+        </w:tc>
+        <w:tc>
+          <w:tcPr/>
+          <w:p>
+            <w:pPr>
+              <w:pStyle w:val="Compact"/>
+              <w:jc w:val="left"/>
+            </w:pPr>
+            <w:r>
+              <w:t xml:space="preserve">4′</w:t>
+            </w:r>
+          </w:p>
+        </w:tc>
+        <w:tc>
+          <w:tcPr/>
+          <w:p>
+            <w:pPr>
+              <w:pStyle w:val="Compact"/>
+              <w:jc w:val="left"/>
+            </w:pPr>
+            <w:r>
+              <w:t xml:space="preserve">[ ]</w:t>
+            </w:r>
+          </w:p>
+        </w:tc>
+      </w:tr>
+      <w:tr>
+        <w:tc>
+          <w:tcPr/>
+          <w:p>
+            <w:pPr>
+              <w:pStyle w:val="Compact"/>
+              <w:jc w:val="left"/>
+            </w:pPr>
+            <w:r>
+              <w:t xml:space="preserve">16</w:t>
+            </w:r>
+          </w:p>
+        </w:tc>
+        <w:tc>
+          <w:tcPr/>
+          <w:p>
+            <w:pPr>
+              <w:pStyle w:val="Compact"/>
+              <w:jc w:val="left"/>
+            </w:pPr>
+            <w:r>
+              <w:t xml:space="preserve">Xử lý dữ liệu: AI viết và chạy mã Python – DEMO 2</w:t>
+            </w:r>
+          </w:p>
+        </w:tc>
+        <w:tc>
+          <w:tcPr/>
+          <w:p>
+            <w:pPr>
+              <w:pStyle w:val="Compact"/>
+              <w:jc w:val="left"/>
+            </w:pPr>
+            <w:r>
+              <w:t xml:space="preserve">III</w:t>
+            </w:r>
+          </w:p>
+        </w:tc>
+        <w:tc>
+          <w:tcPr/>
+          <w:p>
+            <w:pPr>
+              <w:pStyle w:val="Compact"/>
+              <w:jc w:val="left"/>
+            </w:pPr>
+            <w:r>
               <w:t xml:space="preserve">6′</w:t>
             </w:r>
           </w:p>
@@ -2076,19 +2216,19 @@
               <w:jc w:val="left"/>
             </w:pPr>
             <w:r>
-              <w:t xml:space="preserve">15</w:t>
-            </w:r>
-          </w:p>
-        </w:tc>
-        <w:tc>
-          <w:tcPr/>
-          <w:p>
-            <w:pPr>
-              <w:pStyle w:val="Compact"/>
-              <w:jc w:val="left"/>
-            </w:pPr>
-            <w:r>
-              <w:t xml:space="preserve">Hồ sơ nhiệm vụ: thuyết minh, tiến độ và kinh phí theo biểu mẫu Trung tâm</w:t>
+              <w:t xml:space="preserve">17</w:t>
+            </w:r>
+          </w:p>
+        </w:tc>
+        <w:tc>
+          <w:tcPr/>
+          <w:p>
+            <w:pPr>
+              <w:pStyle w:val="Compact"/>
+              <w:jc w:val="left"/>
+            </w:pPr>
+            <w:r>
+              <w:t xml:space="preserve">Mô hình 3D: mô phỏng quá trình ăn mòn vật liệu theo thời gian</w:t>
             </w:r>
           </w:p>
         </w:tc>
@@ -2112,193 +2252,69 @@
               <w:jc w:val="left"/>
             </w:pPr>
             <w:r>
+              <w:t xml:space="preserve">3′</w:t>
+            </w:r>
+          </w:p>
+        </w:tc>
+        <w:tc>
+          <w:tcPr/>
+          <w:p>
+            <w:pPr>
+              <w:pStyle w:val="Compact"/>
+              <w:jc w:val="left"/>
+            </w:pPr>
+            <w:r>
+              <w:t xml:space="preserve">[ ]</w:t>
+            </w:r>
+          </w:p>
+        </w:tc>
+      </w:tr>
+      <w:tr>
+        <w:tc>
+          <w:tcPr/>
+          <w:p>
+            <w:pPr>
+              <w:pStyle w:val="Compact"/>
+              <w:jc w:val="left"/>
+            </w:pPr>
+            <w:r>
+              <w:t xml:space="preserve">18</w:t>
+            </w:r>
+          </w:p>
+        </w:tc>
+        <w:tc>
+          <w:tcPr/>
+          <w:p>
+            <w:pPr>
+              <w:pStyle w:val="Compact"/>
+              <w:jc w:val="left"/>
+            </w:pPr>
+            <w:r>
+              <w:t xml:space="preserve">Công bố kết quả: bài báo và báo cáo tổng hợp theo nhiều định dạng</w:t>
+            </w:r>
+          </w:p>
+        </w:tc>
+        <w:tc>
+          <w:tcPr/>
+          <w:p>
+            <w:pPr>
+              <w:pStyle w:val="Compact"/>
+              <w:jc w:val="left"/>
+            </w:pPr>
+            <w:r>
+              <w:t xml:space="preserve">III</w:t>
+            </w:r>
+          </w:p>
+        </w:tc>
+        <w:tc>
+          <w:tcPr/>
+          <w:p>
+            <w:pPr>
+              <w:pStyle w:val="Compact"/>
+              <w:jc w:val="left"/>
+            </w:pPr>
+            <w:r>
               <w:t xml:space="preserve">4′</w:t>
-            </w:r>
-          </w:p>
-        </w:tc>
-        <w:tc>
-          <w:tcPr/>
-          <w:p>
-            <w:pPr>
-              <w:pStyle w:val="Compact"/>
-              <w:jc w:val="left"/>
-            </w:pPr>
-            <w:r>
-              <w:t xml:space="preserve">[ ]</w:t>
-            </w:r>
-          </w:p>
-        </w:tc>
-      </w:tr>
-      <w:tr>
-        <w:tc>
-          <w:tcPr/>
-          <w:p>
-            <w:pPr>
-              <w:pStyle w:val="Compact"/>
-              <w:jc w:val="left"/>
-            </w:pPr>
-            <w:r>
-              <w:t xml:space="preserve">16</w:t>
-            </w:r>
-          </w:p>
-        </w:tc>
-        <w:tc>
-          <w:tcPr/>
-          <w:p>
-            <w:pPr>
-              <w:pStyle w:val="Compact"/>
-              <w:jc w:val="left"/>
-            </w:pPr>
-            <w:r>
-              <w:t xml:space="preserve">Xử lý dữ liệu: AI viết và chạy mã Python – DEMO 2</w:t>
-            </w:r>
-          </w:p>
-        </w:tc>
-        <w:tc>
-          <w:tcPr/>
-          <w:p>
-            <w:pPr>
-              <w:pStyle w:val="Compact"/>
-              <w:jc w:val="left"/>
-            </w:pPr>
-            <w:r>
-              <w:t xml:space="preserve">III</w:t>
-            </w:r>
-          </w:p>
-        </w:tc>
-        <w:tc>
-          <w:tcPr/>
-          <w:p>
-            <w:pPr>
-              <w:pStyle w:val="Compact"/>
-              <w:jc w:val="left"/>
-            </w:pPr>
-            <w:r>
-              <w:t xml:space="preserve">7′</w:t>
-            </w:r>
-          </w:p>
-        </w:tc>
-        <w:tc>
-          <w:tcPr/>
-          <w:p>
-            <w:pPr>
-              <w:pStyle w:val="Compact"/>
-              <w:jc w:val="left"/>
-            </w:pPr>
-            <w:r>
-              <w:t xml:space="preserve">[ ]</w:t>
-            </w:r>
-          </w:p>
-        </w:tc>
-      </w:tr>
-      <w:tr>
-        <w:tc>
-          <w:tcPr/>
-          <w:p>
-            <w:pPr>
-              <w:pStyle w:val="Compact"/>
-              <w:jc w:val="left"/>
-            </w:pPr>
-            <w:r>
-              <w:t xml:space="preserve">17</w:t>
-            </w:r>
-          </w:p>
-        </w:tc>
-        <w:tc>
-          <w:tcPr/>
-          <w:p>
-            <w:pPr>
-              <w:pStyle w:val="Compact"/>
-              <w:jc w:val="left"/>
-            </w:pPr>
-            <w:r>
-              <w:t xml:space="preserve">Mô hình 3D: mô phỏng quá trình ăn mòn vật liệu theo thời gian</w:t>
-            </w:r>
-          </w:p>
-        </w:tc>
-        <w:tc>
-          <w:tcPr/>
-          <w:p>
-            <w:pPr>
-              <w:pStyle w:val="Compact"/>
-              <w:jc w:val="left"/>
-            </w:pPr>
-            <w:r>
-              <w:t xml:space="preserve">III</w:t>
-            </w:r>
-          </w:p>
-        </w:tc>
-        <w:tc>
-          <w:tcPr/>
-          <w:p>
-            <w:pPr>
-              <w:pStyle w:val="Compact"/>
-              <w:jc w:val="left"/>
-            </w:pPr>
-            <w:r>
-              <w:t xml:space="preserve">3′</w:t>
-            </w:r>
-          </w:p>
-        </w:tc>
-        <w:tc>
-          <w:tcPr/>
-          <w:p>
-            <w:pPr>
-              <w:pStyle w:val="Compact"/>
-              <w:jc w:val="left"/>
-            </w:pPr>
-            <w:r>
-              <w:t xml:space="preserve">[ ]</w:t>
-            </w:r>
-          </w:p>
-        </w:tc>
-      </w:tr>
-      <w:tr>
-        <w:tc>
-          <w:tcPr/>
-          <w:p>
-            <w:pPr>
-              <w:pStyle w:val="Compact"/>
-              <w:jc w:val="left"/>
-            </w:pPr>
-            <w:r>
-              <w:t xml:space="preserve">18</w:t>
-            </w:r>
-          </w:p>
-        </w:tc>
-        <w:tc>
-          <w:tcPr/>
-          <w:p>
-            <w:pPr>
-              <w:pStyle w:val="Compact"/>
-              <w:jc w:val="left"/>
-            </w:pPr>
-            <w:r>
-              <w:t xml:space="preserve">Công bố kết quả: bài báo và báo cáo tổng hợp theo nhiều định dạng</w:t>
-            </w:r>
-          </w:p>
-        </w:tc>
-        <w:tc>
-          <w:tcPr/>
-          <w:p>
-            <w:pPr>
-              <w:pStyle w:val="Compact"/>
-              <w:jc w:val="left"/>
-            </w:pPr>
-            <w:r>
-              <w:t xml:space="preserve">III</w:t>
-            </w:r>
-          </w:p>
-        </w:tc>
-        <w:tc>
-          <w:tcPr/>
-          <w:p>
-            <w:pPr>
-              <w:pStyle w:val="Compact"/>
-              <w:jc w:val="left"/>
-            </w:pPr>
-            <w:r>
-              <w:t xml:space="preserve">5′</w:t>
             </w:r>
           </w:p>
         </w:tc>
@@ -2398,7 +2414,7 @@
                 <w:bCs/>
                 <w:b/>
               </w:rPr>
-              <w:t xml:space="preserve">PHẦN IV. ĐỀ TÀI MẬT: ỨNG DỤNG AI KHI DỮ LIỆU KHÔNG ĐƯỢC ĐƯA LÊN INTERNET – 5′</w:t>
+              <w:t xml:space="preserve">PHẦN IV. ĐỀ TÀI MẬT: ỨNG DỤNG AI KHI DỮ LIỆU KHÔNG ĐƯỢC ĐƯA LÊN INTERNET – 15′</w:t>
             </w:r>
           </w:p>
         </w:tc>
@@ -2448,6 +2464,130 @@
               <w:jc w:val="left"/>
             </w:pPr>
             <w:r>
+              <w:t xml:space="preserve">🆕 Ranh giới pháp lý: dữ liệu mật và AI trực tuyến</w:t>
+            </w:r>
+          </w:p>
+        </w:tc>
+        <w:tc>
+          <w:tcPr/>
+          <w:p>
+            <w:pPr>
+              <w:pStyle w:val="Compact"/>
+              <w:jc w:val="left"/>
+            </w:pPr>
+            <w:r>
+              <w:t xml:space="preserve">IV</w:t>
+            </w:r>
+          </w:p>
+        </w:tc>
+        <w:tc>
+          <w:tcPr/>
+          <w:p>
+            <w:pPr>
+              <w:pStyle w:val="Compact"/>
+              <w:jc w:val="left"/>
+            </w:pPr>
+            <w:r>
+              <w:t xml:space="preserve">3′</w:t>
+            </w:r>
+          </w:p>
+        </w:tc>
+        <w:tc>
+          <w:tcPr/>
+          <w:p>
+            <w:pPr>
+              <w:pStyle w:val="Compact"/>
+              <w:jc w:val="left"/>
+            </w:pPr>
+            <w:r>
+              <w:t xml:space="preserve">[ ]</w:t>
+            </w:r>
+          </w:p>
+        </w:tc>
+      </w:tr>
+      <w:tr>
+        <w:tc>
+          <w:tcPr/>
+          <w:p>
+            <w:pPr>
+              <w:pStyle w:val="Compact"/>
+              <w:jc w:val="left"/>
+            </w:pPr>
+            <w:r>
+              <w:t xml:space="preserve">21</w:t>
+            </w:r>
+          </w:p>
+        </w:tc>
+        <w:tc>
+          <w:tcPr/>
+          <w:p>
+            <w:pPr>
+              <w:pStyle w:val="Compact"/>
+              <w:jc w:val="left"/>
+            </w:pPr>
+            <w:r>
+              <w:t xml:space="preserve">🆕 Mô hình ba vùng và quy trình 6 bước có điểm kiểm soát</w:t>
+            </w:r>
+          </w:p>
+        </w:tc>
+        <w:tc>
+          <w:tcPr/>
+          <w:p>
+            <w:pPr>
+              <w:pStyle w:val="Compact"/>
+              <w:jc w:val="left"/>
+            </w:pPr>
+            <w:r>
+              <w:t xml:space="preserve">IV</w:t>
+            </w:r>
+          </w:p>
+        </w:tc>
+        <w:tc>
+          <w:tcPr/>
+          <w:p>
+            <w:pPr>
+              <w:pStyle w:val="Compact"/>
+              <w:jc w:val="left"/>
+            </w:pPr>
+            <w:r>
+              <w:t xml:space="preserve">4′</w:t>
+            </w:r>
+          </w:p>
+        </w:tc>
+        <w:tc>
+          <w:tcPr/>
+          <w:p>
+            <w:pPr>
+              <w:pStyle w:val="Compact"/>
+              <w:jc w:val="left"/>
+            </w:pPr>
+            <w:r>
+              <w:t xml:space="preserve">[ ]</w:t>
+            </w:r>
+          </w:p>
+        </w:tc>
+      </w:tr>
+      <w:tr>
+        <w:tc>
+          <w:tcPr/>
+          <w:p>
+            <w:pPr>
+              <w:pStyle w:val="Compact"/>
+              <w:jc w:val="left"/>
+            </w:pPr>
+            <w:r>
+              <w:t xml:space="preserve">22</w:t>
+            </w:r>
+          </w:p>
+        </w:tc>
+        <w:tc>
+          <w:tcPr/>
+          <w:p>
+            <w:pPr>
+              <w:pStyle w:val="Compact"/>
+              <w:jc w:val="left"/>
+            </w:pPr>
+            <w:r>
               <w:t xml:space="preserve">Đề tài mật: xây dựng công cụ và xử lý ngay trên máy không kết nối Internet – DEMO 3</w:t>
             </w:r>
           </w:p>
@@ -2473,6 +2613,68 @@
             </w:pPr>
             <w:r>
               <w:t xml:space="preserve">5′</w:t>
+            </w:r>
+          </w:p>
+        </w:tc>
+        <w:tc>
+          <w:tcPr/>
+          <w:p>
+            <w:pPr>
+              <w:pStyle w:val="Compact"/>
+              <w:jc w:val="left"/>
+            </w:pPr>
+            <w:r>
+              <w:t xml:space="preserve">[ ]</w:t>
+            </w:r>
+          </w:p>
+        </w:tc>
+      </w:tr>
+      <w:tr>
+        <w:tc>
+          <w:tcPr/>
+          <w:p>
+            <w:pPr>
+              <w:pStyle w:val="Compact"/>
+              <w:jc w:val="left"/>
+            </w:pPr>
+            <w:r>
+              <w:t xml:space="preserve">23</w:t>
+            </w:r>
+          </w:p>
+        </w:tc>
+        <w:tc>
+          <w:tcPr/>
+          <w:p>
+            <w:pPr>
+              <w:pStyle w:val="Compact"/>
+              <w:jc w:val="left"/>
+            </w:pPr>
+            <w:r>
+              <w:t xml:space="preserve">🆕 Sai lầm thường gặp và các phương án khác</w:t>
+            </w:r>
+          </w:p>
+        </w:tc>
+        <w:tc>
+          <w:tcPr/>
+          <w:p>
+            <w:pPr>
+              <w:pStyle w:val="Compact"/>
+              <w:jc w:val="left"/>
+            </w:pPr>
+            <w:r>
+              <w:t xml:space="preserve">IV</w:t>
+            </w:r>
+          </w:p>
+        </w:tc>
+        <w:tc>
+          <w:tcPr/>
+          <w:p>
+            <w:pPr>
+              <w:pStyle w:val="Compact"/>
+              <w:jc w:val="left"/>
+            </w:pPr>
+            <w:r>
+              <w:t xml:space="preserve">3′</w:t>
             </w:r>
           </w:p>
         </w:tc>
@@ -2510,45 +2712,45 @@
                 <w:bCs/>
                 <w:b/>
               </w:rPr>
-              <w:t xml:space="preserve">PHẦN V. SKILL, KHOA HỌC MỞ VÀ TỰ ĐỘNG HÓA – 15′</w:t>
-            </w:r>
-          </w:p>
-        </w:tc>
-        <w:tc>
-          <w:tcPr/>
-          <w:p>
-            <w:pPr>
-              <w:pStyle w:val="Compact"/>
-            </w:pPr>
-          </w:p>
-        </w:tc>
-        <w:tc>
-          <w:tcPr/>
-          <w:p>
-            <w:pPr>
-              <w:pStyle w:val="Compact"/>
-            </w:pPr>
-          </w:p>
-        </w:tc>
-        <w:tc>
-          <w:tcPr/>
-          <w:p>
-            <w:pPr>
-              <w:pStyle w:val="Compact"/>
-            </w:pPr>
-          </w:p>
-        </w:tc>
-      </w:tr>
-      <w:tr>
-        <w:tc>
-          <w:tcPr/>
-          <w:p>
-            <w:pPr>
-              <w:pStyle w:val="Compact"/>
-              <w:jc w:val="left"/>
-            </w:pPr>
-            <w:r>
-              <w:t xml:space="preserve">21</w:t>
+              <w:t xml:space="preserve">PHẦN V. SKILL, KHOA HỌC MỞ VÀ TỰ ĐỘNG HÓA – 13′</w:t>
+            </w:r>
+          </w:p>
+        </w:tc>
+        <w:tc>
+          <w:tcPr/>
+          <w:p>
+            <w:pPr>
+              <w:pStyle w:val="Compact"/>
+            </w:pPr>
+          </w:p>
+        </w:tc>
+        <w:tc>
+          <w:tcPr/>
+          <w:p>
+            <w:pPr>
+              <w:pStyle w:val="Compact"/>
+            </w:pPr>
+          </w:p>
+        </w:tc>
+        <w:tc>
+          <w:tcPr/>
+          <w:p>
+            <w:pPr>
+              <w:pStyle w:val="Compact"/>
+            </w:pPr>
+          </w:p>
+        </w:tc>
+      </w:tr>
+      <w:tr>
+        <w:tc>
+          <w:tcPr/>
+          <w:p>
+            <w:pPr>
+              <w:pStyle w:val="Compact"/>
+              <w:jc w:val="left"/>
+            </w:pPr>
+            <w:r>
+              <w:t xml:space="preserve">24</w:t>
             </w:r>
           </w:p>
         </w:tc>
@@ -2584,7 +2786,7 @@
               <w:jc w:val="left"/>
             </w:pPr>
             <w:r>
-              <w:t xml:space="preserve">6′</w:t>
+              <w:t xml:space="preserve">5′</w:t>
             </w:r>
           </w:p>
         </w:tc>
@@ -2610,7 +2812,7 @@
               <w:jc w:val="left"/>
             </w:pPr>
             <w:r>
-              <w:t xml:space="preserve">22</w:t>
+              <w:t xml:space="preserve">25</w:t>
             </w:r>
           </w:p>
         </w:tc>
@@ -2646,7 +2848,7 @@
               <w:jc w:val="left"/>
             </w:pPr>
             <w:r>
-              <w:t xml:space="preserve">5′</w:t>
+              <w:t xml:space="preserve">4′</w:t>
             </w:r>
           </w:p>
         </w:tc>
@@ -2672,7 +2874,7 @@
               <w:jc w:val="left"/>
             </w:pPr>
             <w:r>
-              <w:t xml:space="preserve">23</w:t>
+              <w:t xml:space="preserve">26</w:t>
             </w:r>
           </w:p>
         </w:tc>
@@ -2784,7 +2986,7 @@
               <w:jc w:val="left"/>
             </w:pPr>
             <w:r>
-              <w:t xml:space="preserve">24</w:t>
+              <w:t xml:space="preserve">27</w:t>
             </w:r>
           </w:p>
         </w:tc>
@@ -2896,7 +3098,7 @@
               <w:jc w:val="left"/>
             </w:pPr>
             <w:r>
-              <w:t xml:space="preserve">25</w:t>
+              <w:t xml:space="preserve">28</w:t>
             </w:r>
           </w:p>
         </w:tc>
@@ -2958,7 +3160,7 @@
               <w:jc w:val="left"/>
             </w:pPr>
             <w:r>
-              <w:t xml:space="preserve">26</w:t>
+              <w:t xml:space="preserve">29</w:t>
             </w:r>
           </w:p>
         </w:tc>
@@ -3020,7 +3222,7 @@
               <w:jc w:val="left"/>
             </w:pPr>
             <w:r>
-              <w:t xml:space="preserve">27</w:t>
+              <w:t xml:space="preserve">30</w:t>
             </w:r>
           </w:p>
         </w:tc>
@@ -3082,7 +3284,7 @@
               <w:jc w:val="left"/>
             </w:pPr>
             <w:r>
-              <w:t xml:space="preserve">28</w:t>
+              <w:t xml:space="preserve">31</w:t>
             </w:r>
           </w:p>
         </w:tc>
@@ -3144,7 +3346,7 @@
               <w:jc w:val="left"/>
             </w:pPr>
             <w:r>
-              <w:t xml:space="preserve">29</w:t>
+              <w:t xml:space="preserve">32</w:t>
             </w:r>
           </w:p>
         </w:tc>
@@ -4777,13 +4979,13 @@
     </w:p>
     <w:bookmarkEnd w:id="28"/>
     <w:bookmarkEnd w:id="29"/>
-    <w:bookmarkStart w:id="38" w:name="X52d1169fc9a4f3edcc8e3f646ed780d583b262b"/>
+    <w:bookmarkStart w:id="38" w:name="Xa1d8ae570c6b4d8a7632d2cdd3fd6d3433745c3"/>
     <w:p>
       <w:pPr>
         <w:pStyle w:val="Heading1"/>
       </w:pPr>
       <w:r>
-        <w:t xml:space="preserve">PHẦN II. LỰA CHỌN VÀ SỬ DỤNG CÔNG CỤ AI PHÙ HỢP (36 phút)</w:t>
+        <w:t xml:space="preserve">PHẦN II. LỰA CHỌN VÀ SỬ DỤNG CÔNG CỤ AI PHÙ HỢP (32 phút)</w:t>
       </w:r>
     </w:p>
     <w:p>
@@ -5272,13 +5474,13 @@
       </w:r>
     </w:p>
     <w:bookmarkEnd w:id="30"/>
-    <w:bookmarkStart w:id="31" w:name="X1489f1209cb8496d49bc0b0faf962492444811d"/>
+    <w:bookmarkStart w:id="31" w:name="X24d1c09b8e484d4311ae8b168dea217e6d28e26"/>
     <w:p>
       <w:pPr>
         <w:pStyle w:val="Heading2"/>
       </w:pPr>
       <w:r>
-        <w:t xml:space="preserve">Slide 6 – Các công cụ AI phổ biến và vai trò của từng loại (3′)</w:t>
+        <w:t xml:space="preserve">Slide 6 – Các công cụ AI phổ biến và vai trò của từng loại (2′)</w:t>
       </w:r>
     </w:p>
     <w:p>
@@ -6702,13 +6904,13 @@
       </w:r>
     </w:p>
     <w:bookmarkEnd w:id="33"/>
-    <w:bookmarkStart w:id="34" w:name="X1f2fca7a4929371012e05f3d846214e7df9b297"/>
+    <w:bookmarkStart w:id="34" w:name="X804204e3a809e15549529c0e80355c3679ac91d"/>
     <w:p>
       <w:pPr>
         <w:pStyle w:val="Heading2"/>
       </w:pPr>
       <w:r>
-        <w:t xml:space="preserve">Slide 9 – Bắt đầu với Claude: 6 bước đầu tiên và tổng hợp dữ liệu nhiều nguồn (6′)</w:t>
+        <w:t xml:space="preserve">Slide 9 – Bắt đầu với Claude: 6 bước đầu tiên và tổng hợp dữ liệu nhiều nguồn (5′)</w:t>
       </w:r>
     </w:p>
     <w:p>
@@ -7793,13 +7995,13 @@
       </w:r>
     </w:p>
     <w:bookmarkEnd w:id="34"/>
-    <w:bookmarkStart w:id="35" w:name="Xa0af0395506ce5796e276f539278a944ef2c75f"/>
+    <w:bookmarkStart w:id="35" w:name="X1b19ea63da5f2e53c9ddbb9fbe1a91d56194a43"/>
     <w:p>
       <w:pPr>
         <w:pStyle w:val="Heading2"/>
       </w:pPr>
       <w:r>
-        <w:t xml:space="preserve">Slide 10 – Giao việc cho AI Agent: cách viết yêu cầu 5 bước (6′)</w:t>
+        <w:t xml:space="preserve">Slide 10 – Giao việc cho AI Agent: cách viết yêu cầu 5 bước (5′)</w:t>
       </w:r>
     </w:p>
     <w:p>
@@ -8523,7 +8725,7 @@
         <w:rPr>
           <w:rStyle w:val="VerbatimChar"/>
         </w:rPr>
-        <w:t xml:space="preserve">├── 05-ket-qua/              ← bảng, hình, mô hình 3D, kiểm tra bằng Skill                 (Slide 16, 17, 21)</w:t>
+        <w:t xml:space="preserve">├── 05-ket-qua/              ← bảng, hình, mô hình 3D, kiểm tra bằng Skill                 (Slide 16, 17, 24)</w:t>
       </w:r>
       <w:r>
         <w:br/>
@@ -8625,13 +8827,13 @@
       </w:r>
     </w:p>
     <w:bookmarkEnd w:id="36"/>
-    <w:bookmarkStart w:id="37" w:name="X95e28c2cc31a9fbdda85c56c3f8cbf25d1f1191"/>
+    <w:bookmarkStart w:id="37" w:name="Xd43cf258a8a6f26e4e2ebfab4eeebf3b2928ae9"/>
     <w:p>
       <w:pPr>
         <w:pStyle w:val="Heading2"/>
       </w:pPr>
       <w:r>
-        <w:t xml:space="preserve">Slide 12 – Skill, Subagent và hệ thống nhiều Agent (3′) –</w:t>
+        <w:t xml:space="preserve">Slide 12 – Skill, Subagent và hệ thống nhiều Agent (2′) –</w:t>
       </w:r>
       <w:r>
         <w:t xml:space="preserve"> </w:t>
@@ -8844,13 +9046,13 @@
     </w:p>
     <w:bookmarkEnd w:id="37"/>
     <w:bookmarkEnd w:id="38"/>
-    <w:bookmarkStart w:id="46" w:name="Xb76ac458eb2f403086516140cdc9f2a6c74effc"/>
+    <w:bookmarkStart w:id="46" w:name="X8f20a420af1379ad237599e2a76979ed8275dc8"/>
     <w:p>
       <w:pPr>
         <w:pStyle w:val="Heading1"/>
       </w:pPr>
       <w:r>
-        <w:t xml:space="preserve">PHẦN III. AI AGENT TRONG VÒNG ĐỜI NHIỆM VỤ KHOA HỌC (34 phút)</w:t>
+        <w:t xml:space="preserve">PHẦN III. AI AGENT TRONG VÒNG ĐỜI NHIỆM VỤ KHOA HỌC (30 phút)</w:t>
       </w:r>
     </w:p>
     <w:p>
@@ -8934,13 +9136,13 @@
         </w:pict>
       </w:r>
     </w:p>
-    <w:bookmarkStart w:id="39" w:name="Xb2bbdb2ab71873195c7690595cfbe09ab9e92fd"/>
+    <w:bookmarkStart w:id="39" w:name="X86b8179ee4983cce1e74e4be426ed43bc51a863"/>
     <w:p>
       <w:pPr>
         <w:pStyle w:val="Heading2"/>
       </w:pPr>
       <w:r>
-        <w:t xml:space="preserve">Slide 13 – Tổng quan tài liệu: từ bài báo đến khoảng trống nghiên cứu (7′)</w:t>
+        <w:t xml:space="preserve">Slide 13 – Tổng quan tài liệu: từ bài báo đến khoảng trống nghiên cứu (6′)</w:t>
       </w:r>
     </w:p>
     <w:p>
@@ -9241,13 +9443,13 @@
       </w:r>
     </w:p>
     <w:bookmarkEnd w:id="39"/>
-    <w:bookmarkStart w:id="40" w:name="X92aca80117eae73b864446d26d5774419245066"/>
+    <w:bookmarkStart w:id="40" w:name="X8d7e78c22fb4cd32c248eb2d592e06664dd5bd7"/>
     <w:p>
       <w:pPr>
         <w:pStyle w:val="Heading2"/>
       </w:pPr>
       <w:r>
-        <w:t xml:space="preserve">Slide 14 – Đề xuất nhiệm vụ: từ khoảng trống đến phiếu đề xuất và thuyết minh – DEMO 1 (6′)</w:t>
+        <w:t xml:space="preserve">Slide 14 – Đề xuất nhiệm vụ: từ khoảng trống đến phiếu đề xuất và thuyết minh – DEMO 1 (5′)</w:t>
       </w:r>
     </w:p>
     <w:p>
@@ -9717,13 +9919,13 @@
       </w:r>
     </w:p>
     <w:bookmarkEnd w:id="41"/>
-    <w:bookmarkStart w:id="42" w:name="Xacbd027a0466a8126644e875ec189c8247cbd2e"/>
+    <w:bookmarkStart w:id="42" w:name="Xae2fbca96bcb46ff2b706302da1d5a4147a88ee"/>
     <w:p>
       <w:pPr>
         <w:pStyle w:val="Heading2"/>
       </w:pPr>
       <w:r>
-        <w:t xml:space="preserve">Slide 16 – Xử lý dữ liệu: AI viết và chạy mã Python – DEMO 2 (7′)</w:t>
+        <w:t xml:space="preserve">Slide 16 – Xử lý dữ liệu: AI viết và chạy mã Python – DEMO 2 (6′)</w:t>
       </w:r>
     </w:p>
     <w:p>
@@ -10639,13 +10841,13 @@
       </w:r>
     </w:p>
     <w:bookmarkEnd w:id="43"/>
-    <w:bookmarkStart w:id="44" w:name="X3d0cb8888c77e00478e39b2807659fc7b9f359f"/>
+    <w:bookmarkStart w:id="44" w:name="X61752ef5806553cc1d9ee1f478b5f3fc10b911a"/>
     <w:p>
       <w:pPr>
         <w:pStyle w:val="Heading2"/>
       </w:pPr>
       <w:r>
-        <w:t xml:space="preserve">Slide 18 – Công bố kết quả: bài báo và báo cáo tổng hợp theo nhiều định dạng (5′)</w:t>
+        <w:t xml:space="preserve">Slide 18 – Công bố kết quả: bài báo và báo cáo tổng hợp theo nhiều định dạng (4′)</w:t>
       </w:r>
     </w:p>
     <w:p>
@@ -11208,13 +11410,13 @@
     </w:p>
     <w:bookmarkEnd w:id="45"/>
     <w:bookmarkEnd w:id="46"/>
-    <w:bookmarkStart w:id="48" w:name="X71301bc43ae8a2583ec30af40a0adfa491f7f5a"/>
+    <w:bookmarkStart w:id="51" w:name="X0014fa5bec6c78deb2d55d5cdd9b3469e0b9c66"/>
     <w:p>
       <w:pPr>
         <w:pStyle w:val="Heading1"/>
       </w:pPr>
       <w:r>
-        <w:t xml:space="preserve">PHẦN IV. ĐỀ TÀI MẬT: ỨNG DỤNG AI KHI DỮ LIỆU KHÔNG ĐƯỢC ĐƯA LÊN INTERNET (5 phút)</w:t>
+        <w:t xml:space="preserve">PHẦN IV. ĐỀ TÀI MẬT: ỨNG DỤNG AI KHI DỮ LIỆU KHÔNG ĐƯỢC ĐƯA LÊN INTERNET (15 phút)</w:t>
       </w:r>
     </w:p>
     <w:p>
@@ -11232,7 +11434,7 @@
         <w:t xml:space="preserve"> </w:t>
       </w:r>
       <w:r>
-        <w:t xml:space="preserve">tên Phần IV · Slide 20</w:t>
+        <w:t xml:space="preserve">tên Phần IV · Slide 20–23</w:t>
       </w:r>
     </w:p>
     <w:p>
@@ -11242,13 +11444,13 @@
         </w:pict>
       </w:r>
     </w:p>
-    <w:bookmarkStart w:id="47" w:name="Xdce5a0ca7e50bb4b26a7a2c21738c7913073300"/>
+    <w:bookmarkStart w:id="47" w:name="X1f3519f9b30b39f05368139bd8fbc1456ddcfef"/>
     <w:p>
       <w:pPr>
         <w:pStyle w:val="Heading2"/>
       </w:pPr>
       <w:r>
-        <w:t xml:space="preserve">Slide 20 – Đề tài mật: xây dựng công cụ và xử lý ngay trên máy không kết nối Internet – DEMO 3 (5′)</w:t>
+        <w:t xml:space="preserve">Slide 20 – Ranh giới pháp lý: dữ liệu mật và AI trực tuyến (3′)</w:t>
       </w:r>
     </w:p>
     <w:p>
@@ -11276,7 +11478,1323 @@
           <w:bCs/>
           <w:b/>
         </w:rPr>
-        <w:t xml:space="preserve">Nguyên tắc: AI viết công cụ – AI không bao giờ thấy dữ liệu thật</w:t>
+        <w:t xml:space="preserve">Luật Bảo vệ bí mật nhà nước số 117/2025/QH15</w:t>
+      </w:r>
+      <w:r>
+        <w:t xml:space="preserve"> </w:t>
+      </w:r>
+      <w:r>
+        <w:t xml:space="preserve">(hiệu lực 01/3/2026), Điều 5 – nghiêm cấm:</w:t>
+      </w:r>
+      <w:r>
+        <w:t xml:space="preserve"> </w:t>
+      </w:r>
+      <w:r>
+        <w:t xml:space="preserve">- soạn thảo, lưu giữ tài liệu có nội dung bí mật nhà nước trên máy tính, thiết bị đang kết nối Internet, mạng máy tính, mạng viễn thông (trừ mạng LAN độc lập theo quy định);</w:t>
+      </w:r>
+      <w:r>
+        <w:t xml:space="preserve"> </w:t>
+      </w:r>
+      <w:r>
+        <w:t xml:space="preserve">- sử dụng hệ thống trí tuệ nhân tạo, công nghệ mới để xâm phạm bí mật nhà nước.</w:t>
+      </w:r>
+      <w:r>
+        <w:t xml:space="preserve"> </w:t>
+      </w:r>
+      <w:r>
+        <w:t xml:space="preserve">- →</w:t>
+      </w:r>
+      <w:r>
+        <w:t xml:space="preserve"> </w:t>
+      </w:r>
+      <w:r>
+        <w:rPr>
+          <w:bCs/>
+          <w:b/>
+        </w:rPr>
+        <w:t xml:space="preserve">Dữ liệu mật không bao giờ đi vào AI trực tuyến</w:t>
+      </w:r>
+      <w:r>
+        <w:t xml:space="preserve"> </w:t>
+      </w:r>
+      <w:r>
+        <w:t xml:space="preserve">– kể cả</w:t>
+      </w:r>
+      <w:r>
+        <w:t xml:space="preserve"> </w:t>
+      </w:r>
+      <w:r>
+        <w:t xml:space="preserve">“</w:t>
+      </w:r>
+      <w:r>
+        <w:t xml:space="preserve">hỏi thử</w:t>
+      </w:r>
+      <w:r>
+        <w:t xml:space="preserve">”</w:t>
+      </w:r>
+      <w:r>
+        <w:t xml:space="preserve">, một đoạn trích hay một ảnh chụp màn hình.</w:t>
+      </w:r>
+    </w:p>
+    <w:tbl>
+      <w:tblPr>
+        <w:tblStyle w:val="Table"/>
+        <w:tblW w:type="pct" w:w="5000"/>
+        <w:tblLook w:firstRow="1" w:lastRow="0" w:firstColumn="0" w:lastColumn="0" w:noHBand="0" w:noVBand="0" w:val="0020"/>
+        <w:jc w:val="start"/>
+      </w:tblPr>
+      <w:tblGrid>
+        <w:gridCol w:w="3960"/>
+        <w:gridCol w:w="3960"/>
+      </w:tblGrid>
+      <w:tr>
+        <w:trPr>
+          <w:tblHeader w:val="true"/>
+        </w:trPr>
+        <w:tc>
+          <w:tcPr/>
+          <w:p>
+            <w:pPr>
+              <w:pStyle w:val="Compact"/>
+              <w:jc w:val="left"/>
+            </w:pPr>
+            <w:r>
+              <w:t xml:space="preserve">Được đưa cho AI trực tuyến</w:t>
+            </w:r>
+          </w:p>
+        </w:tc>
+        <w:tc>
+          <w:tcPr/>
+          <w:p>
+            <w:pPr>
+              <w:pStyle w:val="Compact"/>
+              <w:jc w:val="left"/>
+            </w:pPr>
+            <w:r>
+              <w:t xml:space="preserve">Không bao giờ đưa</w:t>
+            </w:r>
+          </w:p>
+        </w:tc>
+      </w:tr>
+      <w:tr>
+        <w:tc>
+          <w:tcPr/>
+          <w:p>
+            <w:pPr>
+              <w:pStyle w:val="Compact"/>
+              <w:jc w:val="left"/>
+            </w:pPr>
+            <w:r>
+              <w:t xml:space="preserve">Cấu trúc dữ liệu với tên cột trung tính (</w:t>
+            </w:r>
+            <w:r>
+              <w:rPr>
+                <w:rStyle w:val="VerbatimChar"/>
+              </w:rPr>
+              <w:t xml:space="preserve">do_cao_m</w:t>
+            </w:r>
+            <w:r>
+              <w:t xml:space="preserve">,</w:t>
+            </w:r>
+            <w:r>
+              <w:t xml:space="preserve"> </w:t>
+            </w:r>
+            <w:r>
+              <w:rPr>
+                <w:rStyle w:val="VerbatimChar"/>
+              </w:rPr>
+              <w:t xml:space="preserve">gio_u_ms</w:t>
+            </w:r>
+            <w:r>
+              <w:t xml:space="preserve">)</w:t>
+            </w:r>
+          </w:p>
+        </w:tc>
+        <w:tc>
+          <w:tcPr/>
+          <w:p>
+            <w:pPr>
+              <w:pStyle w:val="Compact"/>
+              <w:jc w:val="left"/>
+            </w:pPr>
+            <w:r>
+              <w:t xml:space="preserve">Giá trị số liệu thật, tọa độ, bản đồ, ảnh</w:t>
+            </w:r>
+          </w:p>
+        </w:tc>
+      </w:tr>
+      <w:tr>
+        <w:tc>
+          <w:tcPr/>
+          <w:p>
+            <w:pPr>
+              <w:pStyle w:val="Compact"/>
+              <w:jc w:val="left"/>
+            </w:pPr>
+            <w:r>
+              <w:t xml:space="preserve">Bài toán mô tả ở dạng tổng quát (</w:t>
+            </w:r>
+            <w:r>
+              <w:t xml:space="preserve">“</w:t>
+            </w:r>
+            <w:r>
+              <w:t xml:space="preserve">tìm đường tốn ít năng lượng nhất trên lưới</w:t>
+            </w:r>
+            <w:r>
+              <w:t xml:space="preserve">”</w:t>
+            </w:r>
+            <w:r>
+              <w:t xml:space="preserve">)</w:t>
+            </w:r>
+          </w:p>
+        </w:tc>
+        <w:tc>
+          <w:tcPr/>
+          <w:p>
+            <w:pPr>
+              <w:pStyle w:val="Compact"/>
+              <w:jc w:val="left"/>
+            </w:pPr>
+            <w:r>
+              <w:t xml:space="preserve">Tên đơn vị, phiên hiệu, khu vực, mục đích nhiệm vụ</w:t>
+            </w:r>
+          </w:p>
+        </w:tc>
+      </w:tr>
+      <w:tr>
+        <w:tc>
+          <w:tcPr/>
+          <w:p>
+            <w:pPr>
+              <w:pStyle w:val="Compact"/>
+              <w:jc w:val="left"/>
+            </w:pPr>
+            <w:r>
+              <w:t xml:space="preserve">Dữ liệu giả do AI sinh ra</w:t>
+            </w:r>
+          </w:p>
+        </w:tc>
+        <w:tc>
+          <w:tcPr/>
+          <w:p>
+            <w:pPr>
+              <w:pStyle w:val="Compact"/>
+              <w:jc w:val="left"/>
+            </w:pPr>
+            <w:r>
+              <w:t xml:space="preserve">Thông số kỹ thuật thật của vũ khí, trang bị</w:t>
+            </w:r>
+          </w:p>
+        </w:tc>
+      </w:tr>
+      <w:tr>
+        <w:tc>
+          <w:tcPr/>
+          <w:p>
+            <w:pPr>
+              <w:pStyle w:val="Compact"/>
+              <w:jc w:val="left"/>
+            </w:pPr>
+            <w:r>
+              <w:t xml:space="preserve">Thông báo lỗi đã tái tạo trên dữ liệu giả</w:t>
+            </w:r>
+          </w:p>
+        </w:tc>
+        <w:tc>
+          <w:tcPr/>
+          <w:p>
+            <w:pPr>
+              <w:pStyle w:val="Compact"/>
+              <w:jc w:val="left"/>
+            </w:pPr>
+            <w:r>
+              <w:t xml:space="preserve">Ảnh chụp màn hình, nhật ký lỗi, tệp kết quả từ máy mật</w:t>
+            </w:r>
+          </w:p>
+        </w:tc>
+      </w:tr>
+    </w:tbl>
+    <w:p>
+      <w:pPr>
+        <w:pStyle w:val="BlockText"/>
+      </w:pPr>
+      <w:r>
+        <w:t xml:space="preserve">⚠ Ghép nhiều thông tin tưởng như vô hại có thể suy ra thông tin mật → mô tả càng chung càng tốt; khi chưa chắc, hỏi cán bộ bảo mật trước.</w:t>
+      </w:r>
+    </w:p>
+    <w:p>
+      <w:pPr>
+        <w:pStyle w:val="FirstParagraph"/>
+      </w:pPr>
+      <w:r>
+        <w:rPr>
+          <w:bCs/>
+          <w:b/>
+        </w:rPr>
+        <w:t xml:space="preserve">Nguồn:</w:t>
+      </w:r>
+      <w:r>
+        <w:t xml:space="preserve"> </w:t>
+      </w:r>
+      <w:r>
+        <w:t xml:space="preserve">N38 (Luật 117/2025/QH15), N10 (Luật Trí tuệ nhân tạo 134/2025/QH15)</w:t>
+      </w:r>
+    </w:p>
+    <w:p>
+      <w:pPr>
+        <w:pStyle w:val="BodyText"/>
+      </w:pPr>
+      <w:r>
+        <w:rPr>
+          <w:bCs/>
+          <w:b/>
+        </w:rPr>
+        <w:t xml:space="preserve">Duyệt:</w:t>
+      </w:r>
+      <w:r>
+        <w:t xml:space="preserve"> </w:t>
+      </w:r>
+      <w:r>
+        <w:t xml:space="preserve">[ ] Duyệt · [ ] Sửa · [ ] Bỏ</w:t>
+      </w:r>
+      <w:r>
+        <w:t xml:space="preserve"> </w:t>
+      </w:r>
+      <w:r>
+        <w:rPr>
+          <w:bCs/>
+          <w:b/>
+        </w:rPr>
+        <w:t xml:space="preserve">Ghi chú:</w:t>
+      </w:r>
+    </w:p>
+    <w:p>
+      <w:r>
+        <w:pict>
+          <v:rect style="width:0;height:1.5pt" o:hralign="center" o:hrstd="t" o:hr="t"/>
+        </w:pict>
+      </w:r>
+    </w:p>
+    <w:bookmarkEnd w:id="47"/>
+    <w:bookmarkStart w:id="48" w:name="X17ef4ae97e6f1961ed6445ba6f8809014ff0c02"/>
+    <w:p>
+      <w:pPr>
+        <w:pStyle w:val="Heading2"/>
+      </w:pPr>
+      <w:r>
+        <w:t xml:space="preserve">Slide 21 – Mô hình ba vùng và quy trình 6 bước có điểm kiểm soát (4′)</w:t>
+      </w:r>
+    </w:p>
+    <w:p>
+      <w:pPr>
+        <w:pStyle w:val="FirstParagraph"/>
+      </w:pPr>
+      <w:r>
+        <w:rPr>
+          <w:bCs/>
+          <w:b/>
+        </w:rPr>
+        <w:t xml:space="preserve">Chữ trên slide:</w:t>
+      </w:r>
+      <w:r>
+        <w:t xml:space="preserve"> </w:t>
+      </w:r>
+      <w:r>
+        <w:t xml:space="preserve">-</w:t>
+      </w:r>
+      <w:r>
+        <w:t xml:space="preserve"> </w:t>
+      </w:r>
+      <w:r>
+        <w:rPr>
+          <w:bCs/>
+          <w:b/>
+        </w:rPr>
+        <w:t xml:space="preserve">Nguyên tắc: AI viết công cụ – AI không bao giờ thấy dữ liệu thật · luồng một chiều: chỉ mã đi vào, không gì đi ra</w:t>
+      </w:r>
+    </w:p>
+    <w:tbl>
+      <w:tblPr>
+        <w:tblStyle w:val="Table"/>
+        <w:tblW w:type="pct" w:w="5000"/>
+        <w:tblLook w:firstRow="1" w:lastRow="0" w:firstColumn="0" w:lastColumn="0" w:noHBand="0" w:noVBand="0" w:val="0020"/>
+        <w:jc w:val="start"/>
+      </w:tblPr>
+      <w:tblGrid>
+        <w:gridCol w:w="1980"/>
+        <w:gridCol w:w="1980"/>
+        <w:gridCol w:w="1980"/>
+        <w:gridCol w:w="1980"/>
+      </w:tblGrid>
+      <w:tr>
+        <w:trPr>
+          <w:tblHeader w:val="true"/>
+        </w:trPr>
+        <w:tc>
+          <w:tcPr/>
+          <w:p>
+            <w:pPr>
+              <w:pStyle w:val="Compact"/>
+              <w:jc w:val="left"/>
+            </w:pPr>
+            <w:r>
+              <w:t xml:space="preserve">Vùng</w:t>
+            </w:r>
+          </w:p>
+        </w:tc>
+        <w:tc>
+          <w:tcPr/>
+          <w:p>
+            <w:pPr>
+              <w:pStyle w:val="Compact"/>
+              <w:jc w:val="left"/>
+            </w:pPr>
+            <w:r>
+              <w:t xml:space="preserve">Bước</w:t>
+            </w:r>
+          </w:p>
+        </w:tc>
+        <w:tc>
+          <w:tcPr/>
+          <w:p>
+            <w:pPr>
+              <w:pStyle w:val="Compact"/>
+              <w:jc w:val="left"/>
+            </w:pPr>
+            <w:r>
+              <w:t xml:space="preserve">Điểm kiểm soát</w:t>
+            </w:r>
+          </w:p>
+        </w:tc>
+        <w:tc>
+          <w:tcPr/>
+          <w:p>
+            <w:pPr>
+              <w:pStyle w:val="Compact"/>
+              <w:jc w:val="left"/>
+            </w:pPr>
+            <w:r>
+              <w:t xml:space="preserve">Người chịu trách nhiệm</w:t>
+            </w:r>
+          </w:p>
+        </w:tc>
+      </w:tr>
+      <w:tr>
+        <w:tc>
+          <w:tcPr/>
+          <w:p>
+            <w:pPr>
+              <w:pStyle w:val="Compact"/>
+              <w:jc w:val="left"/>
+            </w:pPr>
+            <w:r>
+              <w:rPr>
+                <w:bCs/>
+                <w:b/>
+              </w:rPr>
+              <w:t xml:space="preserve">A. Máy có Internet</w:t>
+            </w:r>
+            <w:r>
+              <w:t xml:space="preserve"> </w:t>
+            </w:r>
+            <w:r>
+              <w:t xml:space="preserve">(dùng AI)</w:t>
+            </w:r>
+          </w:p>
+        </w:tc>
+        <w:tc>
+          <w:tcPr/>
+          <w:p>
+            <w:pPr>
+              <w:pStyle w:val="Compact"/>
+              <w:jc w:val="left"/>
+            </w:pPr>
+            <w:r>
+              <w:t xml:space="preserve">1. Mô tả cấu trúc dữ liệu, bài toán tổng quát</w:t>
+            </w:r>
+          </w:p>
+        </w:tc>
+        <w:tc>
+          <w:tcPr/>
+          <w:p>
+            <w:pPr>
+              <w:pStyle w:val="Compact"/>
+              <w:jc w:val="left"/>
+            </w:pPr>
+            <w:r>
+              <w:t xml:space="preserve">Rà soát mô tả trước khi gửi (bảng</w:t>
+            </w:r>
+            <w:r>
+              <w:t xml:space="preserve"> </w:t>
+            </w:r>
+            <w:r>
+              <w:t xml:space="preserve">“</w:t>
+            </w:r>
+            <w:r>
+              <w:t xml:space="preserve">được – không được</w:t>
+            </w:r>
+            <w:r>
+              <w:t xml:space="preserve">”</w:t>
+            </w:r>
+            <w:r>
+              <w:t xml:space="preserve"> </w:t>
+            </w:r>
+            <w:r>
+              <w:t xml:space="preserve">Slide 20)</w:t>
+            </w:r>
+          </w:p>
+        </w:tc>
+        <w:tc>
+          <w:tcPr/>
+          <w:p>
+            <w:pPr>
+              <w:pStyle w:val="Compact"/>
+              <w:jc w:val="left"/>
+            </w:pPr>
+            <w:r>
+              <w:t xml:space="preserve">Chủ nhiệm nhiệm vụ</w:t>
+            </w:r>
+          </w:p>
+        </w:tc>
+      </w:tr>
+      <w:tr>
+        <w:tc>
+          <w:tcPr/>
+          <w:p>
+            <w:pPr>
+              <w:pStyle w:val="Compact"/>
+            </w:pPr>
+          </w:p>
+        </w:tc>
+        <w:tc>
+          <w:tcPr/>
+          <w:p>
+            <w:pPr>
+              <w:pStyle w:val="Compact"/>
+              <w:jc w:val="left"/>
+            </w:pPr>
+            <w:r>
+              <w:t xml:space="preserve">2. AI viết công cụ, sinh dữ liệu giả, chạy thử</w:t>
+            </w:r>
+          </w:p>
+        </w:tc>
+        <w:tc>
+          <w:tcPr/>
+          <w:p>
+            <w:pPr>
+              <w:pStyle w:val="Compact"/>
+              <w:jc w:val="left"/>
+            </w:pPr>
+            <w:r>
+              <w:t xml:space="preserve">Chỉ dùng thư viện được phép; không gọi mạng</w:t>
+            </w:r>
+          </w:p>
+        </w:tc>
+        <w:tc>
+          <w:tcPr/>
+          <w:p>
+            <w:pPr>
+              <w:pStyle w:val="Compact"/>
+              <w:jc w:val="left"/>
+            </w:pPr>
+            <w:r>
+              <w:t xml:space="preserve">Chủ nhiệm nhiệm vụ</w:t>
+            </w:r>
+          </w:p>
+        </w:tc>
+      </w:tr>
+      <w:tr>
+        <w:tc>
+          <w:tcPr/>
+          <w:p>
+            <w:pPr>
+              <w:pStyle w:val="Compact"/>
+            </w:pPr>
+          </w:p>
+        </w:tc>
+        <w:tc>
+          <w:tcPr/>
+          <w:p>
+            <w:pPr>
+              <w:pStyle w:val="Compact"/>
+              <w:jc w:val="left"/>
+            </w:pPr>
+            <w:r>
+              <w:t xml:space="preserve">3. Đọc mã; chạy chương trình</w:t>
+            </w:r>
+            <w:r>
+              <w:t xml:space="preserve"> </w:t>
+            </w:r>
+            <w:r>
+              <w:rPr>
+                <w:bCs/>
+                <w:b/>
+              </w:rPr>
+              <w:t xml:space="preserve">quét mã</w:t>
+            </w:r>
+          </w:p>
+        </w:tc>
+        <w:tc>
+          <w:tcPr/>
+          <w:p>
+            <w:pPr>
+              <w:pStyle w:val="Compact"/>
+              <w:jc w:val="left"/>
+            </w:pPr>
+            <w:r>
+              <w:t xml:space="preserve">Không thư viện mạng, không lệnh hệ thống, không địa chỉ web</w:t>
+            </w:r>
+          </w:p>
+        </w:tc>
+        <w:tc>
+          <w:tcPr/>
+          <w:p>
+            <w:pPr>
+              <w:pStyle w:val="Compact"/>
+              <w:jc w:val="left"/>
+            </w:pPr>
+            <w:r>
+              <w:t xml:space="preserve">Chủ nhiệm + cán bộ CNTT</w:t>
+            </w:r>
+          </w:p>
+        </w:tc>
+      </w:tr>
+      <w:tr>
+        <w:tc>
+          <w:tcPr/>
+          <w:p>
+            <w:pPr>
+              <w:pStyle w:val="Compact"/>
+            </w:pPr>
+          </w:p>
+        </w:tc>
+        <w:tc>
+          <w:tcPr/>
+          <w:p>
+            <w:pPr>
+              <w:pStyle w:val="Compact"/>
+              <w:jc w:val="left"/>
+            </w:pPr>
+            <w:r>
+              <w:t xml:space="preserve">4. Đóng gói +</w:t>
+            </w:r>
+            <w:r>
+              <w:t xml:space="preserve"> </w:t>
+            </w:r>
+            <w:r>
+              <w:rPr>
+                <w:bCs/>
+                <w:b/>
+              </w:rPr>
+              <w:t xml:space="preserve">mã băm SHA-256</w:t>
+            </w:r>
+          </w:p>
+        </w:tc>
+        <w:tc>
+          <w:tcPr/>
+          <w:p>
+            <w:pPr>
+              <w:pStyle w:val="Compact"/>
+              <w:jc w:val="left"/>
+            </w:pPr>
+            <w:r>
+              <w:t xml:space="preserve">Danh sách tệp, mã băm ghi sổ</w:t>
+            </w:r>
+          </w:p>
+        </w:tc>
+        <w:tc>
+          <w:tcPr/>
+          <w:p>
+            <w:pPr>
+              <w:pStyle w:val="Compact"/>
+              <w:jc w:val="left"/>
+            </w:pPr>
+            <w:r>
+              <w:t xml:space="preserve">Cán bộ CNTT</w:t>
+            </w:r>
+          </w:p>
+        </w:tc>
+      </w:tr>
+      <w:tr>
+        <w:tc>
+          <w:tcPr/>
+          <w:p>
+            <w:pPr>
+              <w:pStyle w:val="Compact"/>
+              <w:jc w:val="left"/>
+            </w:pPr>
+            <w:r>
+              <w:rPr>
+                <w:bCs/>
+                <w:b/>
+              </w:rPr>
+              <w:t xml:space="preserve">B. Chuyển giao</w:t>
+            </w:r>
+          </w:p>
+        </w:tc>
+        <w:tc>
+          <w:tcPr/>
+          <w:p>
+            <w:pPr>
+              <w:pStyle w:val="Compact"/>
+              <w:jc w:val="left"/>
+            </w:pPr>
+            <w:r>
+              <w:t xml:space="preserve">5. Chép sang máy mật</w:t>
+            </w:r>
+          </w:p>
+        </w:tc>
+        <w:tc>
+          <w:tcPr/>
+          <w:p>
+            <w:pPr>
+              <w:pStyle w:val="Compact"/>
+              <w:jc w:val="left"/>
+            </w:pPr>
+            <w:r>
+              <w:t xml:space="preserve">Thiết bị lưu trữ được cấp phép, quét mã độc, sổ theo dõi;</w:t>
+            </w:r>
+            <w:r>
+              <w:t xml:space="preserve"> </w:t>
+            </w:r>
+            <w:r>
+              <w:rPr>
+                <w:bCs/>
+                <w:b/>
+              </w:rPr>
+              <w:t xml:space="preserve">đối chiếu mã băm</w:t>
+            </w:r>
+          </w:p>
+        </w:tc>
+        <w:tc>
+          <w:tcPr/>
+          <w:p>
+            <w:pPr>
+              <w:pStyle w:val="Compact"/>
+              <w:jc w:val="left"/>
+            </w:pPr>
+            <w:r>
+              <w:t xml:space="preserve">Cán bộ bảo mật</w:t>
+            </w:r>
+          </w:p>
+        </w:tc>
+      </w:tr>
+      <w:tr>
+        <w:tc>
+          <w:tcPr/>
+          <w:p>
+            <w:pPr>
+              <w:pStyle w:val="Compact"/>
+              <w:jc w:val="left"/>
+            </w:pPr>
+            <w:r>
+              <w:rPr>
+                <w:bCs/>
+                <w:b/>
+              </w:rPr>
+              <w:t xml:space="preserve">C. Máy không kết nối Internet</w:t>
+            </w:r>
+            <w:r>
+              <w:t xml:space="preserve"> </w:t>
+            </w:r>
+            <w:r>
+              <w:t xml:space="preserve">(hoặc mạng LAN độc lập)</w:t>
+            </w:r>
+          </w:p>
+        </w:tc>
+        <w:tc>
+          <w:tcPr/>
+          <w:p>
+            <w:pPr>
+              <w:pStyle w:val="Compact"/>
+              <w:jc w:val="left"/>
+            </w:pPr>
+            <w:r>
+              <w:t xml:space="preserve">6. Chạy với dữ liệu thật</w:t>
+            </w:r>
+          </w:p>
+        </w:tc>
+        <w:tc>
+          <w:tcPr/>
+          <w:p>
+            <w:pPr>
+              <w:pStyle w:val="Compact"/>
+              <w:jc w:val="left"/>
+            </w:pPr>
+            <w:r>
+              <w:t xml:space="preserve">Báo cáo tự ghi mã băm của dữ liệu, cấu hình → truy vết được; kết quả lưu tại chỗ</w:t>
+            </w:r>
+          </w:p>
+        </w:tc>
+        <w:tc>
+          <w:tcPr/>
+          <w:p>
+            <w:pPr>
+              <w:pStyle w:val="Compact"/>
+              <w:jc w:val="left"/>
+            </w:pPr>
+            <w:r>
+              <w:t xml:space="preserve">Chủ nhiệm nhiệm vụ</w:t>
+            </w:r>
+          </w:p>
+        </w:tc>
+      </w:tr>
+    </w:tbl>
+    <w:p>
+      <w:pPr>
+        <w:numPr>
+          <w:ilvl w:val="0"/>
+          <w:numId w:val="1005"/>
+        </w:numPr>
+        <w:pStyle w:val="Compact"/>
+      </w:pPr>
+      <w:r>
+        <w:t xml:space="preserve">Sửa công cụ: quay lại vùng A với dữ liệu giả → đóng gói lại → mã băm mới.</w:t>
+      </w:r>
+    </w:p>
+    <w:p>
+      <w:pPr>
+        <w:pStyle w:val="FirstParagraph"/>
+      </w:pPr>
+      <w:r>
+        <w:rPr>
+          <w:bCs/>
+          <w:b/>
+        </w:rPr>
+        <w:t xml:space="preserve">Hình ảnh:</w:t>
+      </w:r>
+      <w:r>
+        <w:t xml:space="preserve"> </w:t>
+      </w:r>
+      <w:r>
+        <w:t xml:space="preserve">sơ đồ ba vùng A – B – C, mũi tên một chiều A → C.</w:t>
+      </w:r>
+    </w:p>
+    <w:p>
+      <w:pPr>
+        <w:pStyle w:val="BodyText"/>
+      </w:pPr>
+      <w:r>
+        <w:rPr>
+          <w:bCs/>
+          <w:b/>
+        </w:rPr>
+        <w:t xml:space="preserve">Duyệt:</w:t>
+      </w:r>
+      <w:r>
+        <w:t xml:space="preserve"> </w:t>
+      </w:r>
+      <w:r>
+        <w:t xml:space="preserve">[ ] Duyệt · [ ] Sửa · [ ] Bỏ</w:t>
+      </w:r>
+      <w:r>
+        <w:t xml:space="preserve"> </w:t>
+      </w:r>
+      <w:r>
+        <w:rPr>
+          <w:bCs/>
+          <w:b/>
+        </w:rPr>
+        <w:t xml:space="preserve">Ghi chú:</w:t>
+      </w:r>
+    </w:p>
+    <w:p>
+      <w:r>
+        <w:pict>
+          <v:rect style="width:0;height:1.5pt" o:hralign="center" o:hrstd="t" o:hr="t"/>
+        </w:pict>
+      </w:r>
+    </w:p>
+    <w:bookmarkEnd w:id="48"/>
+    <w:bookmarkStart w:id="49" w:name="Xbdb4c9c42cf5b0b68a21832623de9ea47ef158c"/>
+    <w:p>
+      <w:pPr>
+        <w:pStyle w:val="Heading2"/>
+      </w:pPr>
+      <w:r>
+        <w:t xml:space="preserve">Slide 22 – Đề tài mật: xây dựng công cụ và xử lý ngay trên máy không kết nối Internet – DEMO 3 (5′)</w:t>
+      </w:r>
+    </w:p>
+    <w:p>
+      <w:pPr>
+        <w:pStyle w:val="FirstParagraph"/>
+      </w:pPr>
+      <w:r>
+        <w:rPr>
+          <w:bCs/>
+          <w:b/>
+        </w:rPr>
+        <w:t xml:space="preserve">Chữ trên slide:</w:t>
+      </w:r>
+      <w:r>
+        <w:t xml:space="preserve"> </w:t>
+      </w:r>
+      <w:r>
+        <w:t xml:space="preserve">- 🧪</w:t>
+      </w:r>
+      <w:r>
+        <w:t xml:space="preserve"> </w:t>
+      </w:r>
+      <w:r>
+        <w:rPr>
+          <w:bCs/>
+          <w:b/>
+        </w:rPr>
+        <w:t xml:space="preserve">Bài toán (dữ liệu giả lập):</w:t>
+      </w:r>
+      <w:r>
+        <w:t xml:space="preserve"> </w:t>
+      </w:r>
+      <w:r>
+        <w:rPr>
+          <w:iCs/>
+          <w:i/>
+        </w:rPr>
+        <w:t xml:space="preserve">Ảnh hưởng của địa hình và khí hậu nhiệt đới đến lộ trình của thiết bị bay không người lái</w:t>
+      </w:r>
+      <w:r>
+        <w:t xml:space="preserve"> </w:t>
+      </w:r>
+      <w:r>
+        <w:t xml:space="preserve">-</w:t>
+      </w:r>
+      <w:r>
+        <w:t xml:space="preserve"> </w:t>
+      </w:r>
+      <w:r>
+        <w:rPr>
+          <w:bCs/>
+          <w:b/>
+        </w:rPr>
+        <w:t xml:space="preserve">Công cụ AI viết</w:t>
+      </w:r>
+      <w:r>
+        <w:t xml:space="preserve"> </w:t>
+      </w:r>
+      <w:r>
+        <w:t xml:space="preserve">(chỉ dùng numpy, matplotlib): tìm lộ trình tốn ít năng lượng nhất, tránh núi cao, ổ mưa dông, gió mạnh; tính ảnh hưởng của gió, mưa, nhiệt độ – độ ẩm, leo cao; kiểm tra pin chiều đi, chiều về</w:t>
+      </w:r>
+      <w:r>
+        <w:t xml:space="preserve"> </w:t>
+      </w:r>
+      <w:r>
+        <w:t xml:space="preserve">- 📊</w:t>
+      </w:r>
+      <w:r>
+        <w:t xml:space="preserve"> </w:t>
+      </w:r>
+      <w:r>
+        <w:rPr>
+          <w:bCs/>
+          <w:b/>
+        </w:rPr>
+        <w:t xml:space="preserve">Kết quả:</w:t>
+      </w:r>
+      <w:r>
+        <w:t xml:space="preserve"> </w:t>
+      </w:r>
+      <w:r>
+        <w:t xml:space="preserve">- Đường thẳng cắt qua</w:t>
+      </w:r>
+      <w:r>
+        <w:t xml:space="preserve"> </w:t>
+      </w:r>
+      <w:r>
+        <w:rPr>
+          <w:bCs/>
+          <w:b/>
+        </w:rPr>
+        <w:t xml:space="preserve">8 ô cấm bay</w:t>
+      </w:r>
+      <w:r>
+        <w:t xml:space="preserve"> </w:t>
+      </w:r>
+      <w:r>
+        <w:t xml:space="preserve">→ lộ trình vòng qua đèo: 14,5 km, 240 Wh</w:t>
+      </w:r>
+      <w:r>
+        <w:t xml:space="preserve"> </w:t>
+      </w:r>
+      <w:r>
+        <w:t xml:space="preserve">- Chiều về ngược gió mùa:</w:t>
+      </w:r>
+      <w:r>
+        <w:t xml:space="preserve"> </w:t>
+      </w:r>
+      <w:r>
+        <w:rPr>
+          <w:bCs/>
+          <w:b/>
+        </w:rPr>
+        <w:t xml:space="preserve">422 Wh – gấp 1,8 lần chiều đi</w:t>
+      </w:r>
+      <w:r>
+        <w:t xml:space="preserve"> </w:t>
+      </w:r>
+      <w:r>
+        <w:t xml:space="preserve">→ không đủ pin, phải đổi phương án</w:t>
+      </w:r>
+      <w:r>
+        <w:t xml:space="preserve"> </w:t>
+      </w:r>
+      <w:r>
+        <w:t xml:space="preserve">- Chạy ~3 giây trên máy tính thường, không cần mạng</w:t>
+      </w:r>
+      <w:r>
+        <w:t xml:space="preserve"> </w:t>
+      </w:r>
+      <w:r>
+        <w:t xml:space="preserve">- 🔒</w:t>
+      </w:r>
+      <w:r>
+        <w:t xml:space="preserve"> </w:t>
+      </w:r>
+      <w:r>
+        <w:rPr>
+          <w:bCs/>
+          <w:b/>
+        </w:rPr>
+        <w:t xml:space="preserve">Kiểm tra an toàn đã chạy:</w:t>
+      </w:r>
+      <w:r>
+        <w:t xml:space="preserve"> </w:t>
+      </w:r>
+      <w:r>
+        <w:t xml:space="preserve">quét mã →</w:t>
+      </w:r>
+      <w:r>
+        <w:t xml:space="preserve"> </w:t>
+      </w:r>
+      <w:r>
+        <w:t xml:space="preserve">“</w:t>
+      </w:r>
+      <w:r>
+        <w:t xml:space="preserve">không phát hiện kết nối mạng</w:t>
+      </w:r>
+      <w:r>
+        <w:t xml:space="preserve">”</w:t>
+      </w:r>
+      <w:r>
+        <w:t xml:space="preserve">; thử chèn</w:t>
+      </w:r>
+      <w:r>
+        <w:t xml:space="preserve"> </w:t>
+      </w:r>
+      <w:r>
+        <w:rPr>
+          <w:rStyle w:val="VerbatimChar"/>
+        </w:rPr>
+        <w:t xml:space="preserve">import requests</w:t>
+      </w:r>
+      <w:r>
+        <w:t xml:space="preserve"> </w:t>
+      </w:r>
+      <w:r>
+        <w:t xml:space="preserve">→</w:t>
+      </w:r>
+      <w:r>
+        <w:t xml:space="preserve"> </w:t>
+      </w:r>
+      <w:r>
+        <w:rPr>
+          <w:bCs/>
+          <w:b/>
+        </w:rPr>
+        <w:t xml:space="preserve">bị chặn</w:t>
+      </w:r>
+      <w:r>
+        <w:t xml:space="preserve">; đối chiếu mã băm trên máy đích →</w:t>
+      </w:r>
+      <w:r>
+        <w:t xml:space="preserve"> </w:t>
+      </w:r>
+      <w:r>
+        <w:rPr>
+          <w:bCs/>
+          <w:b/>
+        </w:rPr>
+        <w:t xml:space="preserve">KHỚP</w:t>
+      </w:r>
+      <w:r>
+        <w:t xml:space="preserve"> </w:t>
+      </w:r>
+      <w:r>
+        <w:t xml:space="preserve">- 🎯</w:t>
+      </w:r>
+      <w:r>
+        <w:t xml:space="preserve"> </w:t>
+      </w:r>
+      <w:r>
+        <w:rPr>
+          <w:bCs/>
+          <w:b/>
+        </w:rPr>
+        <w:t xml:space="preserve">Trọng tâm là quy trình</w:t>
+      </w:r>
+      <w:r>
+        <w:t xml:space="preserve"> </w:t>
+      </w:r>
+      <w:r>
+        <w:t xml:space="preserve">– mô hình bay đã đơn giản hóa; đơn vị thay bằng mô hình và thông số của mình.</w:t>
+      </w:r>
+    </w:p>
+    <w:p>
+      <w:pPr>
+        <w:pStyle w:val="BodyText"/>
+      </w:pPr>
+      <w:r>
+        <w:rPr>
+          <w:bCs/>
+          <w:b/>
+        </w:rPr>
+        <w:t xml:space="preserve">Hình ảnh:</w:t>
+      </w:r>
+      <w:r>
+        <w:t xml:space="preserve"> </w:t>
+      </w:r>
+      <w:r>
+        <w:rPr>
+          <w:rStyle w:val="VerbatimChar"/>
+        </w:rPr>
+        <w:t xml:space="preserve">thuyet-trinh/ket-qua-demo/may-cach-ly/ban_do_lo_trinh.png</w:t>
+      </w:r>
+      <w:r>
+        <w:t xml:space="preserve">; ảnh báo cáo có dòng mã băm.</w:t>
+      </w:r>
+    </w:p>
+    <w:p>
+      <w:pPr>
+        <w:pStyle w:val="BodyText"/>
+      </w:pPr>
+      <w:r>
+        <w:rPr>
+          <w:bCs/>
+          <w:b/>
+        </w:rPr>
+        <w:t xml:space="preserve">🎬 Trình chiếu:</w:t>
+      </w:r>
+      <w:r>
+        <w:t xml:space="preserve"> </w:t>
+      </w:r>
+      <w:r>
+        <w:t xml:space="preserve">ảnh bản đồ lộ trình + báo cáo; ảnh màn hình chương trình quét mã và đối chiếu mã băm (câu lệnh:</w:t>
+      </w:r>
+      <w:r>
+        <w:t xml:space="preserve"> </w:t>
+      </w:r>
+      <w:r>
+        <w:rPr>
+          <w:rStyle w:val="VerbatimChar"/>
+        </w:rPr>
+        <w:t xml:space="preserve">cau-lenh-demo.md</w:t>
+      </w:r>
+      <w:r>
+        <w:t xml:space="preserve"> </w:t>
+      </w:r>
+      <w:r>
+        <w:t xml:space="preserve">mục 13; mã:</w:t>
+      </w:r>
+      <w:r>
+        <w:t xml:space="preserve"> </w:t>
+      </w:r>
+      <w:r>
+        <w:rPr>
+          <w:rStyle w:val="VerbatimChar"/>
+        </w:rPr>
+        <w:t xml:space="preserve">thuyet-trinh/ma-nguon-demo/may-cach-ly/</w:t>
+      </w:r>
+      <w:r>
+        <w:t xml:space="preserve">).</w:t>
+      </w:r>
+    </w:p>
+    <w:p>
+      <w:pPr>
+        <w:pStyle w:val="BodyText"/>
+      </w:pPr>
+      <w:r>
+        <w:rPr>
+          <w:bCs/>
+          <w:b/>
+        </w:rPr>
+        <w:t xml:space="preserve">Duyệt:</w:t>
+      </w:r>
+      <w:r>
+        <w:t xml:space="preserve"> </w:t>
+      </w:r>
+      <w:r>
+        <w:t xml:space="preserve">[ ] Duyệt · [ ] Sửa · [ ] Bỏ</w:t>
+      </w:r>
+      <w:r>
+        <w:t xml:space="preserve"> </w:t>
+      </w:r>
+      <w:r>
+        <w:rPr>
+          <w:bCs/>
+          <w:b/>
+        </w:rPr>
+        <w:t xml:space="preserve">Ghi chú:</w:t>
+      </w:r>
+    </w:p>
+    <w:p>
+      <w:r>
+        <w:pict>
+          <v:rect style="width:0;height:1.5pt" o:hralign="center" o:hrstd="t" o:hr="t"/>
+        </w:pict>
+      </w:r>
+    </w:p>
+    <w:bookmarkEnd w:id="49"/>
+    <w:bookmarkStart w:id="50" w:name="X854607e9086b793b76053ed81bd2959e7fc81cb"/>
+    <w:p>
+      <w:pPr>
+        <w:pStyle w:val="Heading2"/>
+      </w:pPr>
+      <w:r>
+        <w:t xml:space="preserve">Slide 23 – Sai lầm thường gặp và các phương án khác (3′)</w:t>
+      </w:r>
+    </w:p>
+    <w:p>
+      <w:pPr>
+        <w:pStyle w:val="FirstParagraph"/>
+      </w:pPr>
+      <w:r>
+        <w:rPr>
+          <w:bCs/>
+          <w:b/>
+        </w:rPr>
+        <w:t xml:space="preserve">Chữ trên slide:</w:t>
+      </w:r>
+    </w:p>
+    <w:p>
+      <w:pPr>
+        <w:pStyle w:val="BodyText"/>
+      </w:pPr>
+      <w:r>
+        <w:rPr>
+          <w:bCs/>
+          <w:b/>
+        </w:rPr>
+        <w:t xml:space="preserve">Năm sai lầm dễ làm lộ dữ liệu:</w:t>
+      </w:r>
+      <w:r>
+        <w:t xml:space="preserve"> </w:t>
+      </w:r>
+      <w:r>
+        <w:t xml:space="preserve">1. Chụp màn hình, dán đoạn trích tài liệu mật để</w:t>
+      </w:r>
+      <w:r>
+        <w:t xml:space="preserve"> </w:t>
+      </w:r>
+      <w:r>
+        <w:t xml:space="preserve">“</w:t>
+      </w:r>
+      <w:r>
+        <w:t xml:space="preserve">hỏi nhanh</w:t>
+      </w:r>
+      <w:r>
+        <w:t xml:space="preserve">”</w:t>
+      </w:r>
+      <w:r>
+        <w:t xml:space="preserve"> </w:t>
+      </w:r>
+      <w:r>
+        <w:t xml:space="preserve">AI</w:t>
+      </w:r>
+      <w:r>
+        <w:t xml:space="preserve"> </w:t>
+      </w:r>
+      <w:r>
+        <w:t xml:space="preserve">2. Dùng</w:t>
+      </w:r>
+      <w:r>
+        <w:t xml:space="preserve"> </w:t>
+      </w:r>
+      <w:r>
+        <w:rPr>
+          <w:bCs/>
+          <w:b/>
+        </w:rPr>
+        <w:t xml:space="preserve">Cowork</w:t>
+      </w:r>
+      <w:r>
+        <w:t xml:space="preserve">, tiện ích AI trong trình duyệt, tính năng</w:t>
+      </w:r>
+      <w:r>
+        <w:t xml:space="preserve"> </w:t>
+      </w:r>
+      <w:r>
+        <w:rPr>
+          <w:bCs/>
+          <w:b/>
+        </w:rPr>
+        <w:t xml:space="preserve">sử dụng máy tính</w:t>
+      </w:r>
+      <w:r>
+        <w:t xml:space="preserve"> </w:t>
+      </w:r>
+      <w:r>
+        <w:t xml:space="preserve">trên máy có tài liệu mật – AI đọc được mọi tệp trong thư mục được cấp quyền</w:t>
+      </w:r>
+      <w:r>
+        <w:t xml:space="preserve"> </w:t>
+      </w:r>
+      <w:r>
+        <w:t xml:space="preserve">3. Bật</w:t>
+      </w:r>
+      <w:r>
+        <w:t xml:space="preserve"> </w:t>
+      </w:r>
+      <w:r>
+        <w:rPr>
+          <w:bCs/>
+          <w:b/>
+        </w:rPr>
+        <w:t xml:space="preserve">đồng bộ đám mây</w:t>
+      </w:r>
+      <w:r>
+        <w:t xml:space="preserve"> </w:t>
+      </w:r>
+      <w:r>
+        <w:t xml:space="preserve">(OneDrive, Google Drive) hoặc</w:t>
+      </w:r>
+      <w:r>
+        <w:t xml:space="preserve"> </w:t>
+      </w:r>
+      <w:r>
+        <w:rPr>
+          <w:bCs/>
+          <w:b/>
+        </w:rPr>
+        <w:t xml:space="preserve">Kết nối (Connectors)</w:t>
+      </w:r>
+      <w:r>
+        <w:t xml:space="preserve"> </w:t>
+      </w:r>
+      <w:r>
+        <w:t xml:space="preserve">trên máy xử lý tài liệu mật</w:t>
+      </w:r>
+      <w:r>
+        <w:t xml:space="preserve"> </w:t>
+      </w:r>
+      <w:r>
+        <w:t xml:space="preserve">4. Mang nhật ký lỗi, tệp kết quả từ máy mật sang máy có Internet để nhờ AI sửa</w:t>
+      </w:r>
+      <w:r>
+        <w:t xml:space="preserve"> </w:t>
+      </w:r>
+      <w:r>
+        <w:t xml:space="preserve">5. Dùng tài khoản AI cá nhân cho công việc nội bộ của đơn vị</w:t>
+      </w:r>
+    </w:p>
+    <w:p>
+      <w:pPr>
+        <w:pStyle w:val="BodyText"/>
+      </w:pPr>
+      <w:r>
+        <w:rPr>
+          <w:bCs/>
+          <w:b/>
+        </w:rPr>
+        <w:t xml:space="preserve">Phương án khác (khi được cấp có thẩm quyền cho phép):</w:t>
       </w:r>
     </w:p>
     <w:tbl>
@@ -11303,266 +12821,107 @@
               <w:jc w:val="left"/>
             </w:pPr>
             <w:r>
-              <w:t xml:space="preserve">Máy có Internet (dùng AI)</w:t>
-            </w:r>
-          </w:p>
-        </w:tc>
-        <w:tc>
-          <w:tcPr/>
-          <w:p>
-            <w:pPr>
-              <w:pStyle w:val="Compact"/>
-            </w:pPr>
-          </w:p>
-        </w:tc>
-        <w:tc>
-          <w:tcPr/>
-          <w:p>
-            <w:pPr>
-              <w:pStyle w:val="Compact"/>
-              <w:jc w:val="left"/>
-            </w:pPr>
-            <w:r>
-              <w:t xml:space="preserve">Máy không Internet (dữ liệu mật)</w:t>
-            </w:r>
-          </w:p>
-        </w:tc>
-      </w:tr>
-      <w:tr>
-        <w:tc>
-          <w:tcPr/>
-          <w:p>
-            <w:pPr>
-              <w:pStyle w:val="Compact"/>
-              <w:jc w:val="left"/>
-            </w:pPr>
-            <w:r>
-              <w:t xml:space="preserve">1. Chỉ mô tả</w:t>
-            </w:r>
-            <w:r>
-              <w:t xml:space="preserve"> </w:t>
-            </w:r>
-            <w:r>
-              <w:rPr>
-                <w:bCs/>
-                <w:b/>
-              </w:rPr>
-              <w:t xml:space="preserve">cấu trúc</w:t>
-            </w:r>
-            <w:r>
-              <w:t xml:space="preserve"> </w:t>
-            </w:r>
-            <w:r>
-              <w:t xml:space="preserve">dữ liệu (tên cột, đơn vị)</w:t>
-            </w:r>
-          </w:p>
-        </w:tc>
-        <w:tc>
-          <w:tcPr/>
-          <w:p>
-            <w:pPr>
-              <w:pStyle w:val="Compact"/>
-            </w:pPr>
-          </w:p>
-        </w:tc>
-        <w:tc>
-          <w:tcPr/>
-          <w:p>
-            <w:pPr>
-              <w:pStyle w:val="Compact"/>
-            </w:pPr>
-          </w:p>
-        </w:tc>
-      </w:tr>
-      <w:tr>
-        <w:tc>
-          <w:tcPr/>
-          <w:p>
-            <w:pPr>
-              <w:pStyle w:val="Compact"/>
-              <w:jc w:val="left"/>
-            </w:pPr>
-            <w:r>
-              <w:t xml:space="preserve">2. AI viết công cụ, sinh</w:t>
-            </w:r>
-            <w:r>
-              <w:t xml:space="preserve"> </w:t>
-            </w:r>
-            <w:r>
-              <w:rPr>
-                <w:bCs/>
-                <w:b/>
-              </w:rPr>
-              <w:t xml:space="preserve">dữ liệu giả</w:t>
-            </w:r>
-            <w:r>
-              <w:t xml:space="preserve">, chạy thử</w:t>
-            </w:r>
-          </w:p>
-        </w:tc>
-        <w:tc>
-          <w:tcPr/>
-          <w:p>
-            <w:pPr>
-              <w:pStyle w:val="Compact"/>
-            </w:pPr>
-          </w:p>
-        </w:tc>
-        <w:tc>
-          <w:tcPr/>
-          <w:p>
-            <w:pPr>
-              <w:pStyle w:val="Compact"/>
-            </w:pPr>
-          </w:p>
-        </w:tc>
-      </w:tr>
-      <w:tr>
-        <w:tc>
-          <w:tcPr/>
-          <w:p>
-            <w:pPr>
-              <w:pStyle w:val="Compact"/>
-              <w:jc w:val="left"/>
-            </w:pPr>
-            <w:r>
-              <w:t xml:space="preserve">3. Nhà khoa học đọc mã;</w:t>
-            </w:r>
-            <w:r>
-              <w:t xml:space="preserve"> </w:t>
-            </w:r>
-            <w:r>
-              <w:rPr>
-                <w:bCs/>
-                <w:b/>
-              </w:rPr>
-              <w:t xml:space="preserve">quét mã</w:t>
-            </w:r>
-            <w:r>
-              <w:t xml:space="preserve"> </w:t>
-            </w:r>
-            <w:r>
-              <w:t xml:space="preserve">– không có kết nối mạng</w:t>
-            </w:r>
-          </w:p>
-        </w:tc>
-        <w:tc>
-          <w:tcPr/>
-          <w:p>
-            <w:pPr>
-              <w:pStyle w:val="Compact"/>
-            </w:pPr>
-          </w:p>
-        </w:tc>
-        <w:tc>
-          <w:tcPr/>
-          <w:p>
-            <w:pPr>
-              <w:pStyle w:val="Compact"/>
-            </w:pPr>
-          </w:p>
-        </w:tc>
-      </w:tr>
-      <w:tr>
-        <w:tc>
-          <w:tcPr/>
-          <w:p>
-            <w:pPr>
-              <w:pStyle w:val="Compact"/>
-              <w:jc w:val="left"/>
-            </w:pPr>
-            <w:r>
-              <w:t xml:space="preserve">4. Đóng gói +</w:t>
-            </w:r>
-            <w:r>
-              <w:t xml:space="preserve"> </w:t>
-            </w:r>
-            <w:r>
-              <w:rPr>
-                <w:bCs/>
-                <w:b/>
-              </w:rPr>
-              <w:t xml:space="preserve">mã băm SHA-256</w:t>
-            </w:r>
-          </w:p>
-        </w:tc>
-        <w:tc>
-          <w:tcPr/>
-          <w:p>
-            <w:pPr>
-              <w:pStyle w:val="Compact"/>
-              <w:jc w:val="left"/>
-            </w:pPr>
-            <w:r>
-              <w:t xml:space="preserve">➜ chuyển theo quy định ➜</w:t>
-            </w:r>
-          </w:p>
-        </w:tc>
-        <w:tc>
-          <w:tcPr/>
-          <w:p>
-            <w:pPr>
-              <w:pStyle w:val="Compact"/>
-              <w:jc w:val="left"/>
-            </w:pPr>
-            <w:r>
-              <w:t xml:space="preserve">5. Đối chiếu mã băm → chạy với</w:t>
-            </w:r>
-            <w:r>
-              <w:t xml:space="preserve"> </w:t>
-            </w:r>
-            <w:r>
-              <w:rPr>
-                <w:bCs/>
-                <w:b/>
-              </w:rPr>
-              <w:t xml:space="preserve">dữ liệu thật</w:t>
-            </w:r>
-          </w:p>
-        </w:tc>
-      </w:tr>
-      <w:tr>
-        <w:tc>
-          <w:tcPr/>
-          <w:p>
-            <w:pPr>
-              <w:pStyle w:val="Compact"/>
-            </w:pPr>
-          </w:p>
-        </w:tc>
-        <w:tc>
-          <w:tcPr/>
-          <w:p>
-            <w:pPr>
-              <w:pStyle w:val="Compact"/>
-            </w:pPr>
-          </w:p>
-        </w:tc>
-        <w:tc>
-          <w:tcPr/>
-          <w:p>
-            <w:pPr>
-              <w:pStyle w:val="Compact"/>
-              <w:jc w:val="left"/>
-            </w:pPr>
-            <w:r>
-              <w:t xml:space="preserve">6. Kết quả</w:t>
-            </w:r>
-            <w:r>
-              <w:t xml:space="preserve"> </w:t>
-            </w:r>
-            <w:r>
-              <w:rPr>
-                <w:bCs/>
-                <w:b/>
-              </w:rPr>
-              <w:t xml:space="preserve">ở lại</w:t>
-            </w:r>
-            <w:r>
-              <w:t xml:space="preserve"> </w:t>
-            </w:r>
-            <w:r>
-              <w:t xml:space="preserve">máy này</w:t>
+              <w:t xml:space="preserve">Phương án</w:t>
+            </w:r>
+          </w:p>
+        </w:tc>
+        <w:tc>
+          <w:tcPr/>
+          <w:p>
+            <w:pPr>
+              <w:pStyle w:val="Compact"/>
+              <w:jc w:val="left"/>
+            </w:pPr>
+            <w:r>
+              <w:t xml:space="preserve">Ưu điểm</w:t>
+            </w:r>
+          </w:p>
+        </w:tc>
+        <w:tc>
+          <w:tcPr/>
+          <w:p>
+            <w:pPr>
+              <w:pStyle w:val="Compact"/>
+              <w:jc w:val="left"/>
+            </w:pPr>
+            <w:r>
+              <w:t xml:space="preserve">Hạn chế</w:t>
+            </w:r>
+          </w:p>
+        </w:tc>
+      </w:tr>
+      <w:tr>
+        <w:tc>
+          <w:tcPr/>
+          <w:p>
+            <w:pPr>
+              <w:pStyle w:val="Compact"/>
+              <w:jc w:val="left"/>
+            </w:pPr>
+            <w:r>
+              <w:t xml:space="preserve">Mô hình AI mã nguồn mở chạy cục bộ trên máy không kết nối</w:t>
+            </w:r>
+          </w:p>
+        </w:tc>
+        <w:tc>
+          <w:tcPr/>
+          <w:p>
+            <w:pPr>
+              <w:pStyle w:val="Compact"/>
+              <w:jc w:val="left"/>
+            </w:pPr>
+            <w:r>
+              <w:t xml:space="preserve">Hỏi – đáp, tóm tắt trực tiếp trên dữ liệu mật</w:t>
+            </w:r>
+          </w:p>
+        </w:tc>
+        <w:tc>
+          <w:tcPr/>
+          <w:p>
+            <w:pPr>
+              <w:pStyle w:val="Compact"/>
+              <w:jc w:val="left"/>
+            </w:pPr>
+            <w:r>
+              <w:t xml:space="preserve">Phải kiểm định, phê duyệt; năng lực thấp hơn; cần máy cấu hình cao</w:t>
+            </w:r>
+          </w:p>
+        </w:tc>
+      </w:tr>
+      <w:tr>
+        <w:tc>
+          <w:tcPr/>
+          <w:p>
+            <w:pPr>
+              <w:pStyle w:val="Compact"/>
+              <w:jc w:val="left"/>
+            </w:pPr>
+            <w:r>
+              <w:t xml:space="preserve">Mạng LAN độc lập trong trụ sở</w:t>
+            </w:r>
+          </w:p>
+        </w:tc>
+        <w:tc>
+          <w:tcPr/>
+          <w:p>
+            <w:pPr>
+              <w:pStyle w:val="Compact"/>
+              <w:jc w:val="left"/>
+            </w:pPr>
+            <w:r>
+              <w:t xml:space="preserve">Nhiều cán bộ dùng chung công cụ</w:t>
+            </w:r>
+          </w:p>
+        </w:tc>
+        <w:tc>
+          <w:tcPr/>
+          <w:p>
+            <w:pPr>
+              <w:pStyle w:val="Compact"/>
+              <w:jc w:val="left"/>
+            </w:pPr>
+            <w:r>
+              <w:t xml:space="preserve">Theo quy định về mạng LAN độc lập của Luật 117/2025</w:t>
             </w:r>
           </w:p>
         </w:tc>
@@ -11570,217 +12929,6 @@
     </w:tbl>
     <w:p>
       <w:pPr>
-        <w:numPr>
-          <w:ilvl w:val="0"/>
-          <w:numId w:val="1005"/>
-        </w:numPr>
-        <w:pStyle w:val="Compact"/>
-      </w:pPr>
-      <w:r>
-        <w:t xml:space="preserve">🧪</w:t>
-      </w:r>
-      <w:r>
-        <w:t xml:space="preserve"> </w:t>
-      </w:r>
-      <w:r>
-        <w:rPr>
-          <w:bCs/>
-          <w:b/>
-        </w:rPr>
-        <w:t xml:space="preserve">Ví dụ:</w:t>
-      </w:r>
-      <w:r>
-        <w:t xml:space="preserve"> </w:t>
-      </w:r>
-      <w:r>
-        <w:rPr>
-          <w:iCs/>
-          <w:i/>
-        </w:rPr>
-        <w:t xml:space="preserve">Ảnh hưởng của địa hình và khí hậu nhiệt đới đến lộ trình của thiết bị bay không người lái</w:t>
-      </w:r>
-      <w:r>
-        <w:t xml:space="preserve"> </w:t>
-      </w:r>
-      <w:r>
-        <w:t xml:space="preserve">– công cụ tìm lộ trình tốn ít năng lượng nhất, tránh núi cao, ổ mưa dông, gió mạnh; tính ảnh hưởng của gió, mưa, nhiệt độ – độ ẩm, leo cao</w:t>
-      </w:r>
-    </w:p>
-    <w:p>
-      <w:pPr>
-        <w:numPr>
-          <w:ilvl w:val="0"/>
-          <w:numId w:val="1005"/>
-        </w:numPr>
-        <w:pStyle w:val="Compact"/>
-      </w:pPr>
-      <w:r>
-        <w:t xml:space="preserve">📊</w:t>
-      </w:r>
-      <w:r>
-        <w:t xml:space="preserve"> </w:t>
-      </w:r>
-      <w:r>
-        <w:rPr>
-          <w:bCs/>
-          <w:b/>
-        </w:rPr>
-        <w:t xml:space="preserve">Kết quả với dữ liệu giả lập:</w:t>
-      </w:r>
-    </w:p>
-    <w:p>
-      <w:pPr>
-        <w:numPr>
-          <w:ilvl w:val="1"/>
-          <w:numId w:val="1006"/>
-        </w:numPr>
-        <w:pStyle w:val="Compact"/>
-      </w:pPr>
-      <w:r>
-        <w:t xml:space="preserve">Đường thẳng cắt qua</w:t>
-      </w:r>
-      <w:r>
-        <w:t xml:space="preserve"> </w:t>
-      </w:r>
-      <w:r>
-        <w:rPr>
-          <w:bCs/>
-          <w:b/>
-        </w:rPr>
-        <w:t xml:space="preserve">8 ô cấm bay</w:t>
-      </w:r>
-      <w:r>
-        <w:t xml:space="preserve"> </w:t>
-      </w:r>
-      <w:r>
-        <w:t xml:space="preserve">→ lộ trình vòng qua đèo: 14,5 km, 240 Wh</w:t>
-      </w:r>
-    </w:p>
-    <w:p>
-      <w:pPr>
-        <w:numPr>
-          <w:ilvl w:val="1"/>
-          <w:numId w:val="1006"/>
-        </w:numPr>
-        <w:pStyle w:val="Compact"/>
-      </w:pPr>
-      <w:r>
-        <w:t xml:space="preserve">Chiều về ngược gió mùa:</w:t>
-      </w:r>
-      <w:r>
-        <w:t xml:space="preserve"> </w:t>
-      </w:r>
-      <w:r>
-        <w:rPr>
-          <w:bCs/>
-          <w:b/>
-        </w:rPr>
-        <w:t xml:space="preserve">422 Wh – gấp 1,8 lần chiều đi</w:t>
-      </w:r>
-      <w:r>
-        <w:t xml:space="preserve"> </w:t>
-      </w:r>
-      <w:r>
-        <w:t xml:space="preserve">→ không đủ pin, phải đổi phương án</w:t>
-      </w:r>
-    </w:p>
-    <w:p>
-      <w:pPr>
-        <w:numPr>
-          <w:ilvl w:val="1"/>
-          <w:numId w:val="1006"/>
-        </w:numPr>
-        <w:pStyle w:val="Compact"/>
-      </w:pPr>
-      <w:r>
-        <w:t xml:space="preserve">Công cụ chạy trong ~3 giây trên máy tính thường, không cần mạng</w:t>
-      </w:r>
-    </w:p>
-    <w:p>
-      <w:pPr>
-        <w:numPr>
-          <w:ilvl w:val="0"/>
-          <w:numId w:val="1005"/>
-        </w:numPr>
-        <w:pStyle w:val="Compact"/>
-      </w:pPr>
-      <w:r>
-        <w:t xml:space="preserve">🎯</w:t>
-      </w:r>
-      <w:r>
-        <w:t xml:space="preserve"> </w:t>
-      </w:r>
-      <w:r>
-        <w:rPr>
-          <w:bCs/>
-          <w:b/>
-        </w:rPr>
-        <w:t xml:space="preserve">Trọng tâm là quy trình</w:t>
-      </w:r>
-      <w:r>
-        <w:t xml:space="preserve"> </w:t>
-      </w:r>
-      <w:r>
-        <w:t xml:space="preserve">– mô hình bay trong ví dụ đã đơn giản hóa; đơn vị thay bằng mô hình và thông số của mình.</w:t>
-      </w:r>
-    </w:p>
-    <w:p>
-      <w:pPr>
-        <w:numPr>
-          <w:ilvl w:val="0"/>
-          <w:numId w:val="1005"/>
-        </w:numPr>
-        <w:pStyle w:val="Compact"/>
-      </w:pPr>
-      <w:r>
-        <w:t xml:space="preserve">⚠ Chuyển tệp giữa hai máy theo</w:t>
-      </w:r>
-      <w:r>
-        <w:t xml:space="preserve"> </w:t>
-      </w:r>
-      <w:r>
-        <w:rPr>
-          <w:bCs/>
-          <w:b/>
-        </w:rPr>
-        <w:t xml:space="preserve">quy định bảo vệ bí mật nhà nước và quy chế của đơn vị</w:t>
-      </w:r>
-      <w:r>
-        <w:t xml:space="preserve">. Khi công cụ lỗi: tái tạo lỗi bằng dữ liệu giả để hỏi AI – không mang dữ liệu thật ra ngoài.</w:t>
-      </w:r>
-    </w:p>
-    <w:p>
-      <w:pPr>
-        <w:pStyle w:val="FirstParagraph"/>
-      </w:pPr>
-      <w:r>
-        <w:rPr>
-          <w:bCs/>
-          <w:b/>
-        </w:rPr>
-        <w:t xml:space="preserve">Hình ảnh:</w:t>
-      </w:r>
-      <w:r>
-        <w:t xml:space="preserve"> </w:t>
-      </w:r>
-      <w:r>
-        <w:t xml:space="preserve">sơ đồ hai máy;</w:t>
-      </w:r>
-      <w:r>
-        <w:t xml:space="preserve"> </w:t>
-      </w:r>
-      <w:r>
-        <w:rPr>
-          <w:rStyle w:val="VerbatimChar"/>
-        </w:rPr>
-        <w:t xml:space="preserve">thuyet-trinh/ket-qua-demo/may-cach-ly/ban_do_lo_trinh.png</w:t>
-      </w:r>
-      <w:r>
-        <w:t xml:space="preserve">.</w:t>
-      </w:r>
-    </w:p>
-    <w:p>
-      <w:pPr>
         <w:pStyle w:val="BodyText"/>
       </w:pPr>
       <w:r>
@@ -11788,89 +12936,13 @@
           <w:bCs/>
           <w:b/>
         </w:rPr>
-        <w:t xml:space="preserve">🎬 Trình chiếu:</w:t>
-      </w:r>
-      <w:r>
-        <w:t xml:space="preserve"> </w:t>
-      </w:r>
-      <w:r>
-        <w:t xml:space="preserve">ảnh bản đồ lộ trình + báo cáo đã chạy; ảnh màn hình chương trình quét mã báo</w:t>
-      </w:r>
-      <w:r>
-        <w:t xml:space="preserve"> </w:t>
-      </w:r>
-      <w:r>
-        <w:t xml:space="preserve">“</w:t>
-      </w:r>
-      <w:r>
-        <w:t xml:space="preserve">không phát hiện kết nối mạng</w:t>
-      </w:r>
-      <w:r>
-        <w:t xml:space="preserve">”</w:t>
-      </w:r>
-      <w:r>
-        <w:t xml:space="preserve"> </w:t>
-      </w:r>
-      <w:r>
-        <w:t xml:space="preserve">và báo</w:t>
-      </w:r>
-      <w:r>
-        <w:t xml:space="preserve"> </w:t>
-      </w:r>
-      <w:r>
-        <w:rPr>
-          <w:bCs/>
-          <w:b/>
-        </w:rPr>
-        <w:t xml:space="preserve">chặn</w:t>
-      </w:r>
-      <w:r>
-        <w:t xml:space="preserve"> </w:t>
-      </w:r>
-      <w:r>
-        <w:t xml:space="preserve">khi thử chèn</w:t>
-      </w:r>
-      <w:r>
-        <w:t xml:space="preserve"> </w:t>
-      </w:r>
-      <w:r>
-        <w:rPr>
-          <w:rStyle w:val="VerbatimChar"/>
-        </w:rPr>
-        <w:t xml:space="preserve">import requests</w:t>
-      </w:r>
-      <w:r>
-        <w:t xml:space="preserve"> </w:t>
-      </w:r>
-      <w:r>
-        <w:t xml:space="preserve">(câu lệnh:</w:t>
-      </w:r>
-      <w:r>
-        <w:t xml:space="preserve"> </w:t>
-      </w:r>
-      <w:r>
-        <w:rPr>
-          <w:rStyle w:val="VerbatimChar"/>
-        </w:rPr>
-        <w:t xml:space="preserve">cau-lenh-demo.md</w:t>
-      </w:r>
-      <w:r>
-        <w:t xml:space="preserve"> </w:t>
-      </w:r>
-      <w:r>
-        <w:t xml:space="preserve">mục 13; mã:</w:t>
-      </w:r>
-      <w:r>
-        <w:t xml:space="preserve"> </w:t>
-      </w:r>
-      <w:r>
-        <w:rPr>
-          <w:rStyle w:val="VerbatimChar"/>
-        </w:rPr>
-        <w:t xml:space="preserve">thuyet-trinh/ma-nguon-demo/may-cach-ly/</w:t>
-      </w:r>
-      <w:r>
-        <w:t xml:space="preserve">).</w:t>
+        <w:t xml:space="preserve">Nguồn:</w:t>
+      </w:r>
+      <w:r>
+        <w:t xml:space="preserve"> </w:t>
+      </w:r>
+      <w:r>
+        <w:t xml:space="preserve">N38</w:t>
       </w:r>
     </w:p>
     <w:p>
@@ -11908,15 +12980,15 @@
         </w:pict>
       </w:r>
     </w:p>
-    <w:bookmarkEnd w:id="47"/>
-    <w:bookmarkEnd w:id="48"/>
-    <w:bookmarkStart w:id="52" w:name="X49c9e2e2629d4b3041c6feec67246a57957c4b4"/>
+    <w:bookmarkEnd w:id="50"/>
+    <w:bookmarkEnd w:id="51"/>
+    <w:bookmarkStart w:id="55" w:name="Xa57b4ca23103b29cbf0eb98fe4e860d4d81e36c"/>
     <w:p>
       <w:pPr>
         <w:pStyle w:val="Heading1"/>
       </w:pPr>
       <w:r>
-        <w:t xml:space="preserve">PHẦN V. SKILL, KHOA HỌC MỞ VÀ TỰ ĐỘNG HÓA (15 phút)</w:t>
+        <w:t xml:space="preserve">PHẦN V. SKILL, KHOA HỌC MỞ VÀ TỰ ĐỘNG HÓA (13 phút)</w:t>
       </w:r>
     </w:p>
     <w:p>
@@ -11934,7 +13006,7 @@
         <w:t xml:space="preserve"> </w:t>
       </w:r>
       <w:r>
-        <w:t xml:space="preserve">tên Phần V · Slide 21–23</w:t>
+        <w:t xml:space="preserve">tên Phần V · Slide 24–26</w:t>
       </w:r>
     </w:p>
     <w:p>
@@ -11944,13 +13016,13 @@
         </w:pict>
       </w:r>
     </w:p>
-    <w:bookmarkStart w:id="49" w:name="X5d85201682f74012aaff14be436a56e291dab5b"/>
+    <w:bookmarkStart w:id="52" w:name="X5375f35c5560ee3b02d34f905afaccaf18bbe54"/>
     <w:p>
       <w:pPr>
         <w:pStyle w:val="Heading2"/>
       </w:pPr>
       <w:r>
-        <w:t xml:space="preserve">Slide 21 – Skill và khoa học mở: nền móng của tự động hóa (6′)</w:t>
+        <w:t xml:space="preserve">Slide 24 – Skill và khoa học mở: nền móng của tự động hóa (5′)</w:t>
       </w:r>
     </w:p>
     <w:p>
@@ -12437,14 +13509,14 @@
         </w:pict>
       </w:r>
     </w:p>
-    <w:bookmarkEnd w:id="49"/>
-    <w:bookmarkStart w:id="50" w:name="Xe89b064a741105d19ba019fc0a41ec1b8ee21ee"/>
+    <w:bookmarkEnd w:id="52"/>
+    <w:bookmarkStart w:id="53" w:name="X0cfc18ab76a143714bcb419aa2fc5112160c5db"/>
     <w:p>
       <w:pPr>
         <w:pStyle w:val="Heading2"/>
       </w:pPr>
       <w:r>
-        <w:t xml:space="preserve">Slide 22 – Tự động hóa từng bước: từ một công việc đến toàn quy trình (5′)</w:t>
+        <w:t xml:space="preserve">Slide 25 – Tự động hóa từng bước: từ một công việc đến toàn quy trình (4′)</w:t>
       </w:r>
     </w:p>
     <w:p>
@@ -12964,14 +14036,14 @@
         </w:pict>
       </w:r>
     </w:p>
-    <w:bookmarkEnd w:id="50"/>
-    <w:bookmarkStart w:id="51" w:name="X12f078beff3c8f6e6e0a0aa609bbd91a91781f8"/>
+    <w:bookmarkEnd w:id="53"/>
+    <w:bookmarkStart w:id="54" w:name="X5782e8dd4d466845a4de6bb2295f5da0ac977da"/>
     <w:p>
       <w:pPr>
         <w:pStyle w:val="Heading2"/>
       </w:pPr>
       <w:r>
-        <w:t xml:space="preserve">Slide 23 – Quy trình tự động của Trung tâm và năm quyết định của nhà khoa học (4′)</w:t>
+        <w:t xml:space="preserve">Slide 26 – Quy trình tự động của Trung tâm và năm quyết định của nhà khoa học (4′)</w:t>
       </w:r>
     </w:p>
     <w:p>
@@ -13591,9 +14663,9 @@
         </w:pict>
       </w:r>
     </w:p>
-    <w:bookmarkEnd w:id="51"/>
-    <w:bookmarkEnd w:id="52"/>
-    <w:bookmarkStart w:id="54" w:name="phần-vi.-trao-đổi-và-thảo-luận-12-phút"/>
+    <w:bookmarkEnd w:id="54"/>
+    <w:bookmarkEnd w:id="55"/>
+    <w:bookmarkStart w:id="57" w:name="phần-vi.-trao-đổi-và-thảo-luận-12-phút"/>
     <w:p>
       <w:pPr>
         <w:pStyle w:val="Heading1"/>
@@ -13609,13 +14681,13 @@
         </w:pict>
       </w:r>
     </w:p>
-    <w:bookmarkStart w:id="53" w:name="slide-24-trao-đổi-và-thảo-luận-12"/>
+    <w:bookmarkStart w:id="56" w:name="slide-27-trao-đổi-và-thảo-luận-12"/>
     <w:p>
       <w:pPr>
         <w:pStyle w:val="Heading2"/>
       </w:pPr>
       <w:r>
-        <w:t xml:space="preserve">Slide 24 – Trao đổi và thảo luận (12′)</w:t>
+        <w:t xml:space="preserve">Slide 27 – Trao đổi và thảo luận (12′)</w:t>
       </w:r>
     </w:p>
     <w:p>
@@ -13689,9 +14761,9 @@
         </w:pict>
       </w:r>
     </w:p>
-    <w:bookmarkEnd w:id="53"/>
-    <w:bookmarkEnd w:id="54"/>
-    <w:bookmarkStart w:id="61" w:name="phụ-lục-không-trình-bày"/>
+    <w:bookmarkEnd w:id="56"/>
+    <w:bookmarkEnd w:id="57"/>
+    <w:bookmarkStart w:id="64" w:name="phụ-lục-không-trình-bày"/>
     <w:p>
       <w:pPr>
         <w:pStyle w:val="Heading1"/>
@@ -13707,13 +14779,13 @@
         </w:pict>
       </w:r>
     </w:p>
-    <w:bookmarkStart w:id="55" w:name="X8f9e2ba04e714feee59df4978548bcb43fd9566"/>
+    <w:bookmarkStart w:id="58" w:name="Xe40b59842847e32d9ff00a521f9d01c24863782"/>
     <w:p>
       <w:pPr>
         <w:pStyle w:val="Heading2"/>
       </w:pPr>
       <w:r>
-        <w:t xml:space="preserve">Slide 25 – Phụ lục A: AI lập trình (không trình bày)</w:t>
+        <w:t xml:space="preserve">Slide 28 – Phụ lục A: AI lập trình (không trình bày)</w:t>
       </w:r>
     </w:p>
     <w:p>
@@ -13815,14 +14887,14 @@
         </w:pict>
       </w:r>
     </w:p>
-    <w:bookmarkEnd w:id="55"/>
-    <w:bookmarkStart w:id="56" w:name="Xd74df6b9081f296f5d44d3cb7737b2bbd8fe71c"/>
+    <w:bookmarkEnd w:id="58"/>
+    <w:bookmarkStart w:id="59" w:name="Xb54733a1be9f78a1d097cad3c6c6f1a836eee43"/>
     <w:p>
       <w:pPr>
         <w:pStyle w:val="Heading2"/>
       </w:pPr>
       <w:r>
-        <w:t xml:space="preserve">Slide 26 – Phụ lục B: Ví dụ Google và các nhà khoa học dùng AI (không trình bày – dự phòng khi được hỏi)</w:t>
+        <w:t xml:space="preserve">Slide 29 – Phụ lục B: Ví dụ Google và các nhà khoa học dùng AI (không trình bày – dự phòng khi được hỏi)</w:t>
       </w:r>
     </w:p>
     <w:p>
@@ -14499,14 +15571,14 @@
         </w:pict>
       </w:r>
     </w:p>
-    <w:bookmarkEnd w:id="56"/>
-    <w:bookmarkStart w:id="57" w:name="Xa8e58479d1a1c480496e65013585d6cdadeba01"/>
+    <w:bookmarkEnd w:id="59"/>
+    <w:bookmarkStart w:id="60" w:name="Xc9887d7478f770621d0cae14328f1183d16b37a"/>
     <w:p>
       <w:pPr>
         <w:pStyle w:val="Heading2"/>
       </w:pPr>
       <w:r>
-        <w:t xml:space="preserve">Slide 27 – Phụ lục C: Nguồn tham khảo (không trình bày)</w:t>
+        <w:t xml:space="preserve">Slide 30 – Phụ lục C: Nguồn tham khảo (không trình bày)</w:t>
       </w:r>
     </w:p>
     <w:p>
@@ -14596,14 +15668,14 @@
         </w:pict>
       </w:r>
     </w:p>
-    <w:bookmarkEnd w:id="57"/>
-    <w:bookmarkStart w:id="58" w:name="Xab5725cfa470f07895dde52f84d960bbf3bb8f8"/>
+    <w:bookmarkEnd w:id="60"/>
+    <w:bookmarkStart w:id="61" w:name="Xa7f4f83a003c666aa1034540295379b0c781014"/>
     <w:p>
       <w:pPr>
         <w:pStyle w:val="Heading2"/>
       </w:pPr>
       <w:r>
-        <w:t xml:space="preserve">Slide 28 – Phụ lục D: Dự án và bộ Skill khoa học mở (không trình bày)</w:t>
+        <w:t xml:space="preserve">Slide 31 – Phụ lục D: Dự án và bộ Skill khoa học mở (không trình bày)</w:t>
       </w:r>
     </w:p>
     <w:p>
@@ -14677,14 +15749,14 @@
         </w:pict>
       </w:r>
     </w:p>
-    <w:bookmarkEnd w:id="58"/>
-    <w:bookmarkStart w:id="59" w:name="X33a93005abd6f1d5d0d4884403f4eee5689cd16"/>
+    <w:bookmarkEnd w:id="61"/>
+    <w:bookmarkStart w:id="62" w:name="Xd5f30bdd5007fc667b780428f6ed531daaf0dd0"/>
     <w:p>
       <w:pPr>
         <w:pStyle w:val="Heading2"/>
       </w:pPr>
       <w:r>
-        <w:t xml:space="preserve">Slide 29 – Phụ lục E: Câu hỏi thường gặp (dự phòng khi được hỏi) 🆕</w:t>
+        <w:t xml:space="preserve">Slide 32 – Phụ lục E: Câu hỏi thường gặp (dự phòng khi được hỏi) 🆕</w:t>
       </w:r>
     </w:p>
     <w:p>
@@ -14963,8 +16035,8 @@
         </w:pict>
       </w:r>
     </w:p>
-    <w:bookmarkEnd w:id="59"/>
-    <w:bookmarkStart w:id="60" w:name="ý-kiến-chung-của-người-duyệt"/>
+    <w:bookmarkEnd w:id="62"/>
+    <w:bookmarkStart w:id="63" w:name="ý-kiến-chung-của-người-duyệt"/>
     <w:p>
       <w:pPr>
         <w:pStyle w:val="Heading2"/>
@@ -14977,7 +16049,7 @@
       <w:pPr>
         <w:numPr>
           <w:ilvl w:val="0"/>
-          <w:numId w:val="1007"/>
+          <w:numId w:val="1006"/>
         </w:numPr>
         <w:pStyle w:val="Compact"/>
       </w:pPr>
@@ -14989,7 +16061,7 @@
       <w:pPr>
         <w:numPr>
           <w:ilvl w:val="0"/>
-          <w:numId w:val="1007"/>
+          <w:numId w:val="1006"/>
         </w:numPr>
         <w:pStyle w:val="Compact"/>
       </w:pPr>
@@ -15001,7 +16073,7 @@
       <w:pPr>
         <w:numPr>
           <w:ilvl w:val="0"/>
-          <w:numId w:val="1007"/>
+          <w:numId w:val="1006"/>
         </w:numPr>
         <w:pStyle w:val="Compact"/>
       </w:pPr>
@@ -15013,7 +16085,7 @@
       <w:pPr>
         <w:numPr>
           <w:ilvl w:val="0"/>
-          <w:numId w:val="1007"/>
+          <w:numId w:val="1006"/>
         </w:numPr>
         <w:pStyle w:val="Compact"/>
       </w:pPr>
@@ -15021,8 +16093,8 @@
         <w:t xml:space="preserve">Người duyệt: ______________________ · Ngày: ____ / ____ / 2026</w:t>
       </w:r>
     </w:p>
-    <w:bookmarkEnd w:id="60"/>
-    <w:bookmarkEnd w:id="61"/>
+    <w:bookmarkEnd w:id="63"/>
+    <w:bookmarkEnd w:id="64"/>
     <w:sectPr/>
   </w:body>
 </w:document>
@@ -15336,9 +16408,6 @@
     <w:abstractNumId w:val="991"/>
   </w:num>
   <w:num w:numId="1006">
-    <w:abstractNumId w:val="991"/>
-  </w:num>
-  <w:num w:numId="1007">
     <w:abstractNumId w:val="991"/>
   </w:num>
 </w:numbering>

</xml_diff>

<commit_message>
Phụ lục định hướng theo bản sửa của người trình bày; hướng dẫn Sci-Hub, Sci-Bot ở bước tìm – lọc tài liệu
- Áp dụng chỉnh sửa trong tệp Word: công cụ tìm tài liệu chuyển sang Phần III; bỏ câu cảnh báo Sci-Hub, câu về số liệu tài chính
- Slide tìm và lọc tài liệu thành bước đầu Phần III (Slide 12): quy trình 4 bước với Sci-Bot, Sci-Hub; đánh số lại Slide 7–11; Phần II 28′, Phần III 34′
- Lược bỏ phần thừa trong phụ lục (kết quả cần đạt, hình thức trình bày, tài liệu kèm theo; gộp yêu cầu, công tác chuẩn bị)
- Tài liệu phát tay mục 11, câu lệnh mục 14

Co-Authored-By: Claude Opus 5.5 <noreply@anthropic.com>
Claude-Session: https://claude.ai/code/session_01JoSsghLRHTtvcNzYXbKpzE
</commit_message>
<xml_diff>
--- a/thuyet-trinh/DANH-SACH-SLIDE-v2.5.docx
+++ b/thuyet-trinh/DANH-SACH-SLIDE-v2.5.docx
@@ -197,7 +197,7 @@
         <w:t xml:space="preserve"> </w:t>
       </w:r>
       <w:r>
-        <w:t xml:space="preserve">Slide 7 – công cụ tìm và đọc tài liệu (Sci-Hub, Sci-Bot và lựa chọn hợp pháp); từ Slide 7 cũ trở đi số slide cộng 1; thảo luận 12′.</w:t>
+        <w:t xml:space="preserve">Slide 12 – công cụ tìm và đọc tài liệu (Sci-Hub, Sci-Bot và lựa chọn hợp pháp); từ Slide 12 cũ trở đi số slide cộng 1; thảo luận 12′.</w:t>
       </w:r>
       <w:r>
         <w:t xml:space="preserve"> </w:t>
@@ -534,7 +534,7 @@
               <w:jc w:val="left"/>
             </w:pPr>
             <w:r>
-              <w:t xml:space="preserve">9, 14, 15, 16, 17, 22</w:t>
+              <w:t xml:space="preserve">8, 14, 15, 16, 17, 22</w:t>
             </w:r>
           </w:p>
         </w:tc>
@@ -786,7 +786,7 @@
               <w:jc w:val="left"/>
             </w:pPr>
             <w:r>
-              <w:t xml:space="preserve">1, 3, 8</w:t>
+              <w:t xml:space="preserve">1, 3, 7</w:t>
             </w:r>
           </w:p>
         </w:tc>
@@ -1384,7 +1384,7 @@
                 <w:bCs/>
                 <w:b/>
               </w:rPr>
-              <w:t xml:space="preserve">PHẦN II. LỰA CHỌN VÀ SỬ DỤNG CÔNG CỤ AI PHÙ HỢP – 32′</w:t>
+              <w:t xml:space="preserve">PHẦN II. LỰA CHỌN VÀ SỬ DỤNG CÔNG CỤ AI PHÙ HỢP – 28′</w:t>
             </w:r>
           </w:p>
         </w:tc>
@@ -1558,7 +1558,7 @@
               <w:jc w:val="left"/>
             </w:pPr>
             <w:r>
-              <w:t xml:space="preserve">🆕 Tìm và đọc tài liệu khoa học: Sci-Hub, Sci-Bot và các lựa chọn hợp pháp</w:t>
+              <w:t xml:space="preserve">Giới thiệu Claude: mô hình, gói dịch vụ và tính năng nổi bật trên Windows</w:t>
             </w:r>
           </w:p>
         </w:tc>
@@ -1582,7 +1582,7 @@
               <w:jc w:val="left"/>
             </w:pPr>
             <w:r>
-              <w:t xml:space="preserve">4′</w:t>
+              <w:t xml:space="preserve">6′</w:t>
             </w:r>
           </w:p>
         </w:tc>
@@ -1620,7 +1620,7 @@
               <w:jc w:val="left"/>
             </w:pPr>
             <w:r>
-              <w:t xml:space="preserve">Giới thiệu Claude: mô hình, gói dịch vụ và tính năng nổi bật trên Windows</w:t>
+              <w:t xml:space="preserve">Bắt đầu với Claude: 6 bước đầu tiên và tổng hợp dữ liệu nhiều nguồn</w:t>
             </w:r>
           </w:p>
         </w:tc>
@@ -1644,7 +1644,7 @@
               <w:jc w:val="left"/>
             </w:pPr>
             <w:r>
-              <w:t xml:space="preserve">6′</w:t>
+              <w:t xml:space="preserve">5′</w:t>
             </w:r>
           </w:p>
         </w:tc>
@@ -1682,7 +1682,7 @@
               <w:jc w:val="left"/>
             </w:pPr>
             <w:r>
-              <w:t xml:space="preserve">Bắt đầu với Claude: 6 bước đầu tiên và tổng hợp dữ liệu nhiều nguồn</w:t>
+              <w:t xml:space="preserve">Giao việc cho AI Agent: cách viết yêu cầu 5 bước</w:t>
             </w:r>
           </w:p>
         </w:tc>
@@ -1744,7 +1744,7 @@
               <w:jc w:val="left"/>
             </w:pPr>
             <w:r>
-              <w:t xml:space="preserve">Giao việc cho AI Agent: cách viết yêu cầu 5 bước</w:t>
+              <w:t xml:space="preserve">Không gian làm việc nghiên cứu: mỗi nhiệm vụ một dự án</w:t>
             </w:r>
           </w:p>
         </w:tc>
@@ -1768,7 +1768,7 @@
               <w:jc w:val="left"/>
             </w:pPr>
             <w:r>
-              <w:t xml:space="preserve">5′</w:t>
+              <w:t xml:space="preserve">3′</w:t>
             </w:r>
           </w:p>
         </w:tc>
@@ -1795,68 +1795,6 @@
             </w:pPr>
             <w:r>
               <w:t xml:space="preserve">11</w:t>
-            </w:r>
-          </w:p>
-        </w:tc>
-        <w:tc>
-          <w:tcPr/>
-          <w:p>
-            <w:pPr>
-              <w:pStyle w:val="Compact"/>
-              <w:jc w:val="left"/>
-            </w:pPr>
-            <w:r>
-              <w:t xml:space="preserve">Không gian làm việc nghiên cứu: mỗi nhiệm vụ một dự án</w:t>
-            </w:r>
-          </w:p>
-        </w:tc>
-        <w:tc>
-          <w:tcPr/>
-          <w:p>
-            <w:pPr>
-              <w:pStyle w:val="Compact"/>
-              <w:jc w:val="left"/>
-            </w:pPr>
-            <w:r>
-              <w:t xml:space="preserve">II</w:t>
-            </w:r>
-          </w:p>
-        </w:tc>
-        <w:tc>
-          <w:tcPr/>
-          <w:p>
-            <w:pPr>
-              <w:pStyle w:val="Compact"/>
-              <w:jc w:val="left"/>
-            </w:pPr>
-            <w:r>
-              <w:t xml:space="preserve">3′</w:t>
-            </w:r>
-          </w:p>
-        </w:tc>
-        <w:tc>
-          <w:tcPr/>
-          <w:p>
-            <w:pPr>
-              <w:pStyle w:val="Compact"/>
-              <w:jc w:val="left"/>
-            </w:pPr>
-            <w:r>
-              <w:t xml:space="preserve">[ ]</w:t>
-            </w:r>
-          </w:p>
-        </w:tc>
-      </w:tr>
-      <w:tr>
-        <w:tc>
-          <w:tcPr/>
-          <w:p>
-            <w:pPr>
-              <w:pStyle w:val="Compact"/>
-              <w:jc w:val="left"/>
-            </w:pPr>
-            <w:r>
-              <w:t xml:space="preserve">12</w:t>
             </w:r>
           </w:p>
         </w:tc>
@@ -1930,32 +1868,94 @@
                 <w:bCs/>
                 <w:b/>
               </w:rPr>
-              <w:t xml:space="preserve">PHẦN III. AI AGENT TRONG VÒNG ĐỜI NHIỆM VỤ KHOA HỌC – 30′</w:t>
-            </w:r>
-          </w:p>
-        </w:tc>
-        <w:tc>
-          <w:tcPr/>
-          <w:p>
-            <w:pPr>
-              <w:pStyle w:val="Compact"/>
-            </w:pPr>
-          </w:p>
-        </w:tc>
-        <w:tc>
-          <w:tcPr/>
-          <w:p>
-            <w:pPr>
-              <w:pStyle w:val="Compact"/>
-            </w:pPr>
-          </w:p>
-        </w:tc>
-        <w:tc>
-          <w:tcPr/>
-          <w:p>
-            <w:pPr>
-              <w:pStyle w:val="Compact"/>
-            </w:pPr>
+              <w:t xml:space="preserve">PHẦN III. AI AGENT TRONG VÒNG ĐỜI NHIỆM VỤ KHOA HỌC – 34′</w:t>
+            </w:r>
+          </w:p>
+        </w:tc>
+        <w:tc>
+          <w:tcPr/>
+          <w:p>
+            <w:pPr>
+              <w:pStyle w:val="Compact"/>
+            </w:pPr>
+          </w:p>
+        </w:tc>
+        <w:tc>
+          <w:tcPr/>
+          <w:p>
+            <w:pPr>
+              <w:pStyle w:val="Compact"/>
+            </w:pPr>
+          </w:p>
+        </w:tc>
+        <w:tc>
+          <w:tcPr/>
+          <w:p>
+            <w:pPr>
+              <w:pStyle w:val="Compact"/>
+            </w:pPr>
+          </w:p>
+        </w:tc>
+      </w:tr>
+      <w:tr>
+        <w:tc>
+          <w:tcPr/>
+          <w:p>
+            <w:pPr>
+              <w:pStyle w:val="Compact"/>
+              <w:jc w:val="left"/>
+            </w:pPr>
+            <w:r>
+              <w:t xml:space="preserve">12</w:t>
+            </w:r>
+          </w:p>
+        </w:tc>
+        <w:tc>
+          <w:tcPr/>
+          <w:p>
+            <w:pPr>
+              <w:pStyle w:val="Compact"/>
+              <w:jc w:val="left"/>
+            </w:pPr>
+            <w:r>
+              <w:t xml:space="preserve">Tìm và lọc tài liệu bước đầu: Sci-Hub, Sci-Bot và các công cụ hỗ trợ</w:t>
+            </w:r>
+          </w:p>
+        </w:tc>
+        <w:tc>
+          <w:tcPr/>
+          <w:p>
+            <w:pPr>
+              <w:pStyle w:val="Compact"/>
+              <w:jc w:val="left"/>
+            </w:pPr>
+            <w:r>
+              <w:t xml:space="preserve">III</w:t>
+            </w:r>
+          </w:p>
+        </w:tc>
+        <w:tc>
+          <w:tcPr/>
+          <w:p>
+            <w:pPr>
+              <w:pStyle w:val="Compact"/>
+              <w:jc w:val="left"/>
+            </w:pPr>
+            <w:r>
+              <w:t xml:space="preserve">4′</w:t>
+            </w:r>
+          </w:p>
+        </w:tc>
+        <w:tc>
+          <w:tcPr/>
+          <w:p>
+            <w:pPr>
+              <w:pStyle w:val="Compact"/>
+              <w:jc w:val="left"/>
+            </w:pPr>
+            <w:r>
+              <w:t xml:space="preserve">[ ]</w:t>
+            </w:r>
           </w:p>
         </w:tc>
       </w:tr>
@@ -4634,7 +4634,7 @@
         <w:t xml:space="preserve"> </w:t>
       </w:r>
       <w:r>
-        <w:t xml:space="preserve">bảng đầy đủ 6 tính năng mới kèm mốc thời gian; bảng so sánh chatbot – AI Agent; ví dụ trong dự án ăn mòn: AI phát hiện lỗi đơn vị (Slide 10) nhưng cũng chọn sai cách tìm số đo bất thường (Slide 16).</w:t>
+        <w:t xml:space="preserve">bảng đầy đủ 6 tính năng mới kèm mốc thời gian; bảng so sánh chatbot – AI Agent; ví dụ trong dự án ăn mòn: AI phát hiện lỗi đơn vị (Slide 9) nhưng cũng chọn sai cách tìm số đo bất thường (Slide 16).</w:t>
       </w:r>
     </w:p>
     <w:p>
@@ -4979,13 +4979,13 @@
     </w:p>
     <w:bookmarkEnd w:id="28"/>
     <w:bookmarkEnd w:id="29"/>
-    <w:bookmarkStart w:id="38" w:name="Xa1d8ae570c6b4d8a7632d2cdd3fd6d3433745c3"/>
+    <w:bookmarkStart w:id="37" w:name="X3fa9c9c08ded9263de7af394aaca75d8733df7e"/>
     <w:p>
       <w:pPr>
         <w:pStyle w:val="Heading1"/>
       </w:pPr>
       <w:r>
-        <w:t xml:space="preserve">PHẦN II. LỰA CHỌN VÀ SỬ DỤNG CÔNG CỤ AI PHÙ HỢP (32 phút)</w:t>
+        <w:t xml:space="preserve">PHẦN II. LỰA CHỌN VÀ SỬ DỤNG CÔNG CỤ AI PHÙ HỢP (28 phút)</w:t>
       </w:r>
     </w:p>
     <w:p>
@@ -5003,7 +5003,7 @@
         <w:t xml:space="preserve"> </w:t>
       </w:r>
       <w:r>
-        <w:t xml:space="preserve">tên Phần II · Slide 5–12</w:t>
+        <w:t xml:space="preserve">tên Phần II · Slide 5–11</w:t>
       </w:r>
     </w:p>
     <w:p>
@@ -5892,13 +5892,13 @@
       </w:r>
     </w:p>
     <w:bookmarkEnd w:id="31"/>
-    <w:bookmarkStart w:id="32" w:name="Xb10632a10f9e5dff8ab90ff215e661c3c082af4"/>
+    <w:bookmarkStart w:id="32" w:name="Xd8bddb4a789b7c5b863ead1ea470b7a540e29cc"/>
     <w:p>
       <w:pPr>
         <w:pStyle w:val="Heading2"/>
       </w:pPr>
       <w:r>
-        <w:t xml:space="preserve">Slide 7 – Tìm và đọc tài liệu khoa học: Sci-Hub, Sci-Bot và các lựa chọn hợp pháp (4′) 🆕</w:t>
+        <w:t xml:space="preserve">Slide 7 – Giới thiệu Claude: mô hình, gói dịch vụ và tính năng nổi bật trên Windows (6′)</w:t>
       </w:r>
     </w:p>
     <w:p>
@@ -5911,6 +5911,102 @@
           <w:b/>
         </w:rPr>
         <w:t xml:space="preserve">Chữ trên slide:</w:t>
+      </w:r>
+      <w:r>
+        <w:t xml:space="preserve"> </w:t>
+      </w:r>
+      <w:r>
+        <w:t xml:space="preserve">-</w:t>
+      </w:r>
+      <w:r>
+        <w:t xml:space="preserve"> </w:t>
+      </w:r>
+      <w:r>
+        <w:rPr>
+          <w:bCs/>
+          <w:b/>
+        </w:rPr>
+        <w:t xml:space="preserve">Claude</w:t>
+      </w:r>
+      <w:r>
+        <w:t xml:space="preserve"> </w:t>
+      </w:r>
+      <w:r>
+        <w:t xml:space="preserve">– trợ lý AI của công ty Anthropic (Mỹ). Trên Windows:</w:t>
+      </w:r>
+      <w:r>
+        <w:t xml:space="preserve"> </w:t>
+      </w:r>
+      <w:r>
+        <w:rPr>
+          <w:bCs/>
+          <w:b/>
+        </w:rPr>
+        <w:t xml:space="preserve">trình duyệt (claude.ai)</w:t>
+      </w:r>
+      <w:r>
+        <w:t xml:space="preserve"> </w:t>
+      </w:r>
+      <w:r>
+        <w:t xml:space="preserve">hoặc</w:t>
+      </w:r>
+      <w:r>
+        <w:t xml:space="preserve"> </w:t>
+      </w:r>
+      <w:r>
+        <w:rPr>
+          <w:bCs/>
+          <w:b/>
+        </w:rPr>
+        <w:t xml:space="preserve">ứng dụng Claude cho Windows</w:t>
+      </w:r>
+      <w:r>
+        <w:t xml:space="preserve">; hội thoại, dự án đồng bộ giữa hai cách.</w:t>
+      </w:r>
+      <w:r>
+        <w:t xml:space="preserve"> </w:t>
+      </w:r>
+      <w:r>
+        <w:t xml:space="preserve">-</w:t>
+      </w:r>
+      <w:r>
+        <w:t xml:space="preserve"> </w:t>
+      </w:r>
+      <w:r>
+        <w:rPr>
+          <w:bCs/>
+          <w:b/>
+        </w:rPr>
+        <w:t xml:space="preserve">Bốn mô hình</w:t>
+      </w:r>
+      <w:r>
+        <w:t xml:space="preserve"> </w:t>
+      </w:r>
+      <w:r>
+        <w:rPr>
+          <w:iCs/>
+          <w:i/>
+        </w:rPr>
+        <w:t xml:space="preserve">(10/2026)</w:t>
+      </w:r>
+      <w:r>
+        <w:t xml:space="preserve">: Haiku 5.5 – nhanh, việc đơn giản · Sonnet 5.5 – công việc hằng ngày · Opus 5.5 – phân tích phức tạp (từ gói Pro) · Fable 5.1 – dự án lớn, làm việc dài hơi (từ gói Pro)</w:t>
+      </w:r>
+      <w:r>
+        <w:t xml:space="preserve"> </w:t>
+      </w:r>
+      <w:r>
+        <w:t xml:space="preserve">-</w:t>
+      </w:r>
+      <w:r>
+        <w:t xml:space="preserve"> </w:t>
+      </w:r>
+      <w:r>
+        <w:rPr>
+          <w:bCs/>
+          <w:b/>
+        </w:rPr>
+        <w:t xml:space="preserve">Năm tính năng dùng ngay:</w:t>
       </w:r>
     </w:p>
     <w:tbl>
@@ -5937,612 +6033,6 @@
               <w:jc w:val="left"/>
             </w:pPr>
             <w:r>
-              <w:t xml:space="preserve">Nhóm</w:t>
-            </w:r>
-          </w:p>
-        </w:tc>
-        <w:tc>
-          <w:tcPr/>
-          <w:p>
-            <w:pPr>
-              <w:pStyle w:val="Compact"/>
-              <w:jc w:val="left"/>
-            </w:pPr>
-            <w:r>
-              <w:t xml:space="preserve">Công cụ tiêu biểu</w:t>
-            </w:r>
-          </w:p>
-        </w:tc>
-        <w:tc>
-          <w:tcPr/>
-          <w:p>
-            <w:pPr>
-              <w:pStyle w:val="Compact"/>
-              <w:jc w:val="left"/>
-            </w:pPr>
-            <w:r>
-              <w:t xml:space="preserve">Lưu ý</w:t>
-            </w:r>
-          </w:p>
-        </w:tc>
-      </w:tr>
-      <w:tr>
-        <w:tc>
-          <w:tcPr/>
-          <w:p>
-            <w:pPr>
-              <w:pStyle w:val="Compact"/>
-              <w:jc w:val="left"/>
-            </w:pPr>
-            <w:r>
-              <w:t xml:space="preserve">⚠</w:t>
-            </w:r>
-            <w:r>
-              <w:t xml:space="preserve"> </w:t>
-            </w:r>
-            <w:r>
-              <w:rPr>
-                <w:bCs/>
-                <w:b/>
-              </w:rPr>
-              <w:t xml:space="preserve">Thư viện</w:t>
-            </w:r>
-            <w:r>
-              <w:rPr>
-                <w:bCs/>
-                <w:b/>
-              </w:rPr>
-              <w:t xml:space="preserve"> </w:t>
-            </w:r>
-            <w:r>
-              <w:rPr>
-                <w:bCs/>
-                <w:b/>
-              </w:rPr>
-              <w:t xml:space="preserve">“</w:t>
-            </w:r>
-            <w:r>
-              <w:rPr>
-                <w:bCs/>
-                <w:b/>
-              </w:rPr>
-              <w:t xml:space="preserve">bóng tối</w:t>
-            </w:r>
-            <w:r>
-              <w:rPr>
-                <w:bCs/>
-                <w:b/>
-              </w:rPr>
-              <w:t xml:space="preserve">”</w:t>
-            </w:r>
-          </w:p>
-        </w:tc>
-        <w:tc>
-          <w:tcPr/>
-          <w:p>
-            <w:pPr>
-              <w:pStyle w:val="Compact"/>
-              <w:jc w:val="left"/>
-            </w:pPr>
-            <w:r>
-              <w:rPr>
-                <w:bCs/>
-                <w:b/>
-              </w:rPr>
-              <w:t xml:space="preserve">Sci-Hub</w:t>
-            </w:r>
-            <w:r>
-              <w:t xml:space="preserve"> </w:t>
-            </w:r>
-            <w:r>
-              <w:t xml:space="preserve">– kho ~88 triệu bài báo, sách ·</w:t>
-            </w:r>
-            <w:r>
-              <w:t xml:space="preserve"> </w:t>
-            </w:r>
-            <w:r>
-              <w:rPr>
-                <w:bCs/>
-                <w:b/>
-              </w:rPr>
-              <w:t xml:space="preserve">Sci-Bot</w:t>
-            </w:r>
-            <w:r>
-              <w:t xml:space="preserve"> </w:t>
-            </w:r>
-            <w:r>
-              <w:t xml:space="preserve">(04/2026) – trợ lý AI hỏi – đáp trên kho Sci-Hub, bản thử nghiệm</w:t>
-            </w:r>
-          </w:p>
-        </w:tc>
-        <w:tc>
-          <w:tcPr/>
-          <w:p>
-            <w:pPr>
-              <w:pStyle w:val="Compact"/>
-              <w:jc w:val="left"/>
-            </w:pPr>
-            <w:r>
-              <w:t xml:space="preserve">Tòa án ở Mỹ, Nga (2018), Ấn Độ (2025) xác định vi phạm bản quyền, chặn truy cập; nhiều trang giả mạo – rủi ro mã độc; Sci-Bot thiếu bài mới (sau ~2021–2022), chỉ trả lời từng câu</w:t>
-            </w:r>
-          </w:p>
-        </w:tc>
-      </w:tr>
-      <w:tr>
-        <w:tc>
-          <w:tcPr/>
-          <w:p>
-            <w:pPr>
-              <w:pStyle w:val="Compact"/>
-              <w:jc w:val="left"/>
-            </w:pPr>
-            <w:r>
-              <w:t xml:space="preserve">✅</w:t>
-            </w:r>
-            <w:r>
-              <w:t xml:space="preserve"> </w:t>
-            </w:r>
-            <w:r>
-              <w:rPr>
-                <w:bCs/>
-                <w:b/>
-              </w:rPr>
-              <w:t xml:space="preserve">Toàn văn mở hợp pháp</w:t>
-            </w:r>
-          </w:p>
-        </w:tc>
-        <w:tc>
-          <w:tcPr/>
-          <w:p>
-            <w:pPr>
-              <w:pStyle w:val="Compact"/>
-              <w:jc w:val="left"/>
-            </w:pPr>
-            <w:r>
-              <w:t xml:space="preserve">Unpaywall (tiện ích trình duyệt) · CORE · arXiv · PubMed Central · DOAJ</w:t>
-            </w:r>
-          </w:p>
-        </w:tc>
-        <w:tc>
-          <w:tcPr/>
-          <w:p>
-            <w:pPr>
-              <w:pStyle w:val="Compact"/>
-              <w:jc w:val="left"/>
-            </w:pPr>
-            <w:r>
-              <w:t xml:space="preserve">Miễn phí; tìm bản tác giả đã tự lưu trữ hợp pháp</w:t>
-            </w:r>
-          </w:p>
-        </w:tc>
-      </w:tr>
-      <w:tr>
-        <w:tc>
-          <w:tcPr/>
-          <w:p>
-            <w:pPr>
-              <w:pStyle w:val="Compact"/>
-              <w:jc w:val="left"/>
-            </w:pPr>
-            <w:r>
-              <w:t xml:space="preserve">✅</w:t>
-            </w:r>
-            <w:r>
-              <w:t xml:space="preserve"> </w:t>
-            </w:r>
-            <w:r>
-              <w:rPr>
-                <w:bCs/>
-                <w:b/>
-              </w:rPr>
-              <w:t xml:space="preserve">Tìm kiếm có AI</w:t>
-            </w:r>
-          </w:p>
-        </w:tc>
-        <w:tc>
-          <w:tcPr/>
-          <w:p>
-            <w:pPr>
-              <w:pStyle w:val="Compact"/>
-              <w:jc w:val="left"/>
-            </w:pPr>
-            <w:r>
-              <w:t xml:space="preserve">Google Scholar Labs (11/2025) · Semantic Scholar · Elicit · Consensus · SciSpace · Undermind</w:t>
-            </w:r>
-          </w:p>
-        </w:tc>
-        <w:tc>
-          <w:tcPr/>
-          <w:p>
-            <w:pPr>
-              <w:pStyle w:val="Compact"/>
-              <w:jc w:val="left"/>
-            </w:pPr>
-            <w:r>
-              <w:t xml:space="preserve">Trả lời kèm bài báo dẫn chứng; vẫn phải đọc bản gốc</w:t>
-            </w:r>
-          </w:p>
-        </w:tc>
-      </w:tr>
-      <w:tr>
-        <w:tc>
-          <w:tcPr/>
-          <w:p>
-            <w:pPr>
-              <w:pStyle w:val="Compact"/>
-              <w:jc w:val="left"/>
-            </w:pPr>
-            <w:r>
-              <w:t xml:space="preserve">✅</w:t>
-            </w:r>
-            <w:r>
-              <w:t xml:space="preserve"> </w:t>
-            </w:r>
-            <w:r>
-              <w:rPr>
-                <w:bCs/>
-                <w:b/>
-              </w:rPr>
-              <w:t xml:space="preserve">Cơ sở dữ liệu thu phí</w:t>
-            </w:r>
-          </w:p>
-        </w:tc>
-        <w:tc>
-          <w:tcPr/>
-          <w:p>
-            <w:pPr>
-              <w:pStyle w:val="Compact"/>
-              <w:jc w:val="left"/>
-            </w:pPr>
-            <w:r>
-              <w:t xml:space="preserve">Scopus AI · Web of Science Research Assistant</w:t>
-            </w:r>
-          </w:p>
-        </w:tc>
-        <w:tc>
-          <w:tcPr/>
-          <w:p>
-            <w:pPr>
-              <w:pStyle w:val="Compact"/>
-              <w:jc w:val="left"/>
-            </w:pPr>
-            <w:r>
-              <w:t xml:space="preserve">Qua tài khoản thư viện, tổ chức</w:t>
-            </w:r>
-          </w:p>
-        </w:tc>
-      </w:tr>
-      <w:tr>
-        <w:tc>
-          <w:tcPr/>
-          <w:p>
-            <w:pPr>
-              <w:pStyle w:val="Compact"/>
-              <w:jc w:val="left"/>
-            </w:pPr>
-            <w:r>
-              <w:t xml:space="preserve">✅</w:t>
-            </w:r>
-            <w:r>
-              <w:t xml:space="preserve"> </w:t>
-            </w:r>
-            <w:r>
-              <w:rPr>
-                <w:bCs/>
-                <w:b/>
-              </w:rPr>
-              <w:t xml:space="preserve">Nguồn Việt – Nga</w:t>
-            </w:r>
-          </w:p>
-        </w:tc>
-        <w:tc>
-          <w:tcPr/>
-          <w:p>
-            <w:pPr>
-              <w:pStyle w:val="Compact"/>
-              <w:jc w:val="left"/>
-            </w:pPr>
-            <w:r>
-              <w:t xml:space="preserve">VJOL (tạp chí Việt Nam, miễn phí) · CyberLeninka (thư viện mở Nga) · eLIBRARY.ru (РИНЦ)</w:t>
-            </w:r>
-          </w:p>
-        </w:tc>
-        <w:tc>
-          <w:tcPr/>
-          <w:p>
-            <w:pPr>
-              <w:pStyle w:val="Compact"/>
-              <w:jc w:val="left"/>
-            </w:pPr>
-            <w:r>
-              <w:t xml:space="preserve">Tài liệu tiếng Việt, tiếng Nga – thế mạnh riêng của Trung tâm</w:t>
-            </w:r>
-          </w:p>
-        </w:tc>
-      </w:tr>
-    </w:tbl>
-    <w:p>
-      <w:pPr>
-        <w:pStyle w:val="BlockText"/>
-      </w:pPr>
-      <w:r>
-        <w:rPr>
-          <w:bCs/>
-          <w:b/>
-        </w:rPr>
-        <w:t xml:space="preserve">Khuyến nghị:</w:t>
-      </w:r>
-      <w:r>
-        <w:t xml:space="preserve"> </w:t>
-      </w:r>
-      <w:r>
-        <w:t xml:space="preserve">ưu tiên kênh hợp pháp → không có bản mở thì gửi thư xin bản PDF từ tác giả hoặc qua thư viện; tuân thủ quy định bản quyền và an toàn thông tin của đơn vị.</w:t>
-      </w:r>
-    </w:p>
-    <w:p>
-      <w:pPr>
-        <w:pStyle w:val="FirstParagraph"/>
-      </w:pPr>
-      <w:r>
-        <w:rPr>
-          <w:bCs/>
-          <w:b/>
-        </w:rPr>
-        <w:t xml:space="preserve">Hình ảnh:</w:t>
-      </w:r>
-      <w:r>
-        <w:t xml:space="preserve"> </w:t>
-      </w:r>
-      <w:r>
-        <w:t xml:space="preserve">ảnh chụp Unpaywall hiện nút</w:t>
-      </w:r>
-      <w:r>
-        <w:t xml:space="preserve"> </w:t>
-      </w:r>
-      <w:r>
-        <w:t xml:space="preserve">“</w:t>
-      </w:r>
-      <w:r>
-        <w:t xml:space="preserve">bản mở</w:t>
-      </w:r>
-      <w:r>
-        <w:t xml:space="preserve">”</w:t>
-      </w:r>
-      <w:r>
-        <w:t xml:space="preserve"> </w:t>
-      </w:r>
-      <w:r>
-        <w:t xml:space="preserve">cạnh bài báo; ảnh Google Scholar Labs trả lời một câu hỏi về ăn mòn khí quyển.</w:t>
-      </w:r>
-    </w:p>
-    <w:p>
-      <w:pPr>
-        <w:pStyle w:val="BodyText"/>
-      </w:pPr>
-      <w:r>
-        <w:rPr>
-          <w:bCs/>
-          <w:b/>
-        </w:rPr>
-        <w:t xml:space="preserve">Không chiếu (tài liệu phát tay):</w:t>
-      </w:r>
-      <w:r>
-        <w:t xml:space="preserve"> </w:t>
-      </w:r>
-      <w:r>
-        <w:t xml:space="preserve">mô tả, địa chỉ, cách dùng từng công cụ –</w:t>
-      </w:r>
-      <w:r>
-        <w:t xml:space="preserve"> </w:t>
-      </w:r>
-      <w:r>
-        <w:rPr>
-          <w:rStyle w:val="VerbatimChar"/>
-        </w:rPr>
-        <w:t xml:space="preserve">TAI-LIEU-PHAT-TAY.md</w:t>
-      </w:r>
-      <w:r>
-        <w:t xml:space="preserve"> </w:t>
-      </w:r>
-      <w:r>
-        <w:t xml:space="preserve">mục 11.</w:t>
-      </w:r>
-    </w:p>
-    <w:p>
-      <w:pPr>
-        <w:pStyle w:val="BodyText"/>
-      </w:pPr>
-      <w:r>
-        <w:rPr>
-          <w:bCs/>
-          <w:b/>
-        </w:rPr>
-        <w:t xml:space="preserve">Nguồn:</w:t>
-      </w:r>
-      <w:r>
-        <w:t xml:space="preserve"> </w:t>
-      </w:r>
-      <w:r>
-        <w:t xml:space="preserve">N33–N37</w:t>
-      </w:r>
-    </w:p>
-    <w:p>
-      <w:pPr>
-        <w:pStyle w:val="BodyText"/>
-      </w:pPr>
-      <w:r>
-        <w:rPr>
-          <w:bCs/>
-          <w:b/>
-        </w:rPr>
-        <w:t xml:space="preserve">Duyệt:</w:t>
-      </w:r>
-      <w:r>
-        <w:t xml:space="preserve"> </w:t>
-      </w:r>
-      <w:r>
-        <w:t xml:space="preserve">[ ] Duyệt · [ ] Sửa · [ ] Bỏ</w:t>
-      </w:r>
-      <w:r>
-        <w:t xml:space="preserve"> </w:t>
-      </w:r>
-      <w:r>
-        <w:rPr>
-          <w:bCs/>
-          <w:b/>
-        </w:rPr>
-        <w:t xml:space="preserve">Ghi chú:</w:t>
-      </w:r>
-    </w:p>
-    <w:p>
-      <w:r>
-        <w:pict>
-          <v:rect style="width:0;height:1.5pt" o:hralign="center" o:hrstd="t" o:hr="t"/>
-        </w:pict>
-      </w:r>
-    </w:p>
-    <w:bookmarkEnd w:id="32"/>
-    <w:bookmarkStart w:id="33" w:name="Xb9486dc6dbe54a3628df1c1b61a374d4c4f99a0"/>
-    <w:p>
-      <w:pPr>
-        <w:pStyle w:val="Heading2"/>
-      </w:pPr>
-      <w:r>
-        <w:t xml:space="preserve">Slide 8 – Giới thiệu Claude: mô hình, gói dịch vụ và tính năng nổi bật trên Windows (6′)</w:t>
-      </w:r>
-    </w:p>
-    <w:p>
-      <w:pPr>
-        <w:pStyle w:val="FirstParagraph"/>
-      </w:pPr>
-      <w:r>
-        <w:rPr>
-          <w:bCs/>
-          <w:b/>
-        </w:rPr>
-        <w:t xml:space="preserve">Chữ trên slide:</w:t>
-      </w:r>
-      <w:r>
-        <w:t xml:space="preserve"> </w:t>
-      </w:r>
-      <w:r>
-        <w:t xml:space="preserve">-</w:t>
-      </w:r>
-      <w:r>
-        <w:t xml:space="preserve"> </w:t>
-      </w:r>
-      <w:r>
-        <w:rPr>
-          <w:bCs/>
-          <w:b/>
-        </w:rPr>
-        <w:t xml:space="preserve">Claude</w:t>
-      </w:r>
-      <w:r>
-        <w:t xml:space="preserve"> </w:t>
-      </w:r>
-      <w:r>
-        <w:t xml:space="preserve">– trợ lý AI của công ty Anthropic (Mỹ). Trên Windows:</w:t>
-      </w:r>
-      <w:r>
-        <w:t xml:space="preserve"> </w:t>
-      </w:r>
-      <w:r>
-        <w:rPr>
-          <w:bCs/>
-          <w:b/>
-        </w:rPr>
-        <w:t xml:space="preserve">trình duyệt (claude.ai)</w:t>
-      </w:r>
-      <w:r>
-        <w:t xml:space="preserve"> </w:t>
-      </w:r>
-      <w:r>
-        <w:t xml:space="preserve">hoặc</w:t>
-      </w:r>
-      <w:r>
-        <w:t xml:space="preserve"> </w:t>
-      </w:r>
-      <w:r>
-        <w:rPr>
-          <w:bCs/>
-          <w:b/>
-        </w:rPr>
-        <w:t xml:space="preserve">ứng dụng Claude cho Windows</w:t>
-      </w:r>
-      <w:r>
-        <w:t xml:space="preserve">; hội thoại, dự án đồng bộ giữa hai cách.</w:t>
-      </w:r>
-      <w:r>
-        <w:t xml:space="preserve"> </w:t>
-      </w:r>
-      <w:r>
-        <w:t xml:space="preserve">-</w:t>
-      </w:r>
-      <w:r>
-        <w:t xml:space="preserve"> </w:t>
-      </w:r>
-      <w:r>
-        <w:rPr>
-          <w:bCs/>
-          <w:b/>
-        </w:rPr>
-        <w:t xml:space="preserve">Bốn mô hình</w:t>
-      </w:r>
-      <w:r>
-        <w:t xml:space="preserve"> </w:t>
-      </w:r>
-      <w:r>
-        <w:rPr>
-          <w:iCs/>
-          <w:i/>
-        </w:rPr>
-        <w:t xml:space="preserve">(10/2026)</w:t>
-      </w:r>
-      <w:r>
-        <w:t xml:space="preserve">: Haiku 5.5 – nhanh, việc đơn giản · Sonnet 5.5 – công việc hằng ngày · Opus 5.5 – phân tích phức tạp (từ gói Pro) · Fable 5.1 – dự án lớn, làm việc dài hơi (từ gói Pro)</w:t>
-      </w:r>
-      <w:r>
-        <w:t xml:space="preserve"> </w:t>
-      </w:r>
-      <w:r>
-        <w:t xml:space="preserve">-</w:t>
-      </w:r>
-      <w:r>
-        <w:t xml:space="preserve"> </w:t>
-      </w:r>
-      <w:r>
-        <w:rPr>
-          <w:bCs/>
-          <w:b/>
-        </w:rPr>
-        <w:t xml:space="preserve">Năm tính năng dùng ngay:</w:t>
-      </w:r>
-    </w:p>
-    <w:tbl>
-      <w:tblPr>
-        <w:tblStyle w:val="Table"/>
-        <w:tblW w:type="pct" w:w="5000"/>
-        <w:tblLook w:firstRow="1" w:lastRow="0" w:firstColumn="0" w:lastColumn="0" w:noHBand="0" w:noVBand="0" w:val="0020"/>
-        <w:jc w:val="start"/>
-      </w:tblPr>
-      <w:tblGrid>
-        <w:gridCol w:w="2640"/>
-        <w:gridCol w:w="2640"/>
-        <w:gridCol w:w="2640"/>
-      </w:tblGrid>
-      <w:tr>
-        <w:trPr>
-          <w:tblHeader w:val="true"/>
-        </w:trPr>
-        <w:tc>
-          <w:tcPr/>
-          <w:p>
-            <w:pPr>
-              <w:pStyle w:val="Compact"/>
-              <w:jc w:val="left"/>
-            </w:pPr>
-            <w:r>
               <w:t xml:space="preserve">Tính năng</w:t>
             </w:r>
           </w:p>
@@ -6903,14 +6393,14 @@
         </w:pict>
       </w:r>
     </w:p>
-    <w:bookmarkEnd w:id="33"/>
-    <w:bookmarkStart w:id="34" w:name="X804204e3a809e15549529c0e80355c3679ac91d"/>
+    <w:bookmarkEnd w:id="32"/>
+    <w:bookmarkStart w:id="33" w:name="Xc19f8b9f856b417cbb714306abb4969734bf5ab"/>
     <w:p>
       <w:pPr>
         <w:pStyle w:val="Heading2"/>
       </w:pPr>
       <w:r>
-        <w:t xml:space="preserve">Slide 9 – Bắt đầu với Claude: 6 bước đầu tiên và tổng hợp dữ liệu nhiều nguồn (5′)</w:t>
+        <w:t xml:space="preserve">Slide 8 – Bắt đầu với Claude: 6 bước đầu tiên và tổng hợp dữ liệu nhiều nguồn (5′)</w:t>
       </w:r>
     </w:p>
     <w:p>
@@ -7994,14 +7484,14 @@
         </w:pict>
       </w:r>
     </w:p>
-    <w:bookmarkEnd w:id="34"/>
-    <w:bookmarkStart w:id="35" w:name="X1b19ea63da5f2e53c9ddbb9fbe1a91d56194a43"/>
+    <w:bookmarkEnd w:id="33"/>
+    <w:bookmarkStart w:id="34" w:name="Xfdaf43517d6f9be2186ea73d4cc00c048639f0b"/>
     <w:p>
       <w:pPr>
         <w:pStyle w:val="Heading2"/>
       </w:pPr>
       <w:r>
-        <w:t xml:space="preserve">Slide 10 – Giao việc cho AI Agent: cách viết yêu cầu 5 bước (5′)</w:t>
+        <w:t xml:space="preserve">Slide 9 – Giao việc cho AI Agent: cách viết yêu cầu 5 bước (5′)</w:t>
       </w:r>
     </w:p>
     <w:p>
@@ -8362,14 +7852,14 @@
         </w:pict>
       </w:r>
     </w:p>
-    <w:bookmarkEnd w:id="35"/>
-    <w:bookmarkStart w:id="36" w:name="Xe353d48bd23a56d0a0c296f3202e80aff98e18e"/>
+    <w:bookmarkEnd w:id="34"/>
+    <w:bookmarkStart w:id="35" w:name="X0b923a1a013338280d796ef2440c703039fcd56"/>
     <w:p>
       <w:pPr>
         <w:pStyle w:val="Heading2"/>
       </w:pPr>
       <w:r>
-        <w:t xml:space="preserve">Slide 11 – Không gian làm việc nghiên cứu: mỗi nhiệm vụ một dự án (3′)</w:t>
+        <w:t xml:space="preserve">Slide 10 – Không gian làm việc nghiên cứu: mỗi nhiệm vụ một dự án (3′)</w:t>
       </w:r>
     </w:p>
     <w:p>
@@ -8397,7 +7887,7 @@
         <w:t xml:space="preserve"> </w:t>
       </w:r>
       <w:r>
-        <w:t xml:space="preserve">(cách tạo dự án: xem Slide 9)</w:t>
+        <w:t xml:space="preserve">(cách tạo dự án: xem Slide 8)</w:t>
       </w:r>
     </w:p>
     <w:tbl>
@@ -8826,14 +8316,14 @@
         </w:pict>
       </w:r>
     </w:p>
-    <w:bookmarkEnd w:id="36"/>
-    <w:bookmarkStart w:id="37" w:name="Xd43cf258a8a6f26e4e2ebfab4eeebf3b2928ae9"/>
+    <w:bookmarkEnd w:id="35"/>
+    <w:bookmarkStart w:id="36" w:name="X43a5ec71d5c68447a142ac51b2b6000d42e0f76"/>
     <w:p>
       <w:pPr>
         <w:pStyle w:val="Heading2"/>
       </w:pPr>
       <w:r>
-        <w:t xml:space="preserve">Slide 12 – Skill, Subagent và hệ thống nhiều Agent (2′) –</w:t>
+        <w:t xml:space="preserve">Slide 11 – Skill, Subagent và hệ thống nhiều Agent (2′) –</w:t>
       </w:r>
       <w:r>
         <w:t xml:space="preserve"> </w:t>
@@ -9044,15 +8534,15 @@
         </w:pict>
       </w:r>
     </w:p>
+    <w:bookmarkEnd w:id="36"/>
     <w:bookmarkEnd w:id="37"/>
-    <w:bookmarkEnd w:id="38"/>
-    <w:bookmarkStart w:id="46" w:name="X8f20a420af1379ad237599e2a76979ed8275dc8"/>
+    <w:bookmarkStart w:id="46" w:name="Xb76ac458eb2f403086516140cdc9f2a6c74effc"/>
     <w:p>
       <w:pPr>
         <w:pStyle w:val="Heading1"/>
       </w:pPr>
       <w:r>
-        <w:t xml:space="preserve">PHẦN III. AI AGENT TRONG VÒNG ĐỜI NHIỆM VỤ KHOA HỌC (30 phút)</w:t>
+        <w:t xml:space="preserve">PHẦN III. AI AGENT TRONG VÒNG ĐỜI NHIỆM VỤ KHOA HỌC (34 phút)</w:t>
       </w:r>
     </w:p>
     <w:p>
@@ -9070,7 +8560,7 @@
         <w:t xml:space="preserve"> </w:t>
       </w:r>
       <w:r>
-        <w:t xml:space="preserve">tên Phần III · Slide 13–19</w:t>
+        <w:t xml:space="preserve">tên Phần III · Slide 12–19</w:t>
       </w:r>
     </w:p>
     <w:p>
@@ -9136,13 +8626,13 @@
         </w:pict>
       </w:r>
     </w:p>
-    <w:bookmarkStart w:id="39" w:name="X86b8179ee4983cce1e74e4be426ed43bc51a863"/>
+    <w:bookmarkStart w:id="38" w:name="Xd85a41c55b25eb0738121b4f2eb487220bda3e4"/>
     <w:p>
       <w:pPr>
         <w:pStyle w:val="Heading2"/>
       </w:pPr>
       <w:r>
-        <w:t xml:space="preserve">Slide 13 – Tổng quan tài liệu: từ bài báo đến khoảng trống nghiên cứu (6′)</w:t>
+        <w:t xml:space="preserve">Slide 12 – Tìm và lọc tài liệu bước đầu: Sci-Hub, Sci-Bot và các công cụ hỗ trợ (4′)</w:t>
       </w:r>
     </w:p>
     <w:p>
@@ -9160,113 +8650,235 @@
         <w:t xml:space="preserve"> </w:t>
       </w:r>
       <w:r>
-        <w:t xml:space="preserve">-</w:t>
-      </w:r>
-      <w:r>
-        <w:t xml:space="preserve"> </w:t>
-      </w:r>
-      <w:r>
-        <w:rPr>
-          <w:bCs/>
-          <w:b/>
-        </w:rPr>
-        <w:t xml:space="preserve">Tình huống:</w:t>
-      </w:r>
-      <w:r>
-        <w:t xml:space="preserve"> </w:t>
-      </w:r>
-      <w:r>
-        <w:t xml:space="preserve">ăn mòn khí quyển của kim loại trong khí hậu nhiệt đới Việt Nam</w:t>
-      </w:r>
-      <w:r>
-        <w:t xml:space="preserve"> </w:t>
-      </w:r>
-      <w:r>
-        <w:t xml:space="preserve">- 🌍</w:t>
-      </w:r>
-      <w:r>
-        <w:t xml:space="preserve"> </w:t>
-      </w:r>
-      <w:r>
-        <w:rPr>
-          <w:bCs/>
-          <w:b/>
-        </w:rPr>
-        <w:t xml:space="preserve">Ví dụ thật:</w:t>
-      </w:r>
-      <w:r>
-        <w:t xml:space="preserve"> </w:t>
-      </w:r>
-      <w:r>
-        <w:t xml:space="preserve">AI co-scientist (Google) – nhiều trợ lý đề xuất, phản biện, xếp hạng giả thuyết</w:t>
-      </w:r>
-      <w:r>
-        <w:t xml:space="preserve"> </w:t>
-      </w:r>
-      <w:r>
-        <w:t xml:space="preserve">- 🧰</w:t>
-      </w:r>
-      <w:r>
-        <w:t xml:space="preserve"> </w:t>
-      </w:r>
-      <w:r>
-        <w:rPr>
-          <w:bCs/>
-          <w:b/>
-        </w:rPr>
-        <w:t xml:space="preserve">Công cụ tìm và đọc tài liệu</w:t>
-      </w:r>
-      <w:r>
-        <w:t xml:space="preserve"> </w:t>
-      </w:r>
-      <w:r>
-        <w:t xml:space="preserve">(xem Slide 7): Claude Research · Elicit (tổng quan hệ thống, trích xuất bảng) · Consensus (câu trả lời có dẫn chứng) · Semantic Scholar (miễn phí) · Scite (trích dẫn ủng hộ hay phản bác) · ResearchRabbit (bản đồ trích dẫn)</w:t>
-      </w:r>
-      <w:r>
-        <w:t xml:space="preserve"> </w:t>
-      </w:r>
-      <w:r>
-        <w:t xml:space="preserve">- ⌨</w:t>
-      </w:r>
-      <w:r>
-        <w:t xml:space="preserve"> </w:t>
-      </w:r>
-      <w:r>
-        <w:rPr>
-          <w:bCs/>
-          <w:b/>
-        </w:rPr>
-        <w:t xml:space="preserve">Câu lệnh:</w:t>
-      </w:r>
-      <w:r>
-        <w:t xml:space="preserve"> </w:t>
-      </w:r>
-      <w:r>
-        <w:t xml:space="preserve">&gt; Từ các bài báo trong dự án, lập ma trận bằng chứng (tác giả – năm, địa điểm, kim loại, thời gian phơi mẫu, biến môi trường, mô hình, kết luận, hạn chế). Chỉ ra điểm chưa thống nhất và 3 khoảng trống cho điều kiện Việt Nam, mỗi khoảng trống dẫn chứng ít nhất 2 bài.</w:t>
-      </w:r>
-      <w:r>
-        <w:t xml:space="preserve"> </w:t>
-      </w:r>
-      <w:r>
-        <w:t xml:space="preserve">- ✅</w:t>
-      </w:r>
-      <w:r>
-        <w:t xml:space="preserve"> </w:t>
-      </w:r>
-      <w:r>
-        <w:rPr>
-          <w:bCs/>
-          <w:b/>
-        </w:rPr>
-        <w:t xml:space="preserve">Nhà khoa học xác nhận:</w:t>
-      </w:r>
-      <w:r>
-        <w:t xml:space="preserve"> </w:t>
-      </w:r>
-      <w:r>
-        <w:t xml:space="preserve">nguồn có thật; khoảng trống có giá trị</w:t>
-      </w:r>
-    </w:p>
+        <w:t xml:space="preserve">quy trình 4 bước tìm – lọc tài liệu</w:t>
+      </w:r>
+    </w:p>
+    <w:tbl>
+      <w:tblPr>
+        <w:tblStyle w:val="Table"/>
+        <w:tblW w:type="pct" w:w="5000"/>
+        <w:tblLook w:firstRow="1" w:lastRow="0" w:firstColumn="0" w:lastColumn="0" w:noHBand="0" w:noVBand="0" w:val="0020"/>
+        <w:jc w:val="start"/>
+      </w:tblPr>
+      <w:tblGrid>
+        <w:gridCol w:w="2640"/>
+        <w:gridCol w:w="2640"/>
+        <w:gridCol w:w="2640"/>
+      </w:tblGrid>
+      <w:tr>
+        <w:trPr>
+          <w:tblHeader w:val="true"/>
+        </w:trPr>
+        <w:tc>
+          <w:tcPr/>
+          <w:p>
+            <w:pPr>
+              <w:pStyle w:val="Compact"/>
+              <w:jc w:val="left"/>
+            </w:pPr>
+            <w:r>
+              <w:t xml:space="preserve">Bước</w:t>
+            </w:r>
+          </w:p>
+        </w:tc>
+        <w:tc>
+          <w:tcPr/>
+          <w:p>
+            <w:pPr>
+              <w:pStyle w:val="Compact"/>
+              <w:jc w:val="left"/>
+            </w:pPr>
+            <w:r>
+              <w:t xml:space="preserve">Công cụ</w:t>
+            </w:r>
+          </w:p>
+        </w:tc>
+        <w:tc>
+          <w:tcPr/>
+          <w:p>
+            <w:pPr>
+              <w:pStyle w:val="Compact"/>
+              <w:jc w:val="left"/>
+            </w:pPr>
+            <w:r>
+              <w:t xml:space="preserve">Làm gì</w:t>
+            </w:r>
+          </w:p>
+        </w:tc>
+      </w:tr>
+      <w:tr>
+        <w:tc>
+          <w:tcPr/>
+          <w:p>
+            <w:pPr>
+              <w:pStyle w:val="Compact"/>
+              <w:jc w:val="left"/>
+            </w:pPr>
+            <w:r>
+              <w:t xml:space="preserve">1. Đặt câu hỏi, tìm bài ứng viên</w:t>
+            </w:r>
+          </w:p>
+        </w:tc>
+        <w:tc>
+          <w:tcPr/>
+          <w:p>
+            <w:pPr>
+              <w:pStyle w:val="Compact"/>
+              <w:jc w:val="left"/>
+            </w:pPr>
+            <w:r>
+              <w:rPr>
+                <w:bCs/>
+                <w:b/>
+              </w:rPr>
+              <w:t xml:space="preserve">Sci-Bot</w:t>
+            </w:r>
+            <w:r>
+              <w:t xml:space="preserve"> </w:t>
+            </w:r>
+            <w:r>
+              <w:t xml:space="preserve">(trợ lý AI trên kho Sci-Hub, 04/2026) · Google Scholar Labs · Semantic Scholar</w:t>
+            </w:r>
+          </w:p>
+        </w:tc>
+        <w:tc>
+          <w:tcPr/>
+          <w:p>
+            <w:pPr>
+              <w:pStyle w:val="Compact"/>
+              <w:jc w:val="left"/>
+            </w:pPr>
+            <w:r>
+              <w:t xml:space="preserve">Hỏi bằng tiếng Anh, nêu rõ đối tượng – điều kiện – yếu tố cần xét → câu trả lời tổng hợp kèm danh sách bài báo, DOI</w:t>
+            </w:r>
+          </w:p>
+        </w:tc>
+      </w:tr>
+      <w:tr>
+        <w:tc>
+          <w:tcPr/>
+          <w:p>
+            <w:pPr>
+              <w:pStyle w:val="Compact"/>
+              <w:jc w:val="left"/>
+            </w:pPr>
+            <w:r>
+              <w:t xml:space="preserve">2. Lọc theo tiêu đề, tóm tắt</w:t>
+            </w:r>
+          </w:p>
+        </w:tc>
+        <w:tc>
+          <w:tcPr/>
+          <w:p>
+            <w:pPr>
+              <w:pStyle w:val="Compact"/>
+              <w:jc w:val="left"/>
+            </w:pPr>
+            <w:r>
+              <w:t xml:space="preserve">Elicit · Consensus · Claude (dự án)</w:t>
+            </w:r>
+          </w:p>
+        </w:tc>
+        <w:tc>
+          <w:tcPr/>
+          <w:p>
+            <w:pPr>
+              <w:pStyle w:val="Compact"/>
+              <w:jc w:val="left"/>
+            </w:pPr>
+            <w:r>
+              <w:t xml:space="preserve">Áp tiêu chí đưa vào / loại ra → giữ 10–30 bài</w:t>
+            </w:r>
+          </w:p>
+        </w:tc>
+      </w:tr>
+      <w:tr>
+        <w:tc>
+          <w:tcPr/>
+          <w:p>
+            <w:pPr>
+              <w:pStyle w:val="Compact"/>
+              <w:jc w:val="left"/>
+            </w:pPr>
+            <w:r>
+              <w:t xml:space="preserve">3. Lấy toàn văn</w:t>
+            </w:r>
+          </w:p>
+        </w:tc>
+        <w:tc>
+          <w:tcPr/>
+          <w:p>
+            <w:pPr>
+              <w:pStyle w:val="Compact"/>
+              <w:jc w:val="left"/>
+            </w:pPr>
+            <w:r>
+              <w:rPr>
+                <w:bCs/>
+                <w:b/>
+              </w:rPr>
+              <w:t xml:space="preserve">Sci-Hub</w:t>
+            </w:r>
+            <w:r>
+              <w:t xml:space="preserve"> </w:t>
+            </w:r>
+            <w:r>
+              <w:t xml:space="preserve">(tra theo DOI hoặc tiêu đề) · Unpaywall · CORE · VJOL · CyberLeninka · eLIBRARY.ru</w:t>
+            </w:r>
+          </w:p>
+        </w:tc>
+        <w:tc>
+          <w:tcPr/>
+          <w:p>
+            <w:pPr>
+              <w:pStyle w:val="Compact"/>
+              <w:jc w:val="left"/>
+            </w:pPr>
+            <w:r>
+              <w:t xml:space="preserve">Tải PDF để đọc kỹ</w:t>
+            </w:r>
+          </w:p>
+        </w:tc>
+      </w:tr>
+      <w:tr>
+        <w:tc>
+          <w:tcPr/>
+          <w:p>
+            <w:pPr>
+              <w:pStyle w:val="Compact"/>
+              <w:jc w:val="left"/>
+            </w:pPr>
+            <w:r>
+              <w:t xml:space="preserve">4. Đưa vào dự án</w:t>
+            </w:r>
+          </w:p>
+        </w:tc>
+        <w:tc>
+          <w:tcPr/>
+          <w:p>
+            <w:pPr>
+              <w:pStyle w:val="Compact"/>
+              <w:jc w:val="left"/>
+            </w:pPr>
+            <w:r>
+              <w:t xml:space="preserve">Claude</w:t>
+            </w:r>
+          </w:p>
+        </w:tc>
+        <w:tc>
+          <w:tcPr/>
+          <w:p>
+            <w:pPr>
+              <w:pStyle w:val="Compact"/>
+              <w:jc w:val="left"/>
+            </w:pPr>
+            <w:r>
+              <w:t xml:space="preserve">Tải PDF vào dự án → lập ma trận bằng chứng (Slide 13)</w:t>
+            </w:r>
+          </w:p>
+        </w:tc>
+      </w:tr>
+    </w:tbl>
     <w:p>
       <w:pPr>
         <w:pStyle w:val="BodyText"/>
@@ -9276,7 +8888,7 @@
           <w:bCs/>
           <w:b/>
         </w:rPr>
-        <w:t xml:space="preserve">🆕 Khoảng trống gợi ý – có căn cứ từ phân tích dữ liệu thật</w:t>
+        <w:t xml:space="preserve">Câu hỏi mẫu cho Sci-Bot:</w:t>
       </w:r>
       <w:r>
         <w:t xml:space="preserve"> </w:t>
@@ -9286,44 +8898,47 @@
           <w:iCs/>
           <w:i/>
         </w:rPr>
-        <w:t xml:space="preserve">(đề xuất, nhà khoa học quyết định)</w:t>
-      </w:r>
-      <w:r>
-        <w:t xml:space="preserve">:</w:t>
-      </w:r>
-      <w:r>
-        <w:t xml:space="preserve"> </w:t>
-      </w:r>
-      <w:r>
-        <w:t xml:space="preserve">1. Mô hình quốc tế</w:t>
-      </w:r>
-      <w:r>
-        <w:t xml:space="preserve"> </w:t>
-      </w:r>
-      <w:r>
-        <w:rPr>
-          <w:bCs/>
-          <w:b/>
-        </w:rPr>
-        <w:t xml:space="preserve">đánh giá thấp ~31%</w:t>
-      </w:r>
-      <w:r>
-        <w:t xml:space="preserve"> </w:t>
-      </w:r>
-      <w:r>
-        <w:t xml:space="preserve">ăn mòn thép ở Việt Nam → cần hàm liều – đáp ứng hiệu chỉnh cho khí hậu nhiệt đới (thêm độ ẩm, mưa, chu kỳ khô – ướt).</w:t>
-      </w:r>
-      <w:r>
-        <w:t xml:space="preserve"> </w:t>
-      </w:r>
-      <w:r>
-        <w:t xml:space="preserve">2. Huế, Nha Trang ăn mòn cao dù clorua thấp → yếu tố chưa được giải thích.</w:t>
-      </w:r>
-      <w:r>
-        <w:t xml:space="preserve"> </w:t>
-      </w:r>
-      <w:r>
-        <w:t xml:space="preserve">3. Số liệu Việt Nam chủ yếu 1995–2005, chủ yếu thép cacbon năm đầu → thiếu dữ liệu dài hạn và cập nhật theo biến đổi khí hậu.</w:t>
+        <w:t xml:space="preserve">“</w:t>
+      </w:r>
+      <w:r>
+        <w:rPr>
+          <w:iCs/>
+          <w:i/>
+        </w:rPr>
+        <w:t xml:space="preserve">Which environmental factors control the first-year atmospheric corrosion rate of carbon steel in tropical climates, and how accurate is the ISO 9223 dose-response function there?</w:t>
+      </w:r>
+      <w:r>
+        <w:rPr>
+          <w:iCs/>
+          <w:i/>
+        </w:rPr>
+        <w:t xml:space="preserve">”</w:t>
+      </w:r>
+    </w:p>
+    <w:p>
+      <w:pPr>
+        <w:pStyle w:val="BlockText"/>
+      </w:pPr>
+      <w:r>
+        <w:t xml:space="preserve">Lưu ý khi dùng: Sci-Bot là bản thử nghiệm – mỗi lần một câu hỏi, thiếu bài mới (sau ~2021–2022) → bổ sung bài mới bằng Google Scholar Labs; kiểm tra DOI của mọi trích dẫn. Chỉ truy cập địa chỉ chính thức (nhiều trang giả mạo); không dùng trên máy có tài liệu mật.</w:t>
+      </w:r>
+    </w:p>
+    <w:p>
+      <w:pPr>
+        <w:pStyle w:val="FirstParagraph"/>
+      </w:pPr>
+      <w:r>
+        <w:rPr>
+          <w:bCs/>
+          <w:b/>
+        </w:rPr>
+        <w:t xml:space="preserve">Hình ảnh:</w:t>
+      </w:r>
+      <w:r>
+        <w:t xml:space="preserve"> </w:t>
+      </w:r>
+      <w:r>
+        <w:t xml:space="preserve">ảnh chụp Sci-Bot trả lời câu hỏi mẫu kèm danh sách bài; ảnh Sci-Hub tra một bài theo DOI; ảnh bảng lọc bài trên Claude.</w:t>
       </w:r>
     </w:p>
     <w:p>
@@ -9335,13 +8950,43 @@
           <w:bCs/>
           <w:b/>
         </w:rPr>
-        <w:t xml:space="preserve">Hình ảnh (thay bảng tài liệu):</w:t>
-      </w:r>
-      <w:r>
-        <w:t xml:space="preserve"> </w:t>
-      </w:r>
-      <w:r>
-        <w:t xml:space="preserve">ảnh chụp ma trận bằng chứng do AI lập và 3 khoảng trống có điểm phản biện.</w:t>
+        <w:t xml:space="preserve">Không chiếu (tài liệu phát tay):</w:t>
+      </w:r>
+      <w:r>
+        <w:t xml:space="preserve"> </w:t>
+      </w:r>
+      <w:r>
+        <w:t xml:space="preserve">hướng dẫn chi tiết từng công cụ –</w:t>
+      </w:r>
+      <w:r>
+        <w:t xml:space="preserve"> </w:t>
+      </w:r>
+      <w:r>
+        <w:rPr>
+          <w:rStyle w:val="VerbatimChar"/>
+        </w:rPr>
+        <w:t xml:space="preserve">TAI-LIEU-PHAT-TAY.md</w:t>
+      </w:r>
+      <w:r>
+        <w:t xml:space="preserve"> </w:t>
+      </w:r>
+      <w:r>
+        <w:t xml:space="preserve">mục 11; câu lệnh lọc tài liệu –</w:t>
+      </w:r>
+      <w:r>
+        <w:t xml:space="preserve"> </w:t>
+      </w:r>
+      <w:r>
+        <w:rPr>
+          <w:rStyle w:val="VerbatimChar"/>
+        </w:rPr>
+        <w:t xml:space="preserve">cau-lenh-demo.md</w:t>
+      </w:r>
+      <w:r>
+        <w:t xml:space="preserve"> </w:t>
+      </w:r>
+      <w:r>
+        <w:t xml:space="preserve">mục 14.</w:t>
       </w:r>
     </w:p>
     <w:p>
@@ -9353,58 +8998,13 @@
           <w:bCs/>
           <w:b/>
         </w:rPr>
-        <w:t xml:space="preserve">Không chiếu (tài liệu phát tay):</w:t>
-      </w:r>
-      <w:r>
-        <w:t xml:space="preserve"> </w:t>
-      </w:r>
-      <w:r>
-        <w:t xml:space="preserve">danh mục 8 tài liệu thật dùng cho demo –</w:t>
-      </w:r>
-      <w:r>
-        <w:t xml:space="preserve"> </w:t>
-      </w:r>
-      <w:r>
-        <w:rPr>
-          <w:rStyle w:val="VerbatimChar"/>
-        </w:rPr>
-        <w:t xml:space="preserve">TAI-LIEU-PHAT-TAY.md</w:t>
-      </w:r>
-      <w:r>
-        <w:t xml:space="preserve"> </w:t>
-      </w:r>
-      <w:r>
-        <w:t xml:space="preserve">mục 7; danh mục đầy đủ 13 tài liệu:</w:t>
-      </w:r>
-      <w:r>
-        <w:t xml:space="preserve"> </w:t>
-      </w:r>
-      <w:r>
-        <w:rPr>
-          <w:rStyle w:val="VerbatimChar"/>
-        </w:rPr>
-        <w:t xml:space="preserve">du-an-nghien-cuu/01-tong-quan-tai-lieu/DANH-MUC-TAI-LIEU.csv</w:t>
-      </w:r>
-      <w:r>
-        <w:t xml:space="preserve">.</w:t>
-      </w:r>
-    </w:p>
-    <w:p>
-      <w:pPr>
-        <w:pStyle w:val="BodyText"/>
-      </w:pPr>
-      <w:r>
-        <w:rPr>
-          <w:bCs/>
-          <w:b/>
-        </w:rPr>
         <w:t xml:space="preserve">Nguồn:</w:t>
       </w:r>
       <w:r>
         <w:t xml:space="preserve"> </w:t>
       </w:r>
       <w:r>
-        <w:t xml:space="preserve">G2 · N25 (công cụ tài liệu) · tài liệu 1–8 · Câu lệnh 1.1–1.3</w:t>
+        <w:t xml:space="preserve">N33, N35–N37</w:t>
       </w:r>
     </w:p>
     <w:p>
@@ -9442,14 +9042,14 @@
         </w:pict>
       </w:r>
     </w:p>
-    <w:bookmarkEnd w:id="39"/>
-    <w:bookmarkStart w:id="40" w:name="X8d7e78c22fb4cd32c248eb2d592e06664dd5bd7"/>
+    <w:bookmarkEnd w:id="38"/>
+    <w:bookmarkStart w:id="39" w:name="X86b8179ee4983cce1e74e4be426ed43bc51a863"/>
     <w:p>
       <w:pPr>
         <w:pStyle w:val="Heading2"/>
       </w:pPr>
       <w:r>
-        <w:t xml:space="preserve">Slide 14 – Đề xuất nhiệm vụ: từ khoảng trống đến phiếu đề xuất và thuyết minh – DEMO 1 (5′)</w:t>
+        <w:t xml:space="preserve">Slide 13 – Tổng quan tài liệu: từ bài báo đến khoảng trống nghiên cứu (6′)</w:t>
       </w:r>
     </w:p>
     <w:p>
@@ -9467,45 +9067,67 @@
         <w:t xml:space="preserve"> </w:t>
       </w:r>
       <w:r>
-        <w:t xml:space="preserve">- Khoảng trống → tính cấp thiết, mục tiêu, nội dung, phương pháp, sản phẩm</w:t>
-      </w:r>
-      <w:r>
-        <w:t xml:space="preserve"> </w:t>
-      </w:r>
-      <w:r>
-        <w:t xml:space="preserve">- 🎬</w:t>
-      </w:r>
-      <w:r>
-        <w:t xml:space="preserve"> </w:t>
-      </w:r>
-      <w:r>
-        <w:rPr>
-          <w:bCs/>
-          <w:b/>
-        </w:rPr>
-        <w:t xml:space="preserve">Kết quả demo đã chạy trước:</w:t>
-      </w:r>
-      <w:r>
-        <w:t xml:space="preserve"> </w:t>
-      </w:r>
-      <w:r>
-        <w:t xml:space="preserve">đưa</w:t>
-      </w:r>
-      <w:r>
-        <w:t xml:space="preserve"> </w:t>
-      </w:r>
-      <w:r>
-        <w:rPr>
-          <w:bCs/>
-          <w:b/>
-        </w:rPr>
-        <w:t xml:space="preserve">biểu mẫu thật của Trung tâm</w:t>
-      </w:r>
-      <w:r>
-        <w:t xml:space="preserve"> </w:t>
-      </w:r>
-      <w:r>
-        <w:t xml:space="preserve">(phiếu đề xuất, thuyết minh) vào dự án → AI điền theo khoảng trống đã chọn – trình chiếu ảnh biểu mẫu đã điền và bảng đối chiếu</w:t>
+        <w:t xml:space="preserve">-</w:t>
+      </w:r>
+      <w:r>
+        <w:t xml:space="preserve"> </w:t>
+      </w:r>
+      <w:r>
+        <w:rPr>
+          <w:bCs/>
+          <w:b/>
+        </w:rPr>
+        <w:t xml:space="preserve">Tình huống:</w:t>
+      </w:r>
+      <w:r>
+        <w:t xml:space="preserve"> </w:t>
+      </w:r>
+      <w:r>
+        <w:t xml:space="preserve">ăn mòn khí quyển của kim loại trong khí hậu nhiệt đới Việt Nam</w:t>
+      </w:r>
+      <w:r>
+        <w:t xml:space="preserve"> </w:t>
+      </w:r>
+      <w:r>
+        <w:t xml:space="preserve">- 🌍</w:t>
+      </w:r>
+      <w:r>
+        <w:t xml:space="preserve"> </w:t>
+      </w:r>
+      <w:r>
+        <w:rPr>
+          <w:bCs/>
+          <w:b/>
+        </w:rPr>
+        <w:t xml:space="preserve">Ví dụ thật:</w:t>
+      </w:r>
+      <w:r>
+        <w:t xml:space="preserve"> </w:t>
+      </w:r>
+      <w:r>
+        <w:t xml:space="preserve">AI co-scientist (Google) – nhiều trợ lý đề xuất, phản biện, xếp hạng giả thuyết</w:t>
+      </w:r>
+      <w:r>
+        <w:t xml:space="preserve"> </w:t>
+      </w:r>
+      <w:r>
+        <w:t xml:space="preserve">- 🧰</w:t>
+      </w:r>
+      <w:r>
+        <w:t xml:space="preserve"> </w:t>
+      </w:r>
+      <w:r>
+        <w:rPr>
+          <w:bCs/>
+          <w:b/>
+        </w:rPr>
+        <w:t xml:space="preserve">Tài liệu đầu vào:</w:t>
+      </w:r>
+      <w:r>
+        <w:t xml:space="preserve"> </w:t>
+      </w:r>
+      <w:r>
+        <w:t xml:space="preserve">các bài đã tìm, lọc ở Slide 12; công cụ hỗ trợ đọc: Claude Research · Elicit (tổng quan hệ thống, trích xuất bảng) · Consensus (câu trả lời có dẫn chứng) · Semantic Scholar (miễn phí) · Scite (trích dẫn ủng hộ hay phản bác) · ResearchRabbit (bản đồ trích dẫn)</w:t>
       </w:r>
       <w:r>
         <w:t xml:space="preserve"> </w:t>
@@ -9527,54 +9149,151 @@
         <w:t xml:space="preserve"> </w:t>
       </w:r>
       <w:r>
+        <w:t xml:space="preserve">&gt; Từ các bài báo trong dự án, lập ma trận bằng chứng (tác giả – năm, địa điểm, kim loại, thời gian phơi mẫu, biến môi trường, mô hình, kết luận, hạn chế). Chỉ ra điểm chưa thống nhất và 3 khoảng trống cho điều kiện Việt Nam, mỗi khoảng trống dẫn chứng ít nhất 2 bài.</w:t>
+      </w:r>
+      <w:r>
+        <w:t xml:space="preserve"> </w:t>
+      </w:r>
+      <w:r>
+        <w:t xml:space="preserve">- ✅</w:t>
+      </w:r>
+      <w:r>
+        <w:t xml:space="preserve"> </w:t>
+      </w:r>
+      <w:r>
+        <w:rPr>
+          <w:bCs/>
+          <w:b/>
+        </w:rPr>
+        <w:t xml:space="preserve">Nhà khoa học xác nhận:</w:t>
+      </w:r>
+      <w:r>
+        <w:t xml:space="preserve"> </w:t>
+      </w:r>
+      <w:r>
+        <w:t xml:space="preserve">nguồn có thật; khoảng trống có giá trị</w:t>
+      </w:r>
+    </w:p>
+    <w:p>
+      <w:pPr>
+        <w:pStyle w:val="BodyText"/>
+      </w:pPr>
+      <w:r>
+        <w:rPr>
+          <w:bCs/>
+          <w:b/>
+        </w:rPr>
+        <w:t xml:space="preserve">🆕 Khoảng trống gợi ý – có căn cứ từ phân tích dữ liệu thật</w:t>
+      </w:r>
+      <w:r>
+        <w:t xml:space="preserve"> </w:t>
+      </w:r>
+      <w:r>
+        <w:rPr>
+          <w:iCs/>
+          <w:i/>
+        </w:rPr>
+        <w:t xml:space="preserve">(đề xuất, nhà khoa học quyết định)</w:t>
+      </w:r>
+      <w:r>
+        <w:t xml:space="preserve">:</w:t>
+      </w:r>
+      <w:r>
+        <w:t xml:space="preserve"> </w:t>
+      </w:r>
+      <w:r>
+        <w:t xml:space="preserve">1. Mô hình quốc tế</w:t>
+      </w:r>
+      <w:r>
+        <w:t xml:space="preserve"> </w:t>
+      </w:r>
+      <w:r>
+        <w:rPr>
+          <w:bCs/>
+          <w:b/>
+        </w:rPr>
+        <w:t xml:space="preserve">đánh giá thấp ~31%</w:t>
+      </w:r>
+      <w:r>
+        <w:t xml:space="preserve"> </w:t>
+      </w:r>
+      <w:r>
+        <w:t xml:space="preserve">ăn mòn thép ở Việt Nam → cần hàm liều – đáp ứng hiệu chỉnh cho khí hậu nhiệt đới (thêm độ ẩm, mưa, chu kỳ khô – ướt).</w:t>
+      </w:r>
+      <w:r>
+        <w:t xml:space="preserve"> </w:t>
+      </w:r>
+      <w:r>
+        <w:t xml:space="preserve">2. Huế, Nha Trang ăn mòn cao dù clorua thấp → yếu tố chưa được giải thích.</w:t>
+      </w:r>
+      <w:r>
+        <w:t xml:space="preserve"> </w:t>
+      </w:r>
+      <w:r>
+        <w:t xml:space="preserve">3. Số liệu Việt Nam chủ yếu 1995–2005, chủ yếu thép cacbon năm đầu → thiếu dữ liệu dài hạn và cập nhật theo biến đổi khí hậu.</w:t>
+      </w:r>
+    </w:p>
+    <w:p>
+      <w:pPr>
+        <w:pStyle w:val="BodyText"/>
+      </w:pPr>
+      <w:r>
+        <w:rPr>
+          <w:bCs/>
+          <w:b/>
+        </w:rPr>
+        <w:t xml:space="preserve">Hình ảnh (thay bảng tài liệu):</w:t>
+      </w:r>
+      <w:r>
+        <w:t xml:space="preserve"> </w:t>
+      </w:r>
+      <w:r>
+        <w:t xml:space="preserve">ảnh chụp ma trận bằng chứng do AI lập và 3 khoảng trống có điểm phản biện.</w:t>
+      </w:r>
+    </w:p>
+    <w:p>
+      <w:pPr>
+        <w:pStyle w:val="BodyText"/>
+      </w:pPr>
+      <w:r>
+        <w:rPr>
+          <w:bCs/>
+          <w:b/>
+        </w:rPr>
+        <w:t xml:space="preserve">Không chiếu (tài liệu phát tay):</w:t>
+      </w:r>
+      <w:r>
+        <w:t xml:space="preserve"> </w:t>
+      </w:r>
+      <w:r>
+        <w:t xml:space="preserve">danh mục 8 tài liệu thật dùng cho demo –</w:t>
+      </w:r>
+      <w:r>
+        <w:t xml:space="preserve"> </w:t>
+      </w:r>
+      <w:r>
         <w:rPr>
           <w:rStyle w:val="VerbatimChar"/>
         </w:rPr>
-        <w:t xml:space="preserve">Đọc biểu mẫu [tên biểu mẫu] trong dự án. Liệt kê toàn bộ mục và yêu cầu của từng mục.   Điền nội dung cho khoảng trống số [1]: giữ nguyên số mục, tiêu đề, định dạng của mẫu;   mục nào thiếu thông tin ghi [CẦN BỔ SUNG: ...]; không tự đặt số liệu.   Sau đó lập bảng đối chiếu Mục tiêu → Nội dung → Phương pháp → Sản phẩm → Chỉ tiêu,   đánh dấu ⚠ chỗ không khớp. Xuất tệp .docx.</w:t>
-      </w:r>
-      <w:r>
-        <w:t xml:space="preserve"> </w:t>
-      </w:r>
-      <w:r>
-        <w:t xml:space="preserve">- 📊</w:t>
-      </w:r>
-      <w:r>
-        <w:t xml:space="preserve"> </w:t>
-      </w:r>
-      <w:r>
-        <w:rPr>
-          <w:bCs/>
-          <w:b/>
-        </w:rPr>
-        <w:t xml:space="preserve">Kết quả mong đợi:</w:t>
-      </w:r>
-      <w:r>
-        <w:t xml:space="preserve"> </w:t>
-      </w:r>
-      <w:r>
-        <w:t xml:space="preserve">biểu mẫu đã điền đúng cấu trúc; danh sách [CẦN BỔ SUNG]; bảng đối chiếu có dấu ⚠</w:t>
-      </w:r>
-      <w:r>
-        <w:t xml:space="preserve"> </w:t>
-      </w:r>
-      <w:r>
-        <w:t xml:space="preserve">- ✅</w:t>
-      </w:r>
-      <w:r>
-        <w:t xml:space="preserve"> </w:t>
-      </w:r>
-      <w:r>
-        <w:rPr>
-          <w:bCs/>
-          <w:b/>
-        </w:rPr>
-        <w:t xml:space="preserve">Nhà khoa học xác nhận:</w:t>
-      </w:r>
-      <w:r>
-        <w:t xml:space="preserve"> </w:t>
-      </w:r>
-      <w:r>
-        <w:t xml:space="preserve">tính mới, tính khả thi, chỉ tiêu</w:t>
+        <w:t xml:space="preserve">TAI-LIEU-PHAT-TAY.md</w:t>
+      </w:r>
+      <w:r>
+        <w:t xml:space="preserve"> </w:t>
+      </w:r>
+      <w:r>
+        <w:t xml:space="preserve">mục 7; danh mục đầy đủ 13 tài liệu:</w:t>
+      </w:r>
+      <w:r>
+        <w:t xml:space="preserve"> </w:t>
+      </w:r>
+      <w:r>
+        <w:rPr>
+          <w:rStyle w:val="VerbatimChar"/>
+        </w:rPr>
+        <w:t xml:space="preserve">du-an-nghien-cuu/01-tong-quan-tai-lieu/DANH-MUC-TAI-LIEU.csv</w:t>
+      </w:r>
+      <w:r>
+        <w:t xml:space="preserve">.</w:t>
       </w:r>
     </w:p>
     <w:p>
@@ -9586,65 +9305,13 @@
           <w:bCs/>
           <w:b/>
         </w:rPr>
-        <w:t xml:space="preserve">⚠ Dữ liệu khi chạy trước demo:</w:t>
-      </w:r>
-      <w:r>
-        <w:t xml:space="preserve"> </w:t>
-      </w:r>
-      <w:r>
-        <w:t xml:space="preserve">biểu mẫu trống = nhóm xanh;</w:t>
-      </w:r>
-      <w:r>
-        <w:t xml:space="preserve"> </w:t>
-      </w:r>
-      <w:r>
-        <w:rPr>
-          <w:bCs/>
-          <w:b/>
-        </w:rPr>
-        <w:t xml:space="preserve">nội dung đề xuất thật = nhóm vàng</w:t>
-      </w:r>
-      <w:r>
-        <w:t xml:space="preserve"> </w:t>
-      </w:r>
-      <w:r>
-        <w:t xml:space="preserve">→ chỉ dùng tài khoản gói tổ chức (không huấn luyện mô hình), hoặc dùng nội dung đề xuất giả định cho ảnh trình chiếu.</w:t>
-      </w:r>
-    </w:p>
-    <w:p>
-      <w:pPr>
-        <w:pStyle w:val="BodyText"/>
-      </w:pPr>
-      <w:r>
-        <w:rPr>
-          <w:bCs/>
-          <w:b/>
-        </w:rPr>
-        <w:t xml:space="preserve">Hình ảnh:</w:t>
-      </w:r>
-      <w:r>
-        <w:t xml:space="preserve"> </w:t>
-      </w:r>
-      <w:r>
-        <w:t xml:space="preserve">ảnh chụp bảng đối chiếu có dấu ⚠.</w:t>
-      </w:r>
-    </w:p>
-    <w:p>
-      <w:pPr>
-        <w:pStyle w:val="BodyText"/>
-      </w:pPr>
-      <w:r>
-        <w:rPr>
-          <w:bCs/>
-          <w:b/>
-        </w:rPr>
-        <w:t xml:space="preserve">Việc phải làm:</w:t>
-      </w:r>
-      <w:r>
-        <w:t xml:space="preserve"> </w:t>
-      </w:r>
-      <w:r>
-        <w:t xml:space="preserve">người trình bày gửi biểu mẫu của Trung tâm → chạy thử 2 lần, ghi hình lần chạy tốt nhất.</w:t>
+        <w:t xml:space="preserve">Nguồn:</w:t>
+      </w:r>
+      <w:r>
+        <w:t xml:space="preserve"> </w:t>
+      </w:r>
+      <w:r>
+        <w:t xml:space="preserve">G2 · N25 (công cụ tài liệu) · tài liệu 1–8 · Câu lệnh 1.1–1.3</w:t>
       </w:r>
     </w:p>
     <w:p>
@@ -9682,14 +9349,14 @@
         </w:pict>
       </w:r>
     </w:p>
-    <w:bookmarkEnd w:id="40"/>
-    <w:bookmarkStart w:id="41" w:name="X04139c6c9f22e69b4fed779d765a15c1fb6457c"/>
+    <w:bookmarkEnd w:id="39"/>
+    <w:bookmarkStart w:id="40" w:name="X8d7e78c22fb4cd32c248eb2d592e06664dd5bd7"/>
     <w:p>
       <w:pPr>
         <w:pStyle w:val="Heading2"/>
       </w:pPr>
       <w:r>
-        <w:t xml:space="preserve">Slide 15 – Hồ sơ nhiệm vụ: thuyết minh, tiến độ và kinh phí theo biểu mẫu Trung tâm (4′)</w:t>
+        <w:t xml:space="preserve">Slide 14 – Đề xuất nhiệm vụ: từ khoảng trống đến phiếu đề xuất và thuyết minh – DEMO 1 (5′)</w:t>
       </w:r>
     </w:p>
     <w:p>
@@ -9707,6 +9374,12 @@
         <w:t xml:space="preserve"> </w:t>
       </w:r>
       <w:r>
+        <w:t xml:space="preserve">- Khoảng trống → tính cấp thiết, mục tiêu, nội dung, phương pháp, sản phẩm</w:t>
+      </w:r>
+      <w:r>
+        <w:t xml:space="preserve"> </w:t>
+      </w:r>
+      <w:r>
         <w:t xml:space="preserve">- 🎬</w:t>
       </w:r>
       <w:r>
@@ -9723,7 +9396,23 @@
         <w:t xml:space="preserve"> </w:t>
       </w:r>
       <w:r>
-        <w:t xml:space="preserve">biểu mẫu thuyết minh – tiến độ – dự toán của Trung tâm được AI lập từ thuyết minh đã duyệt</w:t>
+        <w:t xml:space="preserve">đưa</w:t>
+      </w:r>
+      <w:r>
+        <w:t xml:space="preserve"> </w:t>
+      </w:r>
+      <w:r>
+        <w:rPr>
+          <w:bCs/>
+          <w:b/>
+        </w:rPr>
+        <w:t xml:space="preserve">biểu mẫu thật của Trung tâm</w:t>
+      </w:r>
+      <w:r>
+        <w:t xml:space="preserve"> </w:t>
+      </w:r>
+      <w:r>
+        <w:t xml:space="preserve">(phiếu đề xuất, thuyết minh) vào dự án → AI điền theo khoảng trống đã chọn – trình chiếu ảnh biểu mẫu đã điền và bảng đối chiếu</w:t>
       </w:r>
       <w:r>
         <w:t xml:space="preserve"> </w:t>
@@ -9748,7 +9437,7 @@
         <w:rPr>
           <w:rStyle w:val="VerbatimChar"/>
         </w:rPr>
-        <w:t xml:space="preserve">Từ thuyết minh đã duyệt, lập: (1) bảng nội dung công việc – sản phẩm – thời gian – người   thực hiện; (2) sơ đồ Gantt; (3) dự toán theo biểu mẫu [tên], dùng ĐÚNG đơn giá và định mức   tôi cung cấp, không tự đặt đơn giá; (4) kiểm tra logic trình tự và tổng kinh phí;   liệt kê bất hợp lý và đề xuất điều chỉnh. Xuất Word và Excel.</w:t>
+        <w:t xml:space="preserve">Đọc biểu mẫu [tên biểu mẫu] trong dự án. Liệt kê toàn bộ mục và yêu cầu của từng mục.   Điền nội dung cho khoảng trống số [1]: giữ nguyên số mục, tiêu đề, định dạng của mẫu;   mục nào thiếu thông tin ghi [CẦN BỔ SUNG: ...]; không tự đặt số liệu.   Sau đó lập bảng đối chiếu Mục tiêu → Nội dung → Phương pháp → Sản phẩm → Chỉ tiêu,   đánh dấu ⚠ chỗ không khớp. Xuất tệp .docx.</w:t>
       </w:r>
       <w:r>
         <w:t xml:space="preserve"> </w:t>
@@ -9764,35 +9453,13 @@
           <w:bCs/>
           <w:b/>
         </w:rPr>
-        <w:t xml:space="preserve">Minh họa phát hiện lỗi</w:t>
-      </w:r>
-      <w:r>
-        <w:t xml:space="preserve"> </w:t>
-      </w:r>
-      <w:r>
-        <w:t xml:space="preserve">(dữ liệu giả lập): AI tìm ra 3 bất hợp lý cài sẵn – thu mẫu trước khi lắp xong giá phơi mẫu; quan trắc khí tượng kết thúc trước mốc thu mẫu cuối; công bố trước khi mô hình xong</w:t>
-      </w:r>
-      <w:r>
-        <w:t xml:space="preserve"> </w:t>
-      </w:r>
-      <w:r>
-        <w:t xml:space="preserve">-</w:t>
-      </w:r>
-      <w:r>
-        <w:t xml:space="preserve"> </w:t>
-      </w:r>
-      <w:r>
-        <w:rPr>
-          <w:bCs/>
-          <w:b/>
-        </w:rPr>
-        <w:t xml:space="preserve">Căn cứ lập dự toán:</w:t>
-      </w:r>
-      <w:r>
-        <w:t xml:space="preserve"> </w:t>
-      </w:r>
-      <w:r>
-        <w:t xml:space="preserve">Thông tư 03/2023/TT-BTC (định mức tối đa cho nhiệm vụ KH&amp;CN dùng ngân sách nhà nước) và quy định riêng của Bộ Quốc phòng, Trung tâm</w:t>
+        <w:t xml:space="preserve">Kết quả mong đợi:</w:t>
+      </w:r>
+      <w:r>
+        <w:t xml:space="preserve"> </w:t>
+      </w:r>
+      <w:r>
+        <w:t xml:space="preserve">biểu mẫu đã điền đúng cấu trúc; danh sách [CẦN BỔ SUNG]; bảng đối chiếu có dấu ⚠</w:t>
       </w:r>
       <w:r>
         <w:t xml:space="preserve"> </w:t>
@@ -9808,13 +9475,13 @@
           <w:bCs/>
           <w:b/>
         </w:rPr>
-        <w:t xml:space="preserve">Xác nhận:</w:t>
-      </w:r>
-      <w:r>
-        <w:t xml:space="preserve"> </w:t>
-      </w:r>
-      <w:r>
-        <w:t xml:space="preserve">số liệu tài chính do cán bộ tài chính xác nhận</w:t>
+        <w:t xml:space="preserve">Nhà khoa học xác nhận:</w:t>
+      </w:r>
+      <w:r>
+        <w:t xml:space="preserve"> </w:t>
+      </w:r>
+      <w:r>
+        <w:t xml:space="preserve">tính mới, tính khả thi, chỉ tiêu</w:t>
       </w:r>
     </w:p>
     <w:p>
@@ -9826,25 +9493,47 @@
           <w:bCs/>
           <w:b/>
         </w:rPr>
+        <w:t xml:space="preserve">⚠ Dữ liệu khi chạy trước demo:</w:t>
+      </w:r>
+      <w:r>
+        <w:t xml:space="preserve"> </w:t>
+      </w:r>
+      <w:r>
+        <w:t xml:space="preserve">biểu mẫu trống = nhóm xanh;</w:t>
+      </w:r>
+      <w:r>
+        <w:t xml:space="preserve"> </w:t>
+      </w:r>
+      <w:r>
+        <w:rPr>
+          <w:bCs/>
+          <w:b/>
+        </w:rPr>
+        <w:t xml:space="preserve">nội dung đề xuất thật = nhóm vàng</w:t>
+      </w:r>
+      <w:r>
+        <w:t xml:space="preserve"> </w:t>
+      </w:r>
+      <w:r>
+        <w:t xml:space="preserve">→ chỉ dùng tài khoản gói tổ chức (không huấn luyện mô hình), hoặc dùng nội dung đề xuất giả định cho ảnh trình chiếu.</w:t>
+      </w:r>
+    </w:p>
+    <w:p>
+      <w:pPr>
+        <w:pStyle w:val="BodyText"/>
+      </w:pPr>
+      <w:r>
+        <w:rPr>
+          <w:bCs/>
+          <w:b/>
+        </w:rPr>
         <w:t xml:space="preserve">Hình ảnh:</w:t>
       </w:r>
       <w:r>
         <w:t xml:space="preserve"> </w:t>
       </w:r>
       <w:r>
-        <w:t xml:space="preserve">biểu mẫu đã điền;</w:t>
-      </w:r>
-      <w:r>
-        <w:t xml:space="preserve"> </w:t>
-      </w:r>
-      <w:r>
-        <w:rPr>
-          <w:rStyle w:val="VerbatimChar"/>
-        </w:rPr>
-        <w:t xml:space="preserve">thuyet-trinh/ket-qua-demo/gia-lap/so_do_gantt.png</w:t>
-      </w:r>
-      <w:r>
-        <w:t xml:space="preserve">.</w:t>
+        <w:t xml:space="preserve">ảnh chụp bảng đối chiếu có dấu ⚠.</w:t>
       </w:r>
     </w:p>
     <w:p>
@@ -9862,25 +9551,7 @@
         <w:t xml:space="preserve"> </w:t>
       </w:r>
       <w:r>
-        <w:t xml:space="preserve">người trình bày gửi biểu mẫu thuyết minh – tiến độ – dự toán; xác nhận văn bản định mức áp dụng trong Bộ Quốc phòng.</w:t>
-      </w:r>
-    </w:p>
-    <w:p>
-      <w:pPr>
-        <w:pStyle w:val="BodyText"/>
-      </w:pPr>
-      <w:r>
-        <w:rPr>
-          <w:bCs/>
-          <w:b/>
-        </w:rPr>
-        <w:t xml:space="preserve">Nguồn:</w:t>
-      </w:r>
-      <w:r>
-        <w:t xml:space="preserve"> </w:t>
-      </w:r>
-      <w:r>
-        <w:t xml:space="preserve">N26 (Thông tư 03/2023/TT-BTC)</w:t>
+        <w:t xml:space="preserve">người trình bày gửi biểu mẫu của Trung tâm → chạy thử 2 lần, ghi hình lần chạy tốt nhất.</w:t>
       </w:r>
     </w:p>
     <w:p>
@@ -9918,6 +9589,242 @@
         </w:pict>
       </w:r>
     </w:p>
+    <w:bookmarkEnd w:id="40"/>
+    <w:bookmarkStart w:id="41" w:name="X04139c6c9f22e69b4fed779d765a15c1fb6457c"/>
+    <w:p>
+      <w:pPr>
+        <w:pStyle w:val="Heading2"/>
+      </w:pPr>
+      <w:r>
+        <w:t xml:space="preserve">Slide 15 – Hồ sơ nhiệm vụ: thuyết minh, tiến độ và kinh phí theo biểu mẫu Trung tâm (4′)</w:t>
+      </w:r>
+    </w:p>
+    <w:p>
+      <w:pPr>
+        <w:pStyle w:val="FirstParagraph"/>
+      </w:pPr>
+      <w:r>
+        <w:rPr>
+          <w:bCs/>
+          <w:b/>
+        </w:rPr>
+        <w:t xml:space="preserve">Chữ trên slide:</w:t>
+      </w:r>
+      <w:r>
+        <w:t xml:space="preserve"> </w:t>
+      </w:r>
+      <w:r>
+        <w:t xml:space="preserve">- 🎬</w:t>
+      </w:r>
+      <w:r>
+        <w:t xml:space="preserve"> </w:t>
+      </w:r>
+      <w:r>
+        <w:rPr>
+          <w:bCs/>
+          <w:b/>
+        </w:rPr>
+        <w:t xml:space="preserve">Kết quả demo đã chạy trước:</w:t>
+      </w:r>
+      <w:r>
+        <w:t xml:space="preserve"> </w:t>
+      </w:r>
+      <w:r>
+        <w:t xml:space="preserve">biểu mẫu thuyết minh – tiến độ – dự toán của Trung tâm được AI lập từ thuyết minh đã duyệt</w:t>
+      </w:r>
+      <w:r>
+        <w:t xml:space="preserve"> </w:t>
+      </w:r>
+      <w:r>
+        <w:t xml:space="preserve">- ⌨</w:t>
+      </w:r>
+      <w:r>
+        <w:t xml:space="preserve"> </w:t>
+      </w:r>
+      <w:r>
+        <w:rPr>
+          <w:bCs/>
+          <w:b/>
+        </w:rPr>
+        <w:t xml:space="preserve">Câu lệnh:</w:t>
+      </w:r>
+      <w:r>
+        <w:t xml:space="preserve"> </w:t>
+      </w:r>
+      <w:r>
+        <w:rPr>
+          <w:rStyle w:val="VerbatimChar"/>
+        </w:rPr>
+        <w:t xml:space="preserve">Từ thuyết minh đã duyệt, lập: (1) bảng nội dung công việc – sản phẩm – thời gian – người   thực hiện; (2) sơ đồ Gantt; (3) dự toán theo biểu mẫu [tên], dùng ĐÚNG đơn giá và định mức   tôi cung cấp, không tự đặt đơn giá; (4) kiểm tra logic trình tự và tổng kinh phí;   liệt kê bất hợp lý và đề xuất điều chỉnh. Xuất Word và Excel.</w:t>
+      </w:r>
+      <w:r>
+        <w:t xml:space="preserve"> </w:t>
+      </w:r>
+      <w:r>
+        <w:t xml:space="preserve">- 📊</w:t>
+      </w:r>
+      <w:r>
+        <w:t xml:space="preserve"> </w:t>
+      </w:r>
+      <w:r>
+        <w:rPr>
+          <w:bCs/>
+          <w:b/>
+        </w:rPr>
+        <w:t xml:space="preserve">Minh họa phát hiện lỗi</w:t>
+      </w:r>
+      <w:r>
+        <w:t xml:space="preserve"> </w:t>
+      </w:r>
+      <w:r>
+        <w:t xml:space="preserve">(dữ liệu giả lập): AI tìm ra 3 bất hợp lý cài sẵn – thu mẫu trước khi lắp xong giá phơi mẫu; quan trắc khí tượng kết thúc trước mốc thu mẫu cuối; công bố trước khi mô hình xong</w:t>
+      </w:r>
+      <w:r>
+        <w:t xml:space="preserve"> </w:t>
+      </w:r>
+      <w:r>
+        <w:t xml:space="preserve">-</w:t>
+      </w:r>
+      <w:r>
+        <w:t xml:space="preserve"> </w:t>
+      </w:r>
+      <w:r>
+        <w:rPr>
+          <w:bCs/>
+          <w:b/>
+        </w:rPr>
+        <w:t xml:space="preserve">Căn cứ lập dự toán:</w:t>
+      </w:r>
+      <w:r>
+        <w:t xml:space="preserve"> </w:t>
+      </w:r>
+      <w:r>
+        <w:t xml:space="preserve">Thông tư 03/2023/TT-BTC (định mức tối đa cho nhiệm vụ KH&amp;CN dùng ngân sách nhà nước) và quy định riêng của Bộ Quốc phòng, Trung tâm</w:t>
+      </w:r>
+      <w:r>
+        <w:t xml:space="preserve"> </w:t>
+      </w:r>
+      <w:r>
+        <w:t xml:space="preserve">- ✅</w:t>
+      </w:r>
+      <w:r>
+        <w:t xml:space="preserve"> </w:t>
+      </w:r>
+      <w:r>
+        <w:rPr>
+          <w:bCs/>
+          <w:b/>
+        </w:rPr>
+        <w:t xml:space="preserve">Xác nhận:</w:t>
+      </w:r>
+      <w:r>
+        <w:t xml:space="preserve"> </w:t>
+      </w:r>
+      <w:r>
+        <w:t xml:space="preserve">số liệu tài chính do cán bộ tài chính xác nhận</w:t>
+      </w:r>
+    </w:p>
+    <w:p>
+      <w:pPr>
+        <w:pStyle w:val="BodyText"/>
+      </w:pPr>
+      <w:r>
+        <w:rPr>
+          <w:bCs/>
+          <w:b/>
+        </w:rPr>
+        <w:t xml:space="preserve">Hình ảnh:</w:t>
+      </w:r>
+      <w:r>
+        <w:t xml:space="preserve"> </w:t>
+      </w:r>
+      <w:r>
+        <w:t xml:space="preserve">biểu mẫu đã điền;</w:t>
+      </w:r>
+      <w:r>
+        <w:t xml:space="preserve"> </w:t>
+      </w:r>
+      <w:r>
+        <w:rPr>
+          <w:rStyle w:val="VerbatimChar"/>
+        </w:rPr>
+        <w:t xml:space="preserve">thuyet-trinh/ket-qua-demo/gia-lap/so_do_gantt.png</w:t>
+      </w:r>
+      <w:r>
+        <w:t xml:space="preserve">.</w:t>
+      </w:r>
+    </w:p>
+    <w:p>
+      <w:pPr>
+        <w:pStyle w:val="BodyText"/>
+      </w:pPr>
+      <w:r>
+        <w:rPr>
+          <w:bCs/>
+          <w:b/>
+        </w:rPr>
+        <w:t xml:space="preserve">Việc phải làm:</w:t>
+      </w:r>
+      <w:r>
+        <w:t xml:space="preserve"> </w:t>
+      </w:r>
+      <w:r>
+        <w:t xml:space="preserve">người trình bày gửi biểu mẫu thuyết minh – tiến độ – dự toán; xác nhận văn bản định mức áp dụng trong Bộ Quốc phòng.</w:t>
+      </w:r>
+    </w:p>
+    <w:p>
+      <w:pPr>
+        <w:pStyle w:val="BodyText"/>
+      </w:pPr>
+      <w:r>
+        <w:rPr>
+          <w:bCs/>
+          <w:b/>
+        </w:rPr>
+        <w:t xml:space="preserve">Nguồn:</w:t>
+      </w:r>
+      <w:r>
+        <w:t xml:space="preserve"> </w:t>
+      </w:r>
+      <w:r>
+        <w:t xml:space="preserve">N26 (Thông tư 03/2023/TT-BTC)</w:t>
+      </w:r>
+    </w:p>
+    <w:p>
+      <w:pPr>
+        <w:pStyle w:val="BodyText"/>
+      </w:pPr>
+      <w:r>
+        <w:rPr>
+          <w:bCs/>
+          <w:b/>
+        </w:rPr>
+        <w:t xml:space="preserve">Duyệt:</w:t>
+      </w:r>
+      <w:r>
+        <w:t xml:space="preserve"> </w:t>
+      </w:r>
+      <w:r>
+        <w:t xml:space="preserve">[ ] Duyệt · [ ] Sửa · [ ] Bỏ</w:t>
+      </w:r>
+      <w:r>
+        <w:t xml:space="preserve"> </w:t>
+      </w:r>
+      <w:r>
+        <w:rPr>
+          <w:bCs/>
+          <w:b/>
+        </w:rPr>
+        <w:t xml:space="preserve">Ghi chú:</w:t>
+      </w:r>
+    </w:p>
+    <w:p>
+      <w:r>
+        <w:pict>
+          <v:rect style="width:0;height:1.5pt" o:hralign="center" o:hrstd="t" o:hr="t"/>
+        </w:pict>
+      </w:r>
+    </w:p>
     <w:bookmarkEnd w:id="41"/>
     <w:bookmarkStart w:id="42" w:name="Xae2fbca96bcb46ff2b706302da1d5a4147a88ee"/>
     <w:p>
@@ -10073,7 +9980,7 @@
         <w:t xml:space="preserve"> </w:t>
       </w:r>
       <w:r>
-        <w:t xml:space="preserve">- Dữ liệu thật (387 số đo): kết quả chính đã nêu ở Slide 10; mô hình 3D ở Slide 17</w:t>
+        <w:t xml:space="preserve">- Dữ liệu thật (387 số đo): kết quả chính đã nêu ở Slide 9; mô hình 3D ở Slide 17</w:t>
       </w:r>
       <w:r>
         <w:t xml:space="preserve"> </w:t>

</xml_diff>

<commit_message>
Phụ lục định hướng theo bản sửa của người trình bày; hướng dẫn Sci-Hub, Sci-Bot ở bước tìm – lọc tài liệu (#12)
- Áp dụng chỉnh sửa trong tệp Word: công cụ tìm tài liệu chuyển sang Phần III; bỏ câu cảnh báo Sci-Hub, câu về số liệu tài chính
- Slide tìm và lọc tài liệu thành bước đầu Phần III (Slide 12): quy trình 4 bước với Sci-Bot, Sci-Hub; đánh số lại Slide 7–11; Phần II 28′, Phần III 34′
- Lược bỏ phần thừa trong phụ lục (kết quả cần đạt, hình thức trình bày, tài liệu kèm theo; gộp yêu cầu, công tác chuẩn bị)
- Tài liệu phát tay mục 11, câu lệnh mục 14


Claude-Session: https://claude.ai/code/session_01JoSsghLRHTtvcNzYXbKpzE

Co-authored-by: Claude <noreply@anthropic.com>
</commit_message>
<xml_diff>
--- a/thuyet-trinh/DANH-SACH-SLIDE-v2.5.docx
+++ b/thuyet-trinh/DANH-SACH-SLIDE-v2.5.docx
@@ -197,7 +197,7 @@
         <w:t xml:space="preserve"> </w:t>
       </w:r>
       <w:r>
-        <w:t xml:space="preserve">Slide 7 – công cụ tìm và đọc tài liệu (Sci-Hub, Sci-Bot và lựa chọn hợp pháp); từ Slide 7 cũ trở đi số slide cộng 1; thảo luận 12′.</w:t>
+        <w:t xml:space="preserve">Slide 12 – công cụ tìm và đọc tài liệu (Sci-Hub, Sci-Bot và lựa chọn hợp pháp); từ Slide 12 cũ trở đi số slide cộng 1; thảo luận 12′.</w:t>
       </w:r>
       <w:r>
         <w:t xml:space="preserve"> </w:t>
@@ -534,7 +534,7 @@
               <w:jc w:val="left"/>
             </w:pPr>
             <w:r>
-              <w:t xml:space="preserve">9, 14, 15, 16, 17, 22</w:t>
+              <w:t xml:space="preserve">8, 14, 15, 16, 17, 22</w:t>
             </w:r>
           </w:p>
         </w:tc>
@@ -786,7 +786,7 @@
               <w:jc w:val="left"/>
             </w:pPr>
             <w:r>
-              <w:t xml:space="preserve">1, 3, 8</w:t>
+              <w:t xml:space="preserve">1, 3, 7</w:t>
             </w:r>
           </w:p>
         </w:tc>
@@ -1384,7 +1384,7 @@
                 <w:bCs/>
                 <w:b/>
               </w:rPr>
-              <w:t xml:space="preserve">PHẦN II. LỰA CHỌN VÀ SỬ DỤNG CÔNG CỤ AI PHÙ HỢP – 32′</w:t>
+              <w:t xml:space="preserve">PHẦN II. LỰA CHỌN VÀ SỬ DỤNG CÔNG CỤ AI PHÙ HỢP – 28′</w:t>
             </w:r>
           </w:p>
         </w:tc>
@@ -1558,7 +1558,7 @@
               <w:jc w:val="left"/>
             </w:pPr>
             <w:r>
-              <w:t xml:space="preserve">🆕 Tìm và đọc tài liệu khoa học: Sci-Hub, Sci-Bot và các lựa chọn hợp pháp</w:t>
+              <w:t xml:space="preserve">Giới thiệu Claude: mô hình, gói dịch vụ và tính năng nổi bật trên Windows</w:t>
             </w:r>
           </w:p>
         </w:tc>
@@ -1582,7 +1582,7 @@
               <w:jc w:val="left"/>
             </w:pPr>
             <w:r>
-              <w:t xml:space="preserve">4′</w:t>
+              <w:t xml:space="preserve">6′</w:t>
             </w:r>
           </w:p>
         </w:tc>
@@ -1620,7 +1620,7 @@
               <w:jc w:val="left"/>
             </w:pPr>
             <w:r>
-              <w:t xml:space="preserve">Giới thiệu Claude: mô hình, gói dịch vụ và tính năng nổi bật trên Windows</w:t>
+              <w:t xml:space="preserve">Bắt đầu với Claude: 6 bước đầu tiên và tổng hợp dữ liệu nhiều nguồn</w:t>
             </w:r>
           </w:p>
         </w:tc>
@@ -1644,7 +1644,7 @@
               <w:jc w:val="left"/>
             </w:pPr>
             <w:r>
-              <w:t xml:space="preserve">6′</w:t>
+              <w:t xml:space="preserve">5′</w:t>
             </w:r>
           </w:p>
         </w:tc>
@@ -1682,7 +1682,7 @@
               <w:jc w:val="left"/>
             </w:pPr>
             <w:r>
-              <w:t xml:space="preserve">Bắt đầu với Claude: 6 bước đầu tiên và tổng hợp dữ liệu nhiều nguồn</w:t>
+              <w:t xml:space="preserve">Giao việc cho AI Agent: cách viết yêu cầu 5 bước</w:t>
             </w:r>
           </w:p>
         </w:tc>
@@ -1744,7 +1744,7 @@
               <w:jc w:val="left"/>
             </w:pPr>
             <w:r>
-              <w:t xml:space="preserve">Giao việc cho AI Agent: cách viết yêu cầu 5 bước</w:t>
+              <w:t xml:space="preserve">Không gian làm việc nghiên cứu: mỗi nhiệm vụ một dự án</w:t>
             </w:r>
           </w:p>
         </w:tc>
@@ -1768,7 +1768,7 @@
               <w:jc w:val="left"/>
             </w:pPr>
             <w:r>
-              <w:t xml:space="preserve">5′</w:t>
+              <w:t xml:space="preserve">3′</w:t>
             </w:r>
           </w:p>
         </w:tc>
@@ -1795,68 +1795,6 @@
             </w:pPr>
             <w:r>
               <w:t xml:space="preserve">11</w:t>
-            </w:r>
-          </w:p>
-        </w:tc>
-        <w:tc>
-          <w:tcPr/>
-          <w:p>
-            <w:pPr>
-              <w:pStyle w:val="Compact"/>
-              <w:jc w:val="left"/>
-            </w:pPr>
-            <w:r>
-              <w:t xml:space="preserve">Không gian làm việc nghiên cứu: mỗi nhiệm vụ một dự án</w:t>
-            </w:r>
-          </w:p>
-        </w:tc>
-        <w:tc>
-          <w:tcPr/>
-          <w:p>
-            <w:pPr>
-              <w:pStyle w:val="Compact"/>
-              <w:jc w:val="left"/>
-            </w:pPr>
-            <w:r>
-              <w:t xml:space="preserve">II</w:t>
-            </w:r>
-          </w:p>
-        </w:tc>
-        <w:tc>
-          <w:tcPr/>
-          <w:p>
-            <w:pPr>
-              <w:pStyle w:val="Compact"/>
-              <w:jc w:val="left"/>
-            </w:pPr>
-            <w:r>
-              <w:t xml:space="preserve">3′</w:t>
-            </w:r>
-          </w:p>
-        </w:tc>
-        <w:tc>
-          <w:tcPr/>
-          <w:p>
-            <w:pPr>
-              <w:pStyle w:val="Compact"/>
-              <w:jc w:val="left"/>
-            </w:pPr>
-            <w:r>
-              <w:t xml:space="preserve">[ ]</w:t>
-            </w:r>
-          </w:p>
-        </w:tc>
-      </w:tr>
-      <w:tr>
-        <w:tc>
-          <w:tcPr/>
-          <w:p>
-            <w:pPr>
-              <w:pStyle w:val="Compact"/>
-              <w:jc w:val="left"/>
-            </w:pPr>
-            <w:r>
-              <w:t xml:space="preserve">12</w:t>
             </w:r>
           </w:p>
         </w:tc>
@@ -1930,32 +1868,94 @@
                 <w:bCs/>
                 <w:b/>
               </w:rPr>
-              <w:t xml:space="preserve">PHẦN III. AI AGENT TRONG VÒNG ĐỜI NHIỆM VỤ KHOA HỌC – 30′</w:t>
-            </w:r>
-          </w:p>
-        </w:tc>
-        <w:tc>
-          <w:tcPr/>
-          <w:p>
-            <w:pPr>
-              <w:pStyle w:val="Compact"/>
-            </w:pPr>
-          </w:p>
-        </w:tc>
-        <w:tc>
-          <w:tcPr/>
-          <w:p>
-            <w:pPr>
-              <w:pStyle w:val="Compact"/>
-            </w:pPr>
-          </w:p>
-        </w:tc>
-        <w:tc>
-          <w:tcPr/>
-          <w:p>
-            <w:pPr>
-              <w:pStyle w:val="Compact"/>
-            </w:pPr>
+              <w:t xml:space="preserve">PHẦN III. AI AGENT TRONG VÒNG ĐỜI NHIỆM VỤ KHOA HỌC – 34′</w:t>
+            </w:r>
+          </w:p>
+        </w:tc>
+        <w:tc>
+          <w:tcPr/>
+          <w:p>
+            <w:pPr>
+              <w:pStyle w:val="Compact"/>
+            </w:pPr>
+          </w:p>
+        </w:tc>
+        <w:tc>
+          <w:tcPr/>
+          <w:p>
+            <w:pPr>
+              <w:pStyle w:val="Compact"/>
+            </w:pPr>
+          </w:p>
+        </w:tc>
+        <w:tc>
+          <w:tcPr/>
+          <w:p>
+            <w:pPr>
+              <w:pStyle w:val="Compact"/>
+            </w:pPr>
+          </w:p>
+        </w:tc>
+      </w:tr>
+      <w:tr>
+        <w:tc>
+          <w:tcPr/>
+          <w:p>
+            <w:pPr>
+              <w:pStyle w:val="Compact"/>
+              <w:jc w:val="left"/>
+            </w:pPr>
+            <w:r>
+              <w:t xml:space="preserve">12</w:t>
+            </w:r>
+          </w:p>
+        </w:tc>
+        <w:tc>
+          <w:tcPr/>
+          <w:p>
+            <w:pPr>
+              <w:pStyle w:val="Compact"/>
+              <w:jc w:val="left"/>
+            </w:pPr>
+            <w:r>
+              <w:t xml:space="preserve">Tìm và lọc tài liệu bước đầu: Sci-Hub, Sci-Bot và các công cụ hỗ trợ</w:t>
+            </w:r>
+          </w:p>
+        </w:tc>
+        <w:tc>
+          <w:tcPr/>
+          <w:p>
+            <w:pPr>
+              <w:pStyle w:val="Compact"/>
+              <w:jc w:val="left"/>
+            </w:pPr>
+            <w:r>
+              <w:t xml:space="preserve">III</w:t>
+            </w:r>
+          </w:p>
+        </w:tc>
+        <w:tc>
+          <w:tcPr/>
+          <w:p>
+            <w:pPr>
+              <w:pStyle w:val="Compact"/>
+              <w:jc w:val="left"/>
+            </w:pPr>
+            <w:r>
+              <w:t xml:space="preserve">4′</w:t>
+            </w:r>
+          </w:p>
+        </w:tc>
+        <w:tc>
+          <w:tcPr/>
+          <w:p>
+            <w:pPr>
+              <w:pStyle w:val="Compact"/>
+              <w:jc w:val="left"/>
+            </w:pPr>
+            <w:r>
+              <w:t xml:space="preserve">[ ]</w:t>
+            </w:r>
           </w:p>
         </w:tc>
       </w:tr>
@@ -4634,7 +4634,7 @@
         <w:t xml:space="preserve"> </w:t>
       </w:r>
       <w:r>
-        <w:t xml:space="preserve">bảng đầy đủ 6 tính năng mới kèm mốc thời gian; bảng so sánh chatbot – AI Agent; ví dụ trong dự án ăn mòn: AI phát hiện lỗi đơn vị (Slide 10) nhưng cũng chọn sai cách tìm số đo bất thường (Slide 16).</w:t>
+        <w:t xml:space="preserve">bảng đầy đủ 6 tính năng mới kèm mốc thời gian; bảng so sánh chatbot – AI Agent; ví dụ trong dự án ăn mòn: AI phát hiện lỗi đơn vị (Slide 9) nhưng cũng chọn sai cách tìm số đo bất thường (Slide 16).</w:t>
       </w:r>
     </w:p>
     <w:p>
@@ -4979,13 +4979,13 @@
     </w:p>
     <w:bookmarkEnd w:id="28"/>
     <w:bookmarkEnd w:id="29"/>
-    <w:bookmarkStart w:id="38" w:name="Xa1d8ae570c6b4d8a7632d2cdd3fd6d3433745c3"/>
+    <w:bookmarkStart w:id="37" w:name="X3fa9c9c08ded9263de7af394aaca75d8733df7e"/>
     <w:p>
       <w:pPr>
         <w:pStyle w:val="Heading1"/>
       </w:pPr>
       <w:r>
-        <w:t xml:space="preserve">PHẦN II. LỰA CHỌN VÀ SỬ DỤNG CÔNG CỤ AI PHÙ HỢP (32 phút)</w:t>
+        <w:t xml:space="preserve">PHẦN II. LỰA CHỌN VÀ SỬ DỤNG CÔNG CỤ AI PHÙ HỢP (28 phút)</w:t>
       </w:r>
     </w:p>
     <w:p>
@@ -5003,7 +5003,7 @@
         <w:t xml:space="preserve"> </w:t>
       </w:r>
       <w:r>
-        <w:t xml:space="preserve">tên Phần II · Slide 5–12</w:t>
+        <w:t xml:space="preserve">tên Phần II · Slide 5–11</w:t>
       </w:r>
     </w:p>
     <w:p>
@@ -5892,13 +5892,13 @@
       </w:r>
     </w:p>
     <w:bookmarkEnd w:id="31"/>
-    <w:bookmarkStart w:id="32" w:name="Xb10632a10f9e5dff8ab90ff215e661c3c082af4"/>
+    <w:bookmarkStart w:id="32" w:name="Xd8bddb4a789b7c5b863ead1ea470b7a540e29cc"/>
     <w:p>
       <w:pPr>
         <w:pStyle w:val="Heading2"/>
       </w:pPr>
       <w:r>
-        <w:t xml:space="preserve">Slide 7 – Tìm và đọc tài liệu khoa học: Sci-Hub, Sci-Bot và các lựa chọn hợp pháp (4′) 🆕</w:t>
+        <w:t xml:space="preserve">Slide 7 – Giới thiệu Claude: mô hình, gói dịch vụ và tính năng nổi bật trên Windows (6′)</w:t>
       </w:r>
     </w:p>
     <w:p>
@@ -5911,6 +5911,102 @@
           <w:b/>
         </w:rPr>
         <w:t xml:space="preserve">Chữ trên slide:</w:t>
+      </w:r>
+      <w:r>
+        <w:t xml:space="preserve"> </w:t>
+      </w:r>
+      <w:r>
+        <w:t xml:space="preserve">-</w:t>
+      </w:r>
+      <w:r>
+        <w:t xml:space="preserve"> </w:t>
+      </w:r>
+      <w:r>
+        <w:rPr>
+          <w:bCs/>
+          <w:b/>
+        </w:rPr>
+        <w:t xml:space="preserve">Claude</w:t>
+      </w:r>
+      <w:r>
+        <w:t xml:space="preserve"> </w:t>
+      </w:r>
+      <w:r>
+        <w:t xml:space="preserve">– trợ lý AI của công ty Anthropic (Mỹ). Trên Windows:</w:t>
+      </w:r>
+      <w:r>
+        <w:t xml:space="preserve"> </w:t>
+      </w:r>
+      <w:r>
+        <w:rPr>
+          <w:bCs/>
+          <w:b/>
+        </w:rPr>
+        <w:t xml:space="preserve">trình duyệt (claude.ai)</w:t>
+      </w:r>
+      <w:r>
+        <w:t xml:space="preserve"> </w:t>
+      </w:r>
+      <w:r>
+        <w:t xml:space="preserve">hoặc</w:t>
+      </w:r>
+      <w:r>
+        <w:t xml:space="preserve"> </w:t>
+      </w:r>
+      <w:r>
+        <w:rPr>
+          <w:bCs/>
+          <w:b/>
+        </w:rPr>
+        <w:t xml:space="preserve">ứng dụng Claude cho Windows</w:t>
+      </w:r>
+      <w:r>
+        <w:t xml:space="preserve">; hội thoại, dự án đồng bộ giữa hai cách.</w:t>
+      </w:r>
+      <w:r>
+        <w:t xml:space="preserve"> </w:t>
+      </w:r>
+      <w:r>
+        <w:t xml:space="preserve">-</w:t>
+      </w:r>
+      <w:r>
+        <w:t xml:space="preserve"> </w:t>
+      </w:r>
+      <w:r>
+        <w:rPr>
+          <w:bCs/>
+          <w:b/>
+        </w:rPr>
+        <w:t xml:space="preserve">Bốn mô hình</w:t>
+      </w:r>
+      <w:r>
+        <w:t xml:space="preserve"> </w:t>
+      </w:r>
+      <w:r>
+        <w:rPr>
+          <w:iCs/>
+          <w:i/>
+        </w:rPr>
+        <w:t xml:space="preserve">(10/2026)</w:t>
+      </w:r>
+      <w:r>
+        <w:t xml:space="preserve">: Haiku 5.5 – nhanh, việc đơn giản · Sonnet 5.5 – công việc hằng ngày · Opus 5.5 – phân tích phức tạp (từ gói Pro) · Fable 5.1 – dự án lớn, làm việc dài hơi (từ gói Pro)</w:t>
+      </w:r>
+      <w:r>
+        <w:t xml:space="preserve"> </w:t>
+      </w:r>
+      <w:r>
+        <w:t xml:space="preserve">-</w:t>
+      </w:r>
+      <w:r>
+        <w:t xml:space="preserve"> </w:t>
+      </w:r>
+      <w:r>
+        <w:rPr>
+          <w:bCs/>
+          <w:b/>
+        </w:rPr>
+        <w:t xml:space="preserve">Năm tính năng dùng ngay:</w:t>
       </w:r>
     </w:p>
     <w:tbl>
@@ -5937,612 +6033,6 @@
               <w:jc w:val="left"/>
             </w:pPr>
             <w:r>
-              <w:t xml:space="preserve">Nhóm</w:t>
-            </w:r>
-          </w:p>
-        </w:tc>
-        <w:tc>
-          <w:tcPr/>
-          <w:p>
-            <w:pPr>
-              <w:pStyle w:val="Compact"/>
-              <w:jc w:val="left"/>
-            </w:pPr>
-            <w:r>
-              <w:t xml:space="preserve">Công cụ tiêu biểu</w:t>
-            </w:r>
-          </w:p>
-        </w:tc>
-        <w:tc>
-          <w:tcPr/>
-          <w:p>
-            <w:pPr>
-              <w:pStyle w:val="Compact"/>
-              <w:jc w:val="left"/>
-            </w:pPr>
-            <w:r>
-              <w:t xml:space="preserve">Lưu ý</w:t>
-            </w:r>
-          </w:p>
-        </w:tc>
-      </w:tr>
-      <w:tr>
-        <w:tc>
-          <w:tcPr/>
-          <w:p>
-            <w:pPr>
-              <w:pStyle w:val="Compact"/>
-              <w:jc w:val="left"/>
-            </w:pPr>
-            <w:r>
-              <w:t xml:space="preserve">⚠</w:t>
-            </w:r>
-            <w:r>
-              <w:t xml:space="preserve"> </w:t>
-            </w:r>
-            <w:r>
-              <w:rPr>
-                <w:bCs/>
-                <w:b/>
-              </w:rPr>
-              <w:t xml:space="preserve">Thư viện</w:t>
-            </w:r>
-            <w:r>
-              <w:rPr>
-                <w:bCs/>
-                <w:b/>
-              </w:rPr>
-              <w:t xml:space="preserve"> </w:t>
-            </w:r>
-            <w:r>
-              <w:rPr>
-                <w:bCs/>
-                <w:b/>
-              </w:rPr>
-              <w:t xml:space="preserve">“</w:t>
-            </w:r>
-            <w:r>
-              <w:rPr>
-                <w:bCs/>
-                <w:b/>
-              </w:rPr>
-              <w:t xml:space="preserve">bóng tối</w:t>
-            </w:r>
-            <w:r>
-              <w:rPr>
-                <w:bCs/>
-                <w:b/>
-              </w:rPr>
-              <w:t xml:space="preserve">”</w:t>
-            </w:r>
-          </w:p>
-        </w:tc>
-        <w:tc>
-          <w:tcPr/>
-          <w:p>
-            <w:pPr>
-              <w:pStyle w:val="Compact"/>
-              <w:jc w:val="left"/>
-            </w:pPr>
-            <w:r>
-              <w:rPr>
-                <w:bCs/>
-                <w:b/>
-              </w:rPr>
-              <w:t xml:space="preserve">Sci-Hub</w:t>
-            </w:r>
-            <w:r>
-              <w:t xml:space="preserve"> </w:t>
-            </w:r>
-            <w:r>
-              <w:t xml:space="preserve">– kho ~88 triệu bài báo, sách ·</w:t>
-            </w:r>
-            <w:r>
-              <w:t xml:space="preserve"> </w:t>
-            </w:r>
-            <w:r>
-              <w:rPr>
-                <w:bCs/>
-                <w:b/>
-              </w:rPr>
-              <w:t xml:space="preserve">Sci-Bot</w:t>
-            </w:r>
-            <w:r>
-              <w:t xml:space="preserve"> </w:t>
-            </w:r>
-            <w:r>
-              <w:t xml:space="preserve">(04/2026) – trợ lý AI hỏi – đáp trên kho Sci-Hub, bản thử nghiệm</w:t>
-            </w:r>
-          </w:p>
-        </w:tc>
-        <w:tc>
-          <w:tcPr/>
-          <w:p>
-            <w:pPr>
-              <w:pStyle w:val="Compact"/>
-              <w:jc w:val="left"/>
-            </w:pPr>
-            <w:r>
-              <w:t xml:space="preserve">Tòa án ở Mỹ, Nga (2018), Ấn Độ (2025) xác định vi phạm bản quyền, chặn truy cập; nhiều trang giả mạo – rủi ro mã độc; Sci-Bot thiếu bài mới (sau ~2021–2022), chỉ trả lời từng câu</w:t>
-            </w:r>
-          </w:p>
-        </w:tc>
-      </w:tr>
-      <w:tr>
-        <w:tc>
-          <w:tcPr/>
-          <w:p>
-            <w:pPr>
-              <w:pStyle w:val="Compact"/>
-              <w:jc w:val="left"/>
-            </w:pPr>
-            <w:r>
-              <w:t xml:space="preserve">✅</w:t>
-            </w:r>
-            <w:r>
-              <w:t xml:space="preserve"> </w:t>
-            </w:r>
-            <w:r>
-              <w:rPr>
-                <w:bCs/>
-                <w:b/>
-              </w:rPr>
-              <w:t xml:space="preserve">Toàn văn mở hợp pháp</w:t>
-            </w:r>
-          </w:p>
-        </w:tc>
-        <w:tc>
-          <w:tcPr/>
-          <w:p>
-            <w:pPr>
-              <w:pStyle w:val="Compact"/>
-              <w:jc w:val="left"/>
-            </w:pPr>
-            <w:r>
-              <w:t xml:space="preserve">Unpaywall (tiện ích trình duyệt) · CORE · arXiv · PubMed Central · DOAJ</w:t>
-            </w:r>
-          </w:p>
-        </w:tc>
-        <w:tc>
-          <w:tcPr/>
-          <w:p>
-            <w:pPr>
-              <w:pStyle w:val="Compact"/>
-              <w:jc w:val="left"/>
-            </w:pPr>
-            <w:r>
-              <w:t xml:space="preserve">Miễn phí; tìm bản tác giả đã tự lưu trữ hợp pháp</w:t>
-            </w:r>
-          </w:p>
-        </w:tc>
-      </w:tr>
-      <w:tr>
-        <w:tc>
-          <w:tcPr/>
-          <w:p>
-            <w:pPr>
-              <w:pStyle w:val="Compact"/>
-              <w:jc w:val="left"/>
-            </w:pPr>
-            <w:r>
-              <w:t xml:space="preserve">✅</w:t>
-            </w:r>
-            <w:r>
-              <w:t xml:space="preserve"> </w:t>
-            </w:r>
-            <w:r>
-              <w:rPr>
-                <w:bCs/>
-                <w:b/>
-              </w:rPr>
-              <w:t xml:space="preserve">Tìm kiếm có AI</w:t>
-            </w:r>
-          </w:p>
-        </w:tc>
-        <w:tc>
-          <w:tcPr/>
-          <w:p>
-            <w:pPr>
-              <w:pStyle w:val="Compact"/>
-              <w:jc w:val="left"/>
-            </w:pPr>
-            <w:r>
-              <w:t xml:space="preserve">Google Scholar Labs (11/2025) · Semantic Scholar · Elicit · Consensus · SciSpace · Undermind</w:t>
-            </w:r>
-          </w:p>
-        </w:tc>
-        <w:tc>
-          <w:tcPr/>
-          <w:p>
-            <w:pPr>
-              <w:pStyle w:val="Compact"/>
-              <w:jc w:val="left"/>
-            </w:pPr>
-            <w:r>
-              <w:t xml:space="preserve">Trả lời kèm bài báo dẫn chứng; vẫn phải đọc bản gốc</w:t>
-            </w:r>
-          </w:p>
-        </w:tc>
-      </w:tr>
-      <w:tr>
-        <w:tc>
-          <w:tcPr/>
-          <w:p>
-            <w:pPr>
-              <w:pStyle w:val="Compact"/>
-              <w:jc w:val="left"/>
-            </w:pPr>
-            <w:r>
-              <w:t xml:space="preserve">✅</w:t>
-            </w:r>
-            <w:r>
-              <w:t xml:space="preserve"> </w:t>
-            </w:r>
-            <w:r>
-              <w:rPr>
-                <w:bCs/>
-                <w:b/>
-              </w:rPr>
-              <w:t xml:space="preserve">Cơ sở dữ liệu thu phí</w:t>
-            </w:r>
-          </w:p>
-        </w:tc>
-        <w:tc>
-          <w:tcPr/>
-          <w:p>
-            <w:pPr>
-              <w:pStyle w:val="Compact"/>
-              <w:jc w:val="left"/>
-            </w:pPr>
-            <w:r>
-              <w:t xml:space="preserve">Scopus AI · Web of Science Research Assistant</w:t>
-            </w:r>
-          </w:p>
-        </w:tc>
-        <w:tc>
-          <w:tcPr/>
-          <w:p>
-            <w:pPr>
-              <w:pStyle w:val="Compact"/>
-              <w:jc w:val="left"/>
-            </w:pPr>
-            <w:r>
-              <w:t xml:space="preserve">Qua tài khoản thư viện, tổ chức</w:t>
-            </w:r>
-          </w:p>
-        </w:tc>
-      </w:tr>
-      <w:tr>
-        <w:tc>
-          <w:tcPr/>
-          <w:p>
-            <w:pPr>
-              <w:pStyle w:val="Compact"/>
-              <w:jc w:val="left"/>
-            </w:pPr>
-            <w:r>
-              <w:t xml:space="preserve">✅</w:t>
-            </w:r>
-            <w:r>
-              <w:t xml:space="preserve"> </w:t>
-            </w:r>
-            <w:r>
-              <w:rPr>
-                <w:bCs/>
-                <w:b/>
-              </w:rPr>
-              <w:t xml:space="preserve">Nguồn Việt – Nga</w:t>
-            </w:r>
-          </w:p>
-        </w:tc>
-        <w:tc>
-          <w:tcPr/>
-          <w:p>
-            <w:pPr>
-              <w:pStyle w:val="Compact"/>
-              <w:jc w:val="left"/>
-            </w:pPr>
-            <w:r>
-              <w:t xml:space="preserve">VJOL (tạp chí Việt Nam, miễn phí) · CyberLeninka (thư viện mở Nga) · eLIBRARY.ru (РИНЦ)</w:t>
-            </w:r>
-          </w:p>
-        </w:tc>
-        <w:tc>
-          <w:tcPr/>
-          <w:p>
-            <w:pPr>
-              <w:pStyle w:val="Compact"/>
-              <w:jc w:val="left"/>
-            </w:pPr>
-            <w:r>
-              <w:t xml:space="preserve">Tài liệu tiếng Việt, tiếng Nga – thế mạnh riêng của Trung tâm</w:t>
-            </w:r>
-          </w:p>
-        </w:tc>
-      </w:tr>
-    </w:tbl>
-    <w:p>
-      <w:pPr>
-        <w:pStyle w:val="BlockText"/>
-      </w:pPr>
-      <w:r>
-        <w:rPr>
-          <w:bCs/>
-          <w:b/>
-        </w:rPr>
-        <w:t xml:space="preserve">Khuyến nghị:</w:t>
-      </w:r>
-      <w:r>
-        <w:t xml:space="preserve"> </w:t>
-      </w:r>
-      <w:r>
-        <w:t xml:space="preserve">ưu tiên kênh hợp pháp → không có bản mở thì gửi thư xin bản PDF từ tác giả hoặc qua thư viện; tuân thủ quy định bản quyền và an toàn thông tin của đơn vị.</w:t>
-      </w:r>
-    </w:p>
-    <w:p>
-      <w:pPr>
-        <w:pStyle w:val="FirstParagraph"/>
-      </w:pPr>
-      <w:r>
-        <w:rPr>
-          <w:bCs/>
-          <w:b/>
-        </w:rPr>
-        <w:t xml:space="preserve">Hình ảnh:</w:t>
-      </w:r>
-      <w:r>
-        <w:t xml:space="preserve"> </w:t>
-      </w:r>
-      <w:r>
-        <w:t xml:space="preserve">ảnh chụp Unpaywall hiện nút</w:t>
-      </w:r>
-      <w:r>
-        <w:t xml:space="preserve"> </w:t>
-      </w:r>
-      <w:r>
-        <w:t xml:space="preserve">“</w:t>
-      </w:r>
-      <w:r>
-        <w:t xml:space="preserve">bản mở</w:t>
-      </w:r>
-      <w:r>
-        <w:t xml:space="preserve">”</w:t>
-      </w:r>
-      <w:r>
-        <w:t xml:space="preserve"> </w:t>
-      </w:r>
-      <w:r>
-        <w:t xml:space="preserve">cạnh bài báo; ảnh Google Scholar Labs trả lời một câu hỏi về ăn mòn khí quyển.</w:t>
-      </w:r>
-    </w:p>
-    <w:p>
-      <w:pPr>
-        <w:pStyle w:val="BodyText"/>
-      </w:pPr>
-      <w:r>
-        <w:rPr>
-          <w:bCs/>
-          <w:b/>
-        </w:rPr>
-        <w:t xml:space="preserve">Không chiếu (tài liệu phát tay):</w:t>
-      </w:r>
-      <w:r>
-        <w:t xml:space="preserve"> </w:t>
-      </w:r>
-      <w:r>
-        <w:t xml:space="preserve">mô tả, địa chỉ, cách dùng từng công cụ –</w:t>
-      </w:r>
-      <w:r>
-        <w:t xml:space="preserve"> </w:t>
-      </w:r>
-      <w:r>
-        <w:rPr>
-          <w:rStyle w:val="VerbatimChar"/>
-        </w:rPr>
-        <w:t xml:space="preserve">TAI-LIEU-PHAT-TAY.md</w:t>
-      </w:r>
-      <w:r>
-        <w:t xml:space="preserve"> </w:t>
-      </w:r>
-      <w:r>
-        <w:t xml:space="preserve">mục 11.</w:t>
-      </w:r>
-    </w:p>
-    <w:p>
-      <w:pPr>
-        <w:pStyle w:val="BodyText"/>
-      </w:pPr>
-      <w:r>
-        <w:rPr>
-          <w:bCs/>
-          <w:b/>
-        </w:rPr>
-        <w:t xml:space="preserve">Nguồn:</w:t>
-      </w:r>
-      <w:r>
-        <w:t xml:space="preserve"> </w:t>
-      </w:r>
-      <w:r>
-        <w:t xml:space="preserve">N33–N37</w:t>
-      </w:r>
-    </w:p>
-    <w:p>
-      <w:pPr>
-        <w:pStyle w:val="BodyText"/>
-      </w:pPr>
-      <w:r>
-        <w:rPr>
-          <w:bCs/>
-          <w:b/>
-        </w:rPr>
-        <w:t xml:space="preserve">Duyệt:</w:t>
-      </w:r>
-      <w:r>
-        <w:t xml:space="preserve"> </w:t>
-      </w:r>
-      <w:r>
-        <w:t xml:space="preserve">[ ] Duyệt · [ ] Sửa · [ ] Bỏ</w:t>
-      </w:r>
-      <w:r>
-        <w:t xml:space="preserve"> </w:t>
-      </w:r>
-      <w:r>
-        <w:rPr>
-          <w:bCs/>
-          <w:b/>
-        </w:rPr>
-        <w:t xml:space="preserve">Ghi chú:</w:t>
-      </w:r>
-    </w:p>
-    <w:p>
-      <w:r>
-        <w:pict>
-          <v:rect style="width:0;height:1.5pt" o:hralign="center" o:hrstd="t" o:hr="t"/>
-        </w:pict>
-      </w:r>
-    </w:p>
-    <w:bookmarkEnd w:id="32"/>
-    <w:bookmarkStart w:id="33" w:name="Xb9486dc6dbe54a3628df1c1b61a374d4c4f99a0"/>
-    <w:p>
-      <w:pPr>
-        <w:pStyle w:val="Heading2"/>
-      </w:pPr>
-      <w:r>
-        <w:t xml:space="preserve">Slide 8 – Giới thiệu Claude: mô hình, gói dịch vụ và tính năng nổi bật trên Windows (6′)</w:t>
-      </w:r>
-    </w:p>
-    <w:p>
-      <w:pPr>
-        <w:pStyle w:val="FirstParagraph"/>
-      </w:pPr>
-      <w:r>
-        <w:rPr>
-          <w:bCs/>
-          <w:b/>
-        </w:rPr>
-        <w:t xml:space="preserve">Chữ trên slide:</w:t>
-      </w:r>
-      <w:r>
-        <w:t xml:space="preserve"> </w:t>
-      </w:r>
-      <w:r>
-        <w:t xml:space="preserve">-</w:t>
-      </w:r>
-      <w:r>
-        <w:t xml:space="preserve"> </w:t>
-      </w:r>
-      <w:r>
-        <w:rPr>
-          <w:bCs/>
-          <w:b/>
-        </w:rPr>
-        <w:t xml:space="preserve">Claude</w:t>
-      </w:r>
-      <w:r>
-        <w:t xml:space="preserve"> </w:t>
-      </w:r>
-      <w:r>
-        <w:t xml:space="preserve">– trợ lý AI của công ty Anthropic (Mỹ). Trên Windows:</w:t>
-      </w:r>
-      <w:r>
-        <w:t xml:space="preserve"> </w:t>
-      </w:r>
-      <w:r>
-        <w:rPr>
-          <w:bCs/>
-          <w:b/>
-        </w:rPr>
-        <w:t xml:space="preserve">trình duyệt (claude.ai)</w:t>
-      </w:r>
-      <w:r>
-        <w:t xml:space="preserve"> </w:t>
-      </w:r>
-      <w:r>
-        <w:t xml:space="preserve">hoặc</w:t>
-      </w:r>
-      <w:r>
-        <w:t xml:space="preserve"> </w:t>
-      </w:r>
-      <w:r>
-        <w:rPr>
-          <w:bCs/>
-          <w:b/>
-        </w:rPr>
-        <w:t xml:space="preserve">ứng dụng Claude cho Windows</w:t>
-      </w:r>
-      <w:r>
-        <w:t xml:space="preserve">; hội thoại, dự án đồng bộ giữa hai cách.</w:t>
-      </w:r>
-      <w:r>
-        <w:t xml:space="preserve"> </w:t>
-      </w:r>
-      <w:r>
-        <w:t xml:space="preserve">-</w:t>
-      </w:r>
-      <w:r>
-        <w:t xml:space="preserve"> </w:t>
-      </w:r>
-      <w:r>
-        <w:rPr>
-          <w:bCs/>
-          <w:b/>
-        </w:rPr>
-        <w:t xml:space="preserve">Bốn mô hình</w:t>
-      </w:r>
-      <w:r>
-        <w:t xml:space="preserve"> </w:t>
-      </w:r>
-      <w:r>
-        <w:rPr>
-          <w:iCs/>
-          <w:i/>
-        </w:rPr>
-        <w:t xml:space="preserve">(10/2026)</w:t>
-      </w:r>
-      <w:r>
-        <w:t xml:space="preserve">: Haiku 5.5 – nhanh, việc đơn giản · Sonnet 5.5 – công việc hằng ngày · Opus 5.5 – phân tích phức tạp (từ gói Pro) · Fable 5.1 – dự án lớn, làm việc dài hơi (từ gói Pro)</w:t>
-      </w:r>
-      <w:r>
-        <w:t xml:space="preserve"> </w:t>
-      </w:r>
-      <w:r>
-        <w:t xml:space="preserve">-</w:t>
-      </w:r>
-      <w:r>
-        <w:t xml:space="preserve"> </w:t>
-      </w:r>
-      <w:r>
-        <w:rPr>
-          <w:bCs/>
-          <w:b/>
-        </w:rPr>
-        <w:t xml:space="preserve">Năm tính năng dùng ngay:</w:t>
-      </w:r>
-    </w:p>
-    <w:tbl>
-      <w:tblPr>
-        <w:tblStyle w:val="Table"/>
-        <w:tblW w:type="pct" w:w="5000"/>
-        <w:tblLook w:firstRow="1" w:lastRow="0" w:firstColumn="0" w:lastColumn="0" w:noHBand="0" w:noVBand="0" w:val="0020"/>
-        <w:jc w:val="start"/>
-      </w:tblPr>
-      <w:tblGrid>
-        <w:gridCol w:w="2640"/>
-        <w:gridCol w:w="2640"/>
-        <w:gridCol w:w="2640"/>
-      </w:tblGrid>
-      <w:tr>
-        <w:trPr>
-          <w:tblHeader w:val="true"/>
-        </w:trPr>
-        <w:tc>
-          <w:tcPr/>
-          <w:p>
-            <w:pPr>
-              <w:pStyle w:val="Compact"/>
-              <w:jc w:val="left"/>
-            </w:pPr>
-            <w:r>
               <w:t xml:space="preserve">Tính năng</w:t>
             </w:r>
           </w:p>
@@ -6903,14 +6393,14 @@
         </w:pict>
       </w:r>
     </w:p>
-    <w:bookmarkEnd w:id="33"/>
-    <w:bookmarkStart w:id="34" w:name="X804204e3a809e15549529c0e80355c3679ac91d"/>
+    <w:bookmarkEnd w:id="32"/>
+    <w:bookmarkStart w:id="33" w:name="Xc19f8b9f856b417cbb714306abb4969734bf5ab"/>
     <w:p>
       <w:pPr>
         <w:pStyle w:val="Heading2"/>
       </w:pPr>
       <w:r>
-        <w:t xml:space="preserve">Slide 9 – Bắt đầu với Claude: 6 bước đầu tiên và tổng hợp dữ liệu nhiều nguồn (5′)</w:t>
+        <w:t xml:space="preserve">Slide 8 – Bắt đầu với Claude: 6 bước đầu tiên và tổng hợp dữ liệu nhiều nguồn (5′)</w:t>
       </w:r>
     </w:p>
     <w:p>
@@ -7994,14 +7484,14 @@
         </w:pict>
       </w:r>
     </w:p>
-    <w:bookmarkEnd w:id="34"/>
-    <w:bookmarkStart w:id="35" w:name="X1b19ea63da5f2e53c9ddbb9fbe1a91d56194a43"/>
+    <w:bookmarkEnd w:id="33"/>
+    <w:bookmarkStart w:id="34" w:name="Xfdaf43517d6f9be2186ea73d4cc00c048639f0b"/>
     <w:p>
       <w:pPr>
         <w:pStyle w:val="Heading2"/>
       </w:pPr>
       <w:r>
-        <w:t xml:space="preserve">Slide 10 – Giao việc cho AI Agent: cách viết yêu cầu 5 bước (5′)</w:t>
+        <w:t xml:space="preserve">Slide 9 – Giao việc cho AI Agent: cách viết yêu cầu 5 bước (5′)</w:t>
       </w:r>
     </w:p>
     <w:p>
@@ -8362,14 +7852,14 @@
         </w:pict>
       </w:r>
     </w:p>
-    <w:bookmarkEnd w:id="35"/>
-    <w:bookmarkStart w:id="36" w:name="Xe353d48bd23a56d0a0c296f3202e80aff98e18e"/>
+    <w:bookmarkEnd w:id="34"/>
+    <w:bookmarkStart w:id="35" w:name="X0b923a1a013338280d796ef2440c703039fcd56"/>
     <w:p>
       <w:pPr>
         <w:pStyle w:val="Heading2"/>
       </w:pPr>
       <w:r>
-        <w:t xml:space="preserve">Slide 11 – Không gian làm việc nghiên cứu: mỗi nhiệm vụ một dự án (3′)</w:t>
+        <w:t xml:space="preserve">Slide 10 – Không gian làm việc nghiên cứu: mỗi nhiệm vụ một dự án (3′)</w:t>
       </w:r>
     </w:p>
     <w:p>
@@ -8397,7 +7887,7 @@
         <w:t xml:space="preserve"> </w:t>
       </w:r>
       <w:r>
-        <w:t xml:space="preserve">(cách tạo dự án: xem Slide 9)</w:t>
+        <w:t xml:space="preserve">(cách tạo dự án: xem Slide 8)</w:t>
       </w:r>
     </w:p>
     <w:tbl>
@@ -8826,14 +8316,14 @@
         </w:pict>
       </w:r>
     </w:p>
-    <w:bookmarkEnd w:id="36"/>
-    <w:bookmarkStart w:id="37" w:name="Xd43cf258a8a6f26e4e2ebfab4eeebf3b2928ae9"/>
+    <w:bookmarkEnd w:id="35"/>
+    <w:bookmarkStart w:id="36" w:name="X43a5ec71d5c68447a142ac51b2b6000d42e0f76"/>
     <w:p>
       <w:pPr>
         <w:pStyle w:val="Heading2"/>
       </w:pPr>
       <w:r>
-        <w:t xml:space="preserve">Slide 12 – Skill, Subagent và hệ thống nhiều Agent (2′) –</w:t>
+        <w:t xml:space="preserve">Slide 11 – Skill, Subagent và hệ thống nhiều Agent (2′) –</w:t>
       </w:r>
       <w:r>
         <w:t xml:space="preserve"> </w:t>
@@ -9044,15 +8534,15 @@
         </w:pict>
       </w:r>
     </w:p>
+    <w:bookmarkEnd w:id="36"/>
     <w:bookmarkEnd w:id="37"/>
-    <w:bookmarkEnd w:id="38"/>
-    <w:bookmarkStart w:id="46" w:name="X8f20a420af1379ad237599e2a76979ed8275dc8"/>
+    <w:bookmarkStart w:id="46" w:name="Xb76ac458eb2f403086516140cdc9f2a6c74effc"/>
     <w:p>
       <w:pPr>
         <w:pStyle w:val="Heading1"/>
       </w:pPr>
       <w:r>
-        <w:t xml:space="preserve">PHẦN III. AI AGENT TRONG VÒNG ĐỜI NHIỆM VỤ KHOA HỌC (30 phút)</w:t>
+        <w:t xml:space="preserve">PHẦN III. AI AGENT TRONG VÒNG ĐỜI NHIỆM VỤ KHOA HỌC (34 phút)</w:t>
       </w:r>
     </w:p>
     <w:p>
@@ -9070,7 +8560,7 @@
         <w:t xml:space="preserve"> </w:t>
       </w:r>
       <w:r>
-        <w:t xml:space="preserve">tên Phần III · Slide 13–19</w:t>
+        <w:t xml:space="preserve">tên Phần III · Slide 12–19</w:t>
       </w:r>
     </w:p>
     <w:p>
@@ -9136,13 +8626,13 @@
         </w:pict>
       </w:r>
     </w:p>
-    <w:bookmarkStart w:id="39" w:name="X86b8179ee4983cce1e74e4be426ed43bc51a863"/>
+    <w:bookmarkStart w:id="38" w:name="Xd85a41c55b25eb0738121b4f2eb487220bda3e4"/>
     <w:p>
       <w:pPr>
         <w:pStyle w:val="Heading2"/>
       </w:pPr>
       <w:r>
-        <w:t xml:space="preserve">Slide 13 – Tổng quan tài liệu: từ bài báo đến khoảng trống nghiên cứu (6′)</w:t>
+        <w:t xml:space="preserve">Slide 12 – Tìm và lọc tài liệu bước đầu: Sci-Hub, Sci-Bot và các công cụ hỗ trợ (4′)</w:t>
       </w:r>
     </w:p>
     <w:p>
@@ -9160,113 +8650,235 @@
         <w:t xml:space="preserve"> </w:t>
       </w:r>
       <w:r>
-        <w:t xml:space="preserve">-</w:t>
-      </w:r>
-      <w:r>
-        <w:t xml:space="preserve"> </w:t>
-      </w:r>
-      <w:r>
-        <w:rPr>
-          <w:bCs/>
-          <w:b/>
-        </w:rPr>
-        <w:t xml:space="preserve">Tình huống:</w:t>
-      </w:r>
-      <w:r>
-        <w:t xml:space="preserve"> </w:t>
-      </w:r>
-      <w:r>
-        <w:t xml:space="preserve">ăn mòn khí quyển của kim loại trong khí hậu nhiệt đới Việt Nam</w:t>
-      </w:r>
-      <w:r>
-        <w:t xml:space="preserve"> </w:t>
-      </w:r>
-      <w:r>
-        <w:t xml:space="preserve">- 🌍</w:t>
-      </w:r>
-      <w:r>
-        <w:t xml:space="preserve"> </w:t>
-      </w:r>
-      <w:r>
-        <w:rPr>
-          <w:bCs/>
-          <w:b/>
-        </w:rPr>
-        <w:t xml:space="preserve">Ví dụ thật:</w:t>
-      </w:r>
-      <w:r>
-        <w:t xml:space="preserve"> </w:t>
-      </w:r>
-      <w:r>
-        <w:t xml:space="preserve">AI co-scientist (Google) – nhiều trợ lý đề xuất, phản biện, xếp hạng giả thuyết</w:t>
-      </w:r>
-      <w:r>
-        <w:t xml:space="preserve"> </w:t>
-      </w:r>
-      <w:r>
-        <w:t xml:space="preserve">- 🧰</w:t>
-      </w:r>
-      <w:r>
-        <w:t xml:space="preserve"> </w:t>
-      </w:r>
-      <w:r>
-        <w:rPr>
-          <w:bCs/>
-          <w:b/>
-        </w:rPr>
-        <w:t xml:space="preserve">Công cụ tìm và đọc tài liệu</w:t>
-      </w:r>
-      <w:r>
-        <w:t xml:space="preserve"> </w:t>
-      </w:r>
-      <w:r>
-        <w:t xml:space="preserve">(xem Slide 7): Claude Research · Elicit (tổng quan hệ thống, trích xuất bảng) · Consensus (câu trả lời có dẫn chứng) · Semantic Scholar (miễn phí) · Scite (trích dẫn ủng hộ hay phản bác) · ResearchRabbit (bản đồ trích dẫn)</w:t>
-      </w:r>
-      <w:r>
-        <w:t xml:space="preserve"> </w:t>
-      </w:r>
-      <w:r>
-        <w:t xml:space="preserve">- ⌨</w:t>
-      </w:r>
-      <w:r>
-        <w:t xml:space="preserve"> </w:t>
-      </w:r>
-      <w:r>
-        <w:rPr>
-          <w:bCs/>
-          <w:b/>
-        </w:rPr>
-        <w:t xml:space="preserve">Câu lệnh:</w:t>
-      </w:r>
-      <w:r>
-        <w:t xml:space="preserve"> </w:t>
-      </w:r>
-      <w:r>
-        <w:t xml:space="preserve">&gt; Từ các bài báo trong dự án, lập ma trận bằng chứng (tác giả – năm, địa điểm, kim loại, thời gian phơi mẫu, biến môi trường, mô hình, kết luận, hạn chế). Chỉ ra điểm chưa thống nhất và 3 khoảng trống cho điều kiện Việt Nam, mỗi khoảng trống dẫn chứng ít nhất 2 bài.</w:t>
-      </w:r>
-      <w:r>
-        <w:t xml:space="preserve"> </w:t>
-      </w:r>
-      <w:r>
-        <w:t xml:space="preserve">- ✅</w:t>
-      </w:r>
-      <w:r>
-        <w:t xml:space="preserve"> </w:t>
-      </w:r>
-      <w:r>
-        <w:rPr>
-          <w:bCs/>
-          <w:b/>
-        </w:rPr>
-        <w:t xml:space="preserve">Nhà khoa học xác nhận:</w:t>
-      </w:r>
-      <w:r>
-        <w:t xml:space="preserve"> </w:t>
-      </w:r>
-      <w:r>
-        <w:t xml:space="preserve">nguồn có thật; khoảng trống có giá trị</w:t>
-      </w:r>
-    </w:p>
+        <w:t xml:space="preserve">quy trình 4 bước tìm – lọc tài liệu</w:t>
+      </w:r>
+    </w:p>
+    <w:tbl>
+      <w:tblPr>
+        <w:tblStyle w:val="Table"/>
+        <w:tblW w:type="pct" w:w="5000"/>
+        <w:tblLook w:firstRow="1" w:lastRow="0" w:firstColumn="0" w:lastColumn="0" w:noHBand="0" w:noVBand="0" w:val="0020"/>
+        <w:jc w:val="start"/>
+      </w:tblPr>
+      <w:tblGrid>
+        <w:gridCol w:w="2640"/>
+        <w:gridCol w:w="2640"/>
+        <w:gridCol w:w="2640"/>
+      </w:tblGrid>
+      <w:tr>
+        <w:trPr>
+          <w:tblHeader w:val="true"/>
+        </w:trPr>
+        <w:tc>
+          <w:tcPr/>
+          <w:p>
+            <w:pPr>
+              <w:pStyle w:val="Compact"/>
+              <w:jc w:val="left"/>
+            </w:pPr>
+            <w:r>
+              <w:t xml:space="preserve">Bước</w:t>
+            </w:r>
+          </w:p>
+        </w:tc>
+        <w:tc>
+          <w:tcPr/>
+          <w:p>
+            <w:pPr>
+              <w:pStyle w:val="Compact"/>
+              <w:jc w:val="left"/>
+            </w:pPr>
+            <w:r>
+              <w:t xml:space="preserve">Công cụ</w:t>
+            </w:r>
+          </w:p>
+        </w:tc>
+        <w:tc>
+          <w:tcPr/>
+          <w:p>
+            <w:pPr>
+              <w:pStyle w:val="Compact"/>
+              <w:jc w:val="left"/>
+            </w:pPr>
+            <w:r>
+              <w:t xml:space="preserve">Làm gì</w:t>
+            </w:r>
+          </w:p>
+        </w:tc>
+      </w:tr>
+      <w:tr>
+        <w:tc>
+          <w:tcPr/>
+          <w:p>
+            <w:pPr>
+              <w:pStyle w:val="Compact"/>
+              <w:jc w:val="left"/>
+            </w:pPr>
+            <w:r>
+              <w:t xml:space="preserve">1. Đặt câu hỏi, tìm bài ứng viên</w:t>
+            </w:r>
+          </w:p>
+        </w:tc>
+        <w:tc>
+          <w:tcPr/>
+          <w:p>
+            <w:pPr>
+              <w:pStyle w:val="Compact"/>
+              <w:jc w:val="left"/>
+            </w:pPr>
+            <w:r>
+              <w:rPr>
+                <w:bCs/>
+                <w:b/>
+              </w:rPr>
+              <w:t xml:space="preserve">Sci-Bot</w:t>
+            </w:r>
+            <w:r>
+              <w:t xml:space="preserve"> </w:t>
+            </w:r>
+            <w:r>
+              <w:t xml:space="preserve">(trợ lý AI trên kho Sci-Hub, 04/2026) · Google Scholar Labs · Semantic Scholar</w:t>
+            </w:r>
+          </w:p>
+        </w:tc>
+        <w:tc>
+          <w:tcPr/>
+          <w:p>
+            <w:pPr>
+              <w:pStyle w:val="Compact"/>
+              <w:jc w:val="left"/>
+            </w:pPr>
+            <w:r>
+              <w:t xml:space="preserve">Hỏi bằng tiếng Anh, nêu rõ đối tượng – điều kiện – yếu tố cần xét → câu trả lời tổng hợp kèm danh sách bài báo, DOI</w:t>
+            </w:r>
+          </w:p>
+        </w:tc>
+      </w:tr>
+      <w:tr>
+        <w:tc>
+          <w:tcPr/>
+          <w:p>
+            <w:pPr>
+              <w:pStyle w:val="Compact"/>
+              <w:jc w:val="left"/>
+            </w:pPr>
+            <w:r>
+              <w:t xml:space="preserve">2. Lọc theo tiêu đề, tóm tắt</w:t>
+            </w:r>
+          </w:p>
+        </w:tc>
+        <w:tc>
+          <w:tcPr/>
+          <w:p>
+            <w:pPr>
+              <w:pStyle w:val="Compact"/>
+              <w:jc w:val="left"/>
+            </w:pPr>
+            <w:r>
+              <w:t xml:space="preserve">Elicit · Consensus · Claude (dự án)</w:t>
+            </w:r>
+          </w:p>
+        </w:tc>
+        <w:tc>
+          <w:tcPr/>
+          <w:p>
+            <w:pPr>
+              <w:pStyle w:val="Compact"/>
+              <w:jc w:val="left"/>
+            </w:pPr>
+            <w:r>
+              <w:t xml:space="preserve">Áp tiêu chí đưa vào / loại ra → giữ 10–30 bài</w:t>
+            </w:r>
+          </w:p>
+        </w:tc>
+      </w:tr>
+      <w:tr>
+        <w:tc>
+          <w:tcPr/>
+          <w:p>
+            <w:pPr>
+              <w:pStyle w:val="Compact"/>
+              <w:jc w:val="left"/>
+            </w:pPr>
+            <w:r>
+              <w:t xml:space="preserve">3. Lấy toàn văn</w:t>
+            </w:r>
+          </w:p>
+        </w:tc>
+        <w:tc>
+          <w:tcPr/>
+          <w:p>
+            <w:pPr>
+              <w:pStyle w:val="Compact"/>
+              <w:jc w:val="left"/>
+            </w:pPr>
+            <w:r>
+              <w:rPr>
+                <w:bCs/>
+                <w:b/>
+              </w:rPr>
+              <w:t xml:space="preserve">Sci-Hub</w:t>
+            </w:r>
+            <w:r>
+              <w:t xml:space="preserve"> </w:t>
+            </w:r>
+            <w:r>
+              <w:t xml:space="preserve">(tra theo DOI hoặc tiêu đề) · Unpaywall · CORE · VJOL · CyberLeninka · eLIBRARY.ru</w:t>
+            </w:r>
+          </w:p>
+        </w:tc>
+        <w:tc>
+          <w:tcPr/>
+          <w:p>
+            <w:pPr>
+              <w:pStyle w:val="Compact"/>
+              <w:jc w:val="left"/>
+            </w:pPr>
+            <w:r>
+              <w:t xml:space="preserve">Tải PDF để đọc kỹ</w:t>
+            </w:r>
+          </w:p>
+        </w:tc>
+      </w:tr>
+      <w:tr>
+        <w:tc>
+          <w:tcPr/>
+          <w:p>
+            <w:pPr>
+              <w:pStyle w:val="Compact"/>
+              <w:jc w:val="left"/>
+            </w:pPr>
+            <w:r>
+              <w:t xml:space="preserve">4. Đưa vào dự án</w:t>
+            </w:r>
+          </w:p>
+        </w:tc>
+        <w:tc>
+          <w:tcPr/>
+          <w:p>
+            <w:pPr>
+              <w:pStyle w:val="Compact"/>
+              <w:jc w:val="left"/>
+            </w:pPr>
+            <w:r>
+              <w:t xml:space="preserve">Claude</w:t>
+            </w:r>
+          </w:p>
+        </w:tc>
+        <w:tc>
+          <w:tcPr/>
+          <w:p>
+            <w:pPr>
+              <w:pStyle w:val="Compact"/>
+              <w:jc w:val="left"/>
+            </w:pPr>
+            <w:r>
+              <w:t xml:space="preserve">Tải PDF vào dự án → lập ma trận bằng chứng (Slide 13)</w:t>
+            </w:r>
+          </w:p>
+        </w:tc>
+      </w:tr>
+    </w:tbl>
     <w:p>
       <w:pPr>
         <w:pStyle w:val="BodyText"/>
@@ -9276,7 +8888,7 @@
           <w:bCs/>
           <w:b/>
         </w:rPr>
-        <w:t xml:space="preserve">🆕 Khoảng trống gợi ý – có căn cứ từ phân tích dữ liệu thật</w:t>
+        <w:t xml:space="preserve">Câu hỏi mẫu cho Sci-Bot:</w:t>
       </w:r>
       <w:r>
         <w:t xml:space="preserve"> </w:t>
@@ -9286,44 +8898,47 @@
           <w:iCs/>
           <w:i/>
         </w:rPr>
-        <w:t xml:space="preserve">(đề xuất, nhà khoa học quyết định)</w:t>
-      </w:r>
-      <w:r>
-        <w:t xml:space="preserve">:</w:t>
-      </w:r>
-      <w:r>
-        <w:t xml:space="preserve"> </w:t>
-      </w:r>
-      <w:r>
-        <w:t xml:space="preserve">1. Mô hình quốc tế</w:t>
-      </w:r>
-      <w:r>
-        <w:t xml:space="preserve"> </w:t>
-      </w:r>
-      <w:r>
-        <w:rPr>
-          <w:bCs/>
-          <w:b/>
-        </w:rPr>
-        <w:t xml:space="preserve">đánh giá thấp ~31%</w:t>
-      </w:r>
-      <w:r>
-        <w:t xml:space="preserve"> </w:t>
-      </w:r>
-      <w:r>
-        <w:t xml:space="preserve">ăn mòn thép ở Việt Nam → cần hàm liều – đáp ứng hiệu chỉnh cho khí hậu nhiệt đới (thêm độ ẩm, mưa, chu kỳ khô – ướt).</w:t>
-      </w:r>
-      <w:r>
-        <w:t xml:space="preserve"> </w:t>
-      </w:r>
-      <w:r>
-        <w:t xml:space="preserve">2. Huế, Nha Trang ăn mòn cao dù clorua thấp → yếu tố chưa được giải thích.</w:t>
-      </w:r>
-      <w:r>
-        <w:t xml:space="preserve"> </w:t>
-      </w:r>
-      <w:r>
-        <w:t xml:space="preserve">3. Số liệu Việt Nam chủ yếu 1995–2005, chủ yếu thép cacbon năm đầu → thiếu dữ liệu dài hạn và cập nhật theo biến đổi khí hậu.</w:t>
+        <w:t xml:space="preserve">“</w:t>
+      </w:r>
+      <w:r>
+        <w:rPr>
+          <w:iCs/>
+          <w:i/>
+        </w:rPr>
+        <w:t xml:space="preserve">Which environmental factors control the first-year atmospheric corrosion rate of carbon steel in tropical climates, and how accurate is the ISO 9223 dose-response function there?</w:t>
+      </w:r>
+      <w:r>
+        <w:rPr>
+          <w:iCs/>
+          <w:i/>
+        </w:rPr>
+        <w:t xml:space="preserve">”</w:t>
+      </w:r>
+    </w:p>
+    <w:p>
+      <w:pPr>
+        <w:pStyle w:val="BlockText"/>
+      </w:pPr>
+      <w:r>
+        <w:t xml:space="preserve">Lưu ý khi dùng: Sci-Bot là bản thử nghiệm – mỗi lần một câu hỏi, thiếu bài mới (sau ~2021–2022) → bổ sung bài mới bằng Google Scholar Labs; kiểm tra DOI của mọi trích dẫn. Chỉ truy cập địa chỉ chính thức (nhiều trang giả mạo); không dùng trên máy có tài liệu mật.</w:t>
+      </w:r>
+    </w:p>
+    <w:p>
+      <w:pPr>
+        <w:pStyle w:val="FirstParagraph"/>
+      </w:pPr>
+      <w:r>
+        <w:rPr>
+          <w:bCs/>
+          <w:b/>
+        </w:rPr>
+        <w:t xml:space="preserve">Hình ảnh:</w:t>
+      </w:r>
+      <w:r>
+        <w:t xml:space="preserve"> </w:t>
+      </w:r>
+      <w:r>
+        <w:t xml:space="preserve">ảnh chụp Sci-Bot trả lời câu hỏi mẫu kèm danh sách bài; ảnh Sci-Hub tra một bài theo DOI; ảnh bảng lọc bài trên Claude.</w:t>
       </w:r>
     </w:p>
     <w:p>
@@ -9335,13 +8950,43 @@
           <w:bCs/>
           <w:b/>
         </w:rPr>
-        <w:t xml:space="preserve">Hình ảnh (thay bảng tài liệu):</w:t>
-      </w:r>
-      <w:r>
-        <w:t xml:space="preserve"> </w:t>
-      </w:r>
-      <w:r>
-        <w:t xml:space="preserve">ảnh chụp ma trận bằng chứng do AI lập và 3 khoảng trống có điểm phản biện.</w:t>
+        <w:t xml:space="preserve">Không chiếu (tài liệu phát tay):</w:t>
+      </w:r>
+      <w:r>
+        <w:t xml:space="preserve"> </w:t>
+      </w:r>
+      <w:r>
+        <w:t xml:space="preserve">hướng dẫn chi tiết từng công cụ –</w:t>
+      </w:r>
+      <w:r>
+        <w:t xml:space="preserve"> </w:t>
+      </w:r>
+      <w:r>
+        <w:rPr>
+          <w:rStyle w:val="VerbatimChar"/>
+        </w:rPr>
+        <w:t xml:space="preserve">TAI-LIEU-PHAT-TAY.md</w:t>
+      </w:r>
+      <w:r>
+        <w:t xml:space="preserve"> </w:t>
+      </w:r>
+      <w:r>
+        <w:t xml:space="preserve">mục 11; câu lệnh lọc tài liệu –</w:t>
+      </w:r>
+      <w:r>
+        <w:t xml:space="preserve"> </w:t>
+      </w:r>
+      <w:r>
+        <w:rPr>
+          <w:rStyle w:val="VerbatimChar"/>
+        </w:rPr>
+        <w:t xml:space="preserve">cau-lenh-demo.md</w:t>
+      </w:r>
+      <w:r>
+        <w:t xml:space="preserve"> </w:t>
+      </w:r>
+      <w:r>
+        <w:t xml:space="preserve">mục 14.</w:t>
       </w:r>
     </w:p>
     <w:p>
@@ -9353,58 +8998,13 @@
           <w:bCs/>
           <w:b/>
         </w:rPr>
-        <w:t xml:space="preserve">Không chiếu (tài liệu phát tay):</w:t>
-      </w:r>
-      <w:r>
-        <w:t xml:space="preserve"> </w:t>
-      </w:r>
-      <w:r>
-        <w:t xml:space="preserve">danh mục 8 tài liệu thật dùng cho demo –</w:t>
-      </w:r>
-      <w:r>
-        <w:t xml:space="preserve"> </w:t>
-      </w:r>
-      <w:r>
-        <w:rPr>
-          <w:rStyle w:val="VerbatimChar"/>
-        </w:rPr>
-        <w:t xml:space="preserve">TAI-LIEU-PHAT-TAY.md</w:t>
-      </w:r>
-      <w:r>
-        <w:t xml:space="preserve"> </w:t>
-      </w:r>
-      <w:r>
-        <w:t xml:space="preserve">mục 7; danh mục đầy đủ 13 tài liệu:</w:t>
-      </w:r>
-      <w:r>
-        <w:t xml:space="preserve"> </w:t>
-      </w:r>
-      <w:r>
-        <w:rPr>
-          <w:rStyle w:val="VerbatimChar"/>
-        </w:rPr>
-        <w:t xml:space="preserve">du-an-nghien-cuu/01-tong-quan-tai-lieu/DANH-MUC-TAI-LIEU.csv</w:t>
-      </w:r>
-      <w:r>
-        <w:t xml:space="preserve">.</w:t>
-      </w:r>
-    </w:p>
-    <w:p>
-      <w:pPr>
-        <w:pStyle w:val="BodyText"/>
-      </w:pPr>
-      <w:r>
-        <w:rPr>
-          <w:bCs/>
-          <w:b/>
-        </w:rPr>
         <w:t xml:space="preserve">Nguồn:</w:t>
       </w:r>
       <w:r>
         <w:t xml:space="preserve"> </w:t>
       </w:r>
       <w:r>
-        <w:t xml:space="preserve">G2 · N25 (công cụ tài liệu) · tài liệu 1–8 · Câu lệnh 1.1–1.3</w:t>
+        <w:t xml:space="preserve">N33, N35–N37</w:t>
       </w:r>
     </w:p>
     <w:p>
@@ -9442,14 +9042,14 @@
         </w:pict>
       </w:r>
     </w:p>
-    <w:bookmarkEnd w:id="39"/>
-    <w:bookmarkStart w:id="40" w:name="X8d7e78c22fb4cd32c248eb2d592e06664dd5bd7"/>
+    <w:bookmarkEnd w:id="38"/>
+    <w:bookmarkStart w:id="39" w:name="X86b8179ee4983cce1e74e4be426ed43bc51a863"/>
     <w:p>
       <w:pPr>
         <w:pStyle w:val="Heading2"/>
       </w:pPr>
       <w:r>
-        <w:t xml:space="preserve">Slide 14 – Đề xuất nhiệm vụ: từ khoảng trống đến phiếu đề xuất và thuyết minh – DEMO 1 (5′)</w:t>
+        <w:t xml:space="preserve">Slide 13 – Tổng quan tài liệu: từ bài báo đến khoảng trống nghiên cứu (6′)</w:t>
       </w:r>
     </w:p>
     <w:p>
@@ -9467,45 +9067,67 @@
         <w:t xml:space="preserve"> </w:t>
       </w:r>
       <w:r>
-        <w:t xml:space="preserve">- Khoảng trống → tính cấp thiết, mục tiêu, nội dung, phương pháp, sản phẩm</w:t>
-      </w:r>
-      <w:r>
-        <w:t xml:space="preserve"> </w:t>
-      </w:r>
-      <w:r>
-        <w:t xml:space="preserve">- 🎬</w:t>
-      </w:r>
-      <w:r>
-        <w:t xml:space="preserve"> </w:t>
-      </w:r>
-      <w:r>
-        <w:rPr>
-          <w:bCs/>
-          <w:b/>
-        </w:rPr>
-        <w:t xml:space="preserve">Kết quả demo đã chạy trước:</w:t>
-      </w:r>
-      <w:r>
-        <w:t xml:space="preserve"> </w:t>
-      </w:r>
-      <w:r>
-        <w:t xml:space="preserve">đưa</w:t>
-      </w:r>
-      <w:r>
-        <w:t xml:space="preserve"> </w:t>
-      </w:r>
-      <w:r>
-        <w:rPr>
-          <w:bCs/>
-          <w:b/>
-        </w:rPr>
-        <w:t xml:space="preserve">biểu mẫu thật của Trung tâm</w:t>
-      </w:r>
-      <w:r>
-        <w:t xml:space="preserve"> </w:t>
-      </w:r>
-      <w:r>
-        <w:t xml:space="preserve">(phiếu đề xuất, thuyết minh) vào dự án → AI điền theo khoảng trống đã chọn – trình chiếu ảnh biểu mẫu đã điền và bảng đối chiếu</w:t>
+        <w:t xml:space="preserve">-</w:t>
+      </w:r>
+      <w:r>
+        <w:t xml:space="preserve"> </w:t>
+      </w:r>
+      <w:r>
+        <w:rPr>
+          <w:bCs/>
+          <w:b/>
+        </w:rPr>
+        <w:t xml:space="preserve">Tình huống:</w:t>
+      </w:r>
+      <w:r>
+        <w:t xml:space="preserve"> </w:t>
+      </w:r>
+      <w:r>
+        <w:t xml:space="preserve">ăn mòn khí quyển của kim loại trong khí hậu nhiệt đới Việt Nam</w:t>
+      </w:r>
+      <w:r>
+        <w:t xml:space="preserve"> </w:t>
+      </w:r>
+      <w:r>
+        <w:t xml:space="preserve">- 🌍</w:t>
+      </w:r>
+      <w:r>
+        <w:t xml:space="preserve"> </w:t>
+      </w:r>
+      <w:r>
+        <w:rPr>
+          <w:bCs/>
+          <w:b/>
+        </w:rPr>
+        <w:t xml:space="preserve">Ví dụ thật:</w:t>
+      </w:r>
+      <w:r>
+        <w:t xml:space="preserve"> </w:t>
+      </w:r>
+      <w:r>
+        <w:t xml:space="preserve">AI co-scientist (Google) – nhiều trợ lý đề xuất, phản biện, xếp hạng giả thuyết</w:t>
+      </w:r>
+      <w:r>
+        <w:t xml:space="preserve"> </w:t>
+      </w:r>
+      <w:r>
+        <w:t xml:space="preserve">- 🧰</w:t>
+      </w:r>
+      <w:r>
+        <w:t xml:space="preserve"> </w:t>
+      </w:r>
+      <w:r>
+        <w:rPr>
+          <w:bCs/>
+          <w:b/>
+        </w:rPr>
+        <w:t xml:space="preserve">Tài liệu đầu vào:</w:t>
+      </w:r>
+      <w:r>
+        <w:t xml:space="preserve"> </w:t>
+      </w:r>
+      <w:r>
+        <w:t xml:space="preserve">các bài đã tìm, lọc ở Slide 12; công cụ hỗ trợ đọc: Claude Research · Elicit (tổng quan hệ thống, trích xuất bảng) · Consensus (câu trả lời có dẫn chứng) · Semantic Scholar (miễn phí) · Scite (trích dẫn ủng hộ hay phản bác) · ResearchRabbit (bản đồ trích dẫn)</w:t>
       </w:r>
       <w:r>
         <w:t xml:space="preserve"> </w:t>
@@ -9527,54 +9149,151 @@
         <w:t xml:space="preserve"> </w:t>
       </w:r>
       <w:r>
+        <w:t xml:space="preserve">&gt; Từ các bài báo trong dự án, lập ma trận bằng chứng (tác giả – năm, địa điểm, kim loại, thời gian phơi mẫu, biến môi trường, mô hình, kết luận, hạn chế). Chỉ ra điểm chưa thống nhất và 3 khoảng trống cho điều kiện Việt Nam, mỗi khoảng trống dẫn chứng ít nhất 2 bài.</w:t>
+      </w:r>
+      <w:r>
+        <w:t xml:space="preserve"> </w:t>
+      </w:r>
+      <w:r>
+        <w:t xml:space="preserve">- ✅</w:t>
+      </w:r>
+      <w:r>
+        <w:t xml:space="preserve"> </w:t>
+      </w:r>
+      <w:r>
+        <w:rPr>
+          <w:bCs/>
+          <w:b/>
+        </w:rPr>
+        <w:t xml:space="preserve">Nhà khoa học xác nhận:</w:t>
+      </w:r>
+      <w:r>
+        <w:t xml:space="preserve"> </w:t>
+      </w:r>
+      <w:r>
+        <w:t xml:space="preserve">nguồn có thật; khoảng trống có giá trị</w:t>
+      </w:r>
+    </w:p>
+    <w:p>
+      <w:pPr>
+        <w:pStyle w:val="BodyText"/>
+      </w:pPr>
+      <w:r>
+        <w:rPr>
+          <w:bCs/>
+          <w:b/>
+        </w:rPr>
+        <w:t xml:space="preserve">🆕 Khoảng trống gợi ý – có căn cứ từ phân tích dữ liệu thật</w:t>
+      </w:r>
+      <w:r>
+        <w:t xml:space="preserve"> </w:t>
+      </w:r>
+      <w:r>
+        <w:rPr>
+          <w:iCs/>
+          <w:i/>
+        </w:rPr>
+        <w:t xml:space="preserve">(đề xuất, nhà khoa học quyết định)</w:t>
+      </w:r>
+      <w:r>
+        <w:t xml:space="preserve">:</w:t>
+      </w:r>
+      <w:r>
+        <w:t xml:space="preserve"> </w:t>
+      </w:r>
+      <w:r>
+        <w:t xml:space="preserve">1. Mô hình quốc tế</w:t>
+      </w:r>
+      <w:r>
+        <w:t xml:space="preserve"> </w:t>
+      </w:r>
+      <w:r>
+        <w:rPr>
+          <w:bCs/>
+          <w:b/>
+        </w:rPr>
+        <w:t xml:space="preserve">đánh giá thấp ~31%</w:t>
+      </w:r>
+      <w:r>
+        <w:t xml:space="preserve"> </w:t>
+      </w:r>
+      <w:r>
+        <w:t xml:space="preserve">ăn mòn thép ở Việt Nam → cần hàm liều – đáp ứng hiệu chỉnh cho khí hậu nhiệt đới (thêm độ ẩm, mưa, chu kỳ khô – ướt).</w:t>
+      </w:r>
+      <w:r>
+        <w:t xml:space="preserve"> </w:t>
+      </w:r>
+      <w:r>
+        <w:t xml:space="preserve">2. Huế, Nha Trang ăn mòn cao dù clorua thấp → yếu tố chưa được giải thích.</w:t>
+      </w:r>
+      <w:r>
+        <w:t xml:space="preserve"> </w:t>
+      </w:r>
+      <w:r>
+        <w:t xml:space="preserve">3. Số liệu Việt Nam chủ yếu 1995–2005, chủ yếu thép cacbon năm đầu → thiếu dữ liệu dài hạn và cập nhật theo biến đổi khí hậu.</w:t>
+      </w:r>
+    </w:p>
+    <w:p>
+      <w:pPr>
+        <w:pStyle w:val="BodyText"/>
+      </w:pPr>
+      <w:r>
+        <w:rPr>
+          <w:bCs/>
+          <w:b/>
+        </w:rPr>
+        <w:t xml:space="preserve">Hình ảnh (thay bảng tài liệu):</w:t>
+      </w:r>
+      <w:r>
+        <w:t xml:space="preserve"> </w:t>
+      </w:r>
+      <w:r>
+        <w:t xml:space="preserve">ảnh chụp ma trận bằng chứng do AI lập và 3 khoảng trống có điểm phản biện.</w:t>
+      </w:r>
+    </w:p>
+    <w:p>
+      <w:pPr>
+        <w:pStyle w:val="BodyText"/>
+      </w:pPr>
+      <w:r>
+        <w:rPr>
+          <w:bCs/>
+          <w:b/>
+        </w:rPr>
+        <w:t xml:space="preserve">Không chiếu (tài liệu phát tay):</w:t>
+      </w:r>
+      <w:r>
+        <w:t xml:space="preserve"> </w:t>
+      </w:r>
+      <w:r>
+        <w:t xml:space="preserve">danh mục 8 tài liệu thật dùng cho demo –</w:t>
+      </w:r>
+      <w:r>
+        <w:t xml:space="preserve"> </w:t>
+      </w:r>
+      <w:r>
         <w:rPr>
           <w:rStyle w:val="VerbatimChar"/>
         </w:rPr>
-        <w:t xml:space="preserve">Đọc biểu mẫu [tên biểu mẫu] trong dự án. Liệt kê toàn bộ mục và yêu cầu của từng mục.   Điền nội dung cho khoảng trống số [1]: giữ nguyên số mục, tiêu đề, định dạng của mẫu;   mục nào thiếu thông tin ghi [CẦN BỔ SUNG: ...]; không tự đặt số liệu.   Sau đó lập bảng đối chiếu Mục tiêu → Nội dung → Phương pháp → Sản phẩm → Chỉ tiêu,   đánh dấu ⚠ chỗ không khớp. Xuất tệp .docx.</w:t>
-      </w:r>
-      <w:r>
-        <w:t xml:space="preserve"> </w:t>
-      </w:r>
-      <w:r>
-        <w:t xml:space="preserve">- 📊</w:t>
-      </w:r>
-      <w:r>
-        <w:t xml:space="preserve"> </w:t>
-      </w:r>
-      <w:r>
-        <w:rPr>
-          <w:bCs/>
-          <w:b/>
-        </w:rPr>
-        <w:t xml:space="preserve">Kết quả mong đợi:</w:t>
-      </w:r>
-      <w:r>
-        <w:t xml:space="preserve"> </w:t>
-      </w:r>
-      <w:r>
-        <w:t xml:space="preserve">biểu mẫu đã điền đúng cấu trúc; danh sách [CẦN BỔ SUNG]; bảng đối chiếu có dấu ⚠</w:t>
-      </w:r>
-      <w:r>
-        <w:t xml:space="preserve"> </w:t>
-      </w:r>
-      <w:r>
-        <w:t xml:space="preserve">- ✅</w:t>
-      </w:r>
-      <w:r>
-        <w:t xml:space="preserve"> </w:t>
-      </w:r>
-      <w:r>
-        <w:rPr>
-          <w:bCs/>
-          <w:b/>
-        </w:rPr>
-        <w:t xml:space="preserve">Nhà khoa học xác nhận:</w:t>
-      </w:r>
-      <w:r>
-        <w:t xml:space="preserve"> </w:t>
-      </w:r>
-      <w:r>
-        <w:t xml:space="preserve">tính mới, tính khả thi, chỉ tiêu</w:t>
+        <w:t xml:space="preserve">TAI-LIEU-PHAT-TAY.md</w:t>
+      </w:r>
+      <w:r>
+        <w:t xml:space="preserve"> </w:t>
+      </w:r>
+      <w:r>
+        <w:t xml:space="preserve">mục 7; danh mục đầy đủ 13 tài liệu:</w:t>
+      </w:r>
+      <w:r>
+        <w:t xml:space="preserve"> </w:t>
+      </w:r>
+      <w:r>
+        <w:rPr>
+          <w:rStyle w:val="VerbatimChar"/>
+        </w:rPr>
+        <w:t xml:space="preserve">du-an-nghien-cuu/01-tong-quan-tai-lieu/DANH-MUC-TAI-LIEU.csv</w:t>
+      </w:r>
+      <w:r>
+        <w:t xml:space="preserve">.</w:t>
       </w:r>
     </w:p>
     <w:p>
@@ -9586,65 +9305,13 @@
           <w:bCs/>
           <w:b/>
         </w:rPr>
-        <w:t xml:space="preserve">⚠ Dữ liệu khi chạy trước demo:</w:t>
-      </w:r>
-      <w:r>
-        <w:t xml:space="preserve"> </w:t>
-      </w:r>
-      <w:r>
-        <w:t xml:space="preserve">biểu mẫu trống = nhóm xanh;</w:t>
-      </w:r>
-      <w:r>
-        <w:t xml:space="preserve"> </w:t>
-      </w:r>
-      <w:r>
-        <w:rPr>
-          <w:bCs/>
-          <w:b/>
-        </w:rPr>
-        <w:t xml:space="preserve">nội dung đề xuất thật = nhóm vàng</w:t>
-      </w:r>
-      <w:r>
-        <w:t xml:space="preserve"> </w:t>
-      </w:r>
-      <w:r>
-        <w:t xml:space="preserve">→ chỉ dùng tài khoản gói tổ chức (không huấn luyện mô hình), hoặc dùng nội dung đề xuất giả định cho ảnh trình chiếu.</w:t>
-      </w:r>
-    </w:p>
-    <w:p>
-      <w:pPr>
-        <w:pStyle w:val="BodyText"/>
-      </w:pPr>
-      <w:r>
-        <w:rPr>
-          <w:bCs/>
-          <w:b/>
-        </w:rPr>
-        <w:t xml:space="preserve">Hình ảnh:</w:t>
-      </w:r>
-      <w:r>
-        <w:t xml:space="preserve"> </w:t>
-      </w:r>
-      <w:r>
-        <w:t xml:space="preserve">ảnh chụp bảng đối chiếu có dấu ⚠.</w:t>
-      </w:r>
-    </w:p>
-    <w:p>
-      <w:pPr>
-        <w:pStyle w:val="BodyText"/>
-      </w:pPr>
-      <w:r>
-        <w:rPr>
-          <w:bCs/>
-          <w:b/>
-        </w:rPr>
-        <w:t xml:space="preserve">Việc phải làm:</w:t>
-      </w:r>
-      <w:r>
-        <w:t xml:space="preserve"> </w:t>
-      </w:r>
-      <w:r>
-        <w:t xml:space="preserve">người trình bày gửi biểu mẫu của Trung tâm → chạy thử 2 lần, ghi hình lần chạy tốt nhất.</w:t>
+        <w:t xml:space="preserve">Nguồn:</w:t>
+      </w:r>
+      <w:r>
+        <w:t xml:space="preserve"> </w:t>
+      </w:r>
+      <w:r>
+        <w:t xml:space="preserve">G2 · N25 (công cụ tài liệu) · tài liệu 1–8 · Câu lệnh 1.1–1.3</w:t>
       </w:r>
     </w:p>
     <w:p>
@@ -9682,14 +9349,14 @@
         </w:pict>
       </w:r>
     </w:p>
-    <w:bookmarkEnd w:id="40"/>
-    <w:bookmarkStart w:id="41" w:name="X04139c6c9f22e69b4fed779d765a15c1fb6457c"/>
+    <w:bookmarkEnd w:id="39"/>
+    <w:bookmarkStart w:id="40" w:name="X8d7e78c22fb4cd32c248eb2d592e06664dd5bd7"/>
     <w:p>
       <w:pPr>
         <w:pStyle w:val="Heading2"/>
       </w:pPr>
       <w:r>
-        <w:t xml:space="preserve">Slide 15 – Hồ sơ nhiệm vụ: thuyết minh, tiến độ và kinh phí theo biểu mẫu Trung tâm (4′)</w:t>
+        <w:t xml:space="preserve">Slide 14 – Đề xuất nhiệm vụ: từ khoảng trống đến phiếu đề xuất và thuyết minh – DEMO 1 (5′)</w:t>
       </w:r>
     </w:p>
     <w:p>
@@ -9707,6 +9374,12 @@
         <w:t xml:space="preserve"> </w:t>
       </w:r>
       <w:r>
+        <w:t xml:space="preserve">- Khoảng trống → tính cấp thiết, mục tiêu, nội dung, phương pháp, sản phẩm</w:t>
+      </w:r>
+      <w:r>
+        <w:t xml:space="preserve"> </w:t>
+      </w:r>
+      <w:r>
         <w:t xml:space="preserve">- 🎬</w:t>
       </w:r>
       <w:r>
@@ -9723,7 +9396,23 @@
         <w:t xml:space="preserve"> </w:t>
       </w:r>
       <w:r>
-        <w:t xml:space="preserve">biểu mẫu thuyết minh – tiến độ – dự toán của Trung tâm được AI lập từ thuyết minh đã duyệt</w:t>
+        <w:t xml:space="preserve">đưa</w:t>
+      </w:r>
+      <w:r>
+        <w:t xml:space="preserve"> </w:t>
+      </w:r>
+      <w:r>
+        <w:rPr>
+          <w:bCs/>
+          <w:b/>
+        </w:rPr>
+        <w:t xml:space="preserve">biểu mẫu thật của Trung tâm</w:t>
+      </w:r>
+      <w:r>
+        <w:t xml:space="preserve"> </w:t>
+      </w:r>
+      <w:r>
+        <w:t xml:space="preserve">(phiếu đề xuất, thuyết minh) vào dự án → AI điền theo khoảng trống đã chọn – trình chiếu ảnh biểu mẫu đã điền và bảng đối chiếu</w:t>
       </w:r>
       <w:r>
         <w:t xml:space="preserve"> </w:t>
@@ -9748,7 +9437,7 @@
         <w:rPr>
           <w:rStyle w:val="VerbatimChar"/>
         </w:rPr>
-        <w:t xml:space="preserve">Từ thuyết minh đã duyệt, lập: (1) bảng nội dung công việc – sản phẩm – thời gian – người   thực hiện; (2) sơ đồ Gantt; (3) dự toán theo biểu mẫu [tên], dùng ĐÚNG đơn giá và định mức   tôi cung cấp, không tự đặt đơn giá; (4) kiểm tra logic trình tự và tổng kinh phí;   liệt kê bất hợp lý và đề xuất điều chỉnh. Xuất Word và Excel.</w:t>
+        <w:t xml:space="preserve">Đọc biểu mẫu [tên biểu mẫu] trong dự án. Liệt kê toàn bộ mục và yêu cầu của từng mục.   Điền nội dung cho khoảng trống số [1]: giữ nguyên số mục, tiêu đề, định dạng của mẫu;   mục nào thiếu thông tin ghi [CẦN BỔ SUNG: ...]; không tự đặt số liệu.   Sau đó lập bảng đối chiếu Mục tiêu → Nội dung → Phương pháp → Sản phẩm → Chỉ tiêu,   đánh dấu ⚠ chỗ không khớp. Xuất tệp .docx.</w:t>
       </w:r>
       <w:r>
         <w:t xml:space="preserve"> </w:t>
@@ -9764,35 +9453,13 @@
           <w:bCs/>
           <w:b/>
         </w:rPr>
-        <w:t xml:space="preserve">Minh họa phát hiện lỗi</w:t>
-      </w:r>
-      <w:r>
-        <w:t xml:space="preserve"> </w:t>
-      </w:r>
-      <w:r>
-        <w:t xml:space="preserve">(dữ liệu giả lập): AI tìm ra 3 bất hợp lý cài sẵn – thu mẫu trước khi lắp xong giá phơi mẫu; quan trắc khí tượng kết thúc trước mốc thu mẫu cuối; công bố trước khi mô hình xong</w:t>
-      </w:r>
-      <w:r>
-        <w:t xml:space="preserve"> </w:t>
-      </w:r>
-      <w:r>
-        <w:t xml:space="preserve">-</w:t>
-      </w:r>
-      <w:r>
-        <w:t xml:space="preserve"> </w:t>
-      </w:r>
-      <w:r>
-        <w:rPr>
-          <w:bCs/>
-          <w:b/>
-        </w:rPr>
-        <w:t xml:space="preserve">Căn cứ lập dự toán:</w:t>
-      </w:r>
-      <w:r>
-        <w:t xml:space="preserve"> </w:t>
-      </w:r>
-      <w:r>
-        <w:t xml:space="preserve">Thông tư 03/2023/TT-BTC (định mức tối đa cho nhiệm vụ KH&amp;CN dùng ngân sách nhà nước) và quy định riêng của Bộ Quốc phòng, Trung tâm</w:t>
+        <w:t xml:space="preserve">Kết quả mong đợi:</w:t>
+      </w:r>
+      <w:r>
+        <w:t xml:space="preserve"> </w:t>
+      </w:r>
+      <w:r>
+        <w:t xml:space="preserve">biểu mẫu đã điền đúng cấu trúc; danh sách [CẦN BỔ SUNG]; bảng đối chiếu có dấu ⚠</w:t>
       </w:r>
       <w:r>
         <w:t xml:space="preserve"> </w:t>
@@ -9808,13 +9475,13 @@
           <w:bCs/>
           <w:b/>
         </w:rPr>
-        <w:t xml:space="preserve">Xác nhận:</w:t>
-      </w:r>
-      <w:r>
-        <w:t xml:space="preserve"> </w:t>
-      </w:r>
-      <w:r>
-        <w:t xml:space="preserve">số liệu tài chính do cán bộ tài chính xác nhận</w:t>
+        <w:t xml:space="preserve">Nhà khoa học xác nhận:</w:t>
+      </w:r>
+      <w:r>
+        <w:t xml:space="preserve"> </w:t>
+      </w:r>
+      <w:r>
+        <w:t xml:space="preserve">tính mới, tính khả thi, chỉ tiêu</w:t>
       </w:r>
     </w:p>
     <w:p>
@@ -9826,25 +9493,47 @@
           <w:bCs/>
           <w:b/>
         </w:rPr>
+        <w:t xml:space="preserve">⚠ Dữ liệu khi chạy trước demo:</w:t>
+      </w:r>
+      <w:r>
+        <w:t xml:space="preserve"> </w:t>
+      </w:r>
+      <w:r>
+        <w:t xml:space="preserve">biểu mẫu trống = nhóm xanh;</w:t>
+      </w:r>
+      <w:r>
+        <w:t xml:space="preserve"> </w:t>
+      </w:r>
+      <w:r>
+        <w:rPr>
+          <w:bCs/>
+          <w:b/>
+        </w:rPr>
+        <w:t xml:space="preserve">nội dung đề xuất thật = nhóm vàng</w:t>
+      </w:r>
+      <w:r>
+        <w:t xml:space="preserve"> </w:t>
+      </w:r>
+      <w:r>
+        <w:t xml:space="preserve">→ chỉ dùng tài khoản gói tổ chức (không huấn luyện mô hình), hoặc dùng nội dung đề xuất giả định cho ảnh trình chiếu.</w:t>
+      </w:r>
+    </w:p>
+    <w:p>
+      <w:pPr>
+        <w:pStyle w:val="BodyText"/>
+      </w:pPr>
+      <w:r>
+        <w:rPr>
+          <w:bCs/>
+          <w:b/>
+        </w:rPr>
         <w:t xml:space="preserve">Hình ảnh:</w:t>
       </w:r>
       <w:r>
         <w:t xml:space="preserve"> </w:t>
       </w:r>
       <w:r>
-        <w:t xml:space="preserve">biểu mẫu đã điền;</w:t>
-      </w:r>
-      <w:r>
-        <w:t xml:space="preserve"> </w:t>
-      </w:r>
-      <w:r>
-        <w:rPr>
-          <w:rStyle w:val="VerbatimChar"/>
-        </w:rPr>
-        <w:t xml:space="preserve">thuyet-trinh/ket-qua-demo/gia-lap/so_do_gantt.png</w:t>
-      </w:r>
-      <w:r>
-        <w:t xml:space="preserve">.</w:t>
+        <w:t xml:space="preserve">ảnh chụp bảng đối chiếu có dấu ⚠.</w:t>
       </w:r>
     </w:p>
     <w:p>
@@ -9862,25 +9551,7 @@
         <w:t xml:space="preserve"> </w:t>
       </w:r>
       <w:r>
-        <w:t xml:space="preserve">người trình bày gửi biểu mẫu thuyết minh – tiến độ – dự toán; xác nhận văn bản định mức áp dụng trong Bộ Quốc phòng.</w:t>
-      </w:r>
-    </w:p>
-    <w:p>
-      <w:pPr>
-        <w:pStyle w:val="BodyText"/>
-      </w:pPr>
-      <w:r>
-        <w:rPr>
-          <w:bCs/>
-          <w:b/>
-        </w:rPr>
-        <w:t xml:space="preserve">Nguồn:</w:t>
-      </w:r>
-      <w:r>
-        <w:t xml:space="preserve"> </w:t>
-      </w:r>
-      <w:r>
-        <w:t xml:space="preserve">N26 (Thông tư 03/2023/TT-BTC)</w:t>
+        <w:t xml:space="preserve">người trình bày gửi biểu mẫu của Trung tâm → chạy thử 2 lần, ghi hình lần chạy tốt nhất.</w:t>
       </w:r>
     </w:p>
     <w:p>
@@ -9918,6 +9589,242 @@
         </w:pict>
       </w:r>
     </w:p>
+    <w:bookmarkEnd w:id="40"/>
+    <w:bookmarkStart w:id="41" w:name="X04139c6c9f22e69b4fed779d765a15c1fb6457c"/>
+    <w:p>
+      <w:pPr>
+        <w:pStyle w:val="Heading2"/>
+      </w:pPr>
+      <w:r>
+        <w:t xml:space="preserve">Slide 15 – Hồ sơ nhiệm vụ: thuyết minh, tiến độ và kinh phí theo biểu mẫu Trung tâm (4′)</w:t>
+      </w:r>
+    </w:p>
+    <w:p>
+      <w:pPr>
+        <w:pStyle w:val="FirstParagraph"/>
+      </w:pPr>
+      <w:r>
+        <w:rPr>
+          <w:bCs/>
+          <w:b/>
+        </w:rPr>
+        <w:t xml:space="preserve">Chữ trên slide:</w:t>
+      </w:r>
+      <w:r>
+        <w:t xml:space="preserve"> </w:t>
+      </w:r>
+      <w:r>
+        <w:t xml:space="preserve">- 🎬</w:t>
+      </w:r>
+      <w:r>
+        <w:t xml:space="preserve"> </w:t>
+      </w:r>
+      <w:r>
+        <w:rPr>
+          <w:bCs/>
+          <w:b/>
+        </w:rPr>
+        <w:t xml:space="preserve">Kết quả demo đã chạy trước:</w:t>
+      </w:r>
+      <w:r>
+        <w:t xml:space="preserve"> </w:t>
+      </w:r>
+      <w:r>
+        <w:t xml:space="preserve">biểu mẫu thuyết minh – tiến độ – dự toán của Trung tâm được AI lập từ thuyết minh đã duyệt</w:t>
+      </w:r>
+      <w:r>
+        <w:t xml:space="preserve"> </w:t>
+      </w:r>
+      <w:r>
+        <w:t xml:space="preserve">- ⌨</w:t>
+      </w:r>
+      <w:r>
+        <w:t xml:space="preserve"> </w:t>
+      </w:r>
+      <w:r>
+        <w:rPr>
+          <w:bCs/>
+          <w:b/>
+        </w:rPr>
+        <w:t xml:space="preserve">Câu lệnh:</w:t>
+      </w:r>
+      <w:r>
+        <w:t xml:space="preserve"> </w:t>
+      </w:r>
+      <w:r>
+        <w:rPr>
+          <w:rStyle w:val="VerbatimChar"/>
+        </w:rPr>
+        <w:t xml:space="preserve">Từ thuyết minh đã duyệt, lập: (1) bảng nội dung công việc – sản phẩm – thời gian – người   thực hiện; (2) sơ đồ Gantt; (3) dự toán theo biểu mẫu [tên], dùng ĐÚNG đơn giá và định mức   tôi cung cấp, không tự đặt đơn giá; (4) kiểm tra logic trình tự và tổng kinh phí;   liệt kê bất hợp lý và đề xuất điều chỉnh. Xuất Word và Excel.</w:t>
+      </w:r>
+      <w:r>
+        <w:t xml:space="preserve"> </w:t>
+      </w:r>
+      <w:r>
+        <w:t xml:space="preserve">- 📊</w:t>
+      </w:r>
+      <w:r>
+        <w:t xml:space="preserve"> </w:t>
+      </w:r>
+      <w:r>
+        <w:rPr>
+          <w:bCs/>
+          <w:b/>
+        </w:rPr>
+        <w:t xml:space="preserve">Minh họa phát hiện lỗi</w:t>
+      </w:r>
+      <w:r>
+        <w:t xml:space="preserve"> </w:t>
+      </w:r>
+      <w:r>
+        <w:t xml:space="preserve">(dữ liệu giả lập): AI tìm ra 3 bất hợp lý cài sẵn – thu mẫu trước khi lắp xong giá phơi mẫu; quan trắc khí tượng kết thúc trước mốc thu mẫu cuối; công bố trước khi mô hình xong</w:t>
+      </w:r>
+      <w:r>
+        <w:t xml:space="preserve"> </w:t>
+      </w:r>
+      <w:r>
+        <w:t xml:space="preserve">-</w:t>
+      </w:r>
+      <w:r>
+        <w:t xml:space="preserve"> </w:t>
+      </w:r>
+      <w:r>
+        <w:rPr>
+          <w:bCs/>
+          <w:b/>
+        </w:rPr>
+        <w:t xml:space="preserve">Căn cứ lập dự toán:</w:t>
+      </w:r>
+      <w:r>
+        <w:t xml:space="preserve"> </w:t>
+      </w:r>
+      <w:r>
+        <w:t xml:space="preserve">Thông tư 03/2023/TT-BTC (định mức tối đa cho nhiệm vụ KH&amp;CN dùng ngân sách nhà nước) và quy định riêng của Bộ Quốc phòng, Trung tâm</w:t>
+      </w:r>
+      <w:r>
+        <w:t xml:space="preserve"> </w:t>
+      </w:r>
+      <w:r>
+        <w:t xml:space="preserve">- ✅</w:t>
+      </w:r>
+      <w:r>
+        <w:t xml:space="preserve"> </w:t>
+      </w:r>
+      <w:r>
+        <w:rPr>
+          <w:bCs/>
+          <w:b/>
+        </w:rPr>
+        <w:t xml:space="preserve">Xác nhận:</w:t>
+      </w:r>
+      <w:r>
+        <w:t xml:space="preserve"> </w:t>
+      </w:r>
+      <w:r>
+        <w:t xml:space="preserve">số liệu tài chính do cán bộ tài chính xác nhận</w:t>
+      </w:r>
+    </w:p>
+    <w:p>
+      <w:pPr>
+        <w:pStyle w:val="BodyText"/>
+      </w:pPr>
+      <w:r>
+        <w:rPr>
+          <w:bCs/>
+          <w:b/>
+        </w:rPr>
+        <w:t xml:space="preserve">Hình ảnh:</w:t>
+      </w:r>
+      <w:r>
+        <w:t xml:space="preserve"> </w:t>
+      </w:r>
+      <w:r>
+        <w:t xml:space="preserve">biểu mẫu đã điền;</w:t>
+      </w:r>
+      <w:r>
+        <w:t xml:space="preserve"> </w:t>
+      </w:r>
+      <w:r>
+        <w:rPr>
+          <w:rStyle w:val="VerbatimChar"/>
+        </w:rPr>
+        <w:t xml:space="preserve">thuyet-trinh/ket-qua-demo/gia-lap/so_do_gantt.png</w:t>
+      </w:r>
+      <w:r>
+        <w:t xml:space="preserve">.</w:t>
+      </w:r>
+    </w:p>
+    <w:p>
+      <w:pPr>
+        <w:pStyle w:val="BodyText"/>
+      </w:pPr>
+      <w:r>
+        <w:rPr>
+          <w:bCs/>
+          <w:b/>
+        </w:rPr>
+        <w:t xml:space="preserve">Việc phải làm:</w:t>
+      </w:r>
+      <w:r>
+        <w:t xml:space="preserve"> </w:t>
+      </w:r>
+      <w:r>
+        <w:t xml:space="preserve">người trình bày gửi biểu mẫu thuyết minh – tiến độ – dự toán; xác nhận văn bản định mức áp dụng trong Bộ Quốc phòng.</w:t>
+      </w:r>
+    </w:p>
+    <w:p>
+      <w:pPr>
+        <w:pStyle w:val="BodyText"/>
+      </w:pPr>
+      <w:r>
+        <w:rPr>
+          <w:bCs/>
+          <w:b/>
+        </w:rPr>
+        <w:t xml:space="preserve">Nguồn:</w:t>
+      </w:r>
+      <w:r>
+        <w:t xml:space="preserve"> </w:t>
+      </w:r>
+      <w:r>
+        <w:t xml:space="preserve">N26 (Thông tư 03/2023/TT-BTC)</w:t>
+      </w:r>
+    </w:p>
+    <w:p>
+      <w:pPr>
+        <w:pStyle w:val="BodyText"/>
+      </w:pPr>
+      <w:r>
+        <w:rPr>
+          <w:bCs/>
+          <w:b/>
+        </w:rPr>
+        <w:t xml:space="preserve">Duyệt:</w:t>
+      </w:r>
+      <w:r>
+        <w:t xml:space="preserve"> </w:t>
+      </w:r>
+      <w:r>
+        <w:t xml:space="preserve">[ ] Duyệt · [ ] Sửa · [ ] Bỏ</w:t>
+      </w:r>
+      <w:r>
+        <w:t xml:space="preserve"> </w:t>
+      </w:r>
+      <w:r>
+        <w:rPr>
+          <w:bCs/>
+          <w:b/>
+        </w:rPr>
+        <w:t xml:space="preserve">Ghi chú:</w:t>
+      </w:r>
+    </w:p>
+    <w:p>
+      <w:r>
+        <w:pict>
+          <v:rect style="width:0;height:1.5pt" o:hralign="center" o:hrstd="t" o:hr="t"/>
+        </w:pict>
+      </w:r>
+    </w:p>
     <w:bookmarkEnd w:id="41"/>
     <w:bookmarkStart w:id="42" w:name="Xae2fbca96bcb46ff2b706302da1d5a4147a88ee"/>
     <w:p>
@@ -10073,7 +9980,7 @@
         <w:t xml:space="preserve"> </w:t>
       </w:r>
       <w:r>
-        <w:t xml:space="preserve">- Dữ liệu thật (387 số đo): kết quả chính đã nêu ở Slide 10; mô hình 3D ở Slide 17</w:t>
+        <w:t xml:space="preserve">- Dữ liệu thật (387 số đo): kết quả chính đã nêu ở Slide 9; mô hình 3D ở Slide 17</w:t>
       </w:r>
       <w:r>
         <w:t xml:space="preserve"> </w:t>

</xml_diff>

<commit_message>
Phần III theo mạch tài liệu → tổng quan → thuyết minh → xử lý dữ liệu
- Gộp tìm – lọc tài liệu (Sci-Bot, Sci-Hub) với tổng quan thành Slide 12
- Slide 13, 14: xây dựng, hoàn thiện thuyết minh đề tài
- Thêm Slide 15: hướng dẫn xử lý dữ liệu với AI theo 5 bước, trước demo xử lý dữ liệu (Slide 16)
- Cập nhật phụ lục định hướng, tài liệu phát tay (mục 12), tham chiếu số slide

Co-Authored-By: Claude Opus 5.5 <noreply@anthropic.com>
Claude-Session: https://claude.ai/code/session_01JoSsghLRHTtvcNzYXbKpzE
</commit_message>
<xml_diff>
--- a/thuyet-trinh/DANH-SACH-SLIDE-v2.5.docx
+++ b/thuyet-trinh/DANH-SACH-SLIDE-v2.5.docx
@@ -534,7 +534,7 @@
               <w:jc w:val="left"/>
             </w:pPr>
             <w:r>
-              <w:t xml:space="preserve">8, 14, 15, 16, 17, 22</w:t>
+              <w:t xml:space="preserve">8, 13, 14, 16, 17, 22</w:t>
             </w:r>
           </w:p>
         </w:tc>
@@ -656,7 +656,7 @@
               <w:jc w:val="left"/>
             </w:pPr>
             <w:r>
-              <w:t xml:space="preserve">14, 15</w:t>
+              <w:t xml:space="preserve">13, 14</w:t>
             </w:r>
           </w:p>
         </w:tc>
@@ -1918,7 +1918,7 @@
               <w:jc w:val="left"/>
             </w:pPr>
             <w:r>
-              <w:t xml:space="preserve">Tìm và lọc tài liệu bước đầu: Sci-Hub, Sci-Bot và các công cụ hỗ trợ</w:t>
+              <w:t xml:space="preserve">Nghiên cứu tài liệu và tổng quan: từ tìm, lọc tài liệu đến khoảng trống nghiên cứu</w:t>
             </w:r>
           </w:p>
         </w:tc>
@@ -1942,6 +1942,130 @@
               <w:jc w:val="left"/>
             </w:pPr>
             <w:r>
+              <w:t xml:space="preserve">8′</w:t>
+            </w:r>
+          </w:p>
+        </w:tc>
+        <w:tc>
+          <w:tcPr/>
+          <w:p>
+            <w:pPr>
+              <w:pStyle w:val="Compact"/>
+              <w:jc w:val="left"/>
+            </w:pPr>
+            <w:r>
+              <w:t xml:space="preserve">[ ]</w:t>
+            </w:r>
+          </w:p>
+        </w:tc>
+      </w:tr>
+      <w:tr>
+        <w:tc>
+          <w:tcPr/>
+          <w:p>
+            <w:pPr>
+              <w:pStyle w:val="Compact"/>
+              <w:jc w:val="left"/>
+            </w:pPr>
+            <w:r>
+              <w:t xml:space="preserve">13</w:t>
+            </w:r>
+          </w:p>
+        </w:tc>
+        <w:tc>
+          <w:tcPr/>
+          <w:p>
+            <w:pPr>
+              <w:pStyle w:val="Compact"/>
+              <w:jc w:val="left"/>
+            </w:pPr>
+            <w:r>
+              <w:t xml:space="preserve">Xây dựng thuyết minh đề tài: từ khoảng trống đến phiếu đề xuất và thuyết minh – DEMO 1</w:t>
+            </w:r>
+          </w:p>
+        </w:tc>
+        <w:tc>
+          <w:tcPr/>
+          <w:p>
+            <w:pPr>
+              <w:pStyle w:val="Compact"/>
+              <w:jc w:val="left"/>
+            </w:pPr>
+            <w:r>
+              <w:t xml:space="preserve">III</w:t>
+            </w:r>
+          </w:p>
+        </w:tc>
+        <w:tc>
+          <w:tcPr/>
+          <w:p>
+            <w:pPr>
+              <w:pStyle w:val="Compact"/>
+              <w:jc w:val="left"/>
+            </w:pPr>
+            <w:r>
+              <w:t xml:space="preserve">5′</w:t>
+            </w:r>
+          </w:p>
+        </w:tc>
+        <w:tc>
+          <w:tcPr/>
+          <w:p>
+            <w:pPr>
+              <w:pStyle w:val="Compact"/>
+              <w:jc w:val="left"/>
+            </w:pPr>
+            <w:r>
+              <w:t xml:space="preserve">[ ]</w:t>
+            </w:r>
+          </w:p>
+        </w:tc>
+      </w:tr>
+      <w:tr>
+        <w:tc>
+          <w:tcPr/>
+          <w:p>
+            <w:pPr>
+              <w:pStyle w:val="Compact"/>
+              <w:jc w:val="left"/>
+            </w:pPr>
+            <w:r>
+              <w:t xml:space="preserve">14</w:t>
+            </w:r>
+          </w:p>
+        </w:tc>
+        <w:tc>
+          <w:tcPr/>
+          <w:p>
+            <w:pPr>
+              <w:pStyle w:val="Compact"/>
+              <w:jc w:val="left"/>
+            </w:pPr>
+            <w:r>
+              <w:t xml:space="preserve">Hoàn thiện thuyết minh: tiến độ và dự toán kinh phí theo biểu mẫu Trung tâm</w:t>
+            </w:r>
+          </w:p>
+        </w:tc>
+        <w:tc>
+          <w:tcPr/>
+          <w:p>
+            <w:pPr>
+              <w:pStyle w:val="Compact"/>
+              <w:jc w:val="left"/>
+            </w:pPr>
+            <w:r>
+              <w:t xml:space="preserve">III</w:t>
+            </w:r>
+          </w:p>
+        </w:tc>
+        <w:tc>
+          <w:tcPr/>
+          <w:p>
+            <w:pPr>
+              <w:pStyle w:val="Compact"/>
+              <w:jc w:val="left"/>
+            </w:pPr>
+            <w:r>
               <w:t xml:space="preserve">4′</w:t>
             </w:r>
           </w:p>
@@ -1968,19 +2092,19 @@
               <w:jc w:val="left"/>
             </w:pPr>
             <w:r>
-              <w:t xml:space="preserve">13</w:t>
-            </w:r>
-          </w:p>
-        </w:tc>
-        <w:tc>
-          <w:tcPr/>
-          <w:p>
-            <w:pPr>
-              <w:pStyle w:val="Compact"/>
-              <w:jc w:val="left"/>
-            </w:pPr>
-            <w:r>
-              <w:t xml:space="preserve">Tổng quan tài liệu: từ bài báo đến khoảng trống nghiên cứu</w:t>
+              <w:t xml:space="preserve">15</w:t>
+            </w:r>
+          </w:p>
+        </w:tc>
+        <w:tc>
+          <w:tcPr/>
+          <w:p>
+            <w:pPr>
+              <w:pStyle w:val="Compact"/>
+              <w:jc w:val="left"/>
+            </w:pPr>
+            <w:r>
+              <w:t xml:space="preserve">🆕 Hướng dẫn xử lý dữ liệu với AI: quy trình 5 bước</w:t>
             </w:r>
           </w:p>
         </w:tc>
@@ -2004,7 +2128,7 @@
               <w:jc w:val="left"/>
             </w:pPr>
             <w:r>
-              <w:t xml:space="preserve">6′</w:t>
+              <w:t xml:space="preserve">4′</w:t>
             </w:r>
           </w:p>
         </w:tc>
@@ -2030,19 +2154,19 @@
               <w:jc w:val="left"/>
             </w:pPr>
             <w:r>
-              <w:t xml:space="preserve">14</w:t>
-            </w:r>
-          </w:p>
-        </w:tc>
-        <w:tc>
-          <w:tcPr/>
-          <w:p>
-            <w:pPr>
-              <w:pStyle w:val="Compact"/>
-              <w:jc w:val="left"/>
-            </w:pPr>
-            <w:r>
-              <w:t xml:space="preserve">Đề xuất nhiệm vụ: từ khoảng trống đến phiếu đề xuất và thuyết minh – DEMO 1</w:t>
+              <w:t xml:space="preserve">16</w:t>
+            </w:r>
+          </w:p>
+        </w:tc>
+        <w:tc>
+          <w:tcPr/>
+          <w:p>
+            <w:pPr>
+              <w:pStyle w:val="Compact"/>
+              <w:jc w:val="left"/>
+            </w:pPr>
+            <w:r>
+              <w:t xml:space="preserve">Xử lý dữ liệu: AI viết và chạy mã Python – DEMO 2</w:t>
             </w:r>
           </w:p>
         </w:tc>
@@ -2092,19 +2216,19 @@
               <w:jc w:val="left"/>
             </w:pPr>
             <w:r>
-              <w:t xml:space="preserve">15</w:t>
-            </w:r>
-          </w:p>
-        </w:tc>
-        <w:tc>
-          <w:tcPr/>
-          <w:p>
-            <w:pPr>
-              <w:pStyle w:val="Compact"/>
-              <w:jc w:val="left"/>
-            </w:pPr>
-            <w:r>
-              <w:t xml:space="preserve">Hồ sơ nhiệm vụ: thuyết minh, tiến độ và kinh phí theo biểu mẫu Trung tâm</w:t>
+              <w:t xml:space="preserve">17</w:t>
+            </w:r>
+          </w:p>
+        </w:tc>
+        <w:tc>
+          <w:tcPr/>
+          <w:p>
+            <w:pPr>
+              <w:pStyle w:val="Compact"/>
+              <w:jc w:val="left"/>
+            </w:pPr>
+            <w:r>
+              <w:t xml:space="preserve">Mô hình 3D: mô phỏng quá trình ăn mòn vật liệu theo thời gian</w:t>
             </w:r>
           </w:p>
         </w:tc>
@@ -2128,7 +2252,7 @@
               <w:jc w:val="left"/>
             </w:pPr>
             <w:r>
-              <w:t xml:space="preserve">4′</w:t>
+              <w:t xml:space="preserve">3′</w:t>
             </w:r>
           </w:p>
         </w:tc>
@@ -2154,19 +2278,19 @@
               <w:jc w:val="left"/>
             </w:pPr>
             <w:r>
-              <w:t xml:space="preserve">16</w:t>
-            </w:r>
-          </w:p>
-        </w:tc>
-        <w:tc>
-          <w:tcPr/>
-          <w:p>
-            <w:pPr>
-              <w:pStyle w:val="Compact"/>
-              <w:jc w:val="left"/>
-            </w:pPr>
-            <w:r>
-              <w:t xml:space="preserve">Xử lý dữ liệu: AI viết và chạy mã Python – DEMO 2</w:t>
+              <w:t xml:space="preserve">18</w:t>
+            </w:r>
+          </w:p>
+        </w:tc>
+        <w:tc>
+          <w:tcPr/>
+          <w:p>
+            <w:pPr>
+              <w:pStyle w:val="Compact"/>
+              <w:jc w:val="left"/>
+            </w:pPr>
+            <w:r>
+              <w:t xml:space="preserve">Công bố kết quả: bài báo và báo cáo tổng hợp theo nhiều định dạng</w:t>
             </w:r>
           </w:p>
         </w:tc>
@@ -2190,131 +2314,7 @@
               <w:jc w:val="left"/>
             </w:pPr>
             <w:r>
-              <w:t xml:space="preserve">6′</w:t>
-            </w:r>
-          </w:p>
-        </w:tc>
-        <w:tc>
-          <w:tcPr/>
-          <w:p>
-            <w:pPr>
-              <w:pStyle w:val="Compact"/>
-              <w:jc w:val="left"/>
-            </w:pPr>
-            <w:r>
-              <w:t xml:space="preserve">[ ]</w:t>
-            </w:r>
-          </w:p>
-        </w:tc>
-      </w:tr>
-      <w:tr>
-        <w:tc>
-          <w:tcPr/>
-          <w:p>
-            <w:pPr>
-              <w:pStyle w:val="Compact"/>
-              <w:jc w:val="left"/>
-            </w:pPr>
-            <w:r>
-              <w:t xml:space="preserve">17</w:t>
-            </w:r>
-          </w:p>
-        </w:tc>
-        <w:tc>
-          <w:tcPr/>
-          <w:p>
-            <w:pPr>
-              <w:pStyle w:val="Compact"/>
-              <w:jc w:val="left"/>
-            </w:pPr>
-            <w:r>
-              <w:t xml:space="preserve">Mô hình 3D: mô phỏng quá trình ăn mòn vật liệu theo thời gian</w:t>
-            </w:r>
-          </w:p>
-        </w:tc>
-        <w:tc>
-          <w:tcPr/>
-          <w:p>
-            <w:pPr>
-              <w:pStyle w:val="Compact"/>
-              <w:jc w:val="left"/>
-            </w:pPr>
-            <w:r>
-              <w:t xml:space="preserve">III</w:t>
-            </w:r>
-          </w:p>
-        </w:tc>
-        <w:tc>
-          <w:tcPr/>
-          <w:p>
-            <w:pPr>
-              <w:pStyle w:val="Compact"/>
-              <w:jc w:val="left"/>
-            </w:pPr>
-            <w:r>
               <w:t xml:space="preserve">3′</w:t>
-            </w:r>
-          </w:p>
-        </w:tc>
-        <w:tc>
-          <w:tcPr/>
-          <w:p>
-            <w:pPr>
-              <w:pStyle w:val="Compact"/>
-              <w:jc w:val="left"/>
-            </w:pPr>
-            <w:r>
-              <w:t xml:space="preserve">[ ]</w:t>
-            </w:r>
-          </w:p>
-        </w:tc>
-      </w:tr>
-      <w:tr>
-        <w:tc>
-          <w:tcPr/>
-          <w:p>
-            <w:pPr>
-              <w:pStyle w:val="Compact"/>
-              <w:jc w:val="left"/>
-            </w:pPr>
-            <w:r>
-              <w:t xml:space="preserve">18</w:t>
-            </w:r>
-          </w:p>
-        </w:tc>
-        <w:tc>
-          <w:tcPr/>
-          <w:p>
-            <w:pPr>
-              <w:pStyle w:val="Compact"/>
-              <w:jc w:val="left"/>
-            </w:pPr>
-            <w:r>
-              <w:t xml:space="preserve">Công bố kết quả: bài báo và báo cáo tổng hợp theo nhiều định dạng</w:t>
-            </w:r>
-          </w:p>
-        </w:tc>
-        <w:tc>
-          <w:tcPr/>
-          <w:p>
-            <w:pPr>
-              <w:pStyle w:val="Compact"/>
-              <w:jc w:val="left"/>
-            </w:pPr>
-            <w:r>
-              <w:t xml:space="preserve">III</w:t>
-            </w:r>
-          </w:p>
-        </w:tc>
-        <w:tc>
-          <w:tcPr/>
-          <w:p>
-            <w:pPr>
-              <w:pStyle w:val="Compact"/>
-              <w:jc w:val="left"/>
-            </w:pPr>
-            <w:r>
-              <w:t xml:space="preserve">4′</w:t>
             </w:r>
           </w:p>
         </w:tc>
@@ -8179,7 +8179,7 @@
         <w:rPr>
           <w:rStyle w:val="VerbatimChar"/>
         </w:rPr>
-        <w:t xml:space="preserve">├── 01-tong-quan-tai-lieu/   ← 13 tài liệu đã xác minh, ma trận bằng chứng, khoảng trống   (Slide 13)</w:t>
+        <w:t xml:space="preserve">├── 01-tong-quan-tai-lieu/   ← 13 tài liệu đã xác minh, ma trận bằng chứng, khoảng trống   (Slide 12)</w:t>
       </w:r>
       <w:r>
         <w:br/>
@@ -8188,7 +8188,7 @@
         <w:rPr>
           <w:rStyle w:val="VerbatimChar"/>
         </w:rPr>
-        <w:t xml:space="preserve">├── 02-de-xuat-thuyet-minh/  ← bản nháp đề xuất + biểu mẫu Trung tâm                       (Slide 14–15)</w:t>
+        <w:t xml:space="preserve">├── 02-de-xuat-thuyet-minh/  ← bản nháp đề xuất + biểu mẫu Trung tâm                       (Slide 13–14)</w:t>
       </w:r>
       <w:r>
         <w:br/>
@@ -8197,7 +8197,7 @@
         <w:rPr>
           <w:rStyle w:val="VerbatimChar"/>
         </w:rPr>
-        <w:t xml:space="preserve">├── 03-du-lieu/              ← thô (chỉ đọc) → đã xử lý → bổ sung; từ điển dữ liệu           (Slide 16)</w:t>
+        <w:t xml:space="preserve">├── 03-du-lieu/              ← thô (chỉ đọc) → đã xử lý → bổ sung; từ điển dữ liệu           (Slide 15–16)</w:t>
       </w:r>
       <w:r>
         <w:br/>
@@ -8568,26 +8568,13 @@
         <w:pStyle w:val="BlockText"/>
       </w:pPr>
       <w:r>
-        <w:t xml:space="preserve">🆕 v2.4: Phần III</w:t>
-      </w:r>
-      <w:r>
-        <w:t xml:space="preserve"> </w:t>
-      </w:r>
-      <w:r>
-        <w:rPr>
-          <w:bCs/>
-          <w:b/>
-        </w:rPr>
-        <w:t xml:space="preserve">bắt đầu ngay bằng tìm khoảng trống nghiên cứu</w:t>
-      </w:r>
-      <w:r>
-        <w:t xml:space="preserve">; slide tổng quan vòng đời chuyển xuống cuối phần (Slide 19) để tổng kết.</w:t>
-      </w:r>
-      <w:r>
-        <w:t xml:space="preserve"> </w:t>
-      </w:r>
-      <w:r>
-        <w:t xml:space="preserve">Slide 14–15 dùng</w:t>
+        <w:t xml:space="preserve">Mạch Phần III: nghiên cứu tài liệu → tổng quan, khoảng trống (Slide 12) → xây dựng thuyết minh (13, 14) → hướng dẫn xử lý dữ liệu (15) → xử lý dữ liệu, mô hình 3D (16, 17) → công bố (18) → toàn cảnh (19).</w:t>
+      </w:r>
+      <w:r>
+        <w:t xml:space="preserve"> </w:t>
+      </w:r>
+      <w:r>
+        <w:t xml:space="preserve">Slide 13–14 dùng</w:t>
       </w:r>
       <w:r>
         <w:t xml:space="preserve"> </w:t>
@@ -8603,20 +8590,20 @@
         <w:t xml:space="preserve"> </w:t>
       </w:r>
       <w:r>
-        <w:t xml:space="preserve">(người trình bày cung cấp); Slide 13 và 15 dùng</w:t>
-      </w:r>
-      <w:r>
-        <w:t xml:space="preserve"> </w:t>
-      </w:r>
-      <w:r>
-        <w:rPr>
-          <w:bCs/>
-          <w:b/>
-        </w:rPr>
-        <w:t xml:space="preserve">dữ liệu, tài liệu thật đã công bố</w:t>
-      </w:r>
-      <w:r>
-        <w:t xml:space="preserve">; dữ liệu giả lập chỉ còn dùng để minh họa phát hiện lỗi.</w:t>
+        <w:t xml:space="preserve">(người trình bày cung cấp); Slide 12 và 16 dùng</w:t>
+      </w:r>
+      <w:r>
+        <w:t xml:space="preserve"> </w:t>
+      </w:r>
+      <w:r>
+        <w:rPr>
+          <w:bCs/>
+          <w:b/>
+        </w:rPr>
+        <w:t xml:space="preserve">tài liệu, dữ liệu thật đã công bố</w:t>
+      </w:r>
+      <w:r>
+        <w:t xml:space="preserve">.</w:t>
       </w:r>
     </w:p>
     <w:p>
@@ -8626,13 +8613,13 @@
         </w:pict>
       </w:r>
     </w:p>
-    <w:bookmarkStart w:id="38" w:name="Xd85a41c55b25eb0738121b4f2eb487220bda3e4"/>
+    <w:bookmarkStart w:id="38" w:name="Xab0c3f074682ff26898321cd7465ffcf864210a"/>
     <w:p>
       <w:pPr>
         <w:pStyle w:val="Heading2"/>
       </w:pPr>
       <w:r>
-        <w:t xml:space="preserve">Slide 12 – Tìm và lọc tài liệu bước đầu: Sci-Hub, Sci-Bot và các công cụ hỗ trợ (4′)</w:t>
+        <w:t xml:space="preserve">Slide 12 – Nghiên cứu tài liệu và tổng quan: từ tìm, lọc tài liệu đến khoảng trống nghiên cứu (8′)</w:t>
       </w:r>
     </w:p>
     <w:p>
@@ -8650,7 +8637,23 @@
         <w:t xml:space="preserve"> </w:t>
       </w:r>
       <w:r>
-        <w:t xml:space="preserve">quy trình 4 bước tìm – lọc tài liệu</w:t>
+        <w:t xml:space="preserve">-</w:t>
+      </w:r>
+      <w:r>
+        <w:t xml:space="preserve"> </w:t>
+      </w:r>
+      <w:r>
+        <w:rPr>
+          <w:bCs/>
+          <w:b/>
+        </w:rPr>
+        <w:t xml:space="preserve">Tình huống:</w:t>
+      </w:r>
+      <w:r>
+        <w:t xml:space="preserve"> </w:t>
+      </w:r>
+      <w:r>
+        <w:t xml:space="preserve">ăn mòn khí quyển của kim loại trong khí hậu nhiệt đới Việt Nam</w:t>
       </w:r>
     </w:p>
     <w:tbl>
@@ -8701,21 +8704,21 @@
               <w:jc w:val="left"/>
             </w:pPr>
             <w:r>
-              <w:t xml:space="preserve">Làm gì</w:t>
-            </w:r>
-          </w:p>
-        </w:tc>
-      </w:tr>
-      <w:tr>
-        <w:tc>
-          <w:tcPr/>
-          <w:p>
-            <w:pPr>
-              <w:pStyle w:val="Compact"/>
-              <w:jc w:val="left"/>
-            </w:pPr>
-            <w:r>
-              <w:t xml:space="preserve">1. Đặt câu hỏi, tìm bài ứng viên</w:t>
+              <w:t xml:space="preserve">Kết quả</w:t>
+            </w:r>
+          </w:p>
+        </w:tc>
+      </w:tr>
+      <w:tr>
+        <w:tc>
+          <w:tcPr/>
+          <w:p>
+            <w:pPr>
+              <w:pStyle w:val="Compact"/>
+              <w:jc w:val="left"/>
+            </w:pPr>
+            <w:r>
+              <w:t xml:space="preserve">1. Tìm bài ứng viên</w:t>
             </w:r>
           </w:p>
         </w:tc>
@@ -8737,19 +8740,19 @@
               <w:t xml:space="preserve"> </w:t>
             </w:r>
             <w:r>
-              <w:t xml:space="preserve">(trợ lý AI trên kho Sci-Hub, 04/2026) · Google Scholar Labs · Semantic Scholar</w:t>
-            </w:r>
-          </w:p>
-        </w:tc>
-        <w:tc>
-          <w:tcPr/>
-          <w:p>
-            <w:pPr>
-              <w:pStyle w:val="Compact"/>
-              <w:jc w:val="left"/>
-            </w:pPr>
-            <w:r>
-              <w:t xml:space="preserve">Hỏi bằng tiếng Anh, nêu rõ đối tượng – điều kiện – yếu tố cần xét → câu trả lời tổng hợp kèm danh sách bài báo, DOI</w:t>
+              <w:t xml:space="preserve">(trợ lý AI trên kho Sci-Hub) · Google Scholar Labs · Semantic Scholar</w:t>
+            </w:r>
+          </w:p>
+        </w:tc>
+        <w:tc>
+          <w:tcPr/>
+          <w:p>
+            <w:pPr>
+              <w:pStyle w:val="Compact"/>
+              <w:jc w:val="left"/>
+            </w:pPr>
+            <w:r>
+              <w:t xml:space="preserve">Danh sách bài báo kèm DOI</w:t>
             </w:r>
           </w:p>
         </w:tc>
@@ -8775,19 +8778,19 @@
               <w:jc w:val="left"/>
             </w:pPr>
             <w:r>
-              <w:t xml:space="preserve">Elicit · Consensus · Claude (dự án)</w:t>
-            </w:r>
-          </w:p>
-        </w:tc>
-        <w:tc>
-          <w:tcPr/>
-          <w:p>
-            <w:pPr>
-              <w:pStyle w:val="Compact"/>
-              <w:jc w:val="left"/>
-            </w:pPr>
-            <w:r>
-              <w:t xml:space="preserve">Áp tiêu chí đưa vào / loại ra → giữ 10–30 bài</w:t>
+              <w:t xml:space="preserve">Elicit · Consensus · Claude</w:t>
+            </w:r>
+          </w:p>
+        </w:tc>
+        <w:tc>
+          <w:tcPr/>
+          <w:p>
+            <w:pPr>
+              <w:pStyle w:val="Compact"/>
+              <w:jc w:val="left"/>
+            </w:pPr>
+            <w:r>
+              <w:t xml:space="preserve">10–30 bài theo tiêu chí đưa vào / loại ra</w:t>
             </w:r>
           </w:p>
         </w:tc>
@@ -8823,57 +8826,95 @@
               <w:t xml:space="preserve"> </w:t>
             </w:r>
             <w:r>
-              <w:t xml:space="preserve">(tra theo DOI hoặc tiêu đề) · Unpaywall · CORE · VJOL · CyberLeninka · eLIBRARY.ru</w:t>
-            </w:r>
-          </w:p>
-        </w:tc>
-        <w:tc>
-          <w:tcPr/>
-          <w:p>
-            <w:pPr>
-              <w:pStyle w:val="Compact"/>
-              <w:jc w:val="left"/>
-            </w:pPr>
-            <w:r>
-              <w:t xml:space="preserve">Tải PDF để đọc kỹ</w:t>
-            </w:r>
-          </w:p>
-        </w:tc>
-      </w:tr>
-      <w:tr>
-        <w:tc>
-          <w:tcPr/>
-          <w:p>
-            <w:pPr>
-              <w:pStyle w:val="Compact"/>
-              <w:jc w:val="left"/>
-            </w:pPr>
-            <w:r>
-              <w:t xml:space="preserve">4. Đưa vào dự án</w:t>
-            </w:r>
-          </w:p>
-        </w:tc>
-        <w:tc>
-          <w:tcPr/>
-          <w:p>
-            <w:pPr>
-              <w:pStyle w:val="Compact"/>
-              <w:jc w:val="left"/>
-            </w:pPr>
-            <w:r>
-              <w:t xml:space="preserve">Claude</w:t>
-            </w:r>
-          </w:p>
-        </w:tc>
-        <w:tc>
-          <w:tcPr/>
-          <w:p>
-            <w:pPr>
-              <w:pStyle w:val="Compact"/>
-              <w:jc w:val="left"/>
-            </w:pPr>
-            <w:r>
-              <w:t xml:space="preserve">Tải PDF vào dự án → lập ma trận bằng chứng (Slide 13)</w:t>
+              <w:t xml:space="preserve">(theo DOI) · Unpaywall · CORE · VJOL · CyberLeninka · eLIBRARY.ru</w:t>
+            </w:r>
+          </w:p>
+        </w:tc>
+        <w:tc>
+          <w:tcPr/>
+          <w:p>
+            <w:pPr>
+              <w:pStyle w:val="Compact"/>
+              <w:jc w:val="left"/>
+            </w:pPr>
+            <w:r>
+              <w:t xml:space="preserve">Bộ PDF đưa vào dự án Claude</w:t>
+            </w:r>
+          </w:p>
+        </w:tc>
+      </w:tr>
+      <w:tr>
+        <w:tc>
+          <w:tcPr/>
+          <w:p>
+            <w:pPr>
+              <w:pStyle w:val="Compact"/>
+              <w:jc w:val="left"/>
+            </w:pPr>
+            <w:r>
+              <w:t xml:space="preserve">4. Lập ma trận bằng chứng</w:t>
+            </w:r>
+          </w:p>
+        </w:tc>
+        <w:tc>
+          <w:tcPr/>
+          <w:p>
+            <w:pPr>
+              <w:pStyle w:val="Compact"/>
+              <w:jc w:val="left"/>
+            </w:pPr>
+            <w:r>
+              <w:t xml:space="preserve">Claude (dự án)</w:t>
+            </w:r>
+          </w:p>
+        </w:tc>
+        <w:tc>
+          <w:tcPr/>
+          <w:p>
+            <w:pPr>
+              <w:pStyle w:val="Compact"/>
+              <w:jc w:val="left"/>
+            </w:pPr>
+            <w:r>
+              <w:t xml:space="preserve">Bảng: tác giả – năm, địa điểm, kim loại, biến môi trường, mô hình, kết luận, hạn chế</w:t>
+            </w:r>
+          </w:p>
+        </w:tc>
+      </w:tr>
+      <w:tr>
+        <w:tc>
+          <w:tcPr/>
+          <w:p>
+            <w:pPr>
+              <w:pStyle w:val="Compact"/>
+              <w:jc w:val="left"/>
+            </w:pPr>
+            <w:r>
+              <w:t xml:space="preserve">5. Xác định khoảng trống</w:t>
+            </w:r>
+          </w:p>
+        </w:tc>
+        <w:tc>
+          <w:tcPr/>
+          <w:p>
+            <w:pPr>
+              <w:pStyle w:val="Compact"/>
+              <w:jc w:val="left"/>
+            </w:pPr>
+            <w:r>
+              <w:t xml:space="preserve">Claude + nhà khoa học</w:t>
+            </w:r>
+          </w:p>
+        </w:tc>
+        <w:tc>
+          <w:tcPr/>
+          <w:p>
+            <w:pPr>
+              <w:pStyle w:val="Compact"/>
+              <w:jc w:val="left"/>
+            </w:pPr>
+            <w:r>
+              <w:t xml:space="preserve">3 khoảng trống, mỗi khoảng trống dẫn chứng ≥ 2 bài</w:t>
             </w:r>
           </w:p>
         </w:tc>
@@ -8881,14 +8922,24 @@
     </w:tbl>
     <w:p>
       <w:pPr>
-        <w:pStyle w:val="BodyText"/>
-      </w:pPr>
-      <w:r>
-        <w:rPr>
-          <w:bCs/>
-          <w:b/>
-        </w:rPr>
-        <w:t xml:space="preserve">Câu hỏi mẫu cho Sci-Bot:</w:t>
+        <w:numPr>
+          <w:ilvl w:val="0"/>
+          <w:numId w:val="1002"/>
+        </w:numPr>
+        <w:pStyle w:val="Compact"/>
+      </w:pPr>
+      <w:r>
+        <w:t xml:space="preserve">📊</w:t>
+      </w:r>
+      <w:r>
+        <w:t xml:space="preserve"> </w:t>
+      </w:r>
+      <w:r>
+        <w:rPr>
+          <w:bCs/>
+          <w:b/>
+        </w:rPr>
+        <w:t xml:space="preserve">Kết quả – 3 khoảng trống</w:t>
       </w:r>
       <w:r>
         <w:t xml:space="preserve"> </w:t>
@@ -8898,21 +8949,90 @@
           <w:iCs/>
           <w:i/>
         </w:rPr>
-        <w:t xml:space="preserve">“</w:t>
-      </w:r>
-      <w:r>
-        <w:rPr>
-          <w:iCs/>
-          <w:i/>
-        </w:rPr>
-        <w:t xml:space="preserve">Which environmental factors control the first-year atmospheric corrosion rate of carbon steel in tropical climates, and how accurate is the ISO 9223 dose-response function there?</w:t>
-      </w:r>
-      <w:r>
-        <w:rPr>
-          <w:iCs/>
-          <w:i/>
-        </w:rPr>
-        <w:t xml:space="preserve">”</w:t>
+        <w:t xml:space="preserve">(đề xuất, nhà khoa học quyết định)</w:t>
+      </w:r>
+      <w:r>
+        <w:t xml:space="preserve">:</w:t>
+      </w:r>
+    </w:p>
+    <w:p>
+      <w:pPr>
+        <w:numPr>
+          <w:ilvl w:val="1"/>
+          <w:numId w:val="1003"/>
+        </w:numPr>
+        <w:pStyle w:val="Compact"/>
+      </w:pPr>
+      <w:r>
+        <w:t xml:space="preserve">Mô hình quốc tế</w:t>
+      </w:r>
+      <w:r>
+        <w:t xml:space="preserve"> </w:t>
+      </w:r>
+      <w:r>
+        <w:rPr>
+          <w:bCs/>
+          <w:b/>
+        </w:rPr>
+        <w:t xml:space="preserve">đánh giá thấp ~31%</w:t>
+      </w:r>
+      <w:r>
+        <w:t xml:space="preserve"> </w:t>
+      </w:r>
+      <w:r>
+        <w:t xml:space="preserve">ăn mòn thép ở Việt Nam → cần hàm liều – đáp ứng hiệu chỉnh cho khí hậu nhiệt đới</w:t>
+      </w:r>
+    </w:p>
+    <w:p>
+      <w:pPr>
+        <w:numPr>
+          <w:ilvl w:val="1"/>
+          <w:numId w:val="1003"/>
+        </w:numPr>
+        <w:pStyle w:val="Compact"/>
+      </w:pPr>
+      <w:r>
+        <w:t xml:space="preserve">Huế, Nha Trang ăn mòn cao dù clorua thấp → yếu tố chưa được giải thích</w:t>
+      </w:r>
+    </w:p>
+    <w:p>
+      <w:pPr>
+        <w:numPr>
+          <w:ilvl w:val="1"/>
+          <w:numId w:val="1003"/>
+        </w:numPr>
+        <w:pStyle w:val="Compact"/>
+      </w:pPr>
+      <w:r>
+        <w:t xml:space="preserve">Số liệu Việt Nam chủ yếu 1995–2005, chỉ năm đầu → thiếu dữ liệu dài hạn</w:t>
+      </w:r>
+    </w:p>
+    <w:p>
+      <w:pPr>
+        <w:numPr>
+          <w:ilvl w:val="0"/>
+          <w:numId w:val="1002"/>
+        </w:numPr>
+        <w:pStyle w:val="Compact"/>
+      </w:pPr>
+      <w:r>
+        <w:t xml:space="preserve">✅</w:t>
+      </w:r>
+      <w:r>
+        <w:t xml:space="preserve"> </w:t>
+      </w:r>
+      <w:r>
+        <w:rPr>
+          <w:bCs/>
+          <w:b/>
+        </w:rPr>
+        <w:t xml:space="preserve">Nhà khoa học xác nhận:</w:t>
+      </w:r>
+      <w:r>
+        <w:t xml:space="preserve"> </w:t>
+      </w:r>
+      <w:r>
+        <w:t xml:space="preserve">nguồn có thật (kiểm tra DOI); khoảng trống có giá trị → chuyển sang xây dựng thuyết minh (Slide 13)</w:t>
       </w:r>
     </w:p>
     <w:p>
@@ -8920,7 +9040,7 @@
         <w:pStyle w:val="BlockText"/>
       </w:pPr>
       <w:r>
-        <w:t xml:space="preserve">Lưu ý khi dùng: Sci-Bot là bản thử nghiệm – mỗi lần một câu hỏi, thiếu bài mới (sau ~2021–2022) → bổ sung bài mới bằng Google Scholar Labs; kiểm tra DOI của mọi trích dẫn. Chỉ truy cập địa chỉ chính thức (nhiều trang giả mạo); không dùng trên máy có tài liệu mật.</w:t>
+        <w:t xml:space="preserve">Lưu ý: Sci-Bot là bản thử nghiệm – mỗi lần một câu hỏi, thiếu bài mới (sau ~2021–2022) → bổ sung bằng Google Scholar Labs. Chỉ truy cập địa chỉ chính thức; không dùng trên máy có tài liệu mật.</w:t>
       </w:r>
     </w:p>
     <w:p>
@@ -8938,7 +9058,7 @@
         <w:t xml:space="preserve"> </w:t>
       </w:r>
       <w:r>
-        <w:t xml:space="preserve">ảnh chụp Sci-Bot trả lời câu hỏi mẫu kèm danh sách bài; ảnh Sci-Hub tra một bài theo DOI; ảnh bảng lọc bài trên Claude.</w:t>
+        <w:t xml:space="preserve">ảnh Sci-Bot trả lời câu hỏi mẫu; ảnh ma trận bằng chứng do AI lập và 3 khoảng trống.</w:t>
       </w:r>
     </w:p>
     <w:p>
@@ -8956,7 +9076,7 @@
         <w:t xml:space="preserve"> </w:t>
       </w:r>
       <w:r>
-        <w:t xml:space="preserve">hướng dẫn chi tiết từng công cụ –</w:t>
+        <w:t xml:space="preserve">hướng dẫn Sci-Bot, Sci-Hub –</w:t>
       </w:r>
       <w:r>
         <w:t xml:space="preserve"> </w:t>
@@ -8971,7 +9091,7 @@
         <w:t xml:space="preserve"> </w:t>
       </w:r>
       <w:r>
-        <w:t xml:space="preserve">mục 11; câu lệnh lọc tài liệu –</w:t>
+        <w:t xml:space="preserve">mục 11; danh mục 8 tài liệu thật – mục 7; câu lệnh:</w:t>
       </w:r>
       <w:r>
         <w:t xml:space="preserve"> </w:t>
@@ -8986,7 +9106,7 @@
         <w:t xml:space="preserve"> </w:t>
       </w:r>
       <w:r>
-        <w:t xml:space="preserve">mục 14.</w:t>
+        <w:t xml:space="preserve">mục 14 (tìm – lọc), mục 1 (ma trận, khoảng trống).</w:t>
       </w:r>
     </w:p>
     <w:p>
@@ -9004,7 +9124,7 @@
         <w:t xml:space="preserve"> </w:t>
       </w:r>
       <w:r>
-        <w:t xml:space="preserve">N33, N35–N37</w:t>
+        <w:t xml:space="preserve">N25, N33, N35–N37 · tài liệu 1–8</w:t>
       </w:r>
     </w:p>
     <w:p>
@@ -9043,13 +9163,13 @@
       </w:r>
     </w:p>
     <w:bookmarkEnd w:id="38"/>
-    <w:bookmarkStart w:id="39" w:name="X86b8179ee4983cce1e74e4be426ed43bc51a863"/>
+    <w:bookmarkStart w:id="39" w:name="X6a70822288d9db39aca2fe6100c568efe87bed8"/>
     <w:p>
       <w:pPr>
         <w:pStyle w:val="Heading2"/>
       </w:pPr>
       <w:r>
-        <w:t xml:space="preserve">Slide 13 – Tổng quan tài liệu: từ bài báo đến khoảng trống nghiên cứu (6′)</w:t>
+        <w:t xml:space="preserve">Slide 13 – Xây dựng thuyết minh đề tài: từ khoảng trống đến phiếu đề xuất và thuyết minh – DEMO 1 (5′)</w:t>
       </w:r>
     </w:p>
     <w:p>
@@ -9067,67 +9187,45 @@
         <w:t xml:space="preserve"> </w:t>
       </w:r>
       <w:r>
-        <w:t xml:space="preserve">-</w:t>
-      </w:r>
-      <w:r>
-        <w:t xml:space="preserve"> </w:t>
-      </w:r>
-      <w:r>
-        <w:rPr>
-          <w:bCs/>
-          <w:b/>
-        </w:rPr>
-        <w:t xml:space="preserve">Tình huống:</w:t>
-      </w:r>
-      <w:r>
-        <w:t xml:space="preserve"> </w:t>
-      </w:r>
-      <w:r>
-        <w:t xml:space="preserve">ăn mòn khí quyển của kim loại trong khí hậu nhiệt đới Việt Nam</w:t>
-      </w:r>
-      <w:r>
-        <w:t xml:space="preserve"> </w:t>
-      </w:r>
-      <w:r>
-        <w:t xml:space="preserve">- 🌍</w:t>
-      </w:r>
-      <w:r>
-        <w:t xml:space="preserve"> </w:t>
-      </w:r>
-      <w:r>
-        <w:rPr>
-          <w:bCs/>
-          <w:b/>
-        </w:rPr>
-        <w:t xml:space="preserve">Ví dụ thật:</w:t>
-      </w:r>
-      <w:r>
-        <w:t xml:space="preserve"> </w:t>
-      </w:r>
-      <w:r>
-        <w:t xml:space="preserve">AI co-scientist (Google) – nhiều trợ lý đề xuất, phản biện, xếp hạng giả thuyết</w:t>
-      </w:r>
-      <w:r>
-        <w:t xml:space="preserve"> </w:t>
-      </w:r>
-      <w:r>
-        <w:t xml:space="preserve">- 🧰</w:t>
-      </w:r>
-      <w:r>
-        <w:t xml:space="preserve"> </w:t>
-      </w:r>
-      <w:r>
-        <w:rPr>
-          <w:bCs/>
-          <w:b/>
-        </w:rPr>
-        <w:t xml:space="preserve">Tài liệu đầu vào:</w:t>
-      </w:r>
-      <w:r>
-        <w:t xml:space="preserve"> </w:t>
-      </w:r>
-      <w:r>
-        <w:t xml:space="preserve">các bài đã tìm, lọc ở Slide 12; công cụ hỗ trợ đọc: Claude Research · Elicit (tổng quan hệ thống, trích xuất bảng) · Consensus (câu trả lời có dẫn chứng) · Semantic Scholar (miễn phí) · Scite (trích dẫn ủng hộ hay phản bác) · ResearchRabbit (bản đồ trích dẫn)</w:t>
+        <w:t xml:space="preserve">- Khoảng trống → tính cấp thiết, mục tiêu, nội dung, phương pháp, sản phẩm</w:t>
+      </w:r>
+      <w:r>
+        <w:t xml:space="preserve"> </w:t>
+      </w:r>
+      <w:r>
+        <w:t xml:space="preserve">- 🎬</w:t>
+      </w:r>
+      <w:r>
+        <w:t xml:space="preserve"> </w:t>
+      </w:r>
+      <w:r>
+        <w:rPr>
+          <w:bCs/>
+          <w:b/>
+        </w:rPr>
+        <w:t xml:space="preserve">Kết quả demo đã chạy trước:</w:t>
+      </w:r>
+      <w:r>
+        <w:t xml:space="preserve"> </w:t>
+      </w:r>
+      <w:r>
+        <w:t xml:space="preserve">đưa</w:t>
+      </w:r>
+      <w:r>
+        <w:t xml:space="preserve"> </w:t>
+      </w:r>
+      <w:r>
+        <w:rPr>
+          <w:bCs/>
+          <w:b/>
+        </w:rPr>
+        <w:t xml:space="preserve">biểu mẫu thật của Trung tâm</w:t>
+      </w:r>
+      <w:r>
+        <w:t xml:space="preserve"> </w:t>
+      </w:r>
+      <w:r>
+        <w:t xml:space="preserve">(phiếu đề xuất, thuyết minh) vào dự án → AI điền theo khoảng trống đã chọn – trình chiếu ảnh biểu mẫu đã điền và bảng đối chiếu</w:t>
       </w:r>
       <w:r>
         <w:t xml:space="preserve"> </w:t>
@@ -9149,7 +9247,32 @@
         <w:t xml:space="preserve"> </w:t>
       </w:r>
       <w:r>
-        <w:t xml:space="preserve">&gt; Từ các bài báo trong dự án, lập ma trận bằng chứng (tác giả – năm, địa điểm, kim loại, thời gian phơi mẫu, biến môi trường, mô hình, kết luận, hạn chế). Chỉ ra điểm chưa thống nhất và 3 khoảng trống cho điều kiện Việt Nam, mỗi khoảng trống dẫn chứng ít nhất 2 bài.</w:t>
+        <w:rPr>
+          <w:rStyle w:val="VerbatimChar"/>
+        </w:rPr>
+        <w:t xml:space="preserve">Đọc biểu mẫu [tên biểu mẫu] trong dự án. Liệt kê toàn bộ mục và yêu cầu của từng mục.   Điền nội dung cho khoảng trống số [1]: giữ nguyên số mục, tiêu đề, định dạng của mẫu;   mục nào thiếu thông tin ghi [CẦN BỔ SUNG: ...]; không tự đặt số liệu.   Sau đó lập bảng đối chiếu Mục tiêu → Nội dung → Phương pháp → Sản phẩm → Chỉ tiêu,   đánh dấu ⚠ chỗ không khớp. Xuất tệp .docx.</w:t>
+      </w:r>
+      <w:r>
+        <w:t xml:space="preserve"> </w:t>
+      </w:r>
+      <w:r>
+        <w:t xml:space="preserve">- 📊</w:t>
+      </w:r>
+      <w:r>
+        <w:t xml:space="preserve"> </w:t>
+      </w:r>
+      <w:r>
+        <w:rPr>
+          <w:bCs/>
+          <w:b/>
+        </w:rPr>
+        <w:t xml:space="preserve">Kết quả mong đợi:</w:t>
+      </w:r>
+      <w:r>
+        <w:t xml:space="preserve"> </w:t>
+      </w:r>
+      <w:r>
+        <w:t xml:space="preserve">biểu mẫu đã điền đúng cấu trúc; danh sách [CẦN BỔ SUNG]; bảng đối chiếu có dấu ⚠</w:t>
       </w:r>
       <w:r>
         <w:t xml:space="preserve"> </w:t>
@@ -9171,7 +9294,7 @@
         <w:t xml:space="preserve"> </w:t>
       </w:r>
       <w:r>
-        <w:t xml:space="preserve">nguồn có thật; khoảng trống có giá trị</w:t>
+        <w:t xml:space="preserve">tính mới, tính khả thi, chỉ tiêu</w:t>
       </w:r>
     </w:p>
     <w:p>
@@ -9183,54 +9306,29 @@
           <w:bCs/>
           <w:b/>
         </w:rPr>
-        <w:t xml:space="preserve">🆕 Khoảng trống gợi ý – có căn cứ từ phân tích dữ liệu thật</w:t>
-      </w:r>
-      <w:r>
-        <w:t xml:space="preserve"> </w:t>
-      </w:r>
-      <w:r>
-        <w:rPr>
-          <w:iCs/>
-          <w:i/>
-        </w:rPr>
-        <w:t xml:space="preserve">(đề xuất, nhà khoa học quyết định)</w:t>
-      </w:r>
-      <w:r>
-        <w:t xml:space="preserve">:</w:t>
-      </w:r>
-      <w:r>
-        <w:t xml:space="preserve"> </w:t>
-      </w:r>
-      <w:r>
-        <w:t xml:space="preserve">1. Mô hình quốc tế</w:t>
-      </w:r>
-      <w:r>
-        <w:t xml:space="preserve"> </w:t>
-      </w:r>
-      <w:r>
-        <w:rPr>
-          <w:bCs/>
-          <w:b/>
-        </w:rPr>
-        <w:t xml:space="preserve">đánh giá thấp ~31%</w:t>
-      </w:r>
-      <w:r>
-        <w:t xml:space="preserve"> </w:t>
-      </w:r>
-      <w:r>
-        <w:t xml:space="preserve">ăn mòn thép ở Việt Nam → cần hàm liều – đáp ứng hiệu chỉnh cho khí hậu nhiệt đới (thêm độ ẩm, mưa, chu kỳ khô – ướt).</w:t>
-      </w:r>
-      <w:r>
-        <w:t xml:space="preserve"> </w:t>
-      </w:r>
-      <w:r>
-        <w:t xml:space="preserve">2. Huế, Nha Trang ăn mòn cao dù clorua thấp → yếu tố chưa được giải thích.</w:t>
-      </w:r>
-      <w:r>
-        <w:t xml:space="preserve"> </w:t>
-      </w:r>
-      <w:r>
-        <w:t xml:space="preserve">3. Số liệu Việt Nam chủ yếu 1995–2005, chủ yếu thép cacbon năm đầu → thiếu dữ liệu dài hạn và cập nhật theo biến đổi khí hậu.</w:t>
+        <w:t xml:space="preserve">⚠ Dữ liệu khi chạy trước demo:</w:t>
+      </w:r>
+      <w:r>
+        <w:t xml:space="preserve"> </w:t>
+      </w:r>
+      <w:r>
+        <w:t xml:space="preserve">biểu mẫu trống = nhóm xanh;</w:t>
+      </w:r>
+      <w:r>
+        <w:t xml:space="preserve"> </w:t>
+      </w:r>
+      <w:r>
+        <w:rPr>
+          <w:bCs/>
+          <w:b/>
+        </w:rPr>
+        <w:t xml:space="preserve">nội dung đề xuất thật = nhóm vàng</w:t>
+      </w:r>
+      <w:r>
+        <w:t xml:space="preserve"> </w:t>
+      </w:r>
+      <w:r>
+        <w:t xml:space="preserve">→ chỉ dùng tài khoản gói tổ chức (không huấn luyện mô hình), hoặc dùng nội dung đề xuất giả định cho ảnh trình chiếu.</w:t>
       </w:r>
     </w:p>
     <w:p>
@@ -9242,13 +9340,13 @@
           <w:bCs/>
           <w:b/>
         </w:rPr>
-        <w:t xml:space="preserve">Hình ảnh (thay bảng tài liệu):</w:t>
-      </w:r>
-      <w:r>
-        <w:t xml:space="preserve"> </w:t>
-      </w:r>
-      <w:r>
-        <w:t xml:space="preserve">ảnh chụp ma trận bằng chứng do AI lập và 3 khoảng trống có điểm phản biện.</w:t>
+        <w:t xml:space="preserve">Hình ảnh:</w:t>
+      </w:r>
+      <w:r>
+        <w:t xml:space="preserve"> </w:t>
+      </w:r>
+      <w:r>
+        <w:t xml:space="preserve">ảnh chụp bảng đối chiếu có dấu ⚠.</w:t>
       </w:r>
     </w:p>
     <w:p>
@@ -9260,58 +9358,13 @@
           <w:bCs/>
           <w:b/>
         </w:rPr>
-        <w:t xml:space="preserve">Không chiếu (tài liệu phát tay):</w:t>
-      </w:r>
-      <w:r>
-        <w:t xml:space="preserve"> </w:t>
-      </w:r>
-      <w:r>
-        <w:t xml:space="preserve">danh mục 8 tài liệu thật dùng cho demo –</w:t>
-      </w:r>
-      <w:r>
-        <w:t xml:space="preserve"> </w:t>
-      </w:r>
-      <w:r>
-        <w:rPr>
-          <w:rStyle w:val="VerbatimChar"/>
-        </w:rPr>
-        <w:t xml:space="preserve">TAI-LIEU-PHAT-TAY.md</w:t>
-      </w:r>
-      <w:r>
-        <w:t xml:space="preserve"> </w:t>
-      </w:r>
-      <w:r>
-        <w:t xml:space="preserve">mục 7; danh mục đầy đủ 13 tài liệu:</w:t>
-      </w:r>
-      <w:r>
-        <w:t xml:space="preserve"> </w:t>
-      </w:r>
-      <w:r>
-        <w:rPr>
-          <w:rStyle w:val="VerbatimChar"/>
-        </w:rPr>
-        <w:t xml:space="preserve">du-an-nghien-cuu/01-tong-quan-tai-lieu/DANH-MUC-TAI-LIEU.csv</w:t>
-      </w:r>
-      <w:r>
-        <w:t xml:space="preserve">.</w:t>
-      </w:r>
-    </w:p>
-    <w:p>
-      <w:pPr>
-        <w:pStyle w:val="BodyText"/>
-      </w:pPr>
-      <w:r>
-        <w:rPr>
-          <w:bCs/>
-          <w:b/>
-        </w:rPr>
-        <w:t xml:space="preserve">Nguồn:</w:t>
-      </w:r>
-      <w:r>
-        <w:t xml:space="preserve"> </w:t>
-      </w:r>
-      <w:r>
-        <w:t xml:space="preserve">G2 · N25 (công cụ tài liệu) · tài liệu 1–8 · Câu lệnh 1.1–1.3</w:t>
+        <w:t xml:space="preserve">Việc phải làm:</w:t>
+      </w:r>
+      <w:r>
+        <w:t xml:space="preserve"> </w:t>
+      </w:r>
+      <w:r>
+        <w:t xml:space="preserve">người trình bày gửi biểu mẫu của Trung tâm → chạy thử 2 lần, ghi hình lần chạy tốt nhất.</w:t>
       </w:r>
     </w:p>
     <w:p>
@@ -9350,13 +9403,13 @@
       </w:r>
     </w:p>
     <w:bookmarkEnd w:id="39"/>
-    <w:bookmarkStart w:id="40" w:name="X8d7e78c22fb4cd32c248eb2d592e06664dd5bd7"/>
+    <w:bookmarkStart w:id="40" w:name="X606cf028b838d1170c74de0dcc29977c72083bf"/>
     <w:p>
       <w:pPr>
         <w:pStyle w:val="Heading2"/>
       </w:pPr>
       <w:r>
-        <w:t xml:space="preserve">Slide 14 – Đề xuất nhiệm vụ: từ khoảng trống đến phiếu đề xuất và thuyết minh – DEMO 1 (5′)</w:t>
+        <w:t xml:space="preserve">Slide 14 – Hoàn thiện thuyết minh: tiến độ và dự toán kinh phí theo biểu mẫu Trung tâm (4′)</w:t>
       </w:r>
     </w:p>
     <w:p>
@@ -9374,12 +9427,6 @@
         <w:t xml:space="preserve"> </w:t>
       </w:r>
       <w:r>
-        <w:t xml:space="preserve">- Khoảng trống → tính cấp thiết, mục tiêu, nội dung, phương pháp, sản phẩm</w:t>
-      </w:r>
-      <w:r>
-        <w:t xml:space="preserve"> </w:t>
-      </w:r>
-      <w:r>
         <w:t xml:space="preserve">- 🎬</w:t>
       </w:r>
       <w:r>
@@ -9396,23 +9443,7 @@
         <w:t xml:space="preserve"> </w:t>
       </w:r>
       <w:r>
-        <w:t xml:space="preserve">đưa</w:t>
-      </w:r>
-      <w:r>
-        <w:t xml:space="preserve"> </w:t>
-      </w:r>
-      <w:r>
-        <w:rPr>
-          <w:bCs/>
-          <w:b/>
-        </w:rPr>
-        <w:t xml:space="preserve">biểu mẫu thật của Trung tâm</w:t>
-      </w:r>
-      <w:r>
-        <w:t xml:space="preserve"> </w:t>
-      </w:r>
-      <w:r>
-        <w:t xml:space="preserve">(phiếu đề xuất, thuyết minh) vào dự án → AI điền theo khoảng trống đã chọn – trình chiếu ảnh biểu mẫu đã điền và bảng đối chiếu</w:t>
+        <w:t xml:space="preserve">biểu mẫu thuyết minh – tiến độ – dự toán của Trung tâm được AI lập từ thuyết minh đã duyệt</w:t>
       </w:r>
       <w:r>
         <w:t xml:space="preserve"> </w:t>
@@ -9437,7 +9468,7 @@
         <w:rPr>
           <w:rStyle w:val="VerbatimChar"/>
         </w:rPr>
-        <w:t xml:space="preserve">Đọc biểu mẫu [tên biểu mẫu] trong dự án. Liệt kê toàn bộ mục và yêu cầu của từng mục.   Điền nội dung cho khoảng trống số [1]: giữ nguyên số mục, tiêu đề, định dạng của mẫu;   mục nào thiếu thông tin ghi [CẦN BỔ SUNG: ...]; không tự đặt số liệu.   Sau đó lập bảng đối chiếu Mục tiêu → Nội dung → Phương pháp → Sản phẩm → Chỉ tiêu,   đánh dấu ⚠ chỗ không khớp. Xuất tệp .docx.</w:t>
+        <w:t xml:space="preserve">Từ thuyết minh đã duyệt, lập: (1) bảng nội dung công việc – sản phẩm – thời gian – người   thực hiện; (2) sơ đồ Gantt; (3) dự toán theo biểu mẫu [tên], dùng ĐÚNG đơn giá và định mức   tôi cung cấp, không tự đặt đơn giá; (4) kiểm tra logic trình tự và tổng kinh phí;   liệt kê bất hợp lý và đề xuất điều chỉnh. Xuất Word và Excel.</w:t>
       </w:r>
       <w:r>
         <w:t xml:space="preserve"> </w:t>
@@ -9453,13 +9484,35 @@
           <w:bCs/>
           <w:b/>
         </w:rPr>
-        <w:t xml:space="preserve">Kết quả mong đợi:</w:t>
-      </w:r>
-      <w:r>
-        <w:t xml:space="preserve"> </w:t>
-      </w:r>
-      <w:r>
-        <w:t xml:space="preserve">biểu mẫu đã điền đúng cấu trúc; danh sách [CẦN BỔ SUNG]; bảng đối chiếu có dấu ⚠</w:t>
+        <w:t xml:space="preserve">Minh họa phát hiện lỗi</w:t>
+      </w:r>
+      <w:r>
+        <w:t xml:space="preserve"> </w:t>
+      </w:r>
+      <w:r>
+        <w:t xml:space="preserve">(dữ liệu giả lập): AI tìm ra 3 bất hợp lý cài sẵn – thu mẫu trước khi lắp xong giá phơi mẫu; quan trắc khí tượng kết thúc trước mốc thu mẫu cuối; công bố trước khi mô hình xong</w:t>
+      </w:r>
+      <w:r>
+        <w:t xml:space="preserve"> </w:t>
+      </w:r>
+      <w:r>
+        <w:t xml:space="preserve">-</w:t>
+      </w:r>
+      <w:r>
+        <w:t xml:space="preserve"> </w:t>
+      </w:r>
+      <w:r>
+        <w:rPr>
+          <w:bCs/>
+          <w:b/>
+        </w:rPr>
+        <w:t xml:space="preserve">Căn cứ lập dự toán:</w:t>
+      </w:r>
+      <w:r>
+        <w:t xml:space="preserve"> </w:t>
+      </w:r>
+      <w:r>
+        <w:t xml:space="preserve">Thông tư 03/2023/TT-BTC (định mức tối đa cho nhiệm vụ KH&amp;CN dùng ngân sách nhà nước) và quy định riêng của Bộ Quốc phòng, Trung tâm</w:t>
       </w:r>
       <w:r>
         <w:t xml:space="preserve"> </w:t>
@@ -9475,13 +9528,13 @@
           <w:bCs/>
           <w:b/>
         </w:rPr>
-        <w:t xml:space="preserve">Nhà khoa học xác nhận:</w:t>
-      </w:r>
-      <w:r>
-        <w:t xml:space="preserve"> </w:t>
-      </w:r>
-      <w:r>
-        <w:t xml:space="preserve">tính mới, tính khả thi, chỉ tiêu</w:t>
+        <w:t xml:space="preserve">Xác nhận:</w:t>
+      </w:r>
+      <w:r>
+        <w:t xml:space="preserve"> </w:t>
+      </w:r>
+      <w:r>
+        <w:t xml:space="preserve">số liệu tài chính do cán bộ tài chính xác nhận</w:t>
       </w:r>
     </w:p>
     <w:p>
@@ -9493,29 +9546,25 @@
           <w:bCs/>
           <w:b/>
         </w:rPr>
-        <w:t xml:space="preserve">⚠ Dữ liệu khi chạy trước demo:</w:t>
-      </w:r>
-      <w:r>
-        <w:t xml:space="preserve"> </w:t>
-      </w:r>
-      <w:r>
-        <w:t xml:space="preserve">biểu mẫu trống = nhóm xanh;</w:t>
-      </w:r>
-      <w:r>
-        <w:t xml:space="preserve"> </w:t>
-      </w:r>
-      <w:r>
-        <w:rPr>
-          <w:bCs/>
-          <w:b/>
-        </w:rPr>
-        <w:t xml:space="preserve">nội dung đề xuất thật = nhóm vàng</w:t>
-      </w:r>
-      <w:r>
-        <w:t xml:space="preserve"> </w:t>
-      </w:r>
-      <w:r>
-        <w:t xml:space="preserve">→ chỉ dùng tài khoản gói tổ chức (không huấn luyện mô hình), hoặc dùng nội dung đề xuất giả định cho ảnh trình chiếu.</w:t>
+        <w:t xml:space="preserve">Hình ảnh:</w:t>
+      </w:r>
+      <w:r>
+        <w:t xml:space="preserve"> </w:t>
+      </w:r>
+      <w:r>
+        <w:t xml:space="preserve">biểu mẫu đã điền;</w:t>
+      </w:r>
+      <w:r>
+        <w:t xml:space="preserve"> </w:t>
+      </w:r>
+      <w:r>
+        <w:rPr>
+          <w:rStyle w:val="VerbatimChar"/>
+        </w:rPr>
+        <w:t xml:space="preserve">thuyet-trinh/ket-qua-demo/gia-lap/so_do_gantt.png</w:t>
+      </w:r>
+      <w:r>
+        <w:t xml:space="preserve">.</w:t>
       </w:r>
     </w:p>
     <w:p>
@@ -9527,13 +9576,13 @@
           <w:bCs/>
           <w:b/>
         </w:rPr>
-        <w:t xml:space="preserve">Hình ảnh:</w:t>
-      </w:r>
-      <w:r>
-        <w:t xml:space="preserve"> </w:t>
-      </w:r>
-      <w:r>
-        <w:t xml:space="preserve">ảnh chụp bảng đối chiếu có dấu ⚠.</w:t>
+        <w:t xml:space="preserve">Việc phải làm:</w:t>
+      </w:r>
+      <w:r>
+        <w:t xml:space="preserve"> </w:t>
+      </w:r>
+      <w:r>
+        <w:t xml:space="preserve">người trình bày gửi biểu mẫu thuyết minh – tiến độ – dự toán; xác nhận văn bản định mức áp dụng trong Bộ Quốc phòng.</w:t>
       </w:r>
     </w:p>
     <w:p>
@@ -9545,13 +9594,13 @@
           <w:bCs/>
           <w:b/>
         </w:rPr>
-        <w:t xml:space="preserve">Việc phải làm:</w:t>
-      </w:r>
-      <w:r>
-        <w:t xml:space="preserve"> </w:t>
-      </w:r>
-      <w:r>
-        <w:t xml:space="preserve">người trình bày gửi biểu mẫu của Trung tâm → chạy thử 2 lần, ghi hình lần chạy tốt nhất.</w:t>
+        <w:t xml:space="preserve">Nguồn:</w:t>
+      </w:r>
+      <w:r>
+        <w:t xml:space="preserve"> </w:t>
+      </w:r>
+      <w:r>
+        <w:t xml:space="preserve">N26 (Thông tư 03/2023/TT-BTC)</w:t>
       </w:r>
     </w:p>
     <w:p>
@@ -9590,13 +9639,13 @@
       </w:r>
     </w:p>
     <w:bookmarkEnd w:id="40"/>
-    <w:bookmarkStart w:id="41" w:name="X04139c6c9f22e69b4fed779d765a15c1fb6457c"/>
+    <w:bookmarkStart w:id="41" w:name="X8c20f6305ee0f6c27695dc896bfe47eccb1cecf"/>
     <w:p>
       <w:pPr>
         <w:pStyle w:val="Heading2"/>
       </w:pPr>
       <w:r>
-        <w:t xml:space="preserve">Slide 15 – Hồ sơ nhiệm vụ: thuyết minh, tiến độ và kinh phí theo biểu mẫu Trung tâm (4′)</w:t>
+        <w:t xml:space="preserve">Slide 15 – Hướng dẫn xử lý dữ liệu với AI: quy trình 5 bước (4′) 🆕</w:t>
       </w:r>
     </w:p>
     <w:p>
@@ -9609,572 +9658,6 @@
           <w:b/>
         </w:rPr>
         <w:t xml:space="preserve">Chữ trên slide:</w:t>
-      </w:r>
-      <w:r>
-        <w:t xml:space="preserve"> </w:t>
-      </w:r>
-      <w:r>
-        <w:t xml:space="preserve">- 🎬</w:t>
-      </w:r>
-      <w:r>
-        <w:t xml:space="preserve"> </w:t>
-      </w:r>
-      <w:r>
-        <w:rPr>
-          <w:bCs/>
-          <w:b/>
-        </w:rPr>
-        <w:t xml:space="preserve">Kết quả demo đã chạy trước:</w:t>
-      </w:r>
-      <w:r>
-        <w:t xml:space="preserve"> </w:t>
-      </w:r>
-      <w:r>
-        <w:t xml:space="preserve">biểu mẫu thuyết minh – tiến độ – dự toán của Trung tâm được AI lập từ thuyết minh đã duyệt</w:t>
-      </w:r>
-      <w:r>
-        <w:t xml:space="preserve"> </w:t>
-      </w:r>
-      <w:r>
-        <w:t xml:space="preserve">- ⌨</w:t>
-      </w:r>
-      <w:r>
-        <w:t xml:space="preserve"> </w:t>
-      </w:r>
-      <w:r>
-        <w:rPr>
-          <w:bCs/>
-          <w:b/>
-        </w:rPr>
-        <w:t xml:space="preserve">Câu lệnh:</w:t>
-      </w:r>
-      <w:r>
-        <w:t xml:space="preserve"> </w:t>
-      </w:r>
-      <w:r>
-        <w:rPr>
-          <w:rStyle w:val="VerbatimChar"/>
-        </w:rPr>
-        <w:t xml:space="preserve">Từ thuyết minh đã duyệt, lập: (1) bảng nội dung công việc – sản phẩm – thời gian – người   thực hiện; (2) sơ đồ Gantt; (3) dự toán theo biểu mẫu [tên], dùng ĐÚNG đơn giá và định mức   tôi cung cấp, không tự đặt đơn giá; (4) kiểm tra logic trình tự và tổng kinh phí;   liệt kê bất hợp lý và đề xuất điều chỉnh. Xuất Word và Excel.</w:t>
-      </w:r>
-      <w:r>
-        <w:t xml:space="preserve"> </w:t>
-      </w:r>
-      <w:r>
-        <w:t xml:space="preserve">- 📊</w:t>
-      </w:r>
-      <w:r>
-        <w:t xml:space="preserve"> </w:t>
-      </w:r>
-      <w:r>
-        <w:rPr>
-          <w:bCs/>
-          <w:b/>
-        </w:rPr>
-        <w:t xml:space="preserve">Minh họa phát hiện lỗi</w:t>
-      </w:r>
-      <w:r>
-        <w:t xml:space="preserve"> </w:t>
-      </w:r>
-      <w:r>
-        <w:t xml:space="preserve">(dữ liệu giả lập): AI tìm ra 3 bất hợp lý cài sẵn – thu mẫu trước khi lắp xong giá phơi mẫu; quan trắc khí tượng kết thúc trước mốc thu mẫu cuối; công bố trước khi mô hình xong</w:t>
-      </w:r>
-      <w:r>
-        <w:t xml:space="preserve"> </w:t>
-      </w:r>
-      <w:r>
-        <w:t xml:space="preserve">-</w:t>
-      </w:r>
-      <w:r>
-        <w:t xml:space="preserve"> </w:t>
-      </w:r>
-      <w:r>
-        <w:rPr>
-          <w:bCs/>
-          <w:b/>
-        </w:rPr>
-        <w:t xml:space="preserve">Căn cứ lập dự toán:</w:t>
-      </w:r>
-      <w:r>
-        <w:t xml:space="preserve"> </w:t>
-      </w:r>
-      <w:r>
-        <w:t xml:space="preserve">Thông tư 03/2023/TT-BTC (định mức tối đa cho nhiệm vụ KH&amp;CN dùng ngân sách nhà nước) và quy định riêng của Bộ Quốc phòng, Trung tâm</w:t>
-      </w:r>
-      <w:r>
-        <w:t xml:space="preserve"> </w:t>
-      </w:r>
-      <w:r>
-        <w:t xml:space="preserve">- ✅</w:t>
-      </w:r>
-      <w:r>
-        <w:t xml:space="preserve"> </w:t>
-      </w:r>
-      <w:r>
-        <w:rPr>
-          <w:bCs/>
-          <w:b/>
-        </w:rPr>
-        <w:t xml:space="preserve">Xác nhận:</w:t>
-      </w:r>
-      <w:r>
-        <w:t xml:space="preserve"> </w:t>
-      </w:r>
-      <w:r>
-        <w:t xml:space="preserve">số liệu tài chính do cán bộ tài chính xác nhận</w:t>
-      </w:r>
-    </w:p>
-    <w:p>
-      <w:pPr>
-        <w:pStyle w:val="BodyText"/>
-      </w:pPr>
-      <w:r>
-        <w:rPr>
-          <w:bCs/>
-          <w:b/>
-        </w:rPr>
-        <w:t xml:space="preserve">Hình ảnh:</w:t>
-      </w:r>
-      <w:r>
-        <w:t xml:space="preserve"> </w:t>
-      </w:r>
-      <w:r>
-        <w:t xml:space="preserve">biểu mẫu đã điền;</w:t>
-      </w:r>
-      <w:r>
-        <w:t xml:space="preserve"> </w:t>
-      </w:r>
-      <w:r>
-        <w:rPr>
-          <w:rStyle w:val="VerbatimChar"/>
-        </w:rPr>
-        <w:t xml:space="preserve">thuyet-trinh/ket-qua-demo/gia-lap/so_do_gantt.png</w:t>
-      </w:r>
-      <w:r>
-        <w:t xml:space="preserve">.</w:t>
-      </w:r>
-    </w:p>
-    <w:p>
-      <w:pPr>
-        <w:pStyle w:val="BodyText"/>
-      </w:pPr>
-      <w:r>
-        <w:rPr>
-          <w:bCs/>
-          <w:b/>
-        </w:rPr>
-        <w:t xml:space="preserve">Việc phải làm:</w:t>
-      </w:r>
-      <w:r>
-        <w:t xml:space="preserve"> </w:t>
-      </w:r>
-      <w:r>
-        <w:t xml:space="preserve">người trình bày gửi biểu mẫu thuyết minh – tiến độ – dự toán; xác nhận văn bản định mức áp dụng trong Bộ Quốc phòng.</w:t>
-      </w:r>
-    </w:p>
-    <w:p>
-      <w:pPr>
-        <w:pStyle w:val="BodyText"/>
-      </w:pPr>
-      <w:r>
-        <w:rPr>
-          <w:bCs/>
-          <w:b/>
-        </w:rPr>
-        <w:t xml:space="preserve">Nguồn:</w:t>
-      </w:r>
-      <w:r>
-        <w:t xml:space="preserve"> </w:t>
-      </w:r>
-      <w:r>
-        <w:t xml:space="preserve">N26 (Thông tư 03/2023/TT-BTC)</w:t>
-      </w:r>
-    </w:p>
-    <w:p>
-      <w:pPr>
-        <w:pStyle w:val="BodyText"/>
-      </w:pPr>
-      <w:r>
-        <w:rPr>
-          <w:bCs/>
-          <w:b/>
-        </w:rPr>
-        <w:t xml:space="preserve">Duyệt:</w:t>
-      </w:r>
-      <w:r>
-        <w:t xml:space="preserve"> </w:t>
-      </w:r>
-      <w:r>
-        <w:t xml:space="preserve">[ ] Duyệt · [ ] Sửa · [ ] Bỏ</w:t>
-      </w:r>
-      <w:r>
-        <w:t xml:space="preserve"> </w:t>
-      </w:r>
-      <w:r>
-        <w:rPr>
-          <w:bCs/>
-          <w:b/>
-        </w:rPr>
-        <w:t xml:space="preserve">Ghi chú:</w:t>
-      </w:r>
-    </w:p>
-    <w:p>
-      <w:r>
-        <w:pict>
-          <v:rect style="width:0;height:1.5pt" o:hralign="center" o:hrstd="t" o:hr="t"/>
-        </w:pict>
-      </w:r>
-    </w:p>
-    <w:bookmarkEnd w:id="41"/>
-    <w:bookmarkStart w:id="42" w:name="Xae2fbca96bcb46ff2b706302da1d5a4147a88ee"/>
-    <w:p>
-      <w:pPr>
-        <w:pStyle w:val="Heading2"/>
-      </w:pPr>
-      <w:r>
-        <w:t xml:space="preserve">Slide 16 – Xử lý dữ liệu: AI viết và chạy mã Python – DEMO 2 (6′)</w:t>
-      </w:r>
-    </w:p>
-    <w:p>
-      <w:pPr>
-        <w:pStyle w:val="FirstParagraph"/>
-      </w:pPr>
-      <w:r>
-        <w:rPr>
-          <w:bCs/>
-          <w:b/>
-        </w:rPr>
-        <w:t xml:space="preserve">Chữ trên slide:</w:t>
-      </w:r>
-      <w:r>
-        <w:t xml:space="preserve"> </w:t>
-      </w:r>
-      <w:r>
-        <w:t xml:space="preserve">- 🌍</w:t>
-      </w:r>
-      <w:r>
-        <w:t xml:space="preserve"> </w:t>
-      </w:r>
-      <w:r>
-        <w:rPr>
-          <w:bCs/>
-          <w:b/>
-        </w:rPr>
-        <w:t xml:space="preserve">Ví dụ thật:</w:t>
-      </w:r>
-      <w:r>
-        <w:t xml:space="preserve"> </w:t>
-      </w:r>
-      <w:r>
-        <w:t xml:space="preserve">ERA (Google,</w:t>
-      </w:r>
-      <w:r>
-        <w:t xml:space="preserve"> </w:t>
-      </w:r>
-      <w:r>
-        <w:rPr>
-          <w:iCs/>
-          <w:i/>
-        </w:rPr>
-        <w:t xml:space="preserve">Nature</w:t>
-      </w:r>
-      <w:r>
-        <w:t xml:space="preserve"> </w:t>
-      </w:r>
-      <w:r>
-        <w:t xml:space="preserve">2026) – AI tự viết, chạy, chấm điểm, cải tiến mã</w:t>
-      </w:r>
-      <w:r>
-        <w:t xml:space="preserve"> </w:t>
-      </w:r>
-      <w:r>
-        <w:t xml:space="preserve">-</w:t>
-      </w:r>
-      <w:r>
-        <w:t xml:space="preserve"> </w:t>
-      </w:r>
-      <w:r>
-        <w:rPr>
-          <w:bCs/>
-          <w:b/>
-        </w:rPr>
-        <w:t xml:space="preserve">Nhà khoa học không cần biết lập trình:</w:t>
-      </w:r>
-      <w:r>
-        <w:t xml:space="preserve"> </w:t>
-      </w:r>
-      <w:r>
-        <w:t xml:space="preserve">mô tả việc cần làm → AI viết mã Python → chạy → trả bảng, biểu đồ,</w:t>
-      </w:r>
-      <w:r>
-        <w:t xml:space="preserve"> </w:t>
-      </w:r>
-      <w:r>
-        <w:rPr>
-          <w:bCs/>
-          <w:b/>
-        </w:rPr>
-        <w:t xml:space="preserve">kèm mã để tái lập</w:t>
-      </w:r>
-      <w:r>
-        <w:t xml:space="preserve"> </w:t>
-      </w:r>
-      <w:r>
-        <w:t xml:space="preserve">- ⌨</w:t>
-      </w:r>
-      <w:r>
-        <w:t xml:space="preserve"> </w:t>
-      </w:r>
-      <w:r>
-        <w:rPr>
-          <w:bCs/>
-          <w:b/>
-        </w:rPr>
-        <w:t xml:space="preserve">Câu lệnh đã dùng:</w:t>
-      </w:r>
-      <w:r>
-        <w:t xml:space="preserve"> </w:t>
-      </w:r>
-      <w:r>
-        <w:t xml:space="preserve">rà soát dữ liệu → tính toán và lập mô hình → vẽ biểu đồ</w:t>
-      </w:r>
-      <w:r>
-        <w:t xml:space="preserve"> </w:t>
-      </w:r>
-      <w:r>
-        <w:t xml:space="preserve">- 📊</w:t>
-      </w:r>
-      <w:r>
-        <w:t xml:space="preserve"> </w:t>
-      </w:r>
-      <w:r>
-        <w:rPr>
-          <w:bCs/>
-          <w:b/>
-        </w:rPr>
-        <w:t xml:space="preserve">Kết quả:</w:t>
-      </w:r>
-      <w:r>
-        <w:t xml:space="preserve"> </w:t>
-      </w:r>
-      <w:r>
-        <w:t xml:space="preserve">- Dữ liệu giả lập: phát hiện đủ</w:t>
-      </w:r>
-      <w:r>
-        <w:t xml:space="preserve"> </w:t>
-      </w:r>
-      <w:r>
-        <w:rPr>
-          <w:bCs/>
-          <w:b/>
-        </w:rPr>
-        <w:t xml:space="preserve">14/14 lỗi</w:t>
-      </w:r>
-      <w:r>
-        <w:t xml:space="preserve"> </w:t>
-      </w:r>
-      <w:r>
-        <w:t xml:space="preserve">cài sẵn; thép CT3 ven biển C4 · đô thị C3 · nội địa C2</w:t>
-      </w:r>
-      <w:r>
-        <w:t xml:space="preserve"> </w:t>
-      </w:r>
-      <w:r>
-        <w:t xml:space="preserve">- Dữ liệu thật (387 số đo): kết quả chính đã nêu ở Slide 9; mô hình 3D ở Slide 17</w:t>
-      </w:r>
-      <w:r>
-        <w:t xml:space="preserve"> </w:t>
-      </w:r>
-      <w:r>
-        <w:t xml:space="preserve">- 💡</w:t>
-      </w:r>
-      <w:r>
-        <w:t xml:space="preserve"> </w:t>
-      </w:r>
-      <w:r>
-        <w:rPr>
-          <w:bCs/>
-          <w:b/>
-        </w:rPr>
-        <w:t xml:space="preserve">Bài học:</w:t>
-      </w:r>
-      <w:r>
-        <w:t xml:space="preserve"> </w:t>
-      </w:r>
-      <w:r>
-        <w:t xml:space="preserve">AI viết mã rất nhanh – nhưng cách tìm số đo bất thường AI chọn lần đầu đánh dấu nhầm 20 giá trị bình thường và bỏ sót lỗi gõ nhầm; chọn phương pháp phù hợp với thiết kế thí nghiệm (3 mẫu lặp) là việc của người làm chuyên môn</w:t>
-      </w:r>
-    </w:p>
-    <w:p>
-      <w:pPr>
-        <w:pStyle w:val="BodyText"/>
-      </w:pPr>
-      <w:r>
-        <w:rPr>
-          <w:bCs/>
-          <w:b/>
-        </w:rPr>
-        <w:t xml:space="preserve">Hình ảnh:</w:t>
-      </w:r>
-      <w:r>
-        <w:t xml:space="preserve"> </w:t>
-      </w:r>
-      <w:r>
-        <w:rPr>
-          <w:rStyle w:val="VerbatimChar"/>
-        </w:rPr>
-        <w:t xml:space="preserve">thuyet-trinh/ket-qua-demo/gia-lap/bieu_do_dong_hoc_an_mon.png</w:t>
-      </w:r>
-      <w:r>
-        <w:t xml:space="preserve">;</w:t>
-      </w:r>
-      <w:r>
-        <w:t xml:space="preserve"> </w:t>
-      </w:r>
-      <w:r>
-        <w:rPr>
-          <w:rStyle w:val="VerbatimChar"/>
-        </w:rPr>
-        <w:t xml:space="preserve">du-an-nghien-cuu/05-ket-qua/hinh/do_vs_du_doan.png</w:t>
-      </w:r>
-      <w:r>
-        <w:t xml:space="preserve">;</w:t>
-      </w:r>
-      <w:r>
-        <w:t xml:space="preserve"> </w:t>
-      </w:r>
-      <w:r>
-        <w:rPr>
-          <w:rStyle w:val="VerbatimChar"/>
-        </w:rPr>
-        <w:t xml:space="preserve">du-an-nghien-cuu/05-ket-qua/mo-hinh-3d/3D_3_be_mat_tam_thep.png</w:t>
-      </w:r>
-      <w:r>
-        <w:t xml:space="preserve">.</w:t>
-      </w:r>
-    </w:p>
-    <w:p>
-      <w:pPr>
-        <w:pStyle w:val="BodyText"/>
-      </w:pPr>
-      <w:r>
-        <w:rPr>
-          <w:bCs/>
-          <w:b/>
-        </w:rPr>
-        <w:t xml:space="preserve">🎬 Trình chiếu:</w:t>
-      </w:r>
-      <w:r>
-        <w:t xml:space="preserve"> </w:t>
-      </w:r>
-      <w:r>
-        <w:t xml:space="preserve">video ghi sẵn ~2 phút (câu lệnh 4.2 → 4.3 → 4.4 tua nhanh) + ảnh báo cáo chất lượng dữ liệu.</w:t>
-      </w:r>
-    </w:p>
-    <w:p>
-      <w:pPr>
-        <w:pStyle w:val="BodyText"/>
-      </w:pPr>
-      <w:r>
-        <w:rPr>
-          <w:bCs/>
-          <w:b/>
-        </w:rPr>
-        <w:t xml:space="preserve">Nguồn:</w:t>
-      </w:r>
-      <w:r>
-        <w:t xml:space="preserve"> </w:t>
-      </w:r>
-      <w:r>
-        <w:t xml:space="preserve">G5 ·</w:t>
-      </w:r>
-      <w:r>
-        <w:t xml:space="preserve"> </w:t>
-      </w:r>
-      <w:r>
-        <w:rPr>
-          <w:rStyle w:val="VerbatimChar"/>
-        </w:rPr>
-        <w:t xml:space="preserve">du-an-nghien-cuu/07-bao-cao/BAO-CAO-TONG-HOP.md</w:t>
-      </w:r>
-    </w:p>
-    <w:p>
-      <w:pPr>
-        <w:pStyle w:val="BodyText"/>
-      </w:pPr>
-      <w:r>
-        <w:rPr>
-          <w:bCs/>
-          <w:b/>
-        </w:rPr>
-        <w:t xml:space="preserve">Duyệt:</w:t>
-      </w:r>
-      <w:r>
-        <w:t xml:space="preserve"> </w:t>
-      </w:r>
-      <w:r>
-        <w:t xml:space="preserve">[ ] Duyệt · [ ] Sửa · [ ] Bỏ</w:t>
-      </w:r>
-      <w:r>
-        <w:t xml:space="preserve"> </w:t>
-      </w:r>
-      <w:r>
-        <w:rPr>
-          <w:bCs/>
-          <w:b/>
-        </w:rPr>
-        <w:t xml:space="preserve">Ghi chú:</w:t>
-      </w:r>
-    </w:p>
-    <w:p>
-      <w:r>
-        <w:pict>
-          <v:rect style="width:0;height:1.5pt" o:hralign="center" o:hrstd="t" o:hr="t"/>
-        </w:pict>
-      </w:r>
-    </w:p>
-    <w:bookmarkEnd w:id="42"/>
-    <w:bookmarkStart w:id="43" w:name="X834e235100fb9429d0e71671f229adf457c23df"/>
-    <w:p>
-      <w:pPr>
-        <w:pStyle w:val="Heading2"/>
-      </w:pPr>
-      <w:r>
-        <w:t xml:space="preserve">Slide 17 – Mô hình 3D: mô phỏng quá trình ăn mòn vật liệu theo thời gian (3′)</w:t>
-      </w:r>
-    </w:p>
-    <w:p>
-      <w:pPr>
-        <w:pStyle w:val="FirstParagraph"/>
-      </w:pPr>
-      <w:r>
-        <w:rPr>
-          <w:bCs/>
-          <w:b/>
-        </w:rPr>
-        <w:t xml:space="preserve">Chữ trên slide:</w:t>
-      </w:r>
-      <w:r>
-        <w:t xml:space="preserve"> </w:t>
-      </w:r>
-      <w:r>
-        <w:t xml:space="preserve">-</w:t>
-      </w:r>
-      <w:r>
-        <w:t xml:space="preserve"> </w:t>
-      </w:r>
-      <w:r>
-        <w:rPr>
-          <w:bCs/>
-          <w:b/>
-        </w:rPr>
-        <w:t xml:space="preserve">Từ con số đến hình ảnh:</w:t>
-      </w:r>
-      <w:r>
-        <w:t xml:space="preserve"> </w:t>
-      </w:r>
-      <w:r>
-        <w:t xml:space="preserve">AI viết mã dựng mô hình 3D tương tác – mở bằng trình duyệt, xoay, phóng to, bấm ▶ để xem ăn mòn diễn ra theo từng năm</w:t>
       </w:r>
     </w:p>
     <w:tbl>
@@ -10201,121 +9684,69 @@
               <w:jc w:val="left"/>
             </w:pPr>
             <w:r>
-              <w:t xml:space="preserve">Mô hình</w:t>
-            </w:r>
-          </w:p>
-        </w:tc>
-        <w:tc>
-          <w:tcPr/>
-          <w:p>
-            <w:pPr>
-              <w:pStyle w:val="Compact"/>
-              <w:jc w:val="left"/>
-            </w:pPr>
-            <w:r>
-              <w:t xml:space="preserve">Mô tả</w:t>
-            </w:r>
-          </w:p>
-        </w:tc>
-        <w:tc>
-          <w:tcPr/>
-          <w:p>
-            <w:pPr>
-              <w:pStyle w:val="Compact"/>
-              <w:jc w:val="left"/>
-            </w:pPr>
-            <w:r>
-              <w:t xml:space="preserve">Căn cứ</w:t>
-            </w:r>
-          </w:p>
-        </w:tc>
-      </w:tr>
-      <w:tr>
-        <w:tc>
-          <w:tcPr/>
-          <w:p>
-            <w:pPr>
-              <w:pStyle w:val="Compact"/>
-              <w:jc w:val="left"/>
-            </w:pPr>
-            <w:r>
-              <w:t xml:space="preserve">Mặt đáp ứng</w:t>
-            </w:r>
-          </w:p>
-        </w:tc>
-        <w:tc>
-          <w:tcPr/>
-          <w:p>
-            <w:pPr>
-              <w:pStyle w:val="Compact"/>
-              <w:jc w:val="left"/>
-            </w:pPr>
-            <w:r>
-              <w:t xml:space="preserve">Tốc độ ăn mòn năm đầu theo clorua và thời gian ẩm ướt – Việt Nam, Nga; điểm = số đo thật</w:t>
-            </w:r>
-          </w:p>
-        </w:tc>
-        <w:tc>
-          <w:tcPr/>
-          <w:p>
-            <w:pPr>
-              <w:pStyle w:val="Compact"/>
-              <w:jc w:val="left"/>
-            </w:pPr>
-            <w:r>
-              <w:t xml:space="preserve">Hàm liều – đáp ứng hiệu chỉnh vùng, 387 số đo</w:t>
-            </w:r>
-          </w:p>
-        </w:tc>
-      </w:tr>
-      <w:tr>
-        <w:tc>
-          <w:tcPr/>
-          <w:p>
-            <w:pPr>
-              <w:pStyle w:val="Compact"/>
-              <w:jc w:val="left"/>
-            </w:pPr>
-            <w:r>
-              <w:t xml:space="preserve">Diễn tiến theo thời gian</w:t>
-            </w:r>
-          </w:p>
-        </w:tc>
-        <w:tc>
-          <w:tcPr/>
-          <w:p>
-            <w:pPr>
-              <w:pStyle w:val="Compact"/>
-              <w:jc w:val="left"/>
-            </w:pPr>
-            <w:r>
-              <w:t xml:space="preserve">Chiều dày thép mất theo năm và mức clorua</w:t>
-            </w:r>
-          </w:p>
-        </w:tc>
-        <w:tc>
-          <w:tcPr/>
-          <w:p>
-            <w:pPr>
-              <w:pStyle w:val="Compact"/>
-              <w:jc w:val="left"/>
-            </w:pPr>
-            <w:r>
-              <w:t xml:space="preserve">ISO 9224: D = r·t^b, b = 0,523</w:t>
-            </w:r>
-          </w:p>
-        </w:tc>
-      </w:tr>
-      <w:tr>
-        <w:tc>
-          <w:tcPr/>
-          <w:p>
-            <w:pPr>
-              <w:pStyle w:val="Compact"/>
-              <w:jc w:val="left"/>
-            </w:pPr>
-            <w:r>
-              <w:t xml:space="preserve">🆕</w:t>
+              <w:t xml:space="preserve">Bước</w:t>
+            </w:r>
+          </w:p>
+        </w:tc>
+        <w:tc>
+          <w:tcPr/>
+          <w:p>
+            <w:pPr>
+              <w:pStyle w:val="Compact"/>
+              <w:jc w:val="left"/>
+            </w:pPr>
+            <w:r>
+              <w:t xml:space="preserve">AI làm</w:t>
+            </w:r>
+          </w:p>
+        </w:tc>
+        <w:tc>
+          <w:tcPr/>
+          <w:p>
+            <w:pPr>
+              <w:pStyle w:val="Compact"/>
+              <w:jc w:val="left"/>
+            </w:pPr>
+            <w:r>
+              <w:t xml:space="preserve">Nhà khoa học kiểm soát</w:t>
+            </w:r>
+          </w:p>
+        </w:tc>
+      </w:tr>
+      <w:tr>
+        <w:tc>
+          <w:tcPr/>
+          <w:p>
+            <w:pPr>
+              <w:pStyle w:val="Compact"/>
+              <w:jc w:val="left"/>
+            </w:pPr>
+            <w:r>
+              <w:t xml:space="preserve">1. Chuẩn bị dữ liệu</w:t>
+            </w:r>
+          </w:p>
+        </w:tc>
+        <w:tc>
+          <w:tcPr/>
+          <w:p>
+            <w:pPr>
+              <w:pStyle w:val="Compact"/>
+              <w:jc w:val="left"/>
+            </w:pPr>
+            <w:r>
+              <w:t xml:space="preserve">Đọc tệp, mô tả cấu trúc: số dòng, tên cột, đơn vị, nguồn</w:t>
+            </w:r>
+          </w:p>
+        </w:tc>
+        <w:tc>
+          <w:tcPr/>
+          <w:p>
+            <w:pPr>
+              <w:pStyle w:val="Compact"/>
+              <w:jc w:val="left"/>
+            </w:pPr>
+            <w:r>
+              <w:t xml:space="preserve">Giữ</w:t>
             </w:r>
             <w:r>
               <w:t xml:space="preserve"> </w:t>
@@ -10325,79 +9756,179 @@
                 <w:bCs/>
                 <w:b/>
               </w:rPr>
-              <w:t xml:space="preserve">Quá trình ăn mòn (hoạt hình)</w:t>
-            </w:r>
-          </w:p>
-        </w:tc>
-        <w:tc>
-          <w:tcPr/>
-          <w:p>
-            <w:pPr>
-              <w:pStyle w:val="Compact"/>
-              <w:jc w:val="left"/>
-            </w:pPr>
-            <w:r>
-              <w:t xml:space="preserve">Khối mẫu thép tại Nha Trang, 0 → 30 năm: bề mặt kim loại hạ dần, lớp gỉ dày lên, hố ăn mòn sâu dần; kèm mặt cắt</w:t>
-            </w:r>
-          </w:p>
-        </w:tc>
-        <w:tc>
-          <w:tcPr/>
-          <w:p>
-            <w:pPr>
-              <w:pStyle w:val="Compact"/>
-              <w:jc w:val="left"/>
-            </w:pPr>
-            <w:r>
-              <w:t xml:space="preserve">D(t) từ số đo r = 40,6 µm/năm; hình dạng gỉ, hố: minh họa</w:t>
-            </w:r>
-          </w:p>
-        </w:tc>
-      </w:tr>
-      <w:tr>
-        <w:tc>
-          <w:tcPr/>
-          <w:p>
-            <w:pPr>
-              <w:pStyle w:val="Compact"/>
-              <w:jc w:val="left"/>
-            </w:pPr>
-            <w:r>
-              <w:t xml:space="preserve">🆕</w:t>
-            </w:r>
-            <w:r>
-              <w:t xml:space="preserve"> </w:t>
-            </w:r>
+              <w:t xml:space="preserve">bản gốc chỉ đọc</w:t>
+            </w:r>
+            <w:r>
+              <w:t xml:space="preserve">; lập từ điển dữ liệu; chỉ đưa dữ liệu được phép</w:t>
+            </w:r>
+          </w:p>
+        </w:tc>
+      </w:tr>
+      <w:tr>
+        <w:tc>
+          <w:tcPr/>
+          <w:p>
+            <w:pPr>
+              <w:pStyle w:val="Compact"/>
+              <w:jc w:val="left"/>
+            </w:pPr>
+            <w:r>
+              <w:t xml:space="preserve">2. Kiểm tra chất lượng</w:t>
+            </w:r>
+          </w:p>
+        </w:tc>
+        <w:tc>
+          <w:tcPr/>
+          <w:p>
+            <w:pPr>
+              <w:pStyle w:val="Compact"/>
+              <w:jc w:val="left"/>
+            </w:pPr>
+            <w:r>
+              <w:t xml:space="preserve">Tìm dòng trùng, ô trống, sai định dạng, sai đơn vị, giá trị bất thường → báo cáo</w:t>
+            </w:r>
+          </w:p>
+        </w:tc>
+        <w:tc>
+          <w:tcPr/>
+          <w:p>
+            <w:pPr>
+              <w:pStyle w:val="Compact"/>
+              <w:jc w:val="left"/>
+            </w:pPr>
             <w:r>
               <w:rPr>
                 <w:bCs/>
                 <w:b/>
               </w:rPr>
-              <w:t xml:space="preserve">So sánh vật liệu</w:t>
-            </w:r>
-          </w:p>
-        </w:tc>
-        <w:tc>
-          <w:tcPr/>
-          <w:p>
-            <w:pPr>
-              <w:pStyle w:val="Compact"/>
-              <w:jc w:val="left"/>
-            </w:pPr>
-            <w:r>
-              <w:t xml:space="preserve">Thép – kẽm – đồng – nhôm trong cùng cấp ăn mòn C3</w:t>
-            </w:r>
-          </w:p>
-        </w:tc>
-        <w:tc>
-          <w:tcPr/>
-          <w:p>
-            <w:pPr>
-              <w:pStyle w:val="Compact"/>
-              <w:jc w:val="left"/>
-            </w:pPr>
-            <w:r>
-              <w:t xml:space="preserve">ISO 9223 Bảng 2; ISO 9224</w:t>
+              <w:t xml:space="preserve">Chỉ đánh dấu, không tự xóa</w:t>
+            </w:r>
+            <w:r>
+              <w:t xml:space="preserve">; quyết định giữ / loại</w:t>
+            </w:r>
+          </w:p>
+        </w:tc>
+      </w:tr>
+      <w:tr>
+        <w:tc>
+          <w:tcPr/>
+          <w:p>
+            <w:pPr>
+              <w:pStyle w:val="Compact"/>
+              <w:jc w:val="left"/>
+            </w:pPr>
+            <w:r>
+              <w:t xml:space="preserve">3. Phân tích, lập mô hình</w:t>
+            </w:r>
+          </w:p>
+        </w:tc>
+        <w:tc>
+          <w:tcPr/>
+          <w:p>
+            <w:pPr>
+              <w:pStyle w:val="Compact"/>
+              <w:jc w:val="left"/>
+            </w:pPr>
+            <w:r>
+              <w:t xml:space="preserve">Viết và chạy mã Python: thống kê, hồi quy, mô hình theo tiêu chuẩn</w:t>
+            </w:r>
+          </w:p>
+        </w:tc>
+        <w:tc>
+          <w:tcPr/>
+          <w:p>
+            <w:pPr>
+              <w:pStyle w:val="Compact"/>
+              <w:jc w:val="left"/>
+            </w:pPr>
+            <w:r>
+              <w:rPr>
+                <w:bCs/>
+                <w:b/>
+              </w:rPr>
+              <w:t xml:space="preserve">Chọn phương pháp</w:t>
+            </w:r>
+            <w:r>
+              <w:t xml:space="preserve"> </w:t>
+            </w:r>
+            <w:r>
+              <w:t xml:space="preserve">phù hợp thiết kế thí nghiệm; nêu rõ giả định</w:t>
+            </w:r>
+          </w:p>
+        </w:tc>
+      </w:tr>
+      <w:tr>
+        <w:tc>
+          <w:tcPr/>
+          <w:p>
+            <w:pPr>
+              <w:pStyle w:val="Compact"/>
+              <w:jc w:val="left"/>
+            </w:pPr>
+            <w:r>
+              <w:t xml:space="preserve">4. Kiểm định kết quả</w:t>
+            </w:r>
+          </w:p>
+        </w:tc>
+        <w:tc>
+          <w:tcPr/>
+          <w:p>
+            <w:pPr>
+              <w:pStyle w:val="Compact"/>
+              <w:jc w:val="left"/>
+            </w:pPr>
+            <w:r>
+              <w:t xml:space="preserve">Tách tập kiểm định độc lập, tính sai số, so với tiêu chuẩn, số liệu đã công bố</w:t>
+            </w:r>
+          </w:p>
+        </w:tc>
+        <w:tc>
+          <w:tcPr/>
+          <w:p>
+            <w:pPr>
+              <w:pStyle w:val="Compact"/>
+              <w:jc w:val="left"/>
+            </w:pPr>
+            <w:r>
+              <w:t xml:space="preserve">Đánh giá kết quả có hợp lý về chuyên môn</w:t>
+            </w:r>
+          </w:p>
+        </w:tc>
+      </w:tr>
+      <w:tr>
+        <w:tc>
+          <w:tcPr/>
+          <w:p>
+            <w:pPr>
+              <w:pStyle w:val="Compact"/>
+              <w:jc w:val="left"/>
+            </w:pPr>
+            <w:r>
+              <w:t xml:space="preserve">5. Lưu trữ, tái lập</w:t>
+            </w:r>
+          </w:p>
+        </w:tc>
+        <w:tc>
+          <w:tcPr/>
+          <w:p>
+            <w:pPr>
+              <w:pStyle w:val="Compact"/>
+              <w:jc w:val="left"/>
+            </w:pPr>
+            <w:r>
+              <w:t xml:space="preserve">Lưu mã, dữ liệu đã xử lý, nhật ký từng bước</w:t>
+            </w:r>
+          </w:p>
+        </w:tc>
+        <w:tc>
+          <w:tcPr/>
+          <w:p>
+            <w:pPr>
+              <w:pStyle w:val="Compact"/>
+              <w:jc w:val="left"/>
+            </w:pPr>
+            <w:r>
+              <w:t xml:space="preserve">Chạy lại ra cùng kết quả; lưu theo cấu trúc dự án</w:t>
             </w:r>
           </w:p>
         </w:tc>
@@ -10405,172 +9936,58 @@
     </w:tbl>
     <w:p>
       <w:pPr>
-        <w:numPr>
-          <w:ilvl w:val="0"/>
-          <w:numId w:val="1002"/>
-        </w:numPr>
-        <w:pStyle w:val="Compact"/>
-      </w:pPr>
-      <w:r>
-        <w:t xml:space="preserve">📊</w:t>
-      </w:r>
-      <w:r>
-        <w:t xml:space="preserve"> </w:t>
-      </w:r>
-      <w:r>
-        <w:rPr>
-          <w:bCs/>
-          <w:b/>
-        </w:rPr>
-        <w:t xml:space="preserve">Kết quả:</w:t>
-      </w:r>
-    </w:p>
-    <w:p>
-      <w:pPr>
-        <w:numPr>
-          <w:ilvl w:val="1"/>
-          <w:numId w:val="1003"/>
-        </w:numPr>
-        <w:pStyle w:val="Compact"/>
-      </w:pPr>
-      <w:r>
-        <w:t xml:space="preserve">Nha Trang: thép mất trung bình</w:t>
-      </w:r>
-      <w:r>
-        <w:t xml:space="preserve"> </w:t>
-      </w:r>
-      <w:r>
-        <w:rPr>
-          <w:bCs/>
-          <w:b/>
-        </w:rPr>
-        <w:t xml:space="preserve">41 µm</w:t>
-      </w:r>
-      <w:r>
-        <w:t xml:space="preserve"> </w:t>
-      </w:r>
-      <w:r>
-        <w:t xml:space="preserve">sau 1 năm →</w:t>
-      </w:r>
-      <w:r>
-        <w:t xml:space="preserve"> </w:t>
-      </w:r>
-      <w:r>
-        <w:rPr>
-          <w:bCs/>
-          <w:b/>
-        </w:rPr>
-        <w:t xml:space="preserve">135 µm</w:t>
-      </w:r>
-      <w:r>
-        <w:t xml:space="preserve"> </w:t>
-      </w:r>
-      <w:r>
-        <w:t xml:space="preserve">sau 10 năm →</w:t>
-      </w:r>
-      <w:r>
-        <w:t xml:space="preserve"> </w:t>
-      </w:r>
-      <w:r>
-        <w:rPr>
-          <w:bCs/>
-          <w:b/>
-        </w:rPr>
-        <w:t xml:space="preserve">245 µm</w:t>
-      </w:r>
-      <w:r>
-        <w:t xml:space="preserve"> </w:t>
-      </w:r>
-      <w:r>
-        <w:t xml:space="preserve">sau 30 năm (≈ 1.926 g/m²)</w:t>
-      </w:r>
-    </w:p>
-    <w:p>
-      <w:pPr>
-        <w:numPr>
-          <w:ilvl w:val="1"/>
-          <w:numId w:val="1003"/>
-        </w:numPr>
-        <w:pStyle w:val="Compact"/>
-      </w:pPr>
-      <w:r>
-        <w:t xml:space="preserve">Cấp C3, sau 30 năm: thép ≈ 218 µm · kẽm ≈ 20 µm · đồng ≈ 9 µm · nhôm ≈ 5 µm</w:t>
-      </w:r>
-    </w:p>
-    <w:p>
-      <w:pPr>
-        <w:numPr>
-          <w:ilvl w:val="0"/>
-          <w:numId w:val="1002"/>
-        </w:numPr>
-        <w:pStyle w:val="Compact"/>
-      </w:pPr>
-      <w:r>
-        <w:t xml:space="preserve">⚠</w:t>
-      </w:r>
-      <w:r>
-        <w:t xml:space="preserve"> </w:t>
-      </w:r>
-      <w:r>
-        <w:rPr>
-          <w:bCs/>
-          <w:b/>
-        </w:rPr>
-        <w:t xml:space="preserve">Ghi rõ trên hình:</w:t>
-      </w:r>
-      <w:r>
-        <w:t xml:space="preserve"> </w:t>
-      </w:r>
-      <w:r>
-        <w:t xml:space="preserve">phần</w:t>
-      </w:r>
-      <w:r>
-        <w:t xml:space="preserve"> </w:t>
-      </w:r>
-      <w:r>
-        <w:rPr>
-          <w:bCs/>
-          <w:b/>
-        </w:rPr>
-        <w:t xml:space="preserve">định lượng</w:t>
-      </w:r>
-      <w:r>
-        <w:t xml:space="preserve"> </w:t>
-      </w:r>
-      <w:r>
-        <w:t xml:space="preserve">(số đo, tiêu chuẩn) và phần</w:t>
-      </w:r>
-      <w:r>
-        <w:t xml:space="preserve"> </w:t>
-      </w:r>
-      <w:r>
-        <w:rPr>
-          <w:bCs/>
-          <w:b/>
-        </w:rPr>
-        <w:t xml:space="preserve">minh họa</w:t>
-      </w:r>
-      <w:r>
-        <w:t xml:space="preserve"> </w:t>
-      </w:r>
-      <w:r>
-        <w:t xml:space="preserve">(tham số giả định: lớp gỉ, hố) – AI dựng hình nhanh,</w:t>
-      </w:r>
-      <w:r>
-        <w:t xml:space="preserve"> </w:t>
-      </w:r>
-      <w:r>
-        <w:rPr>
-          <w:bCs/>
-          <w:b/>
-        </w:rPr>
-        <w:t xml:space="preserve">chuyên gia ăn mòn hiệu chỉnh</w:t>
-      </w:r>
-      <w:r>
-        <w:t xml:space="preserve"> </w:t>
-      </w:r>
-      <w:r>
-        <w:t xml:space="preserve">bằng số đo thực tế</w:t>
+        <w:pStyle w:val="BodyText"/>
+      </w:pPr>
+      <w:r>
+        <w:t xml:space="preserve">⌨</w:t>
+      </w:r>
+      <w:r>
+        <w:t xml:space="preserve"> </w:t>
+      </w:r>
+      <w:r>
+        <w:rPr>
+          <w:bCs/>
+          <w:b/>
+        </w:rPr>
+        <w:t xml:space="preserve">Mẫu câu lệnh:</w:t>
+      </w:r>
+    </w:p>
+    <w:p>
+      <w:pPr>
+        <w:pStyle w:val="SourceCode"/>
+      </w:pPr>
+      <w:r>
+        <w:rPr>
+          <w:rStyle w:val="VerbatimChar"/>
+        </w:rPr>
+        <w:t xml:space="preserve">Tôi tải lên [tệp dữ liệu]. Làm lần lượt, dừng sau mỗi bước để tôi xác nhận:</w:t>
+      </w:r>
+      <w:r>
+        <w:br/>
+      </w:r>
+      <w:r>
+        <w:rPr>
+          <w:rStyle w:val="VerbatimChar"/>
+        </w:rPr>
+        <w:t xml:space="preserve">1. Mô tả cấu trúc dữ liệu (số dòng, cột, đơn vị); 2. Kiểm tra chất lượng – chỉ đánh dấu,</w:t>
+      </w:r>
+      <w:r>
+        <w:br/>
+      </w:r>
+      <w:r>
+        <w:rPr>
+          <w:rStyle w:val="VerbatimChar"/>
+        </w:rPr>
+        <w:t xml:space="preserve">không xóa; 3. Đề xuất phương pháp phân tích và giải thích vì sao; 4. Phân tích, kiểm định</w:t>
+      </w:r>
+      <w:r>
+        <w:br/>
+      </w:r>
+      <w:r>
+        <w:rPr>
+          <w:rStyle w:val="VerbatimChar"/>
+        </w:rPr>
+        <w:t xml:space="preserve">trên tập độc lập; 5. Lưu toàn bộ mã Python và nhật ký để chạy lại.</w:t>
       </w:r>
     </w:p>
     <w:p>
@@ -10588,16 +10005,49 @@
         <w:t xml:space="preserve"> </w:t>
       </w:r>
       <w:r>
+        <w:t xml:space="preserve">sơ đồ 5 bước, mỗi bước có điểm dừng</w:t>
+      </w:r>
+      <w:r>
+        <w:t xml:space="preserve"> </w:t>
+      </w:r>
+      <w:r>
+        <w:t xml:space="preserve">“</w:t>
+      </w:r>
+      <w:r>
+        <w:t xml:space="preserve">nhà khoa học xác nhận</w:t>
+      </w:r>
+      <w:r>
+        <w:t xml:space="preserve">”</w:t>
+      </w:r>
+      <w:r>
+        <w:t xml:space="preserve">.</w:t>
+      </w:r>
+    </w:p>
+    <w:p>
+      <w:pPr>
+        <w:pStyle w:val="BodyText"/>
+      </w:pPr>
+      <w:r>
+        <w:rPr>
+          <w:bCs/>
+          <w:b/>
+        </w:rPr>
+        <w:t xml:space="preserve">Không chiếu (tài liệu phát tay):</w:t>
+      </w:r>
+      <w:r>
+        <w:t xml:space="preserve"> </w:t>
+      </w:r>
+      <w:r>
         <w:rPr>
           <w:rStyle w:val="VerbatimChar"/>
         </w:rPr>
-        <w:t xml:space="preserve">du-an-nghien-cuu/05-ket-qua/mo-hinh-3d/3D_4_qua_trinh_an_mon.png</w:t>
-      </w:r>
-      <w:r>
-        <w:t xml:space="preserve"> </w:t>
-      </w:r>
-      <w:r>
-        <w:t xml:space="preserve">(4 thời điểm + mặt cắt); mở</w:t>
+        <w:t xml:space="preserve">TAI-LIEU-PHAT-TAY.md</w:t>
+      </w:r>
+      <w:r>
+        <w:t xml:space="preserve"> </w:t>
+      </w:r>
+      <w:r>
+        <w:t xml:space="preserve">mục 12; cấu trúc thư mục dữ liệu mẫu:</w:t>
       </w:r>
       <w:r>
         <w:t xml:space="preserve"> </w:t>
@@ -10606,110 +10056,10 @@
         <w:rPr>
           <w:rStyle w:val="VerbatimChar"/>
         </w:rPr>
-        <w:t xml:space="preserve">3D_4_qua_trinh_an_mon_dong.html</w:t>
-      </w:r>
-      <w:r>
-        <w:t xml:space="preserve">, bấm</w:t>
-      </w:r>
-      <w:r>
-        <w:t xml:space="preserve"> </w:t>
-      </w:r>
-      <w:r>
-        <w:rPr>
-          <w:bCs/>
-          <w:b/>
-        </w:rPr>
-        <w:t xml:space="preserve">▶ Chạy</w:t>
-      </w:r>
-      <w:r>
-        <w:t xml:space="preserve">;</w:t>
-      </w:r>
-      <w:r>
-        <w:t xml:space="preserve"> </w:t>
-      </w:r>
-      <w:r>
-        <w:rPr>
-          <w:rStyle w:val="VerbatimChar"/>
-        </w:rPr>
-        <w:t xml:space="preserve">3D_5_so_sanh_vat_lieu.html</w:t>
+        <w:t xml:space="preserve">du-an-nghien-cuu/03-du-lieu/README.md</w:t>
       </w:r>
       <w:r>
         <w:t xml:space="preserve">.</w:t>
-      </w:r>
-    </w:p>
-    <w:p>
-      <w:pPr>
-        <w:pStyle w:val="BodyText"/>
-      </w:pPr>
-      <w:r>
-        <w:rPr>
-          <w:bCs/>
-          <w:b/>
-        </w:rPr>
-        <w:t xml:space="preserve">🎬 Trình chiếu:</w:t>
-      </w:r>
-      <w:r>
-        <w:t xml:space="preserve"> </w:t>
-      </w:r>
-      <w:r>
-        <w:t xml:space="preserve">mở</w:t>
-      </w:r>
-      <w:r>
-        <w:t xml:space="preserve"> </w:t>
-      </w:r>
-      <w:r>
-        <w:rPr>
-          <w:rStyle w:val="VerbatimChar"/>
-        </w:rPr>
-        <w:t xml:space="preserve">3D_4_qua_trinh_an_mon_dong.html</w:t>
-      </w:r>
-      <w:r>
-        <w:t xml:space="preserve"> </w:t>
-      </w:r>
-      <w:r>
-        <w:t xml:space="preserve">(chạy được không cần Internet), bấm ▶ ~1 phút; dự phòng: video ghi màn hình hoặc ảnh PNG. Câu lệnh đã dùng:</w:t>
-      </w:r>
-      <w:r>
-        <w:t xml:space="preserve"> </w:t>
-      </w:r>
-      <w:r>
-        <w:rPr>
-          <w:rStyle w:val="VerbatimChar"/>
-        </w:rPr>
-        <w:t xml:space="preserve">cau-lenh-demo.md</w:t>
-      </w:r>
-      <w:r>
-        <w:t xml:space="preserve"> </w:t>
-      </w:r>
-      <w:r>
-        <w:t xml:space="preserve">mục 12.</w:t>
-      </w:r>
-    </w:p>
-    <w:p>
-      <w:pPr>
-        <w:pStyle w:val="BodyText"/>
-      </w:pPr>
-      <w:r>
-        <w:rPr>
-          <w:bCs/>
-          <w:b/>
-        </w:rPr>
-        <w:t xml:space="preserve">Nguồn:</w:t>
-      </w:r>
-      <w:r>
-        <w:t xml:space="preserve"> </w:t>
-      </w:r>
-      <w:r>
-        <w:t xml:space="preserve">N16 · ISO 9223:2012, ISO 9224:2012 (T10, T11) ·</w:t>
-      </w:r>
-      <w:r>
-        <w:t xml:space="preserve"> </w:t>
-      </w:r>
-      <w:r>
-        <w:rPr>
-          <w:rStyle w:val="VerbatimChar"/>
-        </w:rPr>
-        <w:t xml:space="preserve">du-an-nghien-cuu/04-ma-nguon/05_mo_hinh_3d_qua_trinh.py</w:t>
       </w:r>
     </w:p>
     <w:p>
@@ -10747,14 +10097,14 @@
         </w:pict>
       </w:r>
     </w:p>
-    <w:bookmarkEnd w:id="43"/>
-    <w:bookmarkStart w:id="44" w:name="X61752ef5806553cc1d9ee1f478b5f3fc10b911a"/>
+    <w:bookmarkEnd w:id="41"/>
+    <w:bookmarkStart w:id="42" w:name="X90f6e54b52672ddc5e9f4ed1cfae23f335d6c72"/>
     <w:p>
       <w:pPr>
         <w:pStyle w:val="Heading2"/>
       </w:pPr>
       <w:r>
-        <w:t xml:space="preserve">Slide 18 – Công bố kết quả: bài báo và báo cáo tổng hợp theo nhiều định dạng (4′)</w:t>
+        <w:t xml:space="preserve">Slide 16 – Xử lý dữ liệu: AI viết và chạy mã Python – DEMO 2 (5′)</w:t>
       </w:r>
     </w:p>
     <w:p>
@@ -10772,17 +10122,331 @@
         <w:t xml:space="preserve"> </w:t>
       </w:r>
       <w:r>
-        <w:t xml:space="preserve">- 🆕</w:t>
-      </w:r>
-      <w:r>
-        <w:t xml:space="preserve"> </w:t>
-      </w:r>
-      <w:r>
-        <w:rPr>
-          <w:bCs/>
-          <w:b/>
-        </w:rPr>
-        <w:t xml:space="preserve">Một kết quả – nhiều định dạng công bố:</w:t>
+        <w:t xml:space="preserve">- 🌍</w:t>
+      </w:r>
+      <w:r>
+        <w:t xml:space="preserve"> </w:t>
+      </w:r>
+      <w:r>
+        <w:rPr>
+          <w:bCs/>
+          <w:b/>
+        </w:rPr>
+        <w:t xml:space="preserve">Ví dụ thật:</w:t>
+      </w:r>
+      <w:r>
+        <w:t xml:space="preserve"> </w:t>
+      </w:r>
+      <w:r>
+        <w:t xml:space="preserve">ERA (Google,</w:t>
+      </w:r>
+      <w:r>
+        <w:t xml:space="preserve"> </w:t>
+      </w:r>
+      <w:r>
+        <w:rPr>
+          <w:iCs/>
+          <w:i/>
+        </w:rPr>
+        <w:t xml:space="preserve">Nature</w:t>
+      </w:r>
+      <w:r>
+        <w:t xml:space="preserve"> </w:t>
+      </w:r>
+      <w:r>
+        <w:t xml:space="preserve">2026) – AI tự viết, chạy, chấm điểm, cải tiến mã</w:t>
+      </w:r>
+      <w:r>
+        <w:t xml:space="preserve"> </w:t>
+      </w:r>
+      <w:r>
+        <w:t xml:space="preserve">-</w:t>
+      </w:r>
+      <w:r>
+        <w:t xml:space="preserve"> </w:t>
+      </w:r>
+      <w:r>
+        <w:rPr>
+          <w:bCs/>
+          <w:b/>
+        </w:rPr>
+        <w:t xml:space="preserve">Nhà khoa học không cần biết lập trình:</w:t>
+      </w:r>
+      <w:r>
+        <w:t xml:space="preserve"> </w:t>
+      </w:r>
+      <w:r>
+        <w:t xml:space="preserve">mô tả việc cần làm → AI viết mã Python → chạy → trả bảng, biểu đồ,</w:t>
+      </w:r>
+      <w:r>
+        <w:t xml:space="preserve"> </w:t>
+      </w:r>
+      <w:r>
+        <w:rPr>
+          <w:bCs/>
+          <w:b/>
+        </w:rPr>
+        <w:t xml:space="preserve">kèm mã để tái lập</w:t>
+      </w:r>
+      <w:r>
+        <w:t xml:space="preserve"> </w:t>
+      </w:r>
+      <w:r>
+        <w:t xml:space="preserve">- ⌨</w:t>
+      </w:r>
+      <w:r>
+        <w:t xml:space="preserve"> </w:t>
+      </w:r>
+      <w:r>
+        <w:rPr>
+          <w:bCs/>
+          <w:b/>
+        </w:rPr>
+        <w:t xml:space="preserve">Áp dụng quy trình 5 bước (Slide 15):</w:t>
+      </w:r>
+      <w:r>
+        <w:t xml:space="preserve"> </w:t>
+      </w:r>
+      <w:r>
+        <w:t xml:space="preserve">rà soát dữ liệu → tính toán và lập mô hình → kiểm định → vẽ biểu đồ, lưu mã</w:t>
+      </w:r>
+      <w:r>
+        <w:t xml:space="preserve"> </w:t>
+      </w:r>
+      <w:r>
+        <w:t xml:space="preserve">- 📊</w:t>
+      </w:r>
+      <w:r>
+        <w:t xml:space="preserve"> </w:t>
+      </w:r>
+      <w:r>
+        <w:rPr>
+          <w:bCs/>
+          <w:b/>
+        </w:rPr>
+        <w:t xml:space="preserve">Kết quả:</w:t>
+      </w:r>
+      <w:r>
+        <w:t xml:space="preserve"> </w:t>
+      </w:r>
+      <w:r>
+        <w:t xml:space="preserve">- Dữ liệu giả lập: phát hiện đủ</w:t>
+      </w:r>
+      <w:r>
+        <w:t xml:space="preserve"> </w:t>
+      </w:r>
+      <w:r>
+        <w:rPr>
+          <w:bCs/>
+          <w:b/>
+        </w:rPr>
+        <w:t xml:space="preserve">14/14 lỗi</w:t>
+      </w:r>
+      <w:r>
+        <w:t xml:space="preserve"> </w:t>
+      </w:r>
+      <w:r>
+        <w:t xml:space="preserve">cài sẵn; thép CT3 ven biển C4 · đô thị C3 · nội địa C2</w:t>
+      </w:r>
+      <w:r>
+        <w:t xml:space="preserve"> </w:t>
+      </w:r>
+      <w:r>
+        <w:t xml:space="preserve">- Dữ liệu thật (387 số đo): kết quả chính đã nêu ở Slide 9; mô hình 3D ở Slide 17</w:t>
+      </w:r>
+      <w:r>
+        <w:t xml:space="preserve"> </w:t>
+      </w:r>
+      <w:r>
+        <w:t xml:space="preserve">- 💡</w:t>
+      </w:r>
+      <w:r>
+        <w:t xml:space="preserve"> </w:t>
+      </w:r>
+      <w:r>
+        <w:rPr>
+          <w:bCs/>
+          <w:b/>
+        </w:rPr>
+        <w:t xml:space="preserve">Bài học:</w:t>
+      </w:r>
+      <w:r>
+        <w:t xml:space="preserve"> </w:t>
+      </w:r>
+      <w:r>
+        <w:t xml:space="preserve">AI viết mã rất nhanh – nhưng cách tìm số đo bất thường AI chọn lần đầu đánh dấu nhầm 20 giá trị bình thường và bỏ sót lỗi gõ nhầm; chọn phương pháp phù hợp với thiết kế thí nghiệm (3 mẫu lặp) là việc của người làm chuyên môn</w:t>
+      </w:r>
+    </w:p>
+    <w:p>
+      <w:pPr>
+        <w:pStyle w:val="BodyText"/>
+      </w:pPr>
+      <w:r>
+        <w:rPr>
+          <w:bCs/>
+          <w:b/>
+        </w:rPr>
+        <w:t xml:space="preserve">Hình ảnh:</w:t>
+      </w:r>
+      <w:r>
+        <w:t xml:space="preserve"> </w:t>
+      </w:r>
+      <w:r>
+        <w:rPr>
+          <w:rStyle w:val="VerbatimChar"/>
+        </w:rPr>
+        <w:t xml:space="preserve">thuyet-trinh/ket-qua-demo/gia-lap/bieu_do_dong_hoc_an_mon.png</w:t>
+      </w:r>
+      <w:r>
+        <w:t xml:space="preserve">;</w:t>
+      </w:r>
+      <w:r>
+        <w:t xml:space="preserve"> </w:t>
+      </w:r>
+      <w:r>
+        <w:rPr>
+          <w:rStyle w:val="VerbatimChar"/>
+        </w:rPr>
+        <w:t xml:space="preserve">du-an-nghien-cuu/05-ket-qua/hinh/do_vs_du_doan.png</w:t>
+      </w:r>
+      <w:r>
+        <w:t xml:space="preserve">;</w:t>
+      </w:r>
+      <w:r>
+        <w:t xml:space="preserve"> </w:t>
+      </w:r>
+      <w:r>
+        <w:rPr>
+          <w:rStyle w:val="VerbatimChar"/>
+        </w:rPr>
+        <w:t xml:space="preserve">du-an-nghien-cuu/05-ket-qua/mo-hinh-3d/3D_3_be_mat_tam_thep.png</w:t>
+      </w:r>
+      <w:r>
+        <w:t xml:space="preserve">.</w:t>
+      </w:r>
+    </w:p>
+    <w:p>
+      <w:pPr>
+        <w:pStyle w:val="BodyText"/>
+      </w:pPr>
+      <w:r>
+        <w:rPr>
+          <w:bCs/>
+          <w:b/>
+        </w:rPr>
+        <w:t xml:space="preserve">🎬 Trình chiếu:</w:t>
+      </w:r>
+      <w:r>
+        <w:t xml:space="preserve"> </w:t>
+      </w:r>
+      <w:r>
+        <w:t xml:space="preserve">video ghi sẵn ~2 phút (câu lệnh 4.2 → 4.3 → 4.4 tua nhanh) + ảnh báo cáo chất lượng dữ liệu.</w:t>
+      </w:r>
+    </w:p>
+    <w:p>
+      <w:pPr>
+        <w:pStyle w:val="BodyText"/>
+      </w:pPr>
+      <w:r>
+        <w:rPr>
+          <w:bCs/>
+          <w:b/>
+        </w:rPr>
+        <w:t xml:space="preserve">Nguồn:</w:t>
+      </w:r>
+      <w:r>
+        <w:t xml:space="preserve"> </w:t>
+      </w:r>
+      <w:r>
+        <w:t xml:space="preserve">G5 ·</w:t>
+      </w:r>
+      <w:r>
+        <w:t xml:space="preserve"> </w:t>
+      </w:r>
+      <w:r>
+        <w:rPr>
+          <w:rStyle w:val="VerbatimChar"/>
+        </w:rPr>
+        <w:t xml:space="preserve">du-an-nghien-cuu/07-bao-cao/BAO-CAO-TONG-HOP.md</w:t>
+      </w:r>
+    </w:p>
+    <w:p>
+      <w:pPr>
+        <w:pStyle w:val="BodyText"/>
+      </w:pPr>
+      <w:r>
+        <w:rPr>
+          <w:bCs/>
+          <w:b/>
+        </w:rPr>
+        <w:t xml:space="preserve">Duyệt:</w:t>
+      </w:r>
+      <w:r>
+        <w:t xml:space="preserve"> </w:t>
+      </w:r>
+      <w:r>
+        <w:t xml:space="preserve">[ ] Duyệt · [ ] Sửa · [ ] Bỏ</w:t>
+      </w:r>
+      <w:r>
+        <w:t xml:space="preserve"> </w:t>
+      </w:r>
+      <w:r>
+        <w:rPr>
+          <w:bCs/>
+          <w:b/>
+        </w:rPr>
+        <w:t xml:space="preserve">Ghi chú:</w:t>
+      </w:r>
+    </w:p>
+    <w:p>
+      <w:r>
+        <w:pict>
+          <v:rect style="width:0;height:1.5pt" o:hralign="center" o:hrstd="t" o:hr="t"/>
+        </w:pict>
+      </w:r>
+    </w:p>
+    <w:bookmarkEnd w:id="42"/>
+    <w:bookmarkStart w:id="43" w:name="X834e235100fb9429d0e71671f229adf457c23df"/>
+    <w:p>
+      <w:pPr>
+        <w:pStyle w:val="Heading2"/>
+      </w:pPr>
+      <w:r>
+        <w:t xml:space="preserve">Slide 17 – Mô hình 3D: mô phỏng quá trình ăn mòn vật liệu theo thời gian (3′)</w:t>
+      </w:r>
+    </w:p>
+    <w:p>
+      <w:pPr>
+        <w:pStyle w:val="FirstParagraph"/>
+      </w:pPr>
+      <w:r>
+        <w:rPr>
+          <w:bCs/>
+          <w:b/>
+        </w:rPr>
+        <w:t xml:space="preserve">Chữ trên slide:</w:t>
+      </w:r>
+      <w:r>
+        <w:t xml:space="preserve"> </w:t>
+      </w:r>
+      <w:r>
+        <w:t xml:space="preserve">-</w:t>
+      </w:r>
+      <w:r>
+        <w:t xml:space="preserve"> </w:t>
+      </w:r>
+      <w:r>
+        <w:rPr>
+          <w:bCs/>
+          <w:b/>
+        </w:rPr>
+        <w:t xml:space="preserve">Từ con số đến hình ảnh:</w:t>
+      </w:r>
+      <w:r>
+        <w:t xml:space="preserve"> </w:t>
+      </w:r>
+      <w:r>
+        <w:t xml:space="preserve">AI viết mã dựng mô hình 3D tương tác – mở bằng trình duyệt, xoay, phóng to, bấm ▶ để xem ăn mòn diễn ra theo từng năm</w:t>
       </w:r>
     </w:p>
     <w:tbl>
@@ -10809,6 +10473,614 @@
               <w:jc w:val="left"/>
             </w:pPr>
             <w:r>
+              <w:t xml:space="preserve">Mô hình</w:t>
+            </w:r>
+          </w:p>
+        </w:tc>
+        <w:tc>
+          <w:tcPr/>
+          <w:p>
+            <w:pPr>
+              <w:pStyle w:val="Compact"/>
+              <w:jc w:val="left"/>
+            </w:pPr>
+            <w:r>
+              <w:t xml:space="preserve">Mô tả</w:t>
+            </w:r>
+          </w:p>
+        </w:tc>
+        <w:tc>
+          <w:tcPr/>
+          <w:p>
+            <w:pPr>
+              <w:pStyle w:val="Compact"/>
+              <w:jc w:val="left"/>
+            </w:pPr>
+            <w:r>
+              <w:t xml:space="preserve">Căn cứ</w:t>
+            </w:r>
+          </w:p>
+        </w:tc>
+      </w:tr>
+      <w:tr>
+        <w:tc>
+          <w:tcPr/>
+          <w:p>
+            <w:pPr>
+              <w:pStyle w:val="Compact"/>
+              <w:jc w:val="left"/>
+            </w:pPr>
+            <w:r>
+              <w:t xml:space="preserve">Mặt đáp ứng</w:t>
+            </w:r>
+          </w:p>
+        </w:tc>
+        <w:tc>
+          <w:tcPr/>
+          <w:p>
+            <w:pPr>
+              <w:pStyle w:val="Compact"/>
+              <w:jc w:val="left"/>
+            </w:pPr>
+            <w:r>
+              <w:t xml:space="preserve">Tốc độ ăn mòn năm đầu theo clorua và thời gian ẩm ướt – Việt Nam, Nga; điểm = số đo thật</w:t>
+            </w:r>
+          </w:p>
+        </w:tc>
+        <w:tc>
+          <w:tcPr/>
+          <w:p>
+            <w:pPr>
+              <w:pStyle w:val="Compact"/>
+              <w:jc w:val="left"/>
+            </w:pPr>
+            <w:r>
+              <w:t xml:space="preserve">Hàm liều – đáp ứng hiệu chỉnh vùng, 387 số đo</w:t>
+            </w:r>
+          </w:p>
+        </w:tc>
+      </w:tr>
+      <w:tr>
+        <w:tc>
+          <w:tcPr/>
+          <w:p>
+            <w:pPr>
+              <w:pStyle w:val="Compact"/>
+              <w:jc w:val="left"/>
+            </w:pPr>
+            <w:r>
+              <w:t xml:space="preserve">Diễn tiến theo thời gian</w:t>
+            </w:r>
+          </w:p>
+        </w:tc>
+        <w:tc>
+          <w:tcPr/>
+          <w:p>
+            <w:pPr>
+              <w:pStyle w:val="Compact"/>
+              <w:jc w:val="left"/>
+            </w:pPr>
+            <w:r>
+              <w:t xml:space="preserve">Chiều dày thép mất theo năm và mức clorua</w:t>
+            </w:r>
+          </w:p>
+        </w:tc>
+        <w:tc>
+          <w:tcPr/>
+          <w:p>
+            <w:pPr>
+              <w:pStyle w:val="Compact"/>
+              <w:jc w:val="left"/>
+            </w:pPr>
+            <w:r>
+              <w:t xml:space="preserve">ISO 9224: D = r·t^b, b = 0,523</w:t>
+            </w:r>
+          </w:p>
+        </w:tc>
+      </w:tr>
+      <w:tr>
+        <w:tc>
+          <w:tcPr/>
+          <w:p>
+            <w:pPr>
+              <w:pStyle w:val="Compact"/>
+              <w:jc w:val="left"/>
+            </w:pPr>
+            <w:r>
+              <w:t xml:space="preserve">🆕</w:t>
+            </w:r>
+            <w:r>
+              <w:t xml:space="preserve"> </w:t>
+            </w:r>
+            <w:r>
+              <w:rPr>
+                <w:bCs/>
+                <w:b/>
+              </w:rPr>
+              <w:t xml:space="preserve">Quá trình ăn mòn (hoạt hình)</w:t>
+            </w:r>
+          </w:p>
+        </w:tc>
+        <w:tc>
+          <w:tcPr/>
+          <w:p>
+            <w:pPr>
+              <w:pStyle w:val="Compact"/>
+              <w:jc w:val="left"/>
+            </w:pPr>
+            <w:r>
+              <w:t xml:space="preserve">Khối mẫu thép tại Nha Trang, 0 → 30 năm: bề mặt kim loại hạ dần, lớp gỉ dày lên, hố ăn mòn sâu dần; kèm mặt cắt</w:t>
+            </w:r>
+          </w:p>
+        </w:tc>
+        <w:tc>
+          <w:tcPr/>
+          <w:p>
+            <w:pPr>
+              <w:pStyle w:val="Compact"/>
+              <w:jc w:val="left"/>
+            </w:pPr>
+            <w:r>
+              <w:t xml:space="preserve">D(t) từ số đo r = 40,6 µm/năm; hình dạng gỉ, hố: minh họa</w:t>
+            </w:r>
+          </w:p>
+        </w:tc>
+      </w:tr>
+      <w:tr>
+        <w:tc>
+          <w:tcPr/>
+          <w:p>
+            <w:pPr>
+              <w:pStyle w:val="Compact"/>
+              <w:jc w:val="left"/>
+            </w:pPr>
+            <w:r>
+              <w:t xml:space="preserve">🆕</w:t>
+            </w:r>
+            <w:r>
+              <w:t xml:space="preserve"> </w:t>
+            </w:r>
+            <w:r>
+              <w:rPr>
+                <w:bCs/>
+                <w:b/>
+              </w:rPr>
+              <w:t xml:space="preserve">So sánh vật liệu</w:t>
+            </w:r>
+          </w:p>
+        </w:tc>
+        <w:tc>
+          <w:tcPr/>
+          <w:p>
+            <w:pPr>
+              <w:pStyle w:val="Compact"/>
+              <w:jc w:val="left"/>
+            </w:pPr>
+            <w:r>
+              <w:t xml:space="preserve">Thép – kẽm – đồng – nhôm trong cùng cấp ăn mòn C3</w:t>
+            </w:r>
+          </w:p>
+        </w:tc>
+        <w:tc>
+          <w:tcPr/>
+          <w:p>
+            <w:pPr>
+              <w:pStyle w:val="Compact"/>
+              <w:jc w:val="left"/>
+            </w:pPr>
+            <w:r>
+              <w:t xml:space="preserve">ISO 9223 Bảng 2; ISO 9224</w:t>
+            </w:r>
+          </w:p>
+        </w:tc>
+      </w:tr>
+    </w:tbl>
+    <w:p>
+      <w:pPr>
+        <w:numPr>
+          <w:ilvl w:val="0"/>
+          <w:numId w:val="1004"/>
+        </w:numPr>
+        <w:pStyle w:val="Compact"/>
+      </w:pPr>
+      <w:r>
+        <w:t xml:space="preserve">📊</w:t>
+      </w:r>
+      <w:r>
+        <w:t xml:space="preserve"> </w:t>
+      </w:r>
+      <w:r>
+        <w:rPr>
+          <w:bCs/>
+          <w:b/>
+        </w:rPr>
+        <w:t xml:space="preserve">Kết quả:</w:t>
+      </w:r>
+    </w:p>
+    <w:p>
+      <w:pPr>
+        <w:numPr>
+          <w:ilvl w:val="1"/>
+          <w:numId w:val="1005"/>
+        </w:numPr>
+        <w:pStyle w:val="Compact"/>
+      </w:pPr>
+      <w:r>
+        <w:t xml:space="preserve">Nha Trang: thép mất trung bình</w:t>
+      </w:r>
+      <w:r>
+        <w:t xml:space="preserve"> </w:t>
+      </w:r>
+      <w:r>
+        <w:rPr>
+          <w:bCs/>
+          <w:b/>
+        </w:rPr>
+        <w:t xml:space="preserve">41 µm</w:t>
+      </w:r>
+      <w:r>
+        <w:t xml:space="preserve"> </w:t>
+      </w:r>
+      <w:r>
+        <w:t xml:space="preserve">sau 1 năm →</w:t>
+      </w:r>
+      <w:r>
+        <w:t xml:space="preserve"> </w:t>
+      </w:r>
+      <w:r>
+        <w:rPr>
+          <w:bCs/>
+          <w:b/>
+        </w:rPr>
+        <w:t xml:space="preserve">135 µm</w:t>
+      </w:r>
+      <w:r>
+        <w:t xml:space="preserve"> </w:t>
+      </w:r>
+      <w:r>
+        <w:t xml:space="preserve">sau 10 năm →</w:t>
+      </w:r>
+      <w:r>
+        <w:t xml:space="preserve"> </w:t>
+      </w:r>
+      <w:r>
+        <w:rPr>
+          <w:bCs/>
+          <w:b/>
+        </w:rPr>
+        <w:t xml:space="preserve">245 µm</w:t>
+      </w:r>
+      <w:r>
+        <w:t xml:space="preserve"> </w:t>
+      </w:r>
+      <w:r>
+        <w:t xml:space="preserve">sau 30 năm (≈ 1.926 g/m²)</w:t>
+      </w:r>
+    </w:p>
+    <w:p>
+      <w:pPr>
+        <w:numPr>
+          <w:ilvl w:val="1"/>
+          <w:numId w:val="1005"/>
+        </w:numPr>
+        <w:pStyle w:val="Compact"/>
+      </w:pPr>
+      <w:r>
+        <w:t xml:space="preserve">Cấp C3, sau 30 năm: thép ≈ 218 µm · kẽm ≈ 20 µm · đồng ≈ 9 µm · nhôm ≈ 5 µm</w:t>
+      </w:r>
+    </w:p>
+    <w:p>
+      <w:pPr>
+        <w:numPr>
+          <w:ilvl w:val="0"/>
+          <w:numId w:val="1004"/>
+        </w:numPr>
+        <w:pStyle w:val="Compact"/>
+      </w:pPr>
+      <w:r>
+        <w:t xml:space="preserve">⚠</w:t>
+      </w:r>
+      <w:r>
+        <w:t xml:space="preserve"> </w:t>
+      </w:r>
+      <w:r>
+        <w:rPr>
+          <w:bCs/>
+          <w:b/>
+        </w:rPr>
+        <w:t xml:space="preserve">Ghi rõ trên hình:</w:t>
+      </w:r>
+      <w:r>
+        <w:t xml:space="preserve"> </w:t>
+      </w:r>
+      <w:r>
+        <w:t xml:space="preserve">phần</w:t>
+      </w:r>
+      <w:r>
+        <w:t xml:space="preserve"> </w:t>
+      </w:r>
+      <w:r>
+        <w:rPr>
+          <w:bCs/>
+          <w:b/>
+        </w:rPr>
+        <w:t xml:space="preserve">định lượng</w:t>
+      </w:r>
+      <w:r>
+        <w:t xml:space="preserve"> </w:t>
+      </w:r>
+      <w:r>
+        <w:t xml:space="preserve">(số đo, tiêu chuẩn) và phần</w:t>
+      </w:r>
+      <w:r>
+        <w:t xml:space="preserve"> </w:t>
+      </w:r>
+      <w:r>
+        <w:rPr>
+          <w:bCs/>
+          <w:b/>
+        </w:rPr>
+        <w:t xml:space="preserve">minh họa</w:t>
+      </w:r>
+      <w:r>
+        <w:t xml:space="preserve"> </w:t>
+      </w:r>
+      <w:r>
+        <w:t xml:space="preserve">(tham số giả định: lớp gỉ, hố) – AI dựng hình nhanh,</w:t>
+      </w:r>
+      <w:r>
+        <w:t xml:space="preserve"> </w:t>
+      </w:r>
+      <w:r>
+        <w:rPr>
+          <w:bCs/>
+          <w:b/>
+        </w:rPr>
+        <w:t xml:space="preserve">chuyên gia ăn mòn hiệu chỉnh</w:t>
+      </w:r>
+      <w:r>
+        <w:t xml:space="preserve"> </w:t>
+      </w:r>
+      <w:r>
+        <w:t xml:space="preserve">bằng số đo thực tế</w:t>
+      </w:r>
+    </w:p>
+    <w:p>
+      <w:pPr>
+        <w:pStyle w:val="FirstParagraph"/>
+      </w:pPr>
+      <w:r>
+        <w:rPr>
+          <w:bCs/>
+          <w:b/>
+        </w:rPr>
+        <w:t xml:space="preserve">Hình ảnh:</w:t>
+      </w:r>
+      <w:r>
+        <w:t xml:space="preserve"> </w:t>
+      </w:r>
+      <w:r>
+        <w:rPr>
+          <w:rStyle w:val="VerbatimChar"/>
+        </w:rPr>
+        <w:t xml:space="preserve">du-an-nghien-cuu/05-ket-qua/mo-hinh-3d/3D_4_qua_trinh_an_mon.png</w:t>
+      </w:r>
+      <w:r>
+        <w:t xml:space="preserve"> </w:t>
+      </w:r>
+      <w:r>
+        <w:t xml:space="preserve">(4 thời điểm + mặt cắt); mở</w:t>
+      </w:r>
+      <w:r>
+        <w:t xml:space="preserve"> </w:t>
+      </w:r>
+      <w:r>
+        <w:rPr>
+          <w:rStyle w:val="VerbatimChar"/>
+        </w:rPr>
+        <w:t xml:space="preserve">3D_4_qua_trinh_an_mon_dong.html</w:t>
+      </w:r>
+      <w:r>
+        <w:t xml:space="preserve">, bấm</w:t>
+      </w:r>
+      <w:r>
+        <w:t xml:space="preserve"> </w:t>
+      </w:r>
+      <w:r>
+        <w:rPr>
+          <w:bCs/>
+          <w:b/>
+        </w:rPr>
+        <w:t xml:space="preserve">▶ Chạy</w:t>
+      </w:r>
+      <w:r>
+        <w:t xml:space="preserve">;</w:t>
+      </w:r>
+      <w:r>
+        <w:t xml:space="preserve"> </w:t>
+      </w:r>
+      <w:r>
+        <w:rPr>
+          <w:rStyle w:val="VerbatimChar"/>
+        </w:rPr>
+        <w:t xml:space="preserve">3D_5_so_sanh_vat_lieu.html</w:t>
+      </w:r>
+      <w:r>
+        <w:t xml:space="preserve">.</w:t>
+      </w:r>
+    </w:p>
+    <w:p>
+      <w:pPr>
+        <w:pStyle w:val="BodyText"/>
+      </w:pPr>
+      <w:r>
+        <w:rPr>
+          <w:bCs/>
+          <w:b/>
+        </w:rPr>
+        <w:t xml:space="preserve">🎬 Trình chiếu:</w:t>
+      </w:r>
+      <w:r>
+        <w:t xml:space="preserve"> </w:t>
+      </w:r>
+      <w:r>
+        <w:t xml:space="preserve">mở</w:t>
+      </w:r>
+      <w:r>
+        <w:t xml:space="preserve"> </w:t>
+      </w:r>
+      <w:r>
+        <w:rPr>
+          <w:rStyle w:val="VerbatimChar"/>
+        </w:rPr>
+        <w:t xml:space="preserve">3D_4_qua_trinh_an_mon_dong.html</w:t>
+      </w:r>
+      <w:r>
+        <w:t xml:space="preserve"> </w:t>
+      </w:r>
+      <w:r>
+        <w:t xml:space="preserve">(chạy được không cần Internet), bấm ▶ ~1 phút; dự phòng: video ghi màn hình hoặc ảnh PNG. Câu lệnh đã dùng:</w:t>
+      </w:r>
+      <w:r>
+        <w:t xml:space="preserve"> </w:t>
+      </w:r>
+      <w:r>
+        <w:rPr>
+          <w:rStyle w:val="VerbatimChar"/>
+        </w:rPr>
+        <w:t xml:space="preserve">cau-lenh-demo.md</w:t>
+      </w:r>
+      <w:r>
+        <w:t xml:space="preserve"> </w:t>
+      </w:r>
+      <w:r>
+        <w:t xml:space="preserve">mục 12.</w:t>
+      </w:r>
+    </w:p>
+    <w:p>
+      <w:pPr>
+        <w:pStyle w:val="BodyText"/>
+      </w:pPr>
+      <w:r>
+        <w:rPr>
+          <w:bCs/>
+          <w:b/>
+        </w:rPr>
+        <w:t xml:space="preserve">Nguồn:</w:t>
+      </w:r>
+      <w:r>
+        <w:t xml:space="preserve"> </w:t>
+      </w:r>
+      <w:r>
+        <w:t xml:space="preserve">N16 · ISO 9223:2012, ISO 9224:2012 (T10, T11) ·</w:t>
+      </w:r>
+      <w:r>
+        <w:t xml:space="preserve"> </w:t>
+      </w:r>
+      <w:r>
+        <w:rPr>
+          <w:rStyle w:val="VerbatimChar"/>
+        </w:rPr>
+        <w:t xml:space="preserve">du-an-nghien-cuu/04-ma-nguon/05_mo_hinh_3d_qua_trinh.py</w:t>
+      </w:r>
+    </w:p>
+    <w:p>
+      <w:pPr>
+        <w:pStyle w:val="BodyText"/>
+      </w:pPr>
+      <w:r>
+        <w:rPr>
+          <w:bCs/>
+          <w:b/>
+        </w:rPr>
+        <w:t xml:space="preserve">Duyệt:</w:t>
+      </w:r>
+      <w:r>
+        <w:t xml:space="preserve"> </w:t>
+      </w:r>
+      <w:r>
+        <w:t xml:space="preserve">[ ] Duyệt · [ ] Sửa · [ ] Bỏ</w:t>
+      </w:r>
+      <w:r>
+        <w:t xml:space="preserve"> </w:t>
+      </w:r>
+      <w:r>
+        <w:rPr>
+          <w:bCs/>
+          <w:b/>
+        </w:rPr>
+        <w:t xml:space="preserve">Ghi chú:</w:t>
+      </w:r>
+    </w:p>
+    <w:p>
+      <w:r>
+        <w:pict>
+          <v:rect style="width:0;height:1.5pt" o:hralign="center" o:hrstd="t" o:hr="t"/>
+        </w:pict>
+      </w:r>
+    </w:p>
+    <w:bookmarkEnd w:id="43"/>
+    <w:bookmarkStart w:id="44" w:name="X2957c6f8b504356acd6d5ff9b1719bef093e161"/>
+    <w:p>
+      <w:pPr>
+        <w:pStyle w:val="Heading2"/>
+      </w:pPr>
+      <w:r>
+        <w:t xml:space="preserve">Slide 18 – Công bố kết quả: bài báo và báo cáo tổng hợp theo nhiều định dạng (3′)</w:t>
+      </w:r>
+    </w:p>
+    <w:p>
+      <w:pPr>
+        <w:pStyle w:val="FirstParagraph"/>
+      </w:pPr>
+      <w:r>
+        <w:rPr>
+          <w:bCs/>
+          <w:b/>
+        </w:rPr>
+        <w:t xml:space="preserve">Chữ trên slide:</w:t>
+      </w:r>
+      <w:r>
+        <w:t xml:space="preserve"> </w:t>
+      </w:r>
+      <w:r>
+        <w:t xml:space="preserve">- 🆕</w:t>
+      </w:r>
+      <w:r>
+        <w:t xml:space="preserve"> </w:t>
+      </w:r>
+      <w:r>
+        <w:rPr>
+          <w:bCs/>
+          <w:b/>
+        </w:rPr>
+        <w:t xml:space="preserve">Một kết quả – nhiều định dạng công bố:</w:t>
+      </w:r>
+    </w:p>
+    <w:tbl>
+      <w:tblPr>
+        <w:tblStyle w:val="Table"/>
+        <w:tblW w:type="pct" w:w="5000"/>
+        <w:tblLook w:firstRow="1" w:lastRow="0" w:firstColumn="0" w:lastColumn="0" w:noHBand="0" w:noVBand="0" w:val="0020"/>
+        <w:jc w:val="start"/>
+      </w:tblPr>
+      <w:tblGrid>
+        <w:gridCol w:w="2640"/>
+        <w:gridCol w:w="2640"/>
+        <w:gridCol w:w="2640"/>
+      </w:tblGrid>
+      <w:tr>
+        <w:trPr>
+          <w:tblHeader w:val="true"/>
+        </w:trPr>
+        <w:tc>
+          <w:tcPr/>
+          <w:p>
+            <w:pPr>
+              <w:pStyle w:val="Compact"/>
+              <w:jc w:val="left"/>
+            </w:pPr>
+            <w:r>
               <w:t xml:space="preserve">Đích công bố</w:t>
             </w:r>
           </w:p>
@@ -11077,7 +11349,7 @@
       <w:pPr>
         <w:numPr>
           <w:ilvl w:val="0"/>
-          <w:numId w:val="1004"/>
+          <w:numId w:val="1006"/>
         </w:numPr>
       </w:pPr>
       <w:r>
@@ -11254,7 +11526,7 @@
         <w:t xml:space="preserve"> </w:t>
       </w:r>
       <w:r>
-        <w:t xml:space="preserve">sơ đồ vòng đời: Tài liệu → Khoảng trống (S13) → Phiếu đề xuất, thuyết minh (S14) → Tiến độ – kinh phí (S15) → Dữ liệu – kết quả, mô hình 3D (S16–S17) → Bài báo – báo cáo (S18); mỗi bước có dấu ✅</w:t>
+        <w:t xml:space="preserve">sơ đồ vòng đời: Tài liệu → Khoảng trống (S12) → Phiếu đề xuất, thuyết minh (S13) → Tiến độ – kinh phí (S14) → Xử lý dữ liệu theo 5 bước, mô hình 3D (S15–S17) → Bài báo – báo cáo (S18); mỗi bước có dấu ✅</w:t>
       </w:r>
       <w:r>
         <w:t xml:space="preserve"> </w:t>
@@ -12151,7 +12423,7 @@
       <w:pPr>
         <w:numPr>
           <w:ilvl w:val="0"/>
-          <w:numId w:val="1005"/>
+          <w:numId w:val="1007"/>
         </w:numPr>
         <w:pStyle w:val="Compact"/>
       </w:pPr>
@@ -15956,7 +16228,7 @@
       <w:pPr>
         <w:numPr>
           <w:ilvl w:val="0"/>
-          <w:numId w:val="1006"/>
+          <w:numId w:val="1008"/>
         </w:numPr>
         <w:pStyle w:val="Compact"/>
       </w:pPr>
@@ -15968,7 +16240,7 @@
       <w:pPr>
         <w:numPr>
           <w:ilvl w:val="0"/>
-          <w:numId w:val="1006"/>
+          <w:numId w:val="1008"/>
         </w:numPr>
         <w:pStyle w:val="Compact"/>
       </w:pPr>
@@ -15980,7 +16252,7 @@
       <w:pPr>
         <w:numPr>
           <w:ilvl w:val="0"/>
-          <w:numId w:val="1006"/>
+          <w:numId w:val="1008"/>
         </w:numPr>
         <w:pStyle w:val="Compact"/>
       </w:pPr>
@@ -15992,7 +16264,7 @@
       <w:pPr>
         <w:numPr>
           <w:ilvl w:val="0"/>
-          <w:numId w:val="1006"/>
+          <w:numId w:val="1008"/>
         </w:numPr>
         <w:pStyle w:val="Compact"/>
       </w:pPr>
@@ -16306,7 +16578,34 @@
     <w:abstractNumId w:val="991"/>
   </w:num>
   <w:num w:numId="1003">
-    <w:abstractNumId w:val="991"/>
+    <w:abstractNumId w:val="99411"/>
+    <w:lvlOverride w:ilvl="0">
+      <w:startOverride w:val="1"/>
+    </w:lvlOverride>
+    <w:lvlOverride w:ilvl="1">
+      <w:startOverride w:val="1"/>
+    </w:lvlOverride>
+    <w:lvlOverride w:ilvl="2">
+      <w:startOverride w:val="1"/>
+    </w:lvlOverride>
+    <w:lvlOverride w:ilvl="3">
+      <w:startOverride w:val="1"/>
+    </w:lvlOverride>
+    <w:lvlOverride w:ilvl="4">
+      <w:startOverride w:val="1"/>
+    </w:lvlOverride>
+    <w:lvlOverride w:ilvl="5">
+      <w:startOverride w:val="1"/>
+    </w:lvlOverride>
+    <w:lvlOverride w:ilvl="6">
+      <w:startOverride w:val="1"/>
+    </w:lvlOverride>
+    <w:lvlOverride w:ilvl="7">
+      <w:startOverride w:val="1"/>
+    </w:lvlOverride>
+    <w:lvlOverride w:ilvl="8">
+      <w:startOverride w:val="1"/>
+    </w:lvlOverride>
   </w:num>
   <w:num w:numId="1004">
     <w:abstractNumId w:val="991"/>
@@ -16315,6 +16614,12 @@
     <w:abstractNumId w:val="991"/>
   </w:num>
   <w:num w:numId="1006">
+    <w:abstractNumId w:val="991"/>
+  </w:num>
+  <w:num w:numId="1007">
+    <w:abstractNumId w:val="991"/>
+  </w:num>
+  <w:num w:numId="1008">
     <w:abstractNumId w:val="991"/>
   </w:num>
 </w:numbering>

</xml_diff>

<commit_message>
Phần III theo mạch tài liệu → tổng quan → thuyết minh → xử lý dữ liệu (#13)
- Gộp tìm – lọc tài liệu (Sci-Bot, Sci-Hub) với tổng quan thành Slide 12
- Slide 13, 14: xây dựng, hoàn thiện thuyết minh đề tài
- Thêm Slide 15: hướng dẫn xử lý dữ liệu với AI theo 5 bước, trước demo xử lý dữ liệu (Slide 16)
- Cập nhật phụ lục định hướng, tài liệu phát tay (mục 12), tham chiếu số slide


Claude-Session: https://claude.ai/code/session_01JoSsghLRHTtvcNzYXbKpzE

Co-authored-by: Claude <noreply@anthropic.com>
</commit_message>
<xml_diff>
--- a/thuyet-trinh/DANH-SACH-SLIDE-v2.5.docx
+++ b/thuyet-trinh/DANH-SACH-SLIDE-v2.5.docx
@@ -534,7 +534,7 @@
               <w:jc w:val="left"/>
             </w:pPr>
             <w:r>
-              <w:t xml:space="preserve">8, 14, 15, 16, 17, 22</w:t>
+              <w:t xml:space="preserve">8, 13, 14, 16, 17, 22</w:t>
             </w:r>
           </w:p>
         </w:tc>
@@ -656,7 +656,7 @@
               <w:jc w:val="left"/>
             </w:pPr>
             <w:r>
-              <w:t xml:space="preserve">14, 15</w:t>
+              <w:t xml:space="preserve">13, 14</w:t>
             </w:r>
           </w:p>
         </w:tc>
@@ -1918,7 +1918,7 @@
               <w:jc w:val="left"/>
             </w:pPr>
             <w:r>
-              <w:t xml:space="preserve">Tìm và lọc tài liệu bước đầu: Sci-Hub, Sci-Bot và các công cụ hỗ trợ</w:t>
+              <w:t xml:space="preserve">Nghiên cứu tài liệu và tổng quan: từ tìm, lọc tài liệu đến khoảng trống nghiên cứu</w:t>
             </w:r>
           </w:p>
         </w:tc>
@@ -1942,6 +1942,130 @@
               <w:jc w:val="left"/>
             </w:pPr>
             <w:r>
+              <w:t xml:space="preserve">8′</w:t>
+            </w:r>
+          </w:p>
+        </w:tc>
+        <w:tc>
+          <w:tcPr/>
+          <w:p>
+            <w:pPr>
+              <w:pStyle w:val="Compact"/>
+              <w:jc w:val="left"/>
+            </w:pPr>
+            <w:r>
+              <w:t xml:space="preserve">[ ]</w:t>
+            </w:r>
+          </w:p>
+        </w:tc>
+      </w:tr>
+      <w:tr>
+        <w:tc>
+          <w:tcPr/>
+          <w:p>
+            <w:pPr>
+              <w:pStyle w:val="Compact"/>
+              <w:jc w:val="left"/>
+            </w:pPr>
+            <w:r>
+              <w:t xml:space="preserve">13</w:t>
+            </w:r>
+          </w:p>
+        </w:tc>
+        <w:tc>
+          <w:tcPr/>
+          <w:p>
+            <w:pPr>
+              <w:pStyle w:val="Compact"/>
+              <w:jc w:val="left"/>
+            </w:pPr>
+            <w:r>
+              <w:t xml:space="preserve">Xây dựng thuyết minh đề tài: từ khoảng trống đến phiếu đề xuất và thuyết minh – DEMO 1</w:t>
+            </w:r>
+          </w:p>
+        </w:tc>
+        <w:tc>
+          <w:tcPr/>
+          <w:p>
+            <w:pPr>
+              <w:pStyle w:val="Compact"/>
+              <w:jc w:val="left"/>
+            </w:pPr>
+            <w:r>
+              <w:t xml:space="preserve">III</w:t>
+            </w:r>
+          </w:p>
+        </w:tc>
+        <w:tc>
+          <w:tcPr/>
+          <w:p>
+            <w:pPr>
+              <w:pStyle w:val="Compact"/>
+              <w:jc w:val="left"/>
+            </w:pPr>
+            <w:r>
+              <w:t xml:space="preserve">5′</w:t>
+            </w:r>
+          </w:p>
+        </w:tc>
+        <w:tc>
+          <w:tcPr/>
+          <w:p>
+            <w:pPr>
+              <w:pStyle w:val="Compact"/>
+              <w:jc w:val="left"/>
+            </w:pPr>
+            <w:r>
+              <w:t xml:space="preserve">[ ]</w:t>
+            </w:r>
+          </w:p>
+        </w:tc>
+      </w:tr>
+      <w:tr>
+        <w:tc>
+          <w:tcPr/>
+          <w:p>
+            <w:pPr>
+              <w:pStyle w:val="Compact"/>
+              <w:jc w:val="left"/>
+            </w:pPr>
+            <w:r>
+              <w:t xml:space="preserve">14</w:t>
+            </w:r>
+          </w:p>
+        </w:tc>
+        <w:tc>
+          <w:tcPr/>
+          <w:p>
+            <w:pPr>
+              <w:pStyle w:val="Compact"/>
+              <w:jc w:val="left"/>
+            </w:pPr>
+            <w:r>
+              <w:t xml:space="preserve">Hoàn thiện thuyết minh: tiến độ và dự toán kinh phí theo biểu mẫu Trung tâm</w:t>
+            </w:r>
+          </w:p>
+        </w:tc>
+        <w:tc>
+          <w:tcPr/>
+          <w:p>
+            <w:pPr>
+              <w:pStyle w:val="Compact"/>
+              <w:jc w:val="left"/>
+            </w:pPr>
+            <w:r>
+              <w:t xml:space="preserve">III</w:t>
+            </w:r>
+          </w:p>
+        </w:tc>
+        <w:tc>
+          <w:tcPr/>
+          <w:p>
+            <w:pPr>
+              <w:pStyle w:val="Compact"/>
+              <w:jc w:val="left"/>
+            </w:pPr>
+            <w:r>
               <w:t xml:space="preserve">4′</w:t>
             </w:r>
           </w:p>
@@ -1968,19 +2092,19 @@
               <w:jc w:val="left"/>
             </w:pPr>
             <w:r>
-              <w:t xml:space="preserve">13</w:t>
-            </w:r>
-          </w:p>
-        </w:tc>
-        <w:tc>
-          <w:tcPr/>
-          <w:p>
-            <w:pPr>
-              <w:pStyle w:val="Compact"/>
-              <w:jc w:val="left"/>
-            </w:pPr>
-            <w:r>
-              <w:t xml:space="preserve">Tổng quan tài liệu: từ bài báo đến khoảng trống nghiên cứu</w:t>
+              <w:t xml:space="preserve">15</w:t>
+            </w:r>
+          </w:p>
+        </w:tc>
+        <w:tc>
+          <w:tcPr/>
+          <w:p>
+            <w:pPr>
+              <w:pStyle w:val="Compact"/>
+              <w:jc w:val="left"/>
+            </w:pPr>
+            <w:r>
+              <w:t xml:space="preserve">🆕 Hướng dẫn xử lý dữ liệu với AI: quy trình 5 bước</w:t>
             </w:r>
           </w:p>
         </w:tc>
@@ -2004,7 +2128,7 @@
               <w:jc w:val="left"/>
             </w:pPr>
             <w:r>
-              <w:t xml:space="preserve">6′</w:t>
+              <w:t xml:space="preserve">4′</w:t>
             </w:r>
           </w:p>
         </w:tc>
@@ -2030,19 +2154,19 @@
               <w:jc w:val="left"/>
             </w:pPr>
             <w:r>
-              <w:t xml:space="preserve">14</w:t>
-            </w:r>
-          </w:p>
-        </w:tc>
-        <w:tc>
-          <w:tcPr/>
-          <w:p>
-            <w:pPr>
-              <w:pStyle w:val="Compact"/>
-              <w:jc w:val="left"/>
-            </w:pPr>
-            <w:r>
-              <w:t xml:space="preserve">Đề xuất nhiệm vụ: từ khoảng trống đến phiếu đề xuất và thuyết minh – DEMO 1</w:t>
+              <w:t xml:space="preserve">16</w:t>
+            </w:r>
+          </w:p>
+        </w:tc>
+        <w:tc>
+          <w:tcPr/>
+          <w:p>
+            <w:pPr>
+              <w:pStyle w:val="Compact"/>
+              <w:jc w:val="left"/>
+            </w:pPr>
+            <w:r>
+              <w:t xml:space="preserve">Xử lý dữ liệu: AI viết và chạy mã Python – DEMO 2</w:t>
             </w:r>
           </w:p>
         </w:tc>
@@ -2092,19 +2216,19 @@
               <w:jc w:val="left"/>
             </w:pPr>
             <w:r>
-              <w:t xml:space="preserve">15</w:t>
-            </w:r>
-          </w:p>
-        </w:tc>
-        <w:tc>
-          <w:tcPr/>
-          <w:p>
-            <w:pPr>
-              <w:pStyle w:val="Compact"/>
-              <w:jc w:val="left"/>
-            </w:pPr>
-            <w:r>
-              <w:t xml:space="preserve">Hồ sơ nhiệm vụ: thuyết minh, tiến độ và kinh phí theo biểu mẫu Trung tâm</w:t>
+              <w:t xml:space="preserve">17</w:t>
+            </w:r>
+          </w:p>
+        </w:tc>
+        <w:tc>
+          <w:tcPr/>
+          <w:p>
+            <w:pPr>
+              <w:pStyle w:val="Compact"/>
+              <w:jc w:val="left"/>
+            </w:pPr>
+            <w:r>
+              <w:t xml:space="preserve">Mô hình 3D: mô phỏng quá trình ăn mòn vật liệu theo thời gian</w:t>
             </w:r>
           </w:p>
         </w:tc>
@@ -2128,7 +2252,7 @@
               <w:jc w:val="left"/>
             </w:pPr>
             <w:r>
-              <w:t xml:space="preserve">4′</w:t>
+              <w:t xml:space="preserve">3′</w:t>
             </w:r>
           </w:p>
         </w:tc>
@@ -2154,19 +2278,19 @@
               <w:jc w:val="left"/>
             </w:pPr>
             <w:r>
-              <w:t xml:space="preserve">16</w:t>
-            </w:r>
-          </w:p>
-        </w:tc>
-        <w:tc>
-          <w:tcPr/>
-          <w:p>
-            <w:pPr>
-              <w:pStyle w:val="Compact"/>
-              <w:jc w:val="left"/>
-            </w:pPr>
-            <w:r>
-              <w:t xml:space="preserve">Xử lý dữ liệu: AI viết và chạy mã Python – DEMO 2</w:t>
+              <w:t xml:space="preserve">18</w:t>
+            </w:r>
+          </w:p>
+        </w:tc>
+        <w:tc>
+          <w:tcPr/>
+          <w:p>
+            <w:pPr>
+              <w:pStyle w:val="Compact"/>
+              <w:jc w:val="left"/>
+            </w:pPr>
+            <w:r>
+              <w:t xml:space="preserve">Công bố kết quả: bài báo và báo cáo tổng hợp theo nhiều định dạng</w:t>
             </w:r>
           </w:p>
         </w:tc>
@@ -2190,131 +2314,7 @@
               <w:jc w:val="left"/>
             </w:pPr>
             <w:r>
-              <w:t xml:space="preserve">6′</w:t>
-            </w:r>
-          </w:p>
-        </w:tc>
-        <w:tc>
-          <w:tcPr/>
-          <w:p>
-            <w:pPr>
-              <w:pStyle w:val="Compact"/>
-              <w:jc w:val="left"/>
-            </w:pPr>
-            <w:r>
-              <w:t xml:space="preserve">[ ]</w:t>
-            </w:r>
-          </w:p>
-        </w:tc>
-      </w:tr>
-      <w:tr>
-        <w:tc>
-          <w:tcPr/>
-          <w:p>
-            <w:pPr>
-              <w:pStyle w:val="Compact"/>
-              <w:jc w:val="left"/>
-            </w:pPr>
-            <w:r>
-              <w:t xml:space="preserve">17</w:t>
-            </w:r>
-          </w:p>
-        </w:tc>
-        <w:tc>
-          <w:tcPr/>
-          <w:p>
-            <w:pPr>
-              <w:pStyle w:val="Compact"/>
-              <w:jc w:val="left"/>
-            </w:pPr>
-            <w:r>
-              <w:t xml:space="preserve">Mô hình 3D: mô phỏng quá trình ăn mòn vật liệu theo thời gian</w:t>
-            </w:r>
-          </w:p>
-        </w:tc>
-        <w:tc>
-          <w:tcPr/>
-          <w:p>
-            <w:pPr>
-              <w:pStyle w:val="Compact"/>
-              <w:jc w:val="left"/>
-            </w:pPr>
-            <w:r>
-              <w:t xml:space="preserve">III</w:t>
-            </w:r>
-          </w:p>
-        </w:tc>
-        <w:tc>
-          <w:tcPr/>
-          <w:p>
-            <w:pPr>
-              <w:pStyle w:val="Compact"/>
-              <w:jc w:val="left"/>
-            </w:pPr>
-            <w:r>
               <w:t xml:space="preserve">3′</w:t>
-            </w:r>
-          </w:p>
-        </w:tc>
-        <w:tc>
-          <w:tcPr/>
-          <w:p>
-            <w:pPr>
-              <w:pStyle w:val="Compact"/>
-              <w:jc w:val="left"/>
-            </w:pPr>
-            <w:r>
-              <w:t xml:space="preserve">[ ]</w:t>
-            </w:r>
-          </w:p>
-        </w:tc>
-      </w:tr>
-      <w:tr>
-        <w:tc>
-          <w:tcPr/>
-          <w:p>
-            <w:pPr>
-              <w:pStyle w:val="Compact"/>
-              <w:jc w:val="left"/>
-            </w:pPr>
-            <w:r>
-              <w:t xml:space="preserve">18</w:t>
-            </w:r>
-          </w:p>
-        </w:tc>
-        <w:tc>
-          <w:tcPr/>
-          <w:p>
-            <w:pPr>
-              <w:pStyle w:val="Compact"/>
-              <w:jc w:val="left"/>
-            </w:pPr>
-            <w:r>
-              <w:t xml:space="preserve">Công bố kết quả: bài báo và báo cáo tổng hợp theo nhiều định dạng</w:t>
-            </w:r>
-          </w:p>
-        </w:tc>
-        <w:tc>
-          <w:tcPr/>
-          <w:p>
-            <w:pPr>
-              <w:pStyle w:val="Compact"/>
-              <w:jc w:val="left"/>
-            </w:pPr>
-            <w:r>
-              <w:t xml:space="preserve">III</w:t>
-            </w:r>
-          </w:p>
-        </w:tc>
-        <w:tc>
-          <w:tcPr/>
-          <w:p>
-            <w:pPr>
-              <w:pStyle w:val="Compact"/>
-              <w:jc w:val="left"/>
-            </w:pPr>
-            <w:r>
-              <w:t xml:space="preserve">4′</w:t>
             </w:r>
           </w:p>
         </w:tc>
@@ -8179,7 +8179,7 @@
         <w:rPr>
           <w:rStyle w:val="VerbatimChar"/>
         </w:rPr>
-        <w:t xml:space="preserve">├── 01-tong-quan-tai-lieu/   ← 13 tài liệu đã xác minh, ma trận bằng chứng, khoảng trống   (Slide 13)</w:t>
+        <w:t xml:space="preserve">├── 01-tong-quan-tai-lieu/   ← 13 tài liệu đã xác minh, ma trận bằng chứng, khoảng trống   (Slide 12)</w:t>
       </w:r>
       <w:r>
         <w:br/>
@@ -8188,7 +8188,7 @@
         <w:rPr>
           <w:rStyle w:val="VerbatimChar"/>
         </w:rPr>
-        <w:t xml:space="preserve">├── 02-de-xuat-thuyet-minh/  ← bản nháp đề xuất + biểu mẫu Trung tâm                       (Slide 14–15)</w:t>
+        <w:t xml:space="preserve">├── 02-de-xuat-thuyet-minh/  ← bản nháp đề xuất + biểu mẫu Trung tâm                       (Slide 13–14)</w:t>
       </w:r>
       <w:r>
         <w:br/>
@@ -8197,7 +8197,7 @@
         <w:rPr>
           <w:rStyle w:val="VerbatimChar"/>
         </w:rPr>
-        <w:t xml:space="preserve">├── 03-du-lieu/              ← thô (chỉ đọc) → đã xử lý → bổ sung; từ điển dữ liệu           (Slide 16)</w:t>
+        <w:t xml:space="preserve">├── 03-du-lieu/              ← thô (chỉ đọc) → đã xử lý → bổ sung; từ điển dữ liệu           (Slide 15–16)</w:t>
       </w:r>
       <w:r>
         <w:br/>
@@ -8568,26 +8568,13 @@
         <w:pStyle w:val="BlockText"/>
       </w:pPr>
       <w:r>
-        <w:t xml:space="preserve">🆕 v2.4: Phần III</w:t>
-      </w:r>
-      <w:r>
-        <w:t xml:space="preserve"> </w:t>
-      </w:r>
-      <w:r>
-        <w:rPr>
-          <w:bCs/>
-          <w:b/>
-        </w:rPr>
-        <w:t xml:space="preserve">bắt đầu ngay bằng tìm khoảng trống nghiên cứu</w:t>
-      </w:r>
-      <w:r>
-        <w:t xml:space="preserve">; slide tổng quan vòng đời chuyển xuống cuối phần (Slide 19) để tổng kết.</w:t>
-      </w:r>
-      <w:r>
-        <w:t xml:space="preserve"> </w:t>
-      </w:r>
-      <w:r>
-        <w:t xml:space="preserve">Slide 14–15 dùng</w:t>
+        <w:t xml:space="preserve">Mạch Phần III: nghiên cứu tài liệu → tổng quan, khoảng trống (Slide 12) → xây dựng thuyết minh (13, 14) → hướng dẫn xử lý dữ liệu (15) → xử lý dữ liệu, mô hình 3D (16, 17) → công bố (18) → toàn cảnh (19).</w:t>
+      </w:r>
+      <w:r>
+        <w:t xml:space="preserve"> </w:t>
+      </w:r>
+      <w:r>
+        <w:t xml:space="preserve">Slide 13–14 dùng</w:t>
       </w:r>
       <w:r>
         <w:t xml:space="preserve"> </w:t>
@@ -8603,20 +8590,20 @@
         <w:t xml:space="preserve"> </w:t>
       </w:r>
       <w:r>
-        <w:t xml:space="preserve">(người trình bày cung cấp); Slide 13 và 15 dùng</w:t>
-      </w:r>
-      <w:r>
-        <w:t xml:space="preserve"> </w:t>
-      </w:r>
-      <w:r>
-        <w:rPr>
-          <w:bCs/>
-          <w:b/>
-        </w:rPr>
-        <w:t xml:space="preserve">dữ liệu, tài liệu thật đã công bố</w:t>
-      </w:r>
-      <w:r>
-        <w:t xml:space="preserve">; dữ liệu giả lập chỉ còn dùng để minh họa phát hiện lỗi.</w:t>
+        <w:t xml:space="preserve">(người trình bày cung cấp); Slide 12 và 16 dùng</w:t>
+      </w:r>
+      <w:r>
+        <w:t xml:space="preserve"> </w:t>
+      </w:r>
+      <w:r>
+        <w:rPr>
+          <w:bCs/>
+          <w:b/>
+        </w:rPr>
+        <w:t xml:space="preserve">tài liệu, dữ liệu thật đã công bố</w:t>
+      </w:r>
+      <w:r>
+        <w:t xml:space="preserve">.</w:t>
       </w:r>
     </w:p>
     <w:p>
@@ -8626,13 +8613,13 @@
         </w:pict>
       </w:r>
     </w:p>
-    <w:bookmarkStart w:id="38" w:name="Xd85a41c55b25eb0738121b4f2eb487220bda3e4"/>
+    <w:bookmarkStart w:id="38" w:name="Xab0c3f074682ff26898321cd7465ffcf864210a"/>
     <w:p>
       <w:pPr>
         <w:pStyle w:val="Heading2"/>
       </w:pPr>
       <w:r>
-        <w:t xml:space="preserve">Slide 12 – Tìm và lọc tài liệu bước đầu: Sci-Hub, Sci-Bot và các công cụ hỗ trợ (4′)</w:t>
+        <w:t xml:space="preserve">Slide 12 – Nghiên cứu tài liệu và tổng quan: từ tìm, lọc tài liệu đến khoảng trống nghiên cứu (8′)</w:t>
       </w:r>
     </w:p>
     <w:p>
@@ -8650,7 +8637,23 @@
         <w:t xml:space="preserve"> </w:t>
       </w:r>
       <w:r>
-        <w:t xml:space="preserve">quy trình 4 bước tìm – lọc tài liệu</w:t>
+        <w:t xml:space="preserve">-</w:t>
+      </w:r>
+      <w:r>
+        <w:t xml:space="preserve"> </w:t>
+      </w:r>
+      <w:r>
+        <w:rPr>
+          <w:bCs/>
+          <w:b/>
+        </w:rPr>
+        <w:t xml:space="preserve">Tình huống:</w:t>
+      </w:r>
+      <w:r>
+        <w:t xml:space="preserve"> </w:t>
+      </w:r>
+      <w:r>
+        <w:t xml:space="preserve">ăn mòn khí quyển của kim loại trong khí hậu nhiệt đới Việt Nam</w:t>
       </w:r>
     </w:p>
     <w:tbl>
@@ -8701,21 +8704,21 @@
               <w:jc w:val="left"/>
             </w:pPr>
             <w:r>
-              <w:t xml:space="preserve">Làm gì</w:t>
-            </w:r>
-          </w:p>
-        </w:tc>
-      </w:tr>
-      <w:tr>
-        <w:tc>
-          <w:tcPr/>
-          <w:p>
-            <w:pPr>
-              <w:pStyle w:val="Compact"/>
-              <w:jc w:val="left"/>
-            </w:pPr>
-            <w:r>
-              <w:t xml:space="preserve">1. Đặt câu hỏi, tìm bài ứng viên</w:t>
+              <w:t xml:space="preserve">Kết quả</w:t>
+            </w:r>
+          </w:p>
+        </w:tc>
+      </w:tr>
+      <w:tr>
+        <w:tc>
+          <w:tcPr/>
+          <w:p>
+            <w:pPr>
+              <w:pStyle w:val="Compact"/>
+              <w:jc w:val="left"/>
+            </w:pPr>
+            <w:r>
+              <w:t xml:space="preserve">1. Tìm bài ứng viên</w:t>
             </w:r>
           </w:p>
         </w:tc>
@@ -8737,19 +8740,19 @@
               <w:t xml:space="preserve"> </w:t>
             </w:r>
             <w:r>
-              <w:t xml:space="preserve">(trợ lý AI trên kho Sci-Hub, 04/2026) · Google Scholar Labs · Semantic Scholar</w:t>
-            </w:r>
-          </w:p>
-        </w:tc>
-        <w:tc>
-          <w:tcPr/>
-          <w:p>
-            <w:pPr>
-              <w:pStyle w:val="Compact"/>
-              <w:jc w:val="left"/>
-            </w:pPr>
-            <w:r>
-              <w:t xml:space="preserve">Hỏi bằng tiếng Anh, nêu rõ đối tượng – điều kiện – yếu tố cần xét → câu trả lời tổng hợp kèm danh sách bài báo, DOI</w:t>
+              <w:t xml:space="preserve">(trợ lý AI trên kho Sci-Hub) · Google Scholar Labs · Semantic Scholar</w:t>
+            </w:r>
+          </w:p>
+        </w:tc>
+        <w:tc>
+          <w:tcPr/>
+          <w:p>
+            <w:pPr>
+              <w:pStyle w:val="Compact"/>
+              <w:jc w:val="left"/>
+            </w:pPr>
+            <w:r>
+              <w:t xml:space="preserve">Danh sách bài báo kèm DOI</w:t>
             </w:r>
           </w:p>
         </w:tc>
@@ -8775,19 +8778,19 @@
               <w:jc w:val="left"/>
             </w:pPr>
             <w:r>
-              <w:t xml:space="preserve">Elicit · Consensus · Claude (dự án)</w:t>
-            </w:r>
-          </w:p>
-        </w:tc>
-        <w:tc>
-          <w:tcPr/>
-          <w:p>
-            <w:pPr>
-              <w:pStyle w:val="Compact"/>
-              <w:jc w:val="left"/>
-            </w:pPr>
-            <w:r>
-              <w:t xml:space="preserve">Áp tiêu chí đưa vào / loại ra → giữ 10–30 bài</w:t>
+              <w:t xml:space="preserve">Elicit · Consensus · Claude</w:t>
+            </w:r>
+          </w:p>
+        </w:tc>
+        <w:tc>
+          <w:tcPr/>
+          <w:p>
+            <w:pPr>
+              <w:pStyle w:val="Compact"/>
+              <w:jc w:val="left"/>
+            </w:pPr>
+            <w:r>
+              <w:t xml:space="preserve">10–30 bài theo tiêu chí đưa vào / loại ra</w:t>
             </w:r>
           </w:p>
         </w:tc>
@@ -8823,57 +8826,95 @@
               <w:t xml:space="preserve"> </w:t>
             </w:r>
             <w:r>
-              <w:t xml:space="preserve">(tra theo DOI hoặc tiêu đề) · Unpaywall · CORE · VJOL · CyberLeninka · eLIBRARY.ru</w:t>
-            </w:r>
-          </w:p>
-        </w:tc>
-        <w:tc>
-          <w:tcPr/>
-          <w:p>
-            <w:pPr>
-              <w:pStyle w:val="Compact"/>
-              <w:jc w:val="left"/>
-            </w:pPr>
-            <w:r>
-              <w:t xml:space="preserve">Tải PDF để đọc kỹ</w:t>
-            </w:r>
-          </w:p>
-        </w:tc>
-      </w:tr>
-      <w:tr>
-        <w:tc>
-          <w:tcPr/>
-          <w:p>
-            <w:pPr>
-              <w:pStyle w:val="Compact"/>
-              <w:jc w:val="left"/>
-            </w:pPr>
-            <w:r>
-              <w:t xml:space="preserve">4. Đưa vào dự án</w:t>
-            </w:r>
-          </w:p>
-        </w:tc>
-        <w:tc>
-          <w:tcPr/>
-          <w:p>
-            <w:pPr>
-              <w:pStyle w:val="Compact"/>
-              <w:jc w:val="left"/>
-            </w:pPr>
-            <w:r>
-              <w:t xml:space="preserve">Claude</w:t>
-            </w:r>
-          </w:p>
-        </w:tc>
-        <w:tc>
-          <w:tcPr/>
-          <w:p>
-            <w:pPr>
-              <w:pStyle w:val="Compact"/>
-              <w:jc w:val="left"/>
-            </w:pPr>
-            <w:r>
-              <w:t xml:space="preserve">Tải PDF vào dự án → lập ma trận bằng chứng (Slide 13)</w:t>
+              <w:t xml:space="preserve">(theo DOI) · Unpaywall · CORE · VJOL · CyberLeninka · eLIBRARY.ru</w:t>
+            </w:r>
+          </w:p>
+        </w:tc>
+        <w:tc>
+          <w:tcPr/>
+          <w:p>
+            <w:pPr>
+              <w:pStyle w:val="Compact"/>
+              <w:jc w:val="left"/>
+            </w:pPr>
+            <w:r>
+              <w:t xml:space="preserve">Bộ PDF đưa vào dự án Claude</w:t>
+            </w:r>
+          </w:p>
+        </w:tc>
+      </w:tr>
+      <w:tr>
+        <w:tc>
+          <w:tcPr/>
+          <w:p>
+            <w:pPr>
+              <w:pStyle w:val="Compact"/>
+              <w:jc w:val="left"/>
+            </w:pPr>
+            <w:r>
+              <w:t xml:space="preserve">4. Lập ma trận bằng chứng</w:t>
+            </w:r>
+          </w:p>
+        </w:tc>
+        <w:tc>
+          <w:tcPr/>
+          <w:p>
+            <w:pPr>
+              <w:pStyle w:val="Compact"/>
+              <w:jc w:val="left"/>
+            </w:pPr>
+            <w:r>
+              <w:t xml:space="preserve">Claude (dự án)</w:t>
+            </w:r>
+          </w:p>
+        </w:tc>
+        <w:tc>
+          <w:tcPr/>
+          <w:p>
+            <w:pPr>
+              <w:pStyle w:val="Compact"/>
+              <w:jc w:val="left"/>
+            </w:pPr>
+            <w:r>
+              <w:t xml:space="preserve">Bảng: tác giả – năm, địa điểm, kim loại, biến môi trường, mô hình, kết luận, hạn chế</w:t>
+            </w:r>
+          </w:p>
+        </w:tc>
+      </w:tr>
+      <w:tr>
+        <w:tc>
+          <w:tcPr/>
+          <w:p>
+            <w:pPr>
+              <w:pStyle w:val="Compact"/>
+              <w:jc w:val="left"/>
+            </w:pPr>
+            <w:r>
+              <w:t xml:space="preserve">5. Xác định khoảng trống</w:t>
+            </w:r>
+          </w:p>
+        </w:tc>
+        <w:tc>
+          <w:tcPr/>
+          <w:p>
+            <w:pPr>
+              <w:pStyle w:val="Compact"/>
+              <w:jc w:val="left"/>
+            </w:pPr>
+            <w:r>
+              <w:t xml:space="preserve">Claude + nhà khoa học</w:t>
+            </w:r>
+          </w:p>
+        </w:tc>
+        <w:tc>
+          <w:tcPr/>
+          <w:p>
+            <w:pPr>
+              <w:pStyle w:val="Compact"/>
+              <w:jc w:val="left"/>
+            </w:pPr>
+            <w:r>
+              <w:t xml:space="preserve">3 khoảng trống, mỗi khoảng trống dẫn chứng ≥ 2 bài</w:t>
             </w:r>
           </w:p>
         </w:tc>
@@ -8881,14 +8922,24 @@
     </w:tbl>
     <w:p>
       <w:pPr>
-        <w:pStyle w:val="BodyText"/>
-      </w:pPr>
-      <w:r>
-        <w:rPr>
-          <w:bCs/>
-          <w:b/>
-        </w:rPr>
-        <w:t xml:space="preserve">Câu hỏi mẫu cho Sci-Bot:</w:t>
+        <w:numPr>
+          <w:ilvl w:val="0"/>
+          <w:numId w:val="1002"/>
+        </w:numPr>
+        <w:pStyle w:val="Compact"/>
+      </w:pPr>
+      <w:r>
+        <w:t xml:space="preserve">📊</w:t>
+      </w:r>
+      <w:r>
+        <w:t xml:space="preserve"> </w:t>
+      </w:r>
+      <w:r>
+        <w:rPr>
+          <w:bCs/>
+          <w:b/>
+        </w:rPr>
+        <w:t xml:space="preserve">Kết quả – 3 khoảng trống</w:t>
       </w:r>
       <w:r>
         <w:t xml:space="preserve"> </w:t>
@@ -8898,21 +8949,90 @@
           <w:iCs/>
           <w:i/>
         </w:rPr>
-        <w:t xml:space="preserve">“</w:t>
-      </w:r>
-      <w:r>
-        <w:rPr>
-          <w:iCs/>
-          <w:i/>
-        </w:rPr>
-        <w:t xml:space="preserve">Which environmental factors control the first-year atmospheric corrosion rate of carbon steel in tropical climates, and how accurate is the ISO 9223 dose-response function there?</w:t>
-      </w:r>
-      <w:r>
-        <w:rPr>
-          <w:iCs/>
-          <w:i/>
-        </w:rPr>
-        <w:t xml:space="preserve">”</w:t>
+        <w:t xml:space="preserve">(đề xuất, nhà khoa học quyết định)</w:t>
+      </w:r>
+      <w:r>
+        <w:t xml:space="preserve">:</w:t>
+      </w:r>
+    </w:p>
+    <w:p>
+      <w:pPr>
+        <w:numPr>
+          <w:ilvl w:val="1"/>
+          <w:numId w:val="1003"/>
+        </w:numPr>
+        <w:pStyle w:val="Compact"/>
+      </w:pPr>
+      <w:r>
+        <w:t xml:space="preserve">Mô hình quốc tế</w:t>
+      </w:r>
+      <w:r>
+        <w:t xml:space="preserve"> </w:t>
+      </w:r>
+      <w:r>
+        <w:rPr>
+          <w:bCs/>
+          <w:b/>
+        </w:rPr>
+        <w:t xml:space="preserve">đánh giá thấp ~31%</w:t>
+      </w:r>
+      <w:r>
+        <w:t xml:space="preserve"> </w:t>
+      </w:r>
+      <w:r>
+        <w:t xml:space="preserve">ăn mòn thép ở Việt Nam → cần hàm liều – đáp ứng hiệu chỉnh cho khí hậu nhiệt đới</w:t>
+      </w:r>
+    </w:p>
+    <w:p>
+      <w:pPr>
+        <w:numPr>
+          <w:ilvl w:val="1"/>
+          <w:numId w:val="1003"/>
+        </w:numPr>
+        <w:pStyle w:val="Compact"/>
+      </w:pPr>
+      <w:r>
+        <w:t xml:space="preserve">Huế, Nha Trang ăn mòn cao dù clorua thấp → yếu tố chưa được giải thích</w:t>
+      </w:r>
+    </w:p>
+    <w:p>
+      <w:pPr>
+        <w:numPr>
+          <w:ilvl w:val="1"/>
+          <w:numId w:val="1003"/>
+        </w:numPr>
+        <w:pStyle w:val="Compact"/>
+      </w:pPr>
+      <w:r>
+        <w:t xml:space="preserve">Số liệu Việt Nam chủ yếu 1995–2005, chỉ năm đầu → thiếu dữ liệu dài hạn</w:t>
+      </w:r>
+    </w:p>
+    <w:p>
+      <w:pPr>
+        <w:numPr>
+          <w:ilvl w:val="0"/>
+          <w:numId w:val="1002"/>
+        </w:numPr>
+        <w:pStyle w:val="Compact"/>
+      </w:pPr>
+      <w:r>
+        <w:t xml:space="preserve">✅</w:t>
+      </w:r>
+      <w:r>
+        <w:t xml:space="preserve"> </w:t>
+      </w:r>
+      <w:r>
+        <w:rPr>
+          <w:bCs/>
+          <w:b/>
+        </w:rPr>
+        <w:t xml:space="preserve">Nhà khoa học xác nhận:</w:t>
+      </w:r>
+      <w:r>
+        <w:t xml:space="preserve"> </w:t>
+      </w:r>
+      <w:r>
+        <w:t xml:space="preserve">nguồn có thật (kiểm tra DOI); khoảng trống có giá trị → chuyển sang xây dựng thuyết minh (Slide 13)</w:t>
       </w:r>
     </w:p>
     <w:p>
@@ -8920,7 +9040,7 @@
         <w:pStyle w:val="BlockText"/>
       </w:pPr>
       <w:r>
-        <w:t xml:space="preserve">Lưu ý khi dùng: Sci-Bot là bản thử nghiệm – mỗi lần một câu hỏi, thiếu bài mới (sau ~2021–2022) → bổ sung bài mới bằng Google Scholar Labs; kiểm tra DOI của mọi trích dẫn. Chỉ truy cập địa chỉ chính thức (nhiều trang giả mạo); không dùng trên máy có tài liệu mật.</w:t>
+        <w:t xml:space="preserve">Lưu ý: Sci-Bot là bản thử nghiệm – mỗi lần một câu hỏi, thiếu bài mới (sau ~2021–2022) → bổ sung bằng Google Scholar Labs. Chỉ truy cập địa chỉ chính thức; không dùng trên máy có tài liệu mật.</w:t>
       </w:r>
     </w:p>
     <w:p>
@@ -8938,7 +9058,7 @@
         <w:t xml:space="preserve"> </w:t>
       </w:r>
       <w:r>
-        <w:t xml:space="preserve">ảnh chụp Sci-Bot trả lời câu hỏi mẫu kèm danh sách bài; ảnh Sci-Hub tra một bài theo DOI; ảnh bảng lọc bài trên Claude.</w:t>
+        <w:t xml:space="preserve">ảnh Sci-Bot trả lời câu hỏi mẫu; ảnh ma trận bằng chứng do AI lập và 3 khoảng trống.</w:t>
       </w:r>
     </w:p>
     <w:p>
@@ -8956,7 +9076,7 @@
         <w:t xml:space="preserve"> </w:t>
       </w:r>
       <w:r>
-        <w:t xml:space="preserve">hướng dẫn chi tiết từng công cụ –</w:t>
+        <w:t xml:space="preserve">hướng dẫn Sci-Bot, Sci-Hub –</w:t>
       </w:r>
       <w:r>
         <w:t xml:space="preserve"> </w:t>
@@ -8971,7 +9091,7 @@
         <w:t xml:space="preserve"> </w:t>
       </w:r>
       <w:r>
-        <w:t xml:space="preserve">mục 11; câu lệnh lọc tài liệu –</w:t>
+        <w:t xml:space="preserve">mục 11; danh mục 8 tài liệu thật – mục 7; câu lệnh:</w:t>
       </w:r>
       <w:r>
         <w:t xml:space="preserve"> </w:t>
@@ -8986,7 +9106,7 @@
         <w:t xml:space="preserve"> </w:t>
       </w:r>
       <w:r>
-        <w:t xml:space="preserve">mục 14.</w:t>
+        <w:t xml:space="preserve">mục 14 (tìm – lọc), mục 1 (ma trận, khoảng trống).</w:t>
       </w:r>
     </w:p>
     <w:p>
@@ -9004,7 +9124,7 @@
         <w:t xml:space="preserve"> </w:t>
       </w:r>
       <w:r>
-        <w:t xml:space="preserve">N33, N35–N37</w:t>
+        <w:t xml:space="preserve">N25, N33, N35–N37 · tài liệu 1–8</w:t>
       </w:r>
     </w:p>
     <w:p>
@@ -9043,13 +9163,13 @@
       </w:r>
     </w:p>
     <w:bookmarkEnd w:id="38"/>
-    <w:bookmarkStart w:id="39" w:name="X86b8179ee4983cce1e74e4be426ed43bc51a863"/>
+    <w:bookmarkStart w:id="39" w:name="X6a70822288d9db39aca2fe6100c568efe87bed8"/>
     <w:p>
       <w:pPr>
         <w:pStyle w:val="Heading2"/>
       </w:pPr>
       <w:r>
-        <w:t xml:space="preserve">Slide 13 – Tổng quan tài liệu: từ bài báo đến khoảng trống nghiên cứu (6′)</w:t>
+        <w:t xml:space="preserve">Slide 13 – Xây dựng thuyết minh đề tài: từ khoảng trống đến phiếu đề xuất và thuyết minh – DEMO 1 (5′)</w:t>
       </w:r>
     </w:p>
     <w:p>
@@ -9067,67 +9187,45 @@
         <w:t xml:space="preserve"> </w:t>
       </w:r>
       <w:r>
-        <w:t xml:space="preserve">-</w:t>
-      </w:r>
-      <w:r>
-        <w:t xml:space="preserve"> </w:t>
-      </w:r>
-      <w:r>
-        <w:rPr>
-          <w:bCs/>
-          <w:b/>
-        </w:rPr>
-        <w:t xml:space="preserve">Tình huống:</w:t>
-      </w:r>
-      <w:r>
-        <w:t xml:space="preserve"> </w:t>
-      </w:r>
-      <w:r>
-        <w:t xml:space="preserve">ăn mòn khí quyển của kim loại trong khí hậu nhiệt đới Việt Nam</w:t>
-      </w:r>
-      <w:r>
-        <w:t xml:space="preserve"> </w:t>
-      </w:r>
-      <w:r>
-        <w:t xml:space="preserve">- 🌍</w:t>
-      </w:r>
-      <w:r>
-        <w:t xml:space="preserve"> </w:t>
-      </w:r>
-      <w:r>
-        <w:rPr>
-          <w:bCs/>
-          <w:b/>
-        </w:rPr>
-        <w:t xml:space="preserve">Ví dụ thật:</w:t>
-      </w:r>
-      <w:r>
-        <w:t xml:space="preserve"> </w:t>
-      </w:r>
-      <w:r>
-        <w:t xml:space="preserve">AI co-scientist (Google) – nhiều trợ lý đề xuất, phản biện, xếp hạng giả thuyết</w:t>
-      </w:r>
-      <w:r>
-        <w:t xml:space="preserve"> </w:t>
-      </w:r>
-      <w:r>
-        <w:t xml:space="preserve">- 🧰</w:t>
-      </w:r>
-      <w:r>
-        <w:t xml:space="preserve"> </w:t>
-      </w:r>
-      <w:r>
-        <w:rPr>
-          <w:bCs/>
-          <w:b/>
-        </w:rPr>
-        <w:t xml:space="preserve">Tài liệu đầu vào:</w:t>
-      </w:r>
-      <w:r>
-        <w:t xml:space="preserve"> </w:t>
-      </w:r>
-      <w:r>
-        <w:t xml:space="preserve">các bài đã tìm, lọc ở Slide 12; công cụ hỗ trợ đọc: Claude Research · Elicit (tổng quan hệ thống, trích xuất bảng) · Consensus (câu trả lời có dẫn chứng) · Semantic Scholar (miễn phí) · Scite (trích dẫn ủng hộ hay phản bác) · ResearchRabbit (bản đồ trích dẫn)</w:t>
+        <w:t xml:space="preserve">- Khoảng trống → tính cấp thiết, mục tiêu, nội dung, phương pháp, sản phẩm</w:t>
+      </w:r>
+      <w:r>
+        <w:t xml:space="preserve"> </w:t>
+      </w:r>
+      <w:r>
+        <w:t xml:space="preserve">- 🎬</w:t>
+      </w:r>
+      <w:r>
+        <w:t xml:space="preserve"> </w:t>
+      </w:r>
+      <w:r>
+        <w:rPr>
+          <w:bCs/>
+          <w:b/>
+        </w:rPr>
+        <w:t xml:space="preserve">Kết quả demo đã chạy trước:</w:t>
+      </w:r>
+      <w:r>
+        <w:t xml:space="preserve"> </w:t>
+      </w:r>
+      <w:r>
+        <w:t xml:space="preserve">đưa</w:t>
+      </w:r>
+      <w:r>
+        <w:t xml:space="preserve"> </w:t>
+      </w:r>
+      <w:r>
+        <w:rPr>
+          <w:bCs/>
+          <w:b/>
+        </w:rPr>
+        <w:t xml:space="preserve">biểu mẫu thật của Trung tâm</w:t>
+      </w:r>
+      <w:r>
+        <w:t xml:space="preserve"> </w:t>
+      </w:r>
+      <w:r>
+        <w:t xml:space="preserve">(phiếu đề xuất, thuyết minh) vào dự án → AI điền theo khoảng trống đã chọn – trình chiếu ảnh biểu mẫu đã điền và bảng đối chiếu</w:t>
       </w:r>
       <w:r>
         <w:t xml:space="preserve"> </w:t>
@@ -9149,7 +9247,32 @@
         <w:t xml:space="preserve"> </w:t>
       </w:r>
       <w:r>
-        <w:t xml:space="preserve">&gt; Từ các bài báo trong dự án, lập ma trận bằng chứng (tác giả – năm, địa điểm, kim loại, thời gian phơi mẫu, biến môi trường, mô hình, kết luận, hạn chế). Chỉ ra điểm chưa thống nhất và 3 khoảng trống cho điều kiện Việt Nam, mỗi khoảng trống dẫn chứng ít nhất 2 bài.</w:t>
+        <w:rPr>
+          <w:rStyle w:val="VerbatimChar"/>
+        </w:rPr>
+        <w:t xml:space="preserve">Đọc biểu mẫu [tên biểu mẫu] trong dự án. Liệt kê toàn bộ mục và yêu cầu của từng mục.   Điền nội dung cho khoảng trống số [1]: giữ nguyên số mục, tiêu đề, định dạng của mẫu;   mục nào thiếu thông tin ghi [CẦN BỔ SUNG: ...]; không tự đặt số liệu.   Sau đó lập bảng đối chiếu Mục tiêu → Nội dung → Phương pháp → Sản phẩm → Chỉ tiêu,   đánh dấu ⚠ chỗ không khớp. Xuất tệp .docx.</w:t>
+      </w:r>
+      <w:r>
+        <w:t xml:space="preserve"> </w:t>
+      </w:r>
+      <w:r>
+        <w:t xml:space="preserve">- 📊</w:t>
+      </w:r>
+      <w:r>
+        <w:t xml:space="preserve"> </w:t>
+      </w:r>
+      <w:r>
+        <w:rPr>
+          <w:bCs/>
+          <w:b/>
+        </w:rPr>
+        <w:t xml:space="preserve">Kết quả mong đợi:</w:t>
+      </w:r>
+      <w:r>
+        <w:t xml:space="preserve"> </w:t>
+      </w:r>
+      <w:r>
+        <w:t xml:space="preserve">biểu mẫu đã điền đúng cấu trúc; danh sách [CẦN BỔ SUNG]; bảng đối chiếu có dấu ⚠</w:t>
       </w:r>
       <w:r>
         <w:t xml:space="preserve"> </w:t>
@@ -9171,7 +9294,7 @@
         <w:t xml:space="preserve"> </w:t>
       </w:r>
       <w:r>
-        <w:t xml:space="preserve">nguồn có thật; khoảng trống có giá trị</w:t>
+        <w:t xml:space="preserve">tính mới, tính khả thi, chỉ tiêu</w:t>
       </w:r>
     </w:p>
     <w:p>
@@ -9183,54 +9306,29 @@
           <w:bCs/>
           <w:b/>
         </w:rPr>
-        <w:t xml:space="preserve">🆕 Khoảng trống gợi ý – có căn cứ từ phân tích dữ liệu thật</w:t>
-      </w:r>
-      <w:r>
-        <w:t xml:space="preserve"> </w:t>
-      </w:r>
-      <w:r>
-        <w:rPr>
-          <w:iCs/>
-          <w:i/>
-        </w:rPr>
-        <w:t xml:space="preserve">(đề xuất, nhà khoa học quyết định)</w:t>
-      </w:r>
-      <w:r>
-        <w:t xml:space="preserve">:</w:t>
-      </w:r>
-      <w:r>
-        <w:t xml:space="preserve"> </w:t>
-      </w:r>
-      <w:r>
-        <w:t xml:space="preserve">1. Mô hình quốc tế</w:t>
-      </w:r>
-      <w:r>
-        <w:t xml:space="preserve"> </w:t>
-      </w:r>
-      <w:r>
-        <w:rPr>
-          <w:bCs/>
-          <w:b/>
-        </w:rPr>
-        <w:t xml:space="preserve">đánh giá thấp ~31%</w:t>
-      </w:r>
-      <w:r>
-        <w:t xml:space="preserve"> </w:t>
-      </w:r>
-      <w:r>
-        <w:t xml:space="preserve">ăn mòn thép ở Việt Nam → cần hàm liều – đáp ứng hiệu chỉnh cho khí hậu nhiệt đới (thêm độ ẩm, mưa, chu kỳ khô – ướt).</w:t>
-      </w:r>
-      <w:r>
-        <w:t xml:space="preserve"> </w:t>
-      </w:r>
-      <w:r>
-        <w:t xml:space="preserve">2. Huế, Nha Trang ăn mòn cao dù clorua thấp → yếu tố chưa được giải thích.</w:t>
-      </w:r>
-      <w:r>
-        <w:t xml:space="preserve"> </w:t>
-      </w:r>
-      <w:r>
-        <w:t xml:space="preserve">3. Số liệu Việt Nam chủ yếu 1995–2005, chủ yếu thép cacbon năm đầu → thiếu dữ liệu dài hạn và cập nhật theo biến đổi khí hậu.</w:t>
+        <w:t xml:space="preserve">⚠ Dữ liệu khi chạy trước demo:</w:t>
+      </w:r>
+      <w:r>
+        <w:t xml:space="preserve"> </w:t>
+      </w:r>
+      <w:r>
+        <w:t xml:space="preserve">biểu mẫu trống = nhóm xanh;</w:t>
+      </w:r>
+      <w:r>
+        <w:t xml:space="preserve"> </w:t>
+      </w:r>
+      <w:r>
+        <w:rPr>
+          <w:bCs/>
+          <w:b/>
+        </w:rPr>
+        <w:t xml:space="preserve">nội dung đề xuất thật = nhóm vàng</w:t>
+      </w:r>
+      <w:r>
+        <w:t xml:space="preserve"> </w:t>
+      </w:r>
+      <w:r>
+        <w:t xml:space="preserve">→ chỉ dùng tài khoản gói tổ chức (không huấn luyện mô hình), hoặc dùng nội dung đề xuất giả định cho ảnh trình chiếu.</w:t>
       </w:r>
     </w:p>
     <w:p>
@@ -9242,13 +9340,13 @@
           <w:bCs/>
           <w:b/>
         </w:rPr>
-        <w:t xml:space="preserve">Hình ảnh (thay bảng tài liệu):</w:t>
-      </w:r>
-      <w:r>
-        <w:t xml:space="preserve"> </w:t>
-      </w:r>
-      <w:r>
-        <w:t xml:space="preserve">ảnh chụp ma trận bằng chứng do AI lập và 3 khoảng trống có điểm phản biện.</w:t>
+        <w:t xml:space="preserve">Hình ảnh:</w:t>
+      </w:r>
+      <w:r>
+        <w:t xml:space="preserve"> </w:t>
+      </w:r>
+      <w:r>
+        <w:t xml:space="preserve">ảnh chụp bảng đối chiếu có dấu ⚠.</w:t>
       </w:r>
     </w:p>
     <w:p>
@@ -9260,58 +9358,13 @@
           <w:bCs/>
           <w:b/>
         </w:rPr>
-        <w:t xml:space="preserve">Không chiếu (tài liệu phát tay):</w:t>
-      </w:r>
-      <w:r>
-        <w:t xml:space="preserve"> </w:t>
-      </w:r>
-      <w:r>
-        <w:t xml:space="preserve">danh mục 8 tài liệu thật dùng cho demo –</w:t>
-      </w:r>
-      <w:r>
-        <w:t xml:space="preserve"> </w:t>
-      </w:r>
-      <w:r>
-        <w:rPr>
-          <w:rStyle w:val="VerbatimChar"/>
-        </w:rPr>
-        <w:t xml:space="preserve">TAI-LIEU-PHAT-TAY.md</w:t>
-      </w:r>
-      <w:r>
-        <w:t xml:space="preserve"> </w:t>
-      </w:r>
-      <w:r>
-        <w:t xml:space="preserve">mục 7; danh mục đầy đủ 13 tài liệu:</w:t>
-      </w:r>
-      <w:r>
-        <w:t xml:space="preserve"> </w:t>
-      </w:r>
-      <w:r>
-        <w:rPr>
-          <w:rStyle w:val="VerbatimChar"/>
-        </w:rPr>
-        <w:t xml:space="preserve">du-an-nghien-cuu/01-tong-quan-tai-lieu/DANH-MUC-TAI-LIEU.csv</w:t>
-      </w:r>
-      <w:r>
-        <w:t xml:space="preserve">.</w:t>
-      </w:r>
-    </w:p>
-    <w:p>
-      <w:pPr>
-        <w:pStyle w:val="BodyText"/>
-      </w:pPr>
-      <w:r>
-        <w:rPr>
-          <w:bCs/>
-          <w:b/>
-        </w:rPr>
-        <w:t xml:space="preserve">Nguồn:</w:t>
-      </w:r>
-      <w:r>
-        <w:t xml:space="preserve"> </w:t>
-      </w:r>
-      <w:r>
-        <w:t xml:space="preserve">G2 · N25 (công cụ tài liệu) · tài liệu 1–8 · Câu lệnh 1.1–1.3</w:t>
+        <w:t xml:space="preserve">Việc phải làm:</w:t>
+      </w:r>
+      <w:r>
+        <w:t xml:space="preserve"> </w:t>
+      </w:r>
+      <w:r>
+        <w:t xml:space="preserve">người trình bày gửi biểu mẫu của Trung tâm → chạy thử 2 lần, ghi hình lần chạy tốt nhất.</w:t>
       </w:r>
     </w:p>
     <w:p>
@@ -9350,13 +9403,13 @@
       </w:r>
     </w:p>
     <w:bookmarkEnd w:id="39"/>
-    <w:bookmarkStart w:id="40" w:name="X8d7e78c22fb4cd32c248eb2d592e06664dd5bd7"/>
+    <w:bookmarkStart w:id="40" w:name="X606cf028b838d1170c74de0dcc29977c72083bf"/>
     <w:p>
       <w:pPr>
         <w:pStyle w:val="Heading2"/>
       </w:pPr>
       <w:r>
-        <w:t xml:space="preserve">Slide 14 – Đề xuất nhiệm vụ: từ khoảng trống đến phiếu đề xuất và thuyết minh – DEMO 1 (5′)</w:t>
+        <w:t xml:space="preserve">Slide 14 – Hoàn thiện thuyết minh: tiến độ và dự toán kinh phí theo biểu mẫu Trung tâm (4′)</w:t>
       </w:r>
     </w:p>
     <w:p>
@@ -9374,12 +9427,6 @@
         <w:t xml:space="preserve"> </w:t>
       </w:r>
       <w:r>
-        <w:t xml:space="preserve">- Khoảng trống → tính cấp thiết, mục tiêu, nội dung, phương pháp, sản phẩm</w:t>
-      </w:r>
-      <w:r>
-        <w:t xml:space="preserve"> </w:t>
-      </w:r>
-      <w:r>
         <w:t xml:space="preserve">- 🎬</w:t>
       </w:r>
       <w:r>
@@ -9396,23 +9443,7 @@
         <w:t xml:space="preserve"> </w:t>
       </w:r>
       <w:r>
-        <w:t xml:space="preserve">đưa</w:t>
-      </w:r>
-      <w:r>
-        <w:t xml:space="preserve"> </w:t>
-      </w:r>
-      <w:r>
-        <w:rPr>
-          <w:bCs/>
-          <w:b/>
-        </w:rPr>
-        <w:t xml:space="preserve">biểu mẫu thật của Trung tâm</w:t>
-      </w:r>
-      <w:r>
-        <w:t xml:space="preserve"> </w:t>
-      </w:r>
-      <w:r>
-        <w:t xml:space="preserve">(phiếu đề xuất, thuyết minh) vào dự án → AI điền theo khoảng trống đã chọn – trình chiếu ảnh biểu mẫu đã điền và bảng đối chiếu</w:t>
+        <w:t xml:space="preserve">biểu mẫu thuyết minh – tiến độ – dự toán của Trung tâm được AI lập từ thuyết minh đã duyệt</w:t>
       </w:r>
       <w:r>
         <w:t xml:space="preserve"> </w:t>
@@ -9437,7 +9468,7 @@
         <w:rPr>
           <w:rStyle w:val="VerbatimChar"/>
         </w:rPr>
-        <w:t xml:space="preserve">Đọc biểu mẫu [tên biểu mẫu] trong dự án. Liệt kê toàn bộ mục và yêu cầu của từng mục.   Điền nội dung cho khoảng trống số [1]: giữ nguyên số mục, tiêu đề, định dạng của mẫu;   mục nào thiếu thông tin ghi [CẦN BỔ SUNG: ...]; không tự đặt số liệu.   Sau đó lập bảng đối chiếu Mục tiêu → Nội dung → Phương pháp → Sản phẩm → Chỉ tiêu,   đánh dấu ⚠ chỗ không khớp. Xuất tệp .docx.</w:t>
+        <w:t xml:space="preserve">Từ thuyết minh đã duyệt, lập: (1) bảng nội dung công việc – sản phẩm – thời gian – người   thực hiện; (2) sơ đồ Gantt; (3) dự toán theo biểu mẫu [tên], dùng ĐÚNG đơn giá và định mức   tôi cung cấp, không tự đặt đơn giá; (4) kiểm tra logic trình tự và tổng kinh phí;   liệt kê bất hợp lý và đề xuất điều chỉnh. Xuất Word và Excel.</w:t>
       </w:r>
       <w:r>
         <w:t xml:space="preserve"> </w:t>
@@ -9453,13 +9484,35 @@
           <w:bCs/>
           <w:b/>
         </w:rPr>
-        <w:t xml:space="preserve">Kết quả mong đợi:</w:t>
-      </w:r>
-      <w:r>
-        <w:t xml:space="preserve"> </w:t>
-      </w:r>
-      <w:r>
-        <w:t xml:space="preserve">biểu mẫu đã điền đúng cấu trúc; danh sách [CẦN BỔ SUNG]; bảng đối chiếu có dấu ⚠</w:t>
+        <w:t xml:space="preserve">Minh họa phát hiện lỗi</w:t>
+      </w:r>
+      <w:r>
+        <w:t xml:space="preserve"> </w:t>
+      </w:r>
+      <w:r>
+        <w:t xml:space="preserve">(dữ liệu giả lập): AI tìm ra 3 bất hợp lý cài sẵn – thu mẫu trước khi lắp xong giá phơi mẫu; quan trắc khí tượng kết thúc trước mốc thu mẫu cuối; công bố trước khi mô hình xong</w:t>
+      </w:r>
+      <w:r>
+        <w:t xml:space="preserve"> </w:t>
+      </w:r>
+      <w:r>
+        <w:t xml:space="preserve">-</w:t>
+      </w:r>
+      <w:r>
+        <w:t xml:space="preserve"> </w:t>
+      </w:r>
+      <w:r>
+        <w:rPr>
+          <w:bCs/>
+          <w:b/>
+        </w:rPr>
+        <w:t xml:space="preserve">Căn cứ lập dự toán:</w:t>
+      </w:r>
+      <w:r>
+        <w:t xml:space="preserve"> </w:t>
+      </w:r>
+      <w:r>
+        <w:t xml:space="preserve">Thông tư 03/2023/TT-BTC (định mức tối đa cho nhiệm vụ KH&amp;CN dùng ngân sách nhà nước) và quy định riêng của Bộ Quốc phòng, Trung tâm</w:t>
       </w:r>
       <w:r>
         <w:t xml:space="preserve"> </w:t>
@@ -9475,13 +9528,13 @@
           <w:bCs/>
           <w:b/>
         </w:rPr>
-        <w:t xml:space="preserve">Nhà khoa học xác nhận:</w:t>
-      </w:r>
-      <w:r>
-        <w:t xml:space="preserve"> </w:t>
-      </w:r>
-      <w:r>
-        <w:t xml:space="preserve">tính mới, tính khả thi, chỉ tiêu</w:t>
+        <w:t xml:space="preserve">Xác nhận:</w:t>
+      </w:r>
+      <w:r>
+        <w:t xml:space="preserve"> </w:t>
+      </w:r>
+      <w:r>
+        <w:t xml:space="preserve">số liệu tài chính do cán bộ tài chính xác nhận</w:t>
       </w:r>
     </w:p>
     <w:p>
@@ -9493,29 +9546,25 @@
           <w:bCs/>
           <w:b/>
         </w:rPr>
-        <w:t xml:space="preserve">⚠ Dữ liệu khi chạy trước demo:</w:t>
-      </w:r>
-      <w:r>
-        <w:t xml:space="preserve"> </w:t>
-      </w:r>
-      <w:r>
-        <w:t xml:space="preserve">biểu mẫu trống = nhóm xanh;</w:t>
-      </w:r>
-      <w:r>
-        <w:t xml:space="preserve"> </w:t>
-      </w:r>
-      <w:r>
-        <w:rPr>
-          <w:bCs/>
-          <w:b/>
-        </w:rPr>
-        <w:t xml:space="preserve">nội dung đề xuất thật = nhóm vàng</w:t>
-      </w:r>
-      <w:r>
-        <w:t xml:space="preserve"> </w:t>
-      </w:r>
-      <w:r>
-        <w:t xml:space="preserve">→ chỉ dùng tài khoản gói tổ chức (không huấn luyện mô hình), hoặc dùng nội dung đề xuất giả định cho ảnh trình chiếu.</w:t>
+        <w:t xml:space="preserve">Hình ảnh:</w:t>
+      </w:r>
+      <w:r>
+        <w:t xml:space="preserve"> </w:t>
+      </w:r>
+      <w:r>
+        <w:t xml:space="preserve">biểu mẫu đã điền;</w:t>
+      </w:r>
+      <w:r>
+        <w:t xml:space="preserve"> </w:t>
+      </w:r>
+      <w:r>
+        <w:rPr>
+          <w:rStyle w:val="VerbatimChar"/>
+        </w:rPr>
+        <w:t xml:space="preserve">thuyet-trinh/ket-qua-demo/gia-lap/so_do_gantt.png</w:t>
+      </w:r>
+      <w:r>
+        <w:t xml:space="preserve">.</w:t>
       </w:r>
     </w:p>
     <w:p>
@@ -9527,13 +9576,13 @@
           <w:bCs/>
           <w:b/>
         </w:rPr>
-        <w:t xml:space="preserve">Hình ảnh:</w:t>
-      </w:r>
-      <w:r>
-        <w:t xml:space="preserve"> </w:t>
-      </w:r>
-      <w:r>
-        <w:t xml:space="preserve">ảnh chụp bảng đối chiếu có dấu ⚠.</w:t>
+        <w:t xml:space="preserve">Việc phải làm:</w:t>
+      </w:r>
+      <w:r>
+        <w:t xml:space="preserve"> </w:t>
+      </w:r>
+      <w:r>
+        <w:t xml:space="preserve">người trình bày gửi biểu mẫu thuyết minh – tiến độ – dự toán; xác nhận văn bản định mức áp dụng trong Bộ Quốc phòng.</w:t>
       </w:r>
     </w:p>
     <w:p>
@@ -9545,13 +9594,13 @@
           <w:bCs/>
           <w:b/>
         </w:rPr>
-        <w:t xml:space="preserve">Việc phải làm:</w:t>
-      </w:r>
-      <w:r>
-        <w:t xml:space="preserve"> </w:t>
-      </w:r>
-      <w:r>
-        <w:t xml:space="preserve">người trình bày gửi biểu mẫu của Trung tâm → chạy thử 2 lần, ghi hình lần chạy tốt nhất.</w:t>
+        <w:t xml:space="preserve">Nguồn:</w:t>
+      </w:r>
+      <w:r>
+        <w:t xml:space="preserve"> </w:t>
+      </w:r>
+      <w:r>
+        <w:t xml:space="preserve">N26 (Thông tư 03/2023/TT-BTC)</w:t>
       </w:r>
     </w:p>
     <w:p>
@@ -9590,13 +9639,13 @@
       </w:r>
     </w:p>
     <w:bookmarkEnd w:id="40"/>
-    <w:bookmarkStart w:id="41" w:name="X04139c6c9f22e69b4fed779d765a15c1fb6457c"/>
+    <w:bookmarkStart w:id="41" w:name="X8c20f6305ee0f6c27695dc896bfe47eccb1cecf"/>
     <w:p>
       <w:pPr>
         <w:pStyle w:val="Heading2"/>
       </w:pPr>
       <w:r>
-        <w:t xml:space="preserve">Slide 15 – Hồ sơ nhiệm vụ: thuyết minh, tiến độ và kinh phí theo biểu mẫu Trung tâm (4′)</w:t>
+        <w:t xml:space="preserve">Slide 15 – Hướng dẫn xử lý dữ liệu với AI: quy trình 5 bước (4′) 🆕</w:t>
       </w:r>
     </w:p>
     <w:p>
@@ -9609,572 +9658,6 @@
           <w:b/>
         </w:rPr>
         <w:t xml:space="preserve">Chữ trên slide:</w:t>
-      </w:r>
-      <w:r>
-        <w:t xml:space="preserve"> </w:t>
-      </w:r>
-      <w:r>
-        <w:t xml:space="preserve">- 🎬</w:t>
-      </w:r>
-      <w:r>
-        <w:t xml:space="preserve"> </w:t>
-      </w:r>
-      <w:r>
-        <w:rPr>
-          <w:bCs/>
-          <w:b/>
-        </w:rPr>
-        <w:t xml:space="preserve">Kết quả demo đã chạy trước:</w:t>
-      </w:r>
-      <w:r>
-        <w:t xml:space="preserve"> </w:t>
-      </w:r>
-      <w:r>
-        <w:t xml:space="preserve">biểu mẫu thuyết minh – tiến độ – dự toán của Trung tâm được AI lập từ thuyết minh đã duyệt</w:t>
-      </w:r>
-      <w:r>
-        <w:t xml:space="preserve"> </w:t>
-      </w:r>
-      <w:r>
-        <w:t xml:space="preserve">- ⌨</w:t>
-      </w:r>
-      <w:r>
-        <w:t xml:space="preserve"> </w:t>
-      </w:r>
-      <w:r>
-        <w:rPr>
-          <w:bCs/>
-          <w:b/>
-        </w:rPr>
-        <w:t xml:space="preserve">Câu lệnh:</w:t>
-      </w:r>
-      <w:r>
-        <w:t xml:space="preserve"> </w:t>
-      </w:r>
-      <w:r>
-        <w:rPr>
-          <w:rStyle w:val="VerbatimChar"/>
-        </w:rPr>
-        <w:t xml:space="preserve">Từ thuyết minh đã duyệt, lập: (1) bảng nội dung công việc – sản phẩm – thời gian – người   thực hiện; (2) sơ đồ Gantt; (3) dự toán theo biểu mẫu [tên], dùng ĐÚNG đơn giá và định mức   tôi cung cấp, không tự đặt đơn giá; (4) kiểm tra logic trình tự và tổng kinh phí;   liệt kê bất hợp lý và đề xuất điều chỉnh. Xuất Word và Excel.</w:t>
-      </w:r>
-      <w:r>
-        <w:t xml:space="preserve"> </w:t>
-      </w:r>
-      <w:r>
-        <w:t xml:space="preserve">- 📊</w:t>
-      </w:r>
-      <w:r>
-        <w:t xml:space="preserve"> </w:t>
-      </w:r>
-      <w:r>
-        <w:rPr>
-          <w:bCs/>
-          <w:b/>
-        </w:rPr>
-        <w:t xml:space="preserve">Minh họa phát hiện lỗi</w:t>
-      </w:r>
-      <w:r>
-        <w:t xml:space="preserve"> </w:t>
-      </w:r>
-      <w:r>
-        <w:t xml:space="preserve">(dữ liệu giả lập): AI tìm ra 3 bất hợp lý cài sẵn – thu mẫu trước khi lắp xong giá phơi mẫu; quan trắc khí tượng kết thúc trước mốc thu mẫu cuối; công bố trước khi mô hình xong</w:t>
-      </w:r>
-      <w:r>
-        <w:t xml:space="preserve"> </w:t>
-      </w:r>
-      <w:r>
-        <w:t xml:space="preserve">-</w:t>
-      </w:r>
-      <w:r>
-        <w:t xml:space="preserve"> </w:t>
-      </w:r>
-      <w:r>
-        <w:rPr>
-          <w:bCs/>
-          <w:b/>
-        </w:rPr>
-        <w:t xml:space="preserve">Căn cứ lập dự toán:</w:t>
-      </w:r>
-      <w:r>
-        <w:t xml:space="preserve"> </w:t>
-      </w:r>
-      <w:r>
-        <w:t xml:space="preserve">Thông tư 03/2023/TT-BTC (định mức tối đa cho nhiệm vụ KH&amp;CN dùng ngân sách nhà nước) và quy định riêng của Bộ Quốc phòng, Trung tâm</w:t>
-      </w:r>
-      <w:r>
-        <w:t xml:space="preserve"> </w:t>
-      </w:r>
-      <w:r>
-        <w:t xml:space="preserve">- ✅</w:t>
-      </w:r>
-      <w:r>
-        <w:t xml:space="preserve"> </w:t>
-      </w:r>
-      <w:r>
-        <w:rPr>
-          <w:bCs/>
-          <w:b/>
-        </w:rPr>
-        <w:t xml:space="preserve">Xác nhận:</w:t>
-      </w:r>
-      <w:r>
-        <w:t xml:space="preserve"> </w:t>
-      </w:r>
-      <w:r>
-        <w:t xml:space="preserve">số liệu tài chính do cán bộ tài chính xác nhận</w:t>
-      </w:r>
-    </w:p>
-    <w:p>
-      <w:pPr>
-        <w:pStyle w:val="BodyText"/>
-      </w:pPr>
-      <w:r>
-        <w:rPr>
-          <w:bCs/>
-          <w:b/>
-        </w:rPr>
-        <w:t xml:space="preserve">Hình ảnh:</w:t>
-      </w:r>
-      <w:r>
-        <w:t xml:space="preserve"> </w:t>
-      </w:r>
-      <w:r>
-        <w:t xml:space="preserve">biểu mẫu đã điền;</w:t>
-      </w:r>
-      <w:r>
-        <w:t xml:space="preserve"> </w:t>
-      </w:r>
-      <w:r>
-        <w:rPr>
-          <w:rStyle w:val="VerbatimChar"/>
-        </w:rPr>
-        <w:t xml:space="preserve">thuyet-trinh/ket-qua-demo/gia-lap/so_do_gantt.png</w:t>
-      </w:r>
-      <w:r>
-        <w:t xml:space="preserve">.</w:t>
-      </w:r>
-    </w:p>
-    <w:p>
-      <w:pPr>
-        <w:pStyle w:val="BodyText"/>
-      </w:pPr>
-      <w:r>
-        <w:rPr>
-          <w:bCs/>
-          <w:b/>
-        </w:rPr>
-        <w:t xml:space="preserve">Việc phải làm:</w:t>
-      </w:r>
-      <w:r>
-        <w:t xml:space="preserve"> </w:t>
-      </w:r>
-      <w:r>
-        <w:t xml:space="preserve">người trình bày gửi biểu mẫu thuyết minh – tiến độ – dự toán; xác nhận văn bản định mức áp dụng trong Bộ Quốc phòng.</w:t>
-      </w:r>
-    </w:p>
-    <w:p>
-      <w:pPr>
-        <w:pStyle w:val="BodyText"/>
-      </w:pPr>
-      <w:r>
-        <w:rPr>
-          <w:bCs/>
-          <w:b/>
-        </w:rPr>
-        <w:t xml:space="preserve">Nguồn:</w:t>
-      </w:r>
-      <w:r>
-        <w:t xml:space="preserve"> </w:t>
-      </w:r>
-      <w:r>
-        <w:t xml:space="preserve">N26 (Thông tư 03/2023/TT-BTC)</w:t>
-      </w:r>
-    </w:p>
-    <w:p>
-      <w:pPr>
-        <w:pStyle w:val="BodyText"/>
-      </w:pPr>
-      <w:r>
-        <w:rPr>
-          <w:bCs/>
-          <w:b/>
-        </w:rPr>
-        <w:t xml:space="preserve">Duyệt:</w:t>
-      </w:r>
-      <w:r>
-        <w:t xml:space="preserve"> </w:t>
-      </w:r>
-      <w:r>
-        <w:t xml:space="preserve">[ ] Duyệt · [ ] Sửa · [ ] Bỏ</w:t>
-      </w:r>
-      <w:r>
-        <w:t xml:space="preserve"> </w:t>
-      </w:r>
-      <w:r>
-        <w:rPr>
-          <w:bCs/>
-          <w:b/>
-        </w:rPr>
-        <w:t xml:space="preserve">Ghi chú:</w:t>
-      </w:r>
-    </w:p>
-    <w:p>
-      <w:r>
-        <w:pict>
-          <v:rect style="width:0;height:1.5pt" o:hralign="center" o:hrstd="t" o:hr="t"/>
-        </w:pict>
-      </w:r>
-    </w:p>
-    <w:bookmarkEnd w:id="41"/>
-    <w:bookmarkStart w:id="42" w:name="Xae2fbca96bcb46ff2b706302da1d5a4147a88ee"/>
-    <w:p>
-      <w:pPr>
-        <w:pStyle w:val="Heading2"/>
-      </w:pPr>
-      <w:r>
-        <w:t xml:space="preserve">Slide 16 – Xử lý dữ liệu: AI viết và chạy mã Python – DEMO 2 (6′)</w:t>
-      </w:r>
-    </w:p>
-    <w:p>
-      <w:pPr>
-        <w:pStyle w:val="FirstParagraph"/>
-      </w:pPr>
-      <w:r>
-        <w:rPr>
-          <w:bCs/>
-          <w:b/>
-        </w:rPr>
-        <w:t xml:space="preserve">Chữ trên slide:</w:t>
-      </w:r>
-      <w:r>
-        <w:t xml:space="preserve"> </w:t>
-      </w:r>
-      <w:r>
-        <w:t xml:space="preserve">- 🌍</w:t>
-      </w:r>
-      <w:r>
-        <w:t xml:space="preserve"> </w:t>
-      </w:r>
-      <w:r>
-        <w:rPr>
-          <w:bCs/>
-          <w:b/>
-        </w:rPr>
-        <w:t xml:space="preserve">Ví dụ thật:</w:t>
-      </w:r>
-      <w:r>
-        <w:t xml:space="preserve"> </w:t>
-      </w:r>
-      <w:r>
-        <w:t xml:space="preserve">ERA (Google,</w:t>
-      </w:r>
-      <w:r>
-        <w:t xml:space="preserve"> </w:t>
-      </w:r>
-      <w:r>
-        <w:rPr>
-          <w:iCs/>
-          <w:i/>
-        </w:rPr>
-        <w:t xml:space="preserve">Nature</w:t>
-      </w:r>
-      <w:r>
-        <w:t xml:space="preserve"> </w:t>
-      </w:r>
-      <w:r>
-        <w:t xml:space="preserve">2026) – AI tự viết, chạy, chấm điểm, cải tiến mã</w:t>
-      </w:r>
-      <w:r>
-        <w:t xml:space="preserve"> </w:t>
-      </w:r>
-      <w:r>
-        <w:t xml:space="preserve">-</w:t>
-      </w:r>
-      <w:r>
-        <w:t xml:space="preserve"> </w:t>
-      </w:r>
-      <w:r>
-        <w:rPr>
-          <w:bCs/>
-          <w:b/>
-        </w:rPr>
-        <w:t xml:space="preserve">Nhà khoa học không cần biết lập trình:</w:t>
-      </w:r>
-      <w:r>
-        <w:t xml:space="preserve"> </w:t>
-      </w:r>
-      <w:r>
-        <w:t xml:space="preserve">mô tả việc cần làm → AI viết mã Python → chạy → trả bảng, biểu đồ,</w:t>
-      </w:r>
-      <w:r>
-        <w:t xml:space="preserve"> </w:t>
-      </w:r>
-      <w:r>
-        <w:rPr>
-          <w:bCs/>
-          <w:b/>
-        </w:rPr>
-        <w:t xml:space="preserve">kèm mã để tái lập</w:t>
-      </w:r>
-      <w:r>
-        <w:t xml:space="preserve"> </w:t>
-      </w:r>
-      <w:r>
-        <w:t xml:space="preserve">- ⌨</w:t>
-      </w:r>
-      <w:r>
-        <w:t xml:space="preserve"> </w:t>
-      </w:r>
-      <w:r>
-        <w:rPr>
-          <w:bCs/>
-          <w:b/>
-        </w:rPr>
-        <w:t xml:space="preserve">Câu lệnh đã dùng:</w:t>
-      </w:r>
-      <w:r>
-        <w:t xml:space="preserve"> </w:t>
-      </w:r>
-      <w:r>
-        <w:t xml:space="preserve">rà soát dữ liệu → tính toán và lập mô hình → vẽ biểu đồ</w:t>
-      </w:r>
-      <w:r>
-        <w:t xml:space="preserve"> </w:t>
-      </w:r>
-      <w:r>
-        <w:t xml:space="preserve">- 📊</w:t>
-      </w:r>
-      <w:r>
-        <w:t xml:space="preserve"> </w:t>
-      </w:r>
-      <w:r>
-        <w:rPr>
-          <w:bCs/>
-          <w:b/>
-        </w:rPr>
-        <w:t xml:space="preserve">Kết quả:</w:t>
-      </w:r>
-      <w:r>
-        <w:t xml:space="preserve"> </w:t>
-      </w:r>
-      <w:r>
-        <w:t xml:space="preserve">- Dữ liệu giả lập: phát hiện đủ</w:t>
-      </w:r>
-      <w:r>
-        <w:t xml:space="preserve"> </w:t>
-      </w:r>
-      <w:r>
-        <w:rPr>
-          <w:bCs/>
-          <w:b/>
-        </w:rPr>
-        <w:t xml:space="preserve">14/14 lỗi</w:t>
-      </w:r>
-      <w:r>
-        <w:t xml:space="preserve"> </w:t>
-      </w:r>
-      <w:r>
-        <w:t xml:space="preserve">cài sẵn; thép CT3 ven biển C4 · đô thị C3 · nội địa C2</w:t>
-      </w:r>
-      <w:r>
-        <w:t xml:space="preserve"> </w:t>
-      </w:r>
-      <w:r>
-        <w:t xml:space="preserve">- Dữ liệu thật (387 số đo): kết quả chính đã nêu ở Slide 9; mô hình 3D ở Slide 17</w:t>
-      </w:r>
-      <w:r>
-        <w:t xml:space="preserve"> </w:t>
-      </w:r>
-      <w:r>
-        <w:t xml:space="preserve">- 💡</w:t>
-      </w:r>
-      <w:r>
-        <w:t xml:space="preserve"> </w:t>
-      </w:r>
-      <w:r>
-        <w:rPr>
-          <w:bCs/>
-          <w:b/>
-        </w:rPr>
-        <w:t xml:space="preserve">Bài học:</w:t>
-      </w:r>
-      <w:r>
-        <w:t xml:space="preserve"> </w:t>
-      </w:r>
-      <w:r>
-        <w:t xml:space="preserve">AI viết mã rất nhanh – nhưng cách tìm số đo bất thường AI chọn lần đầu đánh dấu nhầm 20 giá trị bình thường và bỏ sót lỗi gõ nhầm; chọn phương pháp phù hợp với thiết kế thí nghiệm (3 mẫu lặp) là việc của người làm chuyên môn</w:t>
-      </w:r>
-    </w:p>
-    <w:p>
-      <w:pPr>
-        <w:pStyle w:val="BodyText"/>
-      </w:pPr>
-      <w:r>
-        <w:rPr>
-          <w:bCs/>
-          <w:b/>
-        </w:rPr>
-        <w:t xml:space="preserve">Hình ảnh:</w:t>
-      </w:r>
-      <w:r>
-        <w:t xml:space="preserve"> </w:t>
-      </w:r>
-      <w:r>
-        <w:rPr>
-          <w:rStyle w:val="VerbatimChar"/>
-        </w:rPr>
-        <w:t xml:space="preserve">thuyet-trinh/ket-qua-demo/gia-lap/bieu_do_dong_hoc_an_mon.png</w:t>
-      </w:r>
-      <w:r>
-        <w:t xml:space="preserve">;</w:t>
-      </w:r>
-      <w:r>
-        <w:t xml:space="preserve"> </w:t>
-      </w:r>
-      <w:r>
-        <w:rPr>
-          <w:rStyle w:val="VerbatimChar"/>
-        </w:rPr>
-        <w:t xml:space="preserve">du-an-nghien-cuu/05-ket-qua/hinh/do_vs_du_doan.png</w:t>
-      </w:r>
-      <w:r>
-        <w:t xml:space="preserve">;</w:t>
-      </w:r>
-      <w:r>
-        <w:t xml:space="preserve"> </w:t>
-      </w:r>
-      <w:r>
-        <w:rPr>
-          <w:rStyle w:val="VerbatimChar"/>
-        </w:rPr>
-        <w:t xml:space="preserve">du-an-nghien-cuu/05-ket-qua/mo-hinh-3d/3D_3_be_mat_tam_thep.png</w:t>
-      </w:r>
-      <w:r>
-        <w:t xml:space="preserve">.</w:t>
-      </w:r>
-    </w:p>
-    <w:p>
-      <w:pPr>
-        <w:pStyle w:val="BodyText"/>
-      </w:pPr>
-      <w:r>
-        <w:rPr>
-          <w:bCs/>
-          <w:b/>
-        </w:rPr>
-        <w:t xml:space="preserve">🎬 Trình chiếu:</w:t>
-      </w:r>
-      <w:r>
-        <w:t xml:space="preserve"> </w:t>
-      </w:r>
-      <w:r>
-        <w:t xml:space="preserve">video ghi sẵn ~2 phút (câu lệnh 4.2 → 4.3 → 4.4 tua nhanh) + ảnh báo cáo chất lượng dữ liệu.</w:t>
-      </w:r>
-    </w:p>
-    <w:p>
-      <w:pPr>
-        <w:pStyle w:val="BodyText"/>
-      </w:pPr>
-      <w:r>
-        <w:rPr>
-          <w:bCs/>
-          <w:b/>
-        </w:rPr>
-        <w:t xml:space="preserve">Nguồn:</w:t>
-      </w:r>
-      <w:r>
-        <w:t xml:space="preserve"> </w:t>
-      </w:r>
-      <w:r>
-        <w:t xml:space="preserve">G5 ·</w:t>
-      </w:r>
-      <w:r>
-        <w:t xml:space="preserve"> </w:t>
-      </w:r>
-      <w:r>
-        <w:rPr>
-          <w:rStyle w:val="VerbatimChar"/>
-        </w:rPr>
-        <w:t xml:space="preserve">du-an-nghien-cuu/07-bao-cao/BAO-CAO-TONG-HOP.md</w:t>
-      </w:r>
-    </w:p>
-    <w:p>
-      <w:pPr>
-        <w:pStyle w:val="BodyText"/>
-      </w:pPr>
-      <w:r>
-        <w:rPr>
-          <w:bCs/>
-          <w:b/>
-        </w:rPr>
-        <w:t xml:space="preserve">Duyệt:</w:t>
-      </w:r>
-      <w:r>
-        <w:t xml:space="preserve"> </w:t>
-      </w:r>
-      <w:r>
-        <w:t xml:space="preserve">[ ] Duyệt · [ ] Sửa · [ ] Bỏ</w:t>
-      </w:r>
-      <w:r>
-        <w:t xml:space="preserve"> </w:t>
-      </w:r>
-      <w:r>
-        <w:rPr>
-          <w:bCs/>
-          <w:b/>
-        </w:rPr>
-        <w:t xml:space="preserve">Ghi chú:</w:t>
-      </w:r>
-    </w:p>
-    <w:p>
-      <w:r>
-        <w:pict>
-          <v:rect style="width:0;height:1.5pt" o:hralign="center" o:hrstd="t" o:hr="t"/>
-        </w:pict>
-      </w:r>
-    </w:p>
-    <w:bookmarkEnd w:id="42"/>
-    <w:bookmarkStart w:id="43" w:name="X834e235100fb9429d0e71671f229adf457c23df"/>
-    <w:p>
-      <w:pPr>
-        <w:pStyle w:val="Heading2"/>
-      </w:pPr>
-      <w:r>
-        <w:t xml:space="preserve">Slide 17 – Mô hình 3D: mô phỏng quá trình ăn mòn vật liệu theo thời gian (3′)</w:t>
-      </w:r>
-    </w:p>
-    <w:p>
-      <w:pPr>
-        <w:pStyle w:val="FirstParagraph"/>
-      </w:pPr>
-      <w:r>
-        <w:rPr>
-          <w:bCs/>
-          <w:b/>
-        </w:rPr>
-        <w:t xml:space="preserve">Chữ trên slide:</w:t>
-      </w:r>
-      <w:r>
-        <w:t xml:space="preserve"> </w:t>
-      </w:r>
-      <w:r>
-        <w:t xml:space="preserve">-</w:t>
-      </w:r>
-      <w:r>
-        <w:t xml:space="preserve"> </w:t>
-      </w:r>
-      <w:r>
-        <w:rPr>
-          <w:bCs/>
-          <w:b/>
-        </w:rPr>
-        <w:t xml:space="preserve">Từ con số đến hình ảnh:</w:t>
-      </w:r>
-      <w:r>
-        <w:t xml:space="preserve"> </w:t>
-      </w:r>
-      <w:r>
-        <w:t xml:space="preserve">AI viết mã dựng mô hình 3D tương tác – mở bằng trình duyệt, xoay, phóng to, bấm ▶ để xem ăn mòn diễn ra theo từng năm</w:t>
       </w:r>
     </w:p>
     <w:tbl>
@@ -10201,121 +9684,69 @@
               <w:jc w:val="left"/>
             </w:pPr>
             <w:r>
-              <w:t xml:space="preserve">Mô hình</w:t>
-            </w:r>
-          </w:p>
-        </w:tc>
-        <w:tc>
-          <w:tcPr/>
-          <w:p>
-            <w:pPr>
-              <w:pStyle w:val="Compact"/>
-              <w:jc w:val="left"/>
-            </w:pPr>
-            <w:r>
-              <w:t xml:space="preserve">Mô tả</w:t>
-            </w:r>
-          </w:p>
-        </w:tc>
-        <w:tc>
-          <w:tcPr/>
-          <w:p>
-            <w:pPr>
-              <w:pStyle w:val="Compact"/>
-              <w:jc w:val="left"/>
-            </w:pPr>
-            <w:r>
-              <w:t xml:space="preserve">Căn cứ</w:t>
-            </w:r>
-          </w:p>
-        </w:tc>
-      </w:tr>
-      <w:tr>
-        <w:tc>
-          <w:tcPr/>
-          <w:p>
-            <w:pPr>
-              <w:pStyle w:val="Compact"/>
-              <w:jc w:val="left"/>
-            </w:pPr>
-            <w:r>
-              <w:t xml:space="preserve">Mặt đáp ứng</w:t>
-            </w:r>
-          </w:p>
-        </w:tc>
-        <w:tc>
-          <w:tcPr/>
-          <w:p>
-            <w:pPr>
-              <w:pStyle w:val="Compact"/>
-              <w:jc w:val="left"/>
-            </w:pPr>
-            <w:r>
-              <w:t xml:space="preserve">Tốc độ ăn mòn năm đầu theo clorua và thời gian ẩm ướt – Việt Nam, Nga; điểm = số đo thật</w:t>
-            </w:r>
-          </w:p>
-        </w:tc>
-        <w:tc>
-          <w:tcPr/>
-          <w:p>
-            <w:pPr>
-              <w:pStyle w:val="Compact"/>
-              <w:jc w:val="left"/>
-            </w:pPr>
-            <w:r>
-              <w:t xml:space="preserve">Hàm liều – đáp ứng hiệu chỉnh vùng, 387 số đo</w:t>
-            </w:r>
-          </w:p>
-        </w:tc>
-      </w:tr>
-      <w:tr>
-        <w:tc>
-          <w:tcPr/>
-          <w:p>
-            <w:pPr>
-              <w:pStyle w:val="Compact"/>
-              <w:jc w:val="left"/>
-            </w:pPr>
-            <w:r>
-              <w:t xml:space="preserve">Diễn tiến theo thời gian</w:t>
-            </w:r>
-          </w:p>
-        </w:tc>
-        <w:tc>
-          <w:tcPr/>
-          <w:p>
-            <w:pPr>
-              <w:pStyle w:val="Compact"/>
-              <w:jc w:val="left"/>
-            </w:pPr>
-            <w:r>
-              <w:t xml:space="preserve">Chiều dày thép mất theo năm và mức clorua</w:t>
-            </w:r>
-          </w:p>
-        </w:tc>
-        <w:tc>
-          <w:tcPr/>
-          <w:p>
-            <w:pPr>
-              <w:pStyle w:val="Compact"/>
-              <w:jc w:val="left"/>
-            </w:pPr>
-            <w:r>
-              <w:t xml:space="preserve">ISO 9224: D = r·t^b, b = 0,523</w:t>
-            </w:r>
-          </w:p>
-        </w:tc>
-      </w:tr>
-      <w:tr>
-        <w:tc>
-          <w:tcPr/>
-          <w:p>
-            <w:pPr>
-              <w:pStyle w:val="Compact"/>
-              <w:jc w:val="left"/>
-            </w:pPr>
-            <w:r>
-              <w:t xml:space="preserve">🆕</w:t>
+              <w:t xml:space="preserve">Bước</w:t>
+            </w:r>
+          </w:p>
+        </w:tc>
+        <w:tc>
+          <w:tcPr/>
+          <w:p>
+            <w:pPr>
+              <w:pStyle w:val="Compact"/>
+              <w:jc w:val="left"/>
+            </w:pPr>
+            <w:r>
+              <w:t xml:space="preserve">AI làm</w:t>
+            </w:r>
+          </w:p>
+        </w:tc>
+        <w:tc>
+          <w:tcPr/>
+          <w:p>
+            <w:pPr>
+              <w:pStyle w:val="Compact"/>
+              <w:jc w:val="left"/>
+            </w:pPr>
+            <w:r>
+              <w:t xml:space="preserve">Nhà khoa học kiểm soát</w:t>
+            </w:r>
+          </w:p>
+        </w:tc>
+      </w:tr>
+      <w:tr>
+        <w:tc>
+          <w:tcPr/>
+          <w:p>
+            <w:pPr>
+              <w:pStyle w:val="Compact"/>
+              <w:jc w:val="left"/>
+            </w:pPr>
+            <w:r>
+              <w:t xml:space="preserve">1. Chuẩn bị dữ liệu</w:t>
+            </w:r>
+          </w:p>
+        </w:tc>
+        <w:tc>
+          <w:tcPr/>
+          <w:p>
+            <w:pPr>
+              <w:pStyle w:val="Compact"/>
+              <w:jc w:val="left"/>
+            </w:pPr>
+            <w:r>
+              <w:t xml:space="preserve">Đọc tệp, mô tả cấu trúc: số dòng, tên cột, đơn vị, nguồn</w:t>
+            </w:r>
+          </w:p>
+        </w:tc>
+        <w:tc>
+          <w:tcPr/>
+          <w:p>
+            <w:pPr>
+              <w:pStyle w:val="Compact"/>
+              <w:jc w:val="left"/>
+            </w:pPr>
+            <w:r>
+              <w:t xml:space="preserve">Giữ</w:t>
             </w:r>
             <w:r>
               <w:t xml:space="preserve"> </w:t>
@@ -10325,79 +9756,179 @@
                 <w:bCs/>
                 <w:b/>
               </w:rPr>
-              <w:t xml:space="preserve">Quá trình ăn mòn (hoạt hình)</w:t>
-            </w:r>
-          </w:p>
-        </w:tc>
-        <w:tc>
-          <w:tcPr/>
-          <w:p>
-            <w:pPr>
-              <w:pStyle w:val="Compact"/>
-              <w:jc w:val="left"/>
-            </w:pPr>
-            <w:r>
-              <w:t xml:space="preserve">Khối mẫu thép tại Nha Trang, 0 → 30 năm: bề mặt kim loại hạ dần, lớp gỉ dày lên, hố ăn mòn sâu dần; kèm mặt cắt</w:t>
-            </w:r>
-          </w:p>
-        </w:tc>
-        <w:tc>
-          <w:tcPr/>
-          <w:p>
-            <w:pPr>
-              <w:pStyle w:val="Compact"/>
-              <w:jc w:val="left"/>
-            </w:pPr>
-            <w:r>
-              <w:t xml:space="preserve">D(t) từ số đo r = 40,6 µm/năm; hình dạng gỉ, hố: minh họa</w:t>
-            </w:r>
-          </w:p>
-        </w:tc>
-      </w:tr>
-      <w:tr>
-        <w:tc>
-          <w:tcPr/>
-          <w:p>
-            <w:pPr>
-              <w:pStyle w:val="Compact"/>
-              <w:jc w:val="left"/>
-            </w:pPr>
-            <w:r>
-              <w:t xml:space="preserve">🆕</w:t>
-            </w:r>
-            <w:r>
-              <w:t xml:space="preserve"> </w:t>
-            </w:r>
+              <w:t xml:space="preserve">bản gốc chỉ đọc</w:t>
+            </w:r>
+            <w:r>
+              <w:t xml:space="preserve">; lập từ điển dữ liệu; chỉ đưa dữ liệu được phép</w:t>
+            </w:r>
+          </w:p>
+        </w:tc>
+      </w:tr>
+      <w:tr>
+        <w:tc>
+          <w:tcPr/>
+          <w:p>
+            <w:pPr>
+              <w:pStyle w:val="Compact"/>
+              <w:jc w:val="left"/>
+            </w:pPr>
+            <w:r>
+              <w:t xml:space="preserve">2. Kiểm tra chất lượng</w:t>
+            </w:r>
+          </w:p>
+        </w:tc>
+        <w:tc>
+          <w:tcPr/>
+          <w:p>
+            <w:pPr>
+              <w:pStyle w:val="Compact"/>
+              <w:jc w:val="left"/>
+            </w:pPr>
+            <w:r>
+              <w:t xml:space="preserve">Tìm dòng trùng, ô trống, sai định dạng, sai đơn vị, giá trị bất thường → báo cáo</w:t>
+            </w:r>
+          </w:p>
+        </w:tc>
+        <w:tc>
+          <w:tcPr/>
+          <w:p>
+            <w:pPr>
+              <w:pStyle w:val="Compact"/>
+              <w:jc w:val="left"/>
+            </w:pPr>
             <w:r>
               <w:rPr>
                 <w:bCs/>
                 <w:b/>
               </w:rPr>
-              <w:t xml:space="preserve">So sánh vật liệu</w:t>
-            </w:r>
-          </w:p>
-        </w:tc>
-        <w:tc>
-          <w:tcPr/>
-          <w:p>
-            <w:pPr>
-              <w:pStyle w:val="Compact"/>
-              <w:jc w:val="left"/>
-            </w:pPr>
-            <w:r>
-              <w:t xml:space="preserve">Thép – kẽm – đồng – nhôm trong cùng cấp ăn mòn C3</w:t>
-            </w:r>
-          </w:p>
-        </w:tc>
-        <w:tc>
-          <w:tcPr/>
-          <w:p>
-            <w:pPr>
-              <w:pStyle w:val="Compact"/>
-              <w:jc w:val="left"/>
-            </w:pPr>
-            <w:r>
-              <w:t xml:space="preserve">ISO 9223 Bảng 2; ISO 9224</w:t>
+              <w:t xml:space="preserve">Chỉ đánh dấu, không tự xóa</w:t>
+            </w:r>
+            <w:r>
+              <w:t xml:space="preserve">; quyết định giữ / loại</w:t>
+            </w:r>
+          </w:p>
+        </w:tc>
+      </w:tr>
+      <w:tr>
+        <w:tc>
+          <w:tcPr/>
+          <w:p>
+            <w:pPr>
+              <w:pStyle w:val="Compact"/>
+              <w:jc w:val="left"/>
+            </w:pPr>
+            <w:r>
+              <w:t xml:space="preserve">3. Phân tích, lập mô hình</w:t>
+            </w:r>
+          </w:p>
+        </w:tc>
+        <w:tc>
+          <w:tcPr/>
+          <w:p>
+            <w:pPr>
+              <w:pStyle w:val="Compact"/>
+              <w:jc w:val="left"/>
+            </w:pPr>
+            <w:r>
+              <w:t xml:space="preserve">Viết và chạy mã Python: thống kê, hồi quy, mô hình theo tiêu chuẩn</w:t>
+            </w:r>
+          </w:p>
+        </w:tc>
+        <w:tc>
+          <w:tcPr/>
+          <w:p>
+            <w:pPr>
+              <w:pStyle w:val="Compact"/>
+              <w:jc w:val="left"/>
+            </w:pPr>
+            <w:r>
+              <w:rPr>
+                <w:bCs/>
+                <w:b/>
+              </w:rPr>
+              <w:t xml:space="preserve">Chọn phương pháp</w:t>
+            </w:r>
+            <w:r>
+              <w:t xml:space="preserve"> </w:t>
+            </w:r>
+            <w:r>
+              <w:t xml:space="preserve">phù hợp thiết kế thí nghiệm; nêu rõ giả định</w:t>
+            </w:r>
+          </w:p>
+        </w:tc>
+      </w:tr>
+      <w:tr>
+        <w:tc>
+          <w:tcPr/>
+          <w:p>
+            <w:pPr>
+              <w:pStyle w:val="Compact"/>
+              <w:jc w:val="left"/>
+            </w:pPr>
+            <w:r>
+              <w:t xml:space="preserve">4. Kiểm định kết quả</w:t>
+            </w:r>
+          </w:p>
+        </w:tc>
+        <w:tc>
+          <w:tcPr/>
+          <w:p>
+            <w:pPr>
+              <w:pStyle w:val="Compact"/>
+              <w:jc w:val="left"/>
+            </w:pPr>
+            <w:r>
+              <w:t xml:space="preserve">Tách tập kiểm định độc lập, tính sai số, so với tiêu chuẩn, số liệu đã công bố</w:t>
+            </w:r>
+          </w:p>
+        </w:tc>
+        <w:tc>
+          <w:tcPr/>
+          <w:p>
+            <w:pPr>
+              <w:pStyle w:val="Compact"/>
+              <w:jc w:val="left"/>
+            </w:pPr>
+            <w:r>
+              <w:t xml:space="preserve">Đánh giá kết quả có hợp lý về chuyên môn</w:t>
+            </w:r>
+          </w:p>
+        </w:tc>
+      </w:tr>
+      <w:tr>
+        <w:tc>
+          <w:tcPr/>
+          <w:p>
+            <w:pPr>
+              <w:pStyle w:val="Compact"/>
+              <w:jc w:val="left"/>
+            </w:pPr>
+            <w:r>
+              <w:t xml:space="preserve">5. Lưu trữ, tái lập</w:t>
+            </w:r>
+          </w:p>
+        </w:tc>
+        <w:tc>
+          <w:tcPr/>
+          <w:p>
+            <w:pPr>
+              <w:pStyle w:val="Compact"/>
+              <w:jc w:val="left"/>
+            </w:pPr>
+            <w:r>
+              <w:t xml:space="preserve">Lưu mã, dữ liệu đã xử lý, nhật ký từng bước</w:t>
+            </w:r>
+          </w:p>
+        </w:tc>
+        <w:tc>
+          <w:tcPr/>
+          <w:p>
+            <w:pPr>
+              <w:pStyle w:val="Compact"/>
+              <w:jc w:val="left"/>
+            </w:pPr>
+            <w:r>
+              <w:t xml:space="preserve">Chạy lại ra cùng kết quả; lưu theo cấu trúc dự án</w:t>
             </w:r>
           </w:p>
         </w:tc>
@@ -10405,172 +9936,58 @@
     </w:tbl>
     <w:p>
       <w:pPr>
-        <w:numPr>
-          <w:ilvl w:val="0"/>
-          <w:numId w:val="1002"/>
-        </w:numPr>
-        <w:pStyle w:val="Compact"/>
-      </w:pPr>
-      <w:r>
-        <w:t xml:space="preserve">📊</w:t>
-      </w:r>
-      <w:r>
-        <w:t xml:space="preserve"> </w:t>
-      </w:r>
-      <w:r>
-        <w:rPr>
-          <w:bCs/>
-          <w:b/>
-        </w:rPr>
-        <w:t xml:space="preserve">Kết quả:</w:t>
-      </w:r>
-    </w:p>
-    <w:p>
-      <w:pPr>
-        <w:numPr>
-          <w:ilvl w:val="1"/>
-          <w:numId w:val="1003"/>
-        </w:numPr>
-        <w:pStyle w:val="Compact"/>
-      </w:pPr>
-      <w:r>
-        <w:t xml:space="preserve">Nha Trang: thép mất trung bình</w:t>
-      </w:r>
-      <w:r>
-        <w:t xml:space="preserve"> </w:t>
-      </w:r>
-      <w:r>
-        <w:rPr>
-          <w:bCs/>
-          <w:b/>
-        </w:rPr>
-        <w:t xml:space="preserve">41 µm</w:t>
-      </w:r>
-      <w:r>
-        <w:t xml:space="preserve"> </w:t>
-      </w:r>
-      <w:r>
-        <w:t xml:space="preserve">sau 1 năm →</w:t>
-      </w:r>
-      <w:r>
-        <w:t xml:space="preserve"> </w:t>
-      </w:r>
-      <w:r>
-        <w:rPr>
-          <w:bCs/>
-          <w:b/>
-        </w:rPr>
-        <w:t xml:space="preserve">135 µm</w:t>
-      </w:r>
-      <w:r>
-        <w:t xml:space="preserve"> </w:t>
-      </w:r>
-      <w:r>
-        <w:t xml:space="preserve">sau 10 năm →</w:t>
-      </w:r>
-      <w:r>
-        <w:t xml:space="preserve"> </w:t>
-      </w:r>
-      <w:r>
-        <w:rPr>
-          <w:bCs/>
-          <w:b/>
-        </w:rPr>
-        <w:t xml:space="preserve">245 µm</w:t>
-      </w:r>
-      <w:r>
-        <w:t xml:space="preserve"> </w:t>
-      </w:r>
-      <w:r>
-        <w:t xml:space="preserve">sau 30 năm (≈ 1.926 g/m²)</w:t>
-      </w:r>
-    </w:p>
-    <w:p>
-      <w:pPr>
-        <w:numPr>
-          <w:ilvl w:val="1"/>
-          <w:numId w:val="1003"/>
-        </w:numPr>
-        <w:pStyle w:val="Compact"/>
-      </w:pPr>
-      <w:r>
-        <w:t xml:space="preserve">Cấp C3, sau 30 năm: thép ≈ 218 µm · kẽm ≈ 20 µm · đồng ≈ 9 µm · nhôm ≈ 5 µm</w:t>
-      </w:r>
-    </w:p>
-    <w:p>
-      <w:pPr>
-        <w:numPr>
-          <w:ilvl w:val="0"/>
-          <w:numId w:val="1002"/>
-        </w:numPr>
-        <w:pStyle w:val="Compact"/>
-      </w:pPr>
-      <w:r>
-        <w:t xml:space="preserve">⚠</w:t>
-      </w:r>
-      <w:r>
-        <w:t xml:space="preserve"> </w:t>
-      </w:r>
-      <w:r>
-        <w:rPr>
-          <w:bCs/>
-          <w:b/>
-        </w:rPr>
-        <w:t xml:space="preserve">Ghi rõ trên hình:</w:t>
-      </w:r>
-      <w:r>
-        <w:t xml:space="preserve"> </w:t>
-      </w:r>
-      <w:r>
-        <w:t xml:space="preserve">phần</w:t>
-      </w:r>
-      <w:r>
-        <w:t xml:space="preserve"> </w:t>
-      </w:r>
-      <w:r>
-        <w:rPr>
-          <w:bCs/>
-          <w:b/>
-        </w:rPr>
-        <w:t xml:space="preserve">định lượng</w:t>
-      </w:r>
-      <w:r>
-        <w:t xml:space="preserve"> </w:t>
-      </w:r>
-      <w:r>
-        <w:t xml:space="preserve">(số đo, tiêu chuẩn) và phần</w:t>
-      </w:r>
-      <w:r>
-        <w:t xml:space="preserve"> </w:t>
-      </w:r>
-      <w:r>
-        <w:rPr>
-          <w:bCs/>
-          <w:b/>
-        </w:rPr>
-        <w:t xml:space="preserve">minh họa</w:t>
-      </w:r>
-      <w:r>
-        <w:t xml:space="preserve"> </w:t>
-      </w:r>
-      <w:r>
-        <w:t xml:space="preserve">(tham số giả định: lớp gỉ, hố) – AI dựng hình nhanh,</w:t>
-      </w:r>
-      <w:r>
-        <w:t xml:space="preserve"> </w:t>
-      </w:r>
-      <w:r>
-        <w:rPr>
-          <w:bCs/>
-          <w:b/>
-        </w:rPr>
-        <w:t xml:space="preserve">chuyên gia ăn mòn hiệu chỉnh</w:t>
-      </w:r>
-      <w:r>
-        <w:t xml:space="preserve"> </w:t>
-      </w:r>
-      <w:r>
-        <w:t xml:space="preserve">bằng số đo thực tế</w:t>
+        <w:pStyle w:val="BodyText"/>
+      </w:pPr>
+      <w:r>
+        <w:t xml:space="preserve">⌨</w:t>
+      </w:r>
+      <w:r>
+        <w:t xml:space="preserve"> </w:t>
+      </w:r>
+      <w:r>
+        <w:rPr>
+          <w:bCs/>
+          <w:b/>
+        </w:rPr>
+        <w:t xml:space="preserve">Mẫu câu lệnh:</w:t>
+      </w:r>
+    </w:p>
+    <w:p>
+      <w:pPr>
+        <w:pStyle w:val="SourceCode"/>
+      </w:pPr>
+      <w:r>
+        <w:rPr>
+          <w:rStyle w:val="VerbatimChar"/>
+        </w:rPr>
+        <w:t xml:space="preserve">Tôi tải lên [tệp dữ liệu]. Làm lần lượt, dừng sau mỗi bước để tôi xác nhận:</w:t>
+      </w:r>
+      <w:r>
+        <w:br/>
+      </w:r>
+      <w:r>
+        <w:rPr>
+          <w:rStyle w:val="VerbatimChar"/>
+        </w:rPr>
+        <w:t xml:space="preserve">1. Mô tả cấu trúc dữ liệu (số dòng, cột, đơn vị); 2. Kiểm tra chất lượng – chỉ đánh dấu,</w:t>
+      </w:r>
+      <w:r>
+        <w:br/>
+      </w:r>
+      <w:r>
+        <w:rPr>
+          <w:rStyle w:val="VerbatimChar"/>
+        </w:rPr>
+        <w:t xml:space="preserve">không xóa; 3. Đề xuất phương pháp phân tích và giải thích vì sao; 4. Phân tích, kiểm định</w:t>
+      </w:r>
+      <w:r>
+        <w:br/>
+      </w:r>
+      <w:r>
+        <w:rPr>
+          <w:rStyle w:val="VerbatimChar"/>
+        </w:rPr>
+        <w:t xml:space="preserve">trên tập độc lập; 5. Lưu toàn bộ mã Python và nhật ký để chạy lại.</w:t>
       </w:r>
     </w:p>
     <w:p>
@@ -10588,16 +10005,49 @@
         <w:t xml:space="preserve"> </w:t>
       </w:r>
       <w:r>
+        <w:t xml:space="preserve">sơ đồ 5 bước, mỗi bước có điểm dừng</w:t>
+      </w:r>
+      <w:r>
+        <w:t xml:space="preserve"> </w:t>
+      </w:r>
+      <w:r>
+        <w:t xml:space="preserve">“</w:t>
+      </w:r>
+      <w:r>
+        <w:t xml:space="preserve">nhà khoa học xác nhận</w:t>
+      </w:r>
+      <w:r>
+        <w:t xml:space="preserve">”</w:t>
+      </w:r>
+      <w:r>
+        <w:t xml:space="preserve">.</w:t>
+      </w:r>
+    </w:p>
+    <w:p>
+      <w:pPr>
+        <w:pStyle w:val="BodyText"/>
+      </w:pPr>
+      <w:r>
+        <w:rPr>
+          <w:bCs/>
+          <w:b/>
+        </w:rPr>
+        <w:t xml:space="preserve">Không chiếu (tài liệu phát tay):</w:t>
+      </w:r>
+      <w:r>
+        <w:t xml:space="preserve"> </w:t>
+      </w:r>
+      <w:r>
         <w:rPr>
           <w:rStyle w:val="VerbatimChar"/>
         </w:rPr>
-        <w:t xml:space="preserve">du-an-nghien-cuu/05-ket-qua/mo-hinh-3d/3D_4_qua_trinh_an_mon.png</w:t>
-      </w:r>
-      <w:r>
-        <w:t xml:space="preserve"> </w:t>
-      </w:r>
-      <w:r>
-        <w:t xml:space="preserve">(4 thời điểm + mặt cắt); mở</w:t>
+        <w:t xml:space="preserve">TAI-LIEU-PHAT-TAY.md</w:t>
+      </w:r>
+      <w:r>
+        <w:t xml:space="preserve"> </w:t>
+      </w:r>
+      <w:r>
+        <w:t xml:space="preserve">mục 12; cấu trúc thư mục dữ liệu mẫu:</w:t>
       </w:r>
       <w:r>
         <w:t xml:space="preserve"> </w:t>
@@ -10606,110 +10056,10 @@
         <w:rPr>
           <w:rStyle w:val="VerbatimChar"/>
         </w:rPr>
-        <w:t xml:space="preserve">3D_4_qua_trinh_an_mon_dong.html</w:t>
-      </w:r>
-      <w:r>
-        <w:t xml:space="preserve">, bấm</w:t>
-      </w:r>
-      <w:r>
-        <w:t xml:space="preserve"> </w:t>
-      </w:r>
-      <w:r>
-        <w:rPr>
-          <w:bCs/>
-          <w:b/>
-        </w:rPr>
-        <w:t xml:space="preserve">▶ Chạy</w:t>
-      </w:r>
-      <w:r>
-        <w:t xml:space="preserve">;</w:t>
-      </w:r>
-      <w:r>
-        <w:t xml:space="preserve"> </w:t>
-      </w:r>
-      <w:r>
-        <w:rPr>
-          <w:rStyle w:val="VerbatimChar"/>
-        </w:rPr>
-        <w:t xml:space="preserve">3D_5_so_sanh_vat_lieu.html</w:t>
+        <w:t xml:space="preserve">du-an-nghien-cuu/03-du-lieu/README.md</w:t>
       </w:r>
       <w:r>
         <w:t xml:space="preserve">.</w:t>
-      </w:r>
-    </w:p>
-    <w:p>
-      <w:pPr>
-        <w:pStyle w:val="BodyText"/>
-      </w:pPr>
-      <w:r>
-        <w:rPr>
-          <w:bCs/>
-          <w:b/>
-        </w:rPr>
-        <w:t xml:space="preserve">🎬 Trình chiếu:</w:t>
-      </w:r>
-      <w:r>
-        <w:t xml:space="preserve"> </w:t>
-      </w:r>
-      <w:r>
-        <w:t xml:space="preserve">mở</w:t>
-      </w:r>
-      <w:r>
-        <w:t xml:space="preserve"> </w:t>
-      </w:r>
-      <w:r>
-        <w:rPr>
-          <w:rStyle w:val="VerbatimChar"/>
-        </w:rPr>
-        <w:t xml:space="preserve">3D_4_qua_trinh_an_mon_dong.html</w:t>
-      </w:r>
-      <w:r>
-        <w:t xml:space="preserve"> </w:t>
-      </w:r>
-      <w:r>
-        <w:t xml:space="preserve">(chạy được không cần Internet), bấm ▶ ~1 phút; dự phòng: video ghi màn hình hoặc ảnh PNG. Câu lệnh đã dùng:</w:t>
-      </w:r>
-      <w:r>
-        <w:t xml:space="preserve"> </w:t>
-      </w:r>
-      <w:r>
-        <w:rPr>
-          <w:rStyle w:val="VerbatimChar"/>
-        </w:rPr>
-        <w:t xml:space="preserve">cau-lenh-demo.md</w:t>
-      </w:r>
-      <w:r>
-        <w:t xml:space="preserve"> </w:t>
-      </w:r>
-      <w:r>
-        <w:t xml:space="preserve">mục 12.</w:t>
-      </w:r>
-    </w:p>
-    <w:p>
-      <w:pPr>
-        <w:pStyle w:val="BodyText"/>
-      </w:pPr>
-      <w:r>
-        <w:rPr>
-          <w:bCs/>
-          <w:b/>
-        </w:rPr>
-        <w:t xml:space="preserve">Nguồn:</w:t>
-      </w:r>
-      <w:r>
-        <w:t xml:space="preserve"> </w:t>
-      </w:r>
-      <w:r>
-        <w:t xml:space="preserve">N16 · ISO 9223:2012, ISO 9224:2012 (T10, T11) ·</w:t>
-      </w:r>
-      <w:r>
-        <w:t xml:space="preserve"> </w:t>
-      </w:r>
-      <w:r>
-        <w:rPr>
-          <w:rStyle w:val="VerbatimChar"/>
-        </w:rPr>
-        <w:t xml:space="preserve">du-an-nghien-cuu/04-ma-nguon/05_mo_hinh_3d_qua_trinh.py</w:t>
       </w:r>
     </w:p>
     <w:p>
@@ -10747,14 +10097,14 @@
         </w:pict>
       </w:r>
     </w:p>
-    <w:bookmarkEnd w:id="43"/>
-    <w:bookmarkStart w:id="44" w:name="X61752ef5806553cc1d9ee1f478b5f3fc10b911a"/>
+    <w:bookmarkEnd w:id="41"/>
+    <w:bookmarkStart w:id="42" w:name="X90f6e54b52672ddc5e9f4ed1cfae23f335d6c72"/>
     <w:p>
       <w:pPr>
         <w:pStyle w:val="Heading2"/>
       </w:pPr>
       <w:r>
-        <w:t xml:space="preserve">Slide 18 – Công bố kết quả: bài báo và báo cáo tổng hợp theo nhiều định dạng (4′)</w:t>
+        <w:t xml:space="preserve">Slide 16 – Xử lý dữ liệu: AI viết và chạy mã Python – DEMO 2 (5′)</w:t>
       </w:r>
     </w:p>
     <w:p>
@@ -10772,17 +10122,331 @@
         <w:t xml:space="preserve"> </w:t>
       </w:r>
       <w:r>
-        <w:t xml:space="preserve">- 🆕</w:t>
-      </w:r>
-      <w:r>
-        <w:t xml:space="preserve"> </w:t>
-      </w:r>
-      <w:r>
-        <w:rPr>
-          <w:bCs/>
-          <w:b/>
-        </w:rPr>
-        <w:t xml:space="preserve">Một kết quả – nhiều định dạng công bố:</w:t>
+        <w:t xml:space="preserve">- 🌍</w:t>
+      </w:r>
+      <w:r>
+        <w:t xml:space="preserve"> </w:t>
+      </w:r>
+      <w:r>
+        <w:rPr>
+          <w:bCs/>
+          <w:b/>
+        </w:rPr>
+        <w:t xml:space="preserve">Ví dụ thật:</w:t>
+      </w:r>
+      <w:r>
+        <w:t xml:space="preserve"> </w:t>
+      </w:r>
+      <w:r>
+        <w:t xml:space="preserve">ERA (Google,</w:t>
+      </w:r>
+      <w:r>
+        <w:t xml:space="preserve"> </w:t>
+      </w:r>
+      <w:r>
+        <w:rPr>
+          <w:iCs/>
+          <w:i/>
+        </w:rPr>
+        <w:t xml:space="preserve">Nature</w:t>
+      </w:r>
+      <w:r>
+        <w:t xml:space="preserve"> </w:t>
+      </w:r>
+      <w:r>
+        <w:t xml:space="preserve">2026) – AI tự viết, chạy, chấm điểm, cải tiến mã</w:t>
+      </w:r>
+      <w:r>
+        <w:t xml:space="preserve"> </w:t>
+      </w:r>
+      <w:r>
+        <w:t xml:space="preserve">-</w:t>
+      </w:r>
+      <w:r>
+        <w:t xml:space="preserve"> </w:t>
+      </w:r>
+      <w:r>
+        <w:rPr>
+          <w:bCs/>
+          <w:b/>
+        </w:rPr>
+        <w:t xml:space="preserve">Nhà khoa học không cần biết lập trình:</w:t>
+      </w:r>
+      <w:r>
+        <w:t xml:space="preserve"> </w:t>
+      </w:r>
+      <w:r>
+        <w:t xml:space="preserve">mô tả việc cần làm → AI viết mã Python → chạy → trả bảng, biểu đồ,</w:t>
+      </w:r>
+      <w:r>
+        <w:t xml:space="preserve"> </w:t>
+      </w:r>
+      <w:r>
+        <w:rPr>
+          <w:bCs/>
+          <w:b/>
+        </w:rPr>
+        <w:t xml:space="preserve">kèm mã để tái lập</w:t>
+      </w:r>
+      <w:r>
+        <w:t xml:space="preserve"> </w:t>
+      </w:r>
+      <w:r>
+        <w:t xml:space="preserve">- ⌨</w:t>
+      </w:r>
+      <w:r>
+        <w:t xml:space="preserve"> </w:t>
+      </w:r>
+      <w:r>
+        <w:rPr>
+          <w:bCs/>
+          <w:b/>
+        </w:rPr>
+        <w:t xml:space="preserve">Áp dụng quy trình 5 bước (Slide 15):</w:t>
+      </w:r>
+      <w:r>
+        <w:t xml:space="preserve"> </w:t>
+      </w:r>
+      <w:r>
+        <w:t xml:space="preserve">rà soát dữ liệu → tính toán và lập mô hình → kiểm định → vẽ biểu đồ, lưu mã</w:t>
+      </w:r>
+      <w:r>
+        <w:t xml:space="preserve"> </w:t>
+      </w:r>
+      <w:r>
+        <w:t xml:space="preserve">- 📊</w:t>
+      </w:r>
+      <w:r>
+        <w:t xml:space="preserve"> </w:t>
+      </w:r>
+      <w:r>
+        <w:rPr>
+          <w:bCs/>
+          <w:b/>
+        </w:rPr>
+        <w:t xml:space="preserve">Kết quả:</w:t>
+      </w:r>
+      <w:r>
+        <w:t xml:space="preserve"> </w:t>
+      </w:r>
+      <w:r>
+        <w:t xml:space="preserve">- Dữ liệu giả lập: phát hiện đủ</w:t>
+      </w:r>
+      <w:r>
+        <w:t xml:space="preserve"> </w:t>
+      </w:r>
+      <w:r>
+        <w:rPr>
+          <w:bCs/>
+          <w:b/>
+        </w:rPr>
+        <w:t xml:space="preserve">14/14 lỗi</w:t>
+      </w:r>
+      <w:r>
+        <w:t xml:space="preserve"> </w:t>
+      </w:r>
+      <w:r>
+        <w:t xml:space="preserve">cài sẵn; thép CT3 ven biển C4 · đô thị C3 · nội địa C2</w:t>
+      </w:r>
+      <w:r>
+        <w:t xml:space="preserve"> </w:t>
+      </w:r>
+      <w:r>
+        <w:t xml:space="preserve">- Dữ liệu thật (387 số đo): kết quả chính đã nêu ở Slide 9; mô hình 3D ở Slide 17</w:t>
+      </w:r>
+      <w:r>
+        <w:t xml:space="preserve"> </w:t>
+      </w:r>
+      <w:r>
+        <w:t xml:space="preserve">- 💡</w:t>
+      </w:r>
+      <w:r>
+        <w:t xml:space="preserve"> </w:t>
+      </w:r>
+      <w:r>
+        <w:rPr>
+          <w:bCs/>
+          <w:b/>
+        </w:rPr>
+        <w:t xml:space="preserve">Bài học:</w:t>
+      </w:r>
+      <w:r>
+        <w:t xml:space="preserve"> </w:t>
+      </w:r>
+      <w:r>
+        <w:t xml:space="preserve">AI viết mã rất nhanh – nhưng cách tìm số đo bất thường AI chọn lần đầu đánh dấu nhầm 20 giá trị bình thường và bỏ sót lỗi gõ nhầm; chọn phương pháp phù hợp với thiết kế thí nghiệm (3 mẫu lặp) là việc của người làm chuyên môn</w:t>
+      </w:r>
+    </w:p>
+    <w:p>
+      <w:pPr>
+        <w:pStyle w:val="BodyText"/>
+      </w:pPr>
+      <w:r>
+        <w:rPr>
+          <w:bCs/>
+          <w:b/>
+        </w:rPr>
+        <w:t xml:space="preserve">Hình ảnh:</w:t>
+      </w:r>
+      <w:r>
+        <w:t xml:space="preserve"> </w:t>
+      </w:r>
+      <w:r>
+        <w:rPr>
+          <w:rStyle w:val="VerbatimChar"/>
+        </w:rPr>
+        <w:t xml:space="preserve">thuyet-trinh/ket-qua-demo/gia-lap/bieu_do_dong_hoc_an_mon.png</w:t>
+      </w:r>
+      <w:r>
+        <w:t xml:space="preserve">;</w:t>
+      </w:r>
+      <w:r>
+        <w:t xml:space="preserve"> </w:t>
+      </w:r>
+      <w:r>
+        <w:rPr>
+          <w:rStyle w:val="VerbatimChar"/>
+        </w:rPr>
+        <w:t xml:space="preserve">du-an-nghien-cuu/05-ket-qua/hinh/do_vs_du_doan.png</w:t>
+      </w:r>
+      <w:r>
+        <w:t xml:space="preserve">;</w:t>
+      </w:r>
+      <w:r>
+        <w:t xml:space="preserve"> </w:t>
+      </w:r>
+      <w:r>
+        <w:rPr>
+          <w:rStyle w:val="VerbatimChar"/>
+        </w:rPr>
+        <w:t xml:space="preserve">du-an-nghien-cuu/05-ket-qua/mo-hinh-3d/3D_3_be_mat_tam_thep.png</w:t>
+      </w:r>
+      <w:r>
+        <w:t xml:space="preserve">.</w:t>
+      </w:r>
+    </w:p>
+    <w:p>
+      <w:pPr>
+        <w:pStyle w:val="BodyText"/>
+      </w:pPr>
+      <w:r>
+        <w:rPr>
+          <w:bCs/>
+          <w:b/>
+        </w:rPr>
+        <w:t xml:space="preserve">🎬 Trình chiếu:</w:t>
+      </w:r>
+      <w:r>
+        <w:t xml:space="preserve"> </w:t>
+      </w:r>
+      <w:r>
+        <w:t xml:space="preserve">video ghi sẵn ~2 phút (câu lệnh 4.2 → 4.3 → 4.4 tua nhanh) + ảnh báo cáo chất lượng dữ liệu.</w:t>
+      </w:r>
+    </w:p>
+    <w:p>
+      <w:pPr>
+        <w:pStyle w:val="BodyText"/>
+      </w:pPr>
+      <w:r>
+        <w:rPr>
+          <w:bCs/>
+          <w:b/>
+        </w:rPr>
+        <w:t xml:space="preserve">Nguồn:</w:t>
+      </w:r>
+      <w:r>
+        <w:t xml:space="preserve"> </w:t>
+      </w:r>
+      <w:r>
+        <w:t xml:space="preserve">G5 ·</w:t>
+      </w:r>
+      <w:r>
+        <w:t xml:space="preserve"> </w:t>
+      </w:r>
+      <w:r>
+        <w:rPr>
+          <w:rStyle w:val="VerbatimChar"/>
+        </w:rPr>
+        <w:t xml:space="preserve">du-an-nghien-cuu/07-bao-cao/BAO-CAO-TONG-HOP.md</w:t>
+      </w:r>
+    </w:p>
+    <w:p>
+      <w:pPr>
+        <w:pStyle w:val="BodyText"/>
+      </w:pPr>
+      <w:r>
+        <w:rPr>
+          <w:bCs/>
+          <w:b/>
+        </w:rPr>
+        <w:t xml:space="preserve">Duyệt:</w:t>
+      </w:r>
+      <w:r>
+        <w:t xml:space="preserve"> </w:t>
+      </w:r>
+      <w:r>
+        <w:t xml:space="preserve">[ ] Duyệt · [ ] Sửa · [ ] Bỏ</w:t>
+      </w:r>
+      <w:r>
+        <w:t xml:space="preserve"> </w:t>
+      </w:r>
+      <w:r>
+        <w:rPr>
+          <w:bCs/>
+          <w:b/>
+        </w:rPr>
+        <w:t xml:space="preserve">Ghi chú:</w:t>
+      </w:r>
+    </w:p>
+    <w:p>
+      <w:r>
+        <w:pict>
+          <v:rect style="width:0;height:1.5pt" o:hralign="center" o:hrstd="t" o:hr="t"/>
+        </w:pict>
+      </w:r>
+    </w:p>
+    <w:bookmarkEnd w:id="42"/>
+    <w:bookmarkStart w:id="43" w:name="X834e235100fb9429d0e71671f229adf457c23df"/>
+    <w:p>
+      <w:pPr>
+        <w:pStyle w:val="Heading2"/>
+      </w:pPr>
+      <w:r>
+        <w:t xml:space="preserve">Slide 17 – Mô hình 3D: mô phỏng quá trình ăn mòn vật liệu theo thời gian (3′)</w:t>
+      </w:r>
+    </w:p>
+    <w:p>
+      <w:pPr>
+        <w:pStyle w:val="FirstParagraph"/>
+      </w:pPr>
+      <w:r>
+        <w:rPr>
+          <w:bCs/>
+          <w:b/>
+        </w:rPr>
+        <w:t xml:space="preserve">Chữ trên slide:</w:t>
+      </w:r>
+      <w:r>
+        <w:t xml:space="preserve"> </w:t>
+      </w:r>
+      <w:r>
+        <w:t xml:space="preserve">-</w:t>
+      </w:r>
+      <w:r>
+        <w:t xml:space="preserve"> </w:t>
+      </w:r>
+      <w:r>
+        <w:rPr>
+          <w:bCs/>
+          <w:b/>
+        </w:rPr>
+        <w:t xml:space="preserve">Từ con số đến hình ảnh:</w:t>
+      </w:r>
+      <w:r>
+        <w:t xml:space="preserve"> </w:t>
+      </w:r>
+      <w:r>
+        <w:t xml:space="preserve">AI viết mã dựng mô hình 3D tương tác – mở bằng trình duyệt, xoay, phóng to, bấm ▶ để xem ăn mòn diễn ra theo từng năm</w:t>
       </w:r>
     </w:p>
     <w:tbl>
@@ -10809,6 +10473,614 @@
               <w:jc w:val="left"/>
             </w:pPr>
             <w:r>
+              <w:t xml:space="preserve">Mô hình</w:t>
+            </w:r>
+          </w:p>
+        </w:tc>
+        <w:tc>
+          <w:tcPr/>
+          <w:p>
+            <w:pPr>
+              <w:pStyle w:val="Compact"/>
+              <w:jc w:val="left"/>
+            </w:pPr>
+            <w:r>
+              <w:t xml:space="preserve">Mô tả</w:t>
+            </w:r>
+          </w:p>
+        </w:tc>
+        <w:tc>
+          <w:tcPr/>
+          <w:p>
+            <w:pPr>
+              <w:pStyle w:val="Compact"/>
+              <w:jc w:val="left"/>
+            </w:pPr>
+            <w:r>
+              <w:t xml:space="preserve">Căn cứ</w:t>
+            </w:r>
+          </w:p>
+        </w:tc>
+      </w:tr>
+      <w:tr>
+        <w:tc>
+          <w:tcPr/>
+          <w:p>
+            <w:pPr>
+              <w:pStyle w:val="Compact"/>
+              <w:jc w:val="left"/>
+            </w:pPr>
+            <w:r>
+              <w:t xml:space="preserve">Mặt đáp ứng</w:t>
+            </w:r>
+          </w:p>
+        </w:tc>
+        <w:tc>
+          <w:tcPr/>
+          <w:p>
+            <w:pPr>
+              <w:pStyle w:val="Compact"/>
+              <w:jc w:val="left"/>
+            </w:pPr>
+            <w:r>
+              <w:t xml:space="preserve">Tốc độ ăn mòn năm đầu theo clorua và thời gian ẩm ướt – Việt Nam, Nga; điểm = số đo thật</w:t>
+            </w:r>
+          </w:p>
+        </w:tc>
+        <w:tc>
+          <w:tcPr/>
+          <w:p>
+            <w:pPr>
+              <w:pStyle w:val="Compact"/>
+              <w:jc w:val="left"/>
+            </w:pPr>
+            <w:r>
+              <w:t xml:space="preserve">Hàm liều – đáp ứng hiệu chỉnh vùng, 387 số đo</w:t>
+            </w:r>
+          </w:p>
+        </w:tc>
+      </w:tr>
+      <w:tr>
+        <w:tc>
+          <w:tcPr/>
+          <w:p>
+            <w:pPr>
+              <w:pStyle w:val="Compact"/>
+              <w:jc w:val="left"/>
+            </w:pPr>
+            <w:r>
+              <w:t xml:space="preserve">Diễn tiến theo thời gian</w:t>
+            </w:r>
+          </w:p>
+        </w:tc>
+        <w:tc>
+          <w:tcPr/>
+          <w:p>
+            <w:pPr>
+              <w:pStyle w:val="Compact"/>
+              <w:jc w:val="left"/>
+            </w:pPr>
+            <w:r>
+              <w:t xml:space="preserve">Chiều dày thép mất theo năm và mức clorua</w:t>
+            </w:r>
+          </w:p>
+        </w:tc>
+        <w:tc>
+          <w:tcPr/>
+          <w:p>
+            <w:pPr>
+              <w:pStyle w:val="Compact"/>
+              <w:jc w:val="left"/>
+            </w:pPr>
+            <w:r>
+              <w:t xml:space="preserve">ISO 9224: D = r·t^b, b = 0,523</w:t>
+            </w:r>
+          </w:p>
+        </w:tc>
+      </w:tr>
+      <w:tr>
+        <w:tc>
+          <w:tcPr/>
+          <w:p>
+            <w:pPr>
+              <w:pStyle w:val="Compact"/>
+              <w:jc w:val="left"/>
+            </w:pPr>
+            <w:r>
+              <w:t xml:space="preserve">🆕</w:t>
+            </w:r>
+            <w:r>
+              <w:t xml:space="preserve"> </w:t>
+            </w:r>
+            <w:r>
+              <w:rPr>
+                <w:bCs/>
+                <w:b/>
+              </w:rPr>
+              <w:t xml:space="preserve">Quá trình ăn mòn (hoạt hình)</w:t>
+            </w:r>
+          </w:p>
+        </w:tc>
+        <w:tc>
+          <w:tcPr/>
+          <w:p>
+            <w:pPr>
+              <w:pStyle w:val="Compact"/>
+              <w:jc w:val="left"/>
+            </w:pPr>
+            <w:r>
+              <w:t xml:space="preserve">Khối mẫu thép tại Nha Trang, 0 → 30 năm: bề mặt kim loại hạ dần, lớp gỉ dày lên, hố ăn mòn sâu dần; kèm mặt cắt</w:t>
+            </w:r>
+          </w:p>
+        </w:tc>
+        <w:tc>
+          <w:tcPr/>
+          <w:p>
+            <w:pPr>
+              <w:pStyle w:val="Compact"/>
+              <w:jc w:val="left"/>
+            </w:pPr>
+            <w:r>
+              <w:t xml:space="preserve">D(t) từ số đo r = 40,6 µm/năm; hình dạng gỉ, hố: minh họa</w:t>
+            </w:r>
+          </w:p>
+        </w:tc>
+      </w:tr>
+      <w:tr>
+        <w:tc>
+          <w:tcPr/>
+          <w:p>
+            <w:pPr>
+              <w:pStyle w:val="Compact"/>
+              <w:jc w:val="left"/>
+            </w:pPr>
+            <w:r>
+              <w:t xml:space="preserve">🆕</w:t>
+            </w:r>
+            <w:r>
+              <w:t xml:space="preserve"> </w:t>
+            </w:r>
+            <w:r>
+              <w:rPr>
+                <w:bCs/>
+                <w:b/>
+              </w:rPr>
+              <w:t xml:space="preserve">So sánh vật liệu</w:t>
+            </w:r>
+          </w:p>
+        </w:tc>
+        <w:tc>
+          <w:tcPr/>
+          <w:p>
+            <w:pPr>
+              <w:pStyle w:val="Compact"/>
+              <w:jc w:val="left"/>
+            </w:pPr>
+            <w:r>
+              <w:t xml:space="preserve">Thép – kẽm – đồng – nhôm trong cùng cấp ăn mòn C3</w:t>
+            </w:r>
+          </w:p>
+        </w:tc>
+        <w:tc>
+          <w:tcPr/>
+          <w:p>
+            <w:pPr>
+              <w:pStyle w:val="Compact"/>
+              <w:jc w:val="left"/>
+            </w:pPr>
+            <w:r>
+              <w:t xml:space="preserve">ISO 9223 Bảng 2; ISO 9224</w:t>
+            </w:r>
+          </w:p>
+        </w:tc>
+      </w:tr>
+    </w:tbl>
+    <w:p>
+      <w:pPr>
+        <w:numPr>
+          <w:ilvl w:val="0"/>
+          <w:numId w:val="1004"/>
+        </w:numPr>
+        <w:pStyle w:val="Compact"/>
+      </w:pPr>
+      <w:r>
+        <w:t xml:space="preserve">📊</w:t>
+      </w:r>
+      <w:r>
+        <w:t xml:space="preserve"> </w:t>
+      </w:r>
+      <w:r>
+        <w:rPr>
+          <w:bCs/>
+          <w:b/>
+        </w:rPr>
+        <w:t xml:space="preserve">Kết quả:</w:t>
+      </w:r>
+    </w:p>
+    <w:p>
+      <w:pPr>
+        <w:numPr>
+          <w:ilvl w:val="1"/>
+          <w:numId w:val="1005"/>
+        </w:numPr>
+        <w:pStyle w:val="Compact"/>
+      </w:pPr>
+      <w:r>
+        <w:t xml:space="preserve">Nha Trang: thép mất trung bình</w:t>
+      </w:r>
+      <w:r>
+        <w:t xml:space="preserve"> </w:t>
+      </w:r>
+      <w:r>
+        <w:rPr>
+          <w:bCs/>
+          <w:b/>
+        </w:rPr>
+        <w:t xml:space="preserve">41 µm</w:t>
+      </w:r>
+      <w:r>
+        <w:t xml:space="preserve"> </w:t>
+      </w:r>
+      <w:r>
+        <w:t xml:space="preserve">sau 1 năm →</w:t>
+      </w:r>
+      <w:r>
+        <w:t xml:space="preserve"> </w:t>
+      </w:r>
+      <w:r>
+        <w:rPr>
+          <w:bCs/>
+          <w:b/>
+        </w:rPr>
+        <w:t xml:space="preserve">135 µm</w:t>
+      </w:r>
+      <w:r>
+        <w:t xml:space="preserve"> </w:t>
+      </w:r>
+      <w:r>
+        <w:t xml:space="preserve">sau 10 năm →</w:t>
+      </w:r>
+      <w:r>
+        <w:t xml:space="preserve"> </w:t>
+      </w:r>
+      <w:r>
+        <w:rPr>
+          <w:bCs/>
+          <w:b/>
+        </w:rPr>
+        <w:t xml:space="preserve">245 µm</w:t>
+      </w:r>
+      <w:r>
+        <w:t xml:space="preserve"> </w:t>
+      </w:r>
+      <w:r>
+        <w:t xml:space="preserve">sau 30 năm (≈ 1.926 g/m²)</w:t>
+      </w:r>
+    </w:p>
+    <w:p>
+      <w:pPr>
+        <w:numPr>
+          <w:ilvl w:val="1"/>
+          <w:numId w:val="1005"/>
+        </w:numPr>
+        <w:pStyle w:val="Compact"/>
+      </w:pPr>
+      <w:r>
+        <w:t xml:space="preserve">Cấp C3, sau 30 năm: thép ≈ 218 µm · kẽm ≈ 20 µm · đồng ≈ 9 µm · nhôm ≈ 5 µm</w:t>
+      </w:r>
+    </w:p>
+    <w:p>
+      <w:pPr>
+        <w:numPr>
+          <w:ilvl w:val="0"/>
+          <w:numId w:val="1004"/>
+        </w:numPr>
+        <w:pStyle w:val="Compact"/>
+      </w:pPr>
+      <w:r>
+        <w:t xml:space="preserve">⚠</w:t>
+      </w:r>
+      <w:r>
+        <w:t xml:space="preserve"> </w:t>
+      </w:r>
+      <w:r>
+        <w:rPr>
+          <w:bCs/>
+          <w:b/>
+        </w:rPr>
+        <w:t xml:space="preserve">Ghi rõ trên hình:</w:t>
+      </w:r>
+      <w:r>
+        <w:t xml:space="preserve"> </w:t>
+      </w:r>
+      <w:r>
+        <w:t xml:space="preserve">phần</w:t>
+      </w:r>
+      <w:r>
+        <w:t xml:space="preserve"> </w:t>
+      </w:r>
+      <w:r>
+        <w:rPr>
+          <w:bCs/>
+          <w:b/>
+        </w:rPr>
+        <w:t xml:space="preserve">định lượng</w:t>
+      </w:r>
+      <w:r>
+        <w:t xml:space="preserve"> </w:t>
+      </w:r>
+      <w:r>
+        <w:t xml:space="preserve">(số đo, tiêu chuẩn) và phần</w:t>
+      </w:r>
+      <w:r>
+        <w:t xml:space="preserve"> </w:t>
+      </w:r>
+      <w:r>
+        <w:rPr>
+          <w:bCs/>
+          <w:b/>
+        </w:rPr>
+        <w:t xml:space="preserve">minh họa</w:t>
+      </w:r>
+      <w:r>
+        <w:t xml:space="preserve"> </w:t>
+      </w:r>
+      <w:r>
+        <w:t xml:space="preserve">(tham số giả định: lớp gỉ, hố) – AI dựng hình nhanh,</w:t>
+      </w:r>
+      <w:r>
+        <w:t xml:space="preserve"> </w:t>
+      </w:r>
+      <w:r>
+        <w:rPr>
+          <w:bCs/>
+          <w:b/>
+        </w:rPr>
+        <w:t xml:space="preserve">chuyên gia ăn mòn hiệu chỉnh</w:t>
+      </w:r>
+      <w:r>
+        <w:t xml:space="preserve"> </w:t>
+      </w:r>
+      <w:r>
+        <w:t xml:space="preserve">bằng số đo thực tế</w:t>
+      </w:r>
+    </w:p>
+    <w:p>
+      <w:pPr>
+        <w:pStyle w:val="FirstParagraph"/>
+      </w:pPr>
+      <w:r>
+        <w:rPr>
+          <w:bCs/>
+          <w:b/>
+        </w:rPr>
+        <w:t xml:space="preserve">Hình ảnh:</w:t>
+      </w:r>
+      <w:r>
+        <w:t xml:space="preserve"> </w:t>
+      </w:r>
+      <w:r>
+        <w:rPr>
+          <w:rStyle w:val="VerbatimChar"/>
+        </w:rPr>
+        <w:t xml:space="preserve">du-an-nghien-cuu/05-ket-qua/mo-hinh-3d/3D_4_qua_trinh_an_mon.png</w:t>
+      </w:r>
+      <w:r>
+        <w:t xml:space="preserve"> </w:t>
+      </w:r>
+      <w:r>
+        <w:t xml:space="preserve">(4 thời điểm + mặt cắt); mở</w:t>
+      </w:r>
+      <w:r>
+        <w:t xml:space="preserve"> </w:t>
+      </w:r>
+      <w:r>
+        <w:rPr>
+          <w:rStyle w:val="VerbatimChar"/>
+        </w:rPr>
+        <w:t xml:space="preserve">3D_4_qua_trinh_an_mon_dong.html</w:t>
+      </w:r>
+      <w:r>
+        <w:t xml:space="preserve">, bấm</w:t>
+      </w:r>
+      <w:r>
+        <w:t xml:space="preserve"> </w:t>
+      </w:r>
+      <w:r>
+        <w:rPr>
+          <w:bCs/>
+          <w:b/>
+        </w:rPr>
+        <w:t xml:space="preserve">▶ Chạy</w:t>
+      </w:r>
+      <w:r>
+        <w:t xml:space="preserve">;</w:t>
+      </w:r>
+      <w:r>
+        <w:t xml:space="preserve"> </w:t>
+      </w:r>
+      <w:r>
+        <w:rPr>
+          <w:rStyle w:val="VerbatimChar"/>
+        </w:rPr>
+        <w:t xml:space="preserve">3D_5_so_sanh_vat_lieu.html</w:t>
+      </w:r>
+      <w:r>
+        <w:t xml:space="preserve">.</w:t>
+      </w:r>
+    </w:p>
+    <w:p>
+      <w:pPr>
+        <w:pStyle w:val="BodyText"/>
+      </w:pPr>
+      <w:r>
+        <w:rPr>
+          <w:bCs/>
+          <w:b/>
+        </w:rPr>
+        <w:t xml:space="preserve">🎬 Trình chiếu:</w:t>
+      </w:r>
+      <w:r>
+        <w:t xml:space="preserve"> </w:t>
+      </w:r>
+      <w:r>
+        <w:t xml:space="preserve">mở</w:t>
+      </w:r>
+      <w:r>
+        <w:t xml:space="preserve"> </w:t>
+      </w:r>
+      <w:r>
+        <w:rPr>
+          <w:rStyle w:val="VerbatimChar"/>
+        </w:rPr>
+        <w:t xml:space="preserve">3D_4_qua_trinh_an_mon_dong.html</w:t>
+      </w:r>
+      <w:r>
+        <w:t xml:space="preserve"> </w:t>
+      </w:r>
+      <w:r>
+        <w:t xml:space="preserve">(chạy được không cần Internet), bấm ▶ ~1 phút; dự phòng: video ghi màn hình hoặc ảnh PNG. Câu lệnh đã dùng:</w:t>
+      </w:r>
+      <w:r>
+        <w:t xml:space="preserve"> </w:t>
+      </w:r>
+      <w:r>
+        <w:rPr>
+          <w:rStyle w:val="VerbatimChar"/>
+        </w:rPr>
+        <w:t xml:space="preserve">cau-lenh-demo.md</w:t>
+      </w:r>
+      <w:r>
+        <w:t xml:space="preserve"> </w:t>
+      </w:r>
+      <w:r>
+        <w:t xml:space="preserve">mục 12.</w:t>
+      </w:r>
+    </w:p>
+    <w:p>
+      <w:pPr>
+        <w:pStyle w:val="BodyText"/>
+      </w:pPr>
+      <w:r>
+        <w:rPr>
+          <w:bCs/>
+          <w:b/>
+        </w:rPr>
+        <w:t xml:space="preserve">Nguồn:</w:t>
+      </w:r>
+      <w:r>
+        <w:t xml:space="preserve"> </w:t>
+      </w:r>
+      <w:r>
+        <w:t xml:space="preserve">N16 · ISO 9223:2012, ISO 9224:2012 (T10, T11) ·</w:t>
+      </w:r>
+      <w:r>
+        <w:t xml:space="preserve"> </w:t>
+      </w:r>
+      <w:r>
+        <w:rPr>
+          <w:rStyle w:val="VerbatimChar"/>
+        </w:rPr>
+        <w:t xml:space="preserve">du-an-nghien-cuu/04-ma-nguon/05_mo_hinh_3d_qua_trinh.py</w:t>
+      </w:r>
+    </w:p>
+    <w:p>
+      <w:pPr>
+        <w:pStyle w:val="BodyText"/>
+      </w:pPr>
+      <w:r>
+        <w:rPr>
+          <w:bCs/>
+          <w:b/>
+        </w:rPr>
+        <w:t xml:space="preserve">Duyệt:</w:t>
+      </w:r>
+      <w:r>
+        <w:t xml:space="preserve"> </w:t>
+      </w:r>
+      <w:r>
+        <w:t xml:space="preserve">[ ] Duyệt · [ ] Sửa · [ ] Bỏ</w:t>
+      </w:r>
+      <w:r>
+        <w:t xml:space="preserve"> </w:t>
+      </w:r>
+      <w:r>
+        <w:rPr>
+          <w:bCs/>
+          <w:b/>
+        </w:rPr>
+        <w:t xml:space="preserve">Ghi chú:</w:t>
+      </w:r>
+    </w:p>
+    <w:p>
+      <w:r>
+        <w:pict>
+          <v:rect style="width:0;height:1.5pt" o:hralign="center" o:hrstd="t" o:hr="t"/>
+        </w:pict>
+      </w:r>
+    </w:p>
+    <w:bookmarkEnd w:id="43"/>
+    <w:bookmarkStart w:id="44" w:name="X2957c6f8b504356acd6d5ff9b1719bef093e161"/>
+    <w:p>
+      <w:pPr>
+        <w:pStyle w:val="Heading2"/>
+      </w:pPr>
+      <w:r>
+        <w:t xml:space="preserve">Slide 18 – Công bố kết quả: bài báo và báo cáo tổng hợp theo nhiều định dạng (3′)</w:t>
+      </w:r>
+    </w:p>
+    <w:p>
+      <w:pPr>
+        <w:pStyle w:val="FirstParagraph"/>
+      </w:pPr>
+      <w:r>
+        <w:rPr>
+          <w:bCs/>
+          <w:b/>
+        </w:rPr>
+        <w:t xml:space="preserve">Chữ trên slide:</w:t>
+      </w:r>
+      <w:r>
+        <w:t xml:space="preserve"> </w:t>
+      </w:r>
+      <w:r>
+        <w:t xml:space="preserve">- 🆕</w:t>
+      </w:r>
+      <w:r>
+        <w:t xml:space="preserve"> </w:t>
+      </w:r>
+      <w:r>
+        <w:rPr>
+          <w:bCs/>
+          <w:b/>
+        </w:rPr>
+        <w:t xml:space="preserve">Một kết quả – nhiều định dạng công bố:</w:t>
+      </w:r>
+    </w:p>
+    <w:tbl>
+      <w:tblPr>
+        <w:tblStyle w:val="Table"/>
+        <w:tblW w:type="pct" w:w="5000"/>
+        <w:tblLook w:firstRow="1" w:lastRow="0" w:firstColumn="0" w:lastColumn="0" w:noHBand="0" w:noVBand="0" w:val="0020"/>
+        <w:jc w:val="start"/>
+      </w:tblPr>
+      <w:tblGrid>
+        <w:gridCol w:w="2640"/>
+        <w:gridCol w:w="2640"/>
+        <w:gridCol w:w="2640"/>
+      </w:tblGrid>
+      <w:tr>
+        <w:trPr>
+          <w:tblHeader w:val="true"/>
+        </w:trPr>
+        <w:tc>
+          <w:tcPr/>
+          <w:p>
+            <w:pPr>
+              <w:pStyle w:val="Compact"/>
+              <w:jc w:val="left"/>
+            </w:pPr>
+            <w:r>
               <w:t xml:space="preserve">Đích công bố</w:t>
             </w:r>
           </w:p>
@@ -11077,7 +11349,7 @@
       <w:pPr>
         <w:numPr>
           <w:ilvl w:val="0"/>
-          <w:numId w:val="1004"/>
+          <w:numId w:val="1006"/>
         </w:numPr>
       </w:pPr>
       <w:r>
@@ -11254,7 +11526,7 @@
         <w:t xml:space="preserve"> </w:t>
       </w:r>
       <w:r>
-        <w:t xml:space="preserve">sơ đồ vòng đời: Tài liệu → Khoảng trống (S13) → Phiếu đề xuất, thuyết minh (S14) → Tiến độ – kinh phí (S15) → Dữ liệu – kết quả, mô hình 3D (S16–S17) → Bài báo – báo cáo (S18); mỗi bước có dấu ✅</w:t>
+        <w:t xml:space="preserve">sơ đồ vòng đời: Tài liệu → Khoảng trống (S12) → Phiếu đề xuất, thuyết minh (S13) → Tiến độ – kinh phí (S14) → Xử lý dữ liệu theo 5 bước, mô hình 3D (S15–S17) → Bài báo – báo cáo (S18); mỗi bước có dấu ✅</w:t>
       </w:r>
       <w:r>
         <w:t xml:space="preserve"> </w:t>
@@ -12151,7 +12423,7 @@
       <w:pPr>
         <w:numPr>
           <w:ilvl w:val="0"/>
-          <w:numId w:val="1005"/>
+          <w:numId w:val="1007"/>
         </w:numPr>
         <w:pStyle w:val="Compact"/>
       </w:pPr>
@@ -15956,7 +16228,7 @@
       <w:pPr>
         <w:numPr>
           <w:ilvl w:val="0"/>
-          <w:numId w:val="1006"/>
+          <w:numId w:val="1008"/>
         </w:numPr>
         <w:pStyle w:val="Compact"/>
       </w:pPr>
@@ -15968,7 +16240,7 @@
       <w:pPr>
         <w:numPr>
           <w:ilvl w:val="0"/>
-          <w:numId w:val="1006"/>
+          <w:numId w:val="1008"/>
         </w:numPr>
         <w:pStyle w:val="Compact"/>
       </w:pPr>
@@ -15980,7 +16252,7 @@
       <w:pPr>
         <w:numPr>
           <w:ilvl w:val="0"/>
-          <w:numId w:val="1006"/>
+          <w:numId w:val="1008"/>
         </w:numPr>
         <w:pStyle w:val="Compact"/>
       </w:pPr>
@@ -15992,7 +16264,7 @@
       <w:pPr>
         <w:numPr>
           <w:ilvl w:val="0"/>
-          <w:numId w:val="1006"/>
+          <w:numId w:val="1008"/>
         </w:numPr>
         <w:pStyle w:val="Compact"/>
       </w:pPr>
@@ -16306,7 +16578,34 @@
     <w:abstractNumId w:val="991"/>
   </w:num>
   <w:num w:numId="1003">
-    <w:abstractNumId w:val="991"/>
+    <w:abstractNumId w:val="99411"/>
+    <w:lvlOverride w:ilvl="0">
+      <w:startOverride w:val="1"/>
+    </w:lvlOverride>
+    <w:lvlOverride w:ilvl="1">
+      <w:startOverride w:val="1"/>
+    </w:lvlOverride>
+    <w:lvlOverride w:ilvl="2">
+      <w:startOverride w:val="1"/>
+    </w:lvlOverride>
+    <w:lvlOverride w:ilvl="3">
+      <w:startOverride w:val="1"/>
+    </w:lvlOverride>
+    <w:lvlOverride w:ilvl="4">
+      <w:startOverride w:val="1"/>
+    </w:lvlOverride>
+    <w:lvlOverride w:ilvl="5">
+      <w:startOverride w:val="1"/>
+    </w:lvlOverride>
+    <w:lvlOverride w:ilvl="6">
+      <w:startOverride w:val="1"/>
+    </w:lvlOverride>
+    <w:lvlOverride w:ilvl="7">
+      <w:startOverride w:val="1"/>
+    </w:lvlOverride>
+    <w:lvlOverride w:ilvl="8">
+      <w:startOverride w:val="1"/>
+    </w:lvlOverride>
   </w:num>
   <w:num w:numId="1004">
     <w:abstractNumId w:val="991"/>
@@ -16315,6 +16614,12 @@
     <w:abstractNumId w:val="991"/>
   </w:num>
   <w:num w:numId="1006">
+    <w:abstractNumId w:val="991"/>
+  </w:num>
+  <w:num w:numId="1007">
+    <w:abstractNumId w:val="991"/>
+  </w:num>
+  <w:num w:numId="1008">
     <w:abstractNumId w:val="991"/>
   </w:num>
 </w:numbering>

</xml_diff>